<commit_message>
abis revisi poin 16. next besarin dulu gambar di poin 16 baru lanjut ke 17
</commit_message>
<xml_diff>
--- a/non-website/Laporan Akhir KP/2203040182 - Dhika Ramadhan Saputra - Laporan KP - Revisi 1.docx
+++ b/non-website/Laporan Akhir KP/2203040182 - Dhika Ramadhan Saputra - Laporan KP - Revisi 1.docx
@@ -185,7 +185,6 @@
           <w:szCs w:val="22"/>
         </w:rPr>
       </w:pPr>
-      <w:proofErr w:type="gramStart"/>
       <w:r>
         <w:rPr>
           <w:rFonts w:ascii="Times New Roman" w:hAnsi="Times New Roman" w:cs="Times New Roman"/>
@@ -208,16 +207,15 @@
           <w:sz w:val="22"/>
           <w:szCs w:val="22"/>
         </w:rPr>
-        <w:t>:</w:t>
-      </w:r>
-      <w:proofErr w:type="gramEnd"/>
+        <w:t>: Dhika Ramadhan Saputra</w:t>
+      </w:r>
       <w:r>
         <w:rPr>
           <w:rFonts w:ascii="Times New Roman" w:hAnsi="Times New Roman" w:cs="Times New Roman"/>
           <w:sz w:val="22"/>
           <w:szCs w:val="22"/>
         </w:rPr>
-        <w:t xml:space="preserve"> Dhika Ramadhan Saputra</w:t>
+        <w:br/>
       </w:r>
       <w:r>
         <w:rPr>
@@ -225,16 +223,15 @@
           <w:sz w:val="22"/>
           <w:szCs w:val="22"/>
         </w:rPr>
-        <w:br/>
-      </w:r>
-      <w:proofErr w:type="gramStart"/>
+        <w:t>NIM.</w:t>
+      </w:r>
       <w:r>
         <w:rPr>
           <w:rFonts w:ascii="Times New Roman" w:hAnsi="Times New Roman" w:cs="Times New Roman"/>
           <w:sz w:val="22"/>
           <w:szCs w:val="22"/>
         </w:rPr>
-        <w:t>NIM.</w:t>
+        <w:t xml:space="preserve">  </w:t>
       </w:r>
       <w:r>
         <w:rPr>
@@ -242,24 +239,7 @@
           <w:sz w:val="22"/>
           <w:szCs w:val="22"/>
         </w:rPr>
-        <w:t xml:space="preserve">  </w:t>
-      </w:r>
-      <w:r>
-        <w:rPr>
-          <w:rFonts w:ascii="Times New Roman" w:hAnsi="Times New Roman" w:cs="Times New Roman"/>
-          <w:sz w:val="22"/>
-          <w:szCs w:val="22"/>
-        </w:rPr>
-        <w:t>:</w:t>
-      </w:r>
-      <w:proofErr w:type="gramEnd"/>
-      <w:r>
-        <w:rPr>
-          <w:rFonts w:ascii="Times New Roman" w:hAnsi="Times New Roman" w:cs="Times New Roman"/>
-          <w:sz w:val="22"/>
-          <w:szCs w:val="22"/>
-        </w:rPr>
-        <w:t xml:space="preserve"> 2203040182</w:t>
+        <w:t>: 2203040182</w:t>
       </w:r>
     </w:p>
     <w:p>
@@ -468,7 +448,6 @@
           <w:szCs w:val="22"/>
         </w:rPr>
       </w:pPr>
-      <w:proofErr w:type="gramStart"/>
       <w:r>
         <w:rPr>
           <w:rFonts w:ascii="Times New Roman" w:hAnsi="Times New Roman" w:cs="Times New Roman"/>
@@ -477,9 +456,8 @@
           <w:sz w:val="22"/>
           <w:szCs w:val="22"/>
         </w:rPr>
-        <w:t>Nama :</w:t>
-      </w:r>
-      <w:proofErr w:type="gramEnd"/>
+        <w:t xml:space="preserve">Nama : </w:t>
+      </w:r>
       <w:r>
         <w:rPr>
           <w:rFonts w:ascii="Times New Roman" w:hAnsi="Times New Roman" w:cs="Times New Roman"/>
@@ -488,9 +466,12 @@
           <w:sz w:val="22"/>
           <w:szCs w:val="22"/>
         </w:rPr>
-        <w:t xml:space="preserve"> </w:t>
-      </w:r>
-      <w:r>
+        <w:t>Dhika Ramadhan Saputra</w:t>
+      </w:r>
+    </w:p>
+    <w:p>
+      <w:pPr>
+        <w:jc w:val="center"/>
         <w:rPr>
           <w:rFonts w:ascii="Times New Roman" w:hAnsi="Times New Roman" w:cs="Times New Roman"/>
           <w:b/>
@@ -498,12 +479,8 @@
           <w:sz w:val="22"/>
           <w:szCs w:val="22"/>
         </w:rPr>
-        <w:t>Dhika Ramadhan Saputra</w:t>
-      </w:r>
-    </w:p>
-    <w:p>
-      <w:pPr>
-        <w:jc w:val="center"/>
+      </w:pPr>
+      <w:r>
         <w:rPr>
           <w:rFonts w:ascii="Times New Roman" w:hAnsi="Times New Roman" w:cs="Times New Roman"/>
           <w:b/>
@@ -511,7 +488,8 @@
           <w:sz w:val="22"/>
           <w:szCs w:val="22"/>
         </w:rPr>
-      </w:pPr>
+        <w:t xml:space="preserve">NIM. : </w:t>
+      </w:r>
       <w:r>
         <w:rPr>
           <w:rFonts w:ascii="Times New Roman" w:hAnsi="Times New Roman" w:cs="Times New Roman"/>
@@ -520,9 +498,8 @@
           <w:sz w:val="22"/>
           <w:szCs w:val="22"/>
         </w:rPr>
-        <w:t>NIM</w:t>
-      </w:r>
-      <w:proofErr w:type="gramStart"/>
+        <w:t>2203040182</w:t>
+      </w:r>
       <w:r>
         <w:rPr>
           <w:rFonts w:ascii="Times New Roman" w:hAnsi="Times New Roman" w:cs="Times New Roman"/>
@@ -531,9 +508,36 @@
           <w:sz w:val="22"/>
           <w:szCs w:val="22"/>
         </w:rPr>
-        <w:t>. :</w:t>
-      </w:r>
-      <w:proofErr w:type="gramEnd"/>
+        <w:t>.</w:t>
+      </w:r>
+    </w:p>
+    <w:p>
+      <w:pPr>
+        <w:jc w:val="center"/>
+        <w:rPr>
+          <w:rFonts w:ascii="Times New Roman" w:hAnsi="Times New Roman" w:cs="Times New Roman"/>
+          <w:sz w:val="22"/>
+          <w:szCs w:val="22"/>
+        </w:rPr>
+      </w:pPr>
+      <w:r>
+        <w:rPr>
+          <w:rFonts w:ascii="Times New Roman" w:hAnsi="Times New Roman" w:cs="Times New Roman"/>
+          <w:sz w:val="22"/>
+          <w:szCs w:val="22"/>
+        </w:rPr>
+        <w:br/>
+      </w:r>
+    </w:p>
+    <w:p>
+      <w:pPr>
+        <w:jc w:val="center"/>
+        <w:rPr>
+          <w:rFonts w:ascii="Times New Roman" w:hAnsi="Times New Roman" w:cs="Times New Roman"/>
+          <w:sz w:val="22"/>
+          <w:szCs w:val="22"/>
+        </w:rPr>
+      </w:pPr>
       <w:r>
         <w:rPr>
           <w:rFonts w:ascii="Times New Roman" w:hAnsi="Times New Roman" w:cs="Times New Roman"/>
@@ -542,8 +546,18 @@
           <w:sz w:val="22"/>
           <w:szCs w:val="22"/>
         </w:rPr>
-        <w:t xml:space="preserve"> </w:t>
-      </w:r>
+        <w:t>Laporan Kerja Praktik Mahasiswa tersebut di Atas</w:t>
+      </w:r>
+    </w:p>
+    <w:p>
+      <w:pPr>
+        <w:jc w:val="center"/>
+        <w:rPr>
+          <w:rFonts w:ascii="Times New Roman" w:hAnsi="Times New Roman" w:cs="Times New Roman"/>
+          <w:sz w:val="22"/>
+          <w:szCs w:val="22"/>
+        </w:rPr>
+      </w:pPr>
       <w:r>
         <w:rPr>
           <w:rFonts w:ascii="Times New Roman" w:hAnsi="Times New Roman" w:cs="Times New Roman"/>
@@ -552,8 +566,36 @@
           <w:sz w:val="22"/>
           <w:szCs w:val="22"/>
         </w:rPr>
-        <w:t>2203040182</w:t>
-      </w:r>
+        <w:t>Dinyatakan Telah Memenuhi Syarat untuk Diseminarkan</w:t>
+      </w:r>
+    </w:p>
+    <w:p>
+      <w:pPr>
+        <w:jc w:val="center"/>
+        <w:rPr>
+          <w:rFonts w:ascii="Times New Roman" w:hAnsi="Times New Roman" w:cs="Times New Roman"/>
+          <w:sz w:val="22"/>
+          <w:szCs w:val="22"/>
+        </w:rPr>
+      </w:pPr>
+      <w:r>
+        <w:rPr>
+          <w:rFonts w:ascii="Times New Roman" w:hAnsi="Times New Roman" w:cs="Times New Roman"/>
+          <w:sz w:val="22"/>
+          <w:szCs w:val="22"/>
+        </w:rPr>
+        <w:br/>
+      </w:r>
+    </w:p>
+    <w:p>
+      <w:pPr>
+        <w:jc w:val="center"/>
+        <w:rPr>
+          <w:rFonts w:ascii="Times New Roman" w:hAnsi="Times New Roman" w:cs="Times New Roman"/>
+          <w:sz w:val="22"/>
+          <w:szCs w:val="22"/>
+        </w:rPr>
+      </w:pPr>
       <w:r>
         <w:rPr>
           <w:rFonts w:ascii="Times New Roman" w:hAnsi="Times New Roman" w:cs="Times New Roman"/>
@@ -562,25 +604,7 @@
           <w:sz w:val="22"/>
           <w:szCs w:val="22"/>
         </w:rPr>
-        <w:t>.</w:t>
-      </w:r>
-    </w:p>
-    <w:p>
-      <w:pPr>
-        <w:jc w:val="center"/>
-        <w:rPr>
-          <w:rFonts w:ascii="Times New Roman" w:hAnsi="Times New Roman" w:cs="Times New Roman"/>
-          <w:sz w:val="22"/>
-          <w:szCs w:val="22"/>
-        </w:rPr>
-      </w:pPr>
-      <w:r>
-        <w:rPr>
-          <w:rFonts w:ascii="Times New Roman" w:hAnsi="Times New Roman" w:cs="Times New Roman"/>
-          <w:sz w:val="22"/>
-          <w:szCs w:val="22"/>
-        </w:rPr>
-        <w:br/>
+        <w:t>Disetujui  : di Purwokerto</w:t>
       </w:r>
     </w:p>
     <w:p>
@@ -600,7 +624,23 @@
           <w:sz w:val="22"/>
           <w:szCs w:val="22"/>
         </w:rPr>
-        <w:t>Laporan Kerja Praktik Mahasiswa tersebut di Atas</w:t>
+        <w:t>Tanggal : …………………..</w:t>
+      </w:r>
+      <w:r>
+        <w:rPr>
+          <w:rFonts w:ascii="Times New Roman" w:hAnsi="Times New Roman" w:cs="Times New Roman"/>
+          <w:sz w:val="22"/>
+          <w:szCs w:val="22"/>
+        </w:rPr>
+        <w:br/>
+      </w:r>
+      <w:r>
+        <w:rPr>
+          <w:rFonts w:ascii="Times New Roman" w:hAnsi="Times New Roman" w:cs="Times New Roman"/>
+          <w:sz w:val="22"/>
+          <w:szCs w:val="22"/>
+        </w:rPr>
+        <w:br/>
       </w:r>
     </w:p>
     <w:p>
@@ -620,140 +660,8 @@
           <w:sz w:val="22"/>
           <w:szCs w:val="22"/>
         </w:rPr>
-        <w:t>Dinyatakan Telah Memenuhi Syarat untuk Diseminarkan</w:t>
-      </w:r>
-    </w:p>
-    <w:p>
-      <w:pPr>
-        <w:jc w:val="center"/>
-        <w:rPr>
-          <w:rFonts w:ascii="Times New Roman" w:hAnsi="Times New Roman" w:cs="Times New Roman"/>
-          <w:sz w:val="22"/>
-          <w:szCs w:val="22"/>
-        </w:rPr>
-      </w:pPr>
-      <w:r>
-        <w:rPr>
-          <w:rFonts w:ascii="Times New Roman" w:hAnsi="Times New Roman" w:cs="Times New Roman"/>
-          <w:sz w:val="22"/>
-          <w:szCs w:val="22"/>
-        </w:rPr>
-        <w:br/>
-      </w:r>
-    </w:p>
-    <w:p>
-      <w:pPr>
-        <w:jc w:val="center"/>
-        <w:rPr>
-          <w:rFonts w:ascii="Times New Roman" w:hAnsi="Times New Roman" w:cs="Times New Roman"/>
-          <w:sz w:val="22"/>
-          <w:szCs w:val="22"/>
-        </w:rPr>
-      </w:pPr>
-      <w:proofErr w:type="gramStart"/>
-      <w:r>
-        <w:rPr>
-          <w:rFonts w:ascii="Times New Roman" w:hAnsi="Times New Roman" w:cs="Times New Roman"/>
-          <w:b/>
-          <w:bCs/>
-          <w:sz w:val="22"/>
-          <w:szCs w:val="22"/>
-        </w:rPr>
-        <w:t>Disetujui  :</w:t>
-      </w:r>
-      <w:proofErr w:type="gramEnd"/>
-      <w:r>
-        <w:rPr>
-          <w:rFonts w:ascii="Times New Roman" w:hAnsi="Times New Roman" w:cs="Times New Roman"/>
-          <w:b/>
-          <w:bCs/>
-          <w:sz w:val="22"/>
-          <w:szCs w:val="22"/>
-        </w:rPr>
-        <w:t xml:space="preserve"> di Purwokerto</w:t>
-      </w:r>
-    </w:p>
-    <w:p>
-      <w:pPr>
-        <w:jc w:val="center"/>
-        <w:rPr>
-          <w:rFonts w:ascii="Times New Roman" w:hAnsi="Times New Roman" w:cs="Times New Roman"/>
-          <w:sz w:val="22"/>
-          <w:szCs w:val="22"/>
-        </w:rPr>
-      </w:pPr>
-      <w:proofErr w:type="gramStart"/>
-      <w:r>
-        <w:rPr>
-          <w:rFonts w:ascii="Times New Roman" w:hAnsi="Times New Roman" w:cs="Times New Roman"/>
-          <w:b/>
-          <w:bCs/>
-          <w:sz w:val="22"/>
-          <w:szCs w:val="22"/>
-        </w:rPr>
-        <w:t>Tanggal :</w:t>
-      </w:r>
-      <w:proofErr w:type="gramEnd"/>
-      <w:r>
-        <w:rPr>
-          <w:rFonts w:ascii="Times New Roman" w:hAnsi="Times New Roman" w:cs="Times New Roman"/>
-          <w:b/>
-          <w:bCs/>
-          <w:sz w:val="22"/>
-          <w:szCs w:val="22"/>
-        </w:rPr>
-        <w:t xml:space="preserve"> ………………</w:t>
-      </w:r>
-      <w:proofErr w:type="gramStart"/>
-      <w:r>
-        <w:rPr>
-          <w:rFonts w:ascii="Times New Roman" w:hAnsi="Times New Roman" w:cs="Times New Roman"/>
-          <w:b/>
-          <w:bCs/>
-          <w:sz w:val="22"/>
-          <w:szCs w:val="22"/>
-        </w:rPr>
-        <w:t>…..</w:t>
-      </w:r>
-      <w:proofErr w:type="gramEnd"/>
-      <w:r>
-        <w:rPr>
-          <w:rFonts w:ascii="Times New Roman" w:hAnsi="Times New Roman" w:cs="Times New Roman"/>
-          <w:sz w:val="22"/>
-          <w:szCs w:val="22"/>
-        </w:rPr>
-        <w:br/>
-      </w:r>
-      <w:r>
-        <w:rPr>
-          <w:rFonts w:ascii="Times New Roman" w:hAnsi="Times New Roman" w:cs="Times New Roman"/>
-          <w:sz w:val="22"/>
-          <w:szCs w:val="22"/>
-        </w:rPr>
-        <w:br/>
-      </w:r>
-    </w:p>
-    <w:p>
-      <w:pPr>
-        <w:jc w:val="center"/>
-        <w:rPr>
-          <w:rFonts w:ascii="Times New Roman" w:hAnsi="Times New Roman" w:cs="Times New Roman"/>
-          <w:sz w:val="22"/>
-          <w:szCs w:val="22"/>
-        </w:rPr>
-      </w:pPr>
-      <w:proofErr w:type="gramStart"/>
-      <w:r>
-        <w:rPr>
-          <w:rFonts w:ascii="Times New Roman" w:hAnsi="Times New Roman" w:cs="Times New Roman"/>
-          <w:b/>
-          <w:bCs/>
-          <w:sz w:val="22"/>
-          <w:szCs w:val="22"/>
-        </w:rPr>
         <w:t>Oleh :</w:t>
       </w:r>
-      <w:proofErr w:type="gramEnd"/>
     </w:p>
     <w:p>
       <w:pPr>
@@ -881,27 +789,7 @@
                 <w:szCs w:val="22"/>
                 <w:u w:val="single"/>
               </w:rPr>
-              <w:t xml:space="preserve">Maulida Ayu Fitriani, </w:t>
-            </w:r>
-            <w:proofErr w:type="gramStart"/>
-            <w:r>
-              <w:rPr>
-                <w:rFonts w:ascii="Times New Roman" w:hAnsi="Times New Roman" w:cs="Times New Roman"/>
-                <w:sz w:val="22"/>
-                <w:szCs w:val="22"/>
-                <w:u w:val="single"/>
-              </w:rPr>
-              <w:t>S.Kom</w:t>
-            </w:r>
-            <w:proofErr w:type="gramEnd"/>
-            <w:r>
-              <w:rPr>
-                <w:rFonts w:ascii="Times New Roman" w:hAnsi="Times New Roman" w:cs="Times New Roman"/>
-                <w:sz w:val="22"/>
-                <w:szCs w:val="22"/>
-                <w:u w:val="single"/>
-              </w:rPr>
-              <w:t>., M.Cs.</w:t>
+              <w:t>Maulida Ayu Fitriani, S.Kom., M.Cs.</w:t>
             </w:r>
           </w:p>
           <w:p>
@@ -1246,7 +1134,6 @@
           <w:szCs w:val="20"/>
         </w:rPr>
       </w:pPr>
-      <w:proofErr w:type="gramStart"/>
       <w:r>
         <w:rPr>
           <w:rFonts w:ascii="Times New Roman" w:eastAsia="Times New Roman" w:hAnsi="Times New Roman" w:cs="Times New Roman"/>
@@ -1256,7 +1143,6 @@
         </w:rPr>
         <w:t>Disetujui :</w:t>
       </w:r>
-      <w:proofErr w:type="gramEnd"/>
     </w:p>
     <w:p>
       <w:pPr>
@@ -1301,19 +1187,8 @@
           <w:sz w:val="22"/>
           <w:szCs w:val="22"/>
         </w:rPr>
-        <w:t>Tanggal: ………………</w:t>
-      </w:r>
-      <w:proofErr w:type="gramStart"/>
-      <w:r>
-        <w:rPr>
-          <w:rFonts w:ascii="Times New Roman" w:eastAsia="Times New Roman" w:hAnsi="Times New Roman" w:cs="Times New Roman"/>
-          <w:color w:val="000000"/>
-          <w:sz w:val="22"/>
-          <w:szCs w:val="22"/>
-        </w:rPr>
-        <w:t>…..</w:t>
-      </w:r>
-      <w:proofErr w:type="gramEnd"/>
+        <w:t>Tanggal: …………………..</w:t>
+      </w:r>
     </w:p>
     <w:p>
       <w:pPr>
@@ -1458,29 +1333,7 @@
                 <w:szCs w:val="22"/>
                 <w:u w:val="single"/>
               </w:rPr>
-              <w:t xml:space="preserve">Maulida Ayu Fitriani, </w:t>
-            </w:r>
-            <w:proofErr w:type="gramStart"/>
-            <w:r>
-              <w:rPr>
-                <w:rFonts w:ascii="Times New Roman" w:eastAsia="Times New Roman" w:hAnsi="Times New Roman" w:cs="Times New Roman"/>
-                <w:color w:val="000000"/>
-                <w:sz w:val="22"/>
-                <w:szCs w:val="22"/>
-                <w:u w:val="single"/>
-              </w:rPr>
-              <w:t>S.Kom</w:t>
-            </w:r>
-            <w:proofErr w:type="gramEnd"/>
-            <w:r>
-              <w:rPr>
-                <w:rFonts w:ascii="Times New Roman" w:eastAsia="Times New Roman" w:hAnsi="Times New Roman" w:cs="Times New Roman"/>
-                <w:color w:val="000000"/>
-                <w:sz w:val="22"/>
-                <w:szCs w:val="22"/>
-                <w:u w:val="single"/>
-              </w:rPr>
-              <w:t>., M.Cs.</w:t>
+              <w:t>Maulida Ayu Fitriani, S.Kom., M.Cs.</w:t>
             </w:r>
           </w:p>
           <w:p>
@@ -1493,7 +1346,6 @@
                 <w:szCs w:val="22"/>
               </w:rPr>
             </w:pPr>
-            <w:proofErr w:type="gramStart"/>
             <w:r>
               <w:rPr>
                 <w:rFonts w:ascii="Times New Roman" w:eastAsia="Times New Roman" w:hAnsi="Times New Roman" w:cs="Times New Roman"/>
@@ -1501,17 +1353,7 @@
                 <w:sz w:val="22"/>
                 <w:szCs w:val="22"/>
               </w:rPr>
-              <w:t>NIK./</w:t>
-            </w:r>
-            <w:proofErr w:type="gramEnd"/>
-            <w:r>
-              <w:rPr>
-                <w:rFonts w:ascii="Times New Roman" w:eastAsia="Times New Roman" w:hAnsi="Times New Roman" w:cs="Times New Roman"/>
-                <w:color w:val="000000"/>
-                <w:sz w:val="22"/>
-                <w:szCs w:val="22"/>
-              </w:rPr>
-              <w:t>NIP.</w:t>
+              <w:t>NIK./NIP.</w:t>
             </w:r>
             <w:r>
               <w:rPr>
@@ -1591,7 +1433,6 @@
                 <w:szCs w:val="22"/>
               </w:rPr>
             </w:pPr>
-            <w:proofErr w:type="gramStart"/>
             <w:r>
               <w:rPr>
                 <w:rFonts w:ascii="Times New Roman" w:eastAsia="Times New Roman" w:hAnsi="Times New Roman" w:cs="Times New Roman"/>
@@ -1601,7 +1442,6 @@
               </w:rPr>
               <w:t>NIK./NIP.*</w:t>
             </w:r>
-            <w:proofErr w:type="gramEnd"/>
             <w:r>
               <w:rPr>
                 <w:rFonts w:ascii="Times New Roman" w:eastAsia="Times New Roman" w:hAnsi="Times New Roman" w:cs="Times New Roman"/>
@@ -1728,60 +1568,27 @@
           <w:szCs w:val="22"/>
           <w:u w:val="single"/>
         </w:rPr>
-        <w:t xml:space="preserve">Agung Purwo Wicaksono, S.T., </w:t>
-      </w:r>
-      <w:proofErr w:type="gramStart"/>
+        <w:t>Agung Purwo Wicaksono, S.T., M.Kom.</w:t>
+      </w:r>
+    </w:p>
+    <w:p>
+      <w:pPr>
+        <w:spacing w:line="276" w:lineRule="auto"/>
+        <w:ind w:left="441"/>
+        <w:jc w:val="center"/>
+        <w:rPr>
+          <w:rFonts w:ascii="Times New Roman" w:eastAsia="Times New Roman" w:hAnsi="Times New Roman" w:cs="Times New Roman"/>
+          <w:color w:val="000000"/>
+        </w:rPr>
+      </w:pPr>
       <w:r>
         <w:rPr>
           <w:rFonts w:ascii="Times New Roman" w:eastAsia="Times New Roman" w:hAnsi="Times New Roman" w:cs="Times New Roman"/>
           <w:color w:val="000000"/>
           <w:sz w:val="22"/>
           <w:szCs w:val="22"/>
-          <w:u w:val="single"/>
-        </w:rPr>
-        <w:t>M.Kom</w:t>
-      </w:r>
-      <w:proofErr w:type="gramEnd"/>
-      <w:r>
-        <w:rPr>
-          <w:rFonts w:ascii="Times New Roman" w:eastAsia="Times New Roman" w:hAnsi="Times New Roman" w:cs="Times New Roman"/>
-          <w:color w:val="000000"/>
-          <w:sz w:val="22"/>
-          <w:szCs w:val="22"/>
-          <w:u w:val="single"/>
-        </w:rPr>
-        <w:t>.</w:t>
-      </w:r>
-    </w:p>
-    <w:p>
-      <w:pPr>
-        <w:spacing w:line="276" w:lineRule="auto"/>
-        <w:ind w:left="441"/>
-        <w:jc w:val="center"/>
-        <w:rPr>
-          <w:rFonts w:ascii="Times New Roman" w:eastAsia="Times New Roman" w:hAnsi="Times New Roman" w:cs="Times New Roman"/>
-          <w:color w:val="000000"/>
-        </w:rPr>
-      </w:pPr>
-      <w:proofErr w:type="gramStart"/>
-      <w:r>
-        <w:rPr>
-          <w:rFonts w:ascii="Times New Roman" w:eastAsia="Times New Roman" w:hAnsi="Times New Roman" w:cs="Times New Roman"/>
-          <w:color w:val="000000"/>
-          <w:sz w:val="22"/>
-          <w:szCs w:val="22"/>
-        </w:rPr>
-        <w:t>NIK./</w:t>
-      </w:r>
-      <w:proofErr w:type="gramEnd"/>
-      <w:r>
-        <w:rPr>
-          <w:rFonts w:ascii="Times New Roman" w:eastAsia="Times New Roman" w:hAnsi="Times New Roman" w:cs="Times New Roman"/>
-          <w:color w:val="000000"/>
-          <w:sz w:val="22"/>
-          <w:szCs w:val="22"/>
-        </w:rPr>
-        <w:t>NIP.</w:t>
+        </w:rPr>
+        <w:t>NIK./NIP.</w:t>
       </w:r>
       <w:r>
         <w:rPr>
@@ -12523,7 +12330,7 @@
           <w:noProof/>
         </w:rPr>
         <w:drawing>
-          <wp:inline distT="0" distB="0" distL="0" distR="0" wp14:anchorId="75188C27" wp14:editId="1B78854B">
+          <wp:inline distT="0" distB="0" distL="0" distR="0" wp14:anchorId="75188C27" wp14:editId="455A1287">
             <wp:extent cx="5004000" cy="1844909"/>
             <wp:effectExtent l="19050" t="19050" r="25400" b="22225"/>
             <wp:docPr id="783286403" name="Picture 4"/>
@@ -12899,7 +12706,7 @@
           <w:noProof/>
         </w:rPr>
         <w:drawing>
-          <wp:inline distT="0" distB="0" distL="0" distR="0" wp14:anchorId="02EBA956" wp14:editId="6794050F">
+          <wp:inline distT="0" distB="0" distL="0" distR="0" wp14:anchorId="02EBA956" wp14:editId="3B0EE453">
             <wp:extent cx="3888000" cy="2160000"/>
             <wp:effectExtent l="19050" t="19050" r="17780" b="12065"/>
             <wp:docPr id="102117401" name="Picture 5"/>
@@ -14229,7 +14036,6 @@
           <w:rFonts w:ascii="Times New Roman" w:hAnsi="Times New Roman" w:cs="Times New Roman"/>
         </w:rPr>
       </w:pPr>
-      <w:proofErr w:type="gramStart"/>
       <w:r>
         <w:rPr>
           <w:rFonts w:ascii="Times New Roman" w:hAnsi="Times New Roman" w:cs="Times New Roman"/>
@@ -14244,14 +14050,17 @@
           <w:i/>
           <w:iCs/>
         </w:rPr>
-        <w:t>issing  value</w:t>
-      </w:r>
-      <w:proofErr w:type="gramEnd"/>
-      <w:r>
-        <w:rPr>
-          <w:rFonts w:ascii="Times New Roman" w:hAnsi="Times New Roman" w:cs="Times New Roman"/>
-          <w:i/>
-          <w:iCs/>
+        <w:t xml:space="preserve">issing  value </w:t>
+      </w:r>
+      <w:r>
+        <w:rPr>
+          <w:rFonts w:ascii="Times New Roman" w:hAnsi="Times New Roman" w:cs="Times New Roman"/>
+        </w:rPr>
+        <w:t xml:space="preserve"> adalah  satu  kondisi  dimana  terdapat  nilai  yang  tidak</w:t>
+      </w:r>
+      <w:r>
+        <w:rPr>
+          <w:rFonts w:ascii="Times New Roman" w:hAnsi="Times New Roman" w:cs="Times New Roman"/>
         </w:rPr>
         <w:t xml:space="preserve"> </w:t>
       </w:r>
@@ -14259,114 +14068,8 @@
         <w:rPr>
           <w:rFonts w:ascii="Times New Roman" w:hAnsi="Times New Roman" w:cs="Times New Roman"/>
         </w:rPr>
-        <w:t xml:space="preserve"> </w:t>
-      </w:r>
-      <w:proofErr w:type="gramStart"/>
-      <w:r>
-        <w:rPr>
-          <w:rFonts w:ascii="Times New Roman" w:hAnsi="Times New Roman" w:cs="Times New Roman"/>
-        </w:rPr>
-        <w:t>adalah  satu</w:t>
-      </w:r>
-      <w:proofErr w:type="gramEnd"/>
-      <w:r>
-        <w:rPr>
-          <w:rFonts w:ascii="Times New Roman" w:hAnsi="Times New Roman" w:cs="Times New Roman"/>
-        </w:rPr>
-        <w:t xml:space="preserve">  </w:t>
-      </w:r>
-      <w:proofErr w:type="gramStart"/>
-      <w:r>
-        <w:rPr>
-          <w:rFonts w:ascii="Times New Roman" w:hAnsi="Times New Roman" w:cs="Times New Roman"/>
-        </w:rPr>
-        <w:t>kondisi  dimana</w:t>
-      </w:r>
-      <w:proofErr w:type="gramEnd"/>
-      <w:r>
-        <w:rPr>
-          <w:rFonts w:ascii="Times New Roman" w:hAnsi="Times New Roman" w:cs="Times New Roman"/>
-        </w:rPr>
-        <w:t xml:space="preserve">  </w:t>
-      </w:r>
-      <w:proofErr w:type="gramStart"/>
-      <w:r>
-        <w:rPr>
-          <w:rFonts w:ascii="Times New Roman" w:hAnsi="Times New Roman" w:cs="Times New Roman"/>
-        </w:rPr>
-        <w:t>terdapat  nilai</w:t>
-      </w:r>
-      <w:proofErr w:type="gramEnd"/>
-      <w:r>
-        <w:rPr>
-          <w:rFonts w:ascii="Times New Roman" w:hAnsi="Times New Roman" w:cs="Times New Roman"/>
-        </w:rPr>
-        <w:t xml:space="preserve">  </w:t>
-      </w:r>
-      <w:proofErr w:type="gramStart"/>
-      <w:r>
-        <w:rPr>
-          <w:rFonts w:ascii="Times New Roman" w:hAnsi="Times New Roman" w:cs="Times New Roman"/>
-        </w:rPr>
-        <w:t>yang  tidak</w:t>
-      </w:r>
-      <w:proofErr w:type="gramEnd"/>
-      <w:r>
-        <w:rPr>
-          <w:rFonts w:ascii="Times New Roman" w:hAnsi="Times New Roman" w:cs="Times New Roman"/>
-        </w:rPr>
-        <w:t xml:space="preserve"> </w:t>
-      </w:r>
-      <w:proofErr w:type="gramStart"/>
-      <w:r>
-        <w:rPr>
-          <w:rFonts w:ascii="Times New Roman" w:hAnsi="Times New Roman" w:cs="Times New Roman"/>
-        </w:rPr>
-        <w:t>lengkap  atau</w:t>
-      </w:r>
-      <w:proofErr w:type="gramEnd"/>
-      <w:r>
-        <w:rPr>
-          <w:rFonts w:ascii="Times New Roman" w:hAnsi="Times New Roman" w:cs="Times New Roman"/>
-        </w:rPr>
-        <w:t xml:space="preserve">  </w:t>
-      </w:r>
-      <w:proofErr w:type="gramStart"/>
-      <w:r>
-        <w:rPr>
-          <w:rFonts w:ascii="Times New Roman" w:hAnsi="Times New Roman" w:cs="Times New Roman"/>
-        </w:rPr>
-        <w:t>kosong  pada</w:t>
-      </w:r>
-      <w:proofErr w:type="gramEnd"/>
-      <w:r>
-        <w:rPr>
-          <w:rFonts w:ascii="Times New Roman" w:hAnsi="Times New Roman" w:cs="Times New Roman"/>
-        </w:rPr>
-        <w:t xml:space="preserve">  </w:t>
-      </w:r>
-      <w:proofErr w:type="gramStart"/>
-      <w:r>
-        <w:rPr>
-          <w:rFonts w:ascii="Times New Roman" w:hAnsi="Times New Roman" w:cs="Times New Roman"/>
-        </w:rPr>
-        <w:t>satu  atau</w:t>
-      </w:r>
-      <w:proofErr w:type="gramEnd"/>
-      <w:r>
-        <w:rPr>
-          <w:rFonts w:ascii="Times New Roman" w:hAnsi="Times New Roman" w:cs="Times New Roman"/>
-        </w:rPr>
-        <w:t xml:space="preserve">  </w:t>
-      </w:r>
-      <w:proofErr w:type="gramStart"/>
-      <w:r>
-        <w:rPr>
-          <w:rFonts w:ascii="Times New Roman" w:hAnsi="Times New Roman" w:cs="Times New Roman"/>
-        </w:rPr>
-        <w:t>beberapa  kriteria</w:t>
-      </w:r>
-      <w:proofErr w:type="gramEnd"/>
+        <w:t>lengkap  atau  kosong  pada  satu  atau  beberapa  kriteria</w:t>
+      </w:r>
       <w:r>
         <w:rPr>
           <w:rFonts w:ascii="Times New Roman" w:hAnsi="Times New Roman" w:cs="Times New Roman"/>
@@ -15066,7 +14769,7 @@
       <w:pPr>
         <w:pStyle w:val="ListParagraph"/>
         <w:spacing w:line="480" w:lineRule="auto"/>
-        <w:ind w:left="1440" w:firstLine="720"/>
+        <w:ind w:left="1440"/>
         <w:jc w:val="both"/>
         <w:rPr>
           <w:rFonts w:ascii="Times New Roman" w:hAnsi="Times New Roman" w:cs="Times New Roman"/>
@@ -15176,18 +14879,47 @@
     <w:p>
       <w:pPr>
         <w:pStyle w:val="ListParagraph"/>
+        <w:numPr>
+          <w:ilvl w:val="0"/>
+          <w:numId w:val="44"/>
+        </w:numPr>
+        <w:spacing w:line="480" w:lineRule="auto"/>
+        <w:jc w:val="both"/>
+        <w:rPr>
+          <w:rFonts w:ascii="Times New Roman" w:hAnsi="Times New Roman" w:cs="Times New Roman"/>
+        </w:rPr>
+      </w:pPr>
+      <w:r>
+        <w:rPr>
+          <w:rFonts w:ascii="Times New Roman" w:hAnsi="Times New Roman" w:cs="Times New Roman"/>
+        </w:rPr>
+        <w:t xml:space="preserve">Jalur </w:t>
+      </w:r>
+      <w:r>
+        <w:rPr>
+          <w:rFonts w:ascii="Times New Roman" w:hAnsi="Times New Roman" w:cs="Times New Roman"/>
+        </w:rPr>
+        <w:t>p</w:t>
+      </w:r>
+      <w:r>
+        <w:rPr>
+          <w:rFonts w:ascii="Times New Roman" w:hAnsi="Times New Roman" w:cs="Times New Roman"/>
+        </w:rPr>
+        <w:t>endaftaran</w:t>
+      </w:r>
+    </w:p>
+    <w:p>
+      <w:pPr>
         <w:keepNext/>
         <w:spacing w:line="480" w:lineRule="auto"/>
-        <w:ind w:left="1440"/>
         <w:jc w:val="center"/>
       </w:pPr>
       <w:r>
         <w:rPr>
-          <w:rFonts w:ascii="Times New Roman" w:hAnsi="Times New Roman" w:cs="Times New Roman"/>
           <w:noProof/>
         </w:rPr>
         <w:drawing>
-          <wp:inline distT="0" distB="0" distL="0" distR="0" wp14:anchorId="13F96043" wp14:editId="0FEFCD97">
+          <wp:inline distT="0" distB="0" distL="0" distR="0" wp14:anchorId="71F22594" wp14:editId="719895F9">
             <wp:extent cx="4680000" cy="2676309"/>
             <wp:effectExtent l="0" t="0" r="6350" b="0"/>
             <wp:docPr id="817290869" name="Picture 5"/>
@@ -15239,56 +14971,98 @@
     <w:p>
       <w:pPr>
         <w:pStyle w:val="Caption"/>
+        <w:jc w:val="center"/>
+        <w:rPr>
+          <w:rFonts w:ascii="Times New Roman" w:hAnsi="Times New Roman" w:cs="Times New Roman"/>
+        </w:rPr>
+      </w:pPr>
+      <w:r>
+        <w:t xml:space="preserve">Gambar 3. </w:t>
+      </w:r>
+      <w:r>
+        <w:fldChar w:fldCharType="begin"/>
+      </w:r>
+      <w:r>
+        <w:instrText xml:space="preserve"> SEQ Gambar_3. \* ARABIC </w:instrText>
+      </w:r>
+      <w:r>
+        <w:fldChar w:fldCharType="separate"/>
+      </w:r>
+      <w:r>
+        <w:rPr>
+          <w:noProof/>
+        </w:rPr>
+        <w:t>12</w:t>
+      </w:r>
+      <w:r>
+        <w:fldChar w:fldCharType="end"/>
+      </w:r>
+      <w:r>
+        <w:t xml:space="preserve"> distribusi jalur pendaftaran</w:t>
+      </w:r>
+    </w:p>
+    <w:p>
+      <w:pPr>
+        <w:pStyle w:val="ListParagraph"/>
         <w:spacing w:line="480" w:lineRule="auto"/>
-        <w:jc w:val="center"/>
-        <w:rPr>
-          <w:rFonts w:ascii="Times New Roman" w:hAnsi="Times New Roman" w:cs="Times New Roman"/>
-        </w:rPr>
-      </w:pPr>
-      <w:bookmarkStart w:id="62" w:name="_Toc200446307"/>
-      <w:bookmarkStart w:id="63" w:name="_Toc200618669"/>
-      <w:bookmarkStart w:id="64" w:name="_Toc200619029"/>
-      <w:r>
-        <w:t xml:space="preserve">Gambar 3. </w:t>
-      </w:r>
-      <w:r>
-        <w:fldChar w:fldCharType="begin"/>
-      </w:r>
-      <w:r>
-        <w:instrText xml:space="preserve"> SEQ Gambar_3. \* ARABIC </w:instrText>
-      </w:r>
-      <w:r>
-        <w:fldChar w:fldCharType="separate"/>
-      </w:r>
-      <w:r>
-        <w:rPr>
-          <w:noProof/>
-        </w:rPr>
-        <w:t>12</w:t>
-      </w:r>
-      <w:r>
-        <w:rPr>
-          <w:noProof/>
-        </w:rPr>
-        <w:fldChar w:fldCharType="end"/>
-      </w:r>
-      <w:r>
-        <w:t xml:space="preserve"> d</w:t>
-      </w:r>
-      <w:r>
-        <w:t>istribusi jalur pendaftaran</w:t>
-      </w:r>
-      <w:bookmarkEnd w:id="62"/>
-      <w:bookmarkEnd w:id="63"/>
-      <w:bookmarkEnd w:id="64"/>
+        <w:ind w:left="2160" w:firstLine="720"/>
+        <w:jc w:val="both"/>
+        <w:rPr>
+          <w:rFonts w:ascii="Times New Roman" w:hAnsi="Times New Roman" w:cs="Times New Roman"/>
+        </w:rPr>
+      </w:pPr>
+      <w:r>
+        <w:rPr>
+          <w:rFonts w:ascii="Times New Roman" w:hAnsi="Times New Roman" w:cs="Times New Roman"/>
+        </w:rPr>
+        <w:lastRenderedPageBreak/>
+        <w:t>Distribusi data untuk kolom Jalur Pendaftaran menunjukkan sebaran yang normal dan tidak mengandung nilai anomali. Dari hasil visualisasi, terlihat bahwa jalur-jalur dominan seperti CBT, Nilai Rapor, dan Nilai SNBT memiliki jumlah pendaftar yang jauh lebih tinggi dibandingkan jalur lain, yang merupakan hal yang wajar karena ketiga jalur ini memang menjadi jalur utama penerimaan mahasiswa di UMP.</w:t>
+      </w:r>
+    </w:p>
+    <w:p>
+      <w:pPr>
+        <w:pStyle w:val="ListParagraph"/>
+        <w:spacing w:line="480" w:lineRule="auto"/>
+        <w:ind w:left="2160" w:firstLine="720"/>
+        <w:jc w:val="both"/>
+        <w:rPr>
+          <w:rFonts w:ascii="Times New Roman" w:hAnsi="Times New Roman" w:cs="Times New Roman"/>
+        </w:rPr>
+      </w:pPr>
+      <w:r>
+        <w:rPr>
+          <w:rFonts w:ascii="Times New Roman" w:hAnsi="Times New Roman" w:cs="Times New Roman"/>
+        </w:rPr>
+        <w:t>Sementara itu, jalur lain seperti PPG, Profesi Apoteker, Pascasarjana, hingga jalur-jalur khusus seperti Alih Jenjang Program TLM dan FAST TRACK MAGISTER memiliki jumlah pendaftar yang jauh lebih sedikit, namun tetap relevan karena diperuntukkan bagi target segmentasi tertentu. Tidak ditemukan adanya nilai yang mencurigakan, kesalahan penulisan, ataupun entri yang tidak lazim dalam kolom ini.</w:t>
+      </w:r>
+    </w:p>
+    <w:p>
+      <w:pPr>
+        <w:pStyle w:val="ListParagraph"/>
+        <w:numPr>
+          <w:ilvl w:val="0"/>
+          <w:numId w:val="44"/>
+        </w:numPr>
+        <w:spacing w:line="480" w:lineRule="auto"/>
+        <w:jc w:val="both"/>
+        <w:rPr>
+          <w:rFonts w:ascii="Times New Roman" w:hAnsi="Times New Roman" w:cs="Times New Roman"/>
+        </w:rPr>
+      </w:pPr>
+      <w:r>
+        <w:rPr>
+          <w:rFonts w:ascii="Times New Roman" w:hAnsi="Times New Roman" w:cs="Times New Roman"/>
+        </w:rPr>
+        <w:t>Tahun</w:t>
+      </w:r>
     </w:p>
     <w:p>
       <w:pPr>
         <w:pStyle w:val="ListParagraph"/>
         <w:keepNext/>
         <w:spacing w:line="480" w:lineRule="auto"/>
-        <w:ind w:left="1440"/>
-        <w:jc w:val="center"/>
+        <w:ind w:left="2160"/>
+        <w:jc w:val="both"/>
       </w:pPr>
       <w:r>
         <w:rPr>
@@ -15297,7 +15071,7 @@
         </w:rPr>
         <w:lastRenderedPageBreak/>
         <w:drawing>
-          <wp:inline distT="0" distB="0" distL="0" distR="0" wp14:anchorId="2292EACF" wp14:editId="595C28B0">
+          <wp:inline distT="0" distB="0" distL="0" distR="0" wp14:anchorId="26410C5C" wp14:editId="2883DCA5">
             <wp:extent cx="3240000" cy="2616184"/>
             <wp:effectExtent l="0" t="0" r="0" b="0"/>
             <wp:docPr id="1849742446" name="Picture 6"/>
@@ -15349,65 +15123,125 @@
     <w:p>
       <w:pPr>
         <w:pStyle w:val="Caption"/>
+        <w:jc w:val="center"/>
+        <w:rPr>
+          <w:rFonts w:ascii="Times New Roman" w:hAnsi="Times New Roman" w:cs="Times New Roman"/>
+        </w:rPr>
+      </w:pPr>
+      <w:r>
+        <w:t xml:space="preserve">Gambar 3. </w:t>
+      </w:r>
+      <w:r>
+        <w:fldChar w:fldCharType="begin"/>
+      </w:r>
+      <w:r>
+        <w:instrText xml:space="preserve"> SEQ Gambar_3. \* ARABIC </w:instrText>
+      </w:r>
+      <w:r>
+        <w:fldChar w:fldCharType="separate"/>
+      </w:r>
+      <w:r>
+        <w:rPr>
+          <w:noProof/>
+        </w:rPr>
+        <w:t>13</w:t>
+      </w:r>
+      <w:r>
+        <w:fldChar w:fldCharType="end"/>
+      </w:r>
+      <w:r>
+        <w:t xml:space="preserve"> distribusi </w:t>
+      </w:r>
+      <w:r>
+        <w:t>tahun</w:t>
+      </w:r>
+    </w:p>
+    <w:p>
+      <w:pPr>
+        <w:pStyle w:val="ListParagraph"/>
+        <w:spacing w:line="480" w:lineRule="auto"/>
+        <w:ind w:left="2160" w:firstLine="720"/>
+        <w:jc w:val="both"/>
+        <w:rPr>
+          <w:rFonts w:ascii="Times New Roman" w:hAnsi="Times New Roman" w:cs="Times New Roman"/>
+        </w:rPr>
+      </w:pPr>
+      <w:r>
+        <w:rPr>
+          <w:rFonts w:ascii="Times New Roman" w:hAnsi="Times New Roman" w:cs="Times New Roman"/>
+        </w:rPr>
+        <w:t xml:space="preserve">Dari segi validasi, </w:t>
+      </w:r>
+      <w:r>
+        <w:rPr>
+          <w:rFonts w:ascii="Times New Roman" w:hAnsi="Times New Roman" w:cs="Times New Roman"/>
+        </w:rPr>
+        <w:t xml:space="preserve">distribusi pada kolom </w:t>
+      </w:r>
+      <w:r>
+        <w:rPr>
+          <w:rFonts w:ascii="Times New Roman" w:hAnsi="Times New Roman" w:cs="Times New Roman"/>
+        </w:rPr>
+        <w:t>TAHUN</w:t>
+      </w:r>
+      <w:r>
+        <w:rPr>
+          <w:rFonts w:ascii="Times New Roman" w:hAnsi="Times New Roman" w:cs="Times New Roman"/>
+        </w:rPr>
+        <w:t xml:space="preserve"> </w:t>
+      </w:r>
+      <w:r>
+        <w:rPr>
+          <w:rFonts w:ascii="Times New Roman" w:hAnsi="Times New Roman" w:cs="Times New Roman"/>
+        </w:rPr>
+        <w:t xml:space="preserve">tidak ditemukan nilai tahun yang di luar rentang logis (misalnya tahun sebelum 2014 atau setelah 2024), serta tidak ada duplikasi penamaan atau format yang tidak konsisten. Dengan demikian, distribusi data pada kolom TAHUN dapat dinyatakan valid dan layak digunakan untuk proses </w:t>
+      </w:r>
+      <w:r>
+        <w:rPr>
+          <w:rFonts w:ascii="Times New Roman" w:hAnsi="Times New Roman" w:cs="Times New Roman"/>
+        </w:rPr>
+        <w:t xml:space="preserve">visualisasi </w:t>
+      </w:r>
+      <w:r>
+        <w:rPr>
+          <w:rFonts w:ascii="Times New Roman" w:hAnsi="Times New Roman" w:cs="Times New Roman"/>
+        </w:rPr>
+        <w:t>tren lebih lanjut.</w:t>
+      </w:r>
+    </w:p>
+    <w:p>
+      <w:pPr>
+        <w:pStyle w:val="ListParagraph"/>
+        <w:numPr>
+          <w:ilvl w:val="0"/>
+          <w:numId w:val="44"/>
+        </w:numPr>
+        <w:spacing w:line="480" w:lineRule="auto"/>
+        <w:jc w:val="both"/>
+        <w:rPr>
+          <w:rFonts w:ascii="Times New Roman" w:hAnsi="Times New Roman" w:cs="Times New Roman"/>
+        </w:rPr>
+      </w:pPr>
+      <w:r>
+        <w:rPr>
+          <w:rFonts w:ascii="Times New Roman" w:hAnsi="Times New Roman" w:cs="Times New Roman"/>
+        </w:rPr>
+        <w:t>Prodi pilihan 1</w:t>
+      </w:r>
+    </w:p>
+    <w:p>
+      <w:pPr>
+        <w:keepNext/>
         <w:spacing w:line="480" w:lineRule="auto"/>
         <w:jc w:val="center"/>
-        <w:rPr>
-          <w:rFonts w:ascii="Times New Roman" w:hAnsi="Times New Roman" w:cs="Times New Roman"/>
-        </w:rPr>
-      </w:pPr>
-      <w:bookmarkStart w:id="65" w:name="_Toc200446308"/>
-      <w:bookmarkStart w:id="66" w:name="_Toc200618670"/>
-      <w:bookmarkStart w:id="67" w:name="_Toc200619030"/>
-      <w:r>
-        <w:t xml:space="preserve">Gambar 3. </w:t>
-      </w:r>
-      <w:r>
-        <w:fldChar w:fldCharType="begin"/>
-      </w:r>
-      <w:r>
-        <w:instrText xml:space="preserve"> SEQ Gambar_3. \* ARABIC </w:instrText>
-      </w:r>
-      <w:r>
-        <w:fldChar w:fldCharType="separate"/>
-      </w:r>
-      <w:r>
-        <w:rPr>
-          <w:noProof/>
-        </w:rPr>
-        <w:t>13</w:t>
-      </w:r>
-      <w:r>
-        <w:rPr>
-          <w:noProof/>
-        </w:rPr>
-        <w:fldChar w:fldCharType="end"/>
-      </w:r>
-      <w:r>
-        <w:t xml:space="preserve"> d</w:t>
-      </w:r>
-      <w:r>
-        <w:t>istribusi tahun</w:t>
-      </w:r>
-      <w:bookmarkEnd w:id="65"/>
-      <w:bookmarkEnd w:id="66"/>
-      <w:bookmarkEnd w:id="67"/>
-    </w:p>
-    <w:p>
-      <w:pPr>
-        <w:pStyle w:val="ListParagraph"/>
-        <w:keepNext/>
-        <w:spacing w:line="480" w:lineRule="auto"/>
-        <w:ind w:left="1440"/>
-        <w:jc w:val="center"/>
-      </w:pPr>
-      <w:r>
-        <w:rPr>
-          <w:rFonts w:ascii="Times New Roman" w:hAnsi="Times New Roman" w:cs="Times New Roman"/>
+      </w:pPr>
+      <w:r>
+        <w:rPr>
           <w:noProof/>
         </w:rPr>
         <w:lastRenderedPageBreak/>
         <w:drawing>
-          <wp:inline distT="0" distB="0" distL="0" distR="0" wp14:anchorId="7A51DBB8" wp14:editId="74413FDB">
+          <wp:inline distT="0" distB="0" distL="0" distR="0" wp14:anchorId="7A5235CA" wp14:editId="3EE6896F">
             <wp:extent cx="4680000" cy="4873228"/>
             <wp:effectExtent l="0" t="0" r="6350" b="3810"/>
             <wp:docPr id="1576637060" name="Picture 7"/>
@@ -15459,64 +15293,106 @@
     <w:p>
       <w:pPr>
         <w:pStyle w:val="Caption"/>
+        <w:jc w:val="center"/>
+        <w:rPr>
+          <w:rFonts w:ascii="Times New Roman" w:hAnsi="Times New Roman" w:cs="Times New Roman"/>
+        </w:rPr>
+      </w:pPr>
+      <w:r>
+        <w:t xml:space="preserve">Gambar 3. </w:t>
+      </w:r>
+      <w:r>
+        <w:fldChar w:fldCharType="begin"/>
+      </w:r>
+      <w:r>
+        <w:instrText xml:space="preserve"> SEQ Gambar_3. \* ARABIC </w:instrText>
+      </w:r>
+      <w:r>
+        <w:fldChar w:fldCharType="separate"/>
+      </w:r>
+      <w:r>
+        <w:rPr>
+          <w:noProof/>
+        </w:rPr>
+        <w:t>14</w:t>
+      </w:r>
+      <w:r>
+        <w:fldChar w:fldCharType="end"/>
+      </w:r>
+      <w:r>
+        <w:t xml:space="preserve"> distribusi </w:t>
+      </w:r>
+      <w:r>
+        <w:t>prodi pilihan 1</w:t>
+      </w:r>
+    </w:p>
+    <w:p>
+      <w:pPr>
+        <w:pStyle w:val="ListParagraph"/>
+        <w:spacing w:line="480" w:lineRule="auto"/>
+        <w:ind w:left="2160" w:firstLine="720"/>
+        <w:jc w:val="both"/>
+        <w:rPr>
+          <w:rFonts w:ascii="Times New Roman" w:hAnsi="Times New Roman" w:cs="Times New Roman"/>
+        </w:rPr>
+      </w:pPr>
+      <w:r>
+        <w:rPr>
+          <w:rFonts w:ascii="Times New Roman" w:hAnsi="Times New Roman" w:cs="Times New Roman"/>
+        </w:rPr>
+        <w:t>Distribusi data pada kolom Prodi Pilihan 1 menunjukkan keberagaman pilihan program studi dari para pendaftar mahasiswa baru. Terlihat bahwa program studi seperti Farmasi, Manajemen S1, dan Pendidikan Dokter menjadi pilihan terbanyak. Sementara itu, terdapat pula beberapa program studi dengan jumlah peminat yang relatif rendah, seperti PPG Pendidikan Biologi, PPG Pekerjaan Sosial, hingga Program Pertukaran Mahasiswa.</w:t>
+      </w:r>
+    </w:p>
+    <w:p>
+      <w:pPr>
+        <w:pStyle w:val="ListParagraph"/>
+        <w:spacing w:line="480" w:lineRule="auto"/>
+        <w:ind w:left="2160" w:firstLine="720"/>
+        <w:jc w:val="both"/>
+        <w:rPr>
+          <w:rFonts w:ascii="Times New Roman" w:hAnsi="Times New Roman" w:cs="Times New Roman"/>
+        </w:rPr>
+      </w:pPr>
+      <w:r>
+        <w:rPr>
+          <w:rFonts w:ascii="Times New Roman" w:hAnsi="Times New Roman" w:cs="Times New Roman"/>
+        </w:rPr>
+        <w:lastRenderedPageBreak/>
+        <w:t>Namun, pada pengecekan ini ditemukan satu nilai anomali berupa karakter "-" yang tidak merepresentasikan nama program studi manapun. Nilai tersebut bisa berasal dari data kosong yang belum terisi dengan benar atau kesalahan input saat pendataan. Nilai anomali ini perlu ditindaklanjuti pada tahap problem solving untuk diperbaiki agar tidak mengganggu hasil visualisasi pada dashboard akhir.</w:t>
+      </w:r>
+    </w:p>
+    <w:p>
+      <w:pPr>
+        <w:pStyle w:val="ListParagraph"/>
+        <w:numPr>
+          <w:ilvl w:val="0"/>
+          <w:numId w:val="44"/>
+        </w:numPr>
+        <w:spacing w:line="480" w:lineRule="auto"/>
+        <w:jc w:val="both"/>
+        <w:rPr>
+          <w:rFonts w:ascii="Times New Roman" w:hAnsi="Times New Roman" w:cs="Times New Roman"/>
+        </w:rPr>
+      </w:pPr>
+      <w:r>
+        <w:rPr>
+          <w:rFonts w:ascii="Times New Roman" w:hAnsi="Times New Roman" w:cs="Times New Roman"/>
+        </w:rPr>
+        <w:t>Fakultas prodi pilihan 1</w:t>
+      </w:r>
+    </w:p>
+    <w:p>
+      <w:pPr>
+        <w:keepNext/>
         <w:spacing w:line="480" w:lineRule="auto"/>
         <w:jc w:val="center"/>
-        <w:rPr>
-          <w:rFonts w:ascii="Times New Roman" w:hAnsi="Times New Roman" w:cs="Times New Roman"/>
-        </w:rPr>
-      </w:pPr>
-      <w:bookmarkStart w:id="68" w:name="_Toc200446309"/>
-      <w:bookmarkStart w:id="69" w:name="_Toc200618671"/>
-      <w:bookmarkStart w:id="70" w:name="_Toc200619031"/>
-      <w:r>
-        <w:t xml:space="preserve">Gambar 3. </w:t>
-      </w:r>
-      <w:r>
-        <w:fldChar w:fldCharType="begin"/>
-      </w:r>
-      <w:r>
-        <w:instrText xml:space="preserve"> SEQ Gambar_3. \* ARABIC </w:instrText>
-      </w:r>
-      <w:r>
-        <w:fldChar w:fldCharType="separate"/>
-      </w:r>
+      </w:pPr>
       <w:r>
         <w:rPr>
           <w:noProof/>
         </w:rPr>
-        <w:t>14</w:t>
-      </w:r>
-      <w:r>
-        <w:rPr>
-          <w:noProof/>
-        </w:rPr>
-        <w:fldChar w:fldCharType="end"/>
-      </w:r>
-      <w:r>
-        <w:t xml:space="preserve"> d</w:t>
-      </w:r>
-      <w:r>
-        <w:t>istribusi prodi pilihan 1</w:t>
-      </w:r>
-      <w:bookmarkEnd w:id="68"/>
-      <w:bookmarkEnd w:id="69"/>
-      <w:bookmarkEnd w:id="70"/>
-    </w:p>
-    <w:p>
-      <w:pPr>
-        <w:pStyle w:val="ListParagraph"/>
-        <w:keepNext/>
-        <w:spacing w:line="480" w:lineRule="auto"/>
-        <w:ind w:left="1440"/>
-        <w:jc w:val="center"/>
-      </w:pPr>
-      <w:r>
-        <w:rPr>
-          <w:rFonts w:ascii="Times New Roman" w:hAnsi="Times New Roman" w:cs="Times New Roman"/>
-          <w:noProof/>
-        </w:rPr>
         <w:drawing>
-          <wp:inline distT="0" distB="0" distL="0" distR="0" wp14:anchorId="060BE810" wp14:editId="1EDF327C">
+          <wp:inline distT="0" distB="0" distL="0" distR="0" wp14:anchorId="6CE6529E" wp14:editId="5AFC640B">
             <wp:extent cx="4680000" cy="1652320"/>
             <wp:effectExtent l="0" t="0" r="6350" b="5080"/>
             <wp:docPr id="3550065" name="Picture 8"/>
@@ -15573,9 +15449,6 @@
           <w:rFonts w:ascii="Times New Roman" w:hAnsi="Times New Roman" w:cs="Times New Roman"/>
         </w:rPr>
       </w:pPr>
-      <w:bookmarkStart w:id="71" w:name="_Toc200446310"/>
-      <w:bookmarkStart w:id="72" w:name="_Toc200618672"/>
-      <w:bookmarkStart w:id="73" w:name="_Toc200619032"/>
       <w:r>
         <w:t xml:space="preserve">Gambar 3. </w:t>
       </w:r>
@@ -15595,37 +15468,83 @@
         <w:t>15</w:t>
       </w:r>
       <w:r>
-        <w:rPr>
-          <w:noProof/>
-        </w:rPr>
         <w:fldChar w:fldCharType="end"/>
       </w:r>
       <w:r>
-        <w:t xml:space="preserve"> d</w:t>
-      </w:r>
-      <w:r>
-        <w:t>istribusi fakultas prodi pilihan 1</w:t>
-      </w:r>
-      <w:bookmarkEnd w:id="71"/>
-      <w:bookmarkEnd w:id="72"/>
-      <w:bookmarkEnd w:id="73"/>
+        <w:t xml:space="preserve"> distribusi</w:t>
+      </w:r>
+      <w:r>
+        <w:t xml:space="preserve"> fakultas prodi pilihan 1</w:t>
+      </w:r>
     </w:p>
     <w:p>
       <w:pPr>
         <w:pStyle w:val="ListParagraph"/>
+        <w:spacing w:line="480" w:lineRule="auto"/>
+        <w:ind w:left="2160" w:firstLine="720"/>
+        <w:jc w:val="both"/>
+        <w:rPr>
+          <w:rFonts w:ascii="Times New Roman" w:hAnsi="Times New Roman" w:cs="Times New Roman"/>
+        </w:rPr>
+      </w:pPr>
+      <w:r>
+        <w:rPr>
+          <w:rFonts w:ascii="Times New Roman" w:hAnsi="Times New Roman" w:cs="Times New Roman"/>
+        </w:rPr>
+        <w:t>Distribusi pada kolom Fakultas Prodi Pilihan 1 menunjukkan bahwa sebagian besar pendaftar memilih program studi yang berada di bawah naungan Fakultas Farmasi, Fakultas Keguruan dan Ilmu Pendidikan, serta Fakultas Ekonomi dan Bisnis. Hal ini selaras dengan temuan pada kolom Prodi Pilihan 1, di mana Farmasi dan Manajemen merupakan dua dari program studi dengan jumlah pendaftar tertinggi.</w:t>
+      </w:r>
+    </w:p>
+    <w:p>
+      <w:pPr>
+        <w:pStyle w:val="ListParagraph"/>
+        <w:spacing w:line="480" w:lineRule="auto"/>
+        <w:ind w:left="2160" w:firstLine="720"/>
+        <w:jc w:val="both"/>
+        <w:rPr>
+          <w:rFonts w:ascii="Times New Roman" w:hAnsi="Times New Roman" w:cs="Times New Roman"/>
+        </w:rPr>
+      </w:pPr>
+      <w:r>
+        <w:rPr>
+          <w:rFonts w:ascii="Times New Roman" w:hAnsi="Times New Roman" w:cs="Times New Roman"/>
+        </w:rPr>
+        <w:lastRenderedPageBreak/>
+        <w:t>Namun demikian, pada distribusi kolom Fakultas Prodi Pilihan 1 ditemukan adanya satu nilai anomali berupa karakter “-”. Nilai ini tidak mewakili nama fakultas apapun yang ada di Universitas Muhammadiyah Purwokerto. Kemunculan karakter ini mengindikasikan adanya data yang tidak terisi dengan benar atau kesalahan input pada tahap pencatatan awal. Oleh karena itu, nilai ini perlu ditindaklanjuti pada tahap problem solving agar tidak memengaruhi hasil visualisasi secara keseluruhan.</w:t>
+      </w:r>
+    </w:p>
+    <w:p>
+      <w:pPr>
+        <w:pStyle w:val="ListParagraph"/>
+        <w:numPr>
+          <w:ilvl w:val="0"/>
+          <w:numId w:val="44"/>
+        </w:numPr>
+        <w:spacing w:line="480" w:lineRule="auto"/>
+        <w:jc w:val="both"/>
+        <w:rPr>
+          <w:rFonts w:ascii="Times New Roman" w:hAnsi="Times New Roman" w:cs="Times New Roman"/>
+        </w:rPr>
+      </w:pPr>
+      <w:r>
+        <w:rPr>
+          <w:rFonts w:ascii="Times New Roman" w:hAnsi="Times New Roman" w:cs="Times New Roman"/>
+        </w:rPr>
+        <w:t>Prodi pilihan 2</w:t>
+      </w:r>
+    </w:p>
+    <w:p>
+      <w:pPr>
         <w:keepNext/>
         <w:spacing w:line="480" w:lineRule="auto"/>
-        <w:ind w:left="1440"/>
         <w:jc w:val="center"/>
       </w:pPr>
       <w:r>
         <w:rPr>
-          <w:rFonts w:ascii="Times New Roman" w:hAnsi="Times New Roman" w:cs="Times New Roman"/>
           <w:noProof/>
         </w:rPr>
         <w:lastRenderedPageBreak/>
         <w:drawing>
-          <wp:inline distT="0" distB="0" distL="0" distR="0" wp14:anchorId="5EBC01C6" wp14:editId="4F3DA8CB">
+          <wp:inline distT="0" distB="0" distL="0" distR="0" wp14:anchorId="23CEC3F2" wp14:editId="4E3FEC49">
             <wp:extent cx="4680000" cy="5047036"/>
             <wp:effectExtent l="0" t="0" r="6350" b="1270"/>
             <wp:docPr id="1878337612" name="Picture 9"/>
@@ -15677,65 +15596,106 @@
     <w:p>
       <w:pPr>
         <w:pStyle w:val="Caption"/>
+        <w:jc w:val="center"/>
+        <w:rPr>
+          <w:rFonts w:ascii="Times New Roman" w:hAnsi="Times New Roman" w:cs="Times New Roman"/>
+        </w:rPr>
+      </w:pPr>
+      <w:r>
+        <w:t xml:space="preserve">Gambar 3. </w:t>
+      </w:r>
+      <w:r>
+        <w:fldChar w:fldCharType="begin"/>
+      </w:r>
+      <w:r>
+        <w:instrText xml:space="preserve"> SEQ Gambar_3. \* ARABIC </w:instrText>
+      </w:r>
+      <w:r>
+        <w:fldChar w:fldCharType="separate"/>
+      </w:r>
+      <w:r>
+        <w:rPr>
+          <w:noProof/>
+        </w:rPr>
+        <w:t>16</w:t>
+      </w:r>
+      <w:r>
+        <w:fldChar w:fldCharType="end"/>
+      </w:r>
+      <w:r>
+        <w:t xml:space="preserve"> distribusi </w:t>
+      </w:r>
+      <w:r>
+        <w:t>prodi pilihan 2</w:t>
+      </w:r>
+    </w:p>
+    <w:p>
+      <w:pPr>
+        <w:pStyle w:val="ListParagraph"/>
+        <w:spacing w:line="480" w:lineRule="auto"/>
+        <w:ind w:left="2160" w:firstLine="720"/>
+        <w:jc w:val="both"/>
+        <w:rPr>
+          <w:rFonts w:ascii="Times New Roman" w:hAnsi="Times New Roman" w:cs="Times New Roman"/>
+        </w:rPr>
+      </w:pPr>
+      <w:r>
+        <w:rPr>
+          <w:rFonts w:ascii="Times New Roman" w:hAnsi="Times New Roman" w:cs="Times New Roman"/>
+        </w:rPr>
+        <w:t>Distribusi pada kolom Prodi Pilihan 2 menunjukkan bahwa program studi seperti Manajemen S1, Psikologi, dan Keperawatan S1 menjadi pilihan kedua yang paling banyak dipilih oleh pendaftar. Selain itu, prodi seperti Akuntansi S1, Ilmu Hukum, dan Teknik Informatika juga menunjukkan angka yang cukup tinggi, menandakan bahwa prodi-prodi tersebut cukup diminati meskipun bukan pilihan utama.</w:t>
+      </w:r>
+    </w:p>
+    <w:p>
+      <w:pPr>
+        <w:pStyle w:val="ListParagraph"/>
+        <w:spacing w:line="480" w:lineRule="auto"/>
+        <w:ind w:left="2160" w:firstLine="720"/>
+        <w:jc w:val="both"/>
+        <w:rPr>
+          <w:rFonts w:ascii="Times New Roman" w:hAnsi="Times New Roman" w:cs="Times New Roman"/>
+        </w:rPr>
+      </w:pPr>
+      <w:r>
+        <w:rPr>
+          <w:rFonts w:ascii="Times New Roman" w:hAnsi="Times New Roman" w:cs="Times New Roman"/>
+        </w:rPr>
+        <w:lastRenderedPageBreak/>
+        <w:t>Namun, pada distribusi ini ditemukan satu nilai anomali berupa karakter “-” yang tidak merepresentasikan nama program studi manapun. Nilai tersebut tidak sesuai dengan format yang diharapkan dan perlu ditindaklanjuti pada tahap problem solving agar tidak mengganggu kualitas visualisasi secara keseluruhan. Keberadaan karakter ini mengindikasikan adanya entri yang tidak terisi dengan benar atau kemungkinan kesalahan dalam proses input data.</w:t>
+      </w:r>
+    </w:p>
+    <w:p>
+      <w:pPr>
+        <w:pStyle w:val="ListParagraph"/>
+        <w:numPr>
+          <w:ilvl w:val="0"/>
+          <w:numId w:val="44"/>
+        </w:numPr>
+        <w:spacing w:line="480" w:lineRule="auto"/>
+        <w:jc w:val="both"/>
+        <w:rPr>
+          <w:rFonts w:ascii="Times New Roman" w:hAnsi="Times New Roman" w:cs="Times New Roman"/>
+        </w:rPr>
+      </w:pPr>
+      <w:r>
+        <w:rPr>
+          <w:rFonts w:ascii="Times New Roman" w:hAnsi="Times New Roman" w:cs="Times New Roman"/>
+        </w:rPr>
+        <w:t>Fakultas prodi pilihan 2</w:t>
+      </w:r>
+    </w:p>
+    <w:p>
+      <w:pPr>
+        <w:keepNext/>
         <w:spacing w:line="480" w:lineRule="auto"/>
         <w:jc w:val="center"/>
-        <w:rPr>
-          <w:rFonts w:ascii="Times New Roman" w:hAnsi="Times New Roman" w:cs="Times New Roman"/>
-        </w:rPr>
-      </w:pPr>
-      <w:bookmarkStart w:id="74" w:name="_Toc200446311"/>
-      <w:bookmarkStart w:id="75" w:name="_Toc200618673"/>
-      <w:bookmarkStart w:id="76" w:name="_Toc200619033"/>
-      <w:r>
-        <w:t xml:space="preserve">Gambar 3. </w:t>
-      </w:r>
-      <w:r>
-        <w:fldChar w:fldCharType="begin"/>
-      </w:r>
-      <w:r>
-        <w:instrText xml:space="preserve"> SEQ Gambar_3. \* ARABIC </w:instrText>
-      </w:r>
-      <w:r>
-        <w:fldChar w:fldCharType="separate"/>
-      </w:r>
+      </w:pPr>
       <w:r>
         <w:rPr>
           <w:noProof/>
         </w:rPr>
-        <w:t>16</w:t>
-      </w:r>
-      <w:r>
-        <w:rPr>
-          <w:noProof/>
-        </w:rPr>
-        <w:fldChar w:fldCharType="end"/>
-      </w:r>
-      <w:r>
-        <w:t xml:space="preserve"> d</w:t>
-      </w:r>
-      <w:r>
-        <w:t>istribusi prodi pilihan 2</w:t>
-      </w:r>
-      <w:bookmarkEnd w:id="74"/>
-      <w:bookmarkEnd w:id="75"/>
-      <w:bookmarkEnd w:id="76"/>
-    </w:p>
-    <w:p>
-      <w:pPr>
-        <w:pStyle w:val="ListParagraph"/>
-        <w:keepNext/>
-        <w:spacing w:line="480" w:lineRule="auto"/>
-        <w:ind w:left="1440"/>
-        <w:jc w:val="center"/>
-      </w:pPr>
-      <w:r>
-        <w:rPr>
-          <w:rFonts w:ascii="Times New Roman" w:hAnsi="Times New Roman" w:cs="Times New Roman"/>
-          <w:noProof/>
-        </w:rPr>
-        <w:lastRenderedPageBreak/>
         <w:drawing>
-          <wp:inline distT="0" distB="0" distL="0" distR="0" wp14:anchorId="733B8FED" wp14:editId="4CAE0CE3">
+          <wp:inline distT="0" distB="0" distL="0" distR="0" wp14:anchorId="0A97B8A6" wp14:editId="79936D0D">
             <wp:extent cx="4680000" cy="2230395"/>
             <wp:effectExtent l="0" t="0" r="6350" b="0"/>
             <wp:docPr id="55094509" name="Picture 10"/>
@@ -15792,9 +15752,6 @@
           <w:rFonts w:ascii="Times New Roman" w:hAnsi="Times New Roman" w:cs="Times New Roman"/>
         </w:rPr>
       </w:pPr>
-      <w:bookmarkStart w:id="77" w:name="_Toc200446312"/>
-      <w:bookmarkStart w:id="78" w:name="_Toc200618674"/>
-      <w:bookmarkStart w:id="79" w:name="_Toc200619034"/>
       <w:r>
         <w:t xml:space="preserve">Gambar 3. </w:t>
       </w:r>
@@ -15814,36 +15771,89 @@
         <w:t>17</w:t>
       </w:r>
       <w:r>
-        <w:rPr>
-          <w:noProof/>
-        </w:rPr>
         <w:fldChar w:fldCharType="end"/>
       </w:r>
       <w:r>
-        <w:t xml:space="preserve"> d</w:t>
-      </w:r>
-      <w:r>
-        <w:t>istribusi fakultas prodi pilihan 2</w:t>
-      </w:r>
-      <w:bookmarkEnd w:id="77"/>
-      <w:bookmarkEnd w:id="78"/>
-      <w:bookmarkEnd w:id="79"/>
+        <w:t xml:space="preserve"> distribusi </w:t>
+      </w:r>
+      <w:r>
+        <w:t>fakultas prodi pilihan 2</w:t>
+      </w:r>
     </w:p>
     <w:p>
       <w:pPr>
         <w:pStyle w:val="ListParagraph"/>
+        <w:spacing w:line="480" w:lineRule="auto"/>
+        <w:ind w:left="2160" w:firstLine="720"/>
+        <w:jc w:val="both"/>
+        <w:rPr>
+          <w:rFonts w:ascii="Times New Roman" w:hAnsi="Times New Roman" w:cs="Times New Roman"/>
+        </w:rPr>
+      </w:pPr>
+      <w:r>
+        <w:rPr>
+          <w:rFonts w:ascii="Times New Roman" w:hAnsi="Times New Roman" w:cs="Times New Roman"/>
+        </w:rPr>
+        <w:t xml:space="preserve">Distribusi pada kolom Fakultas Prodi Pilihan 2 menunjukkan bahwa program studi pilihan kedua sebagian besar berada di bawah Fakultas Ilmu Kesehatan, Fakultas Ekonomi dan Bisnis, serta Fakultas Keguruan dan Ilmu Pendidikan. Hal ini menggambarkan minat yang masih </w:t>
+      </w:r>
+      <w:r>
+        <w:rPr>
+          <w:rFonts w:ascii="Times New Roman" w:hAnsi="Times New Roman" w:cs="Times New Roman"/>
+        </w:rPr>
+        <w:lastRenderedPageBreak/>
+        <w:t>tinggi terhadap bidang kesehatan, ekonomi, dan pendidikan meskipun tidak dijadikan pilihan utama.</w:t>
+      </w:r>
+    </w:p>
+    <w:p>
+      <w:pPr>
+        <w:pStyle w:val="ListParagraph"/>
+        <w:spacing w:line="480" w:lineRule="auto"/>
+        <w:ind w:left="2160" w:firstLine="720"/>
+        <w:jc w:val="both"/>
+        <w:rPr>
+          <w:rFonts w:ascii="Times New Roman" w:hAnsi="Times New Roman" w:cs="Times New Roman"/>
+        </w:rPr>
+      </w:pPr>
+      <w:r>
+        <w:rPr>
+          <w:rFonts w:ascii="Times New Roman" w:hAnsi="Times New Roman" w:cs="Times New Roman"/>
+        </w:rPr>
+        <w:t>Namun demikian, terdapat nilai anomali berupa karakter “-” yang muncul sebagai salah satu entri dalam distribusi. Nilai ini tidak sesuai dengan nama fakultas yang ada di Universitas Muhammadiyah Purwokerto dan menunjukkan adanya data yang belum terisi dengan benar atau kesalahan input. Oleh karena itu, perlu dilakukan penanganan pada tahap problem solving agar nilai tersebut tidak mengganggu hasil visualisasi akhir.</w:t>
+      </w:r>
+    </w:p>
+    <w:p>
+      <w:pPr>
+        <w:pStyle w:val="ListParagraph"/>
+        <w:numPr>
+          <w:ilvl w:val="0"/>
+          <w:numId w:val="44"/>
+        </w:numPr>
+        <w:spacing w:line="480" w:lineRule="auto"/>
+        <w:jc w:val="both"/>
+        <w:rPr>
+          <w:rFonts w:ascii="Times New Roman" w:hAnsi="Times New Roman" w:cs="Times New Roman"/>
+        </w:rPr>
+      </w:pPr>
+      <w:r>
+        <w:rPr>
+          <w:rFonts w:ascii="Times New Roman" w:hAnsi="Times New Roman" w:cs="Times New Roman"/>
+        </w:rPr>
+        <w:t>Prodi diterima</w:t>
+      </w:r>
+    </w:p>
+    <w:p>
+      <w:pPr>
         <w:keepNext/>
         <w:spacing w:line="480" w:lineRule="auto"/>
-        <w:ind w:left="1440"/>
         <w:jc w:val="center"/>
       </w:pPr>
       <w:r>
         <w:rPr>
-          <w:rFonts w:ascii="Times New Roman" w:hAnsi="Times New Roman" w:cs="Times New Roman"/>
           <w:noProof/>
         </w:rPr>
+        <w:lastRenderedPageBreak/>
         <w:drawing>
-          <wp:inline distT="0" distB="0" distL="0" distR="0" wp14:anchorId="42346D12" wp14:editId="78EC393D">
+          <wp:inline distT="0" distB="0" distL="0" distR="0" wp14:anchorId="25F37CE7" wp14:editId="090B808A">
             <wp:extent cx="4680000" cy="4873228"/>
             <wp:effectExtent l="0" t="0" r="6350" b="3810"/>
             <wp:docPr id="29152661" name="Picture 11"/>
@@ -15895,65 +15905,124 @@
     <w:p>
       <w:pPr>
         <w:pStyle w:val="Caption"/>
+        <w:jc w:val="center"/>
+        <w:rPr>
+          <w:rFonts w:ascii="Times New Roman" w:hAnsi="Times New Roman" w:cs="Times New Roman"/>
+        </w:rPr>
+      </w:pPr>
+      <w:r>
+        <w:t xml:space="preserve">Gambar 3. </w:t>
+      </w:r>
+      <w:r>
+        <w:fldChar w:fldCharType="begin"/>
+      </w:r>
+      <w:r>
+        <w:instrText xml:space="preserve"> SEQ Gambar_3. \* ARABIC </w:instrText>
+      </w:r>
+      <w:r>
+        <w:fldChar w:fldCharType="separate"/>
+      </w:r>
+      <w:r>
+        <w:rPr>
+          <w:noProof/>
+        </w:rPr>
+        <w:t>18</w:t>
+      </w:r>
+      <w:r>
+        <w:fldChar w:fldCharType="end"/>
+      </w:r>
+      <w:r>
+        <w:t xml:space="preserve"> distribusi </w:t>
+      </w:r>
+      <w:r>
+        <w:t>prodi diterima</w:t>
+      </w:r>
+    </w:p>
+    <w:p>
+      <w:pPr>
+        <w:pStyle w:val="ListParagraph"/>
+        <w:spacing w:line="480" w:lineRule="auto"/>
+        <w:ind w:left="2160" w:firstLine="720"/>
+        <w:jc w:val="both"/>
+        <w:rPr>
+          <w:rFonts w:ascii="Times New Roman" w:hAnsi="Times New Roman" w:cs="Times New Roman"/>
+        </w:rPr>
+      </w:pPr>
+      <w:r>
+        <w:rPr>
+          <w:rFonts w:ascii="Times New Roman" w:hAnsi="Times New Roman" w:cs="Times New Roman"/>
+        </w:rPr>
+        <w:t xml:space="preserve">Distribusi pada kolom Prodi Diterima memperlihatkan program studi yang paling banyak menerima mahasiswa baru di UMP. Dari visualisasi, terlihat bahwa </w:t>
+      </w:r>
+      <w:r>
+        <w:rPr>
+          <w:rFonts w:ascii="Times New Roman" w:hAnsi="Times New Roman" w:cs="Times New Roman"/>
+        </w:rPr>
+        <w:t>Keperawatan</w:t>
+      </w:r>
+      <w:r>
+        <w:rPr>
+          <w:rFonts w:ascii="Times New Roman" w:hAnsi="Times New Roman" w:cs="Times New Roman"/>
+        </w:rPr>
+        <w:t xml:space="preserve">, Manajemen S1, dan Psikologi menjadi tiga program studi dengan jumlah penerimaan tertinggi. </w:t>
+      </w:r>
+    </w:p>
+    <w:p>
+      <w:pPr>
+        <w:pStyle w:val="ListParagraph"/>
+        <w:spacing w:line="480" w:lineRule="auto"/>
+        <w:ind w:left="2160" w:firstLine="720"/>
+        <w:jc w:val="both"/>
+        <w:rPr>
+          <w:rFonts w:ascii="Times New Roman" w:hAnsi="Times New Roman" w:cs="Times New Roman"/>
+        </w:rPr>
+      </w:pPr>
+      <w:r>
+        <w:rPr>
+          <w:rFonts w:ascii="Times New Roman" w:hAnsi="Times New Roman" w:cs="Times New Roman"/>
+        </w:rPr>
+        <w:t xml:space="preserve">Namun, terdapat nilai anomali berupa karakter “-” yang muncul dalam kolom ini. Nilai tersebut tidak merepresentasikan nama program studi manapun dan </w:t>
+      </w:r>
+      <w:r>
+        <w:rPr>
+          <w:rFonts w:ascii="Times New Roman" w:hAnsi="Times New Roman" w:cs="Times New Roman"/>
+        </w:rPr>
+        <w:lastRenderedPageBreak/>
+        <w:t>kemungkinan besar merupakan hasil dari entri yang kosong atau tidak valid. Keberadaan nilai ini perlu ditindaklanjuti pada tahap problem solving untuk menjaga keakuratan visualisasi dan mencegah penyajian data yang menyesatkan.</w:t>
+      </w:r>
+    </w:p>
+    <w:p>
+      <w:pPr>
+        <w:pStyle w:val="ListParagraph"/>
+        <w:numPr>
+          <w:ilvl w:val="0"/>
+          <w:numId w:val="44"/>
+        </w:numPr>
+        <w:spacing w:line="480" w:lineRule="auto"/>
+        <w:jc w:val="both"/>
+        <w:rPr>
+          <w:rFonts w:ascii="Times New Roman" w:hAnsi="Times New Roman" w:cs="Times New Roman"/>
+        </w:rPr>
+      </w:pPr>
+      <w:r>
+        <w:rPr>
+          <w:rFonts w:ascii="Times New Roman" w:hAnsi="Times New Roman" w:cs="Times New Roman"/>
+        </w:rPr>
+        <w:t>Fakultas prodi diterima</w:t>
+      </w:r>
+    </w:p>
+    <w:p>
+      <w:pPr>
+        <w:keepNext/>
         <w:spacing w:line="480" w:lineRule="auto"/>
         <w:jc w:val="center"/>
-        <w:rPr>
-          <w:rFonts w:ascii="Times New Roman" w:hAnsi="Times New Roman" w:cs="Times New Roman"/>
-        </w:rPr>
-      </w:pPr>
-      <w:bookmarkStart w:id="80" w:name="_Toc200446313"/>
-      <w:bookmarkStart w:id="81" w:name="_Toc200618675"/>
-      <w:bookmarkStart w:id="82" w:name="_Toc200619035"/>
-      <w:r>
-        <w:t xml:space="preserve">Gambar 3. </w:t>
-      </w:r>
-      <w:r>
-        <w:fldChar w:fldCharType="begin"/>
-      </w:r>
-      <w:r>
-        <w:instrText xml:space="preserve"> SEQ Gambar_3. \* ARABIC </w:instrText>
-      </w:r>
-      <w:r>
-        <w:fldChar w:fldCharType="separate"/>
-      </w:r>
+      </w:pPr>
       <w:r>
         <w:rPr>
           <w:noProof/>
         </w:rPr>
-        <w:t>18</w:t>
-      </w:r>
-      <w:r>
-        <w:rPr>
-          <w:noProof/>
-        </w:rPr>
-        <w:fldChar w:fldCharType="end"/>
-      </w:r>
-      <w:r>
-        <w:t xml:space="preserve"> d</w:t>
-      </w:r>
-      <w:r>
-        <w:t>istribusi prodi diterima</w:t>
-      </w:r>
-      <w:bookmarkEnd w:id="80"/>
-      <w:bookmarkEnd w:id="81"/>
-      <w:bookmarkEnd w:id="82"/>
-    </w:p>
-    <w:p>
-      <w:pPr>
-        <w:pStyle w:val="ListParagraph"/>
-        <w:keepNext/>
-        <w:spacing w:line="480" w:lineRule="auto"/>
-        <w:ind w:left="1440"/>
-        <w:jc w:val="center"/>
-      </w:pPr>
-      <w:r>
-        <w:rPr>
-          <w:rFonts w:ascii="Times New Roman" w:hAnsi="Times New Roman" w:cs="Times New Roman"/>
-          <w:noProof/>
-        </w:rPr>
-        <w:lastRenderedPageBreak/>
         <w:drawing>
-          <wp:inline distT="0" distB="0" distL="0" distR="0" wp14:anchorId="314D0ACC" wp14:editId="3FF64E78">
+          <wp:inline distT="0" distB="0" distL="0" distR="0" wp14:anchorId="267B44DF" wp14:editId="620DF21B">
             <wp:extent cx="4680000" cy="2242821"/>
             <wp:effectExtent l="0" t="0" r="6350" b="5080"/>
             <wp:docPr id="1341359440" name="Picture 12"/>
@@ -16005,64 +16074,148 @@
     <w:p>
       <w:pPr>
         <w:pStyle w:val="Caption"/>
+        <w:jc w:val="center"/>
+        <w:rPr>
+          <w:rFonts w:ascii="Times New Roman" w:hAnsi="Times New Roman" w:cs="Times New Roman"/>
+        </w:rPr>
+      </w:pPr>
+      <w:r>
+        <w:t xml:space="preserve">Gambar 3. </w:t>
+      </w:r>
+      <w:r>
+        <w:fldChar w:fldCharType="begin"/>
+      </w:r>
+      <w:r>
+        <w:instrText xml:space="preserve"> SEQ Gambar_3. \* ARABIC </w:instrText>
+      </w:r>
+      <w:r>
+        <w:fldChar w:fldCharType="separate"/>
+      </w:r>
+      <w:r>
+        <w:rPr>
+          <w:noProof/>
+        </w:rPr>
+        <w:t>19</w:t>
+      </w:r>
+      <w:r>
+        <w:fldChar w:fldCharType="end"/>
+      </w:r>
+      <w:r>
+        <w:t xml:space="preserve"> distribusi </w:t>
+      </w:r>
+      <w:r>
+        <w:t>fakultas prodi diterima</w:t>
+      </w:r>
+    </w:p>
+    <w:p>
+      <w:pPr>
+        <w:pStyle w:val="ListParagraph"/>
+        <w:spacing w:line="480" w:lineRule="auto"/>
+        <w:ind w:left="2160" w:firstLine="720"/>
+        <w:jc w:val="both"/>
+        <w:rPr>
+          <w:rFonts w:ascii="Times New Roman" w:hAnsi="Times New Roman" w:cs="Times New Roman"/>
+        </w:rPr>
+      </w:pPr>
+      <w:r>
+        <w:rPr>
+          <w:rFonts w:ascii="Times New Roman" w:hAnsi="Times New Roman" w:cs="Times New Roman"/>
+        </w:rPr>
+        <w:t xml:space="preserve">Distribusi pada kolom Fakultas Prodi Diterima menunjukkan bahwa sebagian besar mahasiswa baru diterima di bawah naungan Fakultas </w:t>
+      </w:r>
+      <w:r>
+        <w:rPr>
+          <w:rFonts w:ascii="Times New Roman" w:hAnsi="Times New Roman" w:cs="Times New Roman"/>
+        </w:rPr>
+        <w:t>Keguruan dan Ilmu Pendidikan</w:t>
+      </w:r>
+      <w:r>
+        <w:rPr>
+          <w:rFonts w:ascii="Times New Roman" w:hAnsi="Times New Roman" w:cs="Times New Roman"/>
+        </w:rPr>
+        <w:t>, Fakultas</w:t>
+      </w:r>
+      <w:r>
+        <w:rPr>
+          <w:rFonts w:ascii="Times New Roman" w:hAnsi="Times New Roman" w:cs="Times New Roman"/>
+        </w:rPr>
+        <w:t xml:space="preserve"> Ilmu Kesehatan</w:t>
+      </w:r>
+      <w:r>
+        <w:rPr>
+          <w:rFonts w:ascii="Times New Roman" w:hAnsi="Times New Roman" w:cs="Times New Roman"/>
+        </w:rPr>
+        <w:t>, serta Fakultas</w:t>
+      </w:r>
+      <w:r>
+        <w:rPr>
+          <w:rFonts w:ascii="Times New Roman" w:hAnsi="Times New Roman" w:cs="Times New Roman"/>
+        </w:rPr>
+        <w:t xml:space="preserve"> Ekonomi dan Bisnis</w:t>
+      </w:r>
+      <w:r>
+        <w:rPr>
+          <w:rFonts w:ascii="Times New Roman" w:hAnsi="Times New Roman" w:cs="Times New Roman"/>
+        </w:rPr>
+        <w:t>.</w:t>
+      </w:r>
+    </w:p>
+    <w:p>
+      <w:pPr>
+        <w:pStyle w:val="ListParagraph"/>
+        <w:spacing w:line="480" w:lineRule="auto"/>
+        <w:ind w:left="2160" w:firstLine="720"/>
+        <w:jc w:val="both"/>
+        <w:rPr>
+          <w:rFonts w:ascii="Times New Roman" w:hAnsi="Times New Roman" w:cs="Times New Roman"/>
+        </w:rPr>
+      </w:pPr>
+      <w:r>
+        <w:rPr>
+          <w:rFonts w:ascii="Times New Roman" w:hAnsi="Times New Roman" w:cs="Times New Roman"/>
+        </w:rPr>
+        <w:t xml:space="preserve">Meskipun sebagian besar nilai terlihat valid, terdapat satu nilai anomali berupa karakter “-” yang tidak sesuai dengan nama fakultas resmi di UMP. Nilai tersebut perlu diperhatikan karena dapat memengaruhi integritas visualisasi. Penanganan terhadap entri ini akan dilakukan </w:t>
+      </w:r>
+      <w:r>
+        <w:rPr>
+          <w:rFonts w:ascii="Times New Roman" w:hAnsi="Times New Roman" w:cs="Times New Roman"/>
+        </w:rPr>
+        <w:lastRenderedPageBreak/>
+        <w:t>pada tahap problem solving untuk memastikan bahwa semua data yang divisualisasikan mewakili kondisi sebenarnya.</w:t>
+      </w:r>
+    </w:p>
+    <w:p>
+      <w:pPr>
+        <w:pStyle w:val="ListParagraph"/>
+        <w:numPr>
+          <w:ilvl w:val="0"/>
+          <w:numId w:val="44"/>
+        </w:numPr>
+        <w:spacing w:line="480" w:lineRule="auto"/>
+        <w:jc w:val="both"/>
+        <w:rPr>
+          <w:rFonts w:ascii="Times New Roman" w:hAnsi="Times New Roman" w:cs="Times New Roman"/>
+        </w:rPr>
+      </w:pPr>
+      <w:r>
+        <w:rPr>
+          <w:rFonts w:ascii="Times New Roman" w:hAnsi="Times New Roman" w:cs="Times New Roman"/>
+        </w:rPr>
+        <w:t>Usia</w:t>
+      </w:r>
+    </w:p>
+    <w:p>
+      <w:pPr>
+        <w:keepNext/>
         <w:spacing w:line="480" w:lineRule="auto"/>
         <w:jc w:val="center"/>
-        <w:rPr>
-          <w:rFonts w:ascii="Times New Roman" w:hAnsi="Times New Roman" w:cs="Times New Roman"/>
-        </w:rPr>
-      </w:pPr>
-      <w:bookmarkStart w:id="83" w:name="_Toc200446314"/>
-      <w:bookmarkStart w:id="84" w:name="_Toc200618676"/>
-      <w:bookmarkStart w:id="85" w:name="_Toc200619036"/>
-      <w:r>
-        <w:t xml:space="preserve">Gambar 3. </w:t>
-      </w:r>
-      <w:r>
-        <w:fldChar w:fldCharType="begin"/>
-      </w:r>
-      <w:r>
-        <w:instrText xml:space="preserve"> SEQ Gambar_3. \* ARABIC </w:instrText>
-      </w:r>
-      <w:r>
-        <w:fldChar w:fldCharType="separate"/>
-      </w:r>
+      </w:pPr>
       <w:r>
         <w:rPr>
           <w:noProof/>
         </w:rPr>
-        <w:t>19</w:t>
-      </w:r>
-      <w:r>
-        <w:rPr>
-          <w:noProof/>
-        </w:rPr>
-        <w:fldChar w:fldCharType="end"/>
-      </w:r>
-      <w:r>
-        <w:t xml:space="preserve"> d</w:t>
-      </w:r>
-      <w:r>
-        <w:t>istribusi fakultas prodi diterima</w:t>
-      </w:r>
-      <w:bookmarkEnd w:id="83"/>
-      <w:bookmarkEnd w:id="84"/>
-      <w:bookmarkEnd w:id="85"/>
-    </w:p>
-    <w:p>
-      <w:pPr>
-        <w:pStyle w:val="ListParagraph"/>
-        <w:keepNext/>
-        <w:spacing w:line="480" w:lineRule="auto"/>
-        <w:ind w:left="1440"/>
-        <w:jc w:val="center"/>
-      </w:pPr>
-      <w:r>
-        <w:rPr>
-          <w:rFonts w:ascii="Times New Roman" w:hAnsi="Times New Roman" w:cs="Times New Roman"/>
-          <w:noProof/>
-        </w:rPr>
         <w:drawing>
-          <wp:inline distT="0" distB="0" distL="0" distR="0" wp14:anchorId="13BEE12E" wp14:editId="5C376DDC">
+          <wp:inline distT="0" distB="0" distL="0" distR="0" wp14:anchorId="39AE5A25" wp14:editId="70C50E36">
             <wp:extent cx="4680000" cy="3490848"/>
             <wp:effectExtent l="0" t="0" r="6350" b="0"/>
             <wp:docPr id="1550451844" name="Picture 13"/>
@@ -16114,65 +16267,118 @@
     <w:p>
       <w:pPr>
         <w:pStyle w:val="Caption"/>
+        <w:jc w:val="center"/>
+        <w:rPr>
+          <w:rFonts w:ascii="Times New Roman" w:hAnsi="Times New Roman" w:cs="Times New Roman"/>
+        </w:rPr>
+      </w:pPr>
+      <w:r>
+        <w:t xml:space="preserve">Gambar 3. </w:t>
+      </w:r>
+      <w:r>
+        <w:fldChar w:fldCharType="begin"/>
+      </w:r>
+      <w:r>
+        <w:instrText xml:space="preserve"> SEQ Gambar_3. \* ARABIC </w:instrText>
+      </w:r>
+      <w:r>
+        <w:fldChar w:fldCharType="separate"/>
+      </w:r>
+      <w:r>
+        <w:rPr>
+          <w:noProof/>
+        </w:rPr>
+        <w:t>20</w:t>
+      </w:r>
+      <w:r>
+        <w:fldChar w:fldCharType="end"/>
+      </w:r>
+      <w:r>
+        <w:t xml:space="preserve"> distribusi </w:t>
+      </w:r>
+      <w:r>
+        <w:t>usia</w:t>
+      </w:r>
+    </w:p>
+    <w:p>
+      <w:pPr>
+        <w:pStyle w:val="ListParagraph"/>
+        <w:spacing w:line="480" w:lineRule="auto"/>
+        <w:ind w:left="2160" w:firstLine="720"/>
+        <w:jc w:val="both"/>
+        <w:rPr>
+          <w:rFonts w:ascii="Times New Roman" w:hAnsi="Times New Roman" w:cs="Times New Roman"/>
+        </w:rPr>
+      </w:pPr>
+      <w:r>
+        <w:rPr>
+          <w:rFonts w:ascii="Times New Roman" w:hAnsi="Times New Roman" w:cs="Times New Roman"/>
+        </w:rPr>
+        <w:t xml:space="preserve">Distribusi pada kolom Usia memperlihatkan rentang usia mahasiswa baru yang cukup beragam. Sebagian besar nilai berada dalam rentang yang wajar untuk kategori pendaftar pendidikan tinggi. Namun, dari hasil visualisasi ditemukan beberapa nilai usia yang tidak wajar, seperti usia yang mendekati 120 tahun serta usia </w:t>
+      </w:r>
+      <w:r>
+        <w:rPr>
+          <w:rFonts w:ascii="Times New Roman" w:hAnsi="Times New Roman" w:cs="Times New Roman"/>
+        </w:rPr>
+        <w:t>yang dibawah batas wajar mahasiswa baru</w:t>
+      </w:r>
+      <w:r>
+        <w:rPr>
+          <w:rFonts w:ascii="Times New Roman" w:hAnsi="Times New Roman" w:cs="Times New Roman"/>
+        </w:rPr>
+        <w:t>.</w:t>
+      </w:r>
+    </w:p>
+    <w:p>
+      <w:pPr>
+        <w:pStyle w:val="ListParagraph"/>
+        <w:spacing w:line="480" w:lineRule="auto"/>
+        <w:ind w:left="2160" w:firstLine="720"/>
+        <w:jc w:val="both"/>
+        <w:rPr>
+          <w:rFonts w:ascii="Times New Roman" w:hAnsi="Times New Roman" w:cs="Times New Roman"/>
+        </w:rPr>
+      </w:pPr>
+      <w:r>
+        <w:rPr>
+          <w:rFonts w:ascii="Times New Roman" w:hAnsi="Times New Roman" w:cs="Times New Roman"/>
+        </w:rPr>
+        <w:lastRenderedPageBreak/>
+        <w:t>Nilai-nilai tersebut menunjukkan adanya entri data yang keliru atau tidak terisi dengan benar, sehingga dikategorikan sebagai anomali. Kasus ini perlu ditangani pada tahap problem solving agar tidak memengaruhi interpretasi visualisasi dan tidak menimbulkan kesalahan pemahaman terhadap kondisi demografis mahasiswa baru.</w:t>
+      </w:r>
+    </w:p>
+    <w:p>
+      <w:pPr>
+        <w:pStyle w:val="ListParagraph"/>
+        <w:numPr>
+          <w:ilvl w:val="0"/>
+          <w:numId w:val="44"/>
+        </w:numPr>
+        <w:spacing w:line="480" w:lineRule="auto"/>
+        <w:jc w:val="both"/>
+        <w:rPr>
+          <w:rFonts w:ascii="Times New Roman" w:hAnsi="Times New Roman" w:cs="Times New Roman"/>
+        </w:rPr>
+      </w:pPr>
+      <w:r>
+        <w:rPr>
+          <w:rFonts w:ascii="Times New Roman" w:hAnsi="Times New Roman" w:cs="Times New Roman"/>
+        </w:rPr>
+        <w:t>Jurusan SLTA</w:t>
+      </w:r>
+    </w:p>
+    <w:p>
+      <w:pPr>
+        <w:keepNext/>
         <w:spacing w:line="480" w:lineRule="auto"/>
         <w:jc w:val="center"/>
-        <w:rPr>
-          <w:rFonts w:ascii="Times New Roman" w:hAnsi="Times New Roman" w:cs="Times New Roman"/>
-        </w:rPr>
-      </w:pPr>
-      <w:bookmarkStart w:id="86" w:name="_Toc200446315"/>
-      <w:bookmarkStart w:id="87" w:name="_Toc200618677"/>
-      <w:bookmarkStart w:id="88" w:name="_Toc200619037"/>
-      <w:r>
-        <w:t xml:space="preserve">Gambar 3. </w:t>
-      </w:r>
-      <w:r>
-        <w:fldChar w:fldCharType="begin"/>
-      </w:r>
-      <w:r>
-        <w:instrText xml:space="preserve"> SEQ Gambar_3. \* ARABIC </w:instrText>
-      </w:r>
-      <w:r>
-        <w:fldChar w:fldCharType="separate"/>
-      </w:r>
+      </w:pPr>
       <w:r>
         <w:rPr>
           <w:noProof/>
         </w:rPr>
-        <w:t>20</w:t>
-      </w:r>
-      <w:r>
-        <w:rPr>
-          <w:noProof/>
-        </w:rPr>
-        <w:fldChar w:fldCharType="end"/>
-      </w:r>
-      <w:r>
-        <w:t xml:space="preserve"> d</w:t>
-      </w:r>
-      <w:r>
-        <w:t>istribusi usia mahasiswa baru</w:t>
-      </w:r>
-      <w:bookmarkEnd w:id="86"/>
-      <w:bookmarkEnd w:id="87"/>
-      <w:bookmarkEnd w:id="88"/>
-    </w:p>
-    <w:p>
-      <w:pPr>
-        <w:pStyle w:val="ListParagraph"/>
-        <w:keepNext/>
-        <w:spacing w:line="480" w:lineRule="auto"/>
-        <w:ind w:left="1440"/>
-        <w:jc w:val="center"/>
-      </w:pPr>
-      <w:r>
-        <w:rPr>
-          <w:rFonts w:ascii="Times New Roman" w:hAnsi="Times New Roman" w:cs="Times New Roman"/>
-          <w:noProof/>
-        </w:rPr>
-        <w:lastRenderedPageBreak/>
         <w:drawing>
-          <wp:inline distT="0" distB="0" distL="0" distR="0" wp14:anchorId="7F77E216" wp14:editId="7B8AA769">
+          <wp:inline distT="0" distB="0" distL="0" distR="0" wp14:anchorId="51C94F2B" wp14:editId="32EEF804">
             <wp:extent cx="4680000" cy="1712440"/>
             <wp:effectExtent l="0" t="0" r="6350" b="2540"/>
             <wp:docPr id="1996973606" name="Picture 14"/>
@@ -16224,64 +16430,101 @@
     <w:p>
       <w:pPr>
         <w:pStyle w:val="Caption"/>
+        <w:jc w:val="center"/>
+        <w:rPr>
+          <w:rFonts w:ascii="Times New Roman" w:hAnsi="Times New Roman" w:cs="Times New Roman"/>
+        </w:rPr>
+      </w:pPr>
+      <w:r>
+        <w:t xml:space="preserve">Gambar 3. </w:t>
+      </w:r>
+      <w:r>
+        <w:fldChar w:fldCharType="begin"/>
+      </w:r>
+      <w:r>
+        <w:instrText xml:space="preserve"> SEQ Gambar_3. \* ARABIC </w:instrText>
+      </w:r>
+      <w:r>
+        <w:fldChar w:fldCharType="separate"/>
+      </w:r>
+      <w:r>
+        <w:rPr>
+          <w:noProof/>
+        </w:rPr>
+        <w:t>21</w:t>
+      </w:r>
+      <w:r>
+        <w:fldChar w:fldCharType="end"/>
+      </w:r>
+      <w:r>
+        <w:t xml:space="preserve"> distribusi </w:t>
+      </w:r>
+      <w:r>
+        <w:t>jurusan SLTA</w:t>
+      </w:r>
+    </w:p>
+    <w:p>
+      <w:pPr>
+        <w:pStyle w:val="ListParagraph"/>
+        <w:spacing w:line="480" w:lineRule="auto"/>
+        <w:ind w:left="2160" w:firstLine="720"/>
+        <w:jc w:val="both"/>
+        <w:rPr>
+          <w:rFonts w:ascii="Times New Roman" w:hAnsi="Times New Roman" w:cs="Times New Roman"/>
+        </w:rPr>
+      </w:pPr>
+      <w:r>
+        <w:rPr>
+          <w:rFonts w:ascii="Times New Roman" w:hAnsi="Times New Roman" w:cs="Times New Roman"/>
+        </w:rPr>
+        <w:t>Distribusi pada kolom Jurusan SLTA menunjukkan kategori jurusan asal pendaftar selama berada di jenjang</w:t>
+      </w:r>
+      <w:r>
+        <w:rPr>
+          <w:rFonts w:ascii="Times New Roman" w:hAnsi="Times New Roman" w:cs="Times New Roman"/>
+        </w:rPr>
+        <w:t xml:space="preserve"> sebelumnya</w:t>
+      </w:r>
+      <w:r>
+        <w:rPr>
+          <w:rFonts w:ascii="Times New Roman" w:hAnsi="Times New Roman" w:cs="Times New Roman"/>
+        </w:rPr>
+        <w:t>. Berdasarkan visualisasi, sebaran data pada kolom ini dapat dikatakan normal dan valid. Tidak ditemukan nilai yang janggal, tidak lazim, atau tidak sesuai dengan klasifikasi umum jurusan SLTA di Indonesia. Data pada kolom ini dapat langsung digunakan dalam proses visualisasi tanpa perlu dilakukan penanganan lebih lanjut.</w:t>
+      </w:r>
+    </w:p>
+    <w:p>
+      <w:pPr>
+        <w:pStyle w:val="ListParagraph"/>
+        <w:numPr>
+          <w:ilvl w:val="0"/>
+          <w:numId w:val="44"/>
+        </w:numPr>
+        <w:spacing w:line="480" w:lineRule="auto"/>
+        <w:jc w:val="both"/>
+        <w:rPr>
+          <w:rFonts w:ascii="Times New Roman" w:hAnsi="Times New Roman" w:cs="Times New Roman"/>
+        </w:rPr>
+      </w:pPr>
+      <w:r>
+        <w:rPr>
+          <w:rFonts w:ascii="Times New Roman" w:hAnsi="Times New Roman" w:cs="Times New Roman"/>
+        </w:rPr>
+        <w:t>Pendidikan ayah</w:t>
+      </w:r>
+    </w:p>
+    <w:p>
+      <w:pPr>
+        <w:keepNext/>
         <w:spacing w:line="480" w:lineRule="auto"/>
         <w:jc w:val="center"/>
-        <w:rPr>
-          <w:rFonts w:ascii="Times New Roman" w:hAnsi="Times New Roman" w:cs="Times New Roman"/>
-        </w:rPr>
-      </w:pPr>
-      <w:bookmarkStart w:id="89" w:name="_Toc200446316"/>
-      <w:bookmarkStart w:id="90" w:name="_Toc200618678"/>
-      <w:bookmarkStart w:id="91" w:name="_Toc200619038"/>
-      <w:r>
-        <w:t xml:space="preserve">Gambar 3. </w:t>
-      </w:r>
-      <w:r>
-        <w:fldChar w:fldCharType="begin"/>
-      </w:r>
-      <w:r>
-        <w:instrText xml:space="preserve"> SEQ Gambar_3. \* ARABIC </w:instrText>
-      </w:r>
-      <w:r>
-        <w:fldChar w:fldCharType="separate"/>
-      </w:r>
+      </w:pPr>
       <w:r>
         <w:rPr>
           <w:noProof/>
         </w:rPr>
-        <w:t>21</w:t>
-      </w:r>
-      <w:r>
-        <w:rPr>
-          <w:noProof/>
-        </w:rPr>
-        <w:fldChar w:fldCharType="end"/>
-      </w:r>
-      <w:r>
-        <w:t xml:space="preserve"> d</w:t>
-      </w:r>
-      <w:r>
-        <w:t>istribusi jurusan SLTA</w:t>
-      </w:r>
-      <w:bookmarkEnd w:id="89"/>
-      <w:bookmarkEnd w:id="90"/>
-      <w:bookmarkEnd w:id="91"/>
-    </w:p>
-    <w:p>
-      <w:pPr>
-        <w:pStyle w:val="ListParagraph"/>
-        <w:keepNext/>
-        <w:spacing w:line="480" w:lineRule="auto"/>
-        <w:ind w:left="1440"/>
-        <w:jc w:val="center"/>
-      </w:pPr>
-      <w:r>
-        <w:rPr>
-          <w:rFonts w:ascii="Times New Roman" w:hAnsi="Times New Roman" w:cs="Times New Roman"/>
-          <w:noProof/>
-        </w:rPr>
+        <w:lastRenderedPageBreak/>
         <w:drawing>
-          <wp:inline distT="0" distB="0" distL="0" distR="0" wp14:anchorId="75018F3A" wp14:editId="06EF1370">
+          <wp:inline distT="0" distB="0" distL="0" distR="0" wp14:anchorId="213EFD9D" wp14:editId="0894271C">
             <wp:extent cx="4680000" cy="2632980"/>
             <wp:effectExtent l="0" t="0" r="6350" b="0"/>
             <wp:docPr id="1741589111" name="Picture 15"/>
@@ -16333,65 +16576,107 @@
     <w:p>
       <w:pPr>
         <w:pStyle w:val="Caption"/>
+        <w:jc w:val="center"/>
+        <w:rPr>
+          <w:rFonts w:ascii="Times New Roman" w:hAnsi="Times New Roman" w:cs="Times New Roman"/>
+        </w:rPr>
+      </w:pPr>
+      <w:r>
+        <w:t xml:space="preserve">Gambar 3. </w:t>
+      </w:r>
+      <w:r>
+        <w:fldChar w:fldCharType="begin"/>
+      </w:r>
+      <w:r>
+        <w:instrText xml:space="preserve"> SEQ Gambar_3. \* ARABIC </w:instrText>
+      </w:r>
+      <w:r>
+        <w:fldChar w:fldCharType="separate"/>
+      </w:r>
+      <w:r>
+        <w:rPr>
+          <w:noProof/>
+        </w:rPr>
+        <w:t>22</w:t>
+      </w:r>
+      <w:r>
+        <w:fldChar w:fldCharType="end"/>
+      </w:r>
+      <w:r>
+        <w:t xml:space="preserve"> distribusi </w:t>
+      </w:r>
+      <w:r>
+        <w:t>pendidikan ayah</w:t>
+      </w:r>
+    </w:p>
+    <w:p>
+      <w:pPr>
+        <w:pStyle w:val="ListParagraph"/>
+        <w:spacing w:line="480" w:lineRule="auto"/>
+        <w:ind w:left="2160" w:firstLine="720"/>
+        <w:jc w:val="both"/>
+        <w:rPr>
+          <w:rFonts w:ascii="Times New Roman" w:hAnsi="Times New Roman" w:cs="Times New Roman"/>
+        </w:rPr>
+      </w:pPr>
+      <w:r>
+        <w:rPr>
+          <w:rFonts w:ascii="Times New Roman" w:hAnsi="Times New Roman" w:cs="Times New Roman"/>
+        </w:rPr>
+        <w:t>Distribusi pada kolom Pendidikan Ayah menunjukkan tingkat pendidikan terakhir yang ditempuh oleh orang tua pendaftar (ayah). Berdasarkan visualisasi, seluruh nilai yang muncul tergolong umum dan sesuai dengan jenjang pendidikan formal yang berlaku di Indonesia, seperti SD, SMP, SMA, D3, S1, S2</w:t>
+      </w:r>
+      <w:r>
+        <w:rPr>
+          <w:rFonts w:ascii="Times New Roman" w:hAnsi="Times New Roman" w:cs="Times New Roman"/>
+        </w:rPr>
+        <w:t>,</w:t>
+      </w:r>
+      <w:r>
+        <w:rPr>
+          <w:rFonts w:ascii="Times New Roman" w:hAnsi="Times New Roman" w:cs="Times New Roman"/>
+        </w:rPr>
+        <w:t xml:space="preserve"> dan lainnya</w:t>
+      </w:r>
+      <w:r>
+        <w:rPr>
+          <w:rFonts w:ascii="Times New Roman" w:hAnsi="Times New Roman" w:cs="Times New Roman"/>
+        </w:rPr>
+        <w:t>. Oleh karena itu, distribusi data pada kolom ini dapat dikatakan normal dan valid, serta tidak memerlukan tindakan koreksi tambahan sebelum divisualisasikan.</w:t>
+      </w:r>
+    </w:p>
+    <w:p>
+      <w:pPr>
+        <w:pStyle w:val="ListParagraph"/>
+        <w:numPr>
+          <w:ilvl w:val="0"/>
+          <w:numId w:val="44"/>
+        </w:numPr>
+        <w:spacing w:line="480" w:lineRule="auto"/>
+        <w:jc w:val="both"/>
+        <w:rPr>
+          <w:rFonts w:ascii="Times New Roman" w:hAnsi="Times New Roman" w:cs="Times New Roman"/>
+        </w:rPr>
+      </w:pPr>
+      <w:r>
+        <w:rPr>
+          <w:rFonts w:ascii="Times New Roman" w:hAnsi="Times New Roman" w:cs="Times New Roman"/>
+        </w:rPr>
+        <w:t>Pendidikan ibu</w:t>
+      </w:r>
+    </w:p>
+    <w:p>
+      <w:pPr>
+        <w:keepNext/>
         <w:spacing w:line="480" w:lineRule="auto"/>
         <w:jc w:val="center"/>
-        <w:rPr>
-          <w:rFonts w:ascii="Times New Roman" w:hAnsi="Times New Roman" w:cs="Times New Roman"/>
-        </w:rPr>
-      </w:pPr>
-      <w:bookmarkStart w:id="92" w:name="_Toc200446317"/>
-      <w:bookmarkStart w:id="93" w:name="_Toc200618679"/>
-      <w:bookmarkStart w:id="94" w:name="_Toc200619039"/>
-      <w:r>
-        <w:t xml:space="preserve">Gambar 3. </w:t>
-      </w:r>
-      <w:r>
-        <w:fldChar w:fldCharType="begin"/>
-      </w:r>
-      <w:r>
-        <w:instrText xml:space="preserve"> SEQ Gambar_3. \* ARABIC </w:instrText>
-      </w:r>
-      <w:r>
-        <w:fldChar w:fldCharType="separate"/>
-      </w:r>
-      <w:r>
-        <w:rPr>
-          <w:noProof/>
-        </w:rPr>
-        <w:t>22</w:t>
-      </w:r>
-      <w:r>
-        <w:rPr>
-          <w:noProof/>
-        </w:rPr>
-        <w:fldChar w:fldCharType="end"/>
-      </w:r>
-      <w:r>
-        <w:t xml:space="preserve"> d</w:t>
-      </w:r>
-      <w:r>
-        <w:t>istribusi pendidikan ayah</w:t>
-      </w:r>
-      <w:bookmarkEnd w:id="92"/>
-      <w:bookmarkEnd w:id="93"/>
-      <w:bookmarkEnd w:id="94"/>
-    </w:p>
-    <w:p>
-      <w:pPr>
-        <w:pStyle w:val="ListParagraph"/>
-        <w:keepNext/>
-        <w:spacing w:line="480" w:lineRule="auto"/>
-        <w:ind w:left="1440"/>
-        <w:jc w:val="center"/>
-      </w:pPr>
-      <w:r>
-        <w:rPr>
-          <w:rFonts w:ascii="Times New Roman" w:hAnsi="Times New Roman" w:cs="Times New Roman"/>
+      </w:pPr>
+      <w:r>
+        <w:rPr>
           <w:noProof/>
         </w:rPr>
         <w:lastRenderedPageBreak/>
         <w:drawing>
-          <wp:inline distT="0" distB="0" distL="0" distR="0" wp14:anchorId="6660F74C" wp14:editId="3F0D55E3">
+          <wp:inline distT="0" distB="0" distL="0" distR="0" wp14:anchorId="236AD427" wp14:editId="5459A659">
             <wp:extent cx="4680000" cy="2632980"/>
             <wp:effectExtent l="0" t="0" r="6350" b="0"/>
             <wp:docPr id="2021986289" name="Picture 16"/>
@@ -16443,64 +16728,113 @@
     <w:p>
       <w:pPr>
         <w:pStyle w:val="Caption"/>
+        <w:jc w:val="center"/>
+        <w:rPr>
+          <w:rFonts w:ascii="Times New Roman" w:hAnsi="Times New Roman" w:cs="Times New Roman"/>
+        </w:rPr>
+      </w:pPr>
+      <w:r>
+        <w:t xml:space="preserve">Gambar 3. </w:t>
+      </w:r>
+      <w:r>
+        <w:fldChar w:fldCharType="begin"/>
+      </w:r>
+      <w:r>
+        <w:instrText xml:space="preserve"> SEQ Gambar_3. \* ARABIC </w:instrText>
+      </w:r>
+      <w:r>
+        <w:fldChar w:fldCharType="separate"/>
+      </w:r>
+      <w:r>
+        <w:rPr>
+          <w:noProof/>
+        </w:rPr>
+        <w:t>23</w:t>
+      </w:r>
+      <w:r>
+        <w:fldChar w:fldCharType="end"/>
+      </w:r>
+      <w:r>
+        <w:t xml:space="preserve"> distribusi </w:t>
+      </w:r>
+      <w:r>
+        <w:t>pendidikan ibu</w:t>
+      </w:r>
+    </w:p>
+    <w:p>
+      <w:pPr>
+        <w:pStyle w:val="ListParagraph"/>
+        <w:spacing w:line="480" w:lineRule="auto"/>
+        <w:ind w:left="2160" w:firstLine="720"/>
+        <w:jc w:val="both"/>
+        <w:rPr>
+          <w:rFonts w:ascii="Times New Roman" w:hAnsi="Times New Roman" w:cs="Times New Roman"/>
+        </w:rPr>
+      </w:pPr>
+      <w:r>
+        <w:rPr>
+          <w:rFonts w:ascii="Times New Roman" w:hAnsi="Times New Roman" w:cs="Times New Roman"/>
+        </w:rPr>
+        <w:t>Distribusi pada kolom Pendidikan Ibu merepresentasikan jenjang pendidikan terakhir yang ditempuh oleh ibu dari masing-masing pendaftar. Hasil visualisasi menunjukkan bahwa seluruh nilai yang muncul sesuai dengan jenjang pendidikan formal yang umum di Indonesia, seperti SD, SMP, SMA, D3, S1,</w:t>
+      </w:r>
+      <w:r>
+        <w:rPr>
+          <w:rFonts w:ascii="Times New Roman" w:hAnsi="Times New Roman" w:cs="Times New Roman"/>
+        </w:rPr>
+        <w:t xml:space="preserve"> </w:t>
+      </w:r>
+      <w:r>
+        <w:rPr>
+          <w:rFonts w:ascii="Times New Roman" w:hAnsi="Times New Roman" w:cs="Times New Roman"/>
+        </w:rPr>
+        <w:t>S2</w:t>
+      </w:r>
+      <w:r>
+        <w:rPr>
+          <w:rFonts w:ascii="Times New Roman" w:hAnsi="Times New Roman" w:cs="Times New Roman"/>
+        </w:rPr>
+        <w:t>, dan lainnya</w:t>
+      </w:r>
+      <w:r>
+        <w:rPr>
+          <w:rFonts w:ascii="Times New Roman" w:hAnsi="Times New Roman" w:cs="Times New Roman"/>
+        </w:rPr>
+        <w:t>. Tidak ditemukan nilai yang tidak lazim atau mencurigakan. Dengan demikian, data pada kolom ini dinyatakan aman dan valid, serta dapat digunakan langsung dalam proses visualisasi.</w:t>
+      </w:r>
+    </w:p>
+    <w:p>
+      <w:pPr>
+        <w:pStyle w:val="ListParagraph"/>
+        <w:numPr>
+          <w:ilvl w:val="0"/>
+          <w:numId w:val="44"/>
+        </w:numPr>
+        <w:spacing w:line="480" w:lineRule="auto"/>
+        <w:jc w:val="both"/>
+        <w:rPr>
+          <w:rFonts w:ascii="Times New Roman" w:hAnsi="Times New Roman" w:cs="Times New Roman"/>
+        </w:rPr>
+      </w:pPr>
+      <w:r>
+        <w:rPr>
+          <w:rFonts w:ascii="Times New Roman" w:hAnsi="Times New Roman" w:cs="Times New Roman"/>
+        </w:rPr>
+        <w:t>Pekerjaan orang tua (ibu)</w:t>
+      </w:r>
+    </w:p>
+    <w:p>
+      <w:pPr>
+        <w:keepNext/>
         <w:spacing w:line="480" w:lineRule="auto"/>
         <w:jc w:val="center"/>
-        <w:rPr>
-          <w:rFonts w:ascii="Times New Roman" w:hAnsi="Times New Roman" w:cs="Times New Roman"/>
-        </w:rPr>
-      </w:pPr>
-      <w:bookmarkStart w:id="95" w:name="_Toc200446318"/>
-      <w:bookmarkStart w:id="96" w:name="_Toc200618680"/>
-      <w:bookmarkStart w:id="97" w:name="_Toc200619040"/>
-      <w:r>
-        <w:t xml:space="preserve">Gambar 3. </w:t>
-      </w:r>
-      <w:r>
-        <w:fldChar w:fldCharType="begin"/>
-      </w:r>
-      <w:r>
-        <w:instrText xml:space="preserve"> SEQ Gambar_3. \* ARABIC </w:instrText>
-      </w:r>
-      <w:r>
-        <w:fldChar w:fldCharType="separate"/>
-      </w:r>
+      </w:pPr>
       <w:r>
         <w:rPr>
           <w:noProof/>
         </w:rPr>
-        <w:t>23</w:t>
-      </w:r>
-      <w:r>
-        <w:rPr>
-          <w:noProof/>
-        </w:rPr>
-        <w:fldChar w:fldCharType="end"/>
-      </w:r>
-      <w:r>
-        <w:t xml:space="preserve"> d</w:t>
-      </w:r>
-      <w:r>
-        <w:t>istribusi pendidikan ibu</w:t>
-      </w:r>
-      <w:bookmarkEnd w:id="95"/>
-      <w:bookmarkEnd w:id="96"/>
-      <w:bookmarkEnd w:id="97"/>
-    </w:p>
-    <w:p>
-      <w:pPr>
-        <w:pStyle w:val="ListParagraph"/>
-        <w:keepNext/>
-        <w:spacing w:line="480" w:lineRule="auto"/>
-        <w:ind w:left="1440"/>
-        <w:jc w:val="center"/>
-      </w:pPr>
-      <w:r>
-        <w:rPr>
-          <w:rFonts w:ascii="Times New Roman" w:hAnsi="Times New Roman" w:cs="Times New Roman"/>
-          <w:noProof/>
-        </w:rPr>
+        <w:lastRenderedPageBreak/>
         <w:drawing>
-          <wp:inline distT="0" distB="0" distL="0" distR="0" wp14:anchorId="556D55CE" wp14:editId="18337342">
+          <wp:inline distT="0" distB="0" distL="0" distR="0" wp14:anchorId="78308A1F" wp14:editId="792FBB19">
             <wp:extent cx="4680000" cy="2539174"/>
             <wp:effectExtent l="0" t="0" r="6350" b="0"/>
             <wp:docPr id="526921830" name="Picture 17"/>
@@ -16552,15 +16886,11 @@
     <w:p>
       <w:pPr>
         <w:pStyle w:val="Caption"/>
-        <w:spacing w:line="480" w:lineRule="auto"/>
         <w:jc w:val="center"/>
         <w:rPr>
           <w:rFonts w:ascii="Times New Roman" w:hAnsi="Times New Roman" w:cs="Times New Roman"/>
         </w:rPr>
       </w:pPr>
-      <w:bookmarkStart w:id="98" w:name="_Toc200446319"/>
-      <w:bookmarkStart w:id="99" w:name="_Toc200618681"/>
-      <w:bookmarkStart w:id="100" w:name="_Toc200619041"/>
       <w:r>
         <w:t xml:space="preserve">Gambar 3. </w:t>
       </w:r>
@@ -16580,325 +16910,66 @@
         <w:t>24</w:t>
       </w:r>
       <w:r>
-        <w:rPr>
-          <w:noProof/>
-        </w:rPr>
         <w:fldChar w:fldCharType="end"/>
       </w:r>
       <w:r>
-        <w:t xml:space="preserve"> d</w:t>
-      </w:r>
-      <w:r>
-        <w:t>istribusi pekerjaan orang tua (ibu)</w:t>
-      </w:r>
-      <w:bookmarkEnd w:id="98"/>
-      <w:bookmarkEnd w:id="99"/>
-      <w:bookmarkEnd w:id="100"/>
+        <w:t xml:space="preserve"> distribusi </w:t>
+      </w:r>
+      <w:r>
+        <w:t>pekerjaan orang tua (ibu)</w:t>
+      </w:r>
     </w:p>
     <w:p>
       <w:pPr>
         <w:pStyle w:val="ListParagraph"/>
         <w:spacing w:line="480" w:lineRule="auto"/>
-        <w:ind w:left="1440"/>
-        <w:rPr>
-          <w:rFonts w:ascii="Times New Roman" w:hAnsi="Times New Roman" w:cs="Times New Roman"/>
-        </w:rPr>
-      </w:pPr>
-      <w:r>
-        <w:rPr>
-          <w:rFonts w:ascii="Times New Roman" w:hAnsi="Times New Roman" w:cs="Times New Roman"/>
-        </w:rPr>
-        <w:t>Masalah yang ditemukan pada proses ini</w:t>
-      </w:r>
-      <w:r>
-        <w:rPr>
-          <w:rFonts w:ascii="Times New Roman" w:hAnsi="Times New Roman" w:cs="Times New Roman"/>
-        </w:rPr>
-        <w:t>:</w:t>
-      </w:r>
-    </w:p>
-    <w:p>
-      <w:pPr>
-        <w:pStyle w:val="ListParagraph"/>
-        <w:numPr>
-          <w:ilvl w:val="0"/>
-          <w:numId w:val="12"/>
-        </w:numPr>
-        <w:spacing w:line="480" w:lineRule="auto"/>
-        <w:rPr>
-          <w:rFonts w:ascii="Times New Roman" w:hAnsi="Times New Roman" w:cs="Times New Roman"/>
-        </w:rPr>
-      </w:pPr>
-      <w:r>
-        <w:rPr>
-          <w:rFonts w:ascii="Times New Roman" w:hAnsi="Times New Roman" w:cs="Times New Roman"/>
-        </w:rPr>
-        <w:t xml:space="preserve">PILIHAN PRODI 1 = </w:t>
-      </w:r>
-      <w:r>
-        <w:rPr>
-          <w:rFonts w:ascii="Times New Roman" w:hAnsi="Times New Roman" w:cs="Times New Roman"/>
-        </w:rPr>
-        <w:t>Terdapat</w:t>
-      </w:r>
-      <w:r>
-        <w:rPr>
-          <w:rFonts w:ascii="Times New Roman" w:hAnsi="Times New Roman" w:cs="Times New Roman"/>
-        </w:rPr>
-        <w:t xml:space="preserve"> </w:t>
-      </w:r>
-      <w:r>
-        <w:rPr>
-          <w:rFonts w:ascii="Times New Roman" w:hAnsi="Times New Roman" w:cs="Times New Roman"/>
-        </w:rPr>
-        <w:t xml:space="preserve">data </w:t>
-      </w:r>
-      <w:r>
-        <w:rPr>
-          <w:rFonts w:ascii="Times New Roman" w:hAnsi="Times New Roman" w:cs="Times New Roman"/>
-        </w:rPr>
-        <w:t>'-'</w:t>
-      </w:r>
-    </w:p>
-    <w:p>
-      <w:pPr>
-        <w:pStyle w:val="ListParagraph"/>
-        <w:numPr>
-          <w:ilvl w:val="0"/>
-          <w:numId w:val="12"/>
-        </w:numPr>
-        <w:spacing w:line="480" w:lineRule="auto"/>
-        <w:rPr>
-          <w:rFonts w:ascii="Times New Roman" w:hAnsi="Times New Roman" w:cs="Times New Roman"/>
-        </w:rPr>
-      </w:pPr>
-      <w:r>
-        <w:rPr>
-          <w:rFonts w:ascii="Times New Roman" w:hAnsi="Times New Roman" w:cs="Times New Roman"/>
-        </w:rPr>
-        <w:t xml:space="preserve">FAKULTAS PRODI 1 = </w:t>
-      </w:r>
-      <w:r>
-        <w:rPr>
-          <w:rFonts w:ascii="Times New Roman" w:hAnsi="Times New Roman" w:cs="Times New Roman"/>
-        </w:rPr>
-        <w:t>Terdapat</w:t>
-      </w:r>
-      <w:r>
-        <w:rPr>
-          <w:rFonts w:ascii="Times New Roman" w:hAnsi="Times New Roman" w:cs="Times New Roman"/>
-        </w:rPr>
-        <w:t xml:space="preserve"> </w:t>
-      </w:r>
-      <w:r>
-        <w:rPr>
-          <w:rFonts w:ascii="Times New Roman" w:hAnsi="Times New Roman" w:cs="Times New Roman"/>
-        </w:rPr>
-        <w:t xml:space="preserve">data </w:t>
-      </w:r>
-      <w:r>
-        <w:rPr>
-          <w:rFonts w:ascii="Times New Roman" w:hAnsi="Times New Roman" w:cs="Times New Roman"/>
-        </w:rPr>
-        <w:t>'-'</w:t>
-      </w:r>
-    </w:p>
-    <w:p>
-      <w:pPr>
-        <w:pStyle w:val="ListParagraph"/>
-        <w:numPr>
-          <w:ilvl w:val="0"/>
-          <w:numId w:val="12"/>
-        </w:numPr>
-        <w:spacing w:line="480" w:lineRule="auto"/>
-        <w:rPr>
-          <w:rFonts w:ascii="Times New Roman" w:hAnsi="Times New Roman" w:cs="Times New Roman"/>
-        </w:rPr>
-      </w:pPr>
-      <w:r>
-        <w:rPr>
-          <w:rFonts w:ascii="Times New Roman" w:hAnsi="Times New Roman" w:cs="Times New Roman"/>
-        </w:rPr>
-        <w:t xml:space="preserve">PILIHAN PRODI 2 = </w:t>
-      </w:r>
-      <w:r>
-        <w:rPr>
-          <w:rFonts w:ascii="Times New Roman" w:hAnsi="Times New Roman" w:cs="Times New Roman"/>
-        </w:rPr>
-        <w:t>Terdapat</w:t>
-      </w:r>
-      <w:r>
-        <w:rPr>
-          <w:rFonts w:ascii="Times New Roman" w:hAnsi="Times New Roman" w:cs="Times New Roman"/>
-        </w:rPr>
-        <w:t xml:space="preserve"> </w:t>
-      </w:r>
-      <w:r>
-        <w:rPr>
-          <w:rFonts w:ascii="Times New Roman" w:hAnsi="Times New Roman" w:cs="Times New Roman"/>
-        </w:rPr>
-        <w:t xml:space="preserve">data </w:t>
-      </w:r>
-      <w:r>
-        <w:rPr>
-          <w:rFonts w:ascii="Times New Roman" w:hAnsi="Times New Roman" w:cs="Times New Roman"/>
-        </w:rPr>
-        <w:t>'-'</w:t>
-      </w:r>
-    </w:p>
-    <w:p>
-      <w:pPr>
-        <w:pStyle w:val="ListParagraph"/>
-        <w:numPr>
-          <w:ilvl w:val="0"/>
-          <w:numId w:val="12"/>
-        </w:numPr>
-        <w:spacing w:line="480" w:lineRule="auto"/>
-        <w:rPr>
-          <w:rFonts w:ascii="Times New Roman" w:hAnsi="Times New Roman" w:cs="Times New Roman"/>
-        </w:rPr>
-      </w:pPr>
-      <w:r>
-        <w:rPr>
-          <w:rFonts w:ascii="Times New Roman" w:hAnsi="Times New Roman" w:cs="Times New Roman"/>
-        </w:rPr>
-        <w:t xml:space="preserve">FAKULTAS PRODI 2 = </w:t>
-      </w:r>
-      <w:r>
-        <w:rPr>
-          <w:rFonts w:ascii="Times New Roman" w:hAnsi="Times New Roman" w:cs="Times New Roman"/>
-        </w:rPr>
-        <w:t>Terdapat</w:t>
-      </w:r>
-      <w:r>
-        <w:rPr>
-          <w:rFonts w:ascii="Times New Roman" w:hAnsi="Times New Roman" w:cs="Times New Roman"/>
-        </w:rPr>
-        <w:t xml:space="preserve"> </w:t>
-      </w:r>
-      <w:r>
-        <w:rPr>
-          <w:rFonts w:ascii="Times New Roman" w:hAnsi="Times New Roman" w:cs="Times New Roman"/>
-        </w:rPr>
-        <w:t xml:space="preserve">data </w:t>
-      </w:r>
-      <w:r>
-        <w:rPr>
-          <w:rFonts w:ascii="Times New Roman" w:hAnsi="Times New Roman" w:cs="Times New Roman"/>
-        </w:rPr>
-        <w:t>'-'</w:t>
-      </w:r>
-    </w:p>
-    <w:p>
-      <w:pPr>
-        <w:pStyle w:val="ListParagraph"/>
-        <w:numPr>
-          <w:ilvl w:val="0"/>
-          <w:numId w:val="12"/>
-        </w:numPr>
-        <w:spacing w:line="480" w:lineRule="auto"/>
-        <w:rPr>
-          <w:rFonts w:ascii="Times New Roman" w:hAnsi="Times New Roman" w:cs="Times New Roman"/>
-        </w:rPr>
-      </w:pPr>
-      <w:r>
-        <w:rPr>
-          <w:rFonts w:ascii="Times New Roman" w:hAnsi="Times New Roman" w:cs="Times New Roman"/>
-        </w:rPr>
-        <w:lastRenderedPageBreak/>
-        <w:t xml:space="preserve">DITERIMA PRODI = </w:t>
-      </w:r>
-      <w:r>
-        <w:rPr>
-          <w:rFonts w:ascii="Times New Roman" w:hAnsi="Times New Roman" w:cs="Times New Roman"/>
-        </w:rPr>
-        <w:t xml:space="preserve">Terdapat </w:t>
-      </w:r>
-      <w:r>
-        <w:rPr>
-          <w:rFonts w:ascii="Times New Roman" w:hAnsi="Times New Roman" w:cs="Times New Roman"/>
-        </w:rPr>
-        <w:t xml:space="preserve">data </w:t>
-      </w:r>
-      <w:r>
-        <w:rPr>
-          <w:rFonts w:ascii="Times New Roman" w:hAnsi="Times New Roman" w:cs="Times New Roman"/>
-        </w:rPr>
-        <w:t>'-'</w:t>
-      </w:r>
-    </w:p>
-    <w:p>
-      <w:pPr>
-        <w:pStyle w:val="ListParagraph"/>
-        <w:numPr>
-          <w:ilvl w:val="0"/>
-          <w:numId w:val="12"/>
-        </w:numPr>
-        <w:spacing w:line="480" w:lineRule="auto"/>
-        <w:rPr>
-          <w:rFonts w:ascii="Times New Roman" w:hAnsi="Times New Roman" w:cs="Times New Roman"/>
-        </w:rPr>
-      </w:pPr>
-      <w:r>
-        <w:rPr>
-          <w:rFonts w:ascii="Times New Roman" w:hAnsi="Times New Roman" w:cs="Times New Roman"/>
-        </w:rPr>
-        <w:t xml:space="preserve">FAKULTAS PRODI DITERMA = </w:t>
-      </w:r>
-      <w:r>
-        <w:rPr>
-          <w:rFonts w:ascii="Times New Roman" w:hAnsi="Times New Roman" w:cs="Times New Roman"/>
-        </w:rPr>
-        <w:t>Terdapat</w:t>
-      </w:r>
-      <w:r>
-        <w:rPr>
-          <w:rFonts w:ascii="Times New Roman" w:hAnsi="Times New Roman" w:cs="Times New Roman"/>
-        </w:rPr>
-        <w:t xml:space="preserve"> </w:t>
-      </w:r>
-      <w:r>
-        <w:rPr>
-          <w:rFonts w:ascii="Times New Roman" w:hAnsi="Times New Roman" w:cs="Times New Roman"/>
-        </w:rPr>
-        <w:t xml:space="preserve">data </w:t>
-      </w:r>
-      <w:r>
-        <w:rPr>
-          <w:rFonts w:ascii="Times New Roman" w:hAnsi="Times New Roman" w:cs="Times New Roman"/>
-        </w:rPr>
-        <w:t xml:space="preserve">'-' </w:t>
-      </w:r>
-    </w:p>
-    <w:p>
-      <w:pPr>
-        <w:pStyle w:val="ListParagraph"/>
-        <w:numPr>
-          <w:ilvl w:val="0"/>
-          <w:numId w:val="12"/>
-        </w:numPr>
-        <w:spacing w:line="480" w:lineRule="auto"/>
-        <w:rPr>
-          <w:rFonts w:ascii="Times New Roman" w:hAnsi="Times New Roman" w:cs="Times New Roman"/>
-        </w:rPr>
-      </w:pPr>
-      <w:r>
-        <w:rPr>
-          <w:rFonts w:ascii="Times New Roman" w:hAnsi="Times New Roman" w:cs="Times New Roman"/>
-        </w:rPr>
-        <w:t>USIA = Terdapat usia tidak wajar, contoh: 1</w:t>
-      </w:r>
-      <w:r>
-        <w:rPr>
-          <w:rFonts w:ascii="Times New Roman" w:hAnsi="Times New Roman" w:cs="Times New Roman"/>
-        </w:rPr>
-        <w:t>20</w:t>
-      </w:r>
-      <w:r>
-        <w:rPr>
-          <w:rFonts w:ascii="Times New Roman" w:hAnsi="Times New Roman" w:cs="Times New Roman"/>
-        </w:rPr>
-        <w:t xml:space="preserve"> dan 0 tahun</w:t>
+        <w:ind w:left="2160" w:firstLine="720"/>
+        <w:jc w:val="both"/>
+        <w:rPr>
+          <w:rFonts w:ascii="Times New Roman" w:hAnsi="Times New Roman" w:cs="Times New Roman"/>
+        </w:rPr>
+      </w:pPr>
+      <w:r>
+        <w:rPr>
+          <w:rFonts w:ascii="Times New Roman" w:hAnsi="Times New Roman" w:cs="Times New Roman"/>
+        </w:rPr>
+        <w:t xml:space="preserve">Distribusi pada kolom Pekerjaan Orang Tua (Ibu) menunjukkan variasi pekerjaan yang dijalani oleh ibu dari para pendaftar. Berdasarkan hasil visualisasi, seluruh nilai yang muncul merupakan jenis pekerjaan yang wajar dan umum ditemukan di masyarakat, seperti </w:t>
+      </w:r>
+      <w:r>
+        <w:rPr>
+          <w:rFonts w:ascii="Times New Roman" w:hAnsi="Times New Roman" w:cs="Times New Roman"/>
+        </w:rPr>
+        <w:t xml:space="preserve">tidak bekerja, </w:t>
+      </w:r>
+      <w:r>
+        <w:rPr>
+          <w:rFonts w:ascii="Times New Roman" w:hAnsi="Times New Roman" w:cs="Times New Roman"/>
+        </w:rPr>
+        <w:t>PNS/TNI/</w:t>
+      </w:r>
+      <w:r>
+        <w:rPr>
+          <w:rFonts w:ascii="Times New Roman" w:hAnsi="Times New Roman" w:cs="Times New Roman"/>
+        </w:rPr>
+        <w:t>Polri</w:t>
+      </w:r>
+      <w:r>
+        <w:rPr>
+          <w:rFonts w:ascii="Times New Roman" w:hAnsi="Times New Roman" w:cs="Times New Roman"/>
+        </w:rPr>
+        <w:t xml:space="preserve">, </w:t>
+      </w:r>
+      <w:r>
+        <w:rPr>
+          <w:rFonts w:ascii="Times New Roman" w:hAnsi="Times New Roman" w:cs="Times New Roman"/>
+        </w:rPr>
+        <w:t>karyawan swasta</w:t>
+      </w:r>
+      <w:r>
+        <w:rPr>
+          <w:rFonts w:ascii="Times New Roman" w:hAnsi="Times New Roman" w:cs="Times New Roman"/>
+        </w:rPr>
+        <w:t>, dan profesi lainnya. Tidak terdapat nilai yang janggal, kosong, atau tidak relevan. Oleh karena itu, data pada kolom ini dapat dinyatakan aman dan valid untuk digunakan dalam proses visualisasi lebih lanjut.</w:t>
       </w:r>
     </w:p>
     <w:p>
@@ -17013,6 +17084,7 @@
           <w:i/>
           <w:iCs/>
         </w:rPr>
+        <w:lastRenderedPageBreak/>
         <w:t>problem solving</w:t>
       </w:r>
       <w:r>
@@ -17112,7 +17184,6 @@
           <w:rFonts w:ascii="Times New Roman" w:hAnsi="Times New Roman" w:cs="Times New Roman"/>
           <w:noProof/>
         </w:rPr>
-        <w:lastRenderedPageBreak/>
         <w:drawing>
           <wp:inline distT="0" distB="0" distL="0" distR="0" wp14:anchorId="243B031C" wp14:editId="6749E333">
             <wp:extent cx="3600000" cy="4090166"/>
@@ -17174,9 +17245,9 @@
           <w:rFonts w:ascii="Times New Roman" w:hAnsi="Times New Roman" w:cs="Times New Roman"/>
         </w:rPr>
       </w:pPr>
-      <w:bookmarkStart w:id="101" w:name="_Toc200446320"/>
-      <w:bookmarkStart w:id="102" w:name="_Toc200618682"/>
-      <w:bookmarkStart w:id="103" w:name="_Toc200619042"/>
+      <w:bookmarkStart w:id="62" w:name="_Toc200446320"/>
+      <w:bookmarkStart w:id="63" w:name="_Toc200618682"/>
+      <w:bookmarkStart w:id="64" w:name="_Toc200619042"/>
       <w:r>
         <w:t xml:space="preserve">Gambar 3. </w:t>
       </w:r>
@@ -17207,9 +17278,9 @@
       <w:r>
         <w:t>alidasi ulang struktur data</w:t>
       </w:r>
-      <w:bookmarkEnd w:id="101"/>
-      <w:bookmarkEnd w:id="102"/>
-      <w:bookmarkEnd w:id="103"/>
+      <w:bookmarkEnd w:id="62"/>
+      <w:bookmarkEnd w:id="63"/>
+      <w:bookmarkEnd w:id="64"/>
     </w:p>
     <w:p>
       <w:pPr>
@@ -17233,7 +17304,14 @@
         <w:rPr>
           <w:rFonts w:ascii="Times New Roman" w:hAnsi="Times New Roman" w:cs="Times New Roman"/>
         </w:rPr>
-        <w:t>Pada proses validasi data, ditemukan 54 data duplikat yang hanya akan menyebabkan ketidakaslian data pada tahap visualisasi nantinya</w:t>
+        <w:t xml:space="preserve">Pada proses validasi data, ditemukan 54 data duplikat yang hanya akan menyebabkan ketidakaslian data pada tahap visualisasi </w:t>
+      </w:r>
+      <w:r>
+        <w:rPr>
+          <w:rFonts w:ascii="Times New Roman" w:hAnsi="Times New Roman" w:cs="Times New Roman"/>
+        </w:rPr>
+        <w:lastRenderedPageBreak/>
+        <w:t>nantinya</w:t>
       </w:r>
       <w:r>
         <w:rPr>
@@ -17285,7 +17363,6 @@
           <w:rFonts w:ascii="Times New Roman" w:hAnsi="Times New Roman" w:cs="Times New Roman"/>
           <w:noProof/>
         </w:rPr>
-        <w:lastRenderedPageBreak/>
         <w:drawing>
           <wp:inline distT="0" distB="0" distL="0" distR="0" wp14:anchorId="244B21FA" wp14:editId="64149F72">
             <wp:extent cx="3600000" cy="2276551"/>
@@ -17347,9 +17424,9 @@
           <w:rFonts w:ascii="Times New Roman" w:hAnsi="Times New Roman" w:cs="Times New Roman"/>
         </w:rPr>
       </w:pPr>
-      <w:bookmarkStart w:id="104" w:name="_Toc200446321"/>
-      <w:bookmarkStart w:id="105" w:name="_Toc200618683"/>
-      <w:bookmarkStart w:id="106" w:name="_Toc200619043"/>
+      <w:bookmarkStart w:id="65" w:name="_Toc200446321"/>
+      <w:bookmarkStart w:id="66" w:name="_Toc200618683"/>
+      <w:bookmarkStart w:id="67" w:name="_Toc200619043"/>
       <w:r>
         <w:t xml:space="preserve">Gambar 3. </w:t>
       </w:r>
@@ -17380,9 +17457,9 @@
       <w:r>
         <w:t>alidasi ulang duplikasi data</w:t>
       </w:r>
-      <w:bookmarkEnd w:id="104"/>
-      <w:bookmarkEnd w:id="105"/>
-      <w:bookmarkEnd w:id="106"/>
+      <w:bookmarkEnd w:id="65"/>
+      <w:bookmarkEnd w:id="66"/>
+      <w:bookmarkEnd w:id="67"/>
     </w:p>
     <w:p>
       <w:pPr>
@@ -17618,9 +17695,9 @@
           <w:rFonts w:ascii="Times New Roman" w:hAnsi="Times New Roman" w:cs="Times New Roman"/>
         </w:rPr>
       </w:pPr>
-      <w:bookmarkStart w:id="107" w:name="_Toc200446322"/>
-      <w:bookmarkStart w:id="108" w:name="_Toc200618684"/>
-      <w:bookmarkStart w:id="109" w:name="_Toc200619044"/>
+      <w:bookmarkStart w:id="68" w:name="_Toc200446322"/>
+      <w:bookmarkStart w:id="69" w:name="_Toc200618684"/>
+      <w:bookmarkStart w:id="70" w:name="_Toc200619044"/>
       <w:r>
         <w:t xml:space="preserve">Gambar 3. </w:t>
       </w:r>
@@ -17651,9 +17728,9 @@
       <w:r>
         <w:t>validasi ulang missing/null values</w:t>
       </w:r>
-      <w:bookmarkEnd w:id="107"/>
-      <w:bookmarkEnd w:id="108"/>
-      <w:bookmarkEnd w:id="109"/>
+      <w:bookmarkEnd w:id="68"/>
+      <w:bookmarkEnd w:id="69"/>
+      <w:bookmarkEnd w:id="70"/>
     </w:p>
     <w:p>
       <w:pPr>
@@ -17730,9 +17807,9 @@
           <w:color w:val="auto"/>
         </w:rPr>
       </w:pPr>
-      <w:bookmarkStart w:id="110" w:name="_Toc200446323"/>
-      <w:bookmarkStart w:id="111" w:name="_Toc200618685"/>
-      <w:bookmarkStart w:id="112" w:name="_Toc200619045"/>
+      <w:bookmarkStart w:id="71" w:name="_Toc200446323"/>
+      <w:bookmarkStart w:id="72" w:name="_Toc200618685"/>
+      <w:bookmarkStart w:id="73" w:name="_Toc200619045"/>
       <w:r>
         <w:t xml:space="preserve">Gambar 3. </w:t>
       </w:r>
@@ -17763,9 +17840,9 @@
       <w:r>
         <w:t>contoh data missing yang di isi dengan teknik imputation</w:t>
       </w:r>
-      <w:bookmarkEnd w:id="110"/>
-      <w:bookmarkEnd w:id="111"/>
-      <w:bookmarkEnd w:id="112"/>
+      <w:bookmarkEnd w:id="71"/>
+      <w:bookmarkEnd w:id="72"/>
+      <w:bookmarkEnd w:id="73"/>
     </w:p>
     <w:p>
       <w:pPr>
@@ -17942,9 +18019,9 @@
         <w:spacing w:line="480" w:lineRule="auto"/>
         <w:jc w:val="center"/>
       </w:pPr>
-      <w:bookmarkStart w:id="113" w:name="_Toc200446324"/>
-      <w:bookmarkStart w:id="114" w:name="_Toc200618686"/>
-      <w:bookmarkStart w:id="115" w:name="_Toc200619046"/>
+      <w:bookmarkStart w:id="74" w:name="_Toc200446324"/>
+      <w:bookmarkStart w:id="75" w:name="_Toc200618686"/>
+      <w:bookmarkStart w:id="76" w:name="_Toc200619046"/>
       <w:r>
         <w:t xml:space="preserve">Gambar 3. </w:t>
       </w:r>
@@ -17975,9 +18052,9 @@
       <w:r>
         <w:t>validasi ulang distribusi usia</w:t>
       </w:r>
-      <w:bookmarkEnd w:id="113"/>
-      <w:bookmarkEnd w:id="114"/>
-      <w:bookmarkEnd w:id="115"/>
+      <w:bookmarkEnd w:id="74"/>
+      <w:bookmarkEnd w:id="75"/>
+      <w:bookmarkEnd w:id="76"/>
     </w:p>
     <w:p>
       <w:pPr>
@@ -18048,9 +18125,9 @@
         <w:spacing w:line="480" w:lineRule="auto"/>
         <w:jc w:val="center"/>
       </w:pPr>
-      <w:bookmarkStart w:id="116" w:name="_Toc200446325"/>
-      <w:bookmarkStart w:id="117" w:name="_Toc200618687"/>
-      <w:bookmarkStart w:id="118" w:name="_Toc200619047"/>
+      <w:bookmarkStart w:id="77" w:name="_Toc200446325"/>
+      <w:bookmarkStart w:id="78" w:name="_Toc200618687"/>
+      <w:bookmarkStart w:id="79" w:name="_Toc200619047"/>
       <w:r>
         <w:t xml:space="preserve">Gambar 3. </w:t>
       </w:r>
@@ -18081,9 +18158,9 @@
       <w:r>
         <w:t>validasi ulang fakultas prodi diterima</w:t>
       </w:r>
-      <w:bookmarkEnd w:id="116"/>
-      <w:bookmarkEnd w:id="117"/>
-      <w:bookmarkEnd w:id="118"/>
+      <w:bookmarkEnd w:id="77"/>
+      <w:bookmarkEnd w:id="78"/>
+      <w:bookmarkEnd w:id="79"/>
     </w:p>
     <w:p>
       <w:pPr>
@@ -18154,9 +18231,9 @@
         <w:pStyle w:val="Caption"/>
         <w:jc w:val="center"/>
       </w:pPr>
-      <w:bookmarkStart w:id="119" w:name="_Toc200446326"/>
-      <w:bookmarkStart w:id="120" w:name="_Toc200618688"/>
-      <w:bookmarkStart w:id="121" w:name="_Toc200619048"/>
+      <w:bookmarkStart w:id="80" w:name="_Toc200446326"/>
+      <w:bookmarkStart w:id="81" w:name="_Toc200618688"/>
+      <w:bookmarkStart w:id="82" w:name="_Toc200619048"/>
       <w:r>
         <w:t xml:space="preserve">Gambar 3. </w:t>
       </w:r>
@@ -18187,9 +18264,9 @@
       <w:r>
         <w:t>validasi ulang distribusi fakultas prodi 1</w:t>
       </w:r>
-      <w:bookmarkEnd w:id="119"/>
-      <w:bookmarkEnd w:id="120"/>
-      <w:bookmarkEnd w:id="121"/>
+      <w:bookmarkEnd w:id="80"/>
+      <w:bookmarkEnd w:id="81"/>
+      <w:bookmarkEnd w:id="82"/>
     </w:p>
     <w:p>
       <w:pPr>
@@ -18358,9 +18435,9 @@
         <w:spacing w:line="480" w:lineRule="auto"/>
         <w:jc w:val="center"/>
       </w:pPr>
-      <w:bookmarkStart w:id="122" w:name="_Toc200446327"/>
-      <w:bookmarkStart w:id="123" w:name="_Toc200618689"/>
-      <w:bookmarkStart w:id="124" w:name="_Toc200619049"/>
+      <w:bookmarkStart w:id="83" w:name="_Toc200446327"/>
+      <w:bookmarkStart w:id="84" w:name="_Toc200618689"/>
+      <w:bookmarkStart w:id="85" w:name="_Toc200619049"/>
       <w:r>
         <w:t xml:space="preserve">Gambar 3. </w:t>
       </w:r>
@@ -18391,9 +18468,9 @@
       <w:r>
         <w:t>validasi ulang distribusi prodi diterima</w:t>
       </w:r>
-      <w:bookmarkEnd w:id="122"/>
-      <w:bookmarkEnd w:id="123"/>
-      <w:bookmarkEnd w:id="124"/>
+      <w:bookmarkEnd w:id="83"/>
+      <w:bookmarkEnd w:id="84"/>
+      <w:bookmarkEnd w:id="85"/>
     </w:p>
     <w:p>
       <w:pPr>
@@ -18465,9 +18542,9 @@
         <w:spacing w:line="480" w:lineRule="auto"/>
         <w:jc w:val="center"/>
       </w:pPr>
-      <w:bookmarkStart w:id="125" w:name="_Toc200446328"/>
-      <w:bookmarkStart w:id="126" w:name="_Toc200618690"/>
-      <w:bookmarkStart w:id="127" w:name="_Toc200619050"/>
+      <w:bookmarkStart w:id="86" w:name="_Toc200446328"/>
+      <w:bookmarkStart w:id="87" w:name="_Toc200618690"/>
+      <w:bookmarkStart w:id="88" w:name="_Toc200619050"/>
       <w:r>
         <w:t xml:space="preserve">Gambar 3. </w:t>
       </w:r>
@@ -18498,9 +18575,9 @@
       <w:r>
         <w:t>validasi ulang distribusi prodi pilihan 1</w:t>
       </w:r>
-      <w:bookmarkEnd w:id="125"/>
-      <w:bookmarkEnd w:id="126"/>
-      <w:bookmarkEnd w:id="127"/>
+      <w:bookmarkEnd w:id="86"/>
+      <w:bookmarkEnd w:id="87"/>
+      <w:bookmarkEnd w:id="88"/>
     </w:p>
     <w:p>
       <w:pPr>
@@ -18575,9 +18652,9 @@
           <w:rFonts w:ascii="Times New Roman" w:hAnsi="Times New Roman" w:cs="Times New Roman"/>
         </w:rPr>
       </w:pPr>
-      <w:bookmarkStart w:id="128" w:name="_Toc200446329"/>
-      <w:bookmarkStart w:id="129" w:name="_Toc200618691"/>
-      <w:bookmarkStart w:id="130" w:name="_Toc200619051"/>
+      <w:bookmarkStart w:id="89" w:name="_Toc200446329"/>
+      <w:bookmarkStart w:id="90" w:name="_Toc200618691"/>
+      <w:bookmarkStart w:id="91" w:name="_Toc200619051"/>
       <w:r>
         <w:t xml:space="preserve">Gambar 3. </w:t>
       </w:r>
@@ -18608,9 +18685,9 @@
       <w:r>
         <w:t>validasi ulang prodi pilihan 2</w:t>
       </w:r>
-      <w:bookmarkEnd w:id="128"/>
-      <w:bookmarkEnd w:id="129"/>
-      <w:bookmarkEnd w:id="130"/>
+      <w:bookmarkEnd w:id="89"/>
+      <w:bookmarkEnd w:id="90"/>
+      <w:bookmarkEnd w:id="91"/>
     </w:p>
     <w:p>
       <w:pPr>
@@ -18831,9 +18908,9 @@
           <w:rFonts w:ascii="Times New Roman" w:hAnsi="Times New Roman" w:cs="Times New Roman"/>
         </w:rPr>
       </w:pPr>
-      <w:bookmarkStart w:id="131" w:name="_Toc200446330"/>
-      <w:bookmarkStart w:id="132" w:name="_Toc200618692"/>
-      <w:bookmarkStart w:id="133" w:name="_Toc200619052"/>
+      <w:bookmarkStart w:id="92" w:name="_Toc200446330"/>
+      <w:bookmarkStart w:id="93" w:name="_Toc200618692"/>
+      <w:bookmarkStart w:id="94" w:name="_Toc200619052"/>
       <w:r>
         <w:t xml:space="preserve">Gambar 3. </w:t>
       </w:r>
@@ -18864,9 +18941,9 @@
       <w:r>
         <w:t>sintaks pembuatan kolom Kabupaten/Kota</w:t>
       </w:r>
-      <w:bookmarkEnd w:id="131"/>
-      <w:bookmarkEnd w:id="132"/>
-      <w:bookmarkEnd w:id="133"/>
+      <w:bookmarkEnd w:id="92"/>
+      <w:bookmarkEnd w:id="93"/>
+      <w:bookmarkEnd w:id="94"/>
     </w:p>
     <w:p>
       <w:pPr>
@@ -18942,9 +19019,9 @@
           <w:rFonts w:ascii="Times New Roman" w:hAnsi="Times New Roman" w:cs="Times New Roman"/>
         </w:rPr>
       </w:pPr>
-      <w:bookmarkStart w:id="134" w:name="_Toc200446331"/>
-      <w:bookmarkStart w:id="135" w:name="_Toc200618693"/>
-      <w:bookmarkStart w:id="136" w:name="_Toc200619053"/>
+      <w:bookmarkStart w:id="95" w:name="_Toc200446331"/>
+      <w:bookmarkStart w:id="96" w:name="_Toc200618693"/>
+      <w:bookmarkStart w:id="97" w:name="_Toc200619053"/>
       <w:r>
         <w:t xml:space="preserve">Gambar 3. </w:t>
       </w:r>
@@ -18975,9 +19052,9 @@
       <w:r>
         <w:t>sintaks pembuatan kolom Provinsi</w:t>
       </w:r>
-      <w:bookmarkEnd w:id="134"/>
-      <w:bookmarkEnd w:id="135"/>
-      <w:bookmarkEnd w:id="136"/>
+      <w:bookmarkEnd w:id="95"/>
+      <w:bookmarkEnd w:id="96"/>
+      <w:bookmarkEnd w:id="97"/>
     </w:p>
     <w:p>
       <w:pPr>
@@ -19053,9 +19130,9 @@
           <w:color w:val="auto"/>
         </w:rPr>
       </w:pPr>
-      <w:bookmarkStart w:id="137" w:name="_Toc200446332"/>
-      <w:bookmarkStart w:id="138" w:name="_Toc200618694"/>
-      <w:bookmarkStart w:id="139" w:name="_Toc200619054"/>
+      <w:bookmarkStart w:id="98" w:name="_Toc200446332"/>
+      <w:bookmarkStart w:id="99" w:name="_Toc200618694"/>
+      <w:bookmarkStart w:id="100" w:name="_Toc200619054"/>
       <w:r>
         <w:t xml:space="preserve">Gambar 3. </w:t>
       </w:r>
@@ -19086,9 +19163,9 @@
       <w:r>
         <w:t>contoh hasil pembuatan kolom baru</w:t>
       </w:r>
-      <w:bookmarkEnd w:id="137"/>
-      <w:bookmarkEnd w:id="138"/>
-      <w:bookmarkEnd w:id="139"/>
+      <w:bookmarkEnd w:id="98"/>
+      <w:bookmarkEnd w:id="99"/>
+      <w:bookmarkEnd w:id="100"/>
     </w:p>
     <w:p>
       <w:pPr>
@@ -19804,7 +19881,19 @@
         <w:rPr>
           <w:rFonts w:ascii="Times New Roman" w:hAnsi="Times New Roman" w:cs="Times New Roman"/>
         </w:rPr>
-        <w:t>. Berikut ini adalah hasil dari tahap ini</w:t>
+        <w:t xml:space="preserve">. </w:t>
+      </w:r>
+      <w:r>
+        <w:rPr>
+          <w:rFonts w:ascii="Times New Roman" w:hAnsi="Times New Roman" w:cs="Times New Roman"/>
+        </w:rPr>
+        <w:t>Gambar 3.38 dan 3.39</w:t>
+      </w:r>
+      <w:r>
+        <w:rPr>
+          <w:rFonts w:ascii="Times New Roman" w:hAnsi="Times New Roman" w:cs="Times New Roman"/>
+        </w:rPr>
+        <w:t xml:space="preserve"> adalah hasil dari tahap ini</w:t>
       </w:r>
       <w:r>
         <w:rPr>
@@ -19834,21 +19923,18 @@
     </w:p>
     <w:p>
       <w:pPr>
-        <w:pStyle w:val="ListParagraph"/>
         <w:keepNext/>
         <w:spacing w:line="480" w:lineRule="auto"/>
-        <w:ind w:left="1440"/>
         <w:jc w:val="center"/>
       </w:pPr>
       <w:r>
         <w:rPr>
-          <w:rFonts w:ascii="Times New Roman" w:hAnsi="Times New Roman" w:cs="Times New Roman"/>
           <w:noProof/>
         </w:rPr>
         <w:drawing>
-          <wp:inline distT="0" distB="0" distL="0" distR="0" wp14:anchorId="0500A38A" wp14:editId="423E443D">
-            <wp:extent cx="3960000" cy="2260000"/>
-            <wp:effectExtent l="19050" t="19050" r="21590" b="26035"/>
+          <wp:inline distT="0" distB="0" distL="0" distR="0" wp14:anchorId="0500A38A" wp14:editId="3DF40BCC">
+            <wp:extent cx="5400000" cy="3081818"/>
+            <wp:effectExtent l="19050" t="19050" r="10795" b="23495"/>
             <wp:docPr id="1816641514" name="Picture 1"/>
             <wp:cNvGraphicFramePr>
               <a:graphicFrameLocks xmlns:a="http://schemas.openxmlformats.org/drawingml/2006/main" noChangeAspect="1"/>
@@ -19878,7 +19964,7 @@
                   <pic:spPr bwMode="auto">
                     <a:xfrm>
                       <a:off x="0" y="0"/>
-                      <a:ext cx="3960000" cy="2260000"/>
+                      <a:ext cx="5400000" cy="3081818"/>
                     </a:xfrm>
                     <a:prstGeom prst="rect">
                       <a:avLst/>
@@ -19906,9 +19992,9 @@
           <w:rFonts w:ascii="Times New Roman" w:hAnsi="Times New Roman" w:cs="Times New Roman"/>
         </w:rPr>
       </w:pPr>
-      <w:bookmarkStart w:id="140" w:name="_Toc200446333"/>
-      <w:bookmarkStart w:id="141" w:name="_Toc200618695"/>
-      <w:bookmarkStart w:id="142" w:name="_Toc200619055"/>
+      <w:bookmarkStart w:id="101" w:name="_Toc200446333"/>
+      <w:bookmarkStart w:id="102" w:name="_Toc200618695"/>
+      <w:bookmarkStart w:id="103" w:name="_Toc200619055"/>
       <w:r>
         <w:t xml:space="preserve">Gambar 3. </w:t>
       </w:r>
@@ -19939,9 +20025,9 @@
       <w:r>
         <w:t>dashboard overview</w:t>
       </w:r>
-      <w:bookmarkEnd w:id="140"/>
-      <w:bookmarkEnd w:id="141"/>
-      <w:bookmarkEnd w:id="142"/>
+      <w:bookmarkEnd w:id="101"/>
+      <w:bookmarkEnd w:id="102"/>
+      <w:bookmarkEnd w:id="103"/>
     </w:p>
     <w:p>
       <w:pPr>
@@ -19952,6 +20038,7 @@
           <w:i/>
           <w:iCs/>
         </w:rPr>
+        <w:lastRenderedPageBreak/>
         <w:t>Dashboard</w:t>
       </w:r>
       <w:r>
@@ -19960,22 +20047,18 @@
     </w:p>
     <w:p>
       <w:pPr>
-        <w:pStyle w:val="ListParagraph"/>
         <w:keepNext/>
         <w:spacing w:line="480" w:lineRule="auto"/>
-        <w:ind w:left="1440"/>
         <w:jc w:val="center"/>
       </w:pPr>
       <w:r>
         <w:rPr>
-          <w:rFonts w:ascii="Times New Roman" w:hAnsi="Times New Roman" w:cs="Times New Roman"/>
           <w:noProof/>
         </w:rPr>
-        <w:lastRenderedPageBreak/>
         <w:drawing>
-          <wp:inline distT="0" distB="0" distL="0" distR="0" wp14:anchorId="7D6A7027" wp14:editId="785E4ABF">
-            <wp:extent cx="3960000" cy="2262000"/>
-            <wp:effectExtent l="19050" t="19050" r="21590" b="24130"/>
+          <wp:inline distT="0" distB="0" distL="0" distR="0" wp14:anchorId="7D6A7027" wp14:editId="079CA3AC">
+            <wp:extent cx="5400000" cy="3084545"/>
+            <wp:effectExtent l="19050" t="19050" r="10795" b="20955"/>
             <wp:docPr id="314435876" name="Picture 2"/>
             <wp:cNvGraphicFramePr>
               <a:graphicFrameLocks xmlns:a="http://schemas.openxmlformats.org/drawingml/2006/main" noChangeAspect="1"/>
@@ -20005,7 +20088,7 @@
                   <pic:spPr bwMode="auto">
                     <a:xfrm>
                       <a:off x="0" y="0"/>
-                      <a:ext cx="3960000" cy="2262000"/>
+                      <a:ext cx="5400000" cy="3084545"/>
                     </a:xfrm>
                     <a:prstGeom prst="rect">
                       <a:avLst/>
@@ -20033,9 +20116,9 @@
           <w:rFonts w:ascii="Times New Roman" w:hAnsi="Times New Roman" w:cs="Times New Roman"/>
         </w:rPr>
       </w:pPr>
-      <w:bookmarkStart w:id="143" w:name="_Toc200446334"/>
-      <w:bookmarkStart w:id="144" w:name="_Toc200618696"/>
-      <w:bookmarkStart w:id="145" w:name="_Toc200619056"/>
+      <w:bookmarkStart w:id="104" w:name="_Toc200446334"/>
+      <w:bookmarkStart w:id="105" w:name="_Toc200618696"/>
+      <w:bookmarkStart w:id="106" w:name="_Toc200619056"/>
       <w:r>
         <w:t xml:space="preserve">Gambar 3. </w:t>
       </w:r>
@@ -20066,9 +20149,9 @@
       <w:r>
         <w:t>dashboard demografi</w:t>
       </w:r>
-      <w:bookmarkEnd w:id="143"/>
-      <w:bookmarkEnd w:id="144"/>
-      <w:bookmarkEnd w:id="145"/>
+      <w:bookmarkEnd w:id="104"/>
+      <w:bookmarkEnd w:id="105"/>
+      <w:bookmarkEnd w:id="106"/>
     </w:p>
     <w:p>
       <w:pPr>
@@ -20373,6 +20456,7 @@
         <w:rPr>
           <w:rFonts w:ascii="Times New Roman" w:hAnsi="Times New Roman" w:cs="Times New Roman"/>
         </w:rPr>
+        <w:lastRenderedPageBreak/>
         <w:t>Bar n</w:t>
       </w:r>
       <w:r>
@@ -20465,7 +20549,6 @@
           <w:i/>
           <w:iCs/>
         </w:rPr>
-        <w:lastRenderedPageBreak/>
         <w:t>Funfact</w:t>
       </w:r>
       <w:r>
@@ -20870,9 +20953,9 @@
           <w:rFonts w:ascii="Times New Roman" w:hAnsi="Times New Roman" w:cs="Times New Roman"/>
         </w:rPr>
       </w:pPr>
-      <w:bookmarkStart w:id="146" w:name="_Toc200446335"/>
-      <w:bookmarkStart w:id="147" w:name="_Toc200618697"/>
-      <w:bookmarkStart w:id="148" w:name="_Toc200619057"/>
+      <w:bookmarkStart w:id="107" w:name="_Toc200446335"/>
+      <w:bookmarkStart w:id="108" w:name="_Toc200618697"/>
+      <w:bookmarkStart w:id="109" w:name="_Toc200619057"/>
       <w:r>
         <w:t xml:space="preserve">Gambar 3. </w:t>
       </w:r>
@@ -20903,9 +20986,9 @@
       <w:r>
         <w:t>bar navigasi halaman utama</w:t>
       </w:r>
-      <w:bookmarkEnd w:id="146"/>
-      <w:bookmarkEnd w:id="147"/>
-      <w:bookmarkEnd w:id="148"/>
+      <w:bookmarkEnd w:id="107"/>
+      <w:bookmarkEnd w:id="108"/>
+      <w:bookmarkEnd w:id="109"/>
     </w:p>
     <w:p>
       <w:pPr>
@@ -21023,9 +21106,9 @@
           <w:rFonts w:ascii="Times New Roman" w:hAnsi="Times New Roman" w:cs="Times New Roman"/>
         </w:rPr>
       </w:pPr>
-      <w:bookmarkStart w:id="149" w:name="_Toc200446336"/>
-      <w:bookmarkStart w:id="150" w:name="_Toc200618698"/>
-      <w:bookmarkStart w:id="151" w:name="_Toc200619058"/>
+      <w:bookmarkStart w:id="110" w:name="_Toc200446336"/>
+      <w:bookmarkStart w:id="111" w:name="_Toc200618698"/>
+      <w:bookmarkStart w:id="112" w:name="_Toc200619058"/>
       <w:r>
         <w:t xml:space="preserve">Gambar 3. </w:t>
       </w:r>
@@ -21056,9 +21139,9 @@
       <w:r>
         <w:t>judul proyek pada halaman utama</w:t>
       </w:r>
-      <w:bookmarkEnd w:id="149"/>
-      <w:bookmarkEnd w:id="150"/>
-      <w:bookmarkEnd w:id="151"/>
+      <w:bookmarkEnd w:id="110"/>
+      <w:bookmarkEnd w:id="111"/>
+      <w:bookmarkEnd w:id="112"/>
     </w:p>
     <w:p>
       <w:pPr>
@@ -21177,9 +21260,9 @@
           <w:rFonts w:ascii="Times New Roman" w:hAnsi="Times New Roman" w:cs="Times New Roman"/>
         </w:rPr>
       </w:pPr>
-      <w:bookmarkStart w:id="152" w:name="_Toc200446337"/>
-      <w:bookmarkStart w:id="153" w:name="_Toc200618699"/>
-      <w:bookmarkStart w:id="154" w:name="_Toc200619059"/>
+      <w:bookmarkStart w:id="113" w:name="_Toc200446337"/>
+      <w:bookmarkStart w:id="114" w:name="_Toc200618699"/>
+      <w:bookmarkStart w:id="115" w:name="_Toc200619059"/>
       <w:r>
         <w:t xml:space="preserve">Gambar 3. </w:t>
       </w:r>
@@ -21210,9 +21293,9 @@
       <w:r>
         <w:t>permasalahan, tujuan, dan manfaat pada halaman utama</w:t>
       </w:r>
-      <w:bookmarkEnd w:id="152"/>
-      <w:bookmarkEnd w:id="153"/>
-      <w:bookmarkEnd w:id="154"/>
+      <w:bookmarkEnd w:id="113"/>
+      <w:bookmarkEnd w:id="114"/>
+      <w:bookmarkEnd w:id="115"/>
     </w:p>
     <w:p>
       <w:pPr>
@@ -21356,9 +21439,9 @@
           <w:rFonts w:ascii="Times New Roman" w:hAnsi="Times New Roman" w:cs="Times New Roman"/>
         </w:rPr>
       </w:pPr>
-      <w:bookmarkStart w:id="155" w:name="_Toc200446338"/>
-      <w:bookmarkStart w:id="156" w:name="_Toc200618700"/>
-      <w:bookmarkStart w:id="157" w:name="_Toc200619060"/>
+      <w:bookmarkStart w:id="116" w:name="_Toc200446338"/>
+      <w:bookmarkStart w:id="117" w:name="_Toc200618700"/>
+      <w:bookmarkStart w:id="118" w:name="_Toc200619060"/>
       <w:r>
         <w:t xml:space="preserve">Gambar 3. </w:t>
       </w:r>
@@ -21389,9 +21472,9 @@
       <w:r>
         <w:t>data pipeline pada halaman utama</w:t>
       </w:r>
-      <w:bookmarkEnd w:id="155"/>
-      <w:bookmarkEnd w:id="156"/>
-      <w:bookmarkEnd w:id="157"/>
+      <w:bookmarkEnd w:id="116"/>
+      <w:bookmarkEnd w:id="117"/>
+      <w:bookmarkEnd w:id="118"/>
     </w:p>
     <w:p>
       <w:pPr>
@@ -21534,9 +21617,9 @@
           <w:rFonts w:ascii="Times New Roman" w:hAnsi="Times New Roman" w:cs="Times New Roman"/>
         </w:rPr>
       </w:pPr>
-      <w:bookmarkStart w:id="158" w:name="_Toc200446339"/>
-      <w:bookmarkStart w:id="159" w:name="_Toc200618701"/>
-      <w:bookmarkStart w:id="160" w:name="_Toc200619061"/>
+      <w:bookmarkStart w:id="119" w:name="_Toc200446339"/>
+      <w:bookmarkStart w:id="120" w:name="_Toc200618701"/>
+      <w:bookmarkStart w:id="121" w:name="_Toc200619061"/>
       <w:r>
         <w:t xml:space="preserve">Gambar 3. </w:t>
       </w:r>
@@ -21567,9 +21650,9 @@
       <w:r>
         <w:t>funfact pada halaman utama</w:t>
       </w:r>
-      <w:bookmarkEnd w:id="158"/>
-      <w:bookmarkEnd w:id="159"/>
-      <w:bookmarkEnd w:id="160"/>
+      <w:bookmarkEnd w:id="119"/>
+      <w:bookmarkEnd w:id="120"/>
+      <w:bookmarkEnd w:id="121"/>
     </w:p>
     <w:p>
       <w:pPr>
@@ -21695,9 +21778,9 @@
           <w:rFonts w:ascii="Times New Roman" w:hAnsi="Times New Roman" w:cs="Times New Roman"/>
         </w:rPr>
       </w:pPr>
-      <w:bookmarkStart w:id="161" w:name="_Toc200446340"/>
-      <w:bookmarkStart w:id="162" w:name="_Toc200618702"/>
-      <w:bookmarkStart w:id="163" w:name="_Toc200619062"/>
+      <w:bookmarkStart w:id="122" w:name="_Toc200446340"/>
+      <w:bookmarkStart w:id="123" w:name="_Toc200618702"/>
+      <w:bookmarkStart w:id="124" w:name="_Toc200619062"/>
       <w:r>
         <w:t xml:space="preserve">Gambar 3. </w:t>
       </w:r>
@@ -21728,9 +21811,9 @@
       <w:r>
         <w:t>brainstorming dashboard pada halaman utama</w:t>
       </w:r>
-      <w:bookmarkEnd w:id="161"/>
-      <w:bookmarkEnd w:id="162"/>
-      <w:bookmarkEnd w:id="163"/>
+      <w:bookmarkEnd w:id="122"/>
+      <w:bookmarkEnd w:id="123"/>
+      <w:bookmarkEnd w:id="124"/>
     </w:p>
     <w:p>
       <w:pPr>
@@ -21843,9 +21926,9 @@
           <w:rFonts w:ascii="Times New Roman" w:hAnsi="Times New Roman" w:cs="Times New Roman"/>
         </w:rPr>
       </w:pPr>
-      <w:bookmarkStart w:id="164" w:name="_Toc200446341"/>
-      <w:bookmarkStart w:id="165" w:name="_Toc200618703"/>
-      <w:bookmarkStart w:id="166" w:name="_Toc200619063"/>
+      <w:bookmarkStart w:id="125" w:name="_Toc200446341"/>
+      <w:bookmarkStart w:id="126" w:name="_Toc200618703"/>
+      <w:bookmarkStart w:id="127" w:name="_Toc200619063"/>
       <w:r>
         <w:t xml:space="preserve">Gambar 3. </w:t>
       </w:r>
@@ -21876,9 +21959,9 @@
       <w:r>
         <w:t>ucapan terimakasih pada halaman utama</w:t>
       </w:r>
-      <w:bookmarkEnd w:id="164"/>
-      <w:bookmarkEnd w:id="165"/>
-      <w:bookmarkEnd w:id="166"/>
+      <w:bookmarkEnd w:id="125"/>
+      <w:bookmarkEnd w:id="126"/>
+      <w:bookmarkEnd w:id="127"/>
     </w:p>
     <w:p>
       <w:pPr>
@@ -22016,9 +22099,9 @@
           <w:rFonts w:ascii="Times New Roman" w:hAnsi="Times New Roman" w:cs="Times New Roman"/>
         </w:rPr>
       </w:pPr>
-      <w:bookmarkStart w:id="167" w:name="_Toc200446342"/>
-      <w:bookmarkStart w:id="168" w:name="_Toc200618704"/>
-      <w:bookmarkStart w:id="169" w:name="_Toc200619064"/>
+      <w:bookmarkStart w:id="128" w:name="_Toc200446342"/>
+      <w:bookmarkStart w:id="129" w:name="_Toc200618704"/>
+      <w:bookmarkStart w:id="130" w:name="_Toc200619064"/>
       <w:r>
         <w:t xml:space="preserve">Gambar 3. </w:t>
       </w:r>
@@ -22049,9 +22132,9 @@
       <w:r>
         <w:t>watermark pada halaman utama</w:t>
       </w:r>
-      <w:bookmarkEnd w:id="167"/>
-      <w:bookmarkEnd w:id="168"/>
-      <w:bookmarkEnd w:id="169"/>
+      <w:bookmarkEnd w:id="128"/>
+      <w:bookmarkEnd w:id="129"/>
+      <w:bookmarkEnd w:id="130"/>
     </w:p>
     <w:p>
       <w:pPr>
@@ -22178,9 +22261,9 @@
           <w:rFonts w:ascii="Times New Roman" w:hAnsi="Times New Roman" w:cs="Times New Roman"/>
         </w:rPr>
       </w:pPr>
-      <w:bookmarkStart w:id="170" w:name="_Toc200446343"/>
-      <w:bookmarkStart w:id="171" w:name="_Toc200618705"/>
-      <w:bookmarkStart w:id="172" w:name="_Toc200619065"/>
+      <w:bookmarkStart w:id="131" w:name="_Toc200446343"/>
+      <w:bookmarkStart w:id="132" w:name="_Toc200618705"/>
+      <w:bookmarkStart w:id="133" w:name="_Toc200619065"/>
       <w:r>
         <w:t xml:space="preserve">Gambar 3. </w:t>
       </w:r>
@@ -22211,9 +22294,9 @@
       <w:r>
         <w:t>bar navigasi halaman cara membaca</w:t>
       </w:r>
-      <w:bookmarkEnd w:id="170"/>
-      <w:bookmarkEnd w:id="171"/>
-      <w:bookmarkEnd w:id="172"/>
+      <w:bookmarkEnd w:id="131"/>
+      <w:bookmarkEnd w:id="132"/>
+      <w:bookmarkEnd w:id="133"/>
     </w:p>
     <w:p>
       <w:pPr>
@@ -22331,9 +22414,9 @@
           <w:rFonts w:ascii="Times New Roman" w:hAnsi="Times New Roman" w:cs="Times New Roman"/>
         </w:rPr>
       </w:pPr>
-      <w:bookmarkStart w:id="173" w:name="_Toc200446344"/>
-      <w:bookmarkStart w:id="174" w:name="_Toc200618706"/>
-      <w:bookmarkStart w:id="175" w:name="_Toc200619066"/>
+      <w:bookmarkStart w:id="134" w:name="_Toc200446344"/>
+      <w:bookmarkStart w:id="135" w:name="_Toc200618706"/>
+      <w:bookmarkStart w:id="136" w:name="_Toc200619066"/>
       <w:r>
         <w:t xml:space="preserve">Gambar 3. </w:t>
       </w:r>
@@ -22364,9 +22447,9 @@
       <w:r>
         <w:t>cara membaca pada halaman cara membaca dashboard</w:t>
       </w:r>
-      <w:bookmarkEnd w:id="173"/>
-      <w:bookmarkEnd w:id="174"/>
-      <w:bookmarkEnd w:id="175"/>
+      <w:bookmarkEnd w:id="134"/>
+      <w:bookmarkEnd w:id="135"/>
+      <w:bookmarkEnd w:id="136"/>
     </w:p>
     <w:p>
       <w:pPr>
@@ -22487,9 +22570,9 @@
           <w:rFonts w:ascii="Times New Roman" w:hAnsi="Times New Roman" w:cs="Times New Roman"/>
         </w:rPr>
       </w:pPr>
-      <w:bookmarkStart w:id="176" w:name="_Toc200446345"/>
-      <w:bookmarkStart w:id="177" w:name="_Toc200618707"/>
-      <w:bookmarkStart w:id="178" w:name="_Toc200619067"/>
+      <w:bookmarkStart w:id="137" w:name="_Toc200446345"/>
+      <w:bookmarkStart w:id="138" w:name="_Toc200618707"/>
+      <w:bookmarkStart w:id="139" w:name="_Toc200619067"/>
       <w:r>
         <w:t xml:space="preserve">Gambar 3. </w:t>
       </w:r>
@@ -22520,22 +22603,22 @@
       <w:r>
         <w:t>watermark pada halaman cara membaca</w:t>
       </w:r>
-      <w:bookmarkEnd w:id="176"/>
-      <w:bookmarkEnd w:id="177"/>
-      <w:bookmarkEnd w:id="178"/>
+      <w:bookmarkEnd w:id="137"/>
+      <w:bookmarkEnd w:id="138"/>
+      <w:bookmarkEnd w:id="139"/>
     </w:p>
     <w:p>
       <w:pPr>
         <w:pStyle w:val="Heading3"/>
       </w:pPr>
-      <w:bookmarkStart w:id="179" w:name="_Toc200619295"/>
+      <w:bookmarkStart w:id="140" w:name="_Toc200619295"/>
       <w:r>
         <w:t>B.</w:t>
       </w:r>
       <w:r>
         <w:t xml:space="preserve"> Kendala Pelaksanaan</w:t>
       </w:r>
-      <w:bookmarkEnd w:id="179"/>
+      <w:bookmarkEnd w:id="140"/>
     </w:p>
     <w:p>
       <w:pPr>
@@ -22976,7 +23059,7 @@
       <w:pPr>
         <w:pStyle w:val="Heading2"/>
       </w:pPr>
-      <w:bookmarkStart w:id="180" w:name="_Toc200619296"/>
+      <w:bookmarkStart w:id="141" w:name="_Toc200619296"/>
       <w:r>
         <w:lastRenderedPageBreak/>
         <w:t>BAB IV</w:t>
@@ -22985,20 +23068,20 @@
         <w:br/>
         <w:t>PENUTUP</w:t>
       </w:r>
-      <w:bookmarkEnd w:id="180"/>
+      <w:bookmarkEnd w:id="141"/>
     </w:p>
     <w:p>
       <w:pPr>
         <w:pStyle w:val="Heading3"/>
       </w:pPr>
-      <w:bookmarkStart w:id="181" w:name="_Toc200619297"/>
+      <w:bookmarkStart w:id="142" w:name="_Toc200619297"/>
       <w:r>
         <w:t xml:space="preserve">A. </w:t>
       </w:r>
       <w:r>
         <w:t>Kesimpulan</w:t>
       </w:r>
-      <w:bookmarkEnd w:id="181"/>
+      <w:bookmarkEnd w:id="142"/>
     </w:p>
     <w:p>
       <w:pPr>
@@ -23114,14 +23197,14 @@
       <w:pPr>
         <w:pStyle w:val="Heading3"/>
       </w:pPr>
-      <w:bookmarkStart w:id="182" w:name="_Toc200619298"/>
+      <w:bookmarkStart w:id="143" w:name="_Toc200619298"/>
       <w:r>
         <w:t xml:space="preserve">B. </w:t>
       </w:r>
       <w:r>
         <w:t>Saran</w:t>
       </w:r>
-      <w:bookmarkEnd w:id="182"/>
+      <w:bookmarkEnd w:id="143"/>
     </w:p>
     <w:p>
       <w:pPr>
@@ -23187,12 +23270,12 @@
       <w:pPr>
         <w:pStyle w:val="Heading2"/>
       </w:pPr>
-      <w:bookmarkStart w:id="183" w:name="_Toc200619299"/>
+      <w:bookmarkStart w:id="144" w:name="_Toc200619299"/>
       <w:r>
         <w:lastRenderedPageBreak/>
         <w:t>DAFTAR PUSTAKA</w:t>
       </w:r>
-      <w:bookmarkEnd w:id="183"/>
+      <w:bookmarkEnd w:id="144"/>
     </w:p>
     <w:sdt>
       <w:sdtPr>
@@ -25515,7 +25598,7 @@
   <w:abstractNum w:abstractNumId="15" w15:restartNumberingAfterBreak="0">
     <w:nsid w:val="35715EFD"/>
     <w:multiLevelType w:val="hybridMultilevel"/>
-    <w:tmpl w:val="A5E4AB5A"/>
+    <w:tmpl w:val="95BAA8E8"/>
     <w:lvl w:ilvl="0" w:tplc="04090017">
       <w:start w:val="1"/>
       <w:numFmt w:val="lowerLetter"/>
@@ -26426,6 +26509,292 @@
     </w:lvl>
   </w:abstractNum>
   <w:abstractNum w:abstractNumId="24" w15:restartNumberingAfterBreak="0">
+    <w:nsid w:val="643B6605"/>
+    <w:multiLevelType w:val="hybridMultilevel"/>
+    <w:tmpl w:val="70CCAEF4"/>
+    <w:lvl w:ilvl="0" w:tplc="5F9E8A20">
+      <w:start w:val="1"/>
+      <w:numFmt w:val="lowerLetter"/>
+      <w:pStyle w:val="Heading8"/>
+      <w:lvlText w:val="%1)"/>
+      <w:lvlJc w:val="left"/>
+      <w:pPr>
+        <w:ind w:left="2160" w:hanging="360"/>
+      </w:pPr>
+    </w:lvl>
+    <w:lvl w:ilvl="1" w:tplc="04090019" w:tentative="1">
+      <w:start w:val="1"/>
+      <w:numFmt w:val="lowerLetter"/>
+      <w:lvlText w:val="%2."/>
+      <w:lvlJc w:val="left"/>
+      <w:pPr>
+        <w:ind w:left="2880" w:hanging="360"/>
+      </w:pPr>
+    </w:lvl>
+    <w:lvl w:ilvl="2" w:tplc="0409001B" w:tentative="1">
+      <w:start w:val="1"/>
+      <w:numFmt w:val="lowerRoman"/>
+      <w:lvlText w:val="%3."/>
+      <w:lvlJc w:val="right"/>
+      <w:pPr>
+        <w:ind w:left="3600" w:hanging="180"/>
+      </w:pPr>
+    </w:lvl>
+    <w:lvl w:ilvl="3" w:tplc="0409000F" w:tentative="1">
+      <w:start w:val="1"/>
+      <w:numFmt w:val="decimal"/>
+      <w:lvlText w:val="%4."/>
+      <w:lvlJc w:val="left"/>
+      <w:pPr>
+        <w:ind w:left="4320" w:hanging="360"/>
+      </w:pPr>
+    </w:lvl>
+    <w:lvl w:ilvl="4" w:tplc="04090019" w:tentative="1">
+      <w:start w:val="1"/>
+      <w:numFmt w:val="lowerLetter"/>
+      <w:lvlText w:val="%5."/>
+      <w:lvlJc w:val="left"/>
+      <w:pPr>
+        <w:ind w:left="5040" w:hanging="360"/>
+      </w:pPr>
+    </w:lvl>
+    <w:lvl w:ilvl="5" w:tplc="0409001B" w:tentative="1">
+      <w:start w:val="1"/>
+      <w:numFmt w:val="lowerRoman"/>
+      <w:lvlText w:val="%6."/>
+      <w:lvlJc w:val="right"/>
+      <w:pPr>
+        <w:ind w:left="5760" w:hanging="180"/>
+      </w:pPr>
+    </w:lvl>
+    <w:lvl w:ilvl="6" w:tplc="0409000F" w:tentative="1">
+      <w:start w:val="1"/>
+      <w:numFmt w:val="decimal"/>
+      <w:lvlText w:val="%7."/>
+      <w:lvlJc w:val="left"/>
+      <w:pPr>
+        <w:ind w:left="6480" w:hanging="360"/>
+      </w:pPr>
+    </w:lvl>
+    <w:lvl w:ilvl="7" w:tplc="04090019" w:tentative="1">
+      <w:start w:val="1"/>
+      <w:numFmt w:val="lowerLetter"/>
+      <w:lvlText w:val="%8."/>
+      <w:lvlJc w:val="left"/>
+      <w:pPr>
+        <w:ind w:left="7200" w:hanging="360"/>
+      </w:pPr>
+    </w:lvl>
+    <w:lvl w:ilvl="8" w:tplc="0409001B" w:tentative="1">
+      <w:start w:val="1"/>
+      <w:numFmt w:val="lowerRoman"/>
+      <w:lvlText w:val="%9."/>
+      <w:lvlJc w:val="right"/>
+      <w:pPr>
+        <w:ind w:left="7920" w:hanging="180"/>
+      </w:pPr>
+    </w:lvl>
+  </w:abstractNum>
+  <w:abstractNum w:abstractNumId="25" w15:restartNumberingAfterBreak="0">
+    <w:nsid w:val="6475344C"/>
+    <w:multiLevelType w:val="hybridMultilevel"/>
+    <w:tmpl w:val="083EA28E"/>
+    <w:lvl w:ilvl="0" w:tplc="04090017">
+      <w:start w:val="1"/>
+      <w:numFmt w:val="lowerLetter"/>
+      <w:lvlText w:val="%1)"/>
+      <w:lvlJc w:val="left"/>
+      <w:pPr>
+        <w:ind w:left="720" w:hanging="360"/>
+      </w:pPr>
+    </w:lvl>
+    <w:lvl w:ilvl="1" w:tplc="04090019" w:tentative="1">
+      <w:start w:val="1"/>
+      <w:numFmt w:val="lowerLetter"/>
+      <w:lvlText w:val="%2."/>
+      <w:lvlJc w:val="left"/>
+      <w:pPr>
+        <w:ind w:left="1440" w:hanging="360"/>
+      </w:pPr>
+    </w:lvl>
+    <w:lvl w:ilvl="2" w:tplc="0409001B" w:tentative="1">
+      <w:start w:val="1"/>
+      <w:numFmt w:val="lowerRoman"/>
+      <w:lvlText w:val="%3."/>
+      <w:lvlJc w:val="right"/>
+      <w:pPr>
+        <w:ind w:left="2160" w:hanging="180"/>
+      </w:pPr>
+    </w:lvl>
+    <w:lvl w:ilvl="3" w:tplc="0409000F" w:tentative="1">
+      <w:start w:val="1"/>
+      <w:numFmt w:val="decimal"/>
+      <w:lvlText w:val="%4."/>
+      <w:lvlJc w:val="left"/>
+      <w:pPr>
+        <w:ind w:left="2880" w:hanging="360"/>
+      </w:pPr>
+    </w:lvl>
+    <w:lvl w:ilvl="4" w:tplc="04090019" w:tentative="1">
+      <w:start w:val="1"/>
+      <w:numFmt w:val="lowerLetter"/>
+      <w:lvlText w:val="%5."/>
+      <w:lvlJc w:val="left"/>
+      <w:pPr>
+        <w:ind w:left="3600" w:hanging="360"/>
+      </w:pPr>
+    </w:lvl>
+    <w:lvl w:ilvl="5" w:tplc="0409001B" w:tentative="1">
+      <w:start w:val="1"/>
+      <w:numFmt w:val="lowerRoman"/>
+      <w:lvlText w:val="%6."/>
+      <w:lvlJc w:val="right"/>
+      <w:pPr>
+        <w:ind w:left="4320" w:hanging="180"/>
+      </w:pPr>
+    </w:lvl>
+    <w:lvl w:ilvl="6" w:tplc="0409000F" w:tentative="1">
+      <w:start w:val="1"/>
+      <w:numFmt w:val="decimal"/>
+      <w:lvlText w:val="%7."/>
+      <w:lvlJc w:val="left"/>
+      <w:pPr>
+        <w:ind w:left="5040" w:hanging="360"/>
+      </w:pPr>
+    </w:lvl>
+    <w:lvl w:ilvl="7" w:tplc="04090019" w:tentative="1">
+      <w:start w:val="1"/>
+      <w:numFmt w:val="lowerLetter"/>
+      <w:lvlText w:val="%8."/>
+      <w:lvlJc w:val="left"/>
+      <w:pPr>
+        <w:ind w:left="5760" w:hanging="360"/>
+      </w:pPr>
+    </w:lvl>
+    <w:lvl w:ilvl="8" w:tplc="0409001B" w:tentative="1">
+      <w:start w:val="1"/>
+      <w:numFmt w:val="lowerRoman"/>
+      <w:lvlText w:val="%9."/>
+      <w:lvlJc w:val="right"/>
+      <w:pPr>
+        <w:ind w:left="6480" w:hanging="180"/>
+      </w:pPr>
+    </w:lvl>
+  </w:abstractNum>
+  <w:abstractNum w:abstractNumId="26" w15:restartNumberingAfterBreak="0">
+    <w:nsid w:val="6B1A06B3"/>
+    <w:multiLevelType w:val="hybridMultilevel"/>
+    <w:tmpl w:val="95BAA8E8"/>
+    <w:lvl w:ilvl="0" w:tplc="FFFFFFFF">
+      <w:start w:val="1"/>
+      <w:numFmt w:val="lowerLetter"/>
+      <w:lvlText w:val="%1)"/>
+      <w:lvlJc w:val="left"/>
+      <w:pPr>
+        <w:ind w:left="2160" w:hanging="360"/>
+      </w:pPr>
+      <w:rPr>
+        <w:rFonts w:hint="default"/>
+      </w:rPr>
+    </w:lvl>
+    <w:lvl w:ilvl="1" w:tplc="FFFFFFFF" w:tentative="1">
+      <w:start w:val="1"/>
+      <w:numFmt w:val="bullet"/>
+      <w:lvlText w:val="o"/>
+      <w:lvlJc w:val="left"/>
+      <w:pPr>
+        <w:ind w:left="2880" w:hanging="360"/>
+      </w:pPr>
+      <w:rPr>
+        <w:rFonts w:ascii="Courier New" w:hAnsi="Courier New" w:cs="Courier New" w:hint="default"/>
+      </w:rPr>
+    </w:lvl>
+    <w:lvl w:ilvl="2" w:tplc="FFFFFFFF" w:tentative="1">
+      <w:start w:val="1"/>
+      <w:numFmt w:val="bullet"/>
+      <w:lvlText w:val=""/>
+      <w:lvlJc w:val="left"/>
+      <w:pPr>
+        <w:ind w:left="3600" w:hanging="360"/>
+      </w:pPr>
+      <w:rPr>
+        <w:rFonts w:ascii="Wingdings" w:hAnsi="Wingdings" w:hint="default"/>
+      </w:rPr>
+    </w:lvl>
+    <w:lvl w:ilvl="3" w:tplc="FFFFFFFF" w:tentative="1">
+      <w:start w:val="1"/>
+      <w:numFmt w:val="bullet"/>
+      <w:lvlText w:val=""/>
+      <w:lvlJc w:val="left"/>
+      <w:pPr>
+        <w:ind w:left="4320" w:hanging="360"/>
+      </w:pPr>
+      <w:rPr>
+        <w:rFonts w:ascii="Symbol" w:hAnsi="Symbol" w:hint="default"/>
+      </w:rPr>
+    </w:lvl>
+    <w:lvl w:ilvl="4" w:tplc="FFFFFFFF" w:tentative="1">
+      <w:start w:val="1"/>
+      <w:numFmt w:val="bullet"/>
+      <w:lvlText w:val="o"/>
+      <w:lvlJc w:val="left"/>
+      <w:pPr>
+        <w:ind w:left="5040" w:hanging="360"/>
+      </w:pPr>
+      <w:rPr>
+        <w:rFonts w:ascii="Courier New" w:hAnsi="Courier New" w:cs="Courier New" w:hint="default"/>
+      </w:rPr>
+    </w:lvl>
+    <w:lvl w:ilvl="5" w:tplc="FFFFFFFF" w:tentative="1">
+      <w:start w:val="1"/>
+      <w:numFmt w:val="bullet"/>
+      <w:lvlText w:val=""/>
+      <w:lvlJc w:val="left"/>
+      <w:pPr>
+        <w:ind w:left="5760" w:hanging="360"/>
+      </w:pPr>
+      <w:rPr>
+        <w:rFonts w:ascii="Wingdings" w:hAnsi="Wingdings" w:hint="default"/>
+      </w:rPr>
+    </w:lvl>
+    <w:lvl w:ilvl="6" w:tplc="FFFFFFFF" w:tentative="1">
+      <w:start w:val="1"/>
+      <w:numFmt w:val="bullet"/>
+      <w:lvlText w:val=""/>
+      <w:lvlJc w:val="left"/>
+      <w:pPr>
+        <w:ind w:left="6480" w:hanging="360"/>
+      </w:pPr>
+      <w:rPr>
+        <w:rFonts w:ascii="Symbol" w:hAnsi="Symbol" w:hint="default"/>
+      </w:rPr>
+    </w:lvl>
+    <w:lvl w:ilvl="7" w:tplc="FFFFFFFF" w:tentative="1">
+      <w:start w:val="1"/>
+      <w:numFmt w:val="bullet"/>
+      <w:lvlText w:val="o"/>
+      <w:lvlJc w:val="left"/>
+      <w:pPr>
+        <w:ind w:left="7200" w:hanging="360"/>
+      </w:pPr>
+      <w:rPr>
+        <w:rFonts w:ascii="Courier New" w:hAnsi="Courier New" w:cs="Courier New" w:hint="default"/>
+      </w:rPr>
+    </w:lvl>
+    <w:lvl w:ilvl="8" w:tplc="FFFFFFFF" w:tentative="1">
+      <w:start w:val="1"/>
+      <w:numFmt w:val="bullet"/>
+      <w:lvlText w:val=""/>
+      <w:lvlJc w:val="left"/>
+      <w:pPr>
+        <w:ind w:left="7920" w:hanging="360"/>
+      </w:pPr>
+      <w:rPr>
+        <w:rFonts w:ascii="Wingdings" w:hAnsi="Wingdings" w:hint="default"/>
+      </w:rPr>
+    </w:lvl>
+  </w:abstractNum>
+  <w:abstractNum w:abstractNumId="27" w15:restartNumberingAfterBreak="0">
     <w:nsid w:val="6E3F320D"/>
     <w:multiLevelType w:val="hybridMultilevel"/>
     <w:tmpl w:val="C68A37A4"/>
@@ -26538,7 +26907,7 @@
       </w:rPr>
     </w:lvl>
   </w:abstractNum>
-  <w:abstractNum w:abstractNumId="25" w15:restartNumberingAfterBreak="0">
+  <w:abstractNum w:abstractNumId="28" w15:restartNumberingAfterBreak="0">
     <w:nsid w:val="6F821489"/>
     <w:multiLevelType w:val="hybridMultilevel"/>
     <w:tmpl w:val="0746499E"/>
@@ -26624,7 +26993,7 @@
       </w:pPr>
     </w:lvl>
   </w:abstractNum>
-  <w:abstractNum w:abstractNumId="26" w15:restartNumberingAfterBreak="0">
+  <w:abstractNum w:abstractNumId="29" w15:restartNumberingAfterBreak="0">
     <w:nsid w:val="74484407"/>
     <w:multiLevelType w:val="hybridMultilevel"/>
     <w:tmpl w:val="1A7C4FE4"/>
@@ -26710,7 +27079,7 @@
       </w:pPr>
     </w:lvl>
   </w:abstractNum>
-  <w:abstractNum w:abstractNumId="27" w15:restartNumberingAfterBreak="0">
+  <w:abstractNum w:abstractNumId="30" w15:restartNumberingAfterBreak="0">
     <w:nsid w:val="75AD4CC8"/>
     <w:multiLevelType w:val="hybridMultilevel"/>
     <w:tmpl w:val="0E3A2EEA"/>
@@ -26823,7 +27192,7 @@
       </w:rPr>
     </w:lvl>
   </w:abstractNum>
-  <w:abstractNum w:abstractNumId="28" w15:restartNumberingAfterBreak="0">
+  <w:abstractNum w:abstractNumId="31" w15:restartNumberingAfterBreak="0">
     <w:nsid w:val="7998064F"/>
     <w:multiLevelType w:val="hybridMultilevel"/>
     <w:tmpl w:val="70F29310"/>
@@ -26946,7 +27315,7 @@
     <w:abstractNumId w:val="12"/>
   </w:num>
   <w:num w:numId="4" w16cid:durableId="126434000">
-    <w:abstractNumId w:val="27"/>
+    <w:abstractNumId w:val="30"/>
   </w:num>
   <w:num w:numId="5" w16cid:durableId="88235218">
     <w:abstractNumId w:val="6"/>
@@ -26979,13 +27348,13 @@
     </w:lvlOverride>
   </w:num>
   <w:num w:numId="14" w16cid:durableId="653677883">
-    <w:abstractNumId w:val="25"/>
+    <w:abstractNumId w:val="28"/>
   </w:num>
   <w:num w:numId="15" w16cid:durableId="1593008556">
     <w:abstractNumId w:val="21"/>
   </w:num>
   <w:num w:numId="16" w16cid:durableId="1969361129">
-    <w:abstractNumId w:val="28"/>
+    <w:abstractNumId w:val="31"/>
   </w:num>
   <w:num w:numId="17" w16cid:durableId="287854270">
     <w:abstractNumId w:val="7"/>
@@ -27039,7 +27408,7 @@
     </w:lvlOverride>
   </w:num>
   <w:num w:numId="26" w16cid:durableId="1077551942">
-    <w:abstractNumId w:val="24"/>
+    <w:abstractNumId w:val="27"/>
   </w:num>
   <w:num w:numId="27" w16cid:durableId="840898556">
     <w:abstractNumId w:val="22"/>
@@ -27069,7 +27438,7 @@
     </w:lvlOverride>
   </w:num>
   <w:num w:numId="33" w16cid:durableId="1861236935">
-    <w:abstractNumId w:val="26"/>
+    <w:abstractNumId w:val="29"/>
   </w:num>
   <w:num w:numId="34" w16cid:durableId="254555984">
     <w:abstractNumId w:val="10"/>
@@ -27094,6 +27463,15 @@
   </w:num>
   <w:num w:numId="41" w16cid:durableId="1137141616">
     <w:abstractNumId w:val="2"/>
+  </w:num>
+  <w:num w:numId="42" w16cid:durableId="22630837">
+    <w:abstractNumId w:val="24"/>
+  </w:num>
+  <w:num w:numId="43" w16cid:durableId="866715383">
+    <w:abstractNumId w:val="25"/>
+  </w:num>
+  <w:num w:numId="44" w16cid:durableId="935483795">
+    <w:abstractNumId w:val="26"/>
   </w:num>
 </w:numbering>
 </file>
@@ -27657,25 +28035,23 @@
   </w:style>
   <w:style w:type="paragraph" w:styleId="Heading8">
     <w:name w:val="heading 8"/>
-    <w:basedOn w:val="Normal"/>
+    <w:basedOn w:val="ListParagraph"/>
     <w:next w:val="Normal"/>
     <w:link w:val="Heading8Char"/>
     <w:uiPriority w:val="9"/>
-    <w:semiHidden/>
     <w:unhideWhenUsed/>
     <w:qFormat/>
-    <w:rsid w:val="00023480"/>
+    <w:rsid w:val="00D03B03"/>
     <w:pPr>
-      <w:keepNext/>
-      <w:keepLines/>
-      <w:spacing w:after="0"/>
+      <w:numPr>
+        <w:numId w:val="42"/>
+      </w:numPr>
+      <w:spacing w:line="480" w:lineRule="auto"/>
+      <w:jc w:val="both"/>
       <w:outlineLvl w:val="7"/>
     </w:pPr>
     <w:rPr>
-      <w:rFonts w:eastAsiaTheme="majorEastAsia" w:cstheme="majorBidi"/>
-      <w:i/>
-      <w:iCs/>
-      <w:color w:val="272727" w:themeColor="text1" w:themeTint="D8"/>
+      <w:rFonts w:ascii="Times New Roman" w:hAnsi="Times New Roman" w:cs="Times New Roman"/>
     </w:rPr>
   </w:style>
   <w:style w:type="paragraph" w:styleId="Heading9">
@@ -27816,13 +28192,9 @@
     <w:basedOn w:val="DefaultParagraphFont"/>
     <w:link w:val="Heading8"/>
     <w:uiPriority w:val="9"/>
-    <w:semiHidden/>
-    <w:rsid w:val="00023480"/>
+    <w:rsid w:val="00D03B03"/>
     <w:rPr>
-      <w:rFonts w:eastAsiaTheme="majorEastAsia" w:cstheme="majorBidi"/>
-      <w:i/>
-      <w:iCs/>
-      <w:color w:val="272727" w:themeColor="text1" w:themeTint="D8"/>
+      <w:rFonts w:ascii="Times New Roman" w:hAnsi="Times New Roman" w:cs="Times New Roman"/>
     </w:rPr>
   </w:style>
   <w:style w:type="character" w:customStyle="1" w:styleId="Heading9Char">
@@ -28380,6 +28752,7 @@
   </w:compat>
   <w:rsids>
     <w:rsidRoot w:val="00966163"/>
+    <w:rsid w:val="000450FD"/>
     <w:rsid w:val="001D4EF9"/>
     <w:rsid w:val="00206D59"/>
     <w:rsid w:val="0029117C"/>
@@ -28387,6 +28760,7 @@
     <w:rsid w:val="005A7160"/>
     <w:rsid w:val="006E1BAB"/>
     <w:rsid w:val="00763159"/>
+    <w:rsid w:val="0081424B"/>
     <w:rsid w:val="00966163"/>
     <w:rsid w:val="00AB1197"/>
     <w:rsid w:val="00BB0A64"/>

</xml_diff>

<commit_message>
abis revisi poin 16, 17. next revisi poin 18
</commit_message>
<xml_diff>
--- a/non-website/Laporan Akhir KP/2203040182 - Dhika Ramadhan Saputra - Laporan KP - Revisi 1.docx
+++ b/non-website/Laporan Akhir KP/2203040182 - Dhika Ramadhan Saputra - Laporan KP - Revisi 1.docx
@@ -8813,14 +8813,27 @@
       <w:r>
         <w:t xml:space="preserve">Gambar 1. </w:t>
       </w:r>
-      <w:fldSimple w:instr=" SEQ Gambar_1. \* ARABIC ">
-        <w:r>
-          <w:rPr>
-            <w:noProof/>
-          </w:rPr>
-          <w:t>1</w:t>
-        </w:r>
-      </w:fldSimple>
+      <w:r>
+        <w:fldChar w:fldCharType="begin"/>
+      </w:r>
+      <w:r>
+        <w:instrText xml:space="preserve"> SEQ Gambar_1. \* ARABIC </w:instrText>
+      </w:r>
+      <w:r>
+        <w:fldChar w:fldCharType="separate"/>
+      </w:r>
+      <w:r>
+        <w:rPr>
+          <w:noProof/>
+        </w:rPr>
+        <w:t>1</w:t>
+      </w:r>
+      <w:r>
+        <w:rPr>
+          <w:noProof/>
+        </w:rPr>
+        <w:fldChar w:fldCharType="end"/>
+      </w:r>
       <w:r>
         <w:t xml:space="preserve"> tahapan pelaksanaan</w:t>
       </w:r>
@@ -9629,14 +9642,27 @@
         <w:lastRenderedPageBreak/>
         <w:t xml:space="preserve">Tabel 1. </w:t>
       </w:r>
-      <w:fldSimple w:instr=" SEQ Tabel_1. \* ARABIC ">
-        <w:r>
-          <w:rPr>
-            <w:noProof/>
-          </w:rPr>
-          <w:t>1</w:t>
-        </w:r>
-      </w:fldSimple>
+      <w:r>
+        <w:fldChar w:fldCharType="begin"/>
+      </w:r>
+      <w:r>
+        <w:instrText xml:space="preserve"> SEQ Tabel_1. \* ARABIC </w:instrText>
+      </w:r>
+      <w:r>
+        <w:fldChar w:fldCharType="separate"/>
+      </w:r>
+      <w:r>
+        <w:rPr>
+          <w:noProof/>
+        </w:rPr>
+        <w:t>1</w:t>
+      </w:r>
+      <w:r>
+        <w:rPr>
+          <w:noProof/>
+        </w:rPr>
+        <w:fldChar w:fldCharType="end"/>
+      </w:r>
       <w:r>
         <w:t xml:space="preserve"> jadwal pelaksanaan</w:t>
       </w:r>
@@ -11960,14 +11986,27 @@
       <w:r>
         <w:t xml:space="preserve">Gambar 2. </w:t>
       </w:r>
-      <w:fldSimple w:instr=" SEQ Gambar_2. \* ARABIC ">
-        <w:r>
-          <w:rPr>
-            <w:noProof/>
-          </w:rPr>
-          <w:t>1</w:t>
-        </w:r>
-      </w:fldSimple>
+      <w:r>
+        <w:fldChar w:fldCharType="begin"/>
+      </w:r>
+      <w:r>
+        <w:instrText xml:space="preserve"> SEQ Gambar_2. \* ARABIC </w:instrText>
+      </w:r>
+      <w:r>
+        <w:fldChar w:fldCharType="separate"/>
+      </w:r>
+      <w:r>
+        <w:rPr>
+          <w:noProof/>
+        </w:rPr>
+        <w:t>1</w:t>
+      </w:r>
+      <w:r>
+        <w:rPr>
+          <w:noProof/>
+        </w:rPr>
+        <w:fldChar w:fldCharType="end"/>
+      </w:r>
       <w:r>
         <w:t xml:space="preserve"> struktur umum organisasi mitra</w:t>
       </w:r>
@@ -12443,14 +12482,27 @@
       <w:r>
         <w:t xml:space="preserve">Gambar 3. </w:t>
       </w:r>
-      <w:fldSimple w:instr=" SEQ Gambar_3. \* ARABIC ">
-        <w:r>
-          <w:rPr>
-            <w:noProof/>
-          </w:rPr>
-          <w:t>1</w:t>
-        </w:r>
-      </w:fldSimple>
+      <w:r>
+        <w:fldChar w:fldCharType="begin"/>
+      </w:r>
+      <w:r>
+        <w:instrText xml:space="preserve"> SEQ Gambar_3. \* ARABIC </w:instrText>
+      </w:r>
+      <w:r>
+        <w:fldChar w:fldCharType="separate"/>
+      </w:r>
+      <w:r>
+        <w:rPr>
+          <w:noProof/>
+        </w:rPr>
+        <w:t>1</w:t>
+      </w:r>
+      <w:r>
+        <w:rPr>
+          <w:noProof/>
+        </w:rPr>
+        <w:fldChar w:fldCharType="end"/>
+      </w:r>
       <w:r>
         <w:t xml:space="preserve"> dokumentasi penerimaan data via Whatsapp</w:t>
       </w:r>
@@ -12471,7 +12523,7 @@
           <w:noProof/>
         </w:rPr>
         <w:drawing>
-          <wp:inline distT="0" distB="0" distL="0" distR="0" wp14:anchorId="75188C27" wp14:editId="59883EF6">
+          <wp:inline distT="0" distB="0" distL="0" distR="0" wp14:anchorId="75188C27" wp14:editId="00D7D6E7">
             <wp:extent cx="5004000" cy="1844909"/>
             <wp:effectExtent l="19050" t="19050" r="25400" b="22225"/>
             <wp:docPr id="783286403" name="Picture 4"/>
@@ -12537,14 +12589,27 @@
       <w:r>
         <w:t xml:space="preserve">Gambar 3. </w:t>
       </w:r>
-      <w:fldSimple w:instr=" SEQ Gambar_3. \* ARABIC ">
-        <w:r>
-          <w:rPr>
-            <w:noProof/>
-          </w:rPr>
-          <w:t>2</w:t>
-        </w:r>
-      </w:fldSimple>
+      <w:r>
+        <w:fldChar w:fldCharType="begin"/>
+      </w:r>
+      <w:r>
+        <w:instrText xml:space="preserve"> SEQ Gambar_3. \* ARABIC </w:instrText>
+      </w:r>
+      <w:r>
+        <w:fldChar w:fldCharType="separate"/>
+      </w:r>
+      <w:r>
+        <w:rPr>
+          <w:noProof/>
+        </w:rPr>
+        <w:t>2</w:t>
+      </w:r>
+      <w:r>
+        <w:rPr>
+          <w:noProof/>
+        </w:rPr>
+        <w:fldChar w:fldCharType="end"/>
+      </w:r>
       <w:r>
         <w:t xml:space="preserve"> s</w:t>
       </w:r>
@@ -12834,7 +12899,7 @@
           <w:noProof/>
         </w:rPr>
         <w:drawing>
-          <wp:inline distT="0" distB="0" distL="0" distR="0" wp14:anchorId="02EBA956" wp14:editId="6F5CE348">
+          <wp:inline distT="0" distB="0" distL="0" distR="0" wp14:anchorId="02EBA956" wp14:editId="3C32B85F">
             <wp:extent cx="3888000" cy="2160000"/>
             <wp:effectExtent l="19050" t="19050" r="17780" b="12065"/>
             <wp:docPr id="102117401" name="Picture 5"/>
@@ -12899,14 +12964,27 @@
       <w:r>
         <w:t xml:space="preserve">Gambar 3. </w:t>
       </w:r>
-      <w:fldSimple w:instr=" SEQ Gambar_3. \* ARABIC ">
-        <w:r>
-          <w:rPr>
-            <w:noProof/>
-          </w:rPr>
-          <w:t>3</w:t>
-        </w:r>
-      </w:fldSimple>
+      <w:r>
+        <w:fldChar w:fldCharType="begin"/>
+      </w:r>
+      <w:r>
+        <w:instrText xml:space="preserve"> SEQ Gambar_3. \* ARABIC </w:instrText>
+      </w:r>
+      <w:r>
+        <w:fldChar w:fldCharType="separate"/>
+      </w:r>
+      <w:r>
+        <w:rPr>
+          <w:noProof/>
+        </w:rPr>
+        <w:t>3</w:t>
+      </w:r>
+      <w:r>
+        <w:rPr>
+          <w:noProof/>
+        </w:rPr>
+        <w:fldChar w:fldCharType="end"/>
+      </w:r>
       <w:r>
         <w:t xml:space="preserve"> c</w:t>
       </w:r>
@@ -12997,14 +13075,27 @@
       <w:r>
         <w:t xml:space="preserve">Gambar 3. </w:t>
       </w:r>
-      <w:fldSimple w:instr=" SEQ Gambar_3. \* ARABIC ">
-        <w:r>
-          <w:rPr>
-            <w:noProof/>
-          </w:rPr>
-          <w:t>4</w:t>
-        </w:r>
-      </w:fldSimple>
+      <w:r>
+        <w:fldChar w:fldCharType="begin"/>
+      </w:r>
+      <w:r>
+        <w:instrText xml:space="preserve"> SEQ Gambar_3. \* ARABIC </w:instrText>
+      </w:r>
+      <w:r>
+        <w:fldChar w:fldCharType="separate"/>
+      </w:r>
+      <w:r>
+        <w:rPr>
+          <w:noProof/>
+        </w:rPr>
+        <w:t>4</w:t>
+      </w:r>
+      <w:r>
+        <w:rPr>
+          <w:noProof/>
+        </w:rPr>
+        <w:fldChar w:fldCharType="end"/>
+      </w:r>
       <w:r>
         <w:t xml:space="preserve"> b</w:t>
       </w:r>
@@ -13199,14 +13290,27 @@
       <w:r>
         <w:t xml:space="preserve">Gambar 3. </w:t>
       </w:r>
-      <w:fldSimple w:instr=" SEQ Gambar_3. \* ARABIC ">
-        <w:r>
-          <w:rPr>
-            <w:noProof/>
-          </w:rPr>
-          <w:t>5</w:t>
-        </w:r>
-      </w:fldSimple>
+      <w:r>
+        <w:fldChar w:fldCharType="begin"/>
+      </w:r>
+      <w:r>
+        <w:instrText xml:space="preserve"> SEQ Gambar_3. \* ARABIC </w:instrText>
+      </w:r>
+      <w:r>
+        <w:fldChar w:fldCharType="separate"/>
+      </w:r>
+      <w:r>
+        <w:rPr>
+          <w:noProof/>
+        </w:rPr>
+        <w:t>5</w:t>
+      </w:r>
+      <w:r>
+        <w:rPr>
+          <w:noProof/>
+        </w:rPr>
+        <w:fldChar w:fldCharType="end"/>
+      </w:r>
       <w:r>
         <w:t xml:space="preserve"> b</w:t>
       </w:r>
@@ -13297,14 +13401,27 @@
       <w:r>
         <w:t xml:space="preserve">Gambar 3. </w:t>
       </w:r>
-      <w:fldSimple w:instr=" SEQ Gambar_3. \* ARABIC ">
-        <w:r>
-          <w:rPr>
-            <w:noProof/>
-          </w:rPr>
-          <w:t>6</w:t>
-        </w:r>
-      </w:fldSimple>
+      <w:r>
+        <w:fldChar w:fldCharType="begin"/>
+      </w:r>
+      <w:r>
+        <w:instrText xml:space="preserve"> SEQ Gambar_3. \* ARABIC </w:instrText>
+      </w:r>
+      <w:r>
+        <w:fldChar w:fldCharType="separate"/>
+      </w:r>
+      <w:r>
+        <w:rPr>
+          <w:noProof/>
+        </w:rPr>
+        <w:t>6</w:t>
+      </w:r>
+      <w:r>
+        <w:rPr>
+          <w:noProof/>
+        </w:rPr>
+        <w:fldChar w:fldCharType="end"/>
+      </w:r>
       <w:r>
         <w:t xml:space="preserve"> s</w:t>
       </w:r>
@@ -13394,14 +13511,27 @@
       <w:r>
         <w:t xml:space="preserve">Gambar 3. </w:t>
       </w:r>
-      <w:fldSimple w:instr=" SEQ Gambar_3. \* ARABIC ">
-        <w:r>
-          <w:rPr>
-            <w:noProof/>
-          </w:rPr>
-          <w:t>7</w:t>
-        </w:r>
-      </w:fldSimple>
+      <w:r>
+        <w:fldChar w:fldCharType="begin"/>
+      </w:r>
+      <w:r>
+        <w:instrText xml:space="preserve"> SEQ Gambar_3. \* ARABIC </w:instrText>
+      </w:r>
+      <w:r>
+        <w:fldChar w:fldCharType="separate"/>
+      </w:r>
+      <w:r>
+        <w:rPr>
+          <w:noProof/>
+        </w:rPr>
+        <w:t>7</w:t>
+      </w:r>
+      <w:r>
+        <w:rPr>
+          <w:noProof/>
+        </w:rPr>
+        <w:fldChar w:fldCharType="end"/>
+      </w:r>
       <w:r>
         <w:t xml:space="preserve"> h</w:t>
       </w:r>
@@ -13635,14 +13765,27 @@
       <w:r>
         <w:t xml:space="preserve">Gambar 3. </w:t>
       </w:r>
-      <w:fldSimple w:instr=" SEQ Gambar_3. \* ARABIC ">
-        <w:r>
-          <w:rPr>
-            <w:noProof/>
-          </w:rPr>
-          <w:t>8</w:t>
-        </w:r>
-      </w:fldSimple>
+      <w:r>
+        <w:fldChar w:fldCharType="begin"/>
+      </w:r>
+      <w:r>
+        <w:instrText xml:space="preserve"> SEQ Gambar_3. \* ARABIC </w:instrText>
+      </w:r>
+      <w:r>
+        <w:fldChar w:fldCharType="separate"/>
+      </w:r>
+      <w:r>
+        <w:rPr>
+          <w:noProof/>
+        </w:rPr>
+        <w:t>8</w:t>
+      </w:r>
+      <w:r>
+        <w:rPr>
+          <w:noProof/>
+        </w:rPr>
+        <w:fldChar w:fldCharType="end"/>
+      </w:r>
       <w:r>
         <w:t xml:space="preserve"> </w:t>
       </w:r>
@@ -13885,14 +14028,27 @@
       <w:r>
         <w:t xml:space="preserve">Gambar 3. </w:t>
       </w:r>
-      <w:fldSimple w:instr=" SEQ Gambar_3. \* ARABIC ">
-        <w:r>
-          <w:rPr>
-            <w:noProof/>
-          </w:rPr>
-          <w:t>9</w:t>
-        </w:r>
-      </w:fldSimple>
+      <w:r>
+        <w:fldChar w:fldCharType="begin"/>
+      </w:r>
+      <w:r>
+        <w:instrText xml:space="preserve"> SEQ Gambar_3. \* ARABIC </w:instrText>
+      </w:r>
+      <w:r>
+        <w:fldChar w:fldCharType="separate"/>
+      </w:r>
+      <w:r>
+        <w:rPr>
+          <w:noProof/>
+        </w:rPr>
+        <w:t>9</w:t>
+      </w:r>
+      <w:r>
+        <w:rPr>
+          <w:noProof/>
+        </w:rPr>
+        <w:fldChar w:fldCharType="end"/>
+      </w:r>
       <w:r>
         <w:t xml:space="preserve"> m</w:t>
       </w:r>
@@ -13983,14 +14139,27 @@
       <w:r>
         <w:t xml:space="preserve">Gambar 3. </w:t>
       </w:r>
-      <w:fldSimple w:instr=" SEQ Gambar_3. \* ARABIC ">
-        <w:r>
-          <w:rPr>
-            <w:noProof/>
-          </w:rPr>
-          <w:t>10</w:t>
-        </w:r>
-      </w:fldSimple>
+      <w:r>
+        <w:fldChar w:fldCharType="begin"/>
+      </w:r>
+      <w:r>
+        <w:instrText xml:space="preserve"> SEQ Gambar_3. \* ARABIC </w:instrText>
+      </w:r>
+      <w:r>
+        <w:fldChar w:fldCharType="separate"/>
+      </w:r>
+      <w:r>
+        <w:rPr>
+          <w:noProof/>
+        </w:rPr>
+        <w:t>10</w:t>
+      </w:r>
+      <w:r>
+        <w:rPr>
+          <w:noProof/>
+        </w:rPr>
+        <w:fldChar w:fldCharType="end"/>
+      </w:r>
       <w:r>
         <w:t xml:space="preserve"> s</w:t>
       </w:r>
@@ -14351,14 +14520,27 @@
       <w:r>
         <w:t xml:space="preserve">Gambar 3. </w:t>
       </w:r>
-      <w:fldSimple w:instr=" SEQ Gambar_3. \* ARABIC ">
-        <w:r>
-          <w:rPr>
-            <w:noProof/>
-          </w:rPr>
-          <w:t>11</w:t>
-        </w:r>
-      </w:fldSimple>
+      <w:r>
+        <w:fldChar w:fldCharType="begin"/>
+      </w:r>
+      <w:r>
+        <w:instrText xml:space="preserve"> SEQ Gambar_3. \* ARABIC </w:instrText>
+      </w:r>
+      <w:r>
+        <w:fldChar w:fldCharType="separate"/>
+      </w:r>
+      <w:r>
+        <w:rPr>
+          <w:noProof/>
+        </w:rPr>
+        <w:t>11</w:t>
+      </w:r>
+      <w:r>
+        <w:rPr>
+          <w:noProof/>
+        </w:rPr>
+        <w:fldChar w:fldCharType="end"/>
+      </w:r>
       <w:r>
         <w:t xml:space="preserve"> s</w:t>
       </w:r>
@@ -15089,14 +15271,27 @@
       <w:r>
         <w:t xml:space="preserve">Gambar 3. </w:t>
       </w:r>
-      <w:fldSimple w:instr=" SEQ Gambar_3. \* ARABIC ">
-        <w:r>
-          <w:rPr>
-            <w:noProof/>
-          </w:rPr>
-          <w:t>12</w:t>
-        </w:r>
-      </w:fldSimple>
+      <w:r>
+        <w:fldChar w:fldCharType="begin"/>
+      </w:r>
+      <w:r>
+        <w:instrText xml:space="preserve"> SEQ Gambar_3. \* ARABIC </w:instrText>
+      </w:r>
+      <w:r>
+        <w:fldChar w:fldCharType="separate"/>
+      </w:r>
+      <w:r>
+        <w:rPr>
+          <w:noProof/>
+        </w:rPr>
+        <w:t>12</w:t>
+      </w:r>
+      <w:r>
+        <w:rPr>
+          <w:noProof/>
+        </w:rPr>
+        <w:fldChar w:fldCharType="end"/>
+      </w:r>
       <w:r>
         <w:t xml:space="preserve"> distribusi jalur pendaftaran</w:t>
       </w:r>
@@ -15224,14 +15419,27 @@
       <w:r>
         <w:t xml:space="preserve">Gambar 3. </w:t>
       </w:r>
-      <w:fldSimple w:instr=" SEQ Gambar_3. \* ARABIC ">
-        <w:r>
-          <w:rPr>
-            <w:noProof/>
-          </w:rPr>
-          <w:t>13</w:t>
-        </w:r>
-      </w:fldSimple>
+      <w:r>
+        <w:fldChar w:fldCharType="begin"/>
+      </w:r>
+      <w:r>
+        <w:instrText xml:space="preserve"> SEQ Gambar_3. \* ARABIC </w:instrText>
+      </w:r>
+      <w:r>
+        <w:fldChar w:fldCharType="separate"/>
+      </w:r>
+      <w:r>
+        <w:rPr>
+          <w:noProof/>
+        </w:rPr>
+        <w:t>13</w:t>
+      </w:r>
+      <w:r>
+        <w:rPr>
+          <w:noProof/>
+        </w:rPr>
+        <w:fldChar w:fldCharType="end"/>
+      </w:r>
       <w:r>
         <w:t xml:space="preserve"> distribusi </w:t>
       </w:r>
@@ -15372,14 +15580,27 @@
       <w:r>
         <w:t xml:space="preserve">Gambar 3. </w:t>
       </w:r>
-      <w:fldSimple w:instr=" SEQ Gambar_3. \* ARABIC ">
-        <w:r>
-          <w:rPr>
-            <w:noProof/>
-          </w:rPr>
-          <w:t>14</w:t>
-        </w:r>
-      </w:fldSimple>
+      <w:r>
+        <w:fldChar w:fldCharType="begin"/>
+      </w:r>
+      <w:r>
+        <w:instrText xml:space="preserve"> SEQ Gambar_3. \* ARABIC </w:instrText>
+      </w:r>
+      <w:r>
+        <w:fldChar w:fldCharType="separate"/>
+      </w:r>
+      <w:r>
+        <w:rPr>
+          <w:noProof/>
+        </w:rPr>
+        <w:t>14</w:t>
+      </w:r>
+      <w:r>
+        <w:rPr>
+          <w:noProof/>
+        </w:rPr>
+        <w:fldChar w:fldCharType="end"/>
+      </w:r>
       <w:r>
         <w:t xml:space="preserve"> distribusi </w:t>
       </w:r>
@@ -15507,14 +15728,27 @@
       <w:r>
         <w:t xml:space="preserve">Gambar 3. </w:t>
       </w:r>
-      <w:fldSimple w:instr=" SEQ Gambar_3. \* ARABIC ">
-        <w:r>
-          <w:rPr>
-            <w:noProof/>
-          </w:rPr>
-          <w:t>15</w:t>
-        </w:r>
-      </w:fldSimple>
+      <w:r>
+        <w:fldChar w:fldCharType="begin"/>
+      </w:r>
+      <w:r>
+        <w:instrText xml:space="preserve"> SEQ Gambar_3. \* ARABIC </w:instrText>
+      </w:r>
+      <w:r>
+        <w:fldChar w:fldCharType="separate"/>
+      </w:r>
+      <w:r>
+        <w:rPr>
+          <w:noProof/>
+        </w:rPr>
+        <w:t>15</w:t>
+      </w:r>
+      <w:r>
+        <w:rPr>
+          <w:noProof/>
+        </w:rPr>
+        <w:fldChar w:fldCharType="end"/>
+      </w:r>
       <w:r>
         <w:t xml:space="preserve"> distribusi</w:t>
       </w:r>
@@ -15643,14 +15877,27 @@
       <w:r>
         <w:t xml:space="preserve">Gambar 3. </w:t>
       </w:r>
-      <w:fldSimple w:instr=" SEQ Gambar_3. \* ARABIC ">
-        <w:r>
-          <w:rPr>
-            <w:noProof/>
-          </w:rPr>
-          <w:t>16</w:t>
-        </w:r>
-      </w:fldSimple>
+      <w:r>
+        <w:fldChar w:fldCharType="begin"/>
+      </w:r>
+      <w:r>
+        <w:instrText xml:space="preserve"> SEQ Gambar_3. \* ARABIC </w:instrText>
+      </w:r>
+      <w:r>
+        <w:fldChar w:fldCharType="separate"/>
+      </w:r>
+      <w:r>
+        <w:rPr>
+          <w:noProof/>
+        </w:rPr>
+        <w:t>16</w:t>
+      </w:r>
+      <w:r>
+        <w:rPr>
+          <w:noProof/>
+        </w:rPr>
+        <w:fldChar w:fldCharType="end"/>
+      </w:r>
       <w:r>
         <w:t xml:space="preserve"> distribusi </w:t>
       </w:r>
@@ -15778,14 +16025,27 @@
       <w:r>
         <w:t xml:space="preserve">Gambar 3. </w:t>
       </w:r>
-      <w:fldSimple w:instr=" SEQ Gambar_3. \* ARABIC ">
-        <w:r>
-          <w:rPr>
-            <w:noProof/>
-          </w:rPr>
-          <w:t>17</w:t>
-        </w:r>
-      </w:fldSimple>
+      <w:r>
+        <w:fldChar w:fldCharType="begin"/>
+      </w:r>
+      <w:r>
+        <w:instrText xml:space="preserve"> SEQ Gambar_3. \* ARABIC </w:instrText>
+      </w:r>
+      <w:r>
+        <w:fldChar w:fldCharType="separate"/>
+      </w:r>
+      <w:r>
+        <w:rPr>
+          <w:noProof/>
+        </w:rPr>
+        <w:t>17</w:t>
+      </w:r>
+      <w:r>
+        <w:rPr>
+          <w:noProof/>
+        </w:rPr>
+        <w:fldChar w:fldCharType="end"/>
+      </w:r>
       <w:r>
         <w:t xml:space="preserve"> distribusi </w:t>
       </w:r>
@@ -15914,14 +16174,27 @@
       <w:r>
         <w:t xml:space="preserve">Gambar 3. </w:t>
       </w:r>
-      <w:fldSimple w:instr=" SEQ Gambar_3. \* ARABIC ">
-        <w:r>
-          <w:rPr>
-            <w:noProof/>
-          </w:rPr>
-          <w:t>18</w:t>
-        </w:r>
-      </w:fldSimple>
+      <w:r>
+        <w:fldChar w:fldCharType="begin"/>
+      </w:r>
+      <w:r>
+        <w:instrText xml:space="preserve"> SEQ Gambar_3. \* ARABIC </w:instrText>
+      </w:r>
+      <w:r>
+        <w:fldChar w:fldCharType="separate"/>
+      </w:r>
+      <w:r>
+        <w:rPr>
+          <w:noProof/>
+        </w:rPr>
+        <w:t>18</w:t>
+      </w:r>
+      <w:r>
+        <w:rPr>
+          <w:noProof/>
+        </w:rPr>
+        <w:fldChar w:fldCharType="end"/>
+      </w:r>
       <w:r>
         <w:t xml:space="preserve"> distribusi </w:t>
       </w:r>
@@ -16055,14 +16328,27 @@
       <w:r>
         <w:t xml:space="preserve">Gambar 3. </w:t>
       </w:r>
-      <w:fldSimple w:instr=" SEQ Gambar_3. \* ARABIC ">
-        <w:r>
-          <w:rPr>
-            <w:noProof/>
-          </w:rPr>
-          <w:t>19</w:t>
-        </w:r>
-      </w:fldSimple>
+      <w:r>
+        <w:fldChar w:fldCharType="begin"/>
+      </w:r>
+      <w:r>
+        <w:instrText xml:space="preserve"> SEQ Gambar_3. \* ARABIC </w:instrText>
+      </w:r>
+      <w:r>
+        <w:fldChar w:fldCharType="separate"/>
+      </w:r>
+      <w:r>
+        <w:rPr>
+          <w:noProof/>
+        </w:rPr>
+        <w:t>19</w:t>
+      </w:r>
+      <w:r>
+        <w:rPr>
+          <w:noProof/>
+        </w:rPr>
+        <w:fldChar w:fldCharType="end"/>
+      </w:r>
       <w:r>
         <w:t xml:space="preserve"> distribusi </w:t>
       </w:r>
@@ -16220,14 +16506,27 @@
       <w:r>
         <w:t xml:space="preserve">Gambar 3. </w:t>
       </w:r>
-      <w:fldSimple w:instr=" SEQ Gambar_3. \* ARABIC ">
-        <w:r>
-          <w:rPr>
-            <w:noProof/>
-          </w:rPr>
-          <w:t>20</w:t>
-        </w:r>
-      </w:fldSimple>
+      <w:r>
+        <w:fldChar w:fldCharType="begin"/>
+      </w:r>
+      <w:r>
+        <w:instrText xml:space="preserve"> SEQ Gambar_3. \* ARABIC </w:instrText>
+      </w:r>
+      <w:r>
+        <w:fldChar w:fldCharType="separate"/>
+      </w:r>
+      <w:r>
+        <w:rPr>
+          <w:noProof/>
+        </w:rPr>
+        <w:t>20</w:t>
+      </w:r>
+      <w:r>
+        <w:rPr>
+          <w:noProof/>
+        </w:rPr>
+        <w:fldChar w:fldCharType="end"/>
+      </w:r>
       <w:r>
         <w:t xml:space="preserve"> distribusi </w:t>
       </w:r>
@@ -16367,14 +16666,27 @@
       <w:r>
         <w:t xml:space="preserve">Gambar 3. </w:t>
       </w:r>
-      <w:fldSimple w:instr=" SEQ Gambar_3. \* ARABIC ">
-        <w:r>
-          <w:rPr>
-            <w:noProof/>
-          </w:rPr>
-          <w:t>21</w:t>
-        </w:r>
-      </w:fldSimple>
+      <w:r>
+        <w:fldChar w:fldCharType="begin"/>
+      </w:r>
+      <w:r>
+        <w:instrText xml:space="preserve"> SEQ Gambar_3. \* ARABIC </w:instrText>
+      </w:r>
+      <w:r>
+        <w:fldChar w:fldCharType="separate"/>
+      </w:r>
+      <w:r>
+        <w:rPr>
+          <w:noProof/>
+        </w:rPr>
+        <w:t>21</w:t>
+      </w:r>
+      <w:r>
+        <w:rPr>
+          <w:noProof/>
+        </w:rPr>
+        <w:fldChar w:fldCharType="end"/>
+      </w:r>
       <w:r>
         <w:t xml:space="preserve"> distribusi </w:t>
       </w:r>
@@ -16497,14 +16809,27 @@
       <w:r>
         <w:t xml:space="preserve">Gambar 3. </w:t>
       </w:r>
-      <w:fldSimple w:instr=" SEQ Gambar_3. \* ARABIC ">
-        <w:r>
-          <w:rPr>
-            <w:noProof/>
-          </w:rPr>
-          <w:t>22</w:t>
-        </w:r>
-      </w:fldSimple>
+      <w:r>
+        <w:fldChar w:fldCharType="begin"/>
+      </w:r>
+      <w:r>
+        <w:instrText xml:space="preserve"> SEQ Gambar_3. \* ARABIC </w:instrText>
+      </w:r>
+      <w:r>
+        <w:fldChar w:fldCharType="separate"/>
+      </w:r>
+      <w:r>
+        <w:rPr>
+          <w:noProof/>
+        </w:rPr>
+        <w:t>22</w:t>
+      </w:r>
+      <w:r>
+        <w:rPr>
+          <w:noProof/>
+        </w:rPr>
+        <w:fldChar w:fldCharType="end"/>
+      </w:r>
       <w:r>
         <w:t xml:space="preserve"> distribusi </w:t>
       </w:r>
@@ -16633,14 +16958,27 @@
       <w:r>
         <w:t xml:space="preserve">Gambar 3. </w:t>
       </w:r>
-      <w:fldSimple w:instr=" SEQ Gambar_3. \* ARABIC ">
-        <w:r>
-          <w:rPr>
-            <w:noProof/>
-          </w:rPr>
-          <w:t>23</w:t>
-        </w:r>
-      </w:fldSimple>
+      <w:r>
+        <w:fldChar w:fldCharType="begin"/>
+      </w:r>
+      <w:r>
+        <w:instrText xml:space="preserve"> SEQ Gambar_3. \* ARABIC </w:instrText>
+      </w:r>
+      <w:r>
+        <w:fldChar w:fldCharType="separate"/>
+      </w:r>
+      <w:r>
+        <w:rPr>
+          <w:noProof/>
+        </w:rPr>
+        <w:t>23</w:t>
+      </w:r>
+      <w:r>
+        <w:rPr>
+          <w:noProof/>
+        </w:rPr>
+        <w:fldChar w:fldCharType="end"/>
+      </w:r>
       <w:r>
         <w:t xml:space="preserve"> distribusi </w:t>
       </w:r>
@@ -16775,14 +17113,27 @@
       <w:r>
         <w:t xml:space="preserve">Gambar 3. </w:t>
       </w:r>
-      <w:fldSimple w:instr=" SEQ Gambar_3. \* ARABIC ">
-        <w:r>
-          <w:rPr>
-            <w:noProof/>
-          </w:rPr>
-          <w:t>24</w:t>
-        </w:r>
-      </w:fldSimple>
+      <w:r>
+        <w:fldChar w:fldCharType="begin"/>
+      </w:r>
+      <w:r>
+        <w:instrText xml:space="preserve"> SEQ Gambar_3. \* ARABIC </w:instrText>
+      </w:r>
+      <w:r>
+        <w:fldChar w:fldCharType="separate"/>
+      </w:r>
+      <w:r>
+        <w:rPr>
+          <w:noProof/>
+        </w:rPr>
+        <w:t>24</w:t>
+      </w:r>
+      <w:r>
+        <w:rPr>
+          <w:noProof/>
+        </w:rPr>
+        <w:fldChar w:fldCharType="end"/>
+      </w:r>
       <w:r>
         <w:t xml:space="preserve"> distribusi </w:t>
       </w:r>
@@ -17123,14 +17474,27 @@
       <w:r>
         <w:t xml:space="preserve">Gambar 3. </w:t>
       </w:r>
-      <w:fldSimple w:instr=" SEQ Gambar_3. \* ARABIC ">
-        <w:r>
-          <w:rPr>
-            <w:noProof/>
-          </w:rPr>
-          <w:t>25</w:t>
-        </w:r>
-      </w:fldSimple>
+      <w:r>
+        <w:fldChar w:fldCharType="begin"/>
+      </w:r>
+      <w:r>
+        <w:instrText xml:space="preserve"> SEQ Gambar_3. \* ARABIC </w:instrText>
+      </w:r>
+      <w:r>
+        <w:fldChar w:fldCharType="separate"/>
+      </w:r>
+      <w:r>
+        <w:rPr>
+          <w:noProof/>
+        </w:rPr>
+        <w:t>25</w:t>
+      </w:r>
+      <w:r>
+        <w:rPr>
+          <w:noProof/>
+        </w:rPr>
+        <w:fldChar w:fldCharType="end"/>
+      </w:r>
       <w:r>
         <w:t xml:space="preserve"> v</w:t>
       </w:r>
@@ -17283,14 +17647,27 @@
       <w:r>
         <w:t xml:space="preserve">Gambar 3. </w:t>
       </w:r>
-      <w:fldSimple w:instr=" SEQ Gambar_3. \* ARABIC ">
-        <w:r>
-          <w:rPr>
-            <w:noProof/>
-          </w:rPr>
-          <w:t>26</w:t>
-        </w:r>
-      </w:fldSimple>
+      <w:r>
+        <w:fldChar w:fldCharType="begin"/>
+      </w:r>
+      <w:r>
+        <w:instrText xml:space="preserve"> SEQ Gambar_3. \* ARABIC </w:instrText>
+      </w:r>
+      <w:r>
+        <w:fldChar w:fldCharType="separate"/>
+      </w:r>
+      <w:r>
+        <w:rPr>
+          <w:noProof/>
+        </w:rPr>
+        <w:t>26</w:t>
+      </w:r>
+      <w:r>
+        <w:rPr>
+          <w:noProof/>
+        </w:rPr>
+        <w:fldChar w:fldCharType="end"/>
+      </w:r>
       <w:r>
         <w:t xml:space="preserve"> v</w:t>
       </w:r>
@@ -17541,14 +17918,27 @@
       <w:r>
         <w:t xml:space="preserve">Gambar 3. </w:t>
       </w:r>
-      <w:fldSimple w:instr=" SEQ Gambar_3. \* ARABIC ">
-        <w:r>
-          <w:rPr>
-            <w:noProof/>
-          </w:rPr>
-          <w:t>27</w:t>
-        </w:r>
-      </w:fldSimple>
+      <w:r>
+        <w:fldChar w:fldCharType="begin"/>
+      </w:r>
+      <w:r>
+        <w:instrText xml:space="preserve"> SEQ Gambar_3. \* ARABIC </w:instrText>
+      </w:r>
+      <w:r>
+        <w:fldChar w:fldCharType="separate"/>
+      </w:r>
+      <w:r>
+        <w:rPr>
+          <w:noProof/>
+        </w:rPr>
+        <w:t>27</w:t>
+      </w:r>
+      <w:r>
+        <w:rPr>
+          <w:noProof/>
+        </w:rPr>
+        <w:fldChar w:fldCharType="end"/>
+      </w:r>
       <w:r>
         <w:t xml:space="preserve"> </w:t>
       </w:r>
@@ -17640,14 +18030,27 @@
       <w:r>
         <w:t xml:space="preserve">Gambar 3. </w:t>
       </w:r>
-      <w:fldSimple w:instr=" SEQ Gambar_3. \* ARABIC ">
-        <w:r>
-          <w:rPr>
-            <w:noProof/>
-          </w:rPr>
-          <w:t>28</w:t>
-        </w:r>
-      </w:fldSimple>
+      <w:r>
+        <w:fldChar w:fldCharType="begin"/>
+      </w:r>
+      <w:r>
+        <w:instrText xml:space="preserve"> SEQ Gambar_3. \* ARABIC </w:instrText>
+      </w:r>
+      <w:r>
+        <w:fldChar w:fldCharType="separate"/>
+      </w:r>
+      <w:r>
+        <w:rPr>
+          <w:noProof/>
+        </w:rPr>
+        <w:t>28</w:t>
+      </w:r>
+      <w:r>
+        <w:rPr>
+          <w:noProof/>
+        </w:rPr>
+        <w:fldChar w:fldCharType="end"/>
+      </w:r>
       <w:r>
         <w:t xml:space="preserve"> </w:t>
       </w:r>
@@ -17797,14 +18200,27 @@
       <w:r>
         <w:t xml:space="preserve">Gambar 3. </w:t>
       </w:r>
-      <w:fldSimple w:instr=" SEQ Gambar_3. \* ARABIC ">
-        <w:r>
-          <w:rPr>
-            <w:noProof/>
-          </w:rPr>
-          <w:t>29</w:t>
-        </w:r>
-      </w:fldSimple>
+      <w:r>
+        <w:fldChar w:fldCharType="begin"/>
+      </w:r>
+      <w:r>
+        <w:instrText xml:space="preserve"> SEQ Gambar_3. \* ARABIC </w:instrText>
+      </w:r>
+      <w:r>
+        <w:fldChar w:fldCharType="separate"/>
+      </w:r>
+      <w:r>
+        <w:rPr>
+          <w:noProof/>
+        </w:rPr>
+        <w:t>29</w:t>
+      </w:r>
+      <w:r>
+        <w:rPr>
+          <w:noProof/>
+        </w:rPr>
+        <w:fldChar w:fldCharType="end"/>
+      </w:r>
       <w:r>
         <w:t xml:space="preserve"> validasi ulang prodi pilihan 1</w:t>
       </w:r>
@@ -17925,14 +18341,27 @@
       <w:r>
         <w:t xml:space="preserve">Gambar 3. </w:t>
       </w:r>
-      <w:fldSimple w:instr=" SEQ Gambar_3. \* ARABIC ">
-        <w:r>
-          <w:rPr>
-            <w:noProof/>
-          </w:rPr>
-          <w:t>30</w:t>
-        </w:r>
-      </w:fldSimple>
+      <w:r>
+        <w:fldChar w:fldCharType="begin"/>
+      </w:r>
+      <w:r>
+        <w:instrText xml:space="preserve"> SEQ Gambar_3. \* ARABIC </w:instrText>
+      </w:r>
+      <w:r>
+        <w:fldChar w:fldCharType="separate"/>
+      </w:r>
+      <w:r>
+        <w:rPr>
+          <w:noProof/>
+        </w:rPr>
+        <w:t>30</w:t>
+      </w:r>
+      <w:r>
+        <w:rPr>
+          <w:noProof/>
+        </w:rPr>
+        <w:fldChar w:fldCharType="end"/>
+      </w:r>
       <w:r>
         <w:t xml:space="preserve"> validasi ulang </w:t>
       </w:r>
@@ -18075,14 +18504,27 @@
       <w:r>
         <w:t xml:space="preserve">Gambar 3. </w:t>
       </w:r>
-      <w:fldSimple w:instr=" SEQ Gambar_3. \* ARABIC ">
-        <w:r>
-          <w:rPr>
-            <w:noProof/>
-          </w:rPr>
-          <w:t>31</w:t>
-        </w:r>
-      </w:fldSimple>
+      <w:r>
+        <w:fldChar w:fldCharType="begin"/>
+      </w:r>
+      <w:r>
+        <w:instrText xml:space="preserve"> SEQ Gambar_3. \* ARABIC </w:instrText>
+      </w:r>
+      <w:r>
+        <w:fldChar w:fldCharType="separate"/>
+      </w:r>
+      <w:r>
+        <w:rPr>
+          <w:noProof/>
+        </w:rPr>
+        <w:t>31</w:t>
+      </w:r>
+      <w:r>
+        <w:rPr>
+          <w:noProof/>
+        </w:rPr>
+        <w:fldChar w:fldCharType="end"/>
+      </w:r>
       <w:r>
         <w:t xml:space="preserve"> validasi ulang </w:t>
       </w:r>
@@ -18212,14 +18654,27 @@
       <w:r>
         <w:t xml:space="preserve">Gambar 3. </w:t>
       </w:r>
-      <w:fldSimple w:instr=" SEQ Gambar_3. \* ARABIC ">
-        <w:r>
-          <w:rPr>
-            <w:noProof/>
-          </w:rPr>
-          <w:t>32</w:t>
-        </w:r>
-      </w:fldSimple>
+      <w:r>
+        <w:fldChar w:fldCharType="begin"/>
+      </w:r>
+      <w:r>
+        <w:instrText xml:space="preserve"> SEQ Gambar_3. \* ARABIC </w:instrText>
+      </w:r>
+      <w:r>
+        <w:fldChar w:fldCharType="separate"/>
+      </w:r>
+      <w:r>
+        <w:rPr>
+          <w:noProof/>
+        </w:rPr>
+        <w:t>32</w:t>
+      </w:r>
+      <w:r>
+        <w:rPr>
+          <w:noProof/>
+        </w:rPr>
+        <w:fldChar w:fldCharType="end"/>
+      </w:r>
       <w:r>
         <w:t xml:space="preserve"> validasi ulang </w:t>
       </w:r>
@@ -18374,14 +18829,27 @@
       <w:r>
         <w:t xml:space="preserve">Gambar 3. </w:t>
       </w:r>
-      <w:fldSimple w:instr=" SEQ Gambar_3. \* ARABIC ">
-        <w:r>
-          <w:rPr>
-            <w:noProof/>
-          </w:rPr>
-          <w:t>33</w:t>
-        </w:r>
-      </w:fldSimple>
+      <w:r>
+        <w:fldChar w:fldCharType="begin"/>
+      </w:r>
+      <w:r>
+        <w:instrText xml:space="preserve"> SEQ Gambar_3. \* ARABIC </w:instrText>
+      </w:r>
+      <w:r>
+        <w:fldChar w:fldCharType="separate"/>
+      </w:r>
+      <w:r>
+        <w:rPr>
+          <w:noProof/>
+        </w:rPr>
+        <w:t>33</w:t>
+      </w:r>
+      <w:r>
+        <w:rPr>
+          <w:noProof/>
+        </w:rPr>
+        <w:fldChar w:fldCharType="end"/>
+      </w:r>
       <w:r>
         <w:t xml:space="preserve"> validasi ulang </w:t>
       </w:r>
@@ -18511,14 +18979,27 @@
       <w:r>
         <w:t xml:space="preserve">Gambar 3. </w:t>
       </w:r>
-      <w:fldSimple w:instr=" SEQ Gambar_3. \* ARABIC ">
-        <w:r>
-          <w:rPr>
-            <w:noProof/>
-          </w:rPr>
-          <w:t>34</w:t>
-        </w:r>
-      </w:fldSimple>
+      <w:r>
+        <w:fldChar w:fldCharType="begin"/>
+      </w:r>
+      <w:r>
+        <w:instrText xml:space="preserve"> SEQ Gambar_3. \* ARABIC </w:instrText>
+      </w:r>
+      <w:r>
+        <w:fldChar w:fldCharType="separate"/>
+      </w:r>
+      <w:r>
+        <w:rPr>
+          <w:noProof/>
+        </w:rPr>
+        <w:t>34</w:t>
+      </w:r>
+      <w:r>
+        <w:rPr>
+          <w:noProof/>
+        </w:rPr>
+        <w:fldChar w:fldCharType="end"/>
+      </w:r>
       <w:r>
         <w:t xml:space="preserve"> validasi ulang </w:t>
       </w:r>
@@ -18673,14 +19154,27 @@
       <w:r>
         <w:t xml:space="preserve">Gambar 3. </w:t>
       </w:r>
-      <w:fldSimple w:instr=" SEQ Gambar_3. \* ARABIC ">
-        <w:r>
-          <w:rPr>
-            <w:noProof/>
-          </w:rPr>
-          <w:t>35</w:t>
-        </w:r>
-      </w:fldSimple>
+      <w:r>
+        <w:fldChar w:fldCharType="begin"/>
+      </w:r>
+      <w:r>
+        <w:instrText xml:space="preserve"> SEQ Gambar_3. \* ARABIC </w:instrText>
+      </w:r>
+      <w:r>
+        <w:fldChar w:fldCharType="separate"/>
+      </w:r>
+      <w:r>
+        <w:rPr>
+          <w:noProof/>
+        </w:rPr>
+        <w:t>35</w:t>
+      </w:r>
+      <w:r>
+        <w:rPr>
+          <w:noProof/>
+        </w:rPr>
+        <w:fldChar w:fldCharType="end"/>
+      </w:r>
       <w:r>
         <w:t xml:space="preserve"> validasi ulang </w:t>
       </w:r>
@@ -18975,14 +19469,27 @@
       <w:r>
         <w:t xml:space="preserve">Gambar 3. </w:t>
       </w:r>
-      <w:fldSimple w:instr=" SEQ Gambar_3. \* ARABIC ">
-        <w:r>
-          <w:rPr>
-            <w:noProof/>
-          </w:rPr>
-          <w:t>36</w:t>
-        </w:r>
-      </w:fldSimple>
+      <w:r>
+        <w:fldChar w:fldCharType="begin"/>
+      </w:r>
+      <w:r>
+        <w:instrText xml:space="preserve"> SEQ Gambar_3. \* ARABIC </w:instrText>
+      </w:r>
+      <w:r>
+        <w:fldChar w:fldCharType="separate"/>
+      </w:r>
+      <w:r>
+        <w:rPr>
+          <w:noProof/>
+        </w:rPr>
+        <w:t>36</w:t>
+      </w:r>
+      <w:r>
+        <w:rPr>
+          <w:noProof/>
+        </w:rPr>
+        <w:fldChar w:fldCharType="end"/>
+      </w:r>
       <w:r>
         <w:t xml:space="preserve"> </w:t>
       </w:r>
@@ -19073,14 +19580,27 @@
       <w:r>
         <w:t xml:space="preserve">Gambar 3. </w:t>
       </w:r>
-      <w:fldSimple w:instr=" SEQ Gambar_3. \* ARABIC ">
-        <w:r>
-          <w:rPr>
-            <w:noProof/>
-          </w:rPr>
-          <w:t>37</w:t>
-        </w:r>
-      </w:fldSimple>
+      <w:r>
+        <w:fldChar w:fldCharType="begin"/>
+      </w:r>
+      <w:r>
+        <w:instrText xml:space="preserve"> SEQ Gambar_3. \* ARABIC </w:instrText>
+      </w:r>
+      <w:r>
+        <w:fldChar w:fldCharType="separate"/>
+      </w:r>
+      <w:r>
+        <w:rPr>
+          <w:noProof/>
+        </w:rPr>
+        <w:t>37</w:t>
+      </w:r>
+      <w:r>
+        <w:rPr>
+          <w:noProof/>
+        </w:rPr>
+        <w:fldChar w:fldCharType="end"/>
+      </w:r>
       <w:r>
         <w:t xml:space="preserve"> </w:t>
       </w:r>
@@ -19171,14 +19691,27 @@
       <w:r>
         <w:t xml:space="preserve">Gambar 3. </w:t>
       </w:r>
-      <w:fldSimple w:instr=" SEQ Gambar_3. \* ARABIC ">
-        <w:r>
-          <w:rPr>
-            <w:noProof/>
-          </w:rPr>
-          <w:t>38</w:t>
-        </w:r>
-      </w:fldSimple>
+      <w:r>
+        <w:fldChar w:fldCharType="begin"/>
+      </w:r>
+      <w:r>
+        <w:instrText xml:space="preserve"> SEQ Gambar_3. \* ARABIC </w:instrText>
+      </w:r>
+      <w:r>
+        <w:fldChar w:fldCharType="separate"/>
+      </w:r>
+      <w:r>
+        <w:rPr>
+          <w:noProof/>
+        </w:rPr>
+        <w:t>38</w:t>
+      </w:r>
+      <w:r>
+        <w:rPr>
+          <w:noProof/>
+        </w:rPr>
+        <w:fldChar w:fldCharType="end"/>
+      </w:r>
       <w:r>
         <w:t xml:space="preserve"> </w:t>
       </w:r>
@@ -20020,14 +20553,27 @@
       <w:r>
         <w:t xml:space="preserve">Gambar 3. </w:t>
       </w:r>
-      <w:fldSimple w:instr=" SEQ Gambar_3. \* ARABIC ">
-        <w:r>
-          <w:rPr>
-            <w:noProof/>
-          </w:rPr>
-          <w:t>39</w:t>
-        </w:r>
-      </w:fldSimple>
+      <w:r>
+        <w:fldChar w:fldCharType="begin"/>
+      </w:r>
+      <w:r>
+        <w:instrText xml:space="preserve"> SEQ Gambar_3. \* ARABIC </w:instrText>
+      </w:r>
+      <w:r>
+        <w:fldChar w:fldCharType="separate"/>
+      </w:r>
+      <w:r>
+        <w:rPr>
+          <w:noProof/>
+        </w:rPr>
+        <w:t>39</w:t>
+      </w:r>
+      <w:r>
+        <w:rPr>
+          <w:noProof/>
+        </w:rPr>
+        <w:fldChar w:fldCharType="end"/>
+      </w:r>
       <w:r>
         <w:t xml:space="preserve"> </w:t>
       </w:r>
@@ -20131,14 +20677,27 @@
       <w:r>
         <w:t xml:space="preserve">Gambar 3. </w:t>
       </w:r>
-      <w:fldSimple w:instr=" SEQ Gambar_3. \* ARABIC ">
-        <w:r>
-          <w:rPr>
-            <w:noProof/>
-          </w:rPr>
-          <w:t>40</w:t>
-        </w:r>
-      </w:fldSimple>
+      <w:r>
+        <w:fldChar w:fldCharType="begin"/>
+      </w:r>
+      <w:r>
+        <w:instrText xml:space="preserve"> SEQ Gambar_3. \* ARABIC </w:instrText>
+      </w:r>
+      <w:r>
+        <w:fldChar w:fldCharType="separate"/>
+      </w:r>
+      <w:r>
+        <w:rPr>
+          <w:noProof/>
+        </w:rPr>
+        <w:t>40</w:t>
+      </w:r>
+      <w:r>
+        <w:rPr>
+          <w:noProof/>
+        </w:rPr>
+        <w:fldChar w:fldCharType="end"/>
+      </w:r>
       <w:r>
         <w:t xml:space="preserve"> </w:t>
       </w:r>
@@ -20762,20 +21321,13 @@
     </w:p>
     <w:p>
       <w:pPr>
-        <w:pStyle w:val="ListParagraph"/>
+        <w:pStyle w:val="Heading8"/>
         <w:numPr>
-          <w:ilvl w:val="1"/>
-          <w:numId w:val="28"/>
+          <w:ilvl w:val="0"/>
+          <w:numId w:val="47"/>
         </w:numPr>
-        <w:spacing w:line="480" w:lineRule="auto"/>
-        <w:rPr>
-          <w:rFonts w:ascii="Times New Roman" w:hAnsi="Times New Roman" w:cs="Times New Roman"/>
-        </w:rPr>
-      </w:pPr>
-      <w:r>
-        <w:rPr>
-          <w:rFonts w:ascii="Times New Roman" w:hAnsi="Times New Roman" w:cs="Times New Roman"/>
-        </w:rPr>
+      </w:pPr>
+      <w:r>
         <w:t>Bar navigasi</w:t>
       </w:r>
     </w:p>
@@ -20793,85 +21345,96 @@
         <w:rPr>
           <w:rFonts w:ascii="Times New Roman" w:hAnsi="Times New Roman" w:cs="Times New Roman"/>
         </w:rPr>
-        <w:t>Bar navigasi adalah tempat dimana tombol untuk berpindah halaman berada</w:t>
-      </w:r>
-      <w:r>
-        <w:rPr>
-          <w:rFonts w:ascii="Times New Roman" w:hAnsi="Times New Roman" w:cs="Times New Roman"/>
-        </w:rPr>
-        <w:t xml:space="preserve">. Bar navigasi terdiri dari 3 tombol: </w:t>
-      </w:r>
-      <w:r>
-        <w:rPr>
-          <w:rFonts w:ascii="Times New Roman" w:hAnsi="Times New Roman" w:cs="Times New Roman"/>
-        </w:rPr>
-        <w:t xml:space="preserve">tombol menuju halaman utama, </w:t>
-      </w:r>
-      <w:r>
-        <w:rPr>
-          <w:rFonts w:ascii="Times New Roman" w:hAnsi="Times New Roman" w:cs="Times New Roman"/>
-        </w:rPr>
-        <w:t>C</w:t>
-      </w:r>
-      <w:r>
-        <w:rPr>
-          <w:rFonts w:ascii="Times New Roman" w:hAnsi="Times New Roman" w:cs="Times New Roman"/>
-        </w:rPr>
-        <w:t xml:space="preserve">ara </w:t>
-      </w:r>
-      <w:r>
-        <w:rPr>
-          <w:rFonts w:ascii="Times New Roman" w:hAnsi="Times New Roman" w:cs="Times New Roman"/>
-        </w:rPr>
-        <w:t>M</w:t>
-      </w:r>
-      <w:r>
-        <w:rPr>
-          <w:rFonts w:ascii="Times New Roman" w:hAnsi="Times New Roman" w:cs="Times New Roman"/>
-        </w:rPr>
-        <w:t xml:space="preserve">embaca </w:t>
-      </w:r>
-      <w:r>
-        <w:rPr>
-          <w:rFonts w:ascii="Times New Roman" w:hAnsi="Times New Roman" w:cs="Times New Roman"/>
-        </w:rPr>
-        <w:t>D</w:t>
-      </w:r>
-      <w:r>
-        <w:rPr>
-          <w:rFonts w:ascii="Times New Roman" w:hAnsi="Times New Roman" w:cs="Times New Roman"/>
-        </w:rPr>
-        <w:t xml:space="preserve">ashboard, dan </w:t>
-      </w:r>
-      <w:r>
-        <w:rPr>
-          <w:rFonts w:ascii="Times New Roman" w:hAnsi="Times New Roman" w:cs="Times New Roman"/>
-        </w:rPr>
-        <w:t>D</w:t>
-      </w:r>
-      <w:r>
-        <w:rPr>
-          <w:rFonts w:ascii="Times New Roman" w:hAnsi="Times New Roman" w:cs="Times New Roman"/>
-        </w:rPr>
-        <w:t xml:space="preserve">ashboard </w:t>
-      </w:r>
-      <w:r>
-        <w:rPr>
-          <w:rFonts w:ascii="Times New Roman" w:hAnsi="Times New Roman" w:cs="Times New Roman"/>
-        </w:rPr>
-        <w:t>V</w:t>
-      </w:r>
-      <w:r>
-        <w:rPr>
-          <w:rFonts w:ascii="Times New Roman" w:hAnsi="Times New Roman" w:cs="Times New Roman"/>
-        </w:rPr>
-        <w:t>isualisasi</w:t>
-      </w:r>
-      <w:r>
-        <w:rPr>
-          <w:rFonts w:ascii="Times New Roman" w:hAnsi="Times New Roman" w:cs="Times New Roman"/>
-        </w:rPr>
-        <w:t>.</w:t>
+        <w:t>Bar navigasi</w:t>
+      </w:r>
+      <w:r>
+        <w:rPr>
+          <w:rFonts w:ascii="Times New Roman" w:hAnsi="Times New Roman" w:cs="Times New Roman"/>
+        </w:rPr>
+        <w:t xml:space="preserve"> yang tertera pada gambar 3.41</w:t>
+      </w:r>
+      <w:r>
+        <w:rPr>
+          <w:rFonts w:ascii="Times New Roman" w:hAnsi="Times New Roman" w:cs="Times New Roman"/>
+        </w:rPr>
+        <w:t xml:space="preserve"> adalah tempat dimana tombol untuk berpindah halaman berada. Bar navigasi terdiri dari 3 tombol: tombol menuju halaman utama, Cara Membaca </w:t>
+      </w:r>
+      <w:r>
+        <w:rPr>
+          <w:rFonts w:ascii="Times New Roman" w:hAnsi="Times New Roman" w:cs="Times New Roman"/>
+          <w:i/>
+          <w:iCs/>
+        </w:rPr>
+        <w:t>Dashboard</w:t>
+      </w:r>
+      <w:r>
+        <w:rPr>
+          <w:rFonts w:ascii="Times New Roman" w:hAnsi="Times New Roman" w:cs="Times New Roman"/>
+        </w:rPr>
+        <w:t xml:space="preserve">, dan </w:t>
+      </w:r>
+      <w:r>
+        <w:rPr>
+          <w:rFonts w:ascii="Times New Roman" w:hAnsi="Times New Roman" w:cs="Times New Roman"/>
+          <w:i/>
+          <w:iCs/>
+        </w:rPr>
+        <w:t>Dashboard</w:t>
+      </w:r>
+      <w:r>
+        <w:rPr>
+          <w:rFonts w:ascii="Times New Roman" w:hAnsi="Times New Roman" w:cs="Times New Roman"/>
+        </w:rPr>
+        <w:t xml:space="preserve"> Visualisasi. Navigasi ini diletakkan di bagian atas halaman </w:t>
+      </w:r>
+      <w:r>
+        <w:rPr>
+          <w:rFonts w:ascii="Times New Roman" w:hAnsi="Times New Roman" w:cs="Times New Roman"/>
+        </w:rPr>
+        <w:lastRenderedPageBreak/>
+        <w:t>(</w:t>
+      </w:r>
+      <w:r>
+        <w:rPr>
+          <w:rFonts w:ascii="Times New Roman" w:hAnsi="Times New Roman" w:cs="Times New Roman"/>
+          <w:i/>
+          <w:iCs/>
+        </w:rPr>
+        <w:t>header</w:t>
+      </w:r>
+      <w:r>
+        <w:rPr>
+          <w:rFonts w:ascii="Times New Roman" w:hAnsi="Times New Roman" w:cs="Times New Roman"/>
+        </w:rPr>
+        <w:t xml:space="preserve">) dan tetap terlihat saat pengguna membuka halaman, sehingga memudahkan interaksi pengguna dalam mengakses informasi penting secara cepat dan efisien. Meskipun dibuat menggunakan struktur </w:t>
+      </w:r>
+      <w:r>
+        <w:rPr>
+          <w:rFonts w:ascii="Times New Roman" w:hAnsi="Times New Roman" w:cs="Times New Roman"/>
+          <w:i/>
+          <w:iCs/>
+        </w:rPr>
+        <w:t>class</w:t>
+      </w:r>
+      <w:r>
+        <w:rPr>
+          <w:rFonts w:ascii="Times New Roman" w:hAnsi="Times New Roman" w:cs="Times New Roman"/>
+        </w:rPr>
+        <w:t xml:space="preserve"> dari </w:t>
+      </w:r>
+      <w:r>
+        <w:rPr>
+          <w:rFonts w:ascii="Times New Roman" w:hAnsi="Times New Roman" w:cs="Times New Roman"/>
+          <w:i/>
+          <w:iCs/>
+        </w:rPr>
+        <w:t>template</w:t>
+      </w:r>
+      <w:r>
+        <w:rPr>
+          <w:rFonts w:ascii="Times New Roman" w:hAnsi="Times New Roman" w:cs="Times New Roman"/>
+        </w:rPr>
+        <w:t>, seluruh tautan sudah diarahkan ke halaman yang sesuai dengan fungsinya.</w:t>
       </w:r>
     </w:p>
     <w:p>
@@ -20887,7 +21450,6 @@
           <w:rFonts w:ascii="Times New Roman" w:hAnsi="Times New Roman" w:cs="Times New Roman"/>
           <w:noProof/>
         </w:rPr>
-        <w:lastRenderedPageBreak/>
         <w:drawing>
           <wp:inline distT="0" distB="0" distL="0" distR="0" wp14:anchorId="44B3BE65" wp14:editId="3F9396ED">
             <wp:extent cx="3960000" cy="2106500"/>
@@ -20955,14 +21517,27 @@
       <w:r>
         <w:t xml:space="preserve">Gambar 3. </w:t>
       </w:r>
-      <w:fldSimple w:instr=" SEQ Gambar_3. \* ARABIC ">
-        <w:r>
-          <w:rPr>
-            <w:noProof/>
-          </w:rPr>
-          <w:t>41</w:t>
-        </w:r>
-      </w:fldSimple>
+      <w:r>
+        <w:fldChar w:fldCharType="begin"/>
+      </w:r>
+      <w:r>
+        <w:instrText xml:space="preserve"> SEQ Gambar_3. \* ARABIC </w:instrText>
+      </w:r>
+      <w:r>
+        <w:fldChar w:fldCharType="separate"/>
+      </w:r>
+      <w:r>
+        <w:rPr>
+          <w:noProof/>
+        </w:rPr>
+        <w:t>41</w:t>
+      </w:r>
+      <w:r>
+        <w:rPr>
+          <w:noProof/>
+        </w:rPr>
+        <w:fldChar w:fldCharType="end"/>
+      </w:r>
       <w:r>
         <w:t xml:space="preserve"> </w:t>
       </w:r>
@@ -20975,20 +21550,9 @@
     </w:p>
     <w:p>
       <w:pPr>
-        <w:pStyle w:val="ListParagraph"/>
-        <w:numPr>
-          <w:ilvl w:val="1"/>
-          <w:numId w:val="28"/>
-        </w:numPr>
-        <w:spacing w:line="480" w:lineRule="auto"/>
-        <w:rPr>
-          <w:rFonts w:ascii="Times New Roman" w:hAnsi="Times New Roman" w:cs="Times New Roman"/>
-        </w:rPr>
-      </w:pPr>
-      <w:r>
-        <w:rPr>
-          <w:rFonts w:ascii="Times New Roman" w:hAnsi="Times New Roman" w:cs="Times New Roman"/>
-        </w:rPr>
+        <w:pStyle w:val="Heading8"/>
+      </w:pPr>
+      <w:r>
         <w:t>Judul proyek</w:t>
       </w:r>
     </w:p>
@@ -21006,13 +21570,52 @@
         <w:rPr>
           <w:rFonts w:ascii="Times New Roman" w:hAnsi="Times New Roman" w:cs="Times New Roman"/>
         </w:rPr>
-        <w:t>Bagian ini dirancang sebagai tempat penampungan judul proyek</w:t>
-      </w:r>
-      <w:r>
-        <w:rPr>
-          <w:rFonts w:ascii="Times New Roman" w:hAnsi="Times New Roman" w:cs="Times New Roman"/>
-        </w:rPr>
-        <w:t>.</w:t>
+        <w:t>Bagian</w:t>
+      </w:r>
+      <w:r>
+        <w:rPr>
+          <w:rFonts w:ascii="Times New Roman" w:hAnsi="Times New Roman" w:cs="Times New Roman"/>
+        </w:rPr>
+        <w:t xml:space="preserve"> yang terdapat pada gambar 3.42</w:t>
+      </w:r>
+      <w:r>
+        <w:rPr>
+          <w:rFonts w:ascii="Times New Roman" w:hAnsi="Times New Roman" w:cs="Times New Roman"/>
+        </w:rPr>
+        <w:t xml:space="preserve"> dirancang sebagai tempat penempatan judul proyek yang berfungsi memperkenalkan inti dari keseluruhan konten yang ada pada halaman. Judul ditampilkan dengan ukuran font besar dan pemilihan warna yang mencolok pada kata kunci “Mahasiswa Baru UMP” untuk menekankan fokus utama dari proyek visualisasi ini. Tepat di bawah judul terdapat paragraf pengantar singkat yang menjelaskan konteks proyek, yaitu sebagai bagian dari tugas Kerja Praktek yang </w:t>
+      </w:r>
+      <w:r>
+        <w:rPr>
+          <w:rFonts w:ascii="Times New Roman" w:hAnsi="Times New Roman" w:cs="Times New Roman"/>
+        </w:rPr>
+        <w:lastRenderedPageBreak/>
+        <w:t>berfokus pada visualisasi tren penerimaan mahasiswa baru di Universitas Muhammadiyah Purwokerto dari tahun 2014 hingga 2024.</w:t>
+      </w:r>
+      <w:r>
+        <w:rPr>
+          <w:rFonts w:ascii="Times New Roman" w:hAnsi="Times New Roman" w:cs="Times New Roman"/>
+        </w:rPr>
+        <w:t xml:space="preserve"> </w:t>
+      </w:r>
+      <w:r>
+        <w:rPr>
+          <w:rFonts w:ascii="Times New Roman" w:hAnsi="Times New Roman" w:cs="Times New Roman"/>
+        </w:rPr>
+        <w:t xml:space="preserve">Bagian ini juga ditempatkan di dalam </w:t>
+      </w:r>
+      <w:r>
+        <w:rPr>
+          <w:rFonts w:ascii="Times New Roman" w:hAnsi="Times New Roman" w:cs="Times New Roman"/>
+          <w:i/>
+          <w:iCs/>
+        </w:rPr>
+        <w:t>slider section</w:t>
+      </w:r>
+      <w:r>
+        <w:rPr>
+          <w:rFonts w:ascii="Times New Roman" w:hAnsi="Times New Roman" w:cs="Times New Roman"/>
+        </w:rPr>
+        <w:t xml:space="preserve"> sehingga tampil secara dinamis dan menarik perhatian pengunjung sejak awal membuka halaman utama.</w:t>
       </w:r>
     </w:p>
     <w:p>
@@ -21095,14 +21698,27 @@
       <w:r>
         <w:t xml:space="preserve">Gambar 3. </w:t>
       </w:r>
-      <w:fldSimple w:instr=" SEQ Gambar_3. \* ARABIC ">
-        <w:r>
-          <w:rPr>
-            <w:noProof/>
-          </w:rPr>
-          <w:t>42</w:t>
-        </w:r>
-      </w:fldSimple>
+      <w:r>
+        <w:fldChar w:fldCharType="begin"/>
+      </w:r>
+      <w:r>
+        <w:instrText xml:space="preserve"> SEQ Gambar_3. \* ARABIC </w:instrText>
+      </w:r>
+      <w:r>
+        <w:fldChar w:fldCharType="separate"/>
+      </w:r>
+      <w:r>
+        <w:rPr>
+          <w:noProof/>
+        </w:rPr>
+        <w:t>42</w:t>
+      </w:r>
+      <w:r>
+        <w:rPr>
+          <w:noProof/>
+        </w:rPr>
+        <w:fldChar w:fldCharType="end"/>
+      </w:r>
       <w:r>
         <w:t xml:space="preserve"> </w:t>
       </w:r>
@@ -21115,20 +21731,9 @@
     </w:p>
     <w:p>
       <w:pPr>
-        <w:pStyle w:val="ListParagraph"/>
-        <w:numPr>
-          <w:ilvl w:val="1"/>
-          <w:numId w:val="28"/>
-        </w:numPr>
-        <w:spacing w:line="480" w:lineRule="auto"/>
-        <w:rPr>
-          <w:rFonts w:ascii="Times New Roman" w:hAnsi="Times New Roman" w:cs="Times New Roman"/>
-        </w:rPr>
-      </w:pPr>
-      <w:r>
-        <w:rPr>
-          <w:rFonts w:ascii="Times New Roman" w:hAnsi="Times New Roman" w:cs="Times New Roman"/>
-        </w:rPr>
+        <w:pStyle w:val="Heading8"/>
+      </w:pPr>
+      <w:r>
         <w:t>Permasalahan, tujuan, dan manfaat</w:t>
       </w:r>
     </w:p>
@@ -21146,13 +21751,49 @@
         <w:rPr>
           <w:rFonts w:ascii="Times New Roman" w:hAnsi="Times New Roman" w:cs="Times New Roman"/>
         </w:rPr>
-        <w:t>Bagian ini dirancang untuk menampung permasalahan, tujuan, dan manfaat proyek ini secara singkat</w:t>
-      </w:r>
-      <w:r>
-        <w:rPr>
-          <w:rFonts w:ascii="Times New Roman" w:hAnsi="Times New Roman" w:cs="Times New Roman"/>
-        </w:rPr>
-        <w:t>.</w:t>
+        <w:t>Bagian</w:t>
+      </w:r>
+      <w:r>
+        <w:rPr>
+          <w:rFonts w:ascii="Times New Roman" w:hAnsi="Times New Roman" w:cs="Times New Roman"/>
+        </w:rPr>
+        <w:t xml:space="preserve"> pada gambar 3.43</w:t>
+      </w:r>
+      <w:r>
+        <w:rPr>
+          <w:rFonts w:ascii="Times New Roman" w:hAnsi="Times New Roman" w:cs="Times New Roman"/>
+        </w:rPr>
+        <w:t xml:space="preserve"> </w:t>
+      </w:r>
+      <w:r>
+        <w:rPr>
+          <w:rFonts w:ascii="Times New Roman" w:hAnsi="Times New Roman" w:cs="Times New Roman"/>
+        </w:rPr>
+        <w:t>dirancang untuk menampilkan secara ringkas namun jelas mengenai permasalahan yang diangkat dalam proyek, tujuan yang ingin dicapai, serta manfaat dari hasil akhir proyek. Ketiganya ditampilkan dalam bentuk kotak informasi yang sejajar secara horizontal, sehingga mudah dikenali dan dibaca oleh pengunjung.</w:t>
+      </w:r>
+    </w:p>
+    <w:p>
+      <w:pPr>
+        <w:pStyle w:val="ListParagraph"/>
+        <w:spacing w:line="480" w:lineRule="auto"/>
+        <w:ind w:left="2160" w:firstLine="720"/>
+        <w:jc w:val="both"/>
+        <w:rPr>
+          <w:rFonts w:ascii="Times New Roman" w:hAnsi="Times New Roman" w:cs="Times New Roman"/>
+        </w:rPr>
+      </w:pPr>
+      <w:r>
+        <w:rPr>
+          <w:rFonts w:ascii="Times New Roman" w:hAnsi="Times New Roman" w:cs="Times New Roman"/>
+        </w:rPr>
+        <w:t xml:space="preserve">Isi dari setiap kotak sudah disesuaikan dengan konteks Kerja Praktek ini. Permasalahan yang diangkat </w:t>
+      </w:r>
+      <w:r>
+        <w:rPr>
+          <w:rFonts w:ascii="Times New Roman" w:hAnsi="Times New Roman" w:cs="Times New Roman"/>
+        </w:rPr>
+        <w:lastRenderedPageBreak/>
+        <w:t>berkaitan dengan belum adanya visualisasi berbasis data historis terkait penerimaan mahasiswa baru. Tujuan proyek dijelaskan secara langsung, yaitu merepresentasikan tren tersebut dalam bentuk visual berbasis data internal dari BPA UMP. Sementara itu, manfaat proyek disampaikan dalam konteks fungsional, yaitu untuk mendukung perencanaan strategi promosi melalui pemahaman pola penerimaan mahasiswa baru.</w:t>
       </w:r>
     </w:p>
     <w:p>
@@ -21168,7 +21809,6 @@
           <w:rFonts w:ascii="Times New Roman" w:hAnsi="Times New Roman" w:cs="Times New Roman"/>
           <w:noProof/>
         </w:rPr>
-        <w:lastRenderedPageBreak/>
         <w:drawing>
           <wp:inline distT="0" distB="0" distL="0" distR="0" wp14:anchorId="15C1CDAC" wp14:editId="090FA1E7">
             <wp:extent cx="3960000" cy="2106500"/>
@@ -21236,14 +21876,27 @@
       <w:r>
         <w:t xml:space="preserve">Gambar 3. </w:t>
       </w:r>
-      <w:fldSimple w:instr=" SEQ Gambar_3. \* ARABIC ">
-        <w:r>
-          <w:rPr>
-            <w:noProof/>
-          </w:rPr>
-          <w:t>43</w:t>
-        </w:r>
-      </w:fldSimple>
+      <w:r>
+        <w:fldChar w:fldCharType="begin"/>
+      </w:r>
+      <w:r>
+        <w:instrText xml:space="preserve"> SEQ Gambar_3. \* ARABIC </w:instrText>
+      </w:r>
+      <w:r>
+        <w:fldChar w:fldCharType="separate"/>
+      </w:r>
+      <w:r>
+        <w:rPr>
+          <w:noProof/>
+        </w:rPr>
+        <w:t>43</w:t>
+      </w:r>
+      <w:r>
+        <w:rPr>
+          <w:noProof/>
+        </w:rPr>
+        <w:fldChar w:fldCharType="end"/>
+      </w:r>
       <w:r>
         <w:t xml:space="preserve"> </w:t>
       </w:r>
@@ -21256,28 +21909,12 @@
     </w:p>
     <w:p>
       <w:pPr>
-        <w:pStyle w:val="ListParagraph"/>
-        <w:numPr>
-          <w:ilvl w:val="1"/>
-          <w:numId w:val="28"/>
-        </w:numPr>
-        <w:spacing w:line="480" w:lineRule="auto"/>
-        <w:rPr>
-          <w:rFonts w:ascii="Times New Roman" w:hAnsi="Times New Roman" w:cs="Times New Roman"/>
-        </w:rPr>
-      </w:pPr>
-      <w:r>
-        <w:rPr>
-          <w:rFonts w:ascii="Times New Roman" w:hAnsi="Times New Roman" w:cs="Times New Roman"/>
-          <w:i/>
-          <w:iCs/>
-        </w:rPr>
+        <w:pStyle w:val="Heading8"/>
+      </w:pPr>
+      <w:r>
         <w:t>Data pipeline</w:t>
       </w:r>
       <w:r>
-        <w:rPr>
-          <w:rFonts w:ascii="Times New Roman" w:hAnsi="Times New Roman" w:cs="Times New Roman"/>
-        </w:rPr>
         <w:t xml:space="preserve"> utama</w:t>
       </w:r>
     </w:p>
@@ -21295,31 +21932,43 @@
         <w:rPr>
           <w:rFonts w:ascii="Times New Roman" w:hAnsi="Times New Roman" w:cs="Times New Roman"/>
         </w:rPr>
-        <w:t xml:space="preserve">Bagian ini dirancang untuk memberikan pemahaman </w:t>
-      </w:r>
-      <w:r>
-        <w:rPr>
-          <w:rFonts w:ascii="Times New Roman" w:hAnsi="Times New Roman" w:cs="Times New Roman"/>
-        </w:rPr>
-        <w:t xml:space="preserve">singkat </w:t>
-      </w:r>
-      <w:r>
-        <w:rPr>
-          <w:rFonts w:ascii="Times New Roman" w:hAnsi="Times New Roman" w:cs="Times New Roman"/>
-        </w:rPr>
-        <w:t>terkait aliran data</w:t>
-      </w:r>
-      <w:r>
-        <w:rPr>
-          <w:rFonts w:ascii="Times New Roman" w:hAnsi="Times New Roman" w:cs="Times New Roman"/>
-        </w:rPr>
-        <w:t xml:space="preserve"> pada proyek ini</w:t>
-      </w:r>
-      <w:r>
-        <w:rPr>
-          <w:rFonts w:ascii="Times New Roman" w:hAnsi="Times New Roman" w:cs="Times New Roman"/>
-        </w:rPr>
-        <w:t xml:space="preserve"> dari sumber data hingga data itu dikonsumsi.</w:t>
+        <w:t xml:space="preserve">Bagian </w:t>
+      </w:r>
+      <w:r>
+        <w:rPr>
+          <w:rFonts w:ascii="Times New Roman" w:hAnsi="Times New Roman" w:cs="Times New Roman"/>
+        </w:rPr>
+        <w:t>pada gambar 3.44</w:t>
+      </w:r>
+      <w:r>
+        <w:rPr>
+          <w:rFonts w:ascii="Times New Roman" w:hAnsi="Times New Roman" w:cs="Times New Roman"/>
+        </w:rPr>
+        <w:t xml:space="preserve"> dirancang untuk memberikan pemahaman singkat terkait alur data yang digunakan dalam proyek, mulai dari tahap awal pengumpulan hingga tahap akhir di mana data digunakan dalam visualisasi. Terdapat tiga tahapan utama yang ditampilkan, yaitu Pengumpulan Data, Pre-processing Data, </w:t>
+      </w:r>
+      <w:r>
+        <w:rPr>
+          <w:rFonts w:ascii="Times New Roman" w:hAnsi="Times New Roman" w:cs="Times New Roman"/>
+        </w:rPr>
+        <w:lastRenderedPageBreak/>
+        <w:t>dan Visualisasi. Ketiganya disusun secara horizontal dalam bentuk kotak informasi agar mudah dipahami alurnya oleh pengunjung halaman.</w:t>
+      </w:r>
+    </w:p>
+    <w:p>
+      <w:pPr>
+        <w:pStyle w:val="ListParagraph"/>
+        <w:spacing w:line="480" w:lineRule="auto"/>
+        <w:ind w:left="2160" w:firstLine="720"/>
+        <w:jc w:val="both"/>
+        <w:rPr>
+          <w:rFonts w:ascii="Times New Roman" w:hAnsi="Times New Roman" w:cs="Times New Roman"/>
+        </w:rPr>
+      </w:pPr>
+      <w:r>
+        <w:rPr>
+          <w:rFonts w:ascii="Times New Roman" w:hAnsi="Times New Roman" w:cs="Times New Roman"/>
+        </w:rPr>
+        <w:t>Setiap tahap dilengkapi dengan ikon dan deskripsi singkat yang menggambarkan peran masing-masing dalam proses pengolahan data. Penjelasan ini membantu pengguna memahami bagaimana data mentah yang berasal dari mitra proyek (BPA UMP) diolah secara bertahap hingga menghasilkan visualisasi dashboard sebagai produk akhir.</w:t>
       </w:r>
     </w:p>
     <w:p>
@@ -21402,14 +22051,27 @@
       <w:r>
         <w:t xml:space="preserve">Gambar 3. </w:t>
       </w:r>
-      <w:fldSimple w:instr=" SEQ Gambar_3. \* ARABIC ">
-        <w:r>
-          <w:rPr>
-            <w:noProof/>
-          </w:rPr>
-          <w:t>44</w:t>
-        </w:r>
-      </w:fldSimple>
+      <w:r>
+        <w:fldChar w:fldCharType="begin"/>
+      </w:r>
+      <w:r>
+        <w:instrText xml:space="preserve"> SEQ Gambar_3. \* ARABIC </w:instrText>
+      </w:r>
+      <w:r>
+        <w:fldChar w:fldCharType="separate"/>
+      </w:r>
+      <w:r>
+        <w:rPr>
+          <w:noProof/>
+        </w:rPr>
+        <w:t>44</w:t>
+      </w:r>
+      <w:r>
+        <w:rPr>
+          <w:noProof/>
+        </w:rPr>
+        <w:fldChar w:fldCharType="end"/>
+      </w:r>
       <w:r>
         <w:t xml:space="preserve"> </w:t>
       </w:r>
@@ -21422,36 +22084,15 @@
     </w:p>
     <w:p>
       <w:pPr>
-        <w:pStyle w:val="ListParagraph"/>
-        <w:numPr>
-          <w:ilvl w:val="1"/>
-          <w:numId w:val="28"/>
-        </w:numPr>
-        <w:spacing w:line="480" w:lineRule="auto"/>
-        <w:rPr>
-          <w:rFonts w:ascii="Times New Roman" w:hAnsi="Times New Roman" w:cs="Times New Roman"/>
-        </w:rPr>
-      </w:pPr>
-      <w:r>
-        <w:rPr>
-          <w:rFonts w:ascii="Times New Roman" w:hAnsi="Times New Roman" w:cs="Times New Roman"/>
-          <w:i/>
-          <w:iCs/>
-        </w:rPr>
+        <w:pStyle w:val="Heading8"/>
+      </w:pPr>
+      <w:r>
         <w:t>Funfact</w:t>
       </w:r>
       <w:r>
-        <w:rPr>
-          <w:rFonts w:ascii="Times New Roman" w:hAnsi="Times New Roman" w:cs="Times New Roman"/>
-        </w:rPr>
         <w:t xml:space="preserve"> dalam </w:t>
       </w:r>
       <w:r>
-        <w:rPr>
-          <w:rFonts w:ascii="Times New Roman" w:hAnsi="Times New Roman" w:cs="Times New Roman"/>
-          <w:i/>
-          <w:iCs/>
-        </w:rPr>
         <w:t>dataset</w:t>
       </w:r>
     </w:p>
@@ -21469,7 +22110,19 @@
         <w:rPr>
           <w:rFonts w:ascii="Times New Roman" w:hAnsi="Times New Roman" w:cs="Times New Roman"/>
         </w:rPr>
-        <w:t xml:space="preserve">Bagian ini dirancang untuk memberikan beberapa </w:t>
+        <w:t xml:space="preserve">Bagian </w:t>
+      </w:r>
+      <w:r>
+        <w:rPr>
+          <w:rFonts w:ascii="Times New Roman" w:hAnsi="Times New Roman" w:cs="Times New Roman"/>
+        </w:rPr>
+        <w:t>pada gambar 3.45</w:t>
+      </w:r>
+      <w:r>
+        <w:rPr>
+          <w:rFonts w:ascii="Times New Roman" w:hAnsi="Times New Roman" w:cs="Times New Roman"/>
+        </w:rPr>
+        <w:t xml:space="preserve"> dirancang untuk memberikan informasi menarik seputar </w:t>
       </w:r>
       <w:r>
         <w:rPr>
@@ -21477,13 +22130,70 @@
           <w:i/>
           <w:iCs/>
         </w:rPr>
-        <w:t>funfact</w:t>
-      </w:r>
-      <w:r>
-        <w:rPr>
-          <w:rFonts w:ascii="Times New Roman" w:hAnsi="Times New Roman" w:cs="Times New Roman"/>
-        </w:rPr>
-        <w:t xml:space="preserve"> tentang dataset yang digunakan pada proyek ini.</w:t>
+        <w:t>dataset</w:t>
+      </w:r>
+      <w:r>
+        <w:rPr>
+          <w:rFonts w:ascii="Times New Roman" w:hAnsi="Times New Roman" w:cs="Times New Roman"/>
+        </w:rPr>
+        <w:t xml:space="preserve"> yang digunakan dalam proyek. Informasi tersebut disajikan dalam bentuk angka-angka penting (</w:t>
+      </w:r>
+      <w:r>
+        <w:rPr>
+          <w:rFonts w:ascii="Times New Roman" w:hAnsi="Times New Roman" w:cs="Times New Roman"/>
+          <w:i/>
+          <w:iCs/>
+        </w:rPr>
+        <w:t>key metrics</w:t>
+      </w:r>
+      <w:r>
+        <w:rPr>
+          <w:rFonts w:ascii="Times New Roman" w:hAnsi="Times New Roman" w:cs="Times New Roman"/>
+        </w:rPr>
+        <w:t xml:space="preserve">) seperti total data mahasiswa, jumlah fakultas, jumlah program studi, dan total </w:t>
+      </w:r>
+      <w:r>
+        <w:rPr>
+          <w:rFonts w:ascii="Times New Roman" w:hAnsi="Times New Roman" w:cs="Times New Roman"/>
+        </w:rPr>
+        <w:lastRenderedPageBreak/>
+        <w:t>jalur masuk.</w:t>
+      </w:r>
+      <w:r>
+        <w:rPr>
+          <w:rFonts w:ascii="Times New Roman" w:hAnsi="Times New Roman" w:cs="Times New Roman"/>
+        </w:rPr>
+        <w:t xml:space="preserve"> </w:t>
+      </w:r>
+      <w:r>
+        <w:rPr>
+          <w:rFonts w:ascii="Times New Roman" w:hAnsi="Times New Roman" w:cs="Times New Roman"/>
+          <w:i/>
+          <w:iCs/>
+        </w:rPr>
+        <w:t xml:space="preserve">Fun </w:t>
+      </w:r>
+      <w:r>
+        <w:rPr>
+          <w:rFonts w:ascii="Times New Roman" w:hAnsi="Times New Roman" w:cs="Times New Roman"/>
+          <w:i/>
+          <w:iCs/>
+        </w:rPr>
+        <w:t>f</w:t>
+      </w:r>
+      <w:r>
+        <w:rPr>
+          <w:rFonts w:ascii="Times New Roman" w:hAnsi="Times New Roman" w:cs="Times New Roman"/>
+          <w:i/>
+          <w:iCs/>
+        </w:rPr>
+        <w:t>act</w:t>
+      </w:r>
+      <w:r>
+        <w:rPr>
+          <w:rFonts w:ascii="Times New Roman" w:hAnsi="Times New Roman" w:cs="Times New Roman"/>
+        </w:rPr>
+        <w:t xml:space="preserve"> ini tidak hanya memperkuat konteks dari visualisasi yang ditampilkan, tetapi juga membantu audiens mendapatkan gambaran cepat mengenai skala dan cakupan data yang digunakan dalam proyek.</w:t>
       </w:r>
     </w:p>
     <w:p>
@@ -21499,7 +22209,6 @@
           <w:rFonts w:ascii="Times New Roman" w:hAnsi="Times New Roman" w:cs="Times New Roman"/>
           <w:noProof/>
         </w:rPr>
-        <w:lastRenderedPageBreak/>
         <w:drawing>
           <wp:inline distT="0" distB="0" distL="0" distR="0" wp14:anchorId="35CB2379" wp14:editId="6AC7FC5A">
             <wp:extent cx="3960000" cy="2104500"/>
@@ -21567,14 +22276,27 @@
       <w:r>
         <w:t xml:space="preserve">Gambar 3. </w:t>
       </w:r>
-      <w:fldSimple w:instr=" SEQ Gambar_3. \* ARABIC ">
-        <w:r>
-          <w:rPr>
-            <w:noProof/>
-          </w:rPr>
-          <w:t>45</w:t>
-        </w:r>
-      </w:fldSimple>
+      <w:r>
+        <w:fldChar w:fldCharType="begin"/>
+      </w:r>
+      <w:r>
+        <w:instrText xml:space="preserve"> SEQ Gambar_3. \* ARABIC </w:instrText>
+      </w:r>
+      <w:r>
+        <w:fldChar w:fldCharType="separate"/>
+      </w:r>
+      <w:r>
+        <w:rPr>
+          <w:noProof/>
+        </w:rPr>
+        <w:t>45</w:t>
+      </w:r>
+      <w:r>
+        <w:rPr>
+          <w:noProof/>
+        </w:rPr>
+        <w:fldChar w:fldCharType="end"/>
+      </w:r>
       <w:r>
         <w:t xml:space="preserve"> </w:t>
       </w:r>
@@ -21587,28 +22309,12 @@
     </w:p>
     <w:p>
       <w:pPr>
-        <w:pStyle w:val="ListParagraph"/>
-        <w:numPr>
-          <w:ilvl w:val="1"/>
-          <w:numId w:val="28"/>
-        </w:numPr>
-        <w:spacing w:line="480" w:lineRule="auto"/>
-        <w:rPr>
-          <w:rFonts w:ascii="Times New Roman" w:hAnsi="Times New Roman" w:cs="Times New Roman"/>
-        </w:rPr>
-      </w:pPr>
-      <w:r>
-        <w:rPr>
-          <w:rFonts w:ascii="Times New Roman" w:hAnsi="Times New Roman" w:cs="Times New Roman"/>
-          <w:i/>
-          <w:iCs/>
-        </w:rPr>
+        <w:pStyle w:val="Heading8"/>
+      </w:pPr>
+      <w:r>
         <w:t>Brainstorming dashboard</w:t>
       </w:r>
       <w:r>
-        <w:rPr>
-          <w:rFonts w:ascii="Times New Roman" w:hAnsi="Times New Roman" w:cs="Times New Roman"/>
-        </w:rPr>
         <w:t xml:space="preserve"> visualisasi</w:t>
       </w:r>
     </w:p>
@@ -21626,13 +22332,155 @@
         <w:rPr>
           <w:rFonts w:ascii="Times New Roman" w:hAnsi="Times New Roman" w:cs="Times New Roman"/>
         </w:rPr>
-        <w:t xml:space="preserve">Bagian ini dirancang untuk </w:t>
-      </w:r>
-      <w:r>
-        <w:rPr>
-          <w:rFonts w:ascii="Times New Roman" w:hAnsi="Times New Roman" w:cs="Times New Roman"/>
-        </w:rPr>
-        <w:t>memberikan pemahaman tentang brainstorming yang digunakan saat tahap visualisasi pada proyek ini.</w:t>
+        <w:t xml:space="preserve">Bagian </w:t>
+      </w:r>
+      <w:r>
+        <w:rPr>
+          <w:rFonts w:ascii="Times New Roman" w:hAnsi="Times New Roman" w:cs="Times New Roman"/>
+        </w:rPr>
+        <w:t>pada gambar 3.46</w:t>
+      </w:r>
+      <w:r>
+        <w:rPr>
+          <w:rFonts w:ascii="Times New Roman" w:hAnsi="Times New Roman" w:cs="Times New Roman"/>
+        </w:rPr>
+        <w:t xml:space="preserve"> dirancang untuk memberikan pemahaman tentang proses </w:t>
+      </w:r>
+      <w:r>
+        <w:rPr>
+          <w:rFonts w:ascii="Times New Roman" w:hAnsi="Times New Roman" w:cs="Times New Roman"/>
+          <w:i/>
+          <w:iCs/>
+        </w:rPr>
+        <w:t>brainstorming</w:t>
+      </w:r>
+      <w:r>
+        <w:rPr>
+          <w:rFonts w:ascii="Times New Roman" w:hAnsi="Times New Roman" w:cs="Times New Roman"/>
+        </w:rPr>
+        <w:t xml:space="preserve"> yang dilakukan sebelum pembuatan </w:t>
+      </w:r>
+      <w:r>
+        <w:rPr>
+          <w:rFonts w:ascii="Times New Roman" w:hAnsi="Times New Roman" w:cs="Times New Roman"/>
+          <w:i/>
+          <w:iCs/>
+        </w:rPr>
+        <w:t>dashboard</w:t>
+      </w:r>
+      <w:r>
+        <w:rPr>
+          <w:rFonts w:ascii="Times New Roman" w:hAnsi="Times New Roman" w:cs="Times New Roman"/>
+        </w:rPr>
+        <w:t xml:space="preserve"> visualisasi. </w:t>
+      </w:r>
+      <w:r>
+        <w:rPr>
+          <w:rFonts w:ascii="Times New Roman" w:hAnsi="Times New Roman" w:cs="Times New Roman"/>
+          <w:i/>
+          <w:iCs/>
+        </w:rPr>
+        <w:t>Brainstorming</w:t>
+      </w:r>
+      <w:r>
+        <w:rPr>
+          <w:rFonts w:ascii="Times New Roman" w:hAnsi="Times New Roman" w:cs="Times New Roman"/>
+        </w:rPr>
+        <w:t xml:space="preserve"> bertujuan untuk menentukan fokus utama dari masing-masing </w:t>
+      </w:r>
+      <w:r>
+        <w:rPr>
+          <w:rFonts w:ascii="Times New Roman" w:hAnsi="Times New Roman" w:cs="Times New Roman"/>
+          <w:i/>
+          <w:iCs/>
+        </w:rPr>
+        <w:t>dashboard</w:t>
+      </w:r>
+      <w:r>
+        <w:rPr>
+          <w:rFonts w:ascii="Times New Roman" w:hAnsi="Times New Roman" w:cs="Times New Roman"/>
+        </w:rPr>
+        <w:t>, informasi apa saja yang akan ditampilkan, serta bagaimana struktur visualisasinya agar sesuai dengan kebutuhan mitra.</w:t>
+      </w:r>
+    </w:p>
+    <w:p>
+      <w:pPr>
+        <w:pStyle w:val="ListParagraph"/>
+        <w:spacing w:line="480" w:lineRule="auto"/>
+        <w:ind w:left="2160" w:firstLine="720"/>
+        <w:jc w:val="both"/>
+        <w:rPr>
+          <w:rFonts w:ascii="Times New Roman" w:hAnsi="Times New Roman" w:cs="Times New Roman"/>
+        </w:rPr>
+      </w:pPr>
+      <w:r>
+        <w:rPr>
+          <w:rFonts w:ascii="Times New Roman" w:hAnsi="Times New Roman" w:cs="Times New Roman"/>
+        </w:rPr>
+        <w:t xml:space="preserve">Dalam bagian ini ditampilkan dua kategori utama, yaitu </w:t>
+      </w:r>
+      <w:r>
+        <w:rPr>
+          <w:rFonts w:ascii="Times New Roman" w:hAnsi="Times New Roman" w:cs="Times New Roman"/>
+          <w:i/>
+          <w:iCs/>
+        </w:rPr>
+        <w:t>Dashboard</w:t>
+      </w:r>
+      <w:r>
+        <w:rPr>
+          <w:rFonts w:ascii="Times New Roman" w:hAnsi="Times New Roman" w:cs="Times New Roman"/>
+        </w:rPr>
+        <w:t xml:space="preserve"> Overview dan </w:t>
+      </w:r>
+      <w:r>
+        <w:rPr>
+          <w:rFonts w:ascii="Times New Roman" w:hAnsi="Times New Roman" w:cs="Times New Roman"/>
+          <w:i/>
+          <w:iCs/>
+        </w:rPr>
+        <w:t>Dashboard</w:t>
+      </w:r>
+      <w:r>
+        <w:rPr>
+          <w:rFonts w:ascii="Times New Roman" w:hAnsi="Times New Roman" w:cs="Times New Roman"/>
+        </w:rPr>
+        <w:t xml:space="preserve"> Demografi. Masing-masing disertai dengan deskripsi singkat dan poin-</w:t>
+      </w:r>
+      <w:r>
+        <w:rPr>
+          <w:rFonts w:ascii="Times New Roman" w:hAnsi="Times New Roman" w:cs="Times New Roman"/>
+        </w:rPr>
+        <w:lastRenderedPageBreak/>
+        <w:t>poin penting (</w:t>
+      </w:r>
+      <w:r>
+        <w:rPr>
+          <w:rFonts w:ascii="Times New Roman" w:hAnsi="Times New Roman" w:cs="Times New Roman"/>
+          <w:i/>
+          <w:iCs/>
+        </w:rPr>
+        <w:t>KPIs</w:t>
+      </w:r>
+      <w:r>
+        <w:rPr>
+          <w:rFonts w:ascii="Times New Roman" w:hAnsi="Times New Roman" w:cs="Times New Roman"/>
+        </w:rPr>
+        <w:t xml:space="preserve">) yang menjadi dasar perancangan visualisasinya. Selain itu, gambar tangkapan layar dari masing-masing </w:t>
+      </w:r>
+      <w:r>
+        <w:rPr>
+          <w:rFonts w:ascii="Times New Roman" w:hAnsi="Times New Roman" w:cs="Times New Roman"/>
+          <w:i/>
+          <w:iCs/>
+        </w:rPr>
+        <w:t>dashboard</w:t>
+      </w:r>
+      <w:r>
+        <w:rPr>
+          <w:rFonts w:ascii="Times New Roman" w:hAnsi="Times New Roman" w:cs="Times New Roman"/>
+        </w:rPr>
+        <w:t xml:space="preserve"> turut ditampilkan untuk memberikan gambaran konkret terhadap hasil akhir visualisasi yang dirancang.</w:t>
       </w:r>
     </w:p>
     <w:p>
@@ -21715,14 +22563,27 @@
       <w:r>
         <w:t xml:space="preserve">Gambar 3. </w:t>
       </w:r>
-      <w:fldSimple w:instr=" SEQ Gambar_3. \* ARABIC ">
-        <w:r>
-          <w:rPr>
-            <w:noProof/>
-          </w:rPr>
-          <w:t>46</w:t>
-        </w:r>
-      </w:fldSimple>
+      <w:r>
+        <w:fldChar w:fldCharType="begin"/>
+      </w:r>
+      <w:r>
+        <w:instrText xml:space="preserve"> SEQ Gambar_3. \* ARABIC </w:instrText>
+      </w:r>
+      <w:r>
+        <w:fldChar w:fldCharType="separate"/>
+      </w:r>
+      <w:r>
+        <w:rPr>
+          <w:noProof/>
+        </w:rPr>
+        <w:t>46</w:t>
+      </w:r>
+      <w:r>
+        <w:rPr>
+          <w:noProof/>
+        </w:rPr>
+        <w:fldChar w:fldCharType="end"/>
+      </w:r>
       <w:r>
         <w:t xml:space="preserve"> </w:t>
       </w:r>
@@ -21735,20 +22596,9 @@
     </w:p>
     <w:p>
       <w:pPr>
-        <w:pStyle w:val="ListParagraph"/>
-        <w:numPr>
-          <w:ilvl w:val="1"/>
-          <w:numId w:val="28"/>
-        </w:numPr>
-        <w:spacing w:line="480" w:lineRule="auto"/>
-        <w:rPr>
-          <w:rFonts w:ascii="Times New Roman" w:hAnsi="Times New Roman" w:cs="Times New Roman"/>
-        </w:rPr>
-      </w:pPr>
-      <w:r>
-        <w:rPr>
-          <w:rFonts w:ascii="Times New Roman" w:hAnsi="Times New Roman" w:cs="Times New Roman"/>
-        </w:rPr>
+        <w:pStyle w:val="Heading8"/>
+      </w:pPr>
+      <w:r>
         <w:t>Ucapan terimakasih</w:t>
       </w:r>
     </w:p>
@@ -21766,7 +22616,38 @@
         <w:rPr>
           <w:rFonts w:ascii="Times New Roman" w:hAnsi="Times New Roman" w:cs="Times New Roman"/>
         </w:rPr>
-        <w:t>Bagian ini dirancang untuk menyampaikan ucapan terimakasih penulis kepada mitra proyek.</w:t>
+        <w:t xml:space="preserve">Bagian </w:t>
+      </w:r>
+      <w:r>
+        <w:rPr>
+          <w:rFonts w:ascii="Times New Roman" w:hAnsi="Times New Roman" w:cs="Times New Roman"/>
+        </w:rPr>
+        <w:t>pada gambar 4.4</w:t>
+      </w:r>
+      <w:r>
+        <w:rPr>
+          <w:rFonts w:ascii="Times New Roman" w:hAnsi="Times New Roman" w:cs="Times New Roman"/>
+        </w:rPr>
+        <w:t>7</w:t>
+      </w:r>
+      <w:r>
+        <w:rPr>
+          <w:rFonts w:ascii="Times New Roman" w:hAnsi="Times New Roman" w:cs="Times New Roman"/>
+        </w:rPr>
+        <w:t xml:space="preserve"> </w:t>
+      </w:r>
+      <w:r>
+        <w:rPr>
+          <w:rFonts w:ascii="Times New Roman" w:hAnsi="Times New Roman" w:cs="Times New Roman"/>
+        </w:rPr>
+        <w:t xml:space="preserve">dirancang untuk menyampaikan apresiasi dan ucapan terima kasih dari penulis kepada mitra proyek, yaitu Biro Publikasi dan Admisi (BPA) Universitas Muhammadiyah Purwokerto. Ucapan ini ditujukan kepada pimpinan maupun staf yang telah memberikan dukungan, kemudahan akses data, serta bimbingan selama proses pengerjaan proyek berlangsung. Kehadiran bagian ini juga menjadi bentuk penghargaan </w:t>
+      </w:r>
+      <w:r>
+        <w:rPr>
+          <w:rFonts w:ascii="Times New Roman" w:hAnsi="Times New Roman" w:cs="Times New Roman"/>
+        </w:rPr>
+        <w:lastRenderedPageBreak/>
+        <w:t>terhadap kontribusi mitra dalam kelancaran pelaksanaan Kerja Praktek.</w:t>
       </w:r>
     </w:p>
     <w:p>
@@ -21782,7 +22663,6 @@
           <w:rFonts w:ascii="Times New Roman" w:hAnsi="Times New Roman" w:cs="Times New Roman"/>
           <w:noProof/>
         </w:rPr>
-        <w:lastRenderedPageBreak/>
         <w:drawing>
           <wp:inline distT="0" distB="0" distL="0" distR="0" wp14:anchorId="1BCAA558" wp14:editId="1AD5DCA7">
             <wp:extent cx="3960000" cy="2104500"/>
@@ -21850,14 +22730,27 @@
       <w:r>
         <w:t xml:space="preserve">Gambar 3. </w:t>
       </w:r>
-      <w:fldSimple w:instr=" SEQ Gambar_3. \* ARABIC ">
-        <w:r>
-          <w:rPr>
-            <w:noProof/>
-          </w:rPr>
-          <w:t>47</w:t>
-        </w:r>
-      </w:fldSimple>
+      <w:r>
+        <w:fldChar w:fldCharType="begin"/>
+      </w:r>
+      <w:r>
+        <w:instrText xml:space="preserve"> SEQ Gambar_3. \* ARABIC </w:instrText>
+      </w:r>
+      <w:r>
+        <w:fldChar w:fldCharType="separate"/>
+      </w:r>
+      <w:r>
+        <w:rPr>
+          <w:noProof/>
+        </w:rPr>
+        <w:t>47</w:t>
+      </w:r>
+      <w:r>
+        <w:rPr>
+          <w:noProof/>
+        </w:rPr>
+        <w:fldChar w:fldCharType="end"/>
+      </w:r>
       <w:r>
         <w:t xml:space="preserve"> </w:t>
       </w:r>
@@ -21870,28 +22763,12 @@
     </w:p>
     <w:p>
       <w:pPr>
-        <w:pStyle w:val="ListParagraph"/>
-        <w:numPr>
-          <w:ilvl w:val="1"/>
-          <w:numId w:val="28"/>
-        </w:numPr>
-        <w:spacing w:line="480" w:lineRule="auto"/>
-        <w:rPr>
-          <w:rFonts w:ascii="Times New Roman" w:hAnsi="Times New Roman" w:cs="Times New Roman"/>
-        </w:rPr>
-      </w:pPr>
-      <w:r>
-        <w:rPr>
-          <w:rFonts w:ascii="Times New Roman" w:hAnsi="Times New Roman" w:cs="Times New Roman"/>
-          <w:i/>
-          <w:iCs/>
-        </w:rPr>
+        <w:pStyle w:val="Heading8"/>
+      </w:pPr>
+      <w:r>
         <w:t>Watermark</w:t>
       </w:r>
       <w:r>
-        <w:rPr>
-          <w:rFonts w:ascii="Times New Roman" w:hAnsi="Times New Roman" w:cs="Times New Roman"/>
-        </w:rPr>
         <w:t xml:space="preserve"> penulis</w:t>
       </w:r>
     </w:p>
@@ -21909,25 +22786,75 @@
         <w:rPr>
           <w:rFonts w:ascii="Times New Roman" w:hAnsi="Times New Roman" w:cs="Times New Roman"/>
         </w:rPr>
-        <w:t>Bagian ini dirancang untuk memberikan label penulis</w:t>
-      </w:r>
-      <w:r>
-        <w:rPr>
-          <w:rFonts w:ascii="Times New Roman" w:hAnsi="Times New Roman" w:cs="Times New Roman"/>
-        </w:rPr>
-        <w:t xml:space="preserve"> pada proyek</w:t>
-      </w:r>
-      <w:r>
-        <w:rPr>
-          <w:rFonts w:ascii="Times New Roman" w:hAnsi="Times New Roman" w:cs="Times New Roman"/>
-        </w:rPr>
-        <w:t xml:space="preserve"> ini</w:t>
-      </w:r>
-      <w:r>
-        <w:rPr>
-          <w:rFonts w:ascii="Times New Roman" w:hAnsi="Times New Roman" w:cs="Times New Roman"/>
-        </w:rPr>
-        <w:t>.</w:t>
+        <w:t xml:space="preserve">Bagian </w:t>
+      </w:r>
+      <w:r>
+        <w:rPr>
+          <w:rFonts w:ascii="Times New Roman" w:hAnsi="Times New Roman" w:cs="Times New Roman"/>
+        </w:rPr>
+        <w:t>pada gambar 3.47</w:t>
+      </w:r>
+      <w:r>
+        <w:rPr>
+          <w:rFonts w:ascii="Times New Roman" w:hAnsi="Times New Roman" w:cs="Times New Roman"/>
+        </w:rPr>
+        <w:t xml:space="preserve"> dirancang untuk memberikan label identitas penulis pada proyek ini. </w:t>
+      </w:r>
+      <w:r>
+        <w:rPr>
+          <w:rFonts w:ascii="Times New Roman" w:hAnsi="Times New Roman" w:cs="Times New Roman"/>
+          <w:i/>
+          <w:iCs/>
+        </w:rPr>
+        <w:t>Watermark</w:t>
+      </w:r>
+      <w:r>
+        <w:rPr>
+          <w:rFonts w:ascii="Times New Roman" w:hAnsi="Times New Roman" w:cs="Times New Roman"/>
+        </w:rPr>
+        <w:t xml:space="preserve"> ini berisi informasi singkat berupa nama penulis dan tahun pembuatan proyek, yang ditempatkan pada bagian bawah halaman (</w:t>
+      </w:r>
+      <w:r>
+        <w:rPr>
+          <w:rFonts w:ascii="Times New Roman" w:hAnsi="Times New Roman" w:cs="Times New Roman"/>
+          <w:i/>
+          <w:iCs/>
+        </w:rPr>
+        <w:t>footer</w:t>
+      </w:r>
+      <w:r>
+        <w:rPr>
+          <w:rFonts w:ascii="Times New Roman" w:hAnsi="Times New Roman" w:cs="Times New Roman"/>
+        </w:rPr>
+        <w:t xml:space="preserve">). Penambahan </w:t>
+      </w:r>
+      <w:r>
+        <w:rPr>
+          <w:rFonts w:ascii="Times New Roman" w:hAnsi="Times New Roman" w:cs="Times New Roman"/>
+          <w:i/>
+          <w:iCs/>
+        </w:rPr>
+        <w:t>watermark</w:t>
+      </w:r>
+      <w:r>
+        <w:rPr>
+          <w:rFonts w:ascii="Times New Roman" w:hAnsi="Times New Roman" w:cs="Times New Roman"/>
+        </w:rPr>
+        <w:t xml:space="preserve"> bertujuan untuk menunjukkan kepemilikan karya secara eksplisit sekaligus memberikan pengakuan terhadap pihak yang telah mengerjakan proyek visualisasi ini. Selain itu, keberadaan </w:t>
+      </w:r>
+      <w:r>
+        <w:rPr>
+          <w:rFonts w:ascii="Times New Roman" w:hAnsi="Times New Roman" w:cs="Times New Roman"/>
+          <w:i/>
+          <w:iCs/>
+        </w:rPr>
+        <w:t>watermark</w:t>
+      </w:r>
+      <w:r>
+        <w:rPr>
+          <w:rFonts w:ascii="Times New Roman" w:hAnsi="Times New Roman" w:cs="Times New Roman"/>
+        </w:rPr>
+        <w:t xml:space="preserve"> juga menjadi elemen penting untuk menjaga orisinalitas dan profesionalitas halaman yang ditampilkan.</w:t>
       </w:r>
     </w:p>
     <w:p>
@@ -21943,6 +22870,7 @@
           <w:rFonts w:ascii="Times New Roman" w:hAnsi="Times New Roman" w:cs="Times New Roman"/>
           <w:noProof/>
         </w:rPr>
+        <w:lastRenderedPageBreak/>
         <w:drawing>
           <wp:inline distT="0" distB="0" distL="0" distR="0" wp14:anchorId="72C625E9" wp14:editId="760EDE03">
             <wp:extent cx="3960000" cy="2104500"/>
@@ -22010,14 +22938,27 @@
       <w:r>
         <w:t xml:space="preserve">Gambar 3. </w:t>
       </w:r>
-      <w:fldSimple w:instr=" SEQ Gambar_3. \* ARABIC ">
-        <w:r>
-          <w:rPr>
-            <w:noProof/>
-          </w:rPr>
-          <w:t>48</w:t>
-        </w:r>
-      </w:fldSimple>
+      <w:r>
+        <w:fldChar w:fldCharType="begin"/>
+      </w:r>
+      <w:r>
+        <w:instrText xml:space="preserve"> SEQ Gambar_3. \* ARABIC </w:instrText>
+      </w:r>
+      <w:r>
+        <w:fldChar w:fldCharType="separate"/>
+      </w:r>
+      <w:r>
+        <w:rPr>
+          <w:noProof/>
+        </w:rPr>
+        <w:t>48</w:t>
+      </w:r>
+      <w:r>
+        <w:rPr>
+          <w:noProof/>
+        </w:rPr>
+        <w:fldChar w:fldCharType="end"/>
+      </w:r>
       <w:r>
         <w:t xml:space="preserve"> </w:t>
       </w:r>
@@ -22038,20 +22979,13 @@
     </w:p>
     <w:p>
       <w:pPr>
-        <w:pStyle w:val="ListParagraph"/>
+        <w:pStyle w:val="Heading8"/>
         <w:numPr>
           <w:ilvl w:val="0"/>
-          <w:numId w:val="41"/>
+          <w:numId w:val="48"/>
         </w:numPr>
-        <w:spacing w:line="480" w:lineRule="auto"/>
-        <w:rPr>
-          <w:rFonts w:ascii="Times New Roman" w:hAnsi="Times New Roman" w:cs="Times New Roman"/>
-        </w:rPr>
-      </w:pPr>
-      <w:r>
-        <w:rPr>
-          <w:rFonts w:ascii="Times New Roman" w:hAnsi="Times New Roman" w:cs="Times New Roman"/>
-        </w:rPr>
+      </w:pPr>
+      <w:r>
         <w:t>Bar navigasi</w:t>
       </w:r>
     </w:p>
@@ -22069,14 +23003,61 @@
         <w:rPr>
           <w:rFonts w:ascii="Times New Roman" w:hAnsi="Times New Roman" w:cs="Times New Roman"/>
         </w:rPr>
-        <w:t xml:space="preserve">Bar navigasi adalah tempat dimana tombol untuk berpindah halaman berada. Bar navigasi terdiri dari 3 </w:t>
-      </w:r>
-      <w:r>
-        <w:rPr>
-          <w:rFonts w:ascii="Times New Roman" w:hAnsi="Times New Roman" w:cs="Times New Roman"/>
-        </w:rPr>
-        <w:lastRenderedPageBreak/>
-        <w:t>tombol: tombol menuju halaman utama, Cara Membaca Dashboard, dan Dashboard Visualisasi.</w:t>
+        <w:t>Bar navigasi yang tertera pada gambar 3.4</w:t>
+      </w:r>
+      <w:r>
+        <w:rPr>
+          <w:rFonts w:ascii="Times New Roman" w:hAnsi="Times New Roman" w:cs="Times New Roman"/>
+        </w:rPr>
+        <w:t>9</w:t>
+      </w:r>
+      <w:r>
+        <w:rPr>
+          <w:rFonts w:ascii="Times New Roman" w:hAnsi="Times New Roman" w:cs="Times New Roman"/>
+        </w:rPr>
+        <w:t xml:space="preserve"> adalah tempat dimana tombol untuk berpindah halaman berada. Bar navigasi terdiri dari 3 tombol: tombol menuju halaman utama, Cara Membaca Dashboard, dan Dashboard Visualisasi. Navigasi ini diletakkan di bagian atas halaman (</w:t>
+      </w:r>
+      <w:r>
+        <w:rPr>
+          <w:rFonts w:ascii="Times New Roman" w:hAnsi="Times New Roman" w:cs="Times New Roman"/>
+          <w:i/>
+          <w:iCs/>
+        </w:rPr>
+        <w:t>header</w:t>
+      </w:r>
+      <w:r>
+        <w:rPr>
+          <w:rFonts w:ascii="Times New Roman" w:hAnsi="Times New Roman" w:cs="Times New Roman"/>
+        </w:rPr>
+        <w:t xml:space="preserve">) dan tetap terlihat saat pengguna membuka halaman, sehingga memudahkan interaksi pengguna dalam mengakses informasi penting secara cepat dan efisien. Meskipun dibuat menggunakan struktur </w:t>
+      </w:r>
+      <w:r>
+        <w:rPr>
+          <w:rFonts w:ascii="Times New Roman" w:hAnsi="Times New Roman" w:cs="Times New Roman"/>
+          <w:i/>
+          <w:iCs/>
+        </w:rPr>
+        <w:t>class</w:t>
+      </w:r>
+      <w:r>
+        <w:rPr>
+          <w:rFonts w:ascii="Times New Roman" w:hAnsi="Times New Roman" w:cs="Times New Roman"/>
+        </w:rPr>
+        <w:t xml:space="preserve"> dari </w:t>
+      </w:r>
+      <w:r>
+        <w:rPr>
+          <w:rFonts w:ascii="Times New Roman" w:hAnsi="Times New Roman" w:cs="Times New Roman"/>
+          <w:i/>
+          <w:iCs/>
+        </w:rPr>
+        <w:t>template</w:t>
+      </w:r>
+      <w:r>
+        <w:rPr>
+          <w:rFonts w:ascii="Times New Roman" w:hAnsi="Times New Roman" w:cs="Times New Roman"/>
+        </w:rPr>
+        <w:t>, seluruh tautan sudah diarahkan ke halaman yang sesuai dengan fungsinya.</w:t>
       </w:r>
     </w:p>
     <w:p>
@@ -22092,6 +23073,7 @@
           <w:rFonts w:ascii="Times New Roman" w:hAnsi="Times New Roman" w:cs="Times New Roman"/>
           <w:noProof/>
         </w:rPr>
+        <w:lastRenderedPageBreak/>
         <w:drawing>
           <wp:inline distT="0" distB="0" distL="0" distR="0" wp14:anchorId="0D8026DA" wp14:editId="3E0E2AE8">
             <wp:extent cx="3960000" cy="2106000"/>
@@ -22159,14 +23141,27 @@
       <w:r>
         <w:t xml:space="preserve">Gambar 3. </w:t>
       </w:r>
-      <w:fldSimple w:instr=" SEQ Gambar_3. \* ARABIC ">
-        <w:r>
-          <w:rPr>
-            <w:noProof/>
-          </w:rPr>
-          <w:t>49</w:t>
-        </w:r>
-      </w:fldSimple>
+      <w:r>
+        <w:fldChar w:fldCharType="begin"/>
+      </w:r>
+      <w:r>
+        <w:instrText xml:space="preserve"> SEQ Gambar_3. \* ARABIC </w:instrText>
+      </w:r>
+      <w:r>
+        <w:fldChar w:fldCharType="separate"/>
+      </w:r>
+      <w:r>
+        <w:rPr>
+          <w:noProof/>
+        </w:rPr>
+        <w:t>49</w:t>
+      </w:r>
+      <w:r>
+        <w:rPr>
+          <w:noProof/>
+        </w:rPr>
+        <w:fldChar w:fldCharType="end"/>
+      </w:r>
       <w:r>
         <w:t xml:space="preserve"> </w:t>
       </w:r>
@@ -22179,20 +23174,9 @@
     </w:p>
     <w:p>
       <w:pPr>
-        <w:pStyle w:val="ListParagraph"/>
-        <w:numPr>
-          <w:ilvl w:val="0"/>
-          <w:numId w:val="41"/>
-        </w:numPr>
-        <w:spacing w:line="480" w:lineRule="auto"/>
-        <w:rPr>
-          <w:rFonts w:ascii="Times New Roman" w:hAnsi="Times New Roman" w:cs="Times New Roman"/>
-        </w:rPr>
-      </w:pPr>
-      <w:r>
-        <w:rPr>
-          <w:rFonts w:ascii="Times New Roman" w:hAnsi="Times New Roman" w:cs="Times New Roman"/>
-        </w:rPr>
+        <w:pStyle w:val="Heading8"/>
+      </w:pPr>
+      <w:r>
         <w:t>Cara membaca</w:t>
       </w:r>
     </w:p>
@@ -22210,13 +23194,67 @@
         <w:rPr>
           <w:rFonts w:ascii="Times New Roman" w:hAnsi="Times New Roman" w:cs="Times New Roman"/>
         </w:rPr>
-        <w:t>Bagian ini dirancang untuk menjelaskan cara membaca kedua dashboard visualisasi</w:t>
-      </w:r>
-      <w:r>
-        <w:rPr>
-          <w:rFonts w:ascii="Times New Roman" w:hAnsi="Times New Roman" w:cs="Times New Roman"/>
-        </w:rPr>
-        <w:t>.</w:t>
+        <w:t xml:space="preserve">Bagian </w:t>
+      </w:r>
+      <w:r>
+        <w:rPr>
+          <w:rFonts w:ascii="Times New Roman" w:hAnsi="Times New Roman" w:cs="Times New Roman"/>
+        </w:rPr>
+        <w:t>pada gambar 3.50</w:t>
+      </w:r>
+      <w:r>
+        <w:rPr>
+          <w:rFonts w:ascii="Times New Roman" w:hAnsi="Times New Roman" w:cs="Times New Roman"/>
+        </w:rPr>
+        <w:t xml:space="preserve"> dirancang untuk menjelaskan cara membaca kedua dashboard visualisasi yang telah dibuat, yaitu </w:t>
+      </w:r>
+      <w:r>
+        <w:rPr>
+          <w:rFonts w:ascii="Times New Roman" w:hAnsi="Times New Roman" w:cs="Times New Roman"/>
+        </w:rPr>
+        <w:t>d</w:t>
+      </w:r>
+      <w:r>
+        <w:rPr>
+          <w:rFonts w:ascii="Times New Roman" w:hAnsi="Times New Roman" w:cs="Times New Roman"/>
+        </w:rPr>
+        <w:t xml:space="preserve">ashboard Overview dan </w:t>
+      </w:r>
+      <w:r>
+        <w:rPr>
+          <w:rFonts w:ascii="Times New Roman" w:hAnsi="Times New Roman" w:cs="Times New Roman"/>
+          <w:i/>
+          <w:iCs/>
+        </w:rPr>
+        <w:t>d</w:t>
+      </w:r>
+      <w:r>
+        <w:rPr>
+          <w:rFonts w:ascii="Times New Roman" w:hAnsi="Times New Roman" w:cs="Times New Roman"/>
+          <w:i/>
+          <w:iCs/>
+        </w:rPr>
+        <w:t>ashboard</w:t>
+      </w:r>
+      <w:r>
+        <w:rPr>
+          <w:rFonts w:ascii="Times New Roman" w:hAnsi="Times New Roman" w:cs="Times New Roman"/>
+        </w:rPr>
+        <w:t xml:space="preserve"> Demografi. Penjelasan ini disusun untuk membantu pengguna memahami isi </w:t>
+      </w:r>
+      <w:r>
+        <w:rPr>
+          <w:rFonts w:ascii="Times New Roman" w:hAnsi="Times New Roman" w:cs="Times New Roman"/>
+          <w:i/>
+          <w:iCs/>
+        </w:rPr>
+        <w:t>dashboard</w:t>
+      </w:r>
+      <w:r>
+        <w:rPr>
+          <w:rFonts w:ascii="Times New Roman" w:hAnsi="Times New Roman" w:cs="Times New Roman"/>
+        </w:rPr>
+        <w:t>, fungsi masing-masing elemen visual, serta cara menafsirkan data yang ditampilkan.</w:t>
       </w:r>
     </w:p>
     <w:p>
@@ -22299,14 +23337,27 @@
       <w:r>
         <w:t xml:space="preserve">Gambar 3. </w:t>
       </w:r>
-      <w:fldSimple w:instr=" SEQ Gambar_3. \* ARABIC ">
-        <w:r>
-          <w:rPr>
-            <w:noProof/>
-          </w:rPr>
-          <w:t>50</w:t>
-        </w:r>
-      </w:fldSimple>
+      <w:r>
+        <w:fldChar w:fldCharType="begin"/>
+      </w:r>
+      <w:r>
+        <w:instrText xml:space="preserve"> SEQ Gambar_3. \* ARABIC </w:instrText>
+      </w:r>
+      <w:r>
+        <w:fldChar w:fldCharType="separate"/>
+      </w:r>
+      <w:r>
+        <w:rPr>
+          <w:noProof/>
+        </w:rPr>
+        <w:t>50</w:t>
+      </w:r>
+      <w:r>
+        <w:rPr>
+          <w:noProof/>
+        </w:rPr>
+        <w:fldChar w:fldCharType="end"/>
+      </w:r>
       <w:r>
         <w:t xml:space="preserve"> </w:t>
       </w:r>
@@ -22319,28 +23370,13 @@
     </w:p>
     <w:p>
       <w:pPr>
-        <w:pStyle w:val="ListParagraph"/>
-        <w:numPr>
-          <w:ilvl w:val="0"/>
-          <w:numId w:val="41"/>
-        </w:numPr>
-        <w:spacing w:line="480" w:lineRule="auto"/>
-        <w:rPr>
-          <w:rFonts w:ascii="Times New Roman" w:hAnsi="Times New Roman" w:cs="Times New Roman"/>
-        </w:rPr>
-      </w:pPr>
-      <w:r>
-        <w:rPr>
-          <w:rFonts w:ascii="Times New Roman" w:hAnsi="Times New Roman" w:cs="Times New Roman"/>
-          <w:i/>
-          <w:iCs/>
-        </w:rPr>
+        <w:pStyle w:val="Heading8"/>
+      </w:pPr>
+      <w:r>
+        <w:lastRenderedPageBreak/>
         <w:t>Matermark</w:t>
       </w:r>
       <w:r>
-        <w:rPr>
-          <w:rFonts w:ascii="Times New Roman" w:hAnsi="Times New Roman" w:cs="Times New Roman"/>
-        </w:rPr>
         <w:t xml:space="preserve"> penulis</w:t>
       </w:r>
     </w:p>
@@ -22358,8 +23394,75 @@
         <w:rPr>
           <w:rFonts w:ascii="Times New Roman" w:hAnsi="Times New Roman" w:cs="Times New Roman"/>
         </w:rPr>
-        <w:lastRenderedPageBreak/>
-        <w:t>Bagian ini dirancang untuk memberikan label penulis pada proyek ini.</w:t>
+        <w:t>Bagian pada gambar 3.</w:t>
+      </w:r>
+      <w:r>
+        <w:rPr>
+          <w:rFonts w:ascii="Times New Roman" w:hAnsi="Times New Roman" w:cs="Times New Roman"/>
+        </w:rPr>
+        <w:t>51</w:t>
+      </w:r>
+      <w:r>
+        <w:rPr>
+          <w:rFonts w:ascii="Times New Roman" w:hAnsi="Times New Roman" w:cs="Times New Roman"/>
+        </w:rPr>
+        <w:t xml:space="preserve"> dirancang untuk memberikan label identitas penulis pada proyek ini. </w:t>
+      </w:r>
+      <w:r>
+        <w:rPr>
+          <w:rFonts w:ascii="Times New Roman" w:hAnsi="Times New Roman" w:cs="Times New Roman"/>
+          <w:i/>
+          <w:iCs/>
+        </w:rPr>
+        <w:t>Watermark</w:t>
+      </w:r>
+      <w:r>
+        <w:rPr>
+          <w:rFonts w:ascii="Times New Roman" w:hAnsi="Times New Roman" w:cs="Times New Roman"/>
+        </w:rPr>
+        <w:t xml:space="preserve"> ini berisi informasi singkat berupa nama penulis dan tahun pembuatan proyek, yang ditempatkan pada bagian bawah halaman (</w:t>
+      </w:r>
+      <w:r>
+        <w:rPr>
+          <w:rFonts w:ascii="Times New Roman" w:hAnsi="Times New Roman" w:cs="Times New Roman"/>
+          <w:i/>
+          <w:iCs/>
+        </w:rPr>
+        <w:t>footer</w:t>
+      </w:r>
+      <w:r>
+        <w:rPr>
+          <w:rFonts w:ascii="Times New Roman" w:hAnsi="Times New Roman" w:cs="Times New Roman"/>
+        </w:rPr>
+        <w:t xml:space="preserve">). Penambahan </w:t>
+      </w:r>
+      <w:r>
+        <w:rPr>
+          <w:rFonts w:ascii="Times New Roman" w:hAnsi="Times New Roman" w:cs="Times New Roman"/>
+          <w:i/>
+          <w:iCs/>
+        </w:rPr>
+        <w:t>watermark</w:t>
+      </w:r>
+      <w:r>
+        <w:rPr>
+          <w:rFonts w:ascii="Times New Roman" w:hAnsi="Times New Roman" w:cs="Times New Roman"/>
+        </w:rPr>
+        <w:t xml:space="preserve"> bertujuan untuk menunjukkan kepemilikan karya secara eksplisit sekaligus memberikan pengakuan terhadap pihak yang telah mengerjakan proyek visualisasi ini. Selain itu, keberadaan </w:t>
+      </w:r>
+      <w:r>
+        <w:rPr>
+          <w:rFonts w:ascii="Times New Roman" w:hAnsi="Times New Roman" w:cs="Times New Roman"/>
+          <w:i/>
+          <w:iCs/>
+        </w:rPr>
+        <w:t>watermark</w:t>
+      </w:r>
+      <w:r>
+        <w:rPr>
+          <w:rFonts w:ascii="Times New Roman" w:hAnsi="Times New Roman" w:cs="Times New Roman"/>
+        </w:rPr>
+        <w:t xml:space="preserve"> juga menjadi elemen penting untuk menjaga orisinalitas dan profesionalitas halaman yang ditampilkan.</w:t>
       </w:r>
     </w:p>
     <w:p>
@@ -22442,14 +23545,27 @@
       <w:r>
         <w:t xml:space="preserve">Gambar 3. </w:t>
       </w:r>
-      <w:fldSimple w:instr=" SEQ Gambar_3. \* ARABIC ">
-        <w:r>
-          <w:rPr>
-            <w:noProof/>
-          </w:rPr>
-          <w:t>51</w:t>
-        </w:r>
-      </w:fldSimple>
+      <w:r>
+        <w:fldChar w:fldCharType="begin"/>
+      </w:r>
+      <w:r>
+        <w:instrText xml:space="preserve"> SEQ Gambar_3. \* ARABIC </w:instrText>
+      </w:r>
+      <w:r>
+        <w:fldChar w:fldCharType="separate"/>
+      </w:r>
+      <w:r>
+        <w:rPr>
+          <w:noProof/>
+        </w:rPr>
+        <w:t>51</w:t>
+      </w:r>
+      <w:r>
+        <w:rPr>
+          <w:noProof/>
+        </w:rPr>
+        <w:fldChar w:fldCharType="end"/>
+      </w:r>
       <w:r>
         <w:t xml:space="preserve"> </w:t>
       </w:r>
@@ -22504,6 +23620,7 @@
         </w:numPr>
       </w:pPr>
       <w:r>
+        <w:lastRenderedPageBreak/>
         <w:t>Pengumpulan data</w:t>
       </w:r>
     </w:p>
@@ -22630,7 +23747,6 @@
           <w:i/>
           <w:iCs/>
         </w:rPr>
-        <w:lastRenderedPageBreak/>
         <w:t>Preprocessing</w:t>
       </w:r>
       <w:r>
@@ -27333,6 +28449,18 @@
     </w:lvlOverride>
   </w:num>
   <w:num w:numId="46" w16cid:durableId="1534342251">
+    <w:abstractNumId w:val="24"/>
+    <w:lvlOverride w:ilvl="0">
+      <w:startOverride w:val="1"/>
+    </w:lvlOverride>
+  </w:num>
+  <w:num w:numId="47" w16cid:durableId="259533320">
+    <w:abstractNumId w:val="24"/>
+    <w:lvlOverride w:ilvl="0">
+      <w:startOverride w:val="1"/>
+    </w:lvlOverride>
+  </w:num>
+  <w:num w:numId="48" w16cid:durableId="277027401">
     <w:abstractNumId w:val="24"/>
     <w:lvlOverride w:ilvl="0">
       <w:startOverride w:val="1"/>
@@ -28624,12 +29752,14 @@
     <w:rsid w:val="00206D59"/>
     <w:rsid w:val="0029117C"/>
     <w:rsid w:val="002A4EB4"/>
+    <w:rsid w:val="002E4447"/>
     <w:rsid w:val="00462B05"/>
     <w:rsid w:val="005A7160"/>
     <w:rsid w:val="006E1BAB"/>
     <w:rsid w:val="00763159"/>
     <w:rsid w:val="0081424B"/>
     <w:rsid w:val="00966163"/>
+    <w:rsid w:val="00A00705"/>
     <w:rsid w:val="00AB1197"/>
     <w:rsid w:val="00BB0A64"/>
     <w:rsid w:val="00BB2A6A"/>
@@ -29100,10 +30230,6 @@
       <w:color w:val="666666"/>
     </w:rPr>
   </w:style>
-  <w:style w:type="paragraph" w:customStyle="1" w:styleId="BE715B3A113C4FF4BABEF85CC31B5F06">
-    <w:name w:val="BE715B3A113C4FF4BABEF85CC31B5F06"/>
-    <w:rsid w:val="00C53D3B"/>
-  </w:style>
 </w:styles>
 </file>
 

</xml_diff>

<commit_message>
abis revisi poin 18. next 19 (sudah ada jalurnya tinggal nambahin)
</commit_message>
<xml_diff>
--- a/non-website/Laporan Akhir KP/2203040182 - Dhika Ramadhan Saputra - Laporan KP - Revisi 1.docx
+++ b/non-website/Laporan Akhir KP/2203040182 - Dhika Ramadhan Saputra - Laporan KP - Revisi 1.docx
@@ -185,7 +185,6 @@
           <w:szCs w:val="22"/>
         </w:rPr>
       </w:pPr>
-      <w:proofErr w:type="gramStart"/>
       <w:r>
         <w:rPr>
           <w:rFonts w:ascii="Times New Roman" w:hAnsi="Times New Roman" w:cs="Times New Roman"/>
@@ -208,16 +207,15 @@
           <w:sz w:val="22"/>
           <w:szCs w:val="22"/>
         </w:rPr>
-        <w:t>:</w:t>
-      </w:r>
-      <w:proofErr w:type="gramEnd"/>
+        <w:t>: Dhika Ramadhan Saputra</w:t>
+      </w:r>
       <w:r>
         <w:rPr>
           <w:rFonts w:ascii="Times New Roman" w:hAnsi="Times New Roman" w:cs="Times New Roman"/>
           <w:sz w:val="22"/>
           <w:szCs w:val="22"/>
         </w:rPr>
-        <w:t xml:space="preserve"> Dhika Ramadhan Saputra</w:t>
+        <w:br/>
       </w:r>
       <w:r>
         <w:rPr>
@@ -225,16 +223,15 @@
           <w:sz w:val="22"/>
           <w:szCs w:val="22"/>
         </w:rPr>
-        <w:br/>
-      </w:r>
-      <w:proofErr w:type="gramStart"/>
+        <w:t>NIM.</w:t>
+      </w:r>
       <w:r>
         <w:rPr>
           <w:rFonts w:ascii="Times New Roman" w:hAnsi="Times New Roman" w:cs="Times New Roman"/>
           <w:sz w:val="22"/>
           <w:szCs w:val="22"/>
         </w:rPr>
-        <w:t>NIM.</w:t>
+        <w:t xml:space="preserve">  </w:t>
       </w:r>
       <w:r>
         <w:rPr>
@@ -242,24 +239,7 @@
           <w:sz w:val="22"/>
           <w:szCs w:val="22"/>
         </w:rPr>
-        <w:t xml:space="preserve">  </w:t>
-      </w:r>
-      <w:r>
-        <w:rPr>
-          <w:rFonts w:ascii="Times New Roman" w:hAnsi="Times New Roman" w:cs="Times New Roman"/>
-          <w:sz w:val="22"/>
-          <w:szCs w:val="22"/>
-        </w:rPr>
-        <w:t>:</w:t>
-      </w:r>
-      <w:proofErr w:type="gramEnd"/>
-      <w:r>
-        <w:rPr>
-          <w:rFonts w:ascii="Times New Roman" w:hAnsi="Times New Roman" w:cs="Times New Roman"/>
-          <w:sz w:val="22"/>
-          <w:szCs w:val="22"/>
-        </w:rPr>
-        <w:t xml:space="preserve"> 2203040182</w:t>
+        <w:t>: 2203040182</w:t>
       </w:r>
     </w:p>
     <w:p>
@@ -468,7 +448,6 @@
           <w:szCs w:val="22"/>
         </w:rPr>
       </w:pPr>
-      <w:proofErr w:type="gramStart"/>
       <w:r>
         <w:rPr>
           <w:rFonts w:ascii="Times New Roman" w:hAnsi="Times New Roman" w:cs="Times New Roman"/>
@@ -477,9 +456,8 @@
           <w:sz w:val="22"/>
           <w:szCs w:val="22"/>
         </w:rPr>
-        <w:t>Nama :</w:t>
-      </w:r>
-      <w:proofErr w:type="gramEnd"/>
+        <w:t xml:space="preserve">Nama : </w:t>
+      </w:r>
       <w:r>
         <w:rPr>
           <w:rFonts w:ascii="Times New Roman" w:hAnsi="Times New Roman" w:cs="Times New Roman"/>
@@ -488,9 +466,12 @@
           <w:sz w:val="22"/>
           <w:szCs w:val="22"/>
         </w:rPr>
-        <w:t xml:space="preserve"> </w:t>
-      </w:r>
-      <w:r>
+        <w:t>Dhika Ramadhan Saputra</w:t>
+      </w:r>
+    </w:p>
+    <w:p>
+      <w:pPr>
+        <w:jc w:val="center"/>
         <w:rPr>
           <w:rFonts w:ascii="Times New Roman" w:hAnsi="Times New Roman" w:cs="Times New Roman"/>
           <w:b/>
@@ -498,12 +479,8 @@
           <w:sz w:val="22"/>
           <w:szCs w:val="22"/>
         </w:rPr>
-        <w:t>Dhika Ramadhan Saputra</w:t>
-      </w:r>
-    </w:p>
-    <w:p>
-      <w:pPr>
-        <w:jc w:val="center"/>
+      </w:pPr>
+      <w:r>
         <w:rPr>
           <w:rFonts w:ascii="Times New Roman" w:hAnsi="Times New Roman" w:cs="Times New Roman"/>
           <w:b/>
@@ -511,7 +488,8 @@
           <w:sz w:val="22"/>
           <w:szCs w:val="22"/>
         </w:rPr>
-      </w:pPr>
+        <w:t xml:space="preserve">NIM. : </w:t>
+      </w:r>
       <w:r>
         <w:rPr>
           <w:rFonts w:ascii="Times New Roman" w:hAnsi="Times New Roman" w:cs="Times New Roman"/>
@@ -520,9 +498,8 @@
           <w:sz w:val="22"/>
           <w:szCs w:val="22"/>
         </w:rPr>
-        <w:t>NIM</w:t>
-      </w:r>
-      <w:proofErr w:type="gramStart"/>
+        <w:t>2203040182</w:t>
+      </w:r>
       <w:r>
         <w:rPr>
           <w:rFonts w:ascii="Times New Roman" w:hAnsi="Times New Roman" w:cs="Times New Roman"/>
@@ -531,9 +508,36 @@
           <w:sz w:val="22"/>
           <w:szCs w:val="22"/>
         </w:rPr>
-        <w:t>. :</w:t>
-      </w:r>
-      <w:proofErr w:type="gramEnd"/>
+        <w:t>.</w:t>
+      </w:r>
+    </w:p>
+    <w:p>
+      <w:pPr>
+        <w:jc w:val="center"/>
+        <w:rPr>
+          <w:rFonts w:ascii="Times New Roman" w:hAnsi="Times New Roman" w:cs="Times New Roman"/>
+          <w:sz w:val="22"/>
+          <w:szCs w:val="22"/>
+        </w:rPr>
+      </w:pPr>
+      <w:r>
+        <w:rPr>
+          <w:rFonts w:ascii="Times New Roman" w:hAnsi="Times New Roman" w:cs="Times New Roman"/>
+          <w:sz w:val="22"/>
+          <w:szCs w:val="22"/>
+        </w:rPr>
+        <w:br/>
+      </w:r>
+    </w:p>
+    <w:p>
+      <w:pPr>
+        <w:jc w:val="center"/>
+        <w:rPr>
+          <w:rFonts w:ascii="Times New Roman" w:hAnsi="Times New Roman" w:cs="Times New Roman"/>
+          <w:sz w:val="22"/>
+          <w:szCs w:val="22"/>
+        </w:rPr>
+      </w:pPr>
       <w:r>
         <w:rPr>
           <w:rFonts w:ascii="Times New Roman" w:hAnsi="Times New Roman" w:cs="Times New Roman"/>
@@ -542,8 +546,18 @@
           <w:sz w:val="22"/>
           <w:szCs w:val="22"/>
         </w:rPr>
-        <w:t xml:space="preserve"> </w:t>
-      </w:r>
+        <w:t>Laporan Kerja Praktik Mahasiswa tersebut di Atas</w:t>
+      </w:r>
+    </w:p>
+    <w:p>
+      <w:pPr>
+        <w:jc w:val="center"/>
+        <w:rPr>
+          <w:rFonts w:ascii="Times New Roman" w:hAnsi="Times New Roman" w:cs="Times New Roman"/>
+          <w:sz w:val="22"/>
+          <w:szCs w:val="22"/>
+        </w:rPr>
+      </w:pPr>
       <w:r>
         <w:rPr>
           <w:rFonts w:ascii="Times New Roman" w:hAnsi="Times New Roman" w:cs="Times New Roman"/>
@@ -552,8 +566,36 @@
           <w:sz w:val="22"/>
           <w:szCs w:val="22"/>
         </w:rPr>
-        <w:t>2203040182</w:t>
-      </w:r>
+        <w:t>Dinyatakan Telah Memenuhi Syarat untuk Diseminarkan</w:t>
+      </w:r>
+    </w:p>
+    <w:p>
+      <w:pPr>
+        <w:jc w:val="center"/>
+        <w:rPr>
+          <w:rFonts w:ascii="Times New Roman" w:hAnsi="Times New Roman" w:cs="Times New Roman"/>
+          <w:sz w:val="22"/>
+          <w:szCs w:val="22"/>
+        </w:rPr>
+      </w:pPr>
+      <w:r>
+        <w:rPr>
+          <w:rFonts w:ascii="Times New Roman" w:hAnsi="Times New Roman" w:cs="Times New Roman"/>
+          <w:sz w:val="22"/>
+          <w:szCs w:val="22"/>
+        </w:rPr>
+        <w:br/>
+      </w:r>
+    </w:p>
+    <w:p>
+      <w:pPr>
+        <w:jc w:val="center"/>
+        <w:rPr>
+          <w:rFonts w:ascii="Times New Roman" w:hAnsi="Times New Roman" w:cs="Times New Roman"/>
+          <w:sz w:val="22"/>
+          <w:szCs w:val="22"/>
+        </w:rPr>
+      </w:pPr>
       <w:r>
         <w:rPr>
           <w:rFonts w:ascii="Times New Roman" w:hAnsi="Times New Roman" w:cs="Times New Roman"/>
@@ -562,25 +604,7 @@
           <w:sz w:val="22"/>
           <w:szCs w:val="22"/>
         </w:rPr>
-        <w:t>.</w:t>
-      </w:r>
-    </w:p>
-    <w:p>
-      <w:pPr>
-        <w:jc w:val="center"/>
-        <w:rPr>
-          <w:rFonts w:ascii="Times New Roman" w:hAnsi="Times New Roman" w:cs="Times New Roman"/>
-          <w:sz w:val="22"/>
-          <w:szCs w:val="22"/>
-        </w:rPr>
-      </w:pPr>
-      <w:r>
-        <w:rPr>
-          <w:rFonts w:ascii="Times New Roman" w:hAnsi="Times New Roman" w:cs="Times New Roman"/>
-          <w:sz w:val="22"/>
-          <w:szCs w:val="22"/>
-        </w:rPr>
-        <w:br/>
+        <w:t>Disetujui  : di Purwokerto</w:t>
       </w:r>
     </w:p>
     <w:p>
@@ -600,7 +624,23 @@
           <w:sz w:val="22"/>
           <w:szCs w:val="22"/>
         </w:rPr>
-        <w:t>Laporan Kerja Praktik Mahasiswa tersebut di Atas</w:t>
+        <w:t>Tanggal : …………………..</w:t>
+      </w:r>
+      <w:r>
+        <w:rPr>
+          <w:rFonts w:ascii="Times New Roman" w:hAnsi="Times New Roman" w:cs="Times New Roman"/>
+          <w:sz w:val="22"/>
+          <w:szCs w:val="22"/>
+        </w:rPr>
+        <w:br/>
+      </w:r>
+      <w:r>
+        <w:rPr>
+          <w:rFonts w:ascii="Times New Roman" w:hAnsi="Times New Roman" w:cs="Times New Roman"/>
+          <w:sz w:val="22"/>
+          <w:szCs w:val="22"/>
+        </w:rPr>
+        <w:br/>
       </w:r>
     </w:p>
     <w:p>
@@ -620,140 +660,8 @@
           <w:sz w:val="22"/>
           <w:szCs w:val="22"/>
         </w:rPr>
-        <w:t>Dinyatakan Telah Memenuhi Syarat untuk Diseminarkan</w:t>
-      </w:r>
-    </w:p>
-    <w:p>
-      <w:pPr>
-        <w:jc w:val="center"/>
-        <w:rPr>
-          <w:rFonts w:ascii="Times New Roman" w:hAnsi="Times New Roman" w:cs="Times New Roman"/>
-          <w:sz w:val="22"/>
-          <w:szCs w:val="22"/>
-        </w:rPr>
-      </w:pPr>
-      <w:r>
-        <w:rPr>
-          <w:rFonts w:ascii="Times New Roman" w:hAnsi="Times New Roman" w:cs="Times New Roman"/>
-          <w:sz w:val="22"/>
-          <w:szCs w:val="22"/>
-        </w:rPr>
-        <w:br/>
-      </w:r>
-    </w:p>
-    <w:p>
-      <w:pPr>
-        <w:jc w:val="center"/>
-        <w:rPr>
-          <w:rFonts w:ascii="Times New Roman" w:hAnsi="Times New Roman" w:cs="Times New Roman"/>
-          <w:sz w:val="22"/>
-          <w:szCs w:val="22"/>
-        </w:rPr>
-      </w:pPr>
-      <w:proofErr w:type="gramStart"/>
-      <w:r>
-        <w:rPr>
-          <w:rFonts w:ascii="Times New Roman" w:hAnsi="Times New Roman" w:cs="Times New Roman"/>
-          <w:b/>
-          <w:bCs/>
-          <w:sz w:val="22"/>
-          <w:szCs w:val="22"/>
-        </w:rPr>
-        <w:t>Disetujui  :</w:t>
-      </w:r>
-      <w:proofErr w:type="gramEnd"/>
-      <w:r>
-        <w:rPr>
-          <w:rFonts w:ascii="Times New Roman" w:hAnsi="Times New Roman" w:cs="Times New Roman"/>
-          <w:b/>
-          <w:bCs/>
-          <w:sz w:val="22"/>
-          <w:szCs w:val="22"/>
-        </w:rPr>
-        <w:t xml:space="preserve"> di Purwokerto</w:t>
-      </w:r>
-    </w:p>
-    <w:p>
-      <w:pPr>
-        <w:jc w:val="center"/>
-        <w:rPr>
-          <w:rFonts w:ascii="Times New Roman" w:hAnsi="Times New Roman" w:cs="Times New Roman"/>
-          <w:sz w:val="22"/>
-          <w:szCs w:val="22"/>
-        </w:rPr>
-      </w:pPr>
-      <w:proofErr w:type="gramStart"/>
-      <w:r>
-        <w:rPr>
-          <w:rFonts w:ascii="Times New Roman" w:hAnsi="Times New Roman" w:cs="Times New Roman"/>
-          <w:b/>
-          <w:bCs/>
-          <w:sz w:val="22"/>
-          <w:szCs w:val="22"/>
-        </w:rPr>
-        <w:t>Tanggal :</w:t>
-      </w:r>
-      <w:proofErr w:type="gramEnd"/>
-      <w:r>
-        <w:rPr>
-          <w:rFonts w:ascii="Times New Roman" w:hAnsi="Times New Roman" w:cs="Times New Roman"/>
-          <w:b/>
-          <w:bCs/>
-          <w:sz w:val="22"/>
-          <w:szCs w:val="22"/>
-        </w:rPr>
-        <w:t xml:space="preserve"> ………………</w:t>
-      </w:r>
-      <w:proofErr w:type="gramStart"/>
-      <w:r>
-        <w:rPr>
-          <w:rFonts w:ascii="Times New Roman" w:hAnsi="Times New Roman" w:cs="Times New Roman"/>
-          <w:b/>
-          <w:bCs/>
-          <w:sz w:val="22"/>
-          <w:szCs w:val="22"/>
-        </w:rPr>
-        <w:t>…..</w:t>
-      </w:r>
-      <w:proofErr w:type="gramEnd"/>
-      <w:r>
-        <w:rPr>
-          <w:rFonts w:ascii="Times New Roman" w:hAnsi="Times New Roman" w:cs="Times New Roman"/>
-          <w:sz w:val="22"/>
-          <w:szCs w:val="22"/>
-        </w:rPr>
-        <w:br/>
-      </w:r>
-      <w:r>
-        <w:rPr>
-          <w:rFonts w:ascii="Times New Roman" w:hAnsi="Times New Roman" w:cs="Times New Roman"/>
-          <w:sz w:val="22"/>
-          <w:szCs w:val="22"/>
-        </w:rPr>
-        <w:br/>
-      </w:r>
-    </w:p>
-    <w:p>
-      <w:pPr>
-        <w:jc w:val="center"/>
-        <w:rPr>
-          <w:rFonts w:ascii="Times New Roman" w:hAnsi="Times New Roman" w:cs="Times New Roman"/>
-          <w:sz w:val="22"/>
-          <w:szCs w:val="22"/>
-        </w:rPr>
-      </w:pPr>
-      <w:proofErr w:type="gramStart"/>
-      <w:r>
-        <w:rPr>
-          <w:rFonts w:ascii="Times New Roman" w:hAnsi="Times New Roman" w:cs="Times New Roman"/>
-          <w:b/>
-          <w:bCs/>
-          <w:sz w:val="22"/>
-          <w:szCs w:val="22"/>
-        </w:rPr>
         <w:t>Oleh :</w:t>
       </w:r>
-      <w:proofErr w:type="gramEnd"/>
     </w:p>
     <w:p>
       <w:pPr>
@@ -881,27 +789,7 @@
                 <w:szCs w:val="22"/>
                 <w:u w:val="single"/>
               </w:rPr>
-              <w:t xml:space="preserve">Maulida Ayu Fitriani, </w:t>
-            </w:r>
-            <w:proofErr w:type="gramStart"/>
-            <w:r>
-              <w:rPr>
-                <w:rFonts w:ascii="Times New Roman" w:hAnsi="Times New Roman" w:cs="Times New Roman"/>
-                <w:sz w:val="22"/>
-                <w:szCs w:val="22"/>
-                <w:u w:val="single"/>
-              </w:rPr>
-              <w:t>S.Kom</w:t>
-            </w:r>
-            <w:proofErr w:type="gramEnd"/>
-            <w:r>
-              <w:rPr>
-                <w:rFonts w:ascii="Times New Roman" w:hAnsi="Times New Roman" w:cs="Times New Roman"/>
-                <w:sz w:val="22"/>
-                <w:szCs w:val="22"/>
-                <w:u w:val="single"/>
-              </w:rPr>
-              <w:t>., M.Cs.</w:t>
+              <w:t>Maulida Ayu Fitriani, S.Kom., M.Cs.</w:t>
             </w:r>
           </w:p>
           <w:p>
@@ -1246,7 +1134,6 @@
           <w:szCs w:val="20"/>
         </w:rPr>
       </w:pPr>
-      <w:proofErr w:type="gramStart"/>
       <w:r>
         <w:rPr>
           <w:rFonts w:ascii="Times New Roman" w:eastAsia="Times New Roman" w:hAnsi="Times New Roman" w:cs="Times New Roman"/>
@@ -1256,7 +1143,6 @@
         </w:rPr>
         <w:t>Disetujui :</w:t>
       </w:r>
-      <w:proofErr w:type="gramEnd"/>
     </w:p>
     <w:p>
       <w:pPr>
@@ -1301,19 +1187,8 @@
           <w:sz w:val="22"/>
           <w:szCs w:val="22"/>
         </w:rPr>
-        <w:t>Tanggal: ………………</w:t>
-      </w:r>
-      <w:proofErr w:type="gramStart"/>
-      <w:r>
-        <w:rPr>
-          <w:rFonts w:ascii="Times New Roman" w:eastAsia="Times New Roman" w:hAnsi="Times New Roman" w:cs="Times New Roman"/>
-          <w:color w:val="000000"/>
-          <w:sz w:val="22"/>
-          <w:szCs w:val="22"/>
-        </w:rPr>
-        <w:t>…..</w:t>
-      </w:r>
-      <w:proofErr w:type="gramEnd"/>
+        <w:t>Tanggal: …………………..</w:t>
+      </w:r>
     </w:p>
     <w:p>
       <w:pPr>
@@ -1458,29 +1333,7 @@
                 <w:szCs w:val="22"/>
                 <w:u w:val="single"/>
               </w:rPr>
-              <w:t xml:space="preserve">Maulida Ayu Fitriani, </w:t>
-            </w:r>
-            <w:proofErr w:type="gramStart"/>
-            <w:r>
-              <w:rPr>
-                <w:rFonts w:ascii="Times New Roman" w:eastAsia="Times New Roman" w:hAnsi="Times New Roman" w:cs="Times New Roman"/>
-                <w:color w:val="000000"/>
-                <w:sz w:val="22"/>
-                <w:szCs w:val="22"/>
-                <w:u w:val="single"/>
-              </w:rPr>
-              <w:t>S.Kom</w:t>
-            </w:r>
-            <w:proofErr w:type="gramEnd"/>
-            <w:r>
-              <w:rPr>
-                <w:rFonts w:ascii="Times New Roman" w:eastAsia="Times New Roman" w:hAnsi="Times New Roman" w:cs="Times New Roman"/>
-                <w:color w:val="000000"/>
-                <w:sz w:val="22"/>
-                <w:szCs w:val="22"/>
-                <w:u w:val="single"/>
-              </w:rPr>
-              <w:t>., M.Cs.</w:t>
+              <w:t>Maulida Ayu Fitriani, S.Kom., M.Cs.</w:t>
             </w:r>
           </w:p>
           <w:p>
@@ -1493,7 +1346,6 @@
                 <w:szCs w:val="22"/>
               </w:rPr>
             </w:pPr>
-            <w:proofErr w:type="gramStart"/>
             <w:r>
               <w:rPr>
                 <w:rFonts w:ascii="Times New Roman" w:eastAsia="Times New Roman" w:hAnsi="Times New Roman" w:cs="Times New Roman"/>
@@ -1501,17 +1353,7 @@
                 <w:sz w:val="22"/>
                 <w:szCs w:val="22"/>
               </w:rPr>
-              <w:t>NIK./</w:t>
-            </w:r>
-            <w:proofErr w:type="gramEnd"/>
-            <w:r>
-              <w:rPr>
-                <w:rFonts w:ascii="Times New Roman" w:eastAsia="Times New Roman" w:hAnsi="Times New Roman" w:cs="Times New Roman"/>
-                <w:color w:val="000000"/>
-                <w:sz w:val="22"/>
-                <w:szCs w:val="22"/>
-              </w:rPr>
-              <w:t>NIP.</w:t>
+              <w:t>NIK./NIP.</w:t>
             </w:r>
             <w:r>
               <w:rPr>
@@ -1591,7 +1433,6 @@
                 <w:szCs w:val="22"/>
               </w:rPr>
             </w:pPr>
-            <w:proofErr w:type="gramStart"/>
             <w:r>
               <w:rPr>
                 <w:rFonts w:ascii="Times New Roman" w:eastAsia="Times New Roman" w:hAnsi="Times New Roman" w:cs="Times New Roman"/>
@@ -1601,7 +1442,6 @@
               </w:rPr>
               <w:t>NIK./NIP.*</w:t>
             </w:r>
-            <w:proofErr w:type="gramEnd"/>
             <w:r>
               <w:rPr>
                 <w:rFonts w:ascii="Times New Roman" w:eastAsia="Times New Roman" w:hAnsi="Times New Roman" w:cs="Times New Roman"/>
@@ -1728,60 +1568,27 @@
           <w:szCs w:val="22"/>
           <w:u w:val="single"/>
         </w:rPr>
-        <w:t xml:space="preserve">Agung Purwo Wicaksono, S.T., </w:t>
-      </w:r>
-      <w:proofErr w:type="gramStart"/>
+        <w:t>Agung Purwo Wicaksono, S.T., M.Kom.</w:t>
+      </w:r>
+    </w:p>
+    <w:p>
+      <w:pPr>
+        <w:spacing w:line="276" w:lineRule="auto"/>
+        <w:ind w:left="441"/>
+        <w:jc w:val="center"/>
+        <w:rPr>
+          <w:rFonts w:ascii="Times New Roman" w:eastAsia="Times New Roman" w:hAnsi="Times New Roman" w:cs="Times New Roman"/>
+          <w:color w:val="000000"/>
+        </w:rPr>
+      </w:pPr>
       <w:r>
         <w:rPr>
           <w:rFonts w:ascii="Times New Roman" w:eastAsia="Times New Roman" w:hAnsi="Times New Roman" w:cs="Times New Roman"/>
           <w:color w:val="000000"/>
           <w:sz w:val="22"/>
           <w:szCs w:val="22"/>
-          <w:u w:val="single"/>
-        </w:rPr>
-        <w:t>M.Kom</w:t>
-      </w:r>
-      <w:proofErr w:type="gramEnd"/>
-      <w:r>
-        <w:rPr>
-          <w:rFonts w:ascii="Times New Roman" w:eastAsia="Times New Roman" w:hAnsi="Times New Roman" w:cs="Times New Roman"/>
-          <w:color w:val="000000"/>
-          <w:sz w:val="22"/>
-          <w:szCs w:val="22"/>
-          <w:u w:val="single"/>
-        </w:rPr>
-        <w:t>.</w:t>
-      </w:r>
-    </w:p>
-    <w:p>
-      <w:pPr>
-        <w:spacing w:line="276" w:lineRule="auto"/>
-        <w:ind w:left="441"/>
-        <w:jc w:val="center"/>
-        <w:rPr>
-          <w:rFonts w:ascii="Times New Roman" w:eastAsia="Times New Roman" w:hAnsi="Times New Roman" w:cs="Times New Roman"/>
-          <w:color w:val="000000"/>
-        </w:rPr>
-      </w:pPr>
-      <w:proofErr w:type="gramStart"/>
-      <w:r>
-        <w:rPr>
-          <w:rFonts w:ascii="Times New Roman" w:eastAsia="Times New Roman" w:hAnsi="Times New Roman" w:cs="Times New Roman"/>
-          <w:color w:val="000000"/>
-          <w:sz w:val="22"/>
-          <w:szCs w:val="22"/>
-        </w:rPr>
-        <w:t>NIK./</w:t>
-      </w:r>
-      <w:proofErr w:type="gramEnd"/>
-      <w:r>
-        <w:rPr>
-          <w:rFonts w:ascii="Times New Roman" w:eastAsia="Times New Roman" w:hAnsi="Times New Roman" w:cs="Times New Roman"/>
-          <w:color w:val="000000"/>
-          <w:sz w:val="22"/>
-          <w:szCs w:val="22"/>
-        </w:rPr>
-        <w:t>NIP.</w:t>
+        </w:rPr>
+        <w:t>NIK./NIP.</w:t>
       </w:r>
       <w:r>
         <w:rPr>
@@ -12523,7 +12330,7 @@
           <w:noProof/>
         </w:rPr>
         <w:drawing>
-          <wp:inline distT="0" distB="0" distL="0" distR="0" wp14:anchorId="75188C27" wp14:editId="00D7D6E7">
+          <wp:inline distT="0" distB="0" distL="0" distR="0" wp14:anchorId="75188C27" wp14:editId="10B8DE22">
             <wp:extent cx="5004000" cy="1844909"/>
             <wp:effectExtent l="19050" t="19050" r="25400" b="22225"/>
             <wp:docPr id="783286403" name="Picture 4"/>
@@ -12899,7 +12706,7 @@
           <w:noProof/>
         </w:rPr>
         <w:drawing>
-          <wp:inline distT="0" distB="0" distL="0" distR="0" wp14:anchorId="02EBA956" wp14:editId="3C32B85F">
+          <wp:inline distT="0" distB="0" distL="0" distR="0" wp14:anchorId="02EBA956" wp14:editId="0341DC9B">
             <wp:extent cx="3888000" cy="2160000"/>
             <wp:effectExtent l="19050" t="19050" r="17780" b="12065"/>
             <wp:docPr id="102117401" name="Picture 5"/>
@@ -14229,7 +14036,6 @@
           <w:rFonts w:ascii="Times New Roman" w:hAnsi="Times New Roman" w:cs="Times New Roman"/>
         </w:rPr>
       </w:pPr>
-      <w:proofErr w:type="gramStart"/>
       <w:r>
         <w:rPr>
           <w:rFonts w:ascii="Times New Roman" w:hAnsi="Times New Roman" w:cs="Times New Roman"/>
@@ -14244,14 +14050,17 @@
           <w:i/>
           <w:iCs/>
         </w:rPr>
-        <w:t>issing  value</w:t>
-      </w:r>
-      <w:proofErr w:type="gramEnd"/>
-      <w:r>
-        <w:rPr>
-          <w:rFonts w:ascii="Times New Roman" w:hAnsi="Times New Roman" w:cs="Times New Roman"/>
-          <w:i/>
-          <w:iCs/>
+        <w:t xml:space="preserve">issing  value </w:t>
+      </w:r>
+      <w:r>
+        <w:rPr>
+          <w:rFonts w:ascii="Times New Roman" w:hAnsi="Times New Roman" w:cs="Times New Roman"/>
+        </w:rPr>
+        <w:t xml:space="preserve"> adalah  satu  kondisi  dimana  terdapat  nilai  yang  tidak</w:t>
+      </w:r>
+      <w:r>
+        <w:rPr>
+          <w:rFonts w:ascii="Times New Roman" w:hAnsi="Times New Roman" w:cs="Times New Roman"/>
         </w:rPr>
         <w:t xml:space="preserve"> </w:t>
       </w:r>
@@ -14259,114 +14068,8 @@
         <w:rPr>
           <w:rFonts w:ascii="Times New Roman" w:hAnsi="Times New Roman" w:cs="Times New Roman"/>
         </w:rPr>
-        <w:t xml:space="preserve"> </w:t>
-      </w:r>
-      <w:proofErr w:type="gramStart"/>
-      <w:r>
-        <w:rPr>
-          <w:rFonts w:ascii="Times New Roman" w:hAnsi="Times New Roman" w:cs="Times New Roman"/>
-        </w:rPr>
-        <w:t>adalah  satu</w:t>
-      </w:r>
-      <w:proofErr w:type="gramEnd"/>
-      <w:r>
-        <w:rPr>
-          <w:rFonts w:ascii="Times New Roman" w:hAnsi="Times New Roman" w:cs="Times New Roman"/>
-        </w:rPr>
-        <w:t xml:space="preserve">  </w:t>
-      </w:r>
-      <w:proofErr w:type="gramStart"/>
-      <w:r>
-        <w:rPr>
-          <w:rFonts w:ascii="Times New Roman" w:hAnsi="Times New Roman" w:cs="Times New Roman"/>
-        </w:rPr>
-        <w:t>kondisi  dimana</w:t>
-      </w:r>
-      <w:proofErr w:type="gramEnd"/>
-      <w:r>
-        <w:rPr>
-          <w:rFonts w:ascii="Times New Roman" w:hAnsi="Times New Roman" w:cs="Times New Roman"/>
-        </w:rPr>
-        <w:t xml:space="preserve">  </w:t>
-      </w:r>
-      <w:proofErr w:type="gramStart"/>
-      <w:r>
-        <w:rPr>
-          <w:rFonts w:ascii="Times New Roman" w:hAnsi="Times New Roman" w:cs="Times New Roman"/>
-        </w:rPr>
-        <w:t>terdapat  nilai</w:t>
-      </w:r>
-      <w:proofErr w:type="gramEnd"/>
-      <w:r>
-        <w:rPr>
-          <w:rFonts w:ascii="Times New Roman" w:hAnsi="Times New Roman" w:cs="Times New Roman"/>
-        </w:rPr>
-        <w:t xml:space="preserve">  </w:t>
-      </w:r>
-      <w:proofErr w:type="gramStart"/>
-      <w:r>
-        <w:rPr>
-          <w:rFonts w:ascii="Times New Roman" w:hAnsi="Times New Roman" w:cs="Times New Roman"/>
-        </w:rPr>
-        <w:t>yang  tidak</w:t>
-      </w:r>
-      <w:proofErr w:type="gramEnd"/>
-      <w:r>
-        <w:rPr>
-          <w:rFonts w:ascii="Times New Roman" w:hAnsi="Times New Roman" w:cs="Times New Roman"/>
-        </w:rPr>
-        <w:t xml:space="preserve"> </w:t>
-      </w:r>
-      <w:proofErr w:type="gramStart"/>
-      <w:r>
-        <w:rPr>
-          <w:rFonts w:ascii="Times New Roman" w:hAnsi="Times New Roman" w:cs="Times New Roman"/>
-        </w:rPr>
-        <w:t>lengkap  atau</w:t>
-      </w:r>
-      <w:proofErr w:type="gramEnd"/>
-      <w:r>
-        <w:rPr>
-          <w:rFonts w:ascii="Times New Roman" w:hAnsi="Times New Roman" w:cs="Times New Roman"/>
-        </w:rPr>
-        <w:t xml:space="preserve">  </w:t>
-      </w:r>
-      <w:proofErr w:type="gramStart"/>
-      <w:r>
-        <w:rPr>
-          <w:rFonts w:ascii="Times New Roman" w:hAnsi="Times New Roman" w:cs="Times New Roman"/>
-        </w:rPr>
-        <w:t>kosong  pada</w:t>
-      </w:r>
-      <w:proofErr w:type="gramEnd"/>
-      <w:r>
-        <w:rPr>
-          <w:rFonts w:ascii="Times New Roman" w:hAnsi="Times New Roman" w:cs="Times New Roman"/>
-        </w:rPr>
-        <w:t xml:space="preserve">  </w:t>
-      </w:r>
-      <w:proofErr w:type="gramStart"/>
-      <w:r>
-        <w:rPr>
-          <w:rFonts w:ascii="Times New Roman" w:hAnsi="Times New Roman" w:cs="Times New Roman"/>
-        </w:rPr>
-        <w:t>satu  atau</w:t>
-      </w:r>
-      <w:proofErr w:type="gramEnd"/>
-      <w:r>
-        <w:rPr>
-          <w:rFonts w:ascii="Times New Roman" w:hAnsi="Times New Roman" w:cs="Times New Roman"/>
-        </w:rPr>
-        <w:t xml:space="preserve">  </w:t>
-      </w:r>
-      <w:proofErr w:type="gramStart"/>
-      <w:r>
-        <w:rPr>
-          <w:rFonts w:ascii="Times New Roman" w:hAnsi="Times New Roman" w:cs="Times New Roman"/>
-        </w:rPr>
-        <w:t>beberapa  kriteria</w:t>
-      </w:r>
-      <w:proofErr w:type="gramEnd"/>
+        <w:t>lengkap  atau  kosong  pada  satu  atau  beberapa  kriteria</w:t>
+      </w:r>
       <w:r>
         <w:rPr>
           <w:rFonts w:ascii="Times New Roman" w:hAnsi="Times New Roman" w:cs="Times New Roman"/>
@@ -20460,10 +20163,6 @@
     <w:p>
       <w:pPr>
         <w:pStyle w:val="Heading6"/>
-        <w:numPr>
-          <w:ilvl w:val="0"/>
-          <w:numId w:val="24"/>
-        </w:numPr>
       </w:pPr>
       <w:r>
         <w:rPr>
@@ -20487,7 +20186,7 @@
           <w:noProof/>
         </w:rPr>
         <w:drawing>
-          <wp:inline distT="0" distB="0" distL="0" distR="0" wp14:anchorId="0500A38A" wp14:editId="3DF40BCC">
+          <wp:inline distT="0" distB="0" distL="0" distR="0" wp14:anchorId="505DD079" wp14:editId="3A137FE2">
             <wp:extent cx="5400000" cy="3081818"/>
             <wp:effectExtent l="19050" t="19050" r="10795" b="23495"/>
             <wp:docPr id="1816641514" name="Picture 1"/>
@@ -20543,9 +20242,6 @@
         <w:pStyle w:val="Caption"/>
         <w:spacing w:line="480" w:lineRule="auto"/>
         <w:jc w:val="center"/>
-        <w:rPr>
-          <w:rFonts w:ascii="Times New Roman" w:hAnsi="Times New Roman" w:cs="Times New Roman"/>
-        </w:rPr>
       </w:pPr>
       <w:bookmarkStart w:id="83" w:name="_Toc200446333"/>
       <w:bookmarkStart w:id="84" w:name="_Toc200618695"/>
@@ -20586,10 +20282,17 @@
     </w:p>
     <w:p>
       <w:pPr>
-        <w:pStyle w:val="Heading6"/>
-      </w:pPr>
-      <w:r>
-        <w:rPr>
+        <w:pStyle w:val="ListParagraph"/>
+        <w:spacing w:line="480" w:lineRule="auto"/>
+        <w:ind w:left="1440" w:firstLine="720"/>
+        <w:jc w:val="both"/>
+        <w:rPr>
+          <w:rFonts w:ascii="Times New Roman" w:hAnsi="Times New Roman" w:cs="Times New Roman"/>
+        </w:rPr>
+      </w:pPr>
+      <w:r>
+        <w:rPr>
+          <w:rFonts w:ascii="Times New Roman" w:hAnsi="Times New Roman" w:cs="Times New Roman"/>
           <w:i/>
           <w:iCs/>
         </w:rPr>
@@ -20597,6 +20300,422 @@
         <w:t>Dashboard</w:t>
       </w:r>
       <w:r>
+        <w:rPr>
+          <w:rFonts w:ascii="Times New Roman" w:hAnsi="Times New Roman" w:cs="Times New Roman"/>
+        </w:rPr>
+        <w:t xml:space="preserve"> overview </w:t>
+      </w:r>
+      <w:r>
+        <w:rPr>
+          <w:rFonts w:ascii="Times New Roman" w:hAnsi="Times New Roman" w:cs="Times New Roman"/>
+        </w:rPr>
+        <w:t xml:space="preserve">pada gambar 3.39 adalah </w:t>
+      </w:r>
+      <w:r>
+        <w:rPr>
+          <w:rFonts w:ascii="Times New Roman" w:hAnsi="Times New Roman" w:cs="Times New Roman"/>
+          <w:i/>
+          <w:iCs/>
+        </w:rPr>
+        <w:t>dashboard</w:t>
+      </w:r>
+      <w:r>
+        <w:rPr>
+          <w:rFonts w:ascii="Times New Roman" w:hAnsi="Times New Roman" w:cs="Times New Roman"/>
+        </w:rPr>
+        <w:t xml:space="preserve"> yang </w:t>
+      </w:r>
+      <w:r>
+        <w:rPr>
+          <w:rFonts w:ascii="Times New Roman" w:hAnsi="Times New Roman" w:cs="Times New Roman"/>
+        </w:rPr>
+        <w:t xml:space="preserve">dirancang untuk merepresentasikan tren &amp; distribusi mahasiswa baru secara </w:t>
+      </w:r>
+      <w:r>
+        <w:rPr>
+          <w:rFonts w:ascii="Times New Roman" w:hAnsi="Times New Roman" w:cs="Times New Roman"/>
+          <w:i/>
+          <w:iCs/>
+        </w:rPr>
+        <w:t>overall</w:t>
+      </w:r>
+      <w:r>
+        <w:rPr>
+          <w:rFonts w:ascii="Times New Roman" w:hAnsi="Times New Roman" w:cs="Times New Roman"/>
+        </w:rPr>
+        <w:t xml:space="preserve">. Adapun cara membaca </w:t>
+      </w:r>
+      <w:r>
+        <w:rPr>
+          <w:rFonts w:ascii="Times New Roman" w:hAnsi="Times New Roman" w:cs="Times New Roman"/>
+          <w:i/>
+          <w:iCs/>
+        </w:rPr>
+        <w:t>dashboard</w:t>
+      </w:r>
+      <w:r>
+        <w:rPr>
+          <w:rFonts w:ascii="Times New Roman" w:hAnsi="Times New Roman" w:cs="Times New Roman"/>
+        </w:rPr>
+        <w:t xml:space="preserve"> Overview adalah sebagai berikut:</w:t>
+      </w:r>
+    </w:p>
+    <w:p>
+      <w:pPr>
+        <w:pStyle w:val="ListParagraph"/>
+        <w:numPr>
+          <w:ilvl w:val="0"/>
+          <w:numId w:val="50"/>
+        </w:numPr>
+        <w:spacing w:line="480" w:lineRule="auto"/>
+        <w:jc w:val="both"/>
+        <w:rPr>
+          <w:i/>
+          <w:iCs/>
+        </w:rPr>
+      </w:pPr>
+      <w:r>
+        <w:rPr>
+          <w:i/>
+          <w:iCs/>
+        </w:rPr>
+        <w:t>KPI (Key Perfomance Indicator)</w:t>
+      </w:r>
+    </w:p>
+    <w:p>
+      <w:pPr>
+        <w:pStyle w:val="ListParagraph"/>
+        <w:spacing w:line="480" w:lineRule="auto"/>
+        <w:ind w:left="2160" w:firstLine="720"/>
+        <w:jc w:val="both"/>
+        <w:rPr>
+          <w:i/>
+          <w:iCs/>
+        </w:rPr>
+      </w:pPr>
+      <w:r>
+        <w:rPr>
+          <w:i/>
+          <w:iCs/>
+        </w:rPr>
+        <w:t>KPI</w:t>
+      </w:r>
+      <w:r>
+        <w:t xml:space="preserve"> adalah informasi utama yang mencangkup </w:t>
+      </w:r>
+      <w:r>
+        <w:rPr>
+          <w:i/>
+          <w:iCs/>
+        </w:rPr>
+        <w:t>dashboard</w:t>
+      </w:r>
+      <w:r>
+        <w:t xml:space="preserve"> tersebut secara </w:t>
+      </w:r>
+      <w:r>
+        <w:rPr>
+          <w:i/>
+          <w:iCs/>
+        </w:rPr>
+        <w:t>overall</w:t>
+      </w:r>
+      <w:r>
+        <w:t>.</w:t>
+      </w:r>
+    </w:p>
+    <w:p>
+      <w:pPr>
+        <w:pStyle w:val="ListParagraph"/>
+        <w:numPr>
+          <w:ilvl w:val="1"/>
+          <w:numId w:val="50"/>
+        </w:numPr>
+        <w:spacing w:line="480" w:lineRule="auto"/>
+        <w:jc w:val="both"/>
+      </w:pPr>
+      <w:r>
+        <w:t>Mahasiswa Baru = Jumlah mahasiswa baru UMP</w:t>
+      </w:r>
+    </w:p>
+    <w:p>
+      <w:pPr>
+        <w:pStyle w:val="ListParagraph"/>
+        <w:numPr>
+          <w:ilvl w:val="1"/>
+          <w:numId w:val="50"/>
+        </w:numPr>
+        <w:spacing w:line="480" w:lineRule="auto"/>
+        <w:jc w:val="both"/>
+      </w:pPr>
+      <w:r>
+        <w:t>SMA, SMK, MA, Tidak Diketahui = Total MABA dari jenis asal SLTA tersebut</w:t>
+      </w:r>
+    </w:p>
+    <w:p>
+      <w:pPr>
+        <w:pStyle w:val="ListParagraph"/>
+        <w:numPr>
+          <w:ilvl w:val="1"/>
+          <w:numId w:val="50"/>
+        </w:numPr>
+        <w:spacing w:line="480" w:lineRule="auto"/>
+        <w:jc w:val="both"/>
+      </w:pPr>
+      <w:r>
+        <w:t>Jalur Masuk = Total jalur masuk mahasiswa baru</w:t>
+      </w:r>
+    </w:p>
+    <w:p>
+      <w:pPr>
+        <w:pStyle w:val="ListParagraph"/>
+        <w:numPr>
+          <w:ilvl w:val="0"/>
+          <w:numId w:val="50"/>
+        </w:numPr>
+        <w:spacing w:line="480" w:lineRule="auto"/>
+        <w:jc w:val="both"/>
+      </w:pPr>
+      <w:r>
+        <w:t>Tren Penerimaan Mahasiswa Baru</w:t>
+      </w:r>
+    </w:p>
+    <w:p>
+      <w:pPr>
+        <w:pStyle w:val="ListParagraph"/>
+        <w:spacing w:line="480" w:lineRule="auto"/>
+        <w:ind w:left="2160" w:firstLine="720"/>
+        <w:jc w:val="both"/>
+      </w:pPr>
+      <w:r>
+        <w:t>Visualisasi ini dirancang sebagai informasi grafik tren sekaligus filter pada dashboard ini</w:t>
+      </w:r>
+      <w:r>
+        <w:t>.</w:t>
+      </w:r>
+    </w:p>
+    <w:p>
+      <w:pPr>
+        <w:pStyle w:val="ListParagraph"/>
+        <w:numPr>
+          <w:ilvl w:val="1"/>
+          <w:numId w:val="50"/>
+        </w:numPr>
+        <w:spacing w:line="480" w:lineRule="auto"/>
+        <w:jc w:val="both"/>
+      </w:pPr>
+      <w:r>
+        <w:t>Sumbu X dalam grafik merepresentasikan tahun</w:t>
+      </w:r>
+    </w:p>
+    <w:p>
+      <w:pPr>
+        <w:pStyle w:val="ListParagraph"/>
+        <w:numPr>
+          <w:ilvl w:val="1"/>
+          <w:numId w:val="50"/>
+        </w:numPr>
+        <w:spacing w:line="480" w:lineRule="auto"/>
+        <w:jc w:val="both"/>
+      </w:pPr>
+      <w:r>
+        <w:t>Sumbu Y dalam grafik merepresentasikan jumlah mahasiswa baru</w:t>
+      </w:r>
+    </w:p>
+    <w:p>
+      <w:pPr>
+        <w:pStyle w:val="ListParagraph"/>
+        <w:numPr>
+          <w:ilvl w:val="1"/>
+          <w:numId w:val="50"/>
+        </w:numPr>
+        <w:spacing w:line="480" w:lineRule="auto"/>
+        <w:jc w:val="both"/>
+      </w:pPr>
+      <w:r>
+        <w:t>Bulatan biru di dalam grafik merupakan posisi jumlah MABA</w:t>
+      </w:r>
+    </w:p>
+    <w:p>
+      <w:pPr>
+        <w:pStyle w:val="ListParagraph"/>
+        <w:numPr>
+          <w:ilvl w:val="1"/>
+          <w:numId w:val="50"/>
+        </w:numPr>
+        <w:spacing w:line="480" w:lineRule="auto"/>
+        <w:jc w:val="both"/>
+      </w:pPr>
+      <w:r>
+        <w:t>Angka di bawah bulatan biru merupakan label jumlah MABA</w:t>
+      </w:r>
+    </w:p>
+    <w:p>
+      <w:pPr>
+        <w:pStyle w:val="ListParagraph"/>
+        <w:numPr>
+          <w:ilvl w:val="1"/>
+          <w:numId w:val="50"/>
+        </w:numPr>
+        <w:spacing w:line="480" w:lineRule="auto"/>
+        <w:jc w:val="both"/>
+      </w:pPr>
+      <w:r>
+        <w:lastRenderedPageBreak/>
+        <w:t>Garis horizontal putus-putus merupakan rata-rata dalam 10 tahun</w:t>
+      </w:r>
+    </w:p>
+    <w:p>
+      <w:pPr>
+        <w:pStyle w:val="ListParagraph"/>
+        <w:numPr>
+          <w:ilvl w:val="0"/>
+          <w:numId w:val="50"/>
+        </w:numPr>
+        <w:spacing w:line="480" w:lineRule="auto"/>
+        <w:jc w:val="both"/>
+      </w:pPr>
+      <w:r>
+        <w:t>Distribusi Jalur Masuk</w:t>
+      </w:r>
+    </w:p>
+    <w:p>
+      <w:pPr>
+        <w:pStyle w:val="ListParagraph"/>
+        <w:spacing w:line="480" w:lineRule="auto"/>
+        <w:ind w:left="2160" w:firstLine="720"/>
+        <w:jc w:val="both"/>
+      </w:pPr>
+      <w:r>
+        <w:t>Visualisasi ini dirancang untuk memudahkan mencari tahu jalur masuk paling populer</w:t>
+      </w:r>
+      <w:r>
+        <w:t>.</w:t>
+      </w:r>
+    </w:p>
+    <w:p>
+      <w:pPr>
+        <w:pStyle w:val="ListParagraph"/>
+        <w:numPr>
+          <w:ilvl w:val="0"/>
+          <w:numId w:val="52"/>
+        </w:numPr>
+        <w:spacing w:line="480" w:lineRule="auto"/>
+        <w:jc w:val="both"/>
+      </w:pPr>
+      <w:r>
+        <w:t>Sumbu X merupakan representasi jumlah mahasiswa baru</w:t>
+      </w:r>
+    </w:p>
+    <w:p>
+      <w:pPr>
+        <w:pStyle w:val="ListParagraph"/>
+        <w:numPr>
+          <w:ilvl w:val="0"/>
+          <w:numId w:val="52"/>
+        </w:numPr>
+        <w:spacing w:line="480" w:lineRule="auto"/>
+        <w:jc w:val="both"/>
+      </w:pPr>
+      <w:r>
+        <w:t>Sumbu Y merupakan representasi jenis jalur masuk</w:t>
+      </w:r>
+    </w:p>
+    <w:p>
+      <w:pPr>
+        <w:pStyle w:val="ListParagraph"/>
+        <w:numPr>
+          <w:ilvl w:val="0"/>
+          <w:numId w:val="52"/>
+        </w:numPr>
+        <w:spacing w:line="480" w:lineRule="auto"/>
+        <w:jc w:val="both"/>
+      </w:pPr>
+      <w:r>
+        <w:t>Angka di samping bar adalah nilai detail jumlah mahasiswa barunya</w:t>
+      </w:r>
+    </w:p>
+    <w:p>
+      <w:pPr>
+        <w:pStyle w:val="ListParagraph"/>
+        <w:numPr>
+          <w:ilvl w:val="0"/>
+          <w:numId w:val="50"/>
+        </w:numPr>
+        <w:spacing w:line="480" w:lineRule="auto"/>
+        <w:jc w:val="both"/>
+      </w:pPr>
+      <w:r>
+        <w:t>Distribusi Fakultas &amp; Prodi</w:t>
+      </w:r>
+    </w:p>
+    <w:p>
+      <w:pPr>
+        <w:spacing w:line="480" w:lineRule="auto"/>
+        <w:ind w:left="2160" w:firstLine="720"/>
+        <w:jc w:val="both"/>
+      </w:pPr>
+      <w:r>
+        <w:t>Visualisasi ini dirancang untuk mencari tahu Fakultas maupun Prodi mana yang paling diminati oleh mahasiswa baru</w:t>
+      </w:r>
+      <w:r>
+        <w:t>.</w:t>
+      </w:r>
+    </w:p>
+    <w:p>
+      <w:pPr>
+        <w:pStyle w:val="ListParagraph"/>
+        <w:numPr>
+          <w:ilvl w:val="0"/>
+          <w:numId w:val="53"/>
+        </w:numPr>
+        <w:spacing w:line="480" w:lineRule="auto"/>
+        <w:jc w:val="both"/>
+      </w:pPr>
+      <w:r>
+        <w:t>Pada sisi kiri merupakan nama Fakultas maupun Prodi</w:t>
+      </w:r>
+    </w:p>
+    <w:p>
+      <w:pPr>
+        <w:pStyle w:val="ListParagraph"/>
+        <w:numPr>
+          <w:ilvl w:val="0"/>
+          <w:numId w:val="53"/>
+        </w:numPr>
+        <w:spacing w:line="480" w:lineRule="auto"/>
+        <w:jc w:val="both"/>
+      </w:pPr>
+      <w:r>
+        <w:t>Pada sisi kanan merepresentasikan jumlah mahasiswa barunya</w:t>
+      </w:r>
+    </w:p>
+    <w:p>
+      <w:pPr>
+        <w:pStyle w:val="ListParagraph"/>
+        <w:numPr>
+          <w:ilvl w:val="0"/>
+          <w:numId w:val="53"/>
+        </w:numPr>
+        <w:spacing w:line="480" w:lineRule="auto"/>
+        <w:jc w:val="both"/>
+      </w:pPr>
+      <w:r>
+        <w:t>Semakin gelap warna birunya, semakin banyak mahasiswa barunya</w:t>
+      </w:r>
+    </w:p>
+    <w:p>
+      <w:pPr>
+        <w:pStyle w:val="Heading6"/>
+      </w:pPr>
+      <w:r>
+        <w:rPr>
+          <w:i/>
+          <w:iCs/>
+        </w:rPr>
+        <w:t>Dashboard</w:t>
+      </w:r>
+      <w:r>
         <w:t xml:space="preserve"> demografi</w:t>
       </w:r>
     </w:p>
@@ -20610,6 +20729,7 @@
         <w:rPr>
           <w:noProof/>
         </w:rPr>
+        <w:lastRenderedPageBreak/>
         <w:drawing>
           <wp:inline distT="0" distB="0" distL="0" distR="0" wp14:anchorId="7D6A7027" wp14:editId="079CA3AC">
             <wp:extent cx="5400000" cy="3084545"/>
@@ -20667,9 +20787,6 @@
         <w:pStyle w:val="Caption"/>
         <w:spacing w:line="480" w:lineRule="auto"/>
         <w:jc w:val="center"/>
-        <w:rPr>
-          <w:rFonts w:ascii="Times New Roman" w:hAnsi="Times New Roman" w:cs="Times New Roman"/>
-        </w:rPr>
       </w:pPr>
       <w:bookmarkStart w:id="86" w:name="_Toc200446334"/>
       <w:bookmarkStart w:id="87" w:name="_Toc200618696"/>
@@ -20707,6 +20824,706 @@
       <w:bookmarkEnd w:id="86"/>
       <w:bookmarkEnd w:id="87"/>
       <w:bookmarkEnd w:id="88"/>
+    </w:p>
+    <w:p>
+      <w:pPr>
+        <w:pStyle w:val="ListParagraph"/>
+        <w:spacing w:line="480" w:lineRule="auto"/>
+        <w:ind w:left="1440" w:firstLine="720"/>
+        <w:jc w:val="both"/>
+        <w:rPr>
+          <w:rFonts w:ascii="Times New Roman" w:hAnsi="Times New Roman" w:cs="Times New Roman"/>
+        </w:rPr>
+      </w:pPr>
+      <w:r>
+        <w:rPr>
+          <w:rFonts w:ascii="Times New Roman" w:hAnsi="Times New Roman" w:cs="Times New Roman"/>
+          <w:i/>
+          <w:iCs/>
+        </w:rPr>
+        <w:t>Dashboard</w:t>
+      </w:r>
+      <w:r>
+        <w:rPr>
+          <w:rFonts w:ascii="Times New Roman" w:hAnsi="Times New Roman" w:cs="Times New Roman"/>
+        </w:rPr>
+        <w:t xml:space="preserve"> </w:t>
+      </w:r>
+      <w:r>
+        <w:rPr>
+          <w:rFonts w:ascii="Times New Roman" w:hAnsi="Times New Roman" w:cs="Times New Roman"/>
+        </w:rPr>
+        <w:t>Demografi</w:t>
+      </w:r>
+      <w:r>
+        <w:rPr>
+          <w:rFonts w:ascii="Times New Roman" w:hAnsi="Times New Roman" w:cs="Times New Roman"/>
+        </w:rPr>
+        <w:t xml:space="preserve"> </w:t>
+      </w:r>
+      <w:r>
+        <w:rPr>
+          <w:rFonts w:ascii="Times New Roman" w:hAnsi="Times New Roman" w:cs="Times New Roman"/>
+        </w:rPr>
+        <w:t>pada gambar 3.</w:t>
+      </w:r>
+      <w:r>
+        <w:rPr>
+          <w:rFonts w:ascii="Times New Roman" w:hAnsi="Times New Roman" w:cs="Times New Roman"/>
+        </w:rPr>
+        <w:t>40</w:t>
+      </w:r>
+      <w:r>
+        <w:rPr>
+          <w:rFonts w:ascii="Times New Roman" w:hAnsi="Times New Roman" w:cs="Times New Roman"/>
+        </w:rPr>
+        <w:t xml:space="preserve"> adalah </w:t>
+      </w:r>
+      <w:r>
+        <w:rPr>
+          <w:rFonts w:ascii="Times New Roman" w:hAnsi="Times New Roman" w:cs="Times New Roman"/>
+          <w:i/>
+          <w:iCs/>
+        </w:rPr>
+        <w:t>dashboard</w:t>
+      </w:r>
+      <w:r>
+        <w:rPr>
+          <w:rFonts w:ascii="Times New Roman" w:hAnsi="Times New Roman" w:cs="Times New Roman"/>
+        </w:rPr>
+        <w:t xml:space="preserve"> yang </w:t>
+      </w:r>
+      <w:r>
+        <w:rPr>
+          <w:rFonts w:ascii="Times New Roman" w:hAnsi="Times New Roman" w:cs="Times New Roman"/>
+        </w:rPr>
+        <w:t>dirancang untuk representasi demografi dan domisili mahasiswa baru</w:t>
+      </w:r>
+      <w:r>
+        <w:rPr>
+          <w:rFonts w:ascii="Times New Roman" w:hAnsi="Times New Roman" w:cs="Times New Roman"/>
+        </w:rPr>
+        <w:t xml:space="preserve">. Adapun cara membaca </w:t>
+      </w:r>
+      <w:r>
+        <w:rPr>
+          <w:rFonts w:ascii="Times New Roman" w:hAnsi="Times New Roman" w:cs="Times New Roman"/>
+          <w:i/>
+          <w:iCs/>
+        </w:rPr>
+        <w:t>dashboard</w:t>
+      </w:r>
+      <w:r>
+        <w:rPr>
+          <w:rFonts w:ascii="Times New Roman" w:hAnsi="Times New Roman" w:cs="Times New Roman"/>
+        </w:rPr>
+        <w:t xml:space="preserve"> </w:t>
+      </w:r>
+      <w:r>
+        <w:rPr>
+          <w:rFonts w:ascii="Times New Roman" w:hAnsi="Times New Roman" w:cs="Times New Roman"/>
+        </w:rPr>
+        <w:t>Demografi</w:t>
+      </w:r>
+      <w:r>
+        <w:rPr>
+          <w:rFonts w:ascii="Times New Roman" w:hAnsi="Times New Roman" w:cs="Times New Roman"/>
+        </w:rPr>
+        <w:t xml:space="preserve"> adalah sebagai berikut:</w:t>
+      </w:r>
+    </w:p>
+    <w:p>
+      <w:pPr>
+        <w:pStyle w:val="ListParagraph"/>
+        <w:numPr>
+          <w:ilvl w:val="0"/>
+          <w:numId w:val="51"/>
+        </w:numPr>
+        <w:spacing w:line="480" w:lineRule="auto"/>
+        <w:jc w:val="both"/>
+      </w:pPr>
+      <w:r>
+        <w:rPr>
+          <w:i/>
+          <w:iCs/>
+        </w:rPr>
+        <w:t>KPI (Key Perfomance Indicator)</w:t>
+      </w:r>
+    </w:p>
+    <w:p>
+      <w:pPr>
+        <w:pStyle w:val="ListParagraph"/>
+        <w:spacing w:line="480" w:lineRule="auto"/>
+        <w:ind w:left="2160" w:firstLine="720"/>
+        <w:jc w:val="both"/>
+      </w:pPr>
+      <w:r>
+        <w:rPr>
+          <w:i/>
+          <w:iCs/>
+        </w:rPr>
+        <w:t>KPI</w:t>
+      </w:r>
+      <w:r>
+        <w:t xml:space="preserve"> adalah informasi utama yang mencangkup </w:t>
+      </w:r>
+      <w:r>
+        <w:rPr>
+          <w:i/>
+          <w:iCs/>
+        </w:rPr>
+        <w:t>dashboard</w:t>
+      </w:r>
+      <w:r>
+        <w:t xml:space="preserve"> tersebut secara </w:t>
+      </w:r>
+      <w:r>
+        <w:rPr>
+          <w:i/>
+          <w:iCs/>
+        </w:rPr>
+        <w:t>overall</w:t>
+      </w:r>
+      <w:r>
+        <w:t>.</w:t>
+      </w:r>
+    </w:p>
+    <w:p>
+      <w:pPr>
+        <w:pStyle w:val="ListParagraph"/>
+        <w:numPr>
+          <w:ilvl w:val="0"/>
+          <w:numId w:val="54"/>
+        </w:numPr>
+        <w:spacing w:line="480" w:lineRule="auto"/>
+        <w:jc w:val="both"/>
+      </w:pPr>
+      <w:r>
+        <w:t>Tahun = Usia rata-rata mahasiswa baru</w:t>
+      </w:r>
+    </w:p>
+    <w:p>
+      <w:pPr>
+        <w:pStyle w:val="ListParagraph"/>
+        <w:numPr>
+          <w:ilvl w:val="0"/>
+          <w:numId w:val="54"/>
+        </w:numPr>
+        <w:spacing w:line="480" w:lineRule="auto"/>
+        <w:jc w:val="both"/>
+      </w:pPr>
+      <w:r>
+        <w:t>Pekerjaan Ortu = Jumlah jenis total pekerjaan orang tua</w:t>
+      </w:r>
+    </w:p>
+    <w:p>
+      <w:pPr>
+        <w:pStyle w:val="ListParagraph"/>
+        <w:numPr>
+          <w:ilvl w:val="0"/>
+          <w:numId w:val="54"/>
+        </w:numPr>
+        <w:spacing w:line="480" w:lineRule="auto"/>
+        <w:jc w:val="both"/>
+      </w:pPr>
+      <w:r>
+        <w:t>SLTA = Jumlah total asal SLTA mahasiswa baru</w:t>
+      </w:r>
+    </w:p>
+    <w:p>
+      <w:pPr>
+        <w:pStyle w:val="ListParagraph"/>
+        <w:numPr>
+          <w:ilvl w:val="0"/>
+          <w:numId w:val="51"/>
+        </w:numPr>
+        <w:spacing w:line="480" w:lineRule="auto"/>
+        <w:jc w:val="both"/>
+      </w:pPr>
+      <w:r>
+        <w:t>Pekerjaan Orang Tua</w:t>
+      </w:r>
+    </w:p>
+    <w:p>
+      <w:pPr>
+        <w:pStyle w:val="ListParagraph"/>
+        <w:spacing w:line="480" w:lineRule="auto"/>
+        <w:ind w:left="2160" w:firstLine="720"/>
+        <w:jc w:val="both"/>
+      </w:pPr>
+      <w:r>
+        <w:rPr>
+          <w:i/>
+          <w:iCs/>
+        </w:rPr>
+        <w:lastRenderedPageBreak/>
+        <w:t>Dashboard</w:t>
+      </w:r>
+      <w:r>
+        <w:t xml:space="preserve"> ini dirancang untuk memahami berbagai latar belakang pekerjaan</w:t>
+      </w:r>
+      <w:r>
+        <w:t xml:space="preserve"> </w:t>
+      </w:r>
+      <w:r>
+        <w:t>orang tua mahasiswa baru</w:t>
+      </w:r>
+      <w:r>
+        <w:t>.</w:t>
+      </w:r>
+    </w:p>
+    <w:p>
+      <w:pPr>
+        <w:pStyle w:val="ListParagraph"/>
+        <w:numPr>
+          <w:ilvl w:val="0"/>
+          <w:numId w:val="55"/>
+        </w:numPr>
+        <w:spacing w:line="480" w:lineRule="auto"/>
+        <w:jc w:val="both"/>
+      </w:pPr>
+      <w:r>
+        <w:t>Sumbu X merepresentasikan jumlah orang tua mahasiswa baru</w:t>
+      </w:r>
+    </w:p>
+    <w:p>
+      <w:pPr>
+        <w:pStyle w:val="ListParagraph"/>
+        <w:numPr>
+          <w:ilvl w:val="0"/>
+          <w:numId w:val="55"/>
+        </w:numPr>
+        <w:spacing w:line="480" w:lineRule="auto"/>
+        <w:jc w:val="both"/>
+      </w:pPr>
+      <w:r>
+        <w:t>Sumbu Y merupakan jenis pekerjaan orang tua</w:t>
+      </w:r>
+    </w:p>
+    <w:p>
+      <w:pPr>
+        <w:pStyle w:val="ListParagraph"/>
+        <w:numPr>
+          <w:ilvl w:val="0"/>
+          <w:numId w:val="55"/>
+        </w:numPr>
+        <w:spacing w:line="480" w:lineRule="auto"/>
+        <w:jc w:val="both"/>
+      </w:pPr>
+      <w:r>
+        <w:t>Angka di samping bar merupakan detail jumlah orang tua</w:t>
+      </w:r>
+    </w:p>
+    <w:p>
+      <w:pPr>
+        <w:pStyle w:val="ListParagraph"/>
+        <w:numPr>
+          <w:ilvl w:val="0"/>
+          <w:numId w:val="55"/>
+        </w:numPr>
+        <w:spacing w:line="480" w:lineRule="auto"/>
+        <w:jc w:val="both"/>
+      </w:pPr>
+      <w:r>
+        <w:t>Garis hitam vertikal merupakan rata-rata dari total orang tua</w:t>
+      </w:r>
+    </w:p>
+    <w:p>
+      <w:pPr>
+        <w:pStyle w:val="ListParagraph"/>
+        <w:numPr>
+          <w:ilvl w:val="0"/>
+          <w:numId w:val="51"/>
+        </w:numPr>
+        <w:spacing w:line="480" w:lineRule="auto"/>
+        <w:jc w:val="both"/>
+      </w:pPr>
+      <w:r>
+        <w:t>Pendidikan Ayah &amp; Ibu</w:t>
+      </w:r>
+    </w:p>
+    <w:p>
+      <w:pPr>
+        <w:pStyle w:val="ListParagraph"/>
+        <w:spacing w:line="480" w:lineRule="auto"/>
+        <w:ind w:left="2160" w:firstLine="720"/>
+        <w:jc w:val="both"/>
+      </w:pPr>
+      <w:r>
+        <w:rPr>
+          <w:i/>
+          <w:iCs/>
+        </w:rPr>
+        <w:t>Dashboard</w:t>
+      </w:r>
+      <w:r>
+        <w:t xml:space="preserve"> ini dirancang untuk memahami distribusi pendidikan terakhir orang tua mahasiswa baru</w:t>
+      </w:r>
+      <w:r>
+        <w:t>.</w:t>
+      </w:r>
+    </w:p>
+    <w:p>
+      <w:pPr>
+        <w:pStyle w:val="ListParagraph"/>
+        <w:numPr>
+          <w:ilvl w:val="0"/>
+          <w:numId w:val="56"/>
+        </w:numPr>
+        <w:spacing w:line="480" w:lineRule="auto"/>
+        <w:jc w:val="both"/>
+      </w:pPr>
+      <w:r>
+        <w:t>Setiap warna mewakili satu kategori pendidikan terakhir</w:t>
+      </w:r>
+    </w:p>
+    <w:p>
+      <w:pPr>
+        <w:pStyle w:val="ListParagraph"/>
+        <w:numPr>
+          <w:ilvl w:val="0"/>
+          <w:numId w:val="56"/>
+        </w:numPr>
+        <w:spacing w:line="480" w:lineRule="auto"/>
+        <w:jc w:val="both"/>
+      </w:pPr>
+      <w:r>
+        <w:t>Semakin besar warna pada lingkaran maka semakin mendominasi</w:t>
+      </w:r>
+    </w:p>
+    <w:p>
+      <w:pPr>
+        <w:pStyle w:val="ListParagraph"/>
+        <w:numPr>
+          <w:ilvl w:val="0"/>
+          <w:numId w:val="56"/>
+        </w:numPr>
+        <w:spacing w:line="480" w:lineRule="auto"/>
+        <w:jc w:val="both"/>
+      </w:pPr>
+      <w:r>
+        <w:t>Tulisan disamping warna merupakan detail dari kategori tersebut</w:t>
+      </w:r>
+    </w:p>
+    <w:p>
+      <w:pPr>
+        <w:pStyle w:val="ListParagraph"/>
+        <w:numPr>
+          <w:ilvl w:val="0"/>
+          <w:numId w:val="51"/>
+        </w:numPr>
+        <w:spacing w:line="480" w:lineRule="auto"/>
+        <w:jc w:val="both"/>
+      </w:pPr>
+      <w:r>
+        <w:rPr>
+          <w:i/>
+          <w:iCs/>
+        </w:rPr>
+        <w:t>Top 10</w:t>
+      </w:r>
+      <w:r>
+        <w:t xml:space="preserve"> SLTA</w:t>
+      </w:r>
+    </w:p>
+    <w:p>
+      <w:pPr>
+        <w:pStyle w:val="ListParagraph"/>
+        <w:spacing w:line="480" w:lineRule="auto"/>
+        <w:ind w:left="2160" w:firstLine="720"/>
+        <w:jc w:val="both"/>
+      </w:pPr>
+      <w:r>
+        <w:rPr>
+          <w:i/>
+          <w:iCs/>
+        </w:rPr>
+        <w:t>Dashboard</w:t>
+      </w:r>
+      <w:r>
+        <w:t xml:space="preserve"> ini dirancang untuk </w:t>
+      </w:r>
+      <w:r>
+        <w:t>melihat</w:t>
+      </w:r>
+      <w:r>
+        <w:t xml:space="preserve"> SLTA yang paling banyak menyumbang mahasiswa baru</w:t>
+      </w:r>
+      <w:r>
+        <w:t>.</w:t>
+      </w:r>
+    </w:p>
+    <w:p>
+      <w:pPr>
+        <w:pStyle w:val="ListParagraph"/>
+        <w:numPr>
+          <w:ilvl w:val="0"/>
+          <w:numId w:val="57"/>
+        </w:numPr>
+        <w:spacing w:line="480" w:lineRule="auto"/>
+        <w:jc w:val="both"/>
+      </w:pPr>
+      <w:r>
+        <w:lastRenderedPageBreak/>
+        <w:t>Sebelah kiri tabel merupakan nama SLTA asal mahasiswa</w:t>
+      </w:r>
+    </w:p>
+    <w:p>
+      <w:pPr>
+        <w:pStyle w:val="ListParagraph"/>
+        <w:numPr>
+          <w:ilvl w:val="0"/>
+          <w:numId w:val="57"/>
+        </w:numPr>
+        <w:spacing w:line="480" w:lineRule="auto"/>
+        <w:jc w:val="both"/>
+      </w:pPr>
+      <w:r>
+        <w:t>Semakin gelap warna birunya, semakin banyak menyumbangnya</w:t>
+      </w:r>
+    </w:p>
+    <w:p>
+      <w:pPr>
+        <w:pStyle w:val="ListParagraph"/>
+        <w:numPr>
+          <w:ilvl w:val="0"/>
+          <w:numId w:val="57"/>
+        </w:numPr>
+        <w:spacing w:line="480" w:lineRule="auto"/>
+        <w:jc w:val="both"/>
+      </w:pPr>
+      <w:r>
+        <w:t>Sebelah kanan tabel merupakan jumlah mahasiswa baru yang berasal dari SLTA tersebut</w:t>
+      </w:r>
+    </w:p>
+    <w:p>
+      <w:pPr>
+        <w:pStyle w:val="ListParagraph"/>
+        <w:numPr>
+          <w:ilvl w:val="0"/>
+          <w:numId w:val="51"/>
+        </w:numPr>
+        <w:spacing w:line="480" w:lineRule="auto"/>
+        <w:jc w:val="both"/>
+      </w:pPr>
+      <w:r>
+        <w:t>Distribusi Wilayah</w:t>
+      </w:r>
+    </w:p>
+    <w:p>
+      <w:pPr>
+        <w:pStyle w:val="ListParagraph"/>
+        <w:spacing w:line="480" w:lineRule="auto"/>
+        <w:ind w:left="2160" w:firstLine="720"/>
+        <w:jc w:val="both"/>
+      </w:pPr>
+      <w:r>
+        <w:rPr>
+          <w:i/>
+          <w:iCs/>
+        </w:rPr>
+        <w:t>Dashboard</w:t>
+      </w:r>
+      <w:r>
+        <w:t xml:space="preserve"> ini dirancang untuk memudahkan dalam memahami distribusi domisili asal mahasiswa baru.</w:t>
+      </w:r>
+    </w:p>
+    <w:p>
+      <w:pPr>
+        <w:pStyle w:val="ListParagraph"/>
+        <w:numPr>
+          <w:ilvl w:val="0"/>
+          <w:numId w:val="58"/>
+        </w:numPr>
+        <w:spacing w:line="480" w:lineRule="auto"/>
+        <w:jc w:val="both"/>
+      </w:pPr>
+      <w:r>
+        <w:t>Peta dibuat berdasarkan Provinsi asal domisili</w:t>
+      </w:r>
+    </w:p>
+    <w:p>
+      <w:pPr>
+        <w:pStyle w:val="ListParagraph"/>
+        <w:numPr>
+          <w:ilvl w:val="0"/>
+          <w:numId w:val="58"/>
+        </w:numPr>
+        <w:spacing w:line="480" w:lineRule="auto"/>
+        <w:jc w:val="both"/>
+      </w:pPr>
+      <w:r>
+        <w:t>Warna merepresentasikan jumlah mahasiswa baru</w:t>
+      </w:r>
+    </w:p>
+    <w:p>
+      <w:pPr>
+        <w:pStyle w:val="ListParagraph"/>
+        <w:numPr>
+          <w:ilvl w:val="0"/>
+          <w:numId w:val="58"/>
+        </w:numPr>
+        <w:spacing w:line="480" w:lineRule="auto"/>
+        <w:jc w:val="both"/>
+      </w:pPr>
+      <w:r>
+        <w:t>Semakin gelap warna biru suatu Provinsi, semakin mendominasi</w:t>
+      </w:r>
+    </w:p>
+    <w:p>
+      <w:pPr>
+        <w:pStyle w:val="ListParagraph"/>
+        <w:numPr>
+          <w:ilvl w:val="0"/>
+          <w:numId w:val="58"/>
+        </w:numPr>
+        <w:spacing w:line="480" w:lineRule="auto"/>
+        <w:jc w:val="both"/>
+      </w:pPr>
+      <w:r>
+        <w:t>Semakin gelap merah suatu Provinsi, semakin sedikit</w:t>
+      </w:r>
+    </w:p>
+    <w:p>
+      <w:pPr>
+        <w:pStyle w:val="ListParagraph"/>
+        <w:numPr>
+          <w:ilvl w:val="0"/>
+          <w:numId w:val="51"/>
+        </w:numPr>
+        <w:spacing w:line="480" w:lineRule="auto"/>
+        <w:jc w:val="both"/>
+        <w:rPr>
+          <w:i/>
+          <w:iCs/>
+        </w:rPr>
+      </w:pPr>
+      <w:r>
+        <w:rPr>
+          <w:i/>
+          <w:iCs/>
+        </w:rPr>
+        <w:t>Filter &amp; Legend</w:t>
+      </w:r>
+    </w:p>
+    <w:p>
+      <w:pPr>
+        <w:pStyle w:val="ListParagraph"/>
+        <w:spacing w:line="480" w:lineRule="auto"/>
+        <w:ind w:left="2160" w:firstLine="720"/>
+        <w:jc w:val="both"/>
+      </w:pPr>
+      <w:r>
+        <w:t xml:space="preserve">Bagian </w:t>
+      </w:r>
+      <w:r>
+        <w:rPr>
+          <w:i/>
+          <w:iCs/>
+        </w:rPr>
+        <w:t>filter</w:t>
+      </w:r>
+      <w:r>
+        <w:t xml:space="preserve"> </w:t>
+      </w:r>
+      <w:r>
+        <w:t xml:space="preserve">yang berupa checkbox </w:t>
+      </w:r>
+      <w:r>
+        <w:t>dirancang</w:t>
+      </w:r>
+      <w:r>
+        <w:t xml:space="preserve"> untuk menentukan tahun mana yang ingin ditampilkan. Bagian </w:t>
+      </w:r>
+      <w:r>
+        <w:rPr>
+          <w:i/>
+          <w:iCs/>
+        </w:rPr>
+        <w:t>legend</w:t>
+      </w:r>
+      <w:r>
+        <w:t xml:space="preserve"> merupakan keterangan arti warna dari distribusi pendidikan ayah dan ibu</w:t>
+      </w:r>
+      <w:r>
+        <w:t>.</w:t>
+      </w:r>
+    </w:p>
+    <w:p>
+      <w:pPr>
+        <w:pStyle w:val="ListParagraph"/>
+        <w:numPr>
+          <w:ilvl w:val="0"/>
+          <w:numId w:val="59"/>
+        </w:numPr>
+        <w:spacing w:line="480" w:lineRule="auto"/>
+        <w:jc w:val="both"/>
+      </w:pPr>
+      <w:r>
+        <w:t>Checkbox pada filter dapat diatur sesuai kehendak</w:t>
+      </w:r>
+    </w:p>
+    <w:p>
+      <w:pPr>
+        <w:pStyle w:val="ListParagraph"/>
+        <w:numPr>
+          <w:ilvl w:val="0"/>
+          <w:numId w:val="59"/>
+        </w:numPr>
+        <w:spacing w:line="480" w:lineRule="auto"/>
+        <w:jc w:val="both"/>
+      </w:pPr>
+      <w:r>
+        <w:t>Setiap warna pada legend mewakili satu kategori</w:t>
+      </w:r>
+    </w:p>
+    <w:p>
+      <w:pPr>
+        <w:pStyle w:val="ListParagraph"/>
+        <w:numPr>
+          <w:ilvl w:val="0"/>
+          <w:numId w:val="59"/>
+        </w:numPr>
+        <w:spacing w:line="480" w:lineRule="auto"/>
+        <w:jc w:val="both"/>
+      </w:pPr>
+      <w:r>
+        <w:lastRenderedPageBreak/>
+        <w:t>Perlu dipahami bahwa filter juga mempengaruhi dashboard lain</w:t>
+      </w:r>
+    </w:p>
+    <w:p>
+      <w:pPr>
+        <w:pStyle w:val="Heading5"/>
+        <w:rPr>
+          <w:rFonts w:cs="Times New Roman"/>
+        </w:rPr>
+      </w:pPr>
+      <w:r>
+        <w:t>Demo</w:t>
+      </w:r>
+      <w:r>
+        <w:t>/contoh pemakaian</w:t>
+      </w:r>
+      <w:r>
+        <w:t xml:space="preserve"> dashboard</w:t>
+      </w:r>
+    </w:p>
+    <w:p>
+      <w:pPr>
+        <w:pStyle w:val="ListParagraph"/>
+        <w:spacing w:line="480" w:lineRule="auto"/>
+        <w:ind w:left="1080"/>
+        <w:rPr>
+          <w:rFonts w:ascii="Times New Roman" w:hAnsi="Times New Roman" w:cs="Times New Roman"/>
+        </w:rPr>
+      </w:pPr>
+      <w:r>
+        <w:rPr>
+          <w:rFonts w:ascii="Times New Roman" w:hAnsi="Times New Roman" w:cs="Times New Roman"/>
+        </w:rPr>
+        <w:t>ss</w:t>
+      </w:r>
     </w:p>
     <w:p>
       <w:pPr>
@@ -21011,7 +21828,6 @@
         <w:rPr>
           <w:rFonts w:ascii="Times New Roman" w:hAnsi="Times New Roman" w:cs="Times New Roman"/>
         </w:rPr>
-        <w:lastRenderedPageBreak/>
         <w:t>Bar n</w:t>
       </w:r>
       <w:r>
@@ -21199,6 +22015,7 @@
         <w:pStyle w:val="Heading6"/>
       </w:pPr>
       <w:r>
+        <w:lastRenderedPageBreak/>
         <w:t>Halaman ‘Cara Membaca Dashboard’</w:t>
       </w:r>
     </w:p>
@@ -21385,14 +22202,7 @@
         <w:rPr>
           <w:rFonts w:ascii="Times New Roman" w:hAnsi="Times New Roman" w:cs="Times New Roman"/>
         </w:rPr>
-        <w:t xml:space="preserve"> Visualisasi. Navigasi ini diletakkan di bagian atas halaman </w:t>
-      </w:r>
-      <w:r>
-        <w:rPr>
-          <w:rFonts w:ascii="Times New Roman" w:hAnsi="Times New Roman" w:cs="Times New Roman"/>
-        </w:rPr>
-        <w:lastRenderedPageBreak/>
-        <w:t>(</w:t>
+        <w:t xml:space="preserve"> Visualisasi. Navigasi ini diletakkan di bagian atas halaman (</w:t>
       </w:r>
       <w:r>
         <w:rPr>
@@ -21450,6 +22260,7 @@
           <w:rFonts w:ascii="Times New Roman" w:hAnsi="Times New Roman" w:cs="Times New Roman"/>
           <w:noProof/>
         </w:rPr>
+        <w:lastRenderedPageBreak/>
         <w:drawing>
           <wp:inline distT="0" distB="0" distL="0" distR="0" wp14:anchorId="44B3BE65" wp14:editId="3F9396ED">
             <wp:extent cx="3960000" cy="2106500"/>
@@ -21582,14 +22393,7 @@
         <w:rPr>
           <w:rFonts w:ascii="Times New Roman" w:hAnsi="Times New Roman" w:cs="Times New Roman"/>
         </w:rPr>
-        <w:t xml:space="preserve"> dirancang sebagai tempat penempatan judul proyek yang berfungsi memperkenalkan inti dari keseluruhan konten yang ada pada halaman. Judul ditampilkan dengan ukuran font besar dan pemilihan warna yang mencolok pada kata kunci “Mahasiswa Baru UMP” untuk menekankan fokus utama dari proyek visualisasi ini. Tepat di bawah judul terdapat paragraf pengantar singkat yang menjelaskan konteks proyek, yaitu sebagai bagian dari tugas Kerja Praktek yang </w:t>
-      </w:r>
-      <w:r>
-        <w:rPr>
-          <w:rFonts w:ascii="Times New Roman" w:hAnsi="Times New Roman" w:cs="Times New Roman"/>
-        </w:rPr>
-        <w:lastRenderedPageBreak/>
-        <w:t>berfokus pada visualisasi tren penerimaan mahasiswa baru di Universitas Muhammadiyah Purwokerto dari tahun 2014 hingga 2024.</w:t>
+        <w:t xml:space="preserve"> dirancang sebagai tempat penempatan judul proyek yang berfungsi memperkenalkan inti dari keseluruhan konten yang ada pada halaman. Judul ditampilkan dengan ukuran font besar dan pemilihan warna yang mencolok pada kata kunci “Mahasiswa Baru UMP” untuk menekankan fokus utama dari proyek visualisasi ini. Tepat di bawah judul terdapat paragraf pengantar singkat yang menjelaskan konteks proyek, yaitu sebagai bagian dari tugas Kerja Praktek yang berfokus pada visualisasi tren penerimaan mahasiswa baru di Universitas Muhammadiyah Purwokerto dari tahun 2014 hingga 2024.</w:t>
       </w:r>
       <w:r>
         <w:rPr>
@@ -21631,6 +22435,7 @@
           <w:rFonts w:ascii="Times New Roman" w:hAnsi="Times New Roman" w:cs="Times New Roman"/>
           <w:noProof/>
         </w:rPr>
+        <w:lastRenderedPageBreak/>
         <w:drawing>
           <wp:inline distT="0" distB="0" distL="0" distR="0" wp14:anchorId="36A105A2" wp14:editId="23421EE3">
             <wp:extent cx="3960000" cy="2106500"/>
@@ -21786,14 +22591,14 @@
         <w:rPr>
           <w:rFonts w:ascii="Times New Roman" w:hAnsi="Times New Roman" w:cs="Times New Roman"/>
         </w:rPr>
-        <w:t xml:space="preserve">Isi dari setiap kotak sudah disesuaikan dengan konteks Kerja Praktek ini. Permasalahan yang diangkat </w:t>
+        <w:t xml:space="preserve">Isi dari setiap kotak sudah disesuaikan dengan konteks Kerja Praktek ini. Permasalahan yang diangkat berkaitan dengan belum adanya visualisasi berbasis data historis terkait penerimaan mahasiswa baru. Tujuan proyek dijelaskan secara langsung, yaitu merepresentasikan tren tersebut dalam bentuk visual berbasis data internal dari BPA UMP. Sementara itu, manfaat proyek disampaikan dalam </w:t>
       </w:r>
       <w:r>
         <w:rPr>
           <w:rFonts w:ascii="Times New Roman" w:hAnsi="Times New Roman" w:cs="Times New Roman"/>
         </w:rPr>
         <w:lastRenderedPageBreak/>
-        <w:t>berkaitan dengan belum adanya visualisasi berbasis data historis terkait penerimaan mahasiswa baru. Tujuan proyek dijelaskan secara langsung, yaitu merepresentasikan tren tersebut dalam bentuk visual berbasis data internal dari BPA UMP. Sementara itu, manfaat proyek disampaikan dalam konteks fungsional, yaitu untuk mendukung perencanaan strategi promosi melalui pemahaman pola penerimaan mahasiswa baru.</w:t>
+        <w:t>konteks fungsional, yaitu untuk mendukung perencanaan strategi promosi melalui pemahaman pola penerimaan mahasiswa baru.</w:t>
       </w:r>
     </w:p>
     <w:p>
@@ -21944,14 +22749,7 @@
         <w:rPr>
           <w:rFonts w:ascii="Times New Roman" w:hAnsi="Times New Roman" w:cs="Times New Roman"/>
         </w:rPr>
-        <w:t xml:space="preserve"> dirancang untuk memberikan pemahaman singkat terkait alur data yang digunakan dalam proyek, mulai dari tahap awal pengumpulan hingga tahap akhir di mana data digunakan dalam visualisasi. Terdapat tiga tahapan utama yang ditampilkan, yaitu Pengumpulan Data, Pre-processing Data, </w:t>
-      </w:r>
-      <w:r>
-        <w:rPr>
-          <w:rFonts w:ascii="Times New Roman" w:hAnsi="Times New Roman" w:cs="Times New Roman"/>
-        </w:rPr>
-        <w:lastRenderedPageBreak/>
-        <w:t>dan Visualisasi. Ketiganya disusun secara horizontal dalam bentuk kotak informasi agar mudah dipahami alurnya oleh pengunjung halaman.</w:t>
+        <w:t xml:space="preserve"> dirancang untuk memberikan pemahaman singkat terkait alur data yang digunakan dalam proyek, mulai dari tahap awal pengumpulan hingga tahap akhir di mana data digunakan dalam visualisasi. Terdapat tiga tahapan utama yang ditampilkan, yaitu Pengumpulan Data, Pre-processing Data, dan Visualisasi. Ketiganya disusun secara horizontal dalam bentuk kotak informasi agar mudah dipahami alurnya oleh pengunjung halaman.</w:t>
       </w:r>
     </w:p>
     <w:p>
@@ -21968,7 +22766,14 @@
         <w:rPr>
           <w:rFonts w:ascii="Times New Roman" w:hAnsi="Times New Roman" w:cs="Times New Roman"/>
         </w:rPr>
-        <w:t>Setiap tahap dilengkapi dengan ikon dan deskripsi singkat yang menggambarkan peran masing-masing dalam proses pengolahan data. Penjelasan ini membantu pengguna memahami bagaimana data mentah yang berasal dari mitra proyek (BPA UMP) diolah secara bertahap hingga menghasilkan visualisasi dashboard sebagai produk akhir.</w:t>
+        <w:t xml:space="preserve">Setiap tahap dilengkapi dengan ikon dan deskripsi singkat yang menggambarkan peran masing-masing dalam </w:t>
+      </w:r>
+      <w:r>
+        <w:rPr>
+          <w:rFonts w:ascii="Times New Roman" w:hAnsi="Times New Roman" w:cs="Times New Roman"/>
+        </w:rPr>
+        <w:lastRenderedPageBreak/>
+        <w:t>proses pengolahan data. Penjelasan ini membantu pengguna memahami bagaimana data mentah yang berasal dari mitra proyek (BPA UMP) diolah secara bertahap hingga menghasilkan visualisasi dashboard sebagai produk akhir.</w:t>
       </w:r>
     </w:p>
     <w:p>
@@ -22150,14 +22955,7 @@
         <w:rPr>
           <w:rFonts w:ascii="Times New Roman" w:hAnsi="Times New Roman" w:cs="Times New Roman"/>
         </w:rPr>
-        <w:t xml:space="preserve">) seperti total data mahasiswa, jumlah fakultas, jumlah program studi, dan total </w:t>
-      </w:r>
-      <w:r>
-        <w:rPr>
-          <w:rFonts w:ascii="Times New Roman" w:hAnsi="Times New Roman" w:cs="Times New Roman"/>
-        </w:rPr>
-        <w:lastRenderedPageBreak/>
-        <w:t>jalur masuk.</w:t>
+        <w:t>) seperti total data mahasiswa, jumlah fakultas, jumlah program studi, dan total jalur masuk.</w:t>
       </w:r>
       <w:r>
         <w:rPr>
@@ -22209,6 +23007,7 @@
           <w:rFonts w:ascii="Times New Roman" w:hAnsi="Times New Roman" w:cs="Times New Roman"/>
           <w:noProof/>
         </w:rPr>
+        <w:lastRenderedPageBreak/>
         <w:drawing>
           <wp:inline distT="0" distB="0" distL="0" distR="0" wp14:anchorId="35CB2379" wp14:editId="6AC7FC5A">
             <wp:extent cx="3960000" cy="2104500"/>
@@ -22445,14 +23244,7 @@
         <w:rPr>
           <w:rFonts w:ascii="Times New Roman" w:hAnsi="Times New Roman" w:cs="Times New Roman"/>
         </w:rPr>
-        <w:t xml:space="preserve"> Demografi. Masing-masing disertai dengan deskripsi singkat dan poin-</w:t>
-      </w:r>
-      <w:r>
-        <w:rPr>
-          <w:rFonts w:ascii="Times New Roman" w:hAnsi="Times New Roman" w:cs="Times New Roman"/>
-        </w:rPr>
-        <w:lastRenderedPageBreak/>
-        <w:t>poin penting (</w:t>
+        <w:t xml:space="preserve"> Demografi. Masing-masing disertai dengan deskripsi singkat dan poin-poin penting (</w:t>
       </w:r>
       <w:r>
         <w:rPr>
@@ -22480,7 +23272,14 @@
         <w:rPr>
           <w:rFonts w:ascii="Times New Roman" w:hAnsi="Times New Roman" w:cs="Times New Roman"/>
         </w:rPr>
-        <w:t xml:space="preserve"> turut ditampilkan untuk memberikan gambaran konkret terhadap hasil akhir visualisasi yang dirancang.</w:t>
+        <w:t xml:space="preserve"> turut ditampilkan untuk </w:t>
+      </w:r>
+      <w:r>
+        <w:rPr>
+          <w:rFonts w:ascii="Times New Roman" w:hAnsi="Times New Roman" w:cs="Times New Roman"/>
+        </w:rPr>
+        <w:lastRenderedPageBreak/>
+        <w:t>memberikan gambaran konkret terhadap hasil akhir visualisasi yang dirancang.</w:t>
       </w:r>
     </w:p>
     <w:p>
@@ -22640,14 +23439,7 @@
         <w:rPr>
           <w:rFonts w:ascii="Times New Roman" w:hAnsi="Times New Roman" w:cs="Times New Roman"/>
         </w:rPr>
-        <w:t xml:space="preserve">dirancang untuk menyampaikan apresiasi dan ucapan terima kasih dari penulis kepada mitra proyek, yaitu Biro Publikasi dan Admisi (BPA) Universitas Muhammadiyah Purwokerto. Ucapan ini ditujukan kepada pimpinan maupun staf yang telah memberikan dukungan, kemudahan akses data, serta bimbingan selama proses pengerjaan proyek berlangsung. Kehadiran bagian ini juga menjadi bentuk penghargaan </w:t>
-      </w:r>
-      <w:r>
-        <w:rPr>
-          <w:rFonts w:ascii="Times New Roman" w:hAnsi="Times New Roman" w:cs="Times New Roman"/>
-        </w:rPr>
-        <w:lastRenderedPageBreak/>
-        <w:t>terhadap kontribusi mitra dalam kelancaran pelaksanaan Kerja Praktek.</w:t>
+        <w:t>dirancang untuk menyampaikan apresiasi dan ucapan terima kasih dari penulis kepada mitra proyek, yaitu Biro Publikasi dan Admisi (BPA) Universitas Muhammadiyah Purwokerto. Ucapan ini ditujukan kepada pimpinan maupun staf yang telah memberikan dukungan, kemudahan akses data, serta bimbingan selama proses pengerjaan proyek berlangsung. Kehadiran bagian ini juga menjadi bentuk penghargaan terhadap kontribusi mitra dalam kelancaran pelaksanaan Kerja Praktek.</w:t>
       </w:r>
     </w:p>
     <w:p>
@@ -22663,6 +23455,7 @@
           <w:rFonts w:ascii="Times New Roman" w:hAnsi="Times New Roman" w:cs="Times New Roman"/>
           <w:noProof/>
         </w:rPr>
+        <w:lastRenderedPageBreak/>
         <w:drawing>
           <wp:inline distT="0" distB="0" distL="0" distR="0" wp14:anchorId="1BCAA558" wp14:editId="1AD5DCA7">
             <wp:extent cx="3960000" cy="2104500"/>
@@ -25193,6 +25986,92 @@
     </w:lvl>
   </w:abstractNum>
   <w:abstractNum w:abstractNumId="1" w15:restartNumberingAfterBreak="0">
+    <w:nsid w:val="0BD64056"/>
+    <w:multiLevelType w:val="hybridMultilevel"/>
+    <w:tmpl w:val="D56C4B0E"/>
+    <w:lvl w:ilvl="0" w:tplc="0409001B">
+      <w:start w:val="1"/>
+      <w:numFmt w:val="lowerRoman"/>
+      <w:lvlText w:val="%1."/>
+      <w:lvlJc w:val="right"/>
+      <w:pPr>
+        <w:ind w:left="2880" w:hanging="360"/>
+      </w:pPr>
+    </w:lvl>
+    <w:lvl w:ilvl="1" w:tplc="04090019" w:tentative="1">
+      <w:start w:val="1"/>
+      <w:numFmt w:val="lowerLetter"/>
+      <w:lvlText w:val="%2."/>
+      <w:lvlJc w:val="left"/>
+      <w:pPr>
+        <w:ind w:left="3600" w:hanging="360"/>
+      </w:pPr>
+    </w:lvl>
+    <w:lvl w:ilvl="2" w:tplc="0409001B" w:tentative="1">
+      <w:start w:val="1"/>
+      <w:numFmt w:val="lowerRoman"/>
+      <w:lvlText w:val="%3."/>
+      <w:lvlJc w:val="right"/>
+      <w:pPr>
+        <w:ind w:left="4320" w:hanging="180"/>
+      </w:pPr>
+    </w:lvl>
+    <w:lvl w:ilvl="3" w:tplc="0409000F" w:tentative="1">
+      <w:start w:val="1"/>
+      <w:numFmt w:val="decimal"/>
+      <w:lvlText w:val="%4."/>
+      <w:lvlJc w:val="left"/>
+      <w:pPr>
+        <w:ind w:left="5040" w:hanging="360"/>
+      </w:pPr>
+    </w:lvl>
+    <w:lvl w:ilvl="4" w:tplc="04090019" w:tentative="1">
+      <w:start w:val="1"/>
+      <w:numFmt w:val="lowerLetter"/>
+      <w:lvlText w:val="%5."/>
+      <w:lvlJc w:val="left"/>
+      <w:pPr>
+        <w:ind w:left="5760" w:hanging="360"/>
+      </w:pPr>
+    </w:lvl>
+    <w:lvl w:ilvl="5" w:tplc="0409001B" w:tentative="1">
+      <w:start w:val="1"/>
+      <w:numFmt w:val="lowerRoman"/>
+      <w:lvlText w:val="%6."/>
+      <w:lvlJc w:val="right"/>
+      <w:pPr>
+        <w:ind w:left="6480" w:hanging="180"/>
+      </w:pPr>
+    </w:lvl>
+    <w:lvl w:ilvl="6" w:tplc="0409000F" w:tentative="1">
+      <w:start w:val="1"/>
+      <w:numFmt w:val="decimal"/>
+      <w:lvlText w:val="%7."/>
+      <w:lvlJc w:val="left"/>
+      <w:pPr>
+        <w:ind w:left="7200" w:hanging="360"/>
+      </w:pPr>
+    </w:lvl>
+    <w:lvl w:ilvl="7" w:tplc="04090019" w:tentative="1">
+      <w:start w:val="1"/>
+      <w:numFmt w:val="lowerLetter"/>
+      <w:lvlText w:val="%8."/>
+      <w:lvlJc w:val="left"/>
+      <w:pPr>
+        <w:ind w:left="7920" w:hanging="360"/>
+      </w:pPr>
+    </w:lvl>
+    <w:lvl w:ilvl="8" w:tplc="0409001B" w:tentative="1">
+      <w:start w:val="1"/>
+      <w:numFmt w:val="lowerRoman"/>
+      <w:lvlText w:val="%9."/>
+      <w:lvlJc w:val="right"/>
+      <w:pPr>
+        <w:ind w:left="8640" w:hanging="180"/>
+      </w:pPr>
+    </w:lvl>
+  </w:abstractNum>
+  <w:abstractNum w:abstractNumId="2" w15:restartNumberingAfterBreak="0">
     <w:nsid w:val="0D064769"/>
     <w:multiLevelType w:val="hybridMultilevel"/>
     <w:tmpl w:val="A1FCCCE2"/>
@@ -25278,7 +26157,7 @@
       </w:pPr>
     </w:lvl>
   </w:abstractNum>
-  <w:abstractNum w:abstractNumId="2" w15:restartNumberingAfterBreak="0">
+  <w:abstractNum w:abstractNumId="3" w15:restartNumberingAfterBreak="0">
     <w:nsid w:val="0E9E6DAC"/>
     <w:multiLevelType w:val="hybridMultilevel"/>
     <w:tmpl w:val="5CC0A746"/>
@@ -25364,7 +26243,7 @@
       </w:pPr>
     </w:lvl>
   </w:abstractNum>
-  <w:abstractNum w:abstractNumId="3" w15:restartNumberingAfterBreak="0">
+  <w:abstractNum w:abstractNumId="4" w15:restartNumberingAfterBreak="0">
     <w:nsid w:val="0F3061BA"/>
     <w:multiLevelType w:val="hybridMultilevel"/>
     <w:tmpl w:val="A5E4AB5A"/>
@@ -25477,7 +26356,7 @@
       </w:rPr>
     </w:lvl>
   </w:abstractNum>
-  <w:abstractNum w:abstractNumId="4" w15:restartNumberingAfterBreak="0">
+  <w:abstractNum w:abstractNumId="5" w15:restartNumberingAfterBreak="0">
     <w:nsid w:val="1461066E"/>
     <w:multiLevelType w:val="hybridMultilevel"/>
     <w:tmpl w:val="A22AB4B8"/>
@@ -25563,7 +26442,7 @@
       </w:pPr>
     </w:lvl>
   </w:abstractNum>
-  <w:abstractNum w:abstractNumId="5" w15:restartNumberingAfterBreak="0">
+  <w:abstractNum w:abstractNumId="6" w15:restartNumberingAfterBreak="0">
     <w:nsid w:val="18BD3AFC"/>
     <w:multiLevelType w:val="hybridMultilevel"/>
     <w:tmpl w:val="41E44DE0"/>
@@ -25676,7 +26555,7 @@
       </w:rPr>
     </w:lvl>
   </w:abstractNum>
-  <w:abstractNum w:abstractNumId="6" w15:restartNumberingAfterBreak="0">
+  <w:abstractNum w:abstractNumId="7" w15:restartNumberingAfterBreak="0">
     <w:nsid w:val="1B792F65"/>
     <w:multiLevelType w:val="hybridMultilevel"/>
     <w:tmpl w:val="5082DAE2"/>
@@ -25789,7 +26668,7 @@
       </w:rPr>
     </w:lvl>
   </w:abstractNum>
-  <w:abstractNum w:abstractNumId="7" w15:restartNumberingAfterBreak="0">
+  <w:abstractNum w:abstractNumId="8" w15:restartNumberingAfterBreak="0">
     <w:nsid w:val="1B8B5DC0"/>
     <w:multiLevelType w:val="hybridMultilevel"/>
     <w:tmpl w:val="0064516C"/>
@@ -25879,7 +26758,7 @@
       </w:pPr>
     </w:lvl>
   </w:abstractNum>
-  <w:abstractNum w:abstractNumId="8" w15:restartNumberingAfterBreak="0">
+  <w:abstractNum w:abstractNumId="9" w15:restartNumberingAfterBreak="0">
     <w:nsid w:val="1FE53CE5"/>
     <w:multiLevelType w:val="hybridMultilevel"/>
     <w:tmpl w:val="D2EAEADC"/>
@@ -25966,7 +26845,7 @@
       </w:pPr>
     </w:lvl>
   </w:abstractNum>
-  <w:abstractNum w:abstractNumId="9" w15:restartNumberingAfterBreak="0">
+  <w:abstractNum w:abstractNumId="10" w15:restartNumberingAfterBreak="0">
     <w:nsid w:val="230538D6"/>
     <w:multiLevelType w:val="hybridMultilevel"/>
     <w:tmpl w:val="A5E4AB5A"/>
@@ -26079,7 +26958,206 @@
       </w:rPr>
     </w:lvl>
   </w:abstractNum>
-  <w:abstractNum w:abstractNumId="10" w15:restartNumberingAfterBreak="0">
+  <w:abstractNum w:abstractNumId="11" w15:restartNumberingAfterBreak="0">
+    <w:nsid w:val="26594F3A"/>
+    <w:multiLevelType w:val="hybridMultilevel"/>
+    <w:tmpl w:val="35182BF8"/>
+    <w:lvl w:ilvl="0" w:tplc="04090001">
+      <w:start w:val="1"/>
+      <w:numFmt w:val="bullet"/>
+      <w:lvlText w:val=""/>
+      <w:lvlJc w:val="left"/>
+      <w:pPr>
+        <w:ind w:left="1080" w:hanging="360"/>
+      </w:pPr>
+      <w:rPr>
+        <w:rFonts w:ascii="Symbol" w:hAnsi="Symbol" w:hint="default"/>
+      </w:rPr>
+    </w:lvl>
+    <w:lvl w:ilvl="1" w:tplc="04090003" w:tentative="1">
+      <w:start w:val="1"/>
+      <w:numFmt w:val="bullet"/>
+      <w:lvlText w:val="o"/>
+      <w:lvlJc w:val="left"/>
+      <w:pPr>
+        <w:ind w:left="1800" w:hanging="360"/>
+      </w:pPr>
+      <w:rPr>
+        <w:rFonts w:ascii="Courier New" w:hAnsi="Courier New" w:cs="Courier New" w:hint="default"/>
+      </w:rPr>
+    </w:lvl>
+    <w:lvl w:ilvl="2" w:tplc="04090005" w:tentative="1">
+      <w:start w:val="1"/>
+      <w:numFmt w:val="bullet"/>
+      <w:lvlText w:val=""/>
+      <w:lvlJc w:val="left"/>
+      <w:pPr>
+        <w:ind w:left="2520" w:hanging="360"/>
+      </w:pPr>
+      <w:rPr>
+        <w:rFonts w:ascii="Wingdings" w:hAnsi="Wingdings" w:hint="default"/>
+      </w:rPr>
+    </w:lvl>
+    <w:lvl w:ilvl="3" w:tplc="04090001" w:tentative="1">
+      <w:start w:val="1"/>
+      <w:numFmt w:val="bullet"/>
+      <w:lvlText w:val=""/>
+      <w:lvlJc w:val="left"/>
+      <w:pPr>
+        <w:ind w:left="3240" w:hanging="360"/>
+      </w:pPr>
+      <w:rPr>
+        <w:rFonts w:ascii="Symbol" w:hAnsi="Symbol" w:hint="default"/>
+      </w:rPr>
+    </w:lvl>
+    <w:lvl w:ilvl="4" w:tplc="04090003" w:tentative="1">
+      <w:start w:val="1"/>
+      <w:numFmt w:val="bullet"/>
+      <w:lvlText w:val="o"/>
+      <w:lvlJc w:val="left"/>
+      <w:pPr>
+        <w:ind w:left="3960" w:hanging="360"/>
+      </w:pPr>
+      <w:rPr>
+        <w:rFonts w:ascii="Courier New" w:hAnsi="Courier New" w:cs="Courier New" w:hint="default"/>
+      </w:rPr>
+    </w:lvl>
+    <w:lvl w:ilvl="5" w:tplc="04090005" w:tentative="1">
+      <w:start w:val="1"/>
+      <w:numFmt w:val="bullet"/>
+      <w:lvlText w:val=""/>
+      <w:lvlJc w:val="left"/>
+      <w:pPr>
+        <w:ind w:left="4680" w:hanging="360"/>
+      </w:pPr>
+      <w:rPr>
+        <w:rFonts w:ascii="Wingdings" w:hAnsi="Wingdings" w:hint="default"/>
+      </w:rPr>
+    </w:lvl>
+    <w:lvl w:ilvl="6" w:tplc="04090001" w:tentative="1">
+      <w:start w:val="1"/>
+      <w:numFmt w:val="bullet"/>
+      <w:lvlText w:val=""/>
+      <w:lvlJc w:val="left"/>
+      <w:pPr>
+        <w:ind w:left="5400" w:hanging="360"/>
+      </w:pPr>
+      <w:rPr>
+        <w:rFonts w:ascii="Symbol" w:hAnsi="Symbol" w:hint="default"/>
+      </w:rPr>
+    </w:lvl>
+    <w:lvl w:ilvl="7" w:tplc="04090003" w:tentative="1">
+      <w:start w:val="1"/>
+      <w:numFmt w:val="bullet"/>
+      <w:lvlText w:val="o"/>
+      <w:lvlJc w:val="left"/>
+      <w:pPr>
+        <w:ind w:left="6120" w:hanging="360"/>
+      </w:pPr>
+      <w:rPr>
+        <w:rFonts w:ascii="Courier New" w:hAnsi="Courier New" w:cs="Courier New" w:hint="default"/>
+      </w:rPr>
+    </w:lvl>
+    <w:lvl w:ilvl="8" w:tplc="04090005" w:tentative="1">
+      <w:start w:val="1"/>
+      <w:numFmt w:val="bullet"/>
+      <w:lvlText w:val=""/>
+      <w:lvlJc w:val="left"/>
+      <w:pPr>
+        <w:ind w:left="6840" w:hanging="360"/>
+      </w:pPr>
+      <w:rPr>
+        <w:rFonts w:ascii="Wingdings" w:hAnsi="Wingdings" w:hint="default"/>
+      </w:rPr>
+    </w:lvl>
+  </w:abstractNum>
+  <w:abstractNum w:abstractNumId="12" w15:restartNumberingAfterBreak="0">
+    <w:nsid w:val="2736703D"/>
+    <w:multiLevelType w:val="hybridMultilevel"/>
+    <w:tmpl w:val="2A8467E4"/>
+    <w:lvl w:ilvl="0" w:tplc="0409001B">
+      <w:start w:val="1"/>
+      <w:numFmt w:val="lowerRoman"/>
+      <w:lvlText w:val="%1."/>
+      <w:lvlJc w:val="right"/>
+      <w:pPr>
+        <w:ind w:left="2880" w:hanging="360"/>
+      </w:pPr>
+    </w:lvl>
+    <w:lvl w:ilvl="1" w:tplc="04090019" w:tentative="1">
+      <w:start w:val="1"/>
+      <w:numFmt w:val="lowerLetter"/>
+      <w:lvlText w:val="%2."/>
+      <w:lvlJc w:val="left"/>
+      <w:pPr>
+        <w:ind w:left="3600" w:hanging="360"/>
+      </w:pPr>
+    </w:lvl>
+    <w:lvl w:ilvl="2" w:tplc="0409001B" w:tentative="1">
+      <w:start w:val="1"/>
+      <w:numFmt w:val="lowerRoman"/>
+      <w:lvlText w:val="%3."/>
+      <w:lvlJc w:val="right"/>
+      <w:pPr>
+        <w:ind w:left="4320" w:hanging="180"/>
+      </w:pPr>
+    </w:lvl>
+    <w:lvl w:ilvl="3" w:tplc="0409000F" w:tentative="1">
+      <w:start w:val="1"/>
+      <w:numFmt w:val="decimal"/>
+      <w:lvlText w:val="%4."/>
+      <w:lvlJc w:val="left"/>
+      <w:pPr>
+        <w:ind w:left="5040" w:hanging="360"/>
+      </w:pPr>
+    </w:lvl>
+    <w:lvl w:ilvl="4" w:tplc="04090019" w:tentative="1">
+      <w:start w:val="1"/>
+      <w:numFmt w:val="lowerLetter"/>
+      <w:lvlText w:val="%5."/>
+      <w:lvlJc w:val="left"/>
+      <w:pPr>
+        <w:ind w:left="5760" w:hanging="360"/>
+      </w:pPr>
+    </w:lvl>
+    <w:lvl w:ilvl="5" w:tplc="0409001B" w:tentative="1">
+      <w:start w:val="1"/>
+      <w:numFmt w:val="lowerRoman"/>
+      <w:lvlText w:val="%6."/>
+      <w:lvlJc w:val="right"/>
+      <w:pPr>
+        <w:ind w:left="6480" w:hanging="180"/>
+      </w:pPr>
+    </w:lvl>
+    <w:lvl w:ilvl="6" w:tplc="0409000F" w:tentative="1">
+      <w:start w:val="1"/>
+      <w:numFmt w:val="decimal"/>
+      <w:lvlText w:val="%7."/>
+      <w:lvlJc w:val="left"/>
+      <w:pPr>
+        <w:ind w:left="7200" w:hanging="360"/>
+      </w:pPr>
+    </w:lvl>
+    <w:lvl w:ilvl="7" w:tplc="04090019" w:tentative="1">
+      <w:start w:val="1"/>
+      <w:numFmt w:val="lowerLetter"/>
+      <w:lvlText w:val="%8."/>
+      <w:lvlJc w:val="left"/>
+      <w:pPr>
+        <w:ind w:left="7920" w:hanging="360"/>
+      </w:pPr>
+    </w:lvl>
+    <w:lvl w:ilvl="8" w:tplc="0409001B" w:tentative="1">
+      <w:start w:val="1"/>
+      <w:numFmt w:val="lowerRoman"/>
+      <w:lvlText w:val="%9."/>
+      <w:lvlJc w:val="right"/>
+      <w:pPr>
+        <w:ind w:left="8640" w:hanging="180"/>
+      </w:pPr>
+    </w:lvl>
+  </w:abstractNum>
+  <w:abstractNum w:abstractNumId="13" w15:restartNumberingAfterBreak="0">
     <w:nsid w:val="2AFF388C"/>
     <w:multiLevelType w:val="hybridMultilevel"/>
     <w:tmpl w:val="42EE2B3A"/>
@@ -26165,7 +27243,7 @@
       </w:pPr>
     </w:lvl>
   </w:abstractNum>
-  <w:abstractNum w:abstractNumId="11" w15:restartNumberingAfterBreak="0">
+  <w:abstractNum w:abstractNumId="14" w15:restartNumberingAfterBreak="0">
     <w:nsid w:val="2B7B57CD"/>
     <w:multiLevelType w:val="hybridMultilevel"/>
     <w:tmpl w:val="37AE739A"/>
@@ -26279,7 +27357,7 @@
       </w:rPr>
     </w:lvl>
   </w:abstractNum>
-  <w:abstractNum w:abstractNumId="12" w15:restartNumberingAfterBreak="0">
+  <w:abstractNum w:abstractNumId="15" w15:restartNumberingAfterBreak="0">
     <w:nsid w:val="2EE4123E"/>
     <w:multiLevelType w:val="hybridMultilevel"/>
     <w:tmpl w:val="B3009F48"/>
@@ -26392,7 +27470,93 @@
       </w:rPr>
     </w:lvl>
   </w:abstractNum>
-  <w:abstractNum w:abstractNumId="13" w15:restartNumberingAfterBreak="0">
+  <w:abstractNum w:abstractNumId="16" w15:restartNumberingAfterBreak="0">
+    <w:nsid w:val="2F5101DA"/>
+    <w:multiLevelType w:val="hybridMultilevel"/>
+    <w:tmpl w:val="6CC08692"/>
+    <w:lvl w:ilvl="0" w:tplc="0409001B">
+      <w:start w:val="1"/>
+      <w:numFmt w:val="lowerRoman"/>
+      <w:lvlText w:val="%1."/>
+      <w:lvlJc w:val="right"/>
+      <w:pPr>
+        <w:ind w:left="2880" w:hanging="360"/>
+      </w:pPr>
+    </w:lvl>
+    <w:lvl w:ilvl="1" w:tplc="04090019" w:tentative="1">
+      <w:start w:val="1"/>
+      <w:numFmt w:val="lowerLetter"/>
+      <w:lvlText w:val="%2."/>
+      <w:lvlJc w:val="left"/>
+      <w:pPr>
+        <w:ind w:left="3600" w:hanging="360"/>
+      </w:pPr>
+    </w:lvl>
+    <w:lvl w:ilvl="2" w:tplc="0409001B" w:tentative="1">
+      <w:start w:val="1"/>
+      <w:numFmt w:val="lowerRoman"/>
+      <w:lvlText w:val="%3."/>
+      <w:lvlJc w:val="right"/>
+      <w:pPr>
+        <w:ind w:left="4320" w:hanging="180"/>
+      </w:pPr>
+    </w:lvl>
+    <w:lvl w:ilvl="3" w:tplc="0409000F" w:tentative="1">
+      <w:start w:val="1"/>
+      <w:numFmt w:val="decimal"/>
+      <w:lvlText w:val="%4."/>
+      <w:lvlJc w:val="left"/>
+      <w:pPr>
+        <w:ind w:left="5040" w:hanging="360"/>
+      </w:pPr>
+    </w:lvl>
+    <w:lvl w:ilvl="4" w:tplc="04090019" w:tentative="1">
+      <w:start w:val="1"/>
+      <w:numFmt w:val="lowerLetter"/>
+      <w:lvlText w:val="%5."/>
+      <w:lvlJc w:val="left"/>
+      <w:pPr>
+        <w:ind w:left="5760" w:hanging="360"/>
+      </w:pPr>
+    </w:lvl>
+    <w:lvl w:ilvl="5" w:tplc="0409001B" w:tentative="1">
+      <w:start w:val="1"/>
+      <w:numFmt w:val="lowerRoman"/>
+      <w:lvlText w:val="%6."/>
+      <w:lvlJc w:val="right"/>
+      <w:pPr>
+        <w:ind w:left="6480" w:hanging="180"/>
+      </w:pPr>
+    </w:lvl>
+    <w:lvl w:ilvl="6" w:tplc="0409000F" w:tentative="1">
+      <w:start w:val="1"/>
+      <w:numFmt w:val="decimal"/>
+      <w:lvlText w:val="%7."/>
+      <w:lvlJc w:val="left"/>
+      <w:pPr>
+        <w:ind w:left="7200" w:hanging="360"/>
+      </w:pPr>
+    </w:lvl>
+    <w:lvl w:ilvl="7" w:tplc="04090019" w:tentative="1">
+      <w:start w:val="1"/>
+      <w:numFmt w:val="lowerLetter"/>
+      <w:lvlText w:val="%8."/>
+      <w:lvlJc w:val="left"/>
+      <w:pPr>
+        <w:ind w:left="7920" w:hanging="360"/>
+      </w:pPr>
+    </w:lvl>
+    <w:lvl w:ilvl="8" w:tplc="0409001B" w:tentative="1">
+      <w:start w:val="1"/>
+      <w:numFmt w:val="lowerRoman"/>
+      <w:lvlText w:val="%9."/>
+      <w:lvlJc w:val="right"/>
+      <w:pPr>
+        <w:ind w:left="8640" w:hanging="180"/>
+      </w:pPr>
+    </w:lvl>
+  </w:abstractNum>
+  <w:abstractNum w:abstractNumId="17" w15:restartNumberingAfterBreak="0">
     <w:nsid w:val="33C7115B"/>
     <w:multiLevelType w:val="hybridMultilevel"/>
     <w:tmpl w:val="1C98414A"/>
@@ -26478,7 +27642,7 @@
       </w:pPr>
     </w:lvl>
   </w:abstractNum>
-  <w:abstractNum w:abstractNumId="14" w15:restartNumberingAfterBreak="0">
+  <w:abstractNum w:abstractNumId="18" w15:restartNumberingAfterBreak="0">
     <w:nsid w:val="34170E93"/>
     <w:multiLevelType w:val="hybridMultilevel"/>
     <w:tmpl w:val="B5181170"/>
@@ -26564,7 +27728,7 @@
       </w:pPr>
     </w:lvl>
   </w:abstractNum>
-  <w:abstractNum w:abstractNumId="15" w15:restartNumberingAfterBreak="0">
+  <w:abstractNum w:abstractNumId="19" w15:restartNumberingAfterBreak="0">
     <w:nsid w:val="35715EFD"/>
     <w:multiLevelType w:val="hybridMultilevel"/>
     <w:tmpl w:val="95BAA8E8"/>
@@ -26677,10 +27841,10 @@
       </w:rPr>
     </w:lvl>
   </w:abstractNum>
-  <w:abstractNum w:abstractNumId="16" w15:restartNumberingAfterBreak="0">
+  <w:abstractNum w:abstractNumId="20" w15:restartNumberingAfterBreak="0">
     <w:nsid w:val="4167498C"/>
     <w:multiLevelType w:val="hybridMultilevel"/>
-    <w:tmpl w:val="AC70AFAC"/>
+    <w:tmpl w:val="D8C492C6"/>
     <w:lvl w:ilvl="0" w:tplc="164E053A">
       <w:start w:val="1"/>
       <w:numFmt w:val="decimal"/>
@@ -26767,7 +27931,7 @@
       </w:pPr>
     </w:lvl>
   </w:abstractNum>
-  <w:abstractNum w:abstractNumId="17" w15:restartNumberingAfterBreak="0">
+  <w:abstractNum w:abstractNumId="21" w15:restartNumberingAfterBreak="0">
     <w:nsid w:val="42A60C91"/>
     <w:multiLevelType w:val="hybridMultilevel"/>
     <w:tmpl w:val="B0CCFC00"/>
@@ -26853,7 +28017,93 @@
       </w:pPr>
     </w:lvl>
   </w:abstractNum>
-  <w:abstractNum w:abstractNumId="18" w15:restartNumberingAfterBreak="0">
+  <w:abstractNum w:abstractNumId="22" w15:restartNumberingAfterBreak="0">
+    <w:nsid w:val="48873773"/>
+    <w:multiLevelType w:val="hybridMultilevel"/>
+    <w:tmpl w:val="C9485038"/>
+    <w:lvl w:ilvl="0" w:tplc="0409001B">
+      <w:start w:val="1"/>
+      <w:numFmt w:val="lowerRoman"/>
+      <w:lvlText w:val="%1."/>
+      <w:lvlJc w:val="right"/>
+      <w:pPr>
+        <w:ind w:left="2880" w:hanging="360"/>
+      </w:pPr>
+    </w:lvl>
+    <w:lvl w:ilvl="1" w:tplc="04090019" w:tentative="1">
+      <w:start w:val="1"/>
+      <w:numFmt w:val="lowerLetter"/>
+      <w:lvlText w:val="%2."/>
+      <w:lvlJc w:val="left"/>
+      <w:pPr>
+        <w:ind w:left="3600" w:hanging="360"/>
+      </w:pPr>
+    </w:lvl>
+    <w:lvl w:ilvl="2" w:tplc="0409001B" w:tentative="1">
+      <w:start w:val="1"/>
+      <w:numFmt w:val="lowerRoman"/>
+      <w:lvlText w:val="%3."/>
+      <w:lvlJc w:val="right"/>
+      <w:pPr>
+        <w:ind w:left="4320" w:hanging="180"/>
+      </w:pPr>
+    </w:lvl>
+    <w:lvl w:ilvl="3" w:tplc="0409000F" w:tentative="1">
+      <w:start w:val="1"/>
+      <w:numFmt w:val="decimal"/>
+      <w:lvlText w:val="%4."/>
+      <w:lvlJc w:val="left"/>
+      <w:pPr>
+        <w:ind w:left="5040" w:hanging="360"/>
+      </w:pPr>
+    </w:lvl>
+    <w:lvl w:ilvl="4" w:tplc="04090019" w:tentative="1">
+      <w:start w:val="1"/>
+      <w:numFmt w:val="lowerLetter"/>
+      <w:lvlText w:val="%5."/>
+      <w:lvlJc w:val="left"/>
+      <w:pPr>
+        <w:ind w:left="5760" w:hanging="360"/>
+      </w:pPr>
+    </w:lvl>
+    <w:lvl w:ilvl="5" w:tplc="0409001B" w:tentative="1">
+      <w:start w:val="1"/>
+      <w:numFmt w:val="lowerRoman"/>
+      <w:lvlText w:val="%6."/>
+      <w:lvlJc w:val="right"/>
+      <w:pPr>
+        <w:ind w:left="6480" w:hanging="180"/>
+      </w:pPr>
+    </w:lvl>
+    <w:lvl w:ilvl="6" w:tplc="0409000F" w:tentative="1">
+      <w:start w:val="1"/>
+      <w:numFmt w:val="decimal"/>
+      <w:lvlText w:val="%7."/>
+      <w:lvlJc w:val="left"/>
+      <w:pPr>
+        <w:ind w:left="7200" w:hanging="360"/>
+      </w:pPr>
+    </w:lvl>
+    <w:lvl w:ilvl="7" w:tplc="04090019" w:tentative="1">
+      <w:start w:val="1"/>
+      <w:numFmt w:val="lowerLetter"/>
+      <w:lvlText w:val="%8."/>
+      <w:lvlJc w:val="left"/>
+      <w:pPr>
+        <w:ind w:left="7920" w:hanging="360"/>
+      </w:pPr>
+    </w:lvl>
+    <w:lvl w:ilvl="8" w:tplc="0409001B" w:tentative="1">
+      <w:start w:val="1"/>
+      <w:numFmt w:val="lowerRoman"/>
+      <w:lvlText w:val="%9."/>
+      <w:lvlJc w:val="right"/>
+      <w:pPr>
+        <w:ind w:left="8640" w:hanging="180"/>
+      </w:pPr>
+    </w:lvl>
+  </w:abstractNum>
+  <w:abstractNum w:abstractNumId="23" w15:restartNumberingAfterBreak="0">
     <w:nsid w:val="49F75CB3"/>
     <w:multiLevelType w:val="hybridMultilevel"/>
     <w:tmpl w:val="1A7C4FE4"/>
@@ -26939,7 +28189,93 @@
       </w:pPr>
     </w:lvl>
   </w:abstractNum>
-  <w:abstractNum w:abstractNumId="19" w15:restartNumberingAfterBreak="0">
+  <w:abstractNum w:abstractNumId="24" w15:restartNumberingAfterBreak="0">
+    <w:nsid w:val="4A8800F8"/>
+    <w:multiLevelType w:val="hybridMultilevel"/>
+    <w:tmpl w:val="666243BA"/>
+    <w:lvl w:ilvl="0" w:tplc="04090017">
+      <w:start w:val="1"/>
+      <w:numFmt w:val="lowerLetter"/>
+      <w:lvlText w:val="%1)"/>
+      <w:lvlJc w:val="left"/>
+      <w:pPr>
+        <w:ind w:left="2160" w:hanging="360"/>
+      </w:pPr>
+    </w:lvl>
+    <w:lvl w:ilvl="1" w:tplc="0409001B">
+      <w:start w:val="1"/>
+      <w:numFmt w:val="lowerRoman"/>
+      <w:lvlText w:val="%2."/>
+      <w:lvlJc w:val="right"/>
+      <w:pPr>
+        <w:ind w:left="2880" w:hanging="360"/>
+      </w:pPr>
+    </w:lvl>
+    <w:lvl w:ilvl="2" w:tplc="0409001B" w:tentative="1">
+      <w:start w:val="1"/>
+      <w:numFmt w:val="lowerRoman"/>
+      <w:lvlText w:val="%3."/>
+      <w:lvlJc w:val="right"/>
+      <w:pPr>
+        <w:ind w:left="3600" w:hanging="180"/>
+      </w:pPr>
+    </w:lvl>
+    <w:lvl w:ilvl="3" w:tplc="0409000F" w:tentative="1">
+      <w:start w:val="1"/>
+      <w:numFmt w:val="decimal"/>
+      <w:lvlText w:val="%4."/>
+      <w:lvlJc w:val="left"/>
+      <w:pPr>
+        <w:ind w:left="4320" w:hanging="360"/>
+      </w:pPr>
+    </w:lvl>
+    <w:lvl w:ilvl="4" w:tplc="04090019" w:tentative="1">
+      <w:start w:val="1"/>
+      <w:numFmt w:val="lowerLetter"/>
+      <w:lvlText w:val="%5."/>
+      <w:lvlJc w:val="left"/>
+      <w:pPr>
+        <w:ind w:left="5040" w:hanging="360"/>
+      </w:pPr>
+    </w:lvl>
+    <w:lvl w:ilvl="5" w:tplc="0409001B" w:tentative="1">
+      <w:start w:val="1"/>
+      <w:numFmt w:val="lowerRoman"/>
+      <w:lvlText w:val="%6."/>
+      <w:lvlJc w:val="right"/>
+      <w:pPr>
+        <w:ind w:left="5760" w:hanging="180"/>
+      </w:pPr>
+    </w:lvl>
+    <w:lvl w:ilvl="6" w:tplc="0409000F" w:tentative="1">
+      <w:start w:val="1"/>
+      <w:numFmt w:val="decimal"/>
+      <w:lvlText w:val="%7."/>
+      <w:lvlJc w:val="left"/>
+      <w:pPr>
+        <w:ind w:left="6480" w:hanging="360"/>
+      </w:pPr>
+    </w:lvl>
+    <w:lvl w:ilvl="7" w:tplc="04090019" w:tentative="1">
+      <w:start w:val="1"/>
+      <w:numFmt w:val="lowerLetter"/>
+      <w:lvlText w:val="%8."/>
+      <w:lvlJc w:val="left"/>
+      <w:pPr>
+        <w:ind w:left="7200" w:hanging="360"/>
+      </w:pPr>
+    </w:lvl>
+    <w:lvl w:ilvl="8" w:tplc="0409001B" w:tentative="1">
+      <w:start w:val="1"/>
+      <w:numFmt w:val="lowerRoman"/>
+      <w:lvlText w:val="%9."/>
+      <w:lvlJc w:val="right"/>
+      <w:pPr>
+        <w:ind w:left="7920" w:hanging="180"/>
+      </w:pPr>
+    </w:lvl>
+  </w:abstractNum>
+  <w:abstractNum w:abstractNumId="25" w15:restartNumberingAfterBreak="0">
     <w:nsid w:val="4F7E66BA"/>
     <w:multiLevelType w:val="hybridMultilevel"/>
     <w:tmpl w:val="79F2C6B8"/>
@@ -27052,7 +28388,7 @@
       </w:rPr>
     </w:lvl>
   </w:abstractNum>
-  <w:abstractNum w:abstractNumId="20" w15:restartNumberingAfterBreak="0">
+  <w:abstractNum w:abstractNumId="26" w15:restartNumberingAfterBreak="0">
     <w:nsid w:val="51F91447"/>
     <w:multiLevelType w:val="hybridMultilevel"/>
     <w:tmpl w:val="55006888"/>
@@ -27165,7 +28501,351 @@
       </w:rPr>
     </w:lvl>
   </w:abstractNum>
-  <w:abstractNum w:abstractNumId="21" w15:restartNumberingAfterBreak="0">
+  <w:abstractNum w:abstractNumId="27" w15:restartNumberingAfterBreak="0">
+    <w:nsid w:val="56C929B9"/>
+    <w:multiLevelType w:val="hybridMultilevel"/>
+    <w:tmpl w:val="D0864D98"/>
+    <w:lvl w:ilvl="0" w:tplc="0409001B">
+      <w:start w:val="1"/>
+      <w:numFmt w:val="lowerRoman"/>
+      <w:lvlText w:val="%1."/>
+      <w:lvlJc w:val="right"/>
+      <w:pPr>
+        <w:ind w:left="2880" w:hanging="360"/>
+      </w:pPr>
+    </w:lvl>
+    <w:lvl w:ilvl="1" w:tplc="04090019" w:tentative="1">
+      <w:start w:val="1"/>
+      <w:numFmt w:val="lowerLetter"/>
+      <w:lvlText w:val="%2."/>
+      <w:lvlJc w:val="left"/>
+      <w:pPr>
+        <w:ind w:left="3600" w:hanging="360"/>
+      </w:pPr>
+    </w:lvl>
+    <w:lvl w:ilvl="2" w:tplc="0409001B" w:tentative="1">
+      <w:start w:val="1"/>
+      <w:numFmt w:val="lowerRoman"/>
+      <w:lvlText w:val="%3."/>
+      <w:lvlJc w:val="right"/>
+      <w:pPr>
+        <w:ind w:left="4320" w:hanging="180"/>
+      </w:pPr>
+    </w:lvl>
+    <w:lvl w:ilvl="3" w:tplc="0409000F" w:tentative="1">
+      <w:start w:val="1"/>
+      <w:numFmt w:val="decimal"/>
+      <w:lvlText w:val="%4."/>
+      <w:lvlJc w:val="left"/>
+      <w:pPr>
+        <w:ind w:left="5040" w:hanging="360"/>
+      </w:pPr>
+    </w:lvl>
+    <w:lvl w:ilvl="4" w:tplc="04090019" w:tentative="1">
+      <w:start w:val="1"/>
+      <w:numFmt w:val="lowerLetter"/>
+      <w:lvlText w:val="%5."/>
+      <w:lvlJc w:val="left"/>
+      <w:pPr>
+        <w:ind w:left="5760" w:hanging="360"/>
+      </w:pPr>
+    </w:lvl>
+    <w:lvl w:ilvl="5" w:tplc="0409001B" w:tentative="1">
+      <w:start w:val="1"/>
+      <w:numFmt w:val="lowerRoman"/>
+      <w:lvlText w:val="%6."/>
+      <w:lvlJc w:val="right"/>
+      <w:pPr>
+        <w:ind w:left="6480" w:hanging="180"/>
+      </w:pPr>
+    </w:lvl>
+    <w:lvl w:ilvl="6" w:tplc="0409000F" w:tentative="1">
+      <w:start w:val="1"/>
+      <w:numFmt w:val="decimal"/>
+      <w:lvlText w:val="%7."/>
+      <w:lvlJc w:val="left"/>
+      <w:pPr>
+        <w:ind w:left="7200" w:hanging="360"/>
+      </w:pPr>
+    </w:lvl>
+    <w:lvl w:ilvl="7" w:tplc="04090019" w:tentative="1">
+      <w:start w:val="1"/>
+      <w:numFmt w:val="lowerLetter"/>
+      <w:lvlText w:val="%8."/>
+      <w:lvlJc w:val="left"/>
+      <w:pPr>
+        <w:ind w:left="7920" w:hanging="360"/>
+      </w:pPr>
+    </w:lvl>
+    <w:lvl w:ilvl="8" w:tplc="0409001B" w:tentative="1">
+      <w:start w:val="1"/>
+      <w:numFmt w:val="lowerRoman"/>
+      <w:lvlText w:val="%9."/>
+      <w:lvlJc w:val="right"/>
+      <w:pPr>
+        <w:ind w:left="8640" w:hanging="180"/>
+      </w:pPr>
+    </w:lvl>
+  </w:abstractNum>
+  <w:abstractNum w:abstractNumId="28" w15:restartNumberingAfterBreak="0">
+    <w:nsid w:val="59F01F42"/>
+    <w:multiLevelType w:val="hybridMultilevel"/>
+    <w:tmpl w:val="C862F37E"/>
+    <w:lvl w:ilvl="0" w:tplc="0409001B">
+      <w:start w:val="1"/>
+      <w:numFmt w:val="lowerRoman"/>
+      <w:lvlText w:val="%1."/>
+      <w:lvlJc w:val="right"/>
+      <w:pPr>
+        <w:ind w:left="2880" w:hanging="360"/>
+      </w:pPr>
+    </w:lvl>
+    <w:lvl w:ilvl="1" w:tplc="04090019" w:tentative="1">
+      <w:start w:val="1"/>
+      <w:numFmt w:val="lowerLetter"/>
+      <w:lvlText w:val="%2."/>
+      <w:lvlJc w:val="left"/>
+      <w:pPr>
+        <w:ind w:left="3600" w:hanging="360"/>
+      </w:pPr>
+    </w:lvl>
+    <w:lvl w:ilvl="2" w:tplc="0409001B" w:tentative="1">
+      <w:start w:val="1"/>
+      <w:numFmt w:val="lowerRoman"/>
+      <w:lvlText w:val="%3."/>
+      <w:lvlJc w:val="right"/>
+      <w:pPr>
+        <w:ind w:left="4320" w:hanging="180"/>
+      </w:pPr>
+    </w:lvl>
+    <w:lvl w:ilvl="3" w:tplc="0409000F" w:tentative="1">
+      <w:start w:val="1"/>
+      <w:numFmt w:val="decimal"/>
+      <w:lvlText w:val="%4."/>
+      <w:lvlJc w:val="left"/>
+      <w:pPr>
+        <w:ind w:left="5040" w:hanging="360"/>
+      </w:pPr>
+    </w:lvl>
+    <w:lvl w:ilvl="4" w:tplc="04090019" w:tentative="1">
+      <w:start w:val="1"/>
+      <w:numFmt w:val="lowerLetter"/>
+      <w:lvlText w:val="%5."/>
+      <w:lvlJc w:val="left"/>
+      <w:pPr>
+        <w:ind w:left="5760" w:hanging="360"/>
+      </w:pPr>
+    </w:lvl>
+    <w:lvl w:ilvl="5" w:tplc="0409001B" w:tentative="1">
+      <w:start w:val="1"/>
+      <w:numFmt w:val="lowerRoman"/>
+      <w:lvlText w:val="%6."/>
+      <w:lvlJc w:val="right"/>
+      <w:pPr>
+        <w:ind w:left="6480" w:hanging="180"/>
+      </w:pPr>
+    </w:lvl>
+    <w:lvl w:ilvl="6" w:tplc="0409000F" w:tentative="1">
+      <w:start w:val="1"/>
+      <w:numFmt w:val="decimal"/>
+      <w:lvlText w:val="%7."/>
+      <w:lvlJc w:val="left"/>
+      <w:pPr>
+        <w:ind w:left="7200" w:hanging="360"/>
+      </w:pPr>
+    </w:lvl>
+    <w:lvl w:ilvl="7" w:tplc="04090019" w:tentative="1">
+      <w:start w:val="1"/>
+      <w:numFmt w:val="lowerLetter"/>
+      <w:lvlText w:val="%8."/>
+      <w:lvlJc w:val="left"/>
+      <w:pPr>
+        <w:ind w:left="7920" w:hanging="360"/>
+      </w:pPr>
+    </w:lvl>
+    <w:lvl w:ilvl="8" w:tplc="0409001B" w:tentative="1">
+      <w:start w:val="1"/>
+      <w:numFmt w:val="lowerRoman"/>
+      <w:lvlText w:val="%9."/>
+      <w:lvlJc w:val="right"/>
+      <w:pPr>
+        <w:ind w:left="8640" w:hanging="180"/>
+      </w:pPr>
+    </w:lvl>
+  </w:abstractNum>
+  <w:abstractNum w:abstractNumId="29" w15:restartNumberingAfterBreak="0">
+    <w:nsid w:val="5AFA62EE"/>
+    <w:multiLevelType w:val="hybridMultilevel"/>
+    <w:tmpl w:val="1E725DD2"/>
+    <w:lvl w:ilvl="0" w:tplc="0409001B">
+      <w:start w:val="1"/>
+      <w:numFmt w:val="lowerRoman"/>
+      <w:lvlText w:val="%1."/>
+      <w:lvlJc w:val="right"/>
+      <w:pPr>
+        <w:ind w:left="2880" w:hanging="360"/>
+      </w:pPr>
+    </w:lvl>
+    <w:lvl w:ilvl="1" w:tplc="04090019" w:tentative="1">
+      <w:start w:val="1"/>
+      <w:numFmt w:val="lowerLetter"/>
+      <w:lvlText w:val="%2."/>
+      <w:lvlJc w:val="left"/>
+      <w:pPr>
+        <w:ind w:left="3600" w:hanging="360"/>
+      </w:pPr>
+    </w:lvl>
+    <w:lvl w:ilvl="2" w:tplc="0409001B" w:tentative="1">
+      <w:start w:val="1"/>
+      <w:numFmt w:val="lowerRoman"/>
+      <w:lvlText w:val="%3."/>
+      <w:lvlJc w:val="right"/>
+      <w:pPr>
+        <w:ind w:left="4320" w:hanging="180"/>
+      </w:pPr>
+    </w:lvl>
+    <w:lvl w:ilvl="3" w:tplc="0409000F" w:tentative="1">
+      <w:start w:val="1"/>
+      <w:numFmt w:val="decimal"/>
+      <w:lvlText w:val="%4."/>
+      <w:lvlJc w:val="left"/>
+      <w:pPr>
+        <w:ind w:left="5040" w:hanging="360"/>
+      </w:pPr>
+    </w:lvl>
+    <w:lvl w:ilvl="4" w:tplc="04090019" w:tentative="1">
+      <w:start w:val="1"/>
+      <w:numFmt w:val="lowerLetter"/>
+      <w:lvlText w:val="%5."/>
+      <w:lvlJc w:val="left"/>
+      <w:pPr>
+        <w:ind w:left="5760" w:hanging="360"/>
+      </w:pPr>
+    </w:lvl>
+    <w:lvl w:ilvl="5" w:tplc="0409001B" w:tentative="1">
+      <w:start w:val="1"/>
+      <w:numFmt w:val="lowerRoman"/>
+      <w:lvlText w:val="%6."/>
+      <w:lvlJc w:val="right"/>
+      <w:pPr>
+        <w:ind w:left="6480" w:hanging="180"/>
+      </w:pPr>
+    </w:lvl>
+    <w:lvl w:ilvl="6" w:tplc="0409000F" w:tentative="1">
+      <w:start w:val="1"/>
+      <w:numFmt w:val="decimal"/>
+      <w:lvlText w:val="%7."/>
+      <w:lvlJc w:val="left"/>
+      <w:pPr>
+        <w:ind w:left="7200" w:hanging="360"/>
+      </w:pPr>
+    </w:lvl>
+    <w:lvl w:ilvl="7" w:tplc="04090019" w:tentative="1">
+      <w:start w:val="1"/>
+      <w:numFmt w:val="lowerLetter"/>
+      <w:lvlText w:val="%8."/>
+      <w:lvlJc w:val="left"/>
+      <w:pPr>
+        <w:ind w:left="7920" w:hanging="360"/>
+      </w:pPr>
+    </w:lvl>
+    <w:lvl w:ilvl="8" w:tplc="0409001B" w:tentative="1">
+      <w:start w:val="1"/>
+      <w:numFmt w:val="lowerRoman"/>
+      <w:lvlText w:val="%9."/>
+      <w:lvlJc w:val="right"/>
+      <w:pPr>
+        <w:ind w:left="8640" w:hanging="180"/>
+      </w:pPr>
+    </w:lvl>
+  </w:abstractNum>
+  <w:abstractNum w:abstractNumId="30" w15:restartNumberingAfterBreak="0">
+    <w:nsid w:val="5C794746"/>
+    <w:multiLevelType w:val="hybridMultilevel"/>
+    <w:tmpl w:val="304C26A4"/>
+    <w:lvl w:ilvl="0" w:tplc="FFFFFFFF">
+      <w:start w:val="1"/>
+      <w:numFmt w:val="lowerLetter"/>
+      <w:lvlText w:val="%1)"/>
+      <w:lvlJc w:val="left"/>
+      <w:pPr>
+        <w:ind w:left="2160" w:hanging="360"/>
+      </w:pPr>
+    </w:lvl>
+    <w:lvl w:ilvl="1" w:tplc="FFFFFFFF" w:tentative="1">
+      <w:start w:val="1"/>
+      <w:numFmt w:val="lowerLetter"/>
+      <w:lvlText w:val="%2."/>
+      <w:lvlJc w:val="left"/>
+      <w:pPr>
+        <w:ind w:left="2880" w:hanging="360"/>
+      </w:pPr>
+    </w:lvl>
+    <w:lvl w:ilvl="2" w:tplc="FFFFFFFF" w:tentative="1">
+      <w:start w:val="1"/>
+      <w:numFmt w:val="lowerRoman"/>
+      <w:lvlText w:val="%3."/>
+      <w:lvlJc w:val="right"/>
+      <w:pPr>
+        <w:ind w:left="3600" w:hanging="180"/>
+      </w:pPr>
+    </w:lvl>
+    <w:lvl w:ilvl="3" w:tplc="FFFFFFFF" w:tentative="1">
+      <w:start w:val="1"/>
+      <w:numFmt w:val="decimal"/>
+      <w:lvlText w:val="%4."/>
+      <w:lvlJc w:val="left"/>
+      <w:pPr>
+        <w:ind w:left="4320" w:hanging="360"/>
+      </w:pPr>
+    </w:lvl>
+    <w:lvl w:ilvl="4" w:tplc="FFFFFFFF" w:tentative="1">
+      <w:start w:val="1"/>
+      <w:numFmt w:val="lowerLetter"/>
+      <w:lvlText w:val="%5."/>
+      <w:lvlJc w:val="left"/>
+      <w:pPr>
+        <w:ind w:left="5040" w:hanging="360"/>
+      </w:pPr>
+    </w:lvl>
+    <w:lvl w:ilvl="5" w:tplc="FFFFFFFF" w:tentative="1">
+      <w:start w:val="1"/>
+      <w:numFmt w:val="lowerRoman"/>
+      <w:lvlText w:val="%6."/>
+      <w:lvlJc w:val="right"/>
+      <w:pPr>
+        <w:ind w:left="5760" w:hanging="180"/>
+      </w:pPr>
+    </w:lvl>
+    <w:lvl w:ilvl="6" w:tplc="FFFFFFFF" w:tentative="1">
+      <w:start w:val="1"/>
+      <w:numFmt w:val="decimal"/>
+      <w:lvlText w:val="%7."/>
+      <w:lvlJc w:val="left"/>
+      <w:pPr>
+        <w:ind w:left="6480" w:hanging="360"/>
+      </w:pPr>
+    </w:lvl>
+    <w:lvl w:ilvl="7" w:tplc="FFFFFFFF" w:tentative="1">
+      <w:start w:val="1"/>
+      <w:numFmt w:val="lowerLetter"/>
+      <w:lvlText w:val="%8."/>
+      <w:lvlJc w:val="left"/>
+      <w:pPr>
+        <w:ind w:left="7200" w:hanging="360"/>
+      </w:pPr>
+    </w:lvl>
+    <w:lvl w:ilvl="8" w:tplc="FFFFFFFF" w:tentative="1">
+      <w:start w:val="1"/>
+      <w:numFmt w:val="lowerRoman"/>
+      <w:lvlText w:val="%9."/>
+      <w:lvlJc w:val="right"/>
+      <w:pPr>
+        <w:ind w:left="7920" w:hanging="180"/>
+      </w:pPr>
+    </w:lvl>
+  </w:abstractNum>
+  <w:abstractNum w:abstractNumId="31" w15:restartNumberingAfterBreak="0">
     <w:nsid w:val="5D8A4FCC"/>
     <w:multiLevelType w:val="hybridMultilevel"/>
     <w:tmpl w:val="30D6ECA4"/>
@@ -27278,7 +28958,7 @@
       </w:rPr>
     </w:lvl>
   </w:abstractNum>
-  <w:abstractNum w:abstractNumId="22" w15:restartNumberingAfterBreak="0">
+  <w:abstractNum w:abstractNumId="32" w15:restartNumberingAfterBreak="0">
     <w:nsid w:val="5F115D9E"/>
     <w:multiLevelType w:val="hybridMultilevel"/>
     <w:tmpl w:val="D0A4D174"/>
@@ -27364,7 +29044,7 @@
       </w:pPr>
     </w:lvl>
   </w:abstractNum>
-  <w:abstractNum w:abstractNumId="23" w15:restartNumberingAfterBreak="0">
+  <w:abstractNum w:abstractNumId="33" w15:restartNumberingAfterBreak="0">
     <w:nsid w:val="63917590"/>
     <w:multiLevelType w:val="hybridMultilevel"/>
     <w:tmpl w:val="2BACE4D2"/>
@@ -27477,7 +29157,7 @@
       </w:rPr>
     </w:lvl>
   </w:abstractNum>
-  <w:abstractNum w:abstractNumId="24" w15:restartNumberingAfterBreak="0">
+  <w:abstractNum w:abstractNumId="34" w15:restartNumberingAfterBreak="0">
     <w:nsid w:val="643B6605"/>
     <w:multiLevelType w:val="hybridMultilevel"/>
     <w:tmpl w:val="70CCAEF4"/>
@@ -27564,7 +29244,7 @@
       </w:pPr>
     </w:lvl>
   </w:abstractNum>
-  <w:abstractNum w:abstractNumId="25" w15:restartNumberingAfterBreak="0">
+  <w:abstractNum w:abstractNumId="35" w15:restartNumberingAfterBreak="0">
     <w:nsid w:val="6475344C"/>
     <w:multiLevelType w:val="hybridMultilevel"/>
     <w:tmpl w:val="083EA28E"/>
@@ -27650,7 +29330,120 @@
       </w:pPr>
     </w:lvl>
   </w:abstractNum>
-  <w:abstractNum w:abstractNumId="26" w15:restartNumberingAfterBreak="0">
+  <w:abstractNum w:abstractNumId="36" w15:restartNumberingAfterBreak="0">
+    <w:nsid w:val="67782413"/>
+    <w:multiLevelType w:val="hybridMultilevel"/>
+    <w:tmpl w:val="2EDAC6C6"/>
+    <w:lvl w:ilvl="0" w:tplc="04090001">
+      <w:start w:val="1"/>
+      <w:numFmt w:val="bullet"/>
+      <w:lvlText w:val=""/>
+      <w:lvlJc w:val="left"/>
+      <w:pPr>
+        <w:ind w:left="1440" w:hanging="360"/>
+      </w:pPr>
+      <w:rPr>
+        <w:rFonts w:ascii="Symbol" w:hAnsi="Symbol" w:hint="default"/>
+      </w:rPr>
+    </w:lvl>
+    <w:lvl w:ilvl="1" w:tplc="04090003" w:tentative="1">
+      <w:start w:val="1"/>
+      <w:numFmt w:val="bullet"/>
+      <w:lvlText w:val="o"/>
+      <w:lvlJc w:val="left"/>
+      <w:pPr>
+        <w:ind w:left="2160" w:hanging="360"/>
+      </w:pPr>
+      <w:rPr>
+        <w:rFonts w:ascii="Courier New" w:hAnsi="Courier New" w:cs="Courier New" w:hint="default"/>
+      </w:rPr>
+    </w:lvl>
+    <w:lvl w:ilvl="2" w:tplc="04090005" w:tentative="1">
+      <w:start w:val="1"/>
+      <w:numFmt w:val="bullet"/>
+      <w:lvlText w:val=""/>
+      <w:lvlJc w:val="left"/>
+      <w:pPr>
+        <w:ind w:left="2880" w:hanging="360"/>
+      </w:pPr>
+      <w:rPr>
+        <w:rFonts w:ascii="Wingdings" w:hAnsi="Wingdings" w:hint="default"/>
+      </w:rPr>
+    </w:lvl>
+    <w:lvl w:ilvl="3" w:tplc="04090001" w:tentative="1">
+      <w:start w:val="1"/>
+      <w:numFmt w:val="bullet"/>
+      <w:lvlText w:val=""/>
+      <w:lvlJc w:val="left"/>
+      <w:pPr>
+        <w:ind w:left="3600" w:hanging="360"/>
+      </w:pPr>
+      <w:rPr>
+        <w:rFonts w:ascii="Symbol" w:hAnsi="Symbol" w:hint="default"/>
+      </w:rPr>
+    </w:lvl>
+    <w:lvl w:ilvl="4" w:tplc="04090003" w:tentative="1">
+      <w:start w:val="1"/>
+      <w:numFmt w:val="bullet"/>
+      <w:lvlText w:val="o"/>
+      <w:lvlJc w:val="left"/>
+      <w:pPr>
+        <w:ind w:left="4320" w:hanging="360"/>
+      </w:pPr>
+      <w:rPr>
+        <w:rFonts w:ascii="Courier New" w:hAnsi="Courier New" w:cs="Courier New" w:hint="default"/>
+      </w:rPr>
+    </w:lvl>
+    <w:lvl w:ilvl="5" w:tplc="04090005" w:tentative="1">
+      <w:start w:val="1"/>
+      <w:numFmt w:val="bullet"/>
+      <w:lvlText w:val=""/>
+      <w:lvlJc w:val="left"/>
+      <w:pPr>
+        <w:ind w:left="5040" w:hanging="360"/>
+      </w:pPr>
+      <w:rPr>
+        <w:rFonts w:ascii="Wingdings" w:hAnsi="Wingdings" w:hint="default"/>
+      </w:rPr>
+    </w:lvl>
+    <w:lvl w:ilvl="6" w:tplc="04090001" w:tentative="1">
+      <w:start w:val="1"/>
+      <w:numFmt w:val="bullet"/>
+      <w:lvlText w:val=""/>
+      <w:lvlJc w:val="left"/>
+      <w:pPr>
+        <w:ind w:left="5760" w:hanging="360"/>
+      </w:pPr>
+      <w:rPr>
+        <w:rFonts w:ascii="Symbol" w:hAnsi="Symbol" w:hint="default"/>
+      </w:rPr>
+    </w:lvl>
+    <w:lvl w:ilvl="7" w:tplc="04090003" w:tentative="1">
+      <w:start w:val="1"/>
+      <w:numFmt w:val="bullet"/>
+      <w:lvlText w:val="o"/>
+      <w:lvlJc w:val="left"/>
+      <w:pPr>
+        <w:ind w:left="6480" w:hanging="360"/>
+      </w:pPr>
+      <w:rPr>
+        <w:rFonts w:ascii="Courier New" w:hAnsi="Courier New" w:cs="Courier New" w:hint="default"/>
+      </w:rPr>
+    </w:lvl>
+    <w:lvl w:ilvl="8" w:tplc="04090005" w:tentative="1">
+      <w:start w:val="1"/>
+      <w:numFmt w:val="bullet"/>
+      <w:lvlText w:val=""/>
+      <w:lvlJc w:val="left"/>
+      <w:pPr>
+        <w:ind w:left="7200" w:hanging="360"/>
+      </w:pPr>
+      <w:rPr>
+        <w:rFonts w:ascii="Wingdings" w:hAnsi="Wingdings" w:hint="default"/>
+      </w:rPr>
+    </w:lvl>
+  </w:abstractNum>
+  <w:abstractNum w:abstractNumId="37" w15:restartNumberingAfterBreak="0">
     <w:nsid w:val="6B1A06B3"/>
     <w:multiLevelType w:val="hybridMultilevel"/>
     <w:tmpl w:val="95BAA8E8"/>
@@ -27763,7 +29556,93 @@
       </w:rPr>
     </w:lvl>
   </w:abstractNum>
-  <w:abstractNum w:abstractNumId="27" w15:restartNumberingAfterBreak="0">
+  <w:abstractNum w:abstractNumId="38" w15:restartNumberingAfterBreak="0">
+    <w:nsid w:val="6C88697E"/>
+    <w:multiLevelType w:val="hybridMultilevel"/>
+    <w:tmpl w:val="C7A6E5B2"/>
+    <w:lvl w:ilvl="0" w:tplc="0409001B">
+      <w:start w:val="1"/>
+      <w:numFmt w:val="lowerRoman"/>
+      <w:lvlText w:val="%1."/>
+      <w:lvlJc w:val="right"/>
+      <w:pPr>
+        <w:ind w:left="2880" w:hanging="360"/>
+      </w:pPr>
+    </w:lvl>
+    <w:lvl w:ilvl="1" w:tplc="04090019" w:tentative="1">
+      <w:start w:val="1"/>
+      <w:numFmt w:val="lowerLetter"/>
+      <w:lvlText w:val="%2."/>
+      <w:lvlJc w:val="left"/>
+      <w:pPr>
+        <w:ind w:left="3600" w:hanging="360"/>
+      </w:pPr>
+    </w:lvl>
+    <w:lvl w:ilvl="2" w:tplc="0409001B" w:tentative="1">
+      <w:start w:val="1"/>
+      <w:numFmt w:val="lowerRoman"/>
+      <w:lvlText w:val="%3."/>
+      <w:lvlJc w:val="right"/>
+      <w:pPr>
+        <w:ind w:left="4320" w:hanging="180"/>
+      </w:pPr>
+    </w:lvl>
+    <w:lvl w:ilvl="3" w:tplc="0409000F" w:tentative="1">
+      <w:start w:val="1"/>
+      <w:numFmt w:val="decimal"/>
+      <w:lvlText w:val="%4."/>
+      <w:lvlJc w:val="left"/>
+      <w:pPr>
+        <w:ind w:left="5040" w:hanging="360"/>
+      </w:pPr>
+    </w:lvl>
+    <w:lvl w:ilvl="4" w:tplc="04090019" w:tentative="1">
+      <w:start w:val="1"/>
+      <w:numFmt w:val="lowerLetter"/>
+      <w:lvlText w:val="%5."/>
+      <w:lvlJc w:val="left"/>
+      <w:pPr>
+        <w:ind w:left="5760" w:hanging="360"/>
+      </w:pPr>
+    </w:lvl>
+    <w:lvl w:ilvl="5" w:tplc="0409001B" w:tentative="1">
+      <w:start w:val="1"/>
+      <w:numFmt w:val="lowerRoman"/>
+      <w:lvlText w:val="%6."/>
+      <w:lvlJc w:val="right"/>
+      <w:pPr>
+        <w:ind w:left="6480" w:hanging="180"/>
+      </w:pPr>
+    </w:lvl>
+    <w:lvl w:ilvl="6" w:tplc="0409000F" w:tentative="1">
+      <w:start w:val="1"/>
+      <w:numFmt w:val="decimal"/>
+      <w:lvlText w:val="%7."/>
+      <w:lvlJc w:val="left"/>
+      <w:pPr>
+        <w:ind w:left="7200" w:hanging="360"/>
+      </w:pPr>
+    </w:lvl>
+    <w:lvl w:ilvl="7" w:tplc="04090019" w:tentative="1">
+      <w:start w:val="1"/>
+      <w:numFmt w:val="lowerLetter"/>
+      <w:lvlText w:val="%8."/>
+      <w:lvlJc w:val="left"/>
+      <w:pPr>
+        <w:ind w:left="7920" w:hanging="360"/>
+      </w:pPr>
+    </w:lvl>
+    <w:lvl w:ilvl="8" w:tplc="0409001B" w:tentative="1">
+      <w:start w:val="1"/>
+      <w:numFmt w:val="lowerRoman"/>
+      <w:lvlText w:val="%9."/>
+      <w:lvlJc w:val="right"/>
+      <w:pPr>
+        <w:ind w:left="8640" w:hanging="180"/>
+      </w:pPr>
+    </w:lvl>
+  </w:abstractNum>
+  <w:abstractNum w:abstractNumId="39" w15:restartNumberingAfterBreak="0">
     <w:nsid w:val="6E3F320D"/>
     <w:multiLevelType w:val="hybridMultilevel"/>
     <w:tmpl w:val="C68A37A4"/>
@@ -27876,7 +29755,7 @@
       </w:rPr>
     </w:lvl>
   </w:abstractNum>
-  <w:abstractNum w:abstractNumId="28" w15:restartNumberingAfterBreak="0">
+  <w:abstractNum w:abstractNumId="40" w15:restartNumberingAfterBreak="0">
     <w:nsid w:val="6F821489"/>
     <w:multiLevelType w:val="hybridMultilevel"/>
     <w:tmpl w:val="0746499E"/>
@@ -27962,7 +29841,120 @@
       </w:pPr>
     </w:lvl>
   </w:abstractNum>
-  <w:abstractNum w:abstractNumId="29" w15:restartNumberingAfterBreak="0">
+  <w:abstractNum w:abstractNumId="41" w15:restartNumberingAfterBreak="0">
+    <w:nsid w:val="72AB658B"/>
+    <w:multiLevelType w:val="hybridMultilevel"/>
+    <w:tmpl w:val="AC1053C0"/>
+    <w:lvl w:ilvl="0" w:tplc="04090001">
+      <w:start w:val="1"/>
+      <w:numFmt w:val="bullet"/>
+      <w:lvlText w:val=""/>
+      <w:lvlJc w:val="left"/>
+      <w:pPr>
+        <w:ind w:left="1440" w:hanging="360"/>
+      </w:pPr>
+      <w:rPr>
+        <w:rFonts w:ascii="Symbol" w:hAnsi="Symbol" w:hint="default"/>
+      </w:rPr>
+    </w:lvl>
+    <w:lvl w:ilvl="1" w:tplc="04090003" w:tentative="1">
+      <w:start w:val="1"/>
+      <w:numFmt w:val="bullet"/>
+      <w:lvlText w:val="o"/>
+      <w:lvlJc w:val="left"/>
+      <w:pPr>
+        <w:ind w:left="2160" w:hanging="360"/>
+      </w:pPr>
+      <w:rPr>
+        <w:rFonts w:ascii="Courier New" w:hAnsi="Courier New" w:cs="Courier New" w:hint="default"/>
+      </w:rPr>
+    </w:lvl>
+    <w:lvl w:ilvl="2" w:tplc="04090005" w:tentative="1">
+      <w:start w:val="1"/>
+      <w:numFmt w:val="bullet"/>
+      <w:lvlText w:val=""/>
+      <w:lvlJc w:val="left"/>
+      <w:pPr>
+        <w:ind w:left="2880" w:hanging="360"/>
+      </w:pPr>
+      <w:rPr>
+        <w:rFonts w:ascii="Wingdings" w:hAnsi="Wingdings" w:hint="default"/>
+      </w:rPr>
+    </w:lvl>
+    <w:lvl w:ilvl="3" w:tplc="04090001" w:tentative="1">
+      <w:start w:val="1"/>
+      <w:numFmt w:val="bullet"/>
+      <w:lvlText w:val=""/>
+      <w:lvlJc w:val="left"/>
+      <w:pPr>
+        <w:ind w:left="3600" w:hanging="360"/>
+      </w:pPr>
+      <w:rPr>
+        <w:rFonts w:ascii="Symbol" w:hAnsi="Symbol" w:hint="default"/>
+      </w:rPr>
+    </w:lvl>
+    <w:lvl w:ilvl="4" w:tplc="04090003" w:tentative="1">
+      <w:start w:val="1"/>
+      <w:numFmt w:val="bullet"/>
+      <w:lvlText w:val="o"/>
+      <w:lvlJc w:val="left"/>
+      <w:pPr>
+        <w:ind w:left="4320" w:hanging="360"/>
+      </w:pPr>
+      <w:rPr>
+        <w:rFonts w:ascii="Courier New" w:hAnsi="Courier New" w:cs="Courier New" w:hint="default"/>
+      </w:rPr>
+    </w:lvl>
+    <w:lvl w:ilvl="5" w:tplc="04090005" w:tentative="1">
+      <w:start w:val="1"/>
+      <w:numFmt w:val="bullet"/>
+      <w:lvlText w:val=""/>
+      <w:lvlJc w:val="left"/>
+      <w:pPr>
+        <w:ind w:left="5040" w:hanging="360"/>
+      </w:pPr>
+      <w:rPr>
+        <w:rFonts w:ascii="Wingdings" w:hAnsi="Wingdings" w:hint="default"/>
+      </w:rPr>
+    </w:lvl>
+    <w:lvl w:ilvl="6" w:tplc="04090001" w:tentative="1">
+      <w:start w:val="1"/>
+      <w:numFmt w:val="bullet"/>
+      <w:lvlText w:val=""/>
+      <w:lvlJc w:val="left"/>
+      <w:pPr>
+        <w:ind w:left="5760" w:hanging="360"/>
+      </w:pPr>
+      <w:rPr>
+        <w:rFonts w:ascii="Symbol" w:hAnsi="Symbol" w:hint="default"/>
+      </w:rPr>
+    </w:lvl>
+    <w:lvl w:ilvl="7" w:tplc="04090003" w:tentative="1">
+      <w:start w:val="1"/>
+      <w:numFmt w:val="bullet"/>
+      <w:lvlText w:val="o"/>
+      <w:lvlJc w:val="left"/>
+      <w:pPr>
+        <w:ind w:left="6480" w:hanging="360"/>
+      </w:pPr>
+      <w:rPr>
+        <w:rFonts w:ascii="Courier New" w:hAnsi="Courier New" w:cs="Courier New" w:hint="default"/>
+      </w:rPr>
+    </w:lvl>
+    <w:lvl w:ilvl="8" w:tplc="04090005" w:tentative="1">
+      <w:start w:val="1"/>
+      <w:numFmt w:val="bullet"/>
+      <w:lvlText w:val=""/>
+      <w:lvlJc w:val="left"/>
+      <w:pPr>
+        <w:ind w:left="7200" w:hanging="360"/>
+      </w:pPr>
+      <w:rPr>
+        <w:rFonts w:ascii="Wingdings" w:hAnsi="Wingdings" w:hint="default"/>
+      </w:rPr>
+    </w:lvl>
+  </w:abstractNum>
+  <w:abstractNum w:abstractNumId="42" w15:restartNumberingAfterBreak="0">
     <w:nsid w:val="74484407"/>
     <w:multiLevelType w:val="hybridMultilevel"/>
     <w:tmpl w:val="1A7C4FE4"/>
@@ -28048,7 +30040,7 @@
       </w:pPr>
     </w:lvl>
   </w:abstractNum>
-  <w:abstractNum w:abstractNumId="30" w15:restartNumberingAfterBreak="0">
+  <w:abstractNum w:abstractNumId="43" w15:restartNumberingAfterBreak="0">
     <w:nsid w:val="75AD4CC8"/>
     <w:multiLevelType w:val="hybridMultilevel"/>
     <w:tmpl w:val="0E3A2EEA"/>
@@ -28161,7 +30153,93 @@
       </w:rPr>
     </w:lvl>
   </w:abstractNum>
-  <w:abstractNum w:abstractNumId="31" w15:restartNumberingAfterBreak="0">
+  <w:abstractNum w:abstractNumId="44" w15:restartNumberingAfterBreak="0">
+    <w:nsid w:val="77EB44EB"/>
+    <w:multiLevelType w:val="hybridMultilevel"/>
+    <w:tmpl w:val="52F612CA"/>
+    <w:lvl w:ilvl="0" w:tplc="04090011">
+      <w:start w:val="1"/>
+      <w:numFmt w:val="decimal"/>
+      <w:lvlText w:val="%1)"/>
+      <w:lvlJc w:val="left"/>
+      <w:pPr>
+        <w:ind w:left="1800" w:hanging="360"/>
+      </w:pPr>
+    </w:lvl>
+    <w:lvl w:ilvl="1" w:tplc="04090019" w:tentative="1">
+      <w:start w:val="1"/>
+      <w:numFmt w:val="lowerLetter"/>
+      <w:lvlText w:val="%2."/>
+      <w:lvlJc w:val="left"/>
+      <w:pPr>
+        <w:ind w:left="2520" w:hanging="360"/>
+      </w:pPr>
+    </w:lvl>
+    <w:lvl w:ilvl="2" w:tplc="0409001B" w:tentative="1">
+      <w:start w:val="1"/>
+      <w:numFmt w:val="lowerRoman"/>
+      <w:lvlText w:val="%3."/>
+      <w:lvlJc w:val="right"/>
+      <w:pPr>
+        <w:ind w:left="3240" w:hanging="180"/>
+      </w:pPr>
+    </w:lvl>
+    <w:lvl w:ilvl="3" w:tplc="0409000F" w:tentative="1">
+      <w:start w:val="1"/>
+      <w:numFmt w:val="decimal"/>
+      <w:lvlText w:val="%4."/>
+      <w:lvlJc w:val="left"/>
+      <w:pPr>
+        <w:ind w:left="3960" w:hanging="360"/>
+      </w:pPr>
+    </w:lvl>
+    <w:lvl w:ilvl="4" w:tplc="04090019" w:tentative="1">
+      <w:start w:val="1"/>
+      <w:numFmt w:val="lowerLetter"/>
+      <w:lvlText w:val="%5."/>
+      <w:lvlJc w:val="left"/>
+      <w:pPr>
+        <w:ind w:left="4680" w:hanging="360"/>
+      </w:pPr>
+    </w:lvl>
+    <w:lvl w:ilvl="5" w:tplc="0409001B" w:tentative="1">
+      <w:start w:val="1"/>
+      <w:numFmt w:val="lowerRoman"/>
+      <w:lvlText w:val="%6."/>
+      <w:lvlJc w:val="right"/>
+      <w:pPr>
+        <w:ind w:left="5400" w:hanging="180"/>
+      </w:pPr>
+    </w:lvl>
+    <w:lvl w:ilvl="6" w:tplc="0409000F" w:tentative="1">
+      <w:start w:val="1"/>
+      <w:numFmt w:val="decimal"/>
+      <w:lvlText w:val="%7."/>
+      <w:lvlJc w:val="left"/>
+      <w:pPr>
+        <w:ind w:left="6120" w:hanging="360"/>
+      </w:pPr>
+    </w:lvl>
+    <w:lvl w:ilvl="7" w:tplc="04090019" w:tentative="1">
+      <w:start w:val="1"/>
+      <w:numFmt w:val="lowerLetter"/>
+      <w:lvlText w:val="%8."/>
+      <w:lvlJc w:val="left"/>
+      <w:pPr>
+        <w:ind w:left="6840" w:hanging="360"/>
+      </w:pPr>
+    </w:lvl>
+    <w:lvl w:ilvl="8" w:tplc="0409001B" w:tentative="1">
+      <w:start w:val="1"/>
+      <w:numFmt w:val="lowerRoman"/>
+      <w:lvlText w:val="%9."/>
+      <w:lvlJc w:val="right"/>
+      <w:pPr>
+        <w:ind w:left="7560" w:hanging="180"/>
+      </w:pPr>
+    </w:lvl>
+  </w:abstractNum>
+  <w:abstractNum w:abstractNumId="45" w15:restartNumberingAfterBreak="0">
     <w:nsid w:val="7998064F"/>
     <w:multiLevelType w:val="hybridMultilevel"/>
     <w:tmpl w:val="70F29310"/>
@@ -28275,196 +30353,235 @@
     </w:lvl>
   </w:abstractNum>
   <w:num w:numId="1" w16cid:durableId="1173185611">
-    <w:abstractNumId w:val="23"/>
+    <w:abstractNumId w:val="33"/>
   </w:num>
   <w:num w:numId="2" w16cid:durableId="2008241989">
-    <w:abstractNumId w:val="11"/>
+    <w:abstractNumId w:val="14"/>
   </w:num>
   <w:num w:numId="3" w16cid:durableId="1280189446">
-    <w:abstractNumId w:val="12"/>
+    <w:abstractNumId w:val="15"/>
   </w:num>
   <w:num w:numId="4" w16cid:durableId="126434000">
-    <w:abstractNumId w:val="30"/>
+    <w:abstractNumId w:val="43"/>
   </w:num>
   <w:num w:numId="5" w16cid:durableId="88235218">
-    <w:abstractNumId w:val="6"/>
+    <w:abstractNumId w:val="7"/>
   </w:num>
   <w:num w:numId="6" w16cid:durableId="2075662437">
+    <w:abstractNumId w:val="9"/>
+  </w:num>
+  <w:num w:numId="7" w16cid:durableId="100228626">
     <w:abstractNumId w:val="8"/>
   </w:num>
-  <w:num w:numId="7" w16cid:durableId="100228626">
-    <w:abstractNumId w:val="7"/>
-  </w:num>
   <w:num w:numId="8" w16cid:durableId="1520004101">
-    <w:abstractNumId w:val="19"/>
+    <w:abstractNumId w:val="25"/>
   </w:num>
   <w:num w:numId="9" w16cid:durableId="2040203771">
     <w:abstractNumId w:val="0"/>
   </w:num>
   <w:num w:numId="10" w16cid:durableId="315181602">
-    <w:abstractNumId w:val="16"/>
+    <w:abstractNumId w:val="20"/>
   </w:num>
   <w:num w:numId="11" w16cid:durableId="6830234">
-    <w:abstractNumId w:val="15"/>
+    <w:abstractNumId w:val="19"/>
   </w:num>
   <w:num w:numId="12" w16cid:durableId="644774398">
-    <w:abstractNumId w:val="20"/>
+    <w:abstractNumId w:val="26"/>
   </w:num>
   <w:num w:numId="13" w16cid:durableId="1220090486">
-    <w:abstractNumId w:val="16"/>
+    <w:abstractNumId w:val="20"/>
     <w:lvlOverride w:ilvl="0">
       <w:startOverride w:val="1"/>
     </w:lvlOverride>
   </w:num>
   <w:num w:numId="14" w16cid:durableId="653677883">
-    <w:abstractNumId w:val="28"/>
+    <w:abstractNumId w:val="40"/>
   </w:num>
   <w:num w:numId="15" w16cid:durableId="1593008556">
-    <w:abstractNumId w:val="21"/>
+    <w:abstractNumId w:val="31"/>
   </w:num>
   <w:num w:numId="16" w16cid:durableId="1969361129">
-    <w:abstractNumId w:val="31"/>
+    <w:abstractNumId w:val="45"/>
   </w:num>
   <w:num w:numId="17" w16cid:durableId="287854270">
-    <w:abstractNumId w:val="7"/>
+    <w:abstractNumId w:val="8"/>
     <w:lvlOverride w:ilvl="0">
       <w:startOverride w:val="1"/>
     </w:lvlOverride>
   </w:num>
   <w:num w:numId="18" w16cid:durableId="1455246916">
-    <w:abstractNumId w:val="7"/>
+    <w:abstractNumId w:val="8"/>
     <w:lvlOverride w:ilvl="0">
       <w:startOverride w:val="1"/>
     </w:lvlOverride>
   </w:num>
   <w:num w:numId="19" w16cid:durableId="1837114645">
-    <w:abstractNumId w:val="7"/>
+    <w:abstractNumId w:val="8"/>
     <w:lvlOverride w:ilvl="0">
       <w:startOverride w:val="1"/>
     </w:lvlOverride>
   </w:num>
   <w:num w:numId="20" w16cid:durableId="382221458">
-    <w:abstractNumId w:val="16"/>
+    <w:abstractNumId w:val="20"/>
     <w:lvlOverride w:ilvl="0">
       <w:startOverride w:val="1"/>
     </w:lvlOverride>
   </w:num>
   <w:num w:numId="21" w16cid:durableId="1655790808">
-    <w:abstractNumId w:val="16"/>
+    <w:abstractNumId w:val="20"/>
     <w:lvlOverride w:ilvl="0">
       <w:startOverride w:val="1"/>
     </w:lvlOverride>
   </w:num>
   <w:num w:numId="22" w16cid:durableId="234171700">
-    <w:abstractNumId w:val="16"/>
+    <w:abstractNumId w:val="20"/>
     <w:lvlOverride w:ilvl="0">
       <w:startOverride w:val="1"/>
     </w:lvlOverride>
   </w:num>
   <w:num w:numId="23" w16cid:durableId="1009982909">
-    <w:abstractNumId w:val="5"/>
+    <w:abstractNumId w:val="6"/>
   </w:num>
   <w:num w:numId="24" w16cid:durableId="1560550362">
-    <w:abstractNumId w:val="16"/>
-    <w:lvlOverride w:ilvl="0">
-      <w:startOverride w:val="1"/>
-    </w:lvlOverride>
+    <w:abstractNumId w:val="20"/>
   </w:num>
   <w:num w:numId="25" w16cid:durableId="813061479">
-    <w:abstractNumId w:val="7"/>
+    <w:abstractNumId w:val="8"/>
     <w:lvlOverride w:ilvl="0">
       <w:startOverride w:val="1"/>
     </w:lvlOverride>
   </w:num>
   <w:num w:numId="26" w16cid:durableId="1077551942">
-    <w:abstractNumId w:val="27"/>
+    <w:abstractNumId w:val="39"/>
   </w:num>
   <w:num w:numId="27" w16cid:durableId="840898556">
-    <w:abstractNumId w:val="22"/>
+    <w:abstractNumId w:val="32"/>
   </w:num>
   <w:num w:numId="28" w16cid:durableId="501895547">
-    <w:abstractNumId w:val="14"/>
+    <w:abstractNumId w:val="18"/>
   </w:num>
   <w:num w:numId="29" w16cid:durableId="1641417374">
-    <w:abstractNumId w:val="16"/>
+    <w:abstractNumId w:val="20"/>
     <w:lvlOverride w:ilvl="0">
       <w:startOverride w:val="1"/>
     </w:lvlOverride>
   </w:num>
   <w:num w:numId="30" w16cid:durableId="1721786039">
-    <w:abstractNumId w:val="16"/>
+    <w:abstractNumId w:val="20"/>
     <w:lvlOverride w:ilvl="0">
       <w:startOverride w:val="1"/>
     </w:lvlOverride>
   </w:num>
   <w:num w:numId="31" w16cid:durableId="1800874209">
-    <w:abstractNumId w:val="1"/>
+    <w:abstractNumId w:val="2"/>
   </w:num>
   <w:num w:numId="32" w16cid:durableId="455873032">
-    <w:abstractNumId w:val="8"/>
+    <w:abstractNumId w:val="9"/>
     <w:lvlOverride w:ilvl="0">
       <w:startOverride w:val="1"/>
     </w:lvlOverride>
   </w:num>
   <w:num w:numId="33" w16cid:durableId="1861236935">
-    <w:abstractNumId w:val="29"/>
+    <w:abstractNumId w:val="42"/>
   </w:num>
   <w:num w:numId="34" w16cid:durableId="254555984">
+    <w:abstractNumId w:val="13"/>
+  </w:num>
+  <w:num w:numId="35" w16cid:durableId="490105366">
+    <w:abstractNumId w:val="5"/>
+  </w:num>
+  <w:num w:numId="36" w16cid:durableId="1690909134">
+    <w:abstractNumId w:val="21"/>
+  </w:num>
+  <w:num w:numId="37" w16cid:durableId="2023042566">
+    <w:abstractNumId w:val="23"/>
+  </w:num>
+  <w:num w:numId="38" w16cid:durableId="1464078482">
+    <w:abstractNumId w:val="4"/>
+  </w:num>
+  <w:num w:numId="39" w16cid:durableId="377363921">
     <w:abstractNumId w:val="10"/>
   </w:num>
-  <w:num w:numId="35" w16cid:durableId="490105366">
-    <w:abstractNumId w:val="4"/>
-  </w:num>
-  <w:num w:numId="36" w16cid:durableId="1690909134">
+  <w:num w:numId="40" w16cid:durableId="746003725">
     <w:abstractNumId w:val="17"/>
   </w:num>
-  <w:num w:numId="37" w16cid:durableId="2023042566">
-    <w:abstractNumId w:val="18"/>
-  </w:num>
-  <w:num w:numId="38" w16cid:durableId="1464078482">
+  <w:num w:numId="41" w16cid:durableId="1137141616">
     <w:abstractNumId w:val="3"/>
   </w:num>
-  <w:num w:numId="39" w16cid:durableId="377363921">
-    <w:abstractNumId w:val="9"/>
-  </w:num>
-  <w:num w:numId="40" w16cid:durableId="746003725">
-    <w:abstractNumId w:val="13"/>
-  </w:num>
-  <w:num w:numId="41" w16cid:durableId="1137141616">
-    <w:abstractNumId w:val="2"/>
-  </w:num>
   <w:num w:numId="42" w16cid:durableId="22630837">
-    <w:abstractNumId w:val="24"/>
+    <w:abstractNumId w:val="34"/>
   </w:num>
   <w:num w:numId="43" w16cid:durableId="866715383">
-    <w:abstractNumId w:val="25"/>
+    <w:abstractNumId w:val="35"/>
   </w:num>
   <w:num w:numId="44" w16cid:durableId="935483795">
-    <w:abstractNumId w:val="26"/>
+    <w:abstractNumId w:val="37"/>
   </w:num>
   <w:num w:numId="45" w16cid:durableId="244732608">
-    <w:abstractNumId w:val="24"/>
+    <w:abstractNumId w:val="34"/>
     <w:lvlOverride w:ilvl="0">
       <w:startOverride w:val="1"/>
     </w:lvlOverride>
   </w:num>
   <w:num w:numId="46" w16cid:durableId="1534342251">
-    <w:abstractNumId w:val="24"/>
+    <w:abstractNumId w:val="34"/>
     <w:lvlOverride w:ilvl="0">
       <w:startOverride w:val="1"/>
     </w:lvlOverride>
   </w:num>
   <w:num w:numId="47" w16cid:durableId="259533320">
-    <w:abstractNumId w:val="24"/>
+    <w:abstractNumId w:val="34"/>
     <w:lvlOverride w:ilvl="0">
       <w:startOverride w:val="1"/>
     </w:lvlOverride>
   </w:num>
   <w:num w:numId="48" w16cid:durableId="277027401">
-    <w:abstractNumId w:val="24"/>
+    <w:abstractNumId w:val="34"/>
     <w:lvlOverride w:ilvl="0">
       <w:startOverride w:val="1"/>
     </w:lvlOverride>
+  </w:num>
+  <w:num w:numId="49" w16cid:durableId="1504321483">
+    <w:abstractNumId w:val="36"/>
+  </w:num>
+  <w:num w:numId="50" w16cid:durableId="1678574022">
+    <w:abstractNumId w:val="24"/>
+  </w:num>
+  <w:num w:numId="51" w16cid:durableId="426121165">
+    <w:abstractNumId w:val="30"/>
+  </w:num>
+  <w:num w:numId="52" w16cid:durableId="779182398">
+    <w:abstractNumId w:val="27"/>
+  </w:num>
+  <w:num w:numId="53" w16cid:durableId="130711008">
+    <w:abstractNumId w:val="29"/>
+  </w:num>
+  <w:num w:numId="54" w16cid:durableId="262618372">
+    <w:abstractNumId w:val="1"/>
+  </w:num>
+  <w:num w:numId="55" w16cid:durableId="1321932707">
+    <w:abstractNumId w:val="38"/>
+  </w:num>
+  <w:num w:numId="56" w16cid:durableId="462307220">
+    <w:abstractNumId w:val="28"/>
+  </w:num>
+  <w:num w:numId="57" w16cid:durableId="411857211">
+    <w:abstractNumId w:val="16"/>
+  </w:num>
+  <w:num w:numId="58" w16cid:durableId="192884163">
+    <w:abstractNumId w:val="22"/>
+  </w:num>
+  <w:num w:numId="59" w16cid:durableId="1222861784">
+    <w:abstractNumId w:val="12"/>
+  </w:num>
+  <w:num w:numId="60" w16cid:durableId="1015962429">
+    <w:abstractNumId w:val="44"/>
+  </w:num>
+  <w:num w:numId="61" w16cid:durableId="563954187">
+    <w:abstractNumId w:val="41"/>
+  </w:num>
+  <w:num w:numId="62" w16cid:durableId="2078477183">
+    <w:abstractNumId w:val="11"/>
   </w:num>
 </w:numbering>
 </file>
@@ -28997,7 +31114,7 @@
     <w:rsid w:val="004E3B8E"/>
     <w:pPr>
       <w:numPr>
-        <w:numId w:val="10"/>
+        <w:numId w:val="24"/>
       </w:numPr>
       <w:spacing w:line="480" w:lineRule="auto"/>
       <w:outlineLvl w:val="5"/>
@@ -29072,7 +31189,6 @@
   <w:style w:type="character" w:default="1" w:styleId="DefaultParagraphFont">
     <w:name w:val="Default Paragraph Font"/>
     <w:uiPriority w:val="1"/>
-    <w:semiHidden/>
     <w:unhideWhenUsed/>
   </w:style>
   <w:style w:type="table" w:default="1" w:styleId="TableNormal">
@@ -29754,7 +31870,9 @@
     <w:rsid w:val="002A4EB4"/>
     <w:rsid w:val="002E4447"/>
     <w:rsid w:val="00462B05"/>
+    <w:rsid w:val="004B24DA"/>
     <w:rsid w:val="005A7160"/>
+    <w:rsid w:val="006901B0"/>
     <w:rsid w:val="006E1BAB"/>
     <w:rsid w:val="00763159"/>
     <w:rsid w:val="0081424B"/>

</xml_diff>

<commit_message>
abis benerin poin 21. next 22 dan 23
</commit_message>
<xml_diff>
--- a/non-website/Laporan Akhir KP/2203040182 - Dhika Ramadhan Saputra - Laporan KP - Revisi 1.docx
+++ b/non-website/Laporan Akhir KP/2203040182 - Dhika Ramadhan Saputra - Laporan KP - Revisi 1.docx
@@ -8143,7 +8143,7 @@
         <w:rPr>
           <w:rFonts w:ascii="Times New Roman" w:hAnsi="Times New Roman" w:cs="Times New Roman"/>
         </w:rPr>
-        <w:t>Pada era digital saat ini, pemanfaatan data dalam pengambilan keputusan menjadi aspek krusial, termasuk dalam strategi pemasaran institusi pendidikan. Universitas Muhammadiyah Purwokerto (UMP) sebagai salah satu perguruan tinggi swasta terus berupaya meningkatkan efektivitas strategi pemasarannya untuk menarik mahasiswa baru. Salah satu tantangan utama yang dihadapi adalah kurangnya analisis berbasis data terhadap tren penerimaan mahasiswa baru dalam satu dekade terakhir (2014–2024), yang dapat berdampak pada efektivitas strategi pemasaran universitas.</w:t>
+        <w:t>Pada era digital saat ini, pemanfaatan data dalam pengambilan keputusan menjadi aspek krusial, termasuk dalam strategi pemasaran institusi pendidikan. Universitas Muhammadiyah Purwokerto (UMP) sebagai salah satu perguruan tinggi swasta terus berupaya meningkatkan efektivitas strategi pemasarannya untuk menarik mahasiswa baru. Salah satu tantangan utama yang dihadapi adalah kurangnya visualisasi data historis terhadap tren penerimaan mahasiswa baru dalam satu dekade terakhir (2014–2024), yang dapat berdampak pada efektivitas strategi promosi universitas.</w:t>
       </w:r>
     </w:p>
     <w:p>
@@ -8175,7 +8175,94 @@
         <w:rPr>
           <w:rFonts w:ascii="Times New Roman" w:hAnsi="Times New Roman" w:cs="Times New Roman"/>
         </w:rPr>
-        <w:t>Solusi yang ditawarkan adalah pembuatan dashboard interaktif menggunakan Tableau Public, yang menyajikan data dalam bentuk visual yang mudah dipahami. Dashboard ini diharapkan menjadi alat bantu bagi universitas dalam mengevaluasi strategi pemasaran serta merancang pendekatan berbasis data untuk meningkatkan efektivitas promosi di masa depan.</w:t>
+        <w:t>Solusi yang ditawarkan adalah pembuatan dashboard interaktif menggunakan Tableau Public, yang menyajikan data dalam bentuk visual yang mudah dipahami. Tableau terbukti efektif dalam mengkomunikasikan informasi data secara cepat dan informatif, sebagaimana disampaikan dalam penelitian</w:t>
+      </w:r>
+      <w:r>
+        <w:rPr>
+          <w:rFonts w:ascii="Times New Roman" w:hAnsi="Times New Roman" w:cs="Times New Roman"/>
+        </w:rPr>
+        <w:t xml:space="preserve"> </w:t>
+      </w:r>
+      <w:sdt>
+        <w:sdtPr>
+          <w:rPr>
+            <w:rFonts w:ascii="Times New Roman" w:hAnsi="Times New Roman" w:cs="Times New Roman"/>
+            <w:color w:val="000000"/>
+          </w:rPr>
+          <w:tag w:val="MENDELEY_CITATION_v3_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"/>
+          <w:id w:val="-735697375"/>
+          <w:placeholder>
+            <w:docPart w:val="DefaultPlaceholder_-1854013440"/>
+          </w:placeholder>
+        </w:sdtPr>
+        <w:sdtContent>
+          <w:r>
+            <w:rPr>
+              <w:rFonts w:ascii="Times New Roman" w:hAnsi="Times New Roman" w:cs="Times New Roman"/>
+              <w:color w:val="000000"/>
+            </w:rPr>
+            <w:t>Anhari et al., 2025</w:t>
+          </w:r>
+        </w:sdtContent>
+      </w:sdt>
+      <w:r>
+        <w:rPr>
+          <w:rFonts w:ascii="Times New Roman" w:hAnsi="Times New Roman" w:cs="Times New Roman"/>
+        </w:rPr>
+        <w:t xml:space="preserve"> bahwa implementasi Tableau mampu memperkuat daya saing </w:t>
+      </w:r>
+      <w:r>
+        <w:rPr>
+          <w:rFonts w:ascii="Times New Roman" w:hAnsi="Times New Roman" w:cs="Times New Roman"/>
+        </w:rPr>
+        <w:lastRenderedPageBreak/>
+        <w:t>universitas melalui visualisasi data yang intuitif dan mendalam.</w:t>
+      </w:r>
+      <w:r>
+        <w:rPr>
+          <w:rFonts w:ascii="Times New Roman" w:hAnsi="Times New Roman" w:cs="Times New Roman"/>
+        </w:rPr>
+        <w:t xml:space="preserve"> </w:t>
+      </w:r>
+      <w:r>
+        <w:rPr>
+          <w:rFonts w:ascii="Times New Roman" w:hAnsi="Times New Roman" w:cs="Times New Roman"/>
+        </w:rPr>
+        <w:t xml:space="preserve">Selain itu, penelitian oleh </w:t>
+      </w:r>
+      <w:sdt>
+        <w:sdtPr>
+          <w:rPr>
+            <w:rFonts w:ascii="Times New Roman" w:hAnsi="Times New Roman" w:cs="Times New Roman"/>
+            <w:color w:val="000000"/>
+          </w:rPr>
+          <w:tag w:val="MENDELEY_CITATION_v3_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"/>
+          <w:id w:val="1578480075"/>
+          <w:placeholder>
+            <w:docPart w:val="DefaultPlaceholder_-1854013440"/>
+          </w:placeholder>
+        </w:sdtPr>
+        <w:sdtContent>
+          <w:r>
+            <w:rPr>
+              <w:rFonts w:ascii="Times New Roman" w:hAnsi="Times New Roman" w:cs="Times New Roman"/>
+              <w:color w:val="000000"/>
+            </w:rPr>
+            <w:t>MZ et al., 2022</w:t>
+          </w:r>
+        </w:sdtContent>
+      </w:sdt>
+      <w:r>
+        <w:rPr>
+          <w:rFonts w:ascii="Times New Roman" w:hAnsi="Times New Roman" w:cs="Times New Roman"/>
+        </w:rPr>
+        <w:t xml:space="preserve"> menunjukkan bahwa dashboard visualisasi memberikan kemudahan bagi stakeholder dalam membaca data PMB dan mendukung proses pengambilan keputusan strategis pada institusi pendidikan tinggi</w:t>
+      </w:r>
+      <w:r>
+        <w:rPr>
+          <w:rFonts w:ascii="Times New Roman" w:hAnsi="Times New Roman" w:cs="Times New Roman"/>
+        </w:rPr>
+        <w:t>.</w:t>
       </w:r>
     </w:p>
     <w:p>
@@ -8190,7 +8277,6 @@
         <w:rPr>
           <w:rFonts w:ascii="Times New Roman" w:hAnsi="Times New Roman" w:cs="Times New Roman"/>
         </w:rPr>
-        <w:lastRenderedPageBreak/>
         <w:t>Manfaat dari proyek ini antara lain:</w:t>
       </w:r>
     </w:p>
@@ -8371,6 +8457,7 @@
         <w:rPr>
           <w:rFonts w:ascii="Times New Roman" w:hAnsi="Times New Roman" w:cs="Times New Roman"/>
         </w:rPr>
+        <w:lastRenderedPageBreak/>
         <w:t>Data pendaftar mahasiswa baru</w:t>
       </w:r>
       <w:r>
@@ -8495,7 +8582,6 @@
         <w:rPr>
           <w:rFonts w:ascii="Times New Roman" w:hAnsi="Times New Roman" w:cs="Times New Roman"/>
         </w:rPr>
-        <w:lastRenderedPageBreak/>
         <w:t>Visualisasi data</w:t>
       </w:r>
     </w:p>
@@ -8813,27 +8899,14 @@
       <w:r>
         <w:t xml:space="preserve">Gambar 1. </w:t>
       </w:r>
-      <w:r>
-        <w:fldChar w:fldCharType="begin"/>
-      </w:r>
-      <w:r>
-        <w:instrText xml:space="preserve"> SEQ Gambar_1. \* ARABIC </w:instrText>
-      </w:r>
-      <w:r>
-        <w:fldChar w:fldCharType="separate"/>
-      </w:r>
-      <w:r>
-        <w:rPr>
-          <w:noProof/>
-        </w:rPr>
-        <w:t>1</w:t>
-      </w:r>
-      <w:r>
-        <w:rPr>
-          <w:noProof/>
-        </w:rPr>
-        <w:fldChar w:fldCharType="end"/>
-      </w:r>
+      <w:fldSimple w:instr=" SEQ Gambar_1. \* ARABIC ">
+        <w:r>
+          <w:rPr>
+            <w:noProof/>
+          </w:rPr>
+          <w:t>1</w:t>
+        </w:r>
+      </w:fldSimple>
       <w:r>
         <w:t xml:space="preserve"> tahapan pelaksanaan</w:t>
       </w:r>
@@ -9642,27 +9715,14 @@
         <w:lastRenderedPageBreak/>
         <w:t xml:space="preserve">Tabel 1. </w:t>
       </w:r>
-      <w:r>
-        <w:fldChar w:fldCharType="begin"/>
-      </w:r>
-      <w:r>
-        <w:instrText xml:space="preserve"> SEQ Tabel_1. \* ARABIC </w:instrText>
-      </w:r>
-      <w:r>
-        <w:fldChar w:fldCharType="separate"/>
-      </w:r>
-      <w:r>
-        <w:rPr>
-          <w:noProof/>
-        </w:rPr>
-        <w:t>1</w:t>
-      </w:r>
-      <w:r>
-        <w:rPr>
-          <w:noProof/>
-        </w:rPr>
-        <w:fldChar w:fldCharType="end"/>
-      </w:r>
+      <w:fldSimple w:instr=" SEQ Tabel_1. \* ARABIC ">
+        <w:r>
+          <w:rPr>
+            <w:noProof/>
+          </w:rPr>
+          <w:t>1</w:t>
+        </w:r>
+      </w:fldSimple>
       <w:r>
         <w:t xml:space="preserve"> jadwal pelaksanaan</w:t>
       </w:r>
@@ -11986,27 +12046,14 @@
       <w:r>
         <w:t xml:space="preserve">Gambar 2. </w:t>
       </w:r>
-      <w:r>
-        <w:fldChar w:fldCharType="begin"/>
-      </w:r>
-      <w:r>
-        <w:instrText xml:space="preserve"> SEQ Gambar_2. \* ARABIC </w:instrText>
-      </w:r>
-      <w:r>
-        <w:fldChar w:fldCharType="separate"/>
-      </w:r>
-      <w:r>
-        <w:rPr>
-          <w:noProof/>
-        </w:rPr>
-        <w:t>1</w:t>
-      </w:r>
-      <w:r>
-        <w:rPr>
-          <w:noProof/>
-        </w:rPr>
-        <w:fldChar w:fldCharType="end"/>
-      </w:r>
+      <w:fldSimple w:instr=" SEQ Gambar_2. \* ARABIC ">
+        <w:r>
+          <w:rPr>
+            <w:noProof/>
+          </w:rPr>
+          <w:t>1</w:t>
+        </w:r>
+      </w:fldSimple>
       <w:r>
         <w:t xml:space="preserve"> struktur umum organisasi mitra</w:t>
       </w:r>
@@ -12287,7 +12334,7 @@
         <w:sdtContent>
           <w:r>
             <w:rPr>
-              <w:rFonts w:ascii="Times New Roman" w:eastAsia="Times New Roman" w:hAnsi="Times New Roman" w:cs="Times New Roman"/>
+              <w:rFonts w:eastAsia="Times New Roman"/>
               <w:color w:val="000000"/>
             </w:rPr>
             <w:t>(Rosita &amp; Tannar, 2024)</w:t>
@@ -12482,27 +12529,14 @@
       <w:r>
         <w:t xml:space="preserve">Gambar 3. </w:t>
       </w:r>
-      <w:r>
-        <w:fldChar w:fldCharType="begin"/>
-      </w:r>
-      <w:r>
-        <w:instrText xml:space="preserve"> SEQ Gambar_3. \* ARABIC </w:instrText>
-      </w:r>
-      <w:r>
-        <w:fldChar w:fldCharType="separate"/>
-      </w:r>
-      <w:r>
-        <w:rPr>
-          <w:noProof/>
-        </w:rPr>
-        <w:t>1</w:t>
-      </w:r>
-      <w:r>
-        <w:rPr>
-          <w:noProof/>
-        </w:rPr>
-        <w:fldChar w:fldCharType="end"/>
-      </w:r>
+      <w:fldSimple w:instr=" SEQ Gambar_3. \* ARABIC ">
+        <w:r>
+          <w:rPr>
+            <w:noProof/>
+          </w:rPr>
+          <w:t>1</w:t>
+        </w:r>
+      </w:fldSimple>
       <w:r>
         <w:t xml:space="preserve"> dokumentasi penerimaan data via Whatsapp</w:t>
       </w:r>
@@ -12523,7 +12557,7 @@
           <w:noProof/>
         </w:rPr>
         <w:drawing>
-          <wp:inline distT="0" distB="0" distL="0" distR="0" wp14:anchorId="75188C27" wp14:editId="1AEE076E">
+          <wp:inline distT="0" distB="0" distL="0" distR="0" wp14:anchorId="75188C27" wp14:editId="7B9D337E">
             <wp:extent cx="5004000" cy="1844909"/>
             <wp:effectExtent l="19050" t="19050" r="25400" b="22225"/>
             <wp:docPr id="783286403" name="Picture 4"/>
@@ -12589,27 +12623,14 @@
       <w:r>
         <w:t xml:space="preserve">Gambar 3. </w:t>
       </w:r>
-      <w:r>
-        <w:fldChar w:fldCharType="begin"/>
-      </w:r>
-      <w:r>
-        <w:instrText xml:space="preserve"> SEQ Gambar_3. \* ARABIC </w:instrText>
-      </w:r>
-      <w:r>
-        <w:fldChar w:fldCharType="separate"/>
-      </w:r>
-      <w:r>
-        <w:rPr>
-          <w:noProof/>
-        </w:rPr>
-        <w:t>2</w:t>
-      </w:r>
-      <w:r>
-        <w:rPr>
-          <w:noProof/>
-        </w:rPr>
-        <w:fldChar w:fldCharType="end"/>
-      </w:r>
+      <w:fldSimple w:instr=" SEQ Gambar_3. \* ARABIC ">
+        <w:r>
+          <w:rPr>
+            <w:noProof/>
+          </w:rPr>
+          <w:t>2</w:t>
+        </w:r>
+      </w:fldSimple>
       <w:r>
         <w:t xml:space="preserve"> s</w:t>
       </w:r>
@@ -12899,7 +12920,7 @@
           <w:noProof/>
         </w:rPr>
         <w:drawing>
-          <wp:inline distT="0" distB="0" distL="0" distR="0" wp14:anchorId="02EBA956" wp14:editId="69F5EF66">
+          <wp:inline distT="0" distB="0" distL="0" distR="0" wp14:anchorId="02EBA956" wp14:editId="519FD437">
             <wp:extent cx="3888000" cy="2160000"/>
             <wp:effectExtent l="19050" t="19050" r="17780" b="12065"/>
             <wp:docPr id="102117401" name="Picture 5"/>
@@ -12964,27 +12985,14 @@
       <w:r>
         <w:t xml:space="preserve">Gambar 3. </w:t>
       </w:r>
-      <w:r>
-        <w:fldChar w:fldCharType="begin"/>
-      </w:r>
-      <w:r>
-        <w:instrText xml:space="preserve"> SEQ Gambar_3. \* ARABIC </w:instrText>
-      </w:r>
-      <w:r>
-        <w:fldChar w:fldCharType="separate"/>
-      </w:r>
-      <w:r>
-        <w:rPr>
-          <w:noProof/>
-        </w:rPr>
-        <w:t>3</w:t>
-      </w:r>
-      <w:r>
-        <w:rPr>
-          <w:noProof/>
-        </w:rPr>
-        <w:fldChar w:fldCharType="end"/>
-      </w:r>
+      <w:fldSimple w:instr=" SEQ Gambar_3. \* ARABIC ">
+        <w:r>
+          <w:rPr>
+            <w:noProof/>
+          </w:rPr>
+          <w:t>3</w:t>
+        </w:r>
+      </w:fldSimple>
       <w:r>
         <w:t xml:space="preserve"> c</w:t>
       </w:r>
@@ -13075,27 +13083,14 @@
       <w:r>
         <w:t xml:space="preserve">Gambar 3. </w:t>
       </w:r>
-      <w:r>
-        <w:fldChar w:fldCharType="begin"/>
-      </w:r>
-      <w:r>
-        <w:instrText xml:space="preserve"> SEQ Gambar_3. \* ARABIC </w:instrText>
-      </w:r>
-      <w:r>
-        <w:fldChar w:fldCharType="separate"/>
-      </w:r>
-      <w:r>
-        <w:rPr>
-          <w:noProof/>
-        </w:rPr>
-        <w:t>4</w:t>
-      </w:r>
-      <w:r>
-        <w:rPr>
-          <w:noProof/>
-        </w:rPr>
-        <w:fldChar w:fldCharType="end"/>
-      </w:r>
+      <w:fldSimple w:instr=" SEQ Gambar_3. \* ARABIC ">
+        <w:r>
+          <w:rPr>
+            <w:noProof/>
+          </w:rPr>
+          <w:t>4</w:t>
+        </w:r>
+      </w:fldSimple>
       <w:r>
         <w:t xml:space="preserve"> b</w:t>
       </w:r>
@@ -13290,27 +13285,14 @@
       <w:r>
         <w:t xml:space="preserve">Gambar 3. </w:t>
       </w:r>
-      <w:r>
-        <w:fldChar w:fldCharType="begin"/>
-      </w:r>
-      <w:r>
-        <w:instrText xml:space="preserve"> SEQ Gambar_3. \* ARABIC </w:instrText>
-      </w:r>
-      <w:r>
-        <w:fldChar w:fldCharType="separate"/>
-      </w:r>
-      <w:r>
-        <w:rPr>
-          <w:noProof/>
-        </w:rPr>
-        <w:t>5</w:t>
-      </w:r>
-      <w:r>
-        <w:rPr>
-          <w:noProof/>
-        </w:rPr>
-        <w:fldChar w:fldCharType="end"/>
-      </w:r>
+      <w:fldSimple w:instr=" SEQ Gambar_3. \* ARABIC ">
+        <w:r>
+          <w:rPr>
+            <w:noProof/>
+          </w:rPr>
+          <w:t>5</w:t>
+        </w:r>
+      </w:fldSimple>
       <w:r>
         <w:t xml:space="preserve"> b</w:t>
       </w:r>
@@ -13401,27 +13383,14 @@
       <w:r>
         <w:t xml:space="preserve">Gambar 3. </w:t>
       </w:r>
-      <w:r>
-        <w:fldChar w:fldCharType="begin"/>
-      </w:r>
-      <w:r>
-        <w:instrText xml:space="preserve"> SEQ Gambar_3. \* ARABIC </w:instrText>
-      </w:r>
-      <w:r>
-        <w:fldChar w:fldCharType="separate"/>
-      </w:r>
-      <w:r>
-        <w:rPr>
-          <w:noProof/>
-        </w:rPr>
-        <w:t>6</w:t>
-      </w:r>
-      <w:r>
-        <w:rPr>
-          <w:noProof/>
-        </w:rPr>
-        <w:fldChar w:fldCharType="end"/>
-      </w:r>
+      <w:fldSimple w:instr=" SEQ Gambar_3. \* ARABIC ">
+        <w:r>
+          <w:rPr>
+            <w:noProof/>
+          </w:rPr>
+          <w:t>6</w:t>
+        </w:r>
+      </w:fldSimple>
       <w:r>
         <w:t xml:space="preserve"> s</w:t>
       </w:r>
@@ -13511,27 +13480,14 @@
       <w:r>
         <w:t xml:space="preserve">Gambar 3. </w:t>
       </w:r>
-      <w:r>
-        <w:fldChar w:fldCharType="begin"/>
-      </w:r>
-      <w:r>
-        <w:instrText xml:space="preserve"> SEQ Gambar_3. \* ARABIC </w:instrText>
-      </w:r>
-      <w:r>
-        <w:fldChar w:fldCharType="separate"/>
-      </w:r>
-      <w:r>
-        <w:rPr>
-          <w:noProof/>
-        </w:rPr>
-        <w:t>7</w:t>
-      </w:r>
-      <w:r>
-        <w:rPr>
-          <w:noProof/>
-        </w:rPr>
-        <w:fldChar w:fldCharType="end"/>
-      </w:r>
+      <w:fldSimple w:instr=" SEQ Gambar_3. \* ARABIC ">
+        <w:r>
+          <w:rPr>
+            <w:noProof/>
+          </w:rPr>
+          <w:t>7</w:t>
+        </w:r>
+      </w:fldSimple>
       <w:r>
         <w:t xml:space="preserve"> h</w:t>
       </w:r>
@@ -13765,27 +13721,14 @@
       <w:r>
         <w:t xml:space="preserve">Gambar 3. </w:t>
       </w:r>
-      <w:r>
-        <w:fldChar w:fldCharType="begin"/>
-      </w:r>
-      <w:r>
-        <w:instrText xml:space="preserve"> SEQ Gambar_3. \* ARABIC </w:instrText>
-      </w:r>
-      <w:r>
-        <w:fldChar w:fldCharType="separate"/>
-      </w:r>
-      <w:r>
-        <w:rPr>
-          <w:noProof/>
-        </w:rPr>
-        <w:t>8</w:t>
-      </w:r>
-      <w:r>
-        <w:rPr>
-          <w:noProof/>
-        </w:rPr>
-        <w:fldChar w:fldCharType="end"/>
-      </w:r>
+      <w:fldSimple w:instr=" SEQ Gambar_3. \* ARABIC ">
+        <w:r>
+          <w:rPr>
+            <w:noProof/>
+          </w:rPr>
+          <w:t>8</w:t>
+        </w:r>
+      </w:fldSimple>
       <w:r>
         <w:t xml:space="preserve"> </w:t>
       </w:r>
@@ -13910,7 +13853,7 @@
         <w:sdtContent>
           <w:r>
             <w:rPr>
-              <w:rFonts w:ascii="Times New Roman" w:eastAsia="Times New Roman" w:hAnsi="Times New Roman" w:cs="Times New Roman"/>
+              <w:rFonts w:eastAsia="Times New Roman"/>
               <w:color w:val="000000"/>
             </w:rPr>
             <w:t>(Hanifah &amp; Nasution, 2025)</w:t>
@@ -14028,27 +13971,14 @@
       <w:r>
         <w:t xml:space="preserve">Gambar 3. </w:t>
       </w:r>
-      <w:r>
-        <w:fldChar w:fldCharType="begin"/>
-      </w:r>
-      <w:r>
-        <w:instrText xml:space="preserve"> SEQ Gambar_3. \* ARABIC </w:instrText>
-      </w:r>
-      <w:r>
-        <w:fldChar w:fldCharType="separate"/>
-      </w:r>
-      <w:r>
-        <w:rPr>
-          <w:noProof/>
-        </w:rPr>
-        <w:t>9</w:t>
-      </w:r>
-      <w:r>
-        <w:rPr>
-          <w:noProof/>
-        </w:rPr>
-        <w:fldChar w:fldCharType="end"/>
-      </w:r>
+      <w:fldSimple w:instr=" SEQ Gambar_3. \* ARABIC ">
+        <w:r>
+          <w:rPr>
+            <w:noProof/>
+          </w:rPr>
+          <w:t>9</w:t>
+        </w:r>
+      </w:fldSimple>
       <w:r>
         <w:t xml:space="preserve"> m</w:t>
       </w:r>
@@ -14139,27 +14069,14 @@
       <w:r>
         <w:t xml:space="preserve">Gambar 3. </w:t>
       </w:r>
-      <w:r>
-        <w:fldChar w:fldCharType="begin"/>
-      </w:r>
-      <w:r>
-        <w:instrText xml:space="preserve"> SEQ Gambar_3. \* ARABIC </w:instrText>
-      </w:r>
-      <w:r>
-        <w:fldChar w:fldCharType="separate"/>
-      </w:r>
-      <w:r>
-        <w:rPr>
-          <w:noProof/>
-        </w:rPr>
-        <w:t>10</w:t>
-      </w:r>
-      <w:r>
-        <w:rPr>
-          <w:noProof/>
-        </w:rPr>
-        <w:fldChar w:fldCharType="end"/>
-      </w:r>
+      <w:fldSimple w:instr=" SEQ Gambar_3. \* ARABIC ">
+        <w:r>
+          <w:rPr>
+            <w:noProof/>
+          </w:rPr>
+          <w:t>10</w:t>
+        </w:r>
+      </w:fldSimple>
       <w:r>
         <w:t xml:space="preserve"> s</w:t>
       </w:r>
@@ -14388,7 +14305,7 @@
         <w:sdtContent>
           <w:r>
             <w:rPr>
-              <w:rFonts w:ascii="Times New Roman" w:eastAsia="Times New Roman" w:hAnsi="Times New Roman" w:cs="Times New Roman"/>
+              <w:rFonts w:eastAsia="Times New Roman"/>
               <w:color w:val="000000"/>
             </w:rPr>
             <w:t>(Sudrajat &amp; Cholid, 2023)</w:t>
@@ -14520,27 +14437,14 @@
       <w:r>
         <w:t xml:space="preserve">Gambar 3. </w:t>
       </w:r>
-      <w:r>
-        <w:fldChar w:fldCharType="begin"/>
-      </w:r>
-      <w:r>
-        <w:instrText xml:space="preserve"> SEQ Gambar_3. \* ARABIC </w:instrText>
-      </w:r>
-      <w:r>
-        <w:fldChar w:fldCharType="separate"/>
-      </w:r>
-      <w:r>
-        <w:rPr>
-          <w:noProof/>
-        </w:rPr>
-        <w:t>11</w:t>
-      </w:r>
-      <w:r>
-        <w:rPr>
-          <w:noProof/>
-        </w:rPr>
-        <w:fldChar w:fldCharType="end"/>
-      </w:r>
+      <w:fldSimple w:instr=" SEQ Gambar_3. \* ARABIC ">
+        <w:r>
+          <w:rPr>
+            <w:noProof/>
+          </w:rPr>
+          <w:t>11</w:t>
+        </w:r>
+      </w:fldSimple>
       <w:r>
         <w:t xml:space="preserve"> s</w:t>
       </w:r>
@@ -15117,7 +15021,7 @@
         <w:sdtContent>
           <w:r>
             <w:rPr>
-              <w:rFonts w:ascii="Times New Roman" w:eastAsia="Times New Roman" w:hAnsi="Times New Roman" w:cs="Times New Roman"/>
+              <w:rFonts w:eastAsia="Times New Roman"/>
               <w:color w:val="000000"/>
             </w:rPr>
             <w:t>(Turyadi &amp; Kusnandar, n.d.)</w:t>
@@ -15271,27 +15175,14 @@
       <w:r>
         <w:t xml:space="preserve">Gambar 3. </w:t>
       </w:r>
-      <w:r>
-        <w:fldChar w:fldCharType="begin"/>
-      </w:r>
-      <w:r>
-        <w:instrText xml:space="preserve"> SEQ Gambar_3. \* ARABIC </w:instrText>
-      </w:r>
-      <w:r>
-        <w:fldChar w:fldCharType="separate"/>
-      </w:r>
-      <w:r>
-        <w:rPr>
-          <w:noProof/>
-        </w:rPr>
-        <w:t>12</w:t>
-      </w:r>
-      <w:r>
-        <w:rPr>
-          <w:noProof/>
-        </w:rPr>
-        <w:fldChar w:fldCharType="end"/>
-      </w:r>
+      <w:fldSimple w:instr=" SEQ Gambar_3. \* ARABIC ">
+        <w:r>
+          <w:rPr>
+            <w:noProof/>
+          </w:rPr>
+          <w:t>12</w:t>
+        </w:r>
+      </w:fldSimple>
       <w:r>
         <w:t xml:space="preserve"> distribusi jalur pendaftaran</w:t>
       </w:r>
@@ -15419,27 +15310,14 @@
       <w:r>
         <w:t xml:space="preserve">Gambar 3. </w:t>
       </w:r>
-      <w:r>
-        <w:fldChar w:fldCharType="begin"/>
-      </w:r>
-      <w:r>
-        <w:instrText xml:space="preserve"> SEQ Gambar_3. \* ARABIC </w:instrText>
-      </w:r>
-      <w:r>
-        <w:fldChar w:fldCharType="separate"/>
-      </w:r>
-      <w:r>
-        <w:rPr>
-          <w:noProof/>
-        </w:rPr>
-        <w:t>13</w:t>
-      </w:r>
-      <w:r>
-        <w:rPr>
-          <w:noProof/>
-        </w:rPr>
-        <w:fldChar w:fldCharType="end"/>
-      </w:r>
+      <w:fldSimple w:instr=" SEQ Gambar_3. \* ARABIC ">
+        <w:r>
+          <w:rPr>
+            <w:noProof/>
+          </w:rPr>
+          <w:t>13</w:t>
+        </w:r>
+      </w:fldSimple>
       <w:r>
         <w:t xml:space="preserve"> distribusi </w:t>
       </w:r>
@@ -15580,27 +15458,14 @@
       <w:r>
         <w:t xml:space="preserve">Gambar 3. </w:t>
       </w:r>
-      <w:r>
-        <w:fldChar w:fldCharType="begin"/>
-      </w:r>
-      <w:r>
-        <w:instrText xml:space="preserve"> SEQ Gambar_3. \* ARABIC </w:instrText>
-      </w:r>
-      <w:r>
-        <w:fldChar w:fldCharType="separate"/>
-      </w:r>
-      <w:r>
-        <w:rPr>
-          <w:noProof/>
-        </w:rPr>
-        <w:t>14</w:t>
-      </w:r>
-      <w:r>
-        <w:rPr>
-          <w:noProof/>
-        </w:rPr>
-        <w:fldChar w:fldCharType="end"/>
-      </w:r>
+      <w:fldSimple w:instr=" SEQ Gambar_3. \* ARABIC ">
+        <w:r>
+          <w:rPr>
+            <w:noProof/>
+          </w:rPr>
+          <w:t>14</w:t>
+        </w:r>
+      </w:fldSimple>
       <w:r>
         <w:t xml:space="preserve"> distribusi </w:t>
       </w:r>
@@ -15728,27 +15593,14 @@
       <w:r>
         <w:t xml:space="preserve">Gambar 3. </w:t>
       </w:r>
-      <w:r>
-        <w:fldChar w:fldCharType="begin"/>
-      </w:r>
-      <w:r>
-        <w:instrText xml:space="preserve"> SEQ Gambar_3. \* ARABIC </w:instrText>
-      </w:r>
-      <w:r>
-        <w:fldChar w:fldCharType="separate"/>
-      </w:r>
-      <w:r>
-        <w:rPr>
-          <w:noProof/>
-        </w:rPr>
-        <w:t>15</w:t>
-      </w:r>
-      <w:r>
-        <w:rPr>
-          <w:noProof/>
-        </w:rPr>
-        <w:fldChar w:fldCharType="end"/>
-      </w:r>
+      <w:fldSimple w:instr=" SEQ Gambar_3. \* ARABIC ">
+        <w:r>
+          <w:rPr>
+            <w:noProof/>
+          </w:rPr>
+          <w:t>15</w:t>
+        </w:r>
+      </w:fldSimple>
       <w:r>
         <w:t xml:space="preserve"> distribusi</w:t>
       </w:r>
@@ -15877,27 +15729,14 @@
       <w:r>
         <w:t xml:space="preserve">Gambar 3. </w:t>
       </w:r>
-      <w:r>
-        <w:fldChar w:fldCharType="begin"/>
-      </w:r>
-      <w:r>
-        <w:instrText xml:space="preserve"> SEQ Gambar_3. \* ARABIC </w:instrText>
-      </w:r>
-      <w:r>
-        <w:fldChar w:fldCharType="separate"/>
-      </w:r>
-      <w:r>
-        <w:rPr>
-          <w:noProof/>
-        </w:rPr>
-        <w:t>16</w:t>
-      </w:r>
-      <w:r>
-        <w:rPr>
-          <w:noProof/>
-        </w:rPr>
-        <w:fldChar w:fldCharType="end"/>
-      </w:r>
+      <w:fldSimple w:instr=" SEQ Gambar_3. \* ARABIC ">
+        <w:r>
+          <w:rPr>
+            <w:noProof/>
+          </w:rPr>
+          <w:t>16</w:t>
+        </w:r>
+      </w:fldSimple>
       <w:r>
         <w:t xml:space="preserve"> distribusi </w:t>
       </w:r>
@@ -16025,27 +15864,14 @@
       <w:r>
         <w:t xml:space="preserve">Gambar 3. </w:t>
       </w:r>
-      <w:r>
-        <w:fldChar w:fldCharType="begin"/>
-      </w:r>
-      <w:r>
-        <w:instrText xml:space="preserve"> SEQ Gambar_3. \* ARABIC </w:instrText>
-      </w:r>
-      <w:r>
-        <w:fldChar w:fldCharType="separate"/>
-      </w:r>
-      <w:r>
-        <w:rPr>
-          <w:noProof/>
-        </w:rPr>
-        <w:t>17</w:t>
-      </w:r>
-      <w:r>
-        <w:rPr>
-          <w:noProof/>
-        </w:rPr>
-        <w:fldChar w:fldCharType="end"/>
-      </w:r>
+      <w:fldSimple w:instr=" SEQ Gambar_3. \* ARABIC ">
+        <w:r>
+          <w:rPr>
+            <w:noProof/>
+          </w:rPr>
+          <w:t>17</w:t>
+        </w:r>
+      </w:fldSimple>
       <w:r>
         <w:t xml:space="preserve"> distribusi </w:t>
       </w:r>
@@ -16174,27 +16000,14 @@
       <w:r>
         <w:t xml:space="preserve">Gambar 3. </w:t>
       </w:r>
-      <w:r>
-        <w:fldChar w:fldCharType="begin"/>
-      </w:r>
-      <w:r>
-        <w:instrText xml:space="preserve"> SEQ Gambar_3. \* ARABIC </w:instrText>
-      </w:r>
-      <w:r>
-        <w:fldChar w:fldCharType="separate"/>
-      </w:r>
-      <w:r>
-        <w:rPr>
-          <w:noProof/>
-        </w:rPr>
-        <w:t>18</w:t>
-      </w:r>
-      <w:r>
-        <w:rPr>
-          <w:noProof/>
-        </w:rPr>
-        <w:fldChar w:fldCharType="end"/>
-      </w:r>
+      <w:fldSimple w:instr=" SEQ Gambar_3. \* ARABIC ">
+        <w:r>
+          <w:rPr>
+            <w:noProof/>
+          </w:rPr>
+          <w:t>18</w:t>
+        </w:r>
+      </w:fldSimple>
       <w:r>
         <w:t xml:space="preserve"> distribusi </w:t>
       </w:r>
@@ -16328,27 +16141,14 @@
       <w:r>
         <w:t xml:space="preserve">Gambar 3. </w:t>
       </w:r>
-      <w:r>
-        <w:fldChar w:fldCharType="begin"/>
-      </w:r>
-      <w:r>
-        <w:instrText xml:space="preserve"> SEQ Gambar_3. \* ARABIC </w:instrText>
-      </w:r>
-      <w:r>
-        <w:fldChar w:fldCharType="separate"/>
-      </w:r>
-      <w:r>
-        <w:rPr>
-          <w:noProof/>
-        </w:rPr>
-        <w:t>19</w:t>
-      </w:r>
-      <w:r>
-        <w:rPr>
-          <w:noProof/>
-        </w:rPr>
-        <w:fldChar w:fldCharType="end"/>
-      </w:r>
+      <w:fldSimple w:instr=" SEQ Gambar_3. \* ARABIC ">
+        <w:r>
+          <w:rPr>
+            <w:noProof/>
+          </w:rPr>
+          <w:t>19</w:t>
+        </w:r>
+      </w:fldSimple>
       <w:r>
         <w:t xml:space="preserve"> distribusi </w:t>
       </w:r>
@@ -16506,27 +16306,14 @@
       <w:r>
         <w:t xml:space="preserve">Gambar 3. </w:t>
       </w:r>
-      <w:r>
-        <w:fldChar w:fldCharType="begin"/>
-      </w:r>
-      <w:r>
-        <w:instrText xml:space="preserve"> SEQ Gambar_3. \* ARABIC </w:instrText>
-      </w:r>
-      <w:r>
-        <w:fldChar w:fldCharType="separate"/>
-      </w:r>
-      <w:r>
-        <w:rPr>
-          <w:noProof/>
-        </w:rPr>
-        <w:t>20</w:t>
-      </w:r>
-      <w:r>
-        <w:rPr>
-          <w:noProof/>
-        </w:rPr>
-        <w:fldChar w:fldCharType="end"/>
-      </w:r>
+      <w:fldSimple w:instr=" SEQ Gambar_3. \* ARABIC ">
+        <w:r>
+          <w:rPr>
+            <w:noProof/>
+          </w:rPr>
+          <w:t>20</w:t>
+        </w:r>
+      </w:fldSimple>
       <w:r>
         <w:t xml:space="preserve"> distribusi </w:t>
       </w:r>
@@ -16666,27 +16453,14 @@
       <w:r>
         <w:t xml:space="preserve">Gambar 3. </w:t>
       </w:r>
-      <w:r>
-        <w:fldChar w:fldCharType="begin"/>
-      </w:r>
-      <w:r>
-        <w:instrText xml:space="preserve"> SEQ Gambar_3. \* ARABIC </w:instrText>
-      </w:r>
-      <w:r>
-        <w:fldChar w:fldCharType="separate"/>
-      </w:r>
-      <w:r>
-        <w:rPr>
-          <w:noProof/>
-        </w:rPr>
-        <w:t>21</w:t>
-      </w:r>
-      <w:r>
-        <w:rPr>
-          <w:noProof/>
-        </w:rPr>
-        <w:fldChar w:fldCharType="end"/>
-      </w:r>
+      <w:fldSimple w:instr=" SEQ Gambar_3. \* ARABIC ">
+        <w:r>
+          <w:rPr>
+            <w:noProof/>
+          </w:rPr>
+          <w:t>21</w:t>
+        </w:r>
+      </w:fldSimple>
       <w:r>
         <w:t xml:space="preserve"> distribusi </w:t>
       </w:r>
@@ -16809,27 +16583,14 @@
       <w:r>
         <w:t xml:space="preserve">Gambar 3. </w:t>
       </w:r>
-      <w:r>
-        <w:fldChar w:fldCharType="begin"/>
-      </w:r>
-      <w:r>
-        <w:instrText xml:space="preserve"> SEQ Gambar_3. \* ARABIC </w:instrText>
-      </w:r>
-      <w:r>
-        <w:fldChar w:fldCharType="separate"/>
-      </w:r>
-      <w:r>
-        <w:rPr>
-          <w:noProof/>
-        </w:rPr>
-        <w:t>22</w:t>
-      </w:r>
-      <w:r>
-        <w:rPr>
-          <w:noProof/>
-        </w:rPr>
-        <w:fldChar w:fldCharType="end"/>
-      </w:r>
+      <w:fldSimple w:instr=" SEQ Gambar_3. \* ARABIC ">
+        <w:r>
+          <w:rPr>
+            <w:noProof/>
+          </w:rPr>
+          <w:t>22</w:t>
+        </w:r>
+      </w:fldSimple>
       <w:r>
         <w:t xml:space="preserve"> distribusi </w:t>
       </w:r>
@@ -16958,27 +16719,14 @@
       <w:r>
         <w:t xml:space="preserve">Gambar 3. </w:t>
       </w:r>
-      <w:r>
-        <w:fldChar w:fldCharType="begin"/>
-      </w:r>
-      <w:r>
-        <w:instrText xml:space="preserve"> SEQ Gambar_3. \* ARABIC </w:instrText>
-      </w:r>
-      <w:r>
-        <w:fldChar w:fldCharType="separate"/>
-      </w:r>
-      <w:r>
-        <w:rPr>
-          <w:noProof/>
-        </w:rPr>
-        <w:t>23</w:t>
-      </w:r>
-      <w:r>
-        <w:rPr>
-          <w:noProof/>
-        </w:rPr>
-        <w:fldChar w:fldCharType="end"/>
-      </w:r>
+      <w:fldSimple w:instr=" SEQ Gambar_3. \* ARABIC ">
+        <w:r>
+          <w:rPr>
+            <w:noProof/>
+          </w:rPr>
+          <w:t>23</w:t>
+        </w:r>
+      </w:fldSimple>
       <w:r>
         <w:t xml:space="preserve"> distribusi </w:t>
       </w:r>
@@ -17113,27 +16861,14 @@
       <w:r>
         <w:t xml:space="preserve">Gambar 3. </w:t>
       </w:r>
-      <w:r>
-        <w:fldChar w:fldCharType="begin"/>
-      </w:r>
-      <w:r>
-        <w:instrText xml:space="preserve"> SEQ Gambar_3. \* ARABIC </w:instrText>
-      </w:r>
-      <w:r>
-        <w:fldChar w:fldCharType="separate"/>
-      </w:r>
-      <w:r>
-        <w:rPr>
-          <w:noProof/>
-        </w:rPr>
-        <w:t>24</w:t>
-      </w:r>
-      <w:r>
-        <w:rPr>
-          <w:noProof/>
-        </w:rPr>
-        <w:fldChar w:fldCharType="end"/>
-      </w:r>
+      <w:fldSimple w:instr=" SEQ Gambar_3. \* ARABIC ">
+        <w:r>
+          <w:rPr>
+            <w:noProof/>
+          </w:rPr>
+          <w:t>24</w:t>
+        </w:r>
+      </w:fldSimple>
       <w:r>
         <w:t xml:space="preserve"> distribusi </w:t>
       </w:r>
@@ -17474,27 +17209,14 @@
       <w:r>
         <w:t xml:space="preserve">Gambar 3. </w:t>
       </w:r>
-      <w:r>
-        <w:fldChar w:fldCharType="begin"/>
-      </w:r>
-      <w:r>
-        <w:instrText xml:space="preserve"> SEQ Gambar_3. \* ARABIC </w:instrText>
-      </w:r>
-      <w:r>
-        <w:fldChar w:fldCharType="separate"/>
-      </w:r>
-      <w:r>
-        <w:rPr>
-          <w:noProof/>
-        </w:rPr>
-        <w:t>25</w:t>
-      </w:r>
-      <w:r>
-        <w:rPr>
-          <w:noProof/>
-        </w:rPr>
-        <w:fldChar w:fldCharType="end"/>
-      </w:r>
+      <w:fldSimple w:instr=" SEQ Gambar_3. \* ARABIC ">
+        <w:r>
+          <w:rPr>
+            <w:noProof/>
+          </w:rPr>
+          <w:t>25</w:t>
+        </w:r>
+      </w:fldSimple>
       <w:r>
         <w:t xml:space="preserve"> v</w:t>
       </w:r>
@@ -17647,27 +17369,14 @@
       <w:r>
         <w:t xml:space="preserve">Gambar 3. </w:t>
       </w:r>
-      <w:r>
-        <w:fldChar w:fldCharType="begin"/>
-      </w:r>
-      <w:r>
-        <w:instrText xml:space="preserve"> SEQ Gambar_3. \* ARABIC </w:instrText>
-      </w:r>
-      <w:r>
-        <w:fldChar w:fldCharType="separate"/>
-      </w:r>
-      <w:r>
-        <w:rPr>
-          <w:noProof/>
-        </w:rPr>
-        <w:t>26</w:t>
-      </w:r>
-      <w:r>
-        <w:rPr>
-          <w:noProof/>
-        </w:rPr>
-        <w:fldChar w:fldCharType="end"/>
-      </w:r>
+      <w:fldSimple w:instr=" SEQ Gambar_3. \* ARABIC ">
+        <w:r>
+          <w:rPr>
+            <w:noProof/>
+          </w:rPr>
+          <w:t>26</w:t>
+        </w:r>
+      </w:fldSimple>
       <w:r>
         <w:t xml:space="preserve"> v</w:t>
       </w:r>
@@ -17918,27 +17627,14 @@
       <w:r>
         <w:t xml:space="preserve">Gambar 3. </w:t>
       </w:r>
-      <w:r>
-        <w:fldChar w:fldCharType="begin"/>
-      </w:r>
-      <w:r>
-        <w:instrText xml:space="preserve"> SEQ Gambar_3. \* ARABIC </w:instrText>
-      </w:r>
-      <w:r>
-        <w:fldChar w:fldCharType="separate"/>
-      </w:r>
-      <w:r>
-        <w:rPr>
-          <w:noProof/>
-        </w:rPr>
-        <w:t>27</w:t>
-      </w:r>
-      <w:r>
-        <w:rPr>
-          <w:noProof/>
-        </w:rPr>
-        <w:fldChar w:fldCharType="end"/>
-      </w:r>
+      <w:fldSimple w:instr=" SEQ Gambar_3. \* ARABIC ">
+        <w:r>
+          <w:rPr>
+            <w:noProof/>
+          </w:rPr>
+          <w:t>27</w:t>
+        </w:r>
+      </w:fldSimple>
       <w:r>
         <w:t xml:space="preserve"> </w:t>
       </w:r>
@@ -18030,27 +17726,14 @@
       <w:r>
         <w:t xml:space="preserve">Gambar 3. </w:t>
       </w:r>
-      <w:r>
-        <w:fldChar w:fldCharType="begin"/>
-      </w:r>
-      <w:r>
-        <w:instrText xml:space="preserve"> SEQ Gambar_3. \* ARABIC </w:instrText>
-      </w:r>
-      <w:r>
-        <w:fldChar w:fldCharType="separate"/>
-      </w:r>
-      <w:r>
-        <w:rPr>
-          <w:noProof/>
-        </w:rPr>
-        <w:t>28</w:t>
-      </w:r>
-      <w:r>
-        <w:rPr>
-          <w:noProof/>
-        </w:rPr>
-        <w:fldChar w:fldCharType="end"/>
-      </w:r>
+      <w:fldSimple w:instr=" SEQ Gambar_3. \* ARABIC ">
+        <w:r>
+          <w:rPr>
+            <w:noProof/>
+          </w:rPr>
+          <w:t>28</w:t>
+        </w:r>
+      </w:fldSimple>
       <w:r>
         <w:t xml:space="preserve"> </w:t>
       </w:r>
@@ -18200,27 +17883,14 @@
       <w:r>
         <w:t xml:space="preserve">Gambar 3. </w:t>
       </w:r>
-      <w:r>
-        <w:fldChar w:fldCharType="begin"/>
-      </w:r>
-      <w:r>
-        <w:instrText xml:space="preserve"> SEQ Gambar_3. \* ARABIC </w:instrText>
-      </w:r>
-      <w:r>
-        <w:fldChar w:fldCharType="separate"/>
-      </w:r>
-      <w:r>
-        <w:rPr>
-          <w:noProof/>
-        </w:rPr>
-        <w:t>29</w:t>
-      </w:r>
-      <w:r>
-        <w:rPr>
-          <w:noProof/>
-        </w:rPr>
-        <w:fldChar w:fldCharType="end"/>
-      </w:r>
+      <w:fldSimple w:instr=" SEQ Gambar_3. \* ARABIC ">
+        <w:r>
+          <w:rPr>
+            <w:noProof/>
+          </w:rPr>
+          <w:t>29</w:t>
+        </w:r>
+      </w:fldSimple>
       <w:r>
         <w:t xml:space="preserve"> validasi ulang prodi pilihan 1</w:t>
       </w:r>
@@ -18341,27 +18011,14 @@
       <w:r>
         <w:t xml:space="preserve">Gambar 3. </w:t>
       </w:r>
-      <w:r>
-        <w:fldChar w:fldCharType="begin"/>
-      </w:r>
-      <w:r>
-        <w:instrText xml:space="preserve"> SEQ Gambar_3. \* ARABIC </w:instrText>
-      </w:r>
-      <w:r>
-        <w:fldChar w:fldCharType="separate"/>
-      </w:r>
-      <w:r>
-        <w:rPr>
-          <w:noProof/>
-        </w:rPr>
-        <w:t>30</w:t>
-      </w:r>
-      <w:r>
-        <w:rPr>
-          <w:noProof/>
-        </w:rPr>
-        <w:fldChar w:fldCharType="end"/>
-      </w:r>
+      <w:fldSimple w:instr=" SEQ Gambar_3. \* ARABIC ">
+        <w:r>
+          <w:rPr>
+            <w:noProof/>
+          </w:rPr>
+          <w:t>30</w:t>
+        </w:r>
+      </w:fldSimple>
       <w:r>
         <w:t xml:space="preserve"> validasi ulang </w:t>
       </w:r>
@@ -18504,27 +18161,14 @@
       <w:r>
         <w:t xml:space="preserve">Gambar 3. </w:t>
       </w:r>
-      <w:r>
-        <w:fldChar w:fldCharType="begin"/>
-      </w:r>
-      <w:r>
-        <w:instrText xml:space="preserve"> SEQ Gambar_3. \* ARABIC </w:instrText>
-      </w:r>
-      <w:r>
-        <w:fldChar w:fldCharType="separate"/>
-      </w:r>
-      <w:r>
-        <w:rPr>
-          <w:noProof/>
-        </w:rPr>
-        <w:t>31</w:t>
-      </w:r>
-      <w:r>
-        <w:rPr>
-          <w:noProof/>
-        </w:rPr>
-        <w:fldChar w:fldCharType="end"/>
-      </w:r>
+      <w:fldSimple w:instr=" SEQ Gambar_3. \* ARABIC ">
+        <w:r>
+          <w:rPr>
+            <w:noProof/>
+          </w:rPr>
+          <w:t>31</w:t>
+        </w:r>
+      </w:fldSimple>
       <w:r>
         <w:t xml:space="preserve"> validasi ulang </w:t>
       </w:r>
@@ -18654,27 +18298,14 @@
       <w:r>
         <w:t xml:space="preserve">Gambar 3. </w:t>
       </w:r>
-      <w:r>
-        <w:fldChar w:fldCharType="begin"/>
-      </w:r>
-      <w:r>
-        <w:instrText xml:space="preserve"> SEQ Gambar_3. \* ARABIC </w:instrText>
-      </w:r>
-      <w:r>
-        <w:fldChar w:fldCharType="separate"/>
-      </w:r>
-      <w:r>
-        <w:rPr>
-          <w:noProof/>
-        </w:rPr>
-        <w:t>32</w:t>
-      </w:r>
-      <w:r>
-        <w:rPr>
-          <w:noProof/>
-        </w:rPr>
-        <w:fldChar w:fldCharType="end"/>
-      </w:r>
+      <w:fldSimple w:instr=" SEQ Gambar_3. \* ARABIC ">
+        <w:r>
+          <w:rPr>
+            <w:noProof/>
+          </w:rPr>
+          <w:t>32</w:t>
+        </w:r>
+      </w:fldSimple>
       <w:r>
         <w:t xml:space="preserve"> validasi ulang </w:t>
       </w:r>
@@ -18829,27 +18460,14 @@
       <w:r>
         <w:t xml:space="preserve">Gambar 3. </w:t>
       </w:r>
-      <w:r>
-        <w:fldChar w:fldCharType="begin"/>
-      </w:r>
-      <w:r>
-        <w:instrText xml:space="preserve"> SEQ Gambar_3. \* ARABIC </w:instrText>
-      </w:r>
-      <w:r>
-        <w:fldChar w:fldCharType="separate"/>
-      </w:r>
-      <w:r>
-        <w:rPr>
-          <w:noProof/>
-        </w:rPr>
-        <w:t>33</w:t>
-      </w:r>
-      <w:r>
-        <w:rPr>
-          <w:noProof/>
-        </w:rPr>
-        <w:fldChar w:fldCharType="end"/>
-      </w:r>
+      <w:fldSimple w:instr=" SEQ Gambar_3. \* ARABIC ">
+        <w:r>
+          <w:rPr>
+            <w:noProof/>
+          </w:rPr>
+          <w:t>33</w:t>
+        </w:r>
+      </w:fldSimple>
       <w:r>
         <w:t xml:space="preserve"> validasi ulang </w:t>
       </w:r>
@@ -18979,27 +18597,14 @@
       <w:r>
         <w:t xml:space="preserve">Gambar 3. </w:t>
       </w:r>
-      <w:r>
-        <w:fldChar w:fldCharType="begin"/>
-      </w:r>
-      <w:r>
-        <w:instrText xml:space="preserve"> SEQ Gambar_3. \* ARABIC </w:instrText>
-      </w:r>
-      <w:r>
-        <w:fldChar w:fldCharType="separate"/>
-      </w:r>
-      <w:r>
-        <w:rPr>
-          <w:noProof/>
-        </w:rPr>
-        <w:t>34</w:t>
-      </w:r>
-      <w:r>
-        <w:rPr>
-          <w:noProof/>
-        </w:rPr>
-        <w:fldChar w:fldCharType="end"/>
-      </w:r>
+      <w:fldSimple w:instr=" SEQ Gambar_3. \* ARABIC ">
+        <w:r>
+          <w:rPr>
+            <w:noProof/>
+          </w:rPr>
+          <w:t>34</w:t>
+        </w:r>
+      </w:fldSimple>
       <w:r>
         <w:t xml:space="preserve"> validasi ulang </w:t>
       </w:r>
@@ -19154,27 +18759,14 @@
       <w:r>
         <w:t xml:space="preserve">Gambar 3. </w:t>
       </w:r>
-      <w:r>
-        <w:fldChar w:fldCharType="begin"/>
-      </w:r>
-      <w:r>
-        <w:instrText xml:space="preserve"> SEQ Gambar_3. \* ARABIC </w:instrText>
-      </w:r>
-      <w:r>
-        <w:fldChar w:fldCharType="separate"/>
-      </w:r>
-      <w:r>
-        <w:rPr>
-          <w:noProof/>
-        </w:rPr>
-        <w:t>35</w:t>
-      </w:r>
-      <w:r>
-        <w:rPr>
-          <w:noProof/>
-        </w:rPr>
-        <w:fldChar w:fldCharType="end"/>
-      </w:r>
+      <w:fldSimple w:instr=" SEQ Gambar_3. \* ARABIC ">
+        <w:r>
+          <w:rPr>
+            <w:noProof/>
+          </w:rPr>
+          <w:t>35</w:t>
+        </w:r>
+      </w:fldSimple>
       <w:r>
         <w:t xml:space="preserve"> validasi ulang </w:t>
       </w:r>
@@ -19469,27 +19061,14 @@
       <w:r>
         <w:t xml:space="preserve">Gambar 3. </w:t>
       </w:r>
-      <w:r>
-        <w:fldChar w:fldCharType="begin"/>
-      </w:r>
-      <w:r>
-        <w:instrText xml:space="preserve"> SEQ Gambar_3. \* ARABIC </w:instrText>
-      </w:r>
-      <w:r>
-        <w:fldChar w:fldCharType="separate"/>
-      </w:r>
-      <w:r>
-        <w:rPr>
-          <w:noProof/>
-        </w:rPr>
-        <w:t>36</w:t>
-      </w:r>
-      <w:r>
-        <w:rPr>
-          <w:noProof/>
-        </w:rPr>
-        <w:fldChar w:fldCharType="end"/>
-      </w:r>
+      <w:fldSimple w:instr=" SEQ Gambar_3. \* ARABIC ">
+        <w:r>
+          <w:rPr>
+            <w:noProof/>
+          </w:rPr>
+          <w:t>36</w:t>
+        </w:r>
+      </w:fldSimple>
       <w:r>
         <w:t xml:space="preserve"> </w:t>
       </w:r>
@@ -19580,27 +19159,14 @@
       <w:r>
         <w:t xml:space="preserve">Gambar 3. </w:t>
       </w:r>
-      <w:r>
-        <w:fldChar w:fldCharType="begin"/>
-      </w:r>
-      <w:r>
-        <w:instrText xml:space="preserve"> SEQ Gambar_3. \* ARABIC </w:instrText>
-      </w:r>
-      <w:r>
-        <w:fldChar w:fldCharType="separate"/>
-      </w:r>
-      <w:r>
-        <w:rPr>
-          <w:noProof/>
-        </w:rPr>
-        <w:t>37</w:t>
-      </w:r>
-      <w:r>
-        <w:rPr>
-          <w:noProof/>
-        </w:rPr>
-        <w:fldChar w:fldCharType="end"/>
-      </w:r>
+      <w:fldSimple w:instr=" SEQ Gambar_3. \* ARABIC ">
+        <w:r>
+          <w:rPr>
+            <w:noProof/>
+          </w:rPr>
+          <w:t>37</w:t>
+        </w:r>
+      </w:fldSimple>
       <w:r>
         <w:t xml:space="preserve"> </w:t>
       </w:r>
@@ -19691,27 +19257,14 @@
       <w:r>
         <w:t xml:space="preserve">Gambar 3. </w:t>
       </w:r>
-      <w:r>
-        <w:fldChar w:fldCharType="begin"/>
-      </w:r>
-      <w:r>
-        <w:instrText xml:space="preserve"> SEQ Gambar_3. \* ARABIC </w:instrText>
-      </w:r>
-      <w:r>
-        <w:fldChar w:fldCharType="separate"/>
-      </w:r>
-      <w:r>
-        <w:rPr>
-          <w:noProof/>
-        </w:rPr>
-        <w:t>38</w:t>
-      </w:r>
-      <w:r>
-        <w:rPr>
-          <w:noProof/>
-        </w:rPr>
-        <w:fldChar w:fldCharType="end"/>
-      </w:r>
+      <w:fldSimple w:instr=" SEQ Gambar_3. \* ARABIC ">
+        <w:r>
+          <w:rPr>
+            <w:noProof/>
+          </w:rPr>
+          <w:t>38</w:t>
+        </w:r>
+      </w:fldSimple>
       <w:r>
         <w:t xml:space="preserve"> </w:t>
       </w:r>
@@ -20355,7 +19908,7 @@
         <w:sdtContent>
           <w:r>
             <w:rPr>
-              <w:rFonts w:ascii="Times New Roman" w:eastAsia="Times New Roman" w:hAnsi="Times New Roman" w:cs="Times New Roman"/>
+              <w:rFonts w:eastAsia="Times New Roman"/>
               <w:color w:val="000000"/>
             </w:rPr>
             <w:t>(Mulyani &amp; Kartini, 2023)</w:t>
@@ -20550,27 +20103,14 @@
       <w:r>
         <w:t xml:space="preserve">Gambar 3. </w:t>
       </w:r>
-      <w:r>
-        <w:fldChar w:fldCharType="begin"/>
-      </w:r>
-      <w:r>
-        <w:instrText xml:space="preserve"> SEQ Gambar_3. \* ARABIC </w:instrText>
-      </w:r>
-      <w:r>
-        <w:fldChar w:fldCharType="separate"/>
-      </w:r>
-      <w:r>
-        <w:rPr>
-          <w:noProof/>
-        </w:rPr>
-        <w:t>39</w:t>
-      </w:r>
-      <w:r>
-        <w:rPr>
-          <w:noProof/>
-        </w:rPr>
-        <w:fldChar w:fldCharType="end"/>
-      </w:r>
+      <w:fldSimple w:instr=" SEQ Gambar_3. \* ARABIC ">
+        <w:r>
+          <w:rPr>
+            <w:noProof/>
+          </w:rPr>
+          <w:t>39</w:t>
+        </w:r>
+      </w:fldSimple>
       <w:r>
         <w:t xml:space="preserve"> </w:t>
       </w:r>
@@ -21095,27 +20635,14 @@
       <w:r>
         <w:t xml:space="preserve">Gambar 3. </w:t>
       </w:r>
-      <w:r>
-        <w:fldChar w:fldCharType="begin"/>
-      </w:r>
-      <w:r>
-        <w:instrText xml:space="preserve"> SEQ Gambar_3. \* ARABIC </w:instrText>
-      </w:r>
-      <w:r>
-        <w:fldChar w:fldCharType="separate"/>
-      </w:r>
-      <w:r>
-        <w:rPr>
-          <w:noProof/>
-        </w:rPr>
-        <w:t>40</w:t>
-      </w:r>
-      <w:r>
-        <w:rPr>
-          <w:noProof/>
-        </w:rPr>
-        <w:fldChar w:fldCharType="end"/>
-      </w:r>
+      <w:fldSimple w:instr=" SEQ Gambar_3. \* ARABIC ">
+        <w:r>
+          <w:rPr>
+            <w:noProof/>
+          </w:rPr>
+          <w:t>40</w:t>
+        </w:r>
+      </w:fldSimple>
       <w:r>
         <w:t xml:space="preserve"> </w:t>
       </w:r>
@@ -21917,24 +21444,14 @@
       <w:r>
         <w:t xml:space="preserve">Gambar 3. </w:t>
       </w:r>
-      <w:r>
-        <w:fldChar w:fldCharType="begin"/>
-      </w:r>
-      <w:r>
-        <w:instrText xml:space="preserve"> SEQ Gambar_3. \* ARABIC </w:instrText>
-      </w:r>
-      <w:r>
-        <w:fldChar w:fldCharType="separate"/>
-      </w:r>
-      <w:r>
-        <w:rPr>
-          <w:noProof/>
-        </w:rPr>
-        <w:t>41</w:t>
-      </w:r>
-      <w:r>
-        <w:fldChar w:fldCharType="end"/>
-      </w:r>
+      <w:fldSimple w:instr=" SEQ Gambar_3. \* ARABIC ">
+        <w:r>
+          <w:rPr>
+            <w:noProof/>
+          </w:rPr>
+          <w:t>41</w:t>
+        </w:r>
+      </w:fldSimple>
       <w:r>
         <w:t xml:space="preserve"> demo penggunaan dashboard overall</w:t>
       </w:r>
@@ -22518,24 +22035,14 @@
       <w:r>
         <w:t xml:space="preserve">Gambar 3. </w:t>
       </w:r>
-      <w:r>
-        <w:fldChar w:fldCharType="begin"/>
-      </w:r>
-      <w:r>
-        <w:instrText xml:space="preserve"> SEQ Gambar_3. \* ARABIC </w:instrText>
-      </w:r>
-      <w:r>
-        <w:fldChar w:fldCharType="separate"/>
-      </w:r>
-      <w:r>
-        <w:rPr>
-          <w:noProof/>
-        </w:rPr>
-        <w:t>42</w:t>
-      </w:r>
-      <w:r>
-        <w:fldChar w:fldCharType="end"/>
-      </w:r>
+      <w:fldSimple w:instr=" SEQ Gambar_3. \* ARABIC ">
+        <w:r>
+          <w:rPr>
+            <w:noProof/>
+          </w:rPr>
+          <w:t>42</w:t>
+        </w:r>
+      </w:fldSimple>
       <w:r>
         <w:t xml:space="preserve"> demo penggunaan dashboard demografi</w:t>
       </w:r>
@@ -23227,7 +22734,7 @@
         <w:sdtContent>
           <w:r>
             <w:rPr>
-              <w:rFonts w:ascii="Times New Roman" w:eastAsia="Times New Roman" w:hAnsi="Times New Roman" w:cs="Times New Roman"/>
+              <w:rFonts w:eastAsia="Times New Roman"/>
               <w:color w:val="000000"/>
             </w:rPr>
             <w:t>(Hismawan &amp; Izaak, 2023)</w:t>
@@ -23970,27 +23477,14 @@
       <w:r>
         <w:t xml:space="preserve">Gambar 3. </w:t>
       </w:r>
-      <w:r>
-        <w:fldChar w:fldCharType="begin"/>
-      </w:r>
-      <w:r>
-        <w:instrText xml:space="preserve"> SEQ Gambar_3. \* ARABIC </w:instrText>
-      </w:r>
-      <w:r>
-        <w:fldChar w:fldCharType="separate"/>
-      </w:r>
-      <w:r>
-        <w:rPr>
-          <w:noProof/>
-        </w:rPr>
-        <w:t>43</w:t>
-      </w:r>
-      <w:r>
-        <w:rPr>
-          <w:noProof/>
-        </w:rPr>
-        <w:fldChar w:fldCharType="end"/>
-      </w:r>
+      <w:fldSimple w:instr=" SEQ Gambar_3. \* ARABIC ">
+        <w:r>
+          <w:rPr>
+            <w:noProof/>
+          </w:rPr>
+          <w:t>43</w:t>
+        </w:r>
+      </w:fldSimple>
       <w:r>
         <w:t xml:space="preserve"> </w:t>
       </w:r>
@@ -24151,27 +23645,14 @@
       <w:r>
         <w:t xml:space="preserve">Gambar 3. </w:t>
       </w:r>
-      <w:r>
-        <w:fldChar w:fldCharType="begin"/>
-      </w:r>
-      <w:r>
-        <w:instrText xml:space="preserve"> SEQ Gambar_3. \* ARABIC </w:instrText>
-      </w:r>
-      <w:r>
-        <w:fldChar w:fldCharType="separate"/>
-      </w:r>
-      <w:r>
-        <w:rPr>
-          <w:noProof/>
-        </w:rPr>
-        <w:t>44</w:t>
-      </w:r>
-      <w:r>
-        <w:rPr>
-          <w:noProof/>
-        </w:rPr>
-        <w:fldChar w:fldCharType="end"/>
-      </w:r>
+      <w:fldSimple w:instr=" SEQ Gambar_3. \* ARABIC ">
+        <w:r>
+          <w:rPr>
+            <w:noProof/>
+          </w:rPr>
+          <w:t>44</w:t>
+        </w:r>
+      </w:fldSimple>
       <w:r>
         <w:t xml:space="preserve"> </w:t>
       </w:r>
@@ -24329,27 +23810,14 @@
       <w:r>
         <w:t xml:space="preserve">Gambar 3. </w:t>
       </w:r>
-      <w:r>
-        <w:fldChar w:fldCharType="begin"/>
-      </w:r>
-      <w:r>
-        <w:instrText xml:space="preserve"> SEQ Gambar_3. \* ARABIC </w:instrText>
-      </w:r>
-      <w:r>
-        <w:fldChar w:fldCharType="separate"/>
-      </w:r>
-      <w:r>
-        <w:rPr>
-          <w:noProof/>
-        </w:rPr>
-        <w:t>45</w:t>
-      </w:r>
-      <w:r>
-        <w:rPr>
-          <w:noProof/>
-        </w:rPr>
-        <w:fldChar w:fldCharType="end"/>
-      </w:r>
+      <w:fldSimple w:instr=" SEQ Gambar_3. \* ARABIC ">
+        <w:r>
+          <w:rPr>
+            <w:noProof/>
+          </w:rPr>
+          <w:t>45</w:t>
+        </w:r>
+      </w:fldSimple>
       <w:r>
         <w:t xml:space="preserve"> </w:t>
       </w:r>
@@ -24504,27 +23972,14 @@
       <w:r>
         <w:t xml:space="preserve">Gambar 3. </w:t>
       </w:r>
-      <w:r>
-        <w:fldChar w:fldCharType="begin"/>
-      </w:r>
-      <w:r>
-        <w:instrText xml:space="preserve"> SEQ Gambar_3. \* ARABIC </w:instrText>
-      </w:r>
-      <w:r>
-        <w:fldChar w:fldCharType="separate"/>
-      </w:r>
-      <w:r>
-        <w:rPr>
-          <w:noProof/>
-        </w:rPr>
-        <w:t>46</w:t>
-      </w:r>
-      <w:r>
-        <w:rPr>
-          <w:noProof/>
-        </w:rPr>
-        <w:fldChar w:fldCharType="end"/>
-      </w:r>
+      <w:fldSimple w:instr=" SEQ Gambar_3. \* ARABIC ">
+        <w:r>
+          <w:rPr>
+            <w:noProof/>
+          </w:rPr>
+          <w:t>46</w:t>
+        </w:r>
+      </w:fldSimple>
       <w:r>
         <w:t xml:space="preserve"> </w:t>
       </w:r>
@@ -24729,27 +24184,14 @@
       <w:r>
         <w:t xml:space="preserve">Gambar 3. </w:t>
       </w:r>
-      <w:r>
-        <w:fldChar w:fldCharType="begin"/>
-      </w:r>
-      <w:r>
-        <w:instrText xml:space="preserve"> SEQ Gambar_3. \* ARABIC </w:instrText>
-      </w:r>
-      <w:r>
-        <w:fldChar w:fldCharType="separate"/>
-      </w:r>
-      <w:r>
-        <w:rPr>
-          <w:noProof/>
-        </w:rPr>
-        <w:t>47</w:t>
-      </w:r>
-      <w:r>
-        <w:rPr>
-          <w:noProof/>
-        </w:rPr>
-        <w:fldChar w:fldCharType="end"/>
-      </w:r>
+      <w:fldSimple w:instr=" SEQ Gambar_3. \* ARABIC ">
+        <w:r>
+          <w:rPr>
+            <w:noProof/>
+          </w:rPr>
+          <w:t>47</w:t>
+        </w:r>
+      </w:fldSimple>
       <w:r>
         <w:t xml:space="preserve"> </w:t>
       </w:r>
@@ -25016,27 +24458,14 @@
       <w:r>
         <w:t xml:space="preserve">Gambar 3. </w:t>
       </w:r>
-      <w:r>
-        <w:fldChar w:fldCharType="begin"/>
-      </w:r>
-      <w:r>
-        <w:instrText xml:space="preserve"> SEQ Gambar_3. \* ARABIC </w:instrText>
-      </w:r>
-      <w:r>
-        <w:fldChar w:fldCharType="separate"/>
-      </w:r>
-      <w:r>
-        <w:rPr>
-          <w:noProof/>
-        </w:rPr>
-        <w:t>48</w:t>
-      </w:r>
-      <w:r>
-        <w:rPr>
-          <w:noProof/>
-        </w:rPr>
-        <w:fldChar w:fldCharType="end"/>
-      </w:r>
+      <w:fldSimple w:instr=" SEQ Gambar_3. \* ARABIC ">
+        <w:r>
+          <w:rPr>
+            <w:noProof/>
+          </w:rPr>
+          <w:t>48</w:t>
+        </w:r>
+      </w:fldSimple>
       <w:r>
         <w:t xml:space="preserve"> </w:t>
       </w:r>
@@ -25183,27 +24612,14 @@
       <w:r>
         <w:t xml:space="preserve">Gambar 3. </w:t>
       </w:r>
-      <w:r>
-        <w:fldChar w:fldCharType="begin"/>
-      </w:r>
-      <w:r>
-        <w:instrText xml:space="preserve"> SEQ Gambar_3. \* ARABIC </w:instrText>
-      </w:r>
-      <w:r>
-        <w:fldChar w:fldCharType="separate"/>
-      </w:r>
-      <w:r>
-        <w:rPr>
-          <w:noProof/>
-        </w:rPr>
-        <w:t>49</w:t>
-      </w:r>
-      <w:r>
-        <w:rPr>
-          <w:noProof/>
-        </w:rPr>
-        <w:fldChar w:fldCharType="end"/>
-      </w:r>
+      <w:fldSimple w:instr=" SEQ Gambar_3. \* ARABIC ">
+        <w:r>
+          <w:rPr>
+            <w:noProof/>
+          </w:rPr>
+          <w:t>49</w:t>
+        </w:r>
+      </w:fldSimple>
       <w:r>
         <w:t xml:space="preserve"> </w:t>
       </w:r>
@@ -25391,27 +24807,14 @@
       <w:r>
         <w:t xml:space="preserve">Gambar 3. </w:t>
       </w:r>
-      <w:r>
-        <w:fldChar w:fldCharType="begin"/>
-      </w:r>
-      <w:r>
-        <w:instrText xml:space="preserve"> SEQ Gambar_3. \* ARABIC </w:instrText>
-      </w:r>
-      <w:r>
-        <w:fldChar w:fldCharType="separate"/>
-      </w:r>
-      <w:r>
-        <w:rPr>
-          <w:noProof/>
-        </w:rPr>
-        <w:t>50</w:t>
-      </w:r>
-      <w:r>
-        <w:rPr>
-          <w:noProof/>
-        </w:rPr>
-        <w:fldChar w:fldCharType="end"/>
-      </w:r>
+      <w:fldSimple w:instr=" SEQ Gambar_3. \* ARABIC ">
+        <w:r>
+          <w:rPr>
+            <w:noProof/>
+          </w:rPr>
+          <w:t>50</w:t>
+        </w:r>
+      </w:fldSimple>
       <w:r>
         <w:t xml:space="preserve"> </w:t>
       </w:r>
@@ -25594,27 +24997,14 @@
       <w:r>
         <w:t xml:space="preserve">Gambar 3. </w:t>
       </w:r>
-      <w:r>
-        <w:fldChar w:fldCharType="begin"/>
-      </w:r>
-      <w:r>
-        <w:instrText xml:space="preserve"> SEQ Gambar_3. \* ARABIC </w:instrText>
-      </w:r>
-      <w:r>
-        <w:fldChar w:fldCharType="separate"/>
-      </w:r>
-      <w:r>
-        <w:rPr>
-          <w:noProof/>
-        </w:rPr>
-        <w:t>51</w:t>
-      </w:r>
-      <w:r>
-        <w:rPr>
-          <w:noProof/>
-        </w:rPr>
-        <w:fldChar w:fldCharType="end"/>
-      </w:r>
+      <w:fldSimple w:instr=" SEQ Gambar_3. \* ARABIC ">
+        <w:r>
+          <w:rPr>
+            <w:noProof/>
+          </w:rPr>
+          <w:t>51</w:t>
+        </w:r>
+      </w:fldSimple>
       <w:r>
         <w:t xml:space="preserve"> </w:t>
       </w:r>
@@ -25790,27 +25180,14 @@
       <w:r>
         <w:t xml:space="preserve">Gambar 3. </w:t>
       </w:r>
-      <w:r>
-        <w:fldChar w:fldCharType="begin"/>
-      </w:r>
-      <w:r>
-        <w:instrText xml:space="preserve"> SEQ Gambar_3. \* ARABIC </w:instrText>
-      </w:r>
-      <w:r>
-        <w:fldChar w:fldCharType="separate"/>
-      </w:r>
-      <w:r>
-        <w:rPr>
-          <w:noProof/>
-        </w:rPr>
-        <w:t>52</w:t>
-      </w:r>
-      <w:r>
-        <w:rPr>
-          <w:noProof/>
-        </w:rPr>
-        <w:fldChar w:fldCharType="end"/>
-      </w:r>
+      <w:fldSimple w:instr=" SEQ Gambar_3. \* ARABIC ">
+        <w:r>
+          <w:rPr>
+            <w:noProof/>
+          </w:rPr>
+          <w:t>52</w:t>
+        </w:r>
+      </w:fldSimple>
       <w:r>
         <w:t xml:space="preserve"> </w:t>
       </w:r>
@@ -25998,27 +25375,14 @@
       <w:r>
         <w:t xml:space="preserve">Gambar 3. </w:t>
       </w:r>
-      <w:r>
-        <w:fldChar w:fldCharType="begin"/>
-      </w:r>
-      <w:r>
-        <w:instrText xml:space="preserve"> SEQ Gambar_3. \* ARABIC </w:instrText>
-      </w:r>
-      <w:r>
-        <w:fldChar w:fldCharType="separate"/>
-      </w:r>
-      <w:r>
-        <w:rPr>
-          <w:noProof/>
-        </w:rPr>
-        <w:t>53</w:t>
-      </w:r>
-      <w:r>
-        <w:rPr>
-          <w:noProof/>
-        </w:rPr>
-        <w:fldChar w:fldCharType="end"/>
-      </w:r>
+      <w:fldSimple w:instr=" SEQ Gambar_3. \* ARABIC ">
+        <w:r>
+          <w:rPr>
+            <w:noProof/>
+          </w:rPr>
+          <w:t>53</w:t>
+        </w:r>
+      </w:fldSimple>
       <w:r>
         <w:t xml:space="preserve"> </w:t>
       </w:r>
@@ -26722,23 +26086,53 @@
             <w:autoSpaceDE w:val="0"/>
             <w:autoSpaceDN w:val="0"/>
             <w:ind w:hanging="480"/>
-            <w:jc w:val="both"/>
-            <w:divId w:val="1149446474"/>
+            <w:divId w:val="2103910461"/>
             <w:rPr>
-              <w:rFonts w:ascii="Times New Roman" w:eastAsia="Times New Roman" w:hAnsi="Times New Roman" w:cs="Times New Roman"/>
+              <w:rFonts w:eastAsia="Times New Roman"/>
               <w:kern w:val="0"/>
               <w14:ligatures w14:val="none"/>
             </w:rPr>
           </w:pPr>
           <w:r>
             <w:rPr>
-              <w:rFonts w:ascii="Times New Roman" w:eastAsia="Times New Roman" w:hAnsi="Times New Roman" w:cs="Times New Roman"/>
+              <w:rFonts w:eastAsia="Times New Roman"/>
+            </w:rPr>
+            <w:t xml:space="preserve">Anhari, T., Alim, E. S., Rizkiawan, M. A., &amp; Hasan, F. N. (2025). </w:t>
+          </w:r>
+          <w:r>
+            <w:rPr>
+              <w:rFonts w:eastAsia="Times New Roman"/>
+              <w:i/>
+              <w:iCs/>
+            </w:rPr>
+            <w:t>Business Intelligence Visualisasi Data Penerimaan Mahasiswa Baru Menggunakan Tableau di Universitas ABC</w:t>
+          </w:r>
+          <w:r>
+            <w:rPr>
+              <w:rFonts w:eastAsia="Times New Roman"/>
+            </w:rPr>
+            <w:t xml:space="preserve"> (Vol. 6, Issue 1).</w:t>
+          </w:r>
+        </w:p>
+        <w:p>
+          <w:pPr>
+            <w:autoSpaceDE w:val="0"/>
+            <w:autoSpaceDN w:val="0"/>
+            <w:ind w:hanging="480"/>
+            <w:divId w:val="1464956673"/>
+            <w:rPr>
+              <w:rFonts w:eastAsia="Times New Roman"/>
+            </w:rPr>
+          </w:pPr>
+          <w:r>
+            <w:rPr>
+              <w:rFonts w:eastAsia="Times New Roman"/>
             </w:rPr>
             <w:t xml:space="preserve">Hanifah, N., &amp; Nasution, M. I. P. (2025). Manajemen Data Yang Efektif: Solusi Untuk Mencegah dan Mengatasi Duplikasi Data Dalam Perusahaan. </w:t>
           </w:r>
           <w:r>
             <w:rPr>
-              <w:rFonts w:ascii="Times New Roman" w:eastAsia="Times New Roman" w:hAnsi="Times New Roman" w:cs="Times New Roman"/>
+              <w:rFonts w:eastAsia="Times New Roman"/>
               <w:i/>
               <w:iCs/>
             </w:rPr>
@@ -26746,13 +26140,13 @@
           </w:r>
           <w:r>
             <w:rPr>
-              <w:rFonts w:ascii="Times New Roman" w:eastAsia="Times New Roman" w:hAnsi="Times New Roman" w:cs="Times New Roman"/>
+              <w:rFonts w:eastAsia="Times New Roman"/>
             </w:rPr>
             <w:t xml:space="preserve">, </w:t>
           </w:r>
           <w:r>
             <w:rPr>
-              <w:rFonts w:ascii="Times New Roman" w:eastAsia="Times New Roman" w:hAnsi="Times New Roman" w:cs="Times New Roman"/>
+              <w:rFonts w:eastAsia="Times New Roman"/>
               <w:i/>
               <w:iCs/>
             </w:rPr>
@@ -26760,7 +26154,7 @@
           </w:r>
           <w:r>
             <w:rPr>
-              <w:rFonts w:ascii="Times New Roman" w:eastAsia="Times New Roman" w:hAnsi="Times New Roman" w:cs="Times New Roman"/>
+              <w:rFonts w:eastAsia="Times New Roman"/>
             </w:rPr>
             <w:t>(1), 27–38.</w:t>
           </w:r>
@@ -26770,21 +26164,20 @@
             <w:autoSpaceDE w:val="0"/>
             <w:autoSpaceDN w:val="0"/>
             <w:ind w:hanging="480"/>
-            <w:jc w:val="both"/>
-            <w:divId w:val="1269385193"/>
+            <w:divId w:val="1836023368"/>
             <w:rPr>
-              <w:rFonts w:ascii="Times New Roman" w:eastAsia="Times New Roman" w:hAnsi="Times New Roman" w:cs="Times New Roman"/>
+              <w:rFonts w:eastAsia="Times New Roman"/>
             </w:rPr>
           </w:pPr>
           <w:r>
             <w:rPr>
-              <w:rFonts w:ascii="Times New Roman" w:eastAsia="Times New Roman" w:hAnsi="Times New Roman" w:cs="Times New Roman"/>
+              <w:rFonts w:eastAsia="Times New Roman"/>
             </w:rPr>
             <w:t xml:space="preserve">Hismawan, F. R., &amp; Izaak, W. C. (2023). Optimalisasi website menggunakan landing page sebagai media pemasaran produk parfum fresh fusion di era digital. </w:t>
           </w:r>
           <w:r>
             <w:rPr>
-              <w:rFonts w:ascii="Times New Roman" w:eastAsia="Times New Roman" w:hAnsi="Times New Roman" w:cs="Times New Roman"/>
+              <w:rFonts w:eastAsia="Times New Roman"/>
               <w:i/>
               <w:iCs/>
             </w:rPr>
@@ -26792,13 +26185,13 @@
           </w:r>
           <w:r>
             <w:rPr>
-              <w:rFonts w:ascii="Times New Roman" w:eastAsia="Times New Roman" w:hAnsi="Times New Roman" w:cs="Times New Roman"/>
+              <w:rFonts w:eastAsia="Times New Roman"/>
             </w:rPr>
             <w:t xml:space="preserve">, </w:t>
           </w:r>
           <w:r>
             <w:rPr>
-              <w:rFonts w:ascii="Times New Roman" w:eastAsia="Times New Roman" w:hAnsi="Times New Roman" w:cs="Times New Roman"/>
+              <w:rFonts w:eastAsia="Times New Roman"/>
               <w:i/>
               <w:iCs/>
             </w:rPr>
@@ -26806,7 +26199,7 @@
           </w:r>
           <w:r>
             <w:rPr>
-              <w:rFonts w:ascii="Times New Roman" w:eastAsia="Times New Roman" w:hAnsi="Times New Roman" w:cs="Times New Roman"/>
+              <w:rFonts w:eastAsia="Times New Roman"/>
             </w:rPr>
             <w:t>(3), 364–368.</w:t>
           </w:r>
@@ -26816,21 +26209,20 @@
             <w:autoSpaceDE w:val="0"/>
             <w:autoSpaceDN w:val="0"/>
             <w:ind w:hanging="480"/>
-            <w:jc w:val="both"/>
-            <w:divId w:val="1358316123"/>
+            <w:divId w:val="1510633787"/>
             <w:rPr>
-              <w:rFonts w:ascii="Times New Roman" w:eastAsia="Times New Roman" w:hAnsi="Times New Roman" w:cs="Times New Roman"/>
+              <w:rFonts w:eastAsia="Times New Roman"/>
             </w:rPr>
           </w:pPr>
           <w:r>
             <w:rPr>
-              <w:rFonts w:ascii="Times New Roman" w:eastAsia="Times New Roman" w:hAnsi="Times New Roman" w:cs="Times New Roman"/>
+              <w:rFonts w:eastAsia="Times New Roman"/>
             </w:rPr>
             <w:t xml:space="preserve">Matondang, M., Sary, N., Gultom, T. B., &amp; Sebayang, Y. (2020). Penerapan Metode Brainstorming Dalam Perancangan Produk Pochade. </w:t>
           </w:r>
           <w:r>
             <w:rPr>
-              <w:rFonts w:ascii="Times New Roman" w:eastAsia="Times New Roman" w:hAnsi="Times New Roman" w:cs="Times New Roman"/>
+              <w:rFonts w:eastAsia="Times New Roman"/>
               <w:i/>
               <w:iCs/>
             </w:rPr>
@@ -26838,13 +26230,13 @@
           </w:r>
           <w:r>
             <w:rPr>
-              <w:rFonts w:ascii="Times New Roman" w:eastAsia="Times New Roman" w:hAnsi="Times New Roman" w:cs="Times New Roman"/>
+              <w:rFonts w:eastAsia="Times New Roman"/>
             </w:rPr>
             <w:t xml:space="preserve">, </w:t>
           </w:r>
           <w:r>
             <w:rPr>
-              <w:rFonts w:ascii="Times New Roman" w:eastAsia="Times New Roman" w:hAnsi="Times New Roman" w:cs="Times New Roman"/>
+              <w:rFonts w:eastAsia="Times New Roman"/>
               <w:i/>
               <w:iCs/>
             </w:rPr>
@@ -26852,7 +26244,7 @@
           </w:r>
           <w:r>
             <w:rPr>
-              <w:rFonts w:ascii="Times New Roman" w:eastAsia="Times New Roman" w:hAnsi="Times New Roman" w:cs="Times New Roman"/>
+              <w:rFonts w:eastAsia="Times New Roman"/>
             </w:rPr>
             <w:t>(2).</w:t>
           </w:r>
@@ -26862,21 +26254,20 @@
             <w:autoSpaceDE w:val="0"/>
             <w:autoSpaceDN w:val="0"/>
             <w:ind w:hanging="480"/>
-            <w:jc w:val="both"/>
-            <w:divId w:val="1863399606"/>
+            <w:divId w:val="571741452"/>
             <w:rPr>
-              <w:rFonts w:ascii="Times New Roman" w:eastAsia="Times New Roman" w:hAnsi="Times New Roman" w:cs="Times New Roman"/>
+              <w:rFonts w:eastAsia="Times New Roman"/>
             </w:rPr>
           </w:pPr>
           <w:r>
             <w:rPr>
-              <w:rFonts w:ascii="Times New Roman" w:eastAsia="Times New Roman" w:hAnsi="Times New Roman" w:cs="Times New Roman"/>
+              <w:rFonts w:eastAsia="Times New Roman"/>
             </w:rPr>
             <w:t xml:space="preserve">Mulyani, A., &amp; Kartini, K. (2023). Visualisasi Data Ticketing Servicedesk Dengan Dashboard Pada PT Brantas Abipraya (Persero). </w:t>
           </w:r>
           <w:r>
             <w:rPr>
-              <w:rFonts w:ascii="Times New Roman" w:eastAsia="Times New Roman" w:hAnsi="Times New Roman" w:cs="Times New Roman"/>
+              <w:rFonts w:eastAsia="Times New Roman"/>
               <w:i/>
               <w:iCs/>
             </w:rPr>
@@ -26884,13 +26275,13 @@
           </w:r>
           <w:r>
             <w:rPr>
-              <w:rFonts w:ascii="Times New Roman" w:eastAsia="Times New Roman" w:hAnsi="Times New Roman" w:cs="Times New Roman"/>
+              <w:rFonts w:eastAsia="Times New Roman"/>
             </w:rPr>
             <w:t xml:space="preserve">, </w:t>
           </w:r>
           <w:r>
             <w:rPr>
-              <w:rFonts w:ascii="Times New Roman" w:eastAsia="Times New Roman" w:hAnsi="Times New Roman" w:cs="Times New Roman"/>
+              <w:rFonts w:eastAsia="Times New Roman"/>
               <w:i/>
               <w:iCs/>
             </w:rPr>
@@ -26898,7 +26289,7 @@
           </w:r>
           <w:r>
             <w:rPr>
-              <w:rFonts w:ascii="Times New Roman" w:eastAsia="Times New Roman" w:hAnsi="Times New Roman" w:cs="Times New Roman"/>
+              <w:rFonts w:eastAsia="Times New Roman"/>
             </w:rPr>
             <w:t>(2), 289–300.</w:t>
           </w:r>
@@ -26908,21 +26299,65 @@
             <w:autoSpaceDE w:val="0"/>
             <w:autoSpaceDN w:val="0"/>
             <w:ind w:hanging="480"/>
-            <w:jc w:val="both"/>
-            <w:divId w:val="706297617"/>
+            <w:divId w:val="658390018"/>
             <w:rPr>
-              <w:rFonts w:ascii="Times New Roman" w:eastAsia="Times New Roman" w:hAnsi="Times New Roman" w:cs="Times New Roman"/>
+              <w:rFonts w:eastAsia="Times New Roman"/>
             </w:rPr>
           </w:pPr>
           <w:r>
             <w:rPr>
-              <w:rFonts w:ascii="Times New Roman" w:eastAsia="Times New Roman" w:hAnsi="Times New Roman" w:cs="Times New Roman"/>
+              <w:rFonts w:eastAsia="Times New Roman"/>
+            </w:rPr>
+            <w:t xml:space="preserve">MZ, Y., Bororing, J. E., Rahayu, S., &amp; Ramadhani, T. A. (2022). Aplikasi Dashboard Visualisasi Data Calon Mahasiswa Baru mengunakan Metabase. </w:t>
+          </w:r>
+          <w:r>
+            <w:rPr>
+              <w:rFonts w:eastAsia="Times New Roman"/>
+              <w:i/>
+              <w:iCs/>
+            </w:rPr>
+            <w:t>Edumatic: Jurnal Pendidikan Informatika</w:t>
+          </w:r>
+          <w:r>
+            <w:rPr>
+              <w:rFonts w:eastAsia="Times New Roman"/>
+            </w:rPr>
+            <w:t xml:space="preserve">, </w:t>
+          </w:r>
+          <w:r>
+            <w:rPr>
+              <w:rFonts w:eastAsia="Times New Roman"/>
+              <w:i/>
+              <w:iCs/>
+            </w:rPr>
+            <w:t>6</w:t>
+          </w:r>
+          <w:r>
+            <w:rPr>
+              <w:rFonts w:eastAsia="Times New Roman"/>
+            </w:rPr>
+            <w:t>(1), 116–125. https://doi.org/10.29408/edumatic.v6i1.5483</w:t>
+          </w:r>
+        </w:p>
+        <w:p>
+          <w:pPr>
+            <w:autoSpaceDE w:val="0"/>
+            <w:autoSpaceDN w:val="0"/>
+            <w:ind w:hanging="480"/>
+            <w:divId w:val="198666868"/>
+            <w:rPr>
+              <w:rFonts w:eastAsia="Times New Roman"/>
+            </w:rPr>
+          </w:pPr>
+          <w:r>
+            <w:rPr>
+              <w:rFonts w:eastAsia="Times New Roman"/>
             </w:rPr>
             <w:t xml:space="preserve">Ramanisa, H., Khairudin, K., &amp; Netti, S. (2020). Analisis Kemampuan Representasi Matematis Siswa. </w:t>
           </w:r>
           <w:r>
             <w:rPr>
-              <w:rFonts w:ascii="Times New Roman" w:eastAsia="Times New Roman" w:hAnsi="Times New Roman" w:cs="Times New Roman"/>
+              <w:rFonts w:eastAsia="Times New Roman"/>
               <w:i/>
               <w:iCs/>
             </w:rPr>
@@ -26930,13 +26365,13 @@
           </w:r>
           <w:r>
             <w:rPr>
-              <w:rFonts w:ascii="Times New Roman" w:eastAsia="Times New Roman" w:hAnsi="Times New Roman" w:cs="Times New Roman"/>
+              <w:rFonts w:eastAsia="Times New Roman"/>
             </w:rPr>
             <w:t xml:space="preserve">, </w:t>
           </w:r>
           <w:r>
             <w:rPr>
-              <w:rFonts w:ascii="Times New Roman" w:eastAsia="Times New Roman" w:hAnsi="Times New Roman" w:cs="Times New Roman"/>
+              <w:rFonts w:eastAsia="Times New Roman"/>
               <w:i/>
               <w:iCs/>
             </w:rPr>
@@ -26944,7 +26379,7 @@
           </w:r>
           <w:r>
             <w:rPr>
-              <w:rFonts w:ascii="Times New Roman" w:eastAsia="Times New Roman" w:hAnsi="Times New Roman" w:cs="Times New Roman"/>
+              <w:rFonts w:eastAsia="Times New Roman"/>
             </w:rPr>
             <w:t>(1), 34–38.</w:t>
           </w:r>
@@ -26954,21 +26389,20 @@
             <w:autoSpaceDE w:val="0"/>
             <w:autoSpaceDN w:val="0"/>
             <w:ind w:hanging="480"/>
-            <w:jc w:val="both"/>
-            <w:divId w:val="146557034"/>
+            <w:divId w:val="664474916"/>
             <w:rPr>
-              <w:rFonts w:ascii="Times New Roman" w:eastAsia="Times New Roman" w:hAnsi="Times New Roman" w:cs="Times New Roman"/>
+              <w:rFonts w:eastAsia="Times New Roman"/>
             </w:rPr>
           </w:pPr>
           <w:r>
             <w:rPr>
-              <w:rFonts w:ascii="Times New Roman" w:eastAsia="Times New Roman" w:hAnsi="Times New Roman" w:cs="Times New Roman"/>
+              <w:rFonts w:eastAsia="Times New Roman"/>
             </w:rPr>
             <w:t xml:space="preserve">Rosita, A. A., &amp; Tannar, O. (2024). PERAN DATA ANALIS DALAM MENDORONG KEPUTUSAN DAN STRATEGI BISNIS PERUSAHAAN. </w:t>
           </w:r>
           <w:r>
             <w:rPr>
-              <w:rFonts w:ascii="Times New Roman" w:eastAsia="Times New Roman" w:hAnsi="Times New Roman" w:cs="Times New Roman"/>
+              <w:rFonts w:eastAsia="Times New Roman"/>
               <w:i/>
               <w:iCs/>
             </w:rPr>
@@ -26976,13 +26410,13 @@
           </w:r>
           <w:r>
             <w:rPr>
-              <w:rFonts w:ascii="Times New Roman" w:eastAsia="Times New Roman" w:hAnsi="Times New Roman" w:cs="Times New Roman"/>
+              <w:rFonts w:eastAsia="Times New Roman"/>
             </w:rPr>
             <w:t xml:space="preserve">, </w:t>
           </w:r>
           <w:r>
             <w:rPr>
-              <w:rFonts w:ascii="Times New Roman" w:eastAsia="Times New Roman" w:hAnsi="Times New Roman" w:cs="Times New Roman"/>
+              <w:rFonts w:eastAsia="Times New Roman"/>
               <w:i/>
               <w:iCs/>
             </w:rPr>
@@ -26990,7 +26424,7 @@
           </w:r>
           <w:r>
             <w:rPr>
-              <w:rFonts w:ascii="Times New Roman" w:eastAsia="Times New Roman" w:hAnsi="Times New Roman" w:cs="Times New Roman"/>
+              <w:rFonts w:eastAsia="Times New Roman"/>
             </w:rPr>
             <w:t>(7).</w:t>
           </w:r>
@@ -27000,21 +26434,20 @@
             <w:autoSpaceDE w:val="0"/>
             <w:autoSpaceDN w:val="0"/>
             <w:ind w:hanging="480"/>
-            <w:jc w:val="both"/>
-            <w:divId w:val="1756784508"/>
+            <w:divId w:val="1498105940"/>
             <w:rPr>
-              <w:rFonts w:ascii="Times New Roman" w:eastAsia="Times New Roman" w:hAnsi="Times New Roman" w:cs="Times New Roman"/>
+              <w:rFonts w:eastAsia="Times New Roman"/>
             </w:rPr>
           </w:pPr>
           <w:r>
             <w:rPr>
-              <w:rFonts w:ascii="Times New Roman" w:eastAsia="Times New Roman" w:hAnsi="Times New Roman" w:cs="Times New Roman"/>
+              <w:rFonts w:eastAsia="Times New Roman"/>
             </w:rPr>
             <w:t xml:space="preserve">Seda, F. S. S. E., Setyawati, L., Tirta, T., &amp; Nobel, K. (2020). Dataset on the cultural dimension of urban society food consumption in Indonesia. </w:t>
           </w:r>
           <w:r>
             <w:rPr>
-              <w:rFonts w:ascii="Times New Roman" w:eastAsia="Times New Roman" w:hAnsi="Times New Roman" w:cs="Times New Roman"/>
+              <w:rFonts w:eastAsia="Times New Roman"/>
               <w:i/>
               <w:iCs/>
             </w:rPr>
@@ -27022,13 +26455,13 @@
           </w:r>
           <w:r>
             <w:rPr>
-              <w:rFonts w:ascii="Times New Roman" w:eastAsia="Times New Roman" w:hAnsi="Times New Roman" w:cs="Times New Roman"/>
+              <w:rFonts w:eastAsia="Times New Roman"/>
             </w:rPr>
             <w:t xml:space="preserve">, </w:t>
           </w:r>
           <w:r>
             <w:rPr>
-              <w:rFonts w:ascii="Times New Roman" w:eastAsia="Times New Roman" w:hAnsi="Times New Roman" w:cs="Times New Roman"/>
+              <w:rFonts w:eastAsia="Times New Roman"/>
               <w:i/>
               <w:iCs/>
             </w:rPr>
@@ -27036,7 +26469,7 @@
           </w:r>
           <w:r>
             <w:rPr>
-              <w:rFonts w:ascii="Times New Roman" w:eastAsia="Times New Roman" w:hAnsi="Times New Roman" w:cs="Times New Roman"/>
+              <w:rFonts w:eastAsia="Times New Roman"/>
             </w:rPr>
             <w:t>, 105681.</w:t>
           </w:r>
@@ -27046,21 +26479,20 @@
             <w:autoSpaceDE w:val="0"/>
             <w:autoSpaceDN w:val="0"/>
             <w:ind w:hanging="480"/>
-            <w:jc w:val="both"/>
-            <w:divId w:val="1945379702"/>
+            <w:divId w:val="1843472528"/>
             <w:rPr>
-              <w:rFonts w:ascii="Times New Roman" w:eastAsia="Times New Roman" w:hAnsi="Times New Roman" w:cs="Times New Roman"/>
+              <w:rFonts w:eastAsia="Times New Roman"/>
             </w:rPr>
           </w:pPr>
           <w:r>
             <w:rPr>
-              <w:rFonts w:ascii="Times New Roman" w:eastAsia="Times New Roman" w:hAnsi="Times New Roman" w:cs="Times New Roman"/>
+              <w:rFonts w:eastAsia="Times New Roman"/>
             </w:rPr>
             <w:t xml:space="preserve">Sudrajat, W., &amp; Cholid, I. (2023). K-Nearest Neighbor (K-Nn) Untuk Penanganan Missing Value Pada Data Umkm. </w:t>
           </w:r>
           <w:r>
             <w:rPr>
-              <w:rFonts w:ascii="Times New Roman" w:eastAsia="Times New Roman" w:hAnsi="Times New Roman" w:cs="Times New Roman"/>
+              <w:rFonts w:eastAsia="Times New Roman"/>
               <w:i/>
               <w:iCs/>
             </w:rPr>
@@ -27068,13 +26500,13 @@
           </w:r>
           <w:r>
             <w:rPr>
-              <w:rFonts w:ascii="Times New Roman" w:eastAsia="Times New Roman" w:hAnsi="Times New Roman" w:cs="Times New Roman"/>
+              <w:rFonts w:eastAsia="Times New Roman"/>
             </w:rPr>
             <w:t xml:space="preserve">, </w:t>
           </w:r>
           <w:r>
             <w:rPr>
-              <w:rFonts w:ascii="Times New Roman" w:eastAsia="Times New Roman" w:hAnsi="Times New Roman" w:cs="Times New Roman"/>
+              <w:rFonts w:eastAsia="Times New Roman"/>
               <w:i/>
               <w:iCs/>
             </w:rPr>
@@ -27082,7 +26514,7 @@
           </w:r>
           <w:r>
             <w:rPr>
-              <w:rFonts w:ascii="Times New Roman" w:eastAsia="Times New Roman" w:hAnsi="Times New Roman" w:cs="Times New Roman"/>
+              <w:rFonts w:eastAsia="Times New Roman"/>
             </w:rPr>
             <w:t>(2), 54–63.</w:t>
           </w:r>
@@ -27092,21 +26524,21 @@
             <w:autoSpaceDE w:val="0"/>
             <w:autoSpaceDN w:val="0"/>
             <w:ind w:hanging="480"/>
-            <w:jc w:val="both"/>
-            <w:divId w:val="1308240817"/>
+            <w:divId w:val="2035492796"/>
             <w:rPr>
-              <w:rFonts w:ascii="Times New Roman" w:eastAsia="Times New Roman" w:hAnsi="Times New Roman" w:cs="Times New Roman"/>
+              <w:rFonts w:eastAsia="Times New Roman"/>
             </w:rPr>
           </w:pPr>
           <w:r>
             <w:rPr>
-              <w:rFonts w:ascii="Times New Roman" w:eastAsia="Times New Roman" w:hAnsi="Times New Roman" w:cs="Times New Roman"/>
+              <w:rFonts w:eastAsia="Times New Roman"/>
             </w:rPr>
+            <w:lastRenderedPageBreak/>
             <w:t xml:space="preserve">Sulasmono, B. S. (2012). Problem solving: Signifikansi, pengertian, dan ragamnya. </w:t>
           </w:r>
           <w:r>
             <w:rPr>
-              <w:rFonts w:ascii="Times New Roman" w:eastAsia="Times New Roman" w:hAnsi="Times New Roman" w:cs="Times New Roman"/>
+              <w:rFonts w:eastAsia="Times New Roman"/>
               <w:i/>
               <w:iCs/>
             </w:rPr>
@@ -27114,13 +26546,13 @@
           </w:r>
           <w:r>
             <w:rPr>
-              <w:rFonts w:ascii="Times New Roman" w:eastAsia="Times New Roman" w:hAnsi="Times New Roman" w:cs="Times New Roman"/>
+              <w:rFonts w:eastAsia="Times New Roman"/>
             </w:rPr>
             <w:t xml:space="preserve">, </w:t>
           </w:r>
           <w:r>
             <w:rPr>
-              <w:rFonts w:ascii="Times New Roman" w:eastAsia="Times New Roman" w:hAnsi="Times New Roman" w:cs="Times New Roman"/>
+              <w:rFonts w:eastAsia="Times New Roman"/>
               <w:i/>
               <w:iCs/>
             </w:rPr>
@@ -27128,7 +26560,7 @@
           </w:r>
           <w:r>
             <w:rPr>
-              <w:rFonts w:ascii="Times New Roman" w:eastAsia="Times New Roman" w:hAnsi="Times New Roman" w:cs="Times New Roman"/>
+              <w:rFonts w:eastAsia="Times New Roman"/>
             </w:rPr>
             <w:t>(2), 155–166.</w:t>
           </w:r>
@@ -27138,21 +26570,20 @@
             <w:autoSpaceDE w:val="0"/>
             <w:autoSpaceDN w:val="0"/>
             <w:ind w:hanging="480"/>
-            <w:jc w:val="both"/>
-            <w:divId w:val="1818689664"/>
+            <w:divId w:val="828641545"/>
             <w:rPr>
-              <w:rFonts w:ascii="Times New Roman" w:eastAsia="Times New Roman" w:hAnsi="Times New Roman" w:cs="Times New Roman"/>
+              <w:rFonts w:eastAsia="Times New Roman"/>
             </w:rPr>
           </w:pPr>
           <w:r>
             <w:rPr>
-              <w:rFonts w:ascii="Times New Roman" w:eastAsia="Times New Roman" w:hAnsi="Times New Roman" w:cs="Times New Roman"/>
+              <w:rFonts w:eastAsia="Times New Roman"/>
             </w:rPr>
             <w:t xml:space="preserve">Turyadi, M. N. M., &amp; Kusnandar, D. (n.d.). KAJIAN SIFAT DISTRIBUSI NORMAL BIVARIAT. </w:t>
           </w:r>
           <w:r>
             <w:rPr>
-              <w:rFonts w:ascii="Times New Roman" w:eastAsia="Times New Roman" w:hAnsi="Times New Roman" w:cs="Times New Roman"/>
+              <w:rFonts w:eastAsia="Times New Roman"/>
               <w:i/>
               <w:iCs/>
             </w:rPr>
@@ -27160,13 +26591,13 @@
           </w:r>
           <w:r>
             <w:rPr>
-              <w:rFonts w:ascii="Times New Roman" w:eastAsia="Times New Roman" w:hAnsi="Times New Roman" w:cs="Times New Roman"/>
+              <w:rFonts w:eastAsia="Times New Roman"/>
             </w:rPr>
             <w:t xml:space="preserve">, </w:t>
           </w:r>
           <w:r>
             <w:rPr>
-              <w:rFonts w:ascii="Times New Roman" w:eastAsia="Times New Roman" w:hAnsi="Times New Roman" w:cs="Times New Roman"/>
+              <w:rFonts w:eastAsia="Times New Roman"/>
               <w:i/>
               <w:iCs/>
             </w:rPr>
@@ -27174,7 +26605,7 @@
           </w:r>
           <w:r>
             <w:rPr>
-              <w:rFonts w:ascii="Times New Roman" w:eastAsia="Times New Roman" w:hAnsi="Times New Roman" w:cs="Times New Roman"/>
+              <w:rFonts w:eastAsia="Times New Roman"/>
             </w:rPr>
             <w:t>(02).</w:t>
           </w:r>
@@ -27184,21 +26615,20 @@
             <w:autoSpaceDE w:val="0"/>
             <w:autoSpaceDN w:val="0"/>
             <w:ind w:hanging="480"/>
-            <w:jc w:val="both"/>
-            <w:divId w:val="1406756622"/>
+            <w:divId w:val="1791780733"/>
             <w:rPr>
-              <w:rFonts w:ascii="Times New Roman" w:eastAsia="Times New Roman" w:hAnsi="Times New Roman" w:cs="Times New Roman"/>
+              <w:rFonts w:eastAsia="Times New Roman"/>
             </w:rPr>
           </w:pPr>
           <w:r>
             <w:rPr>
-              <w:rFonts w:ascii="Times New Roman" w:eastAsia="Times New Roman" w:hAnsi="Times New Roman" w:cs="Times New Roman"/>
+              <w:rFonts w:eastAsia="Times New Roman"/>
             </w:rPr>
             <w:t xml:space="preserve">Widaningsih, S. (2019). Perbandingan Metode Data Mining Untuk Prediksi Nilai Dan Waktu Kelulusan Mahasiswa Prodi Teknik Informatika Dengan Algoritma C4, 5, Naïve Bayes, Knn Dan Svm. </w:t>
           </w:r>
           <w:r>
             <w:rPr>
-              <w:rFonts w:ascii="Times New Roman" w:eastAsia="Times New Roman" w:hAnsi="Times New Roman" w:cs="Times New Roman"/>
+              <w:rFonts w:eastAsia="Times New Roman"/>
               <w:i/>
               <w:iCs/>
             </w:rPr>
@@ -27206,13 +26636,13 @@
           </w:r>
           <w:r>
             <w:rPr>
-              <w:rFonts w:ascii="Times New Roman" w:eastAsia="Times New Roman" w:hAnsi="Times New Roman" w:cs="Times New Roman"/>
+              <w:rFonts w:eastAsia="Times New Roman"/>
             </w:rPr>
             <w:t xml:space="preserve">, </w:t>
           </w:r>
           <w:r>
             <w:rPr>
-              <w:rFonts w:ascii="Times New Roman" w:eastAsia="Times New Roman" w:hAnsi="Times New Roman" w:cs="Times New Roman"/>
+              <w:rFonts w:eastAsia="Times New Roman"/>
               <w:i/>
               <w:iCs/>
             </w:rPr>
@@ -27220,7 +26650,7 @@
           </w:r>
           <w:r>
             <w:rPr>
-              <w:rFonts w:ascii="Times New Roman" w:eastAsia="Times New Roman" w:hAnsi="Times New Roman" w:cs="Times New Roman"/>
+              <w:rFonts w:eastAsia="Times New Roman"/>
             </w:rPr>
             <w:t>(1), 16–25.</w:t>
           </w:r>
@@ -27235,7 +26665,6 @@
             <w:rPr>
               <w:rFonts w:eastAsia="Times New Roman"/>
             </w:rPr>
-            <w:lastRenderedPageBreak/>
             <w:t> </w:t>
           </w:r>
         </w:p>
@@ -34228,6 +33657,7 @@
   <w:style w:type="character" w:default="1" w:styleId="DefaultParagraphFont">
     <w:name w:val="Default Paragraph Font"/>
     <w:uiPriority w:val="1"/>
+    <w:semiHidden/>
     <w:unhideWhenUsed/>
   </w:style>
   <w:style w:type="table" w:default="1" w:styleId="TableNormal">
@@ -34911,10 +34341,13 @@
     <w:rsid w:val="00462B05"/>
     <w:rsid w:val="004B24DA"/>
     <w:rsid w:val="005A7160"/>
+    <w:rsid w:val="005E1BF2"/>
     <w:rsid w:val="006901B0"/>
     <w:rsid w:val="006E1BAB"/>
+    <w:rsid w:val="00751EDB"/>
     <w:rsid w:val="00763159"/>
     <w:rsid w:val="0081424B"/>
+    <w:rsid w:val="008F2E33"/>
     <w:rsid w:val="00966163"/>
     <w:rsid w:val="00A00705"/>
     <w:rsid w:val="00AB1197"/>
@@ -35709,7 +35142,7 @@
     <we:reference id="WA104382081" version="1.55.1.0" store="" storeType="OMEX"/>
   </we:alternateReferences>
   <we:properties>
-    <we:property name="MENDELEY_CITATIONS" value="[{&quot;citationID&quot;:&quot;MENDELEY_CITATION_3a12006e-fbea-40f6-b24c-a6b73827dc3c&quot;,&quot;properties&quot;:{&quot;noteIndex&quot;:0},&quot;isEdited&quot;:false,&quot;manualOverride&quot;:{&quot;isManuallyOverridden&quot;:false,&quot;citeprocText&quot;:&quot;(Rosita &amp;#38; Tannar, 2024)&quot;,&quot;manualOverrideText&quot;:&quot;&quot;},&quot;citationItems&quot;:[{&quot;id&quot;:&quot;74b4a176-a06b-3dcb-9904-952ea10b110c&quot;,&quot;itemData&quot;:{&quot;type&quot;:&quot;article-journal&quot;,&quot;id&quot;:&quot;74b4a176-a06b-3dcb-9904-952ea10b110c&quot;,&quot;title&quot;:&quot;PERAN DATA ANALIS DALAM MENDORONG KEPUTUSAN DAN STRATEGI BISNIS PERUSAHAAN&quot;,&quot;author&quot;:[{&quot;family&quot;:&quot;Rosita&quot;,&quot;given&quot;:&quot;Amanda Aura&quot;,&quot;parse-names&quot;:false,&quot;dropping-particle&quot;:&quot;&quot;,&quot;non-dropping-particle&quot;:&quot;&quot;},{&quot;family&quot;:&quot;Tannar&quot;,&quot;given&quot;:&quot;Oryza&quot;,&quot;parse-names&quot;:false,&quot;dropping-particle&quot;:&quot;&quot;,&quot;non-dropping-particle&quot;:&quot;&quot;}],&quot;container-title&quot;:&quot;Jurnal Ekonomi Revolusioner&quot;,&quot;issued&quot;:{&quot;date-parts&quot;:[[2024]]},&quot;issue&quot;:&quot;7&quot;,&quot;volume&quot;:&quot;7&quot;,&quot;container-title-short&quot;:&quot;&quot;},&quot;isTemporary&quot;:false}],&quot;citationTag&quot;:&quot;MENDELEY_CITATION_v3_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&quot;},{&quot;citationID&quot;:&quot;MENDELEY_CITATION_7d83bb88-96d7-4f02-a289-b3d1de461bdd&quot;,&quot;properties&quot;:{&quot;noteIndex&quot;:0},&quot;isEdited&quot;:false,&quot;manualOverride&quot;:{&quot;isManuallyOverridden&quot;:false,&quot;citeprocText&quot;:&quot;(Widaningsih, 2019)&quot;,&quot;manualOverrideText&quot;:&quot;&quot;},&quot;citationItems&quot;:[{&quot;id&quot;:&quot;624bddcc-faad-354e-a37e-9bcacc2441fb&quot;,&quot;itemData&quot;:{&quot;type&quot;:&quot;article-journal&quot;,&quot;id&quot;:&quot;624bddcc-faad-354e-a37e-9bcacc2441fb&quot;,&quot;title&quot;:&quot;Perbandingan Metode Data Mining Untuk Prediksi Nilai Dan Waktu Kelulusan Mahasiswa Prodi Teknik Informatika Dengan Algoritma C4, 5, Naïve Bayes, Knn Dan Svm&quot;,&quot;author&quot;:[{&quot;family&quot;:&quot;Widaningsih&quot;,&quot;given&quot;:&quot;Sri&quot;,&quot;parse-names&quot;:false,&quot;dropping-particle&quot;:&quot;&quot;,&quot;non-dropping-particle&quot;:&quot;&quot;}],&quot;container-title&quot;:&quot;Jurnal Tekno Insentif&quot;,&quot;ISSN&quot;:&quot;2655-089X&quot;,&quot;issued&quot;:{&quot;date-parts&quot;:[[2019]]},&quot;page&quot;:&quot;16-25&quot;,&quot;issue&quot;:&quot;1&quot;,&quot;volume&quot;:&quot;13&quot;,&quot;container-title-short&quot;:&quot;&quot;},&quot;isTemporary&quot;:false}],&quot;citationTag&quot;:&quot;MENDELEY_CITATION_v3_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&quot;},{&quot;citationID&quot;:&quot;MENDELEY_CITATION_17f89917-cef1-42eb-9d1e-11357d67e251&quot;,&quot;properties&quot;:{&quot;noteIndex&quot;:0},&quot;isEdited&quot;:false,&quot;manualOverride&quot;:{&quot;isManuallyOverridden&quot;:false,&quot;citeprocText&quot;:&quot;(Seda et al., 2020)&quot;,&quot;manualOverrideText&quot;:&quot;&quot;},&quot;citationItems&quot;:[{&quot;id&quot;:&quot;219e0431-c196-3cad-83dd-7ead91a2a396&quot;,&quot;itemData&quot;:{&quot;type&quot;:&quot;article-journal&quot;,&quot;id&quot;:&quot;219e0431-c196-3cad-83dd-7ead91a2a396&quot;,&quot;title&quot;:&quot;Dataset on the cultural dimension of urban society food consumption in Indonesia&quot;,&quot;author&quot;:[{&quot;family&quot;:&quot;Seda&quot;,&quot;given&quot;:&quot;Francisia S S E&quot;,&quot;parse-names&quot;:false,&quot;dropping-particle&quot;:&quot;&quot;,&quot;non-dropping-particle&quot;:&quot;&quot;},{&quot;family&quot;:&quot;Setyawati&quot;,&quot;given&quot;:&quot;Lugina&quot;,&quot;parse-names&quot;:false,&quot;dropping-particle&quot;:&quot;&quot;,&quot;non-dropping-particle&quot;:&quot;&quot;},{&quot;family&quot;:&quot;Tirta&quot;,&quot;given&quot;:&quot;Timoti&quot;,&quot;parse-names&quot;:false,&quot;dropping-particle&quot;:&quot;&quot;,&quot;non-dropping-particle&quot;:&quot;&quot;},{&quot;family&quot;:&quot;Nobel&quot;,&quot;given&quot;:&quot;Kevin&quot;,&quot;parse-names&quot;:false,&quot;dropping-particle&quot;:&quot;&quot;,&quot;non-dropping-particle&quot;:&quot;&quot;}],&quot;container-title&quot;:&quot;Data in Brief&quot;,&quot;container-title-short&quot;:&quot;Data Brief&quot;,&quot;ISSN&quot;:&quot;2352-3409&quot;,&quot;issued&quot;:{&quot;date-parts&quot;:[[2020]]},&quot;page&quot;:&quot;105681&quot;,&quot;publisher&quot;:&quot;Elsevier&quot;,&quot;volume&quot;:&quot;31&quot;},&quot;isTemporary&quot;:false}],&quot;citationTag&quot;:&quot;MENDELEY_CITATION_v3_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&quot;},{&quot;citationID&quot;:&quot;MENDELEY_CITATION_f89be22b-269e-4c31-831b-f953af3883fb&quot;,&quot;properties&quot;:{&quot;noteIndex&quot;:0},&quot;isEdited&quot;:false,&quot;manualOverride&quot;:{&quot;isManuallyOverridden&quot;:false,&quot;citeprocText&quot;:&quot;(Hanifah &amp;#38; Nasution, 2025)&quot;,&quot;manualOverrideText&quot;:&quot;&quot;},&quot;citationItems&quot;:[{&quot;id&quot;:&quot;a93aaf8b-be5f-34bb-aae0-7da4f3b98c22&quot;,&quot;itemData&quot;:{&quot;type&quot;:&quot;article-journal&quot;,&quot;id&quot;:&quot;a93aaf8b-be5f-34bb-aae0-7da4f3b98c22&quot;,&quot;title&quot;:&quot;Manajemen Data Yang Efektif: Solusi Untuk Mencegah dan Mengatasi Duplikasi Data Dalam Perusahaan&quot;,&quot;author&quot;:[{&quot;family&quot;:&quot;Hanifah&quot;,&quot;given&quot;:&quot;Nazwa&quot;,&quot;parse-names&quot;:false,&quot;dropping-particle&quot;:&quot;&quot;,&quot;non-dropping-particle&quot;:&quot;&quot;},{&quot;family&quot;:&quot;Nasution&quot;,&quot;given&quot;:&quot;Muhammad Irwan Padli&quot;,&quot;parse-names&quot;:false,&quot;dropping-particle&quot;:&quot;&quot;,&quot;non-dropping-particle&quot;:&quot;&quot;}],&quot;container-title&quot;:&quot;Epsilon: Journal of Management (EJoM)&quot;,&quot;ISSN&quot;:&quot;3026-653X&quot;,&quot;issued&quot;:{&quot;date-parts&quot;:[[2025]]},&quot;page&quot;:&quot;27-38&quot;,&quot;issue&quot;:&quot;1&quot;,&quot;volume&quot;:&quot;3&quot;,&quot;container-title-short&quot;:&quot;&quot;},&quot;isTemporary&quot;:false}],&quot;citationTag&quot;:&quot;MENDELEY_CITATION_v3_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&quot;},{&quot;citationID&quot;:&quot;MENDELEY_CITATION_41771b54-2cd1-48dc-8259-192f6ab796cb&quot;,&quot;properties&quot;:{&quot;noteIndex&quot;:0},&quot;isEdited&quot;:false,&quot;manualOverride&quot;:{&quot;isManuallyOverridden&quot;:false,&quot;citeprocText&quot;:&quot;(Sudrajat &amp;#38; Cholid, 2023)&quot;,&quot;manualOverrideText&quot;:&quot;&quot;},&quot;citationItems&quot;:[{&quot;id&quot;:&quot;5503319d-adb7-3949-b8f3-2192723250e6&quot;,&quot;itemData&quot;:{&quot;type&quot;:&quot;article-journal&quot;,&quot;id&quot;:&quot;5503319d-adb7-3949-b8f3-2192723250e6&quot;,&quot;title&quot;:&quot;K-Nearest Neighbor (K-Nn) Untuk Penanganan Missing Value Pada Data Umkm&quot;,&quot;author&quot;:[{&quot;family&quot;:&quot;Sudrajat&quot;,&quot;given&quot;:&quot;Wahyu&quot;,&quot;parse-names&quot;:false,&quot;dropping-particle&quot;:&quot;&quot;,&quot;non-dropping-particle&quot;:&quot;&quot;},{&quot;family&quot;:&quot;Cholid&quot;,&quot;given&quot;:&quot;Idahm&quot;,&quot;parse-names&quot;:false,&quot;dropping-particle&quot;:&quot;&quot;,&quot;non-dropping-particle&quot;:&quot;&quot;}],&quot;container-title&quot;:&quot;Jurnal Rekayasa Sistem Informasi Dan Teknologi&quot;,&quot;ISSN&quot;:&quot;3025-888X&quot;,&quot;issued&quot;:{&quot;date-parts&quot;:[[2023]]},&quot;page&quot;:&quot;54-63&quot;,&quot;issue&quot;:&quot;2&quot;,&quot;volume&quot;:&quot;1&quot;,&quot;container-title-short&quot;:&quot;&quot;},&quot;isTemporary&quot;:false}],&quot;citationTag&quot;:&quot;MENDELEY_CITATION_v3_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&quot;},{&quot;citationID&quot;:&quot;MENDELEY_CITATION_a68d755a-3a98-4a4a-93be-865b7b61246c&quot;,&quot;properties&quot;:{&quot;noteIndex&quot;:0},&quot;isEdited&quot;:false,&quot;manualOverride&quot;:{&quot;isManuallyOverridden&quot;:false,&quot;citeprocText&quot;:&quot;(Turyadi &amp;#38; Kusnandar, n.d.)&quot;,&quot;manualOverrideText&quot;:&quot;&quot;},&quot;citationItems&quot;:[{&quot;id&quot;:&quot;2e56aaf9-a5a3-3f81-a5f3-734246019abf&quot;,&quot;itemData&quot;:{&quot;type&quot;:&quot;article-journal&quot;,&quot;id&quot;:&quot;2e56aaf9-a5a3-3f81-a5f3-734246019abf&quot;,&quot;title&quot;:&quot;KAJIAN SIFAT DISTRIBUSI NORMAL BIVARIAT&quot;,&quot;author&quot;:[{&quot;family&quot;:&quot;Turyadi&quot;,&quot;given&quot;:&quot;Muhlasah Novitasari Mara&quot;,&quot;parse-names&quot;:false,&quot;dropping-particle&quot;:&quot;&quot;,&quot;non-dropping-particle&quot;:&quot;&quot;},{&quot;family&quot;:&quot;Kusnandar&quot;,&quot;given&quot;:&quot;Dadan&quot;,&quot;parse-names&quot;:false,&quot;dropping-particle&quot;:&quot;&quot;,&quot;non-dropping-particle&quot;:&quot;&quot;}],&quot;container-title&quot;:&quot;Bimaster: Buletin Ilmiah Matematika, Statistika dan Terapannya&quot;,&quot;ISSN&quot;:&quot;2302-9854&quot;,&quot;issue&quot;:&quot;02&quot;,&quot;volume&quot;:&quot;2&quot;,&quot;container-title-short&quot;:&quot;&quot;},&quot;isTemporary&quot;:false}],&quot;citationTag&quot;:&quot;MENDELEY_CITATION_v3_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&quot;},{&quot;citationID&quot;:&quot;MENDELEY_CITATION_dc4f565e-b259-42f3-abd0-d5e58402ca6a&quot;,&quot;properties&quot;:{&quot;noteIndex&quot;:0},&quot;isEdited&quot;:false,&quot;manualOverride&quot;:{&quot;isManuallyOverridden&quot;:false,&quot;citeprocText&quot;:&quot;(Sulasmono, 2012)&quot;,&quot;manualOverrideText&quot;:&quot;&quot;},&quot;citationItems&quot;:[{&quot;id&quot;:&quot;8e698846-4f7b-35f4-aa77-9c90920f795f&quot;,&quot;itemData&quot;:{&quot;type&quot;:&quot;article-journal&quot;,&quot;id&quot;:&quot;8e698846-4f7b-35f4-aa77-9c90920f795f&quot;,&quot;title&quot;:&quot;Problem solving: Signifikansi, pengertian, dan ragamnya&quot;,&quot;author&quot;:[{&quot;family&quot;:&quot;Sulasmono&quot;,&quot;given&quot;:&quot;Bambang Suteng&quot;,&quot;parse-names&quot;:false,&quot;dropping-particle&quot;:&quot;&quot;,&quot;non-dropping-particle&quot;:&quot;&quot;}],&quot;container-title&quot;:&quot;Satya Widya&quot;,&quot;ISSN&quot;:&quot;2549-967X&quot;,&quot;issued&quot;:{&quot;date-parts&quot;:[[2012]]},&quot;page&quot;:&quot;155-166&quot;,&quot;issue&quot;:&quot;2&quot;,&quot;volume&quot;:&quot;28&quot;,&quot;container-title-short&quot;:&quot;&quot;},&quot;isTemporary&quot;:false}],&quot;citationTag&quot;:&quot;MENDELEY_CITATION_v3_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&quot;},{&quot;citationID&quot;:&quot;MENDELEY_CITATION_0bb2aa4c-3392-4aff-8273-f70e9cc73e68&quot;,&quot;properties&quot;:{&quot;noteIndex&quot;:0},&quot;isEdited&quot;:false,&quot;manualOverride&quot;:{&quot;isManuallyOverridden&quot;:false,&quot;citeprocText&quot;:&quot;(Ramanisa et al., 2020)&quot;,&quot;manualOverrideText&quot;:&quot;&quot;},&quot;citationItems&quot;:[{&quot;id&quot;:&quot;1b97f332-ea00-3a32-b851-ac744ffe09c6&quot;,&quot;itemData&quot;:{&quot;type&quot;:&quot;article-journal&quot;,&quot;id&quot;:&quot;1b97f332-ea00-3a32-b851-ac744ffe09c6&quot;,&quot;title&quot;:&quot;Analisis Kemampuan Representasi Matematis Siswa&quot;,&quot;author&quot;:[{&quot;family&quot;:&quot;Ramanisa&quot;,&quot;given&quot;:&quot;Hartiwi&quot;,&quot;parse-names&quot;:false,&quot;dropping-particle&quot;:&quot;&quot;,&quot;non-dropping-particle&quot;:&quot;&quot;},{&quot;family&quot;:&quot;Khairudin&quot;,&quot;given&quot;:&quot;Khairudin&quot;,&quot;parse-names&quot;:false,&quot;dropping-particle&quot;:&quot;&quot;,&quot;non-dropping-particle&quot;:&quot;&quot;},{&quot;family&quot;:&quot;Netti&quot;,&quot;given&quot;:&quot;Syukma&quot;,&quot;parse-names&quot;:false,&quot;dropping-particle&quot;:&quot;&quot;,&quot;non-dropping-particle&quot;:&quot;&quot;}],&quot;container-title&quot;:&quot;Jurnal Magister Pendidikan Matematika (JUMADIKA)&quot;,&quot;ISSN&quot;:&quot;2684-8848&quot;,&quot;issued&quot;:{&quot;date-parts&quot;:[[2020]]},&quot;page&quot;:&quot;34-38&quot;,&quot;issue&quot;:&quot;1&quot;,&quot;volume&quot;:&quot;2&quot;,&quot;container-title-short&quot;:&quot;&quot;},&quot;isTemporary&quot;:false}],&quot;citationTag&quot;:&quot;MENDELEY_CITATION_v3_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&quot;},{&quot;citationID&quot;:&quot;MENDELEY_CITATION_b766a1da-7ff7-4b3b-9de1-5325f90eb8b2&quot;,&quot;properties&quot;:{&quot;noteIndex&quot;:0},&quot;isEdited&quot;:false,&quot;manualOverride&quot;:{&quot;isManuallyOverridden&quot;:false,&quot;citeprocText&quot;:&quot;(Matondang et al., 2020)&quot;,&quot;manualOverrideText&quot;:&quot;&quot;},&quot;citationTag&quot;:&quot;MENDELEY_CITATION_v3_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&quot;,&quot;citationItems&quot;:[{&quot;id&quot;:&quot;abac9297-d8b0-3b76-a078-f6adb92f755b&quot;,&quot;itemData&quot;:{&quot;type&quot;:&quot;paper-conference&quot;,&quot;id&quot;:&quot;abac9297-d8b0-3b76-a078-f6adb92f755b&quot;,&quot;title&quot;:&quot;Penerapan Metode Brainstorming Dalam Perancangan Produk Pochade&quot;,&quot;author&quot;:[{&quot;family&quot;:&quot;Matondang&quot;,&quot;given&quot;:&quot;Muharram&quot;,&quot;parse-names&quot;:false,&quot;dropping-particle&quot;:&quot;&quot;,&quot;non-dropping-particle&quot;:&quot;&quot;},{&quot;family&quot;:&quot;Sary&quot;,&quot;given&quot;:&quot;Nadilah&quot;,&quot;parse-names&quot;:false,&quot;dropping-particle&quot;:&quot;&quot;,&quot;non-dropping-particle&quot;:&quot;&quot;},{&quot;family&quot;:&quot;Gultom&quot;,&quot;given&quot;:&quot;Theo Benneditson&quot;,&quot;parse-names&quot;:false,&quot;dropping-particle&quot;:&quot;&quot;,&quot;non-dropping-particle&quot;:&quot;&quot;},{&quot;family&quot;:&quot;Sebayang&quot;,&quot;given&quot;:&quot;Yesticka&quot;,&quot;parse-names&quot;:false,&quot;dropping-particle&quot;:&quot;&quot;,&quot;non-dropping-particle&quot;:&quot;&quot;}],&quot;container-title&quot;:&quot;Talenta Conference Series: Energy and Engineering (EE)&quot;,&quot;ISBN&quot;:&quot;2654-704X&quot;,&quot;issued&quot;:{&quot;date-parts&quot;:[[2020]]},&quot;issue&quot;:&quot;2&quot;,&quot;volume&quot;:&quot;3&quot;,&quot;container-title-short&quot;:&quot;&quot;},&quot;isTemporary&quot;:false}]},{&quot;citationID&quot;:&quot;MENDELEY_CITATION_517e0629-801d-4b12-a8f8-ee2fe9f46ac4&quot;,&quot;properties&quot;:{&quot;noteIndex&quot;:0},&quot;isEdited&quot;:false,&quot;manualOverride&quot;:{&quot;isManuallyOverridden&quot;:false,&quot;citeprocText&quot;:&quot;(Mulyani &amp;#38; Kartini, 2023)&quot;,&quot;manualOverrideText&quot;:&quot;&quot;},&quot;citationTag&quot;:&quot;MENDELEY_CITATION_v3_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&quot;,&quot;citationItems&quot;:[{&quot;id&quot;:&quot;0cb1f664-1d35-3d25-a481-d642dbf50f2d&quot;,&quot;itemData&quot;:{&quot;type&quot;:&quot;article-journal&quot;,&quot;id&quot;:&quot;0cb1f664-1d35-3d25-a481-d642dbf50f2d&quot;,&quot;title&quot;:&quot;Visualisasi Data Ticketing Servicedesk Dengan Dashboard Pada PT Brantas Abipraya (Persero)&quot;,&quot;author&quot;:[{&quot;family&quot;:&quot;Mulyani&quot;,&quot;given&quot;:&quot;Astriana&quot;,&quot;parse-names&quot;:false,&quot;dropping-particle&quot;:&quot;&quot;,&quot;non-dropping-particle&quot;:&quot;&quot;},{&quot;family&quot;:&quot;Kartini&quot;,&quot;given&quot;:&quot;Kartini&quot;,&quot;parse-names&quot;:false,&quot;dropping-particle&quot;:&quot;&quot;,&quot;non-dropping-particle&quot;:&quot;&quot;}],&quot;container-title&quot;:&quot;Journal of Information System, Applied, Management, Accounting and Research&quot;,&quot;ISSN&quot;:&quot;2598-8719&quot;,&quot;issued&quot;:{&quot;date-parts&quot;:[[2023]]},&quot;page&quot;:&quot;289-300&quot;,&quot;issue&quot;:&quot;2&quot;,&quot;volume&quot;:&quot;7&quot;,&quot;container-title-short&quot;:&quot;&quot;},&quot;isTemporary&quot;:false}]},{&quot;citationID&quot;:&quot;MENDELEY_CITATION_b7c5119d-813d-44e2-977d-b57712b9b0e2&quot;,&quot;properties&quot;:{&quot;noteIndex&quot;:0},&quot;isEdited&quot;:false,&quot;manualOverride&quot;:{&quot;isManuallyOverridden&quot;:false,&quot;citeprocText&quot;:&quot;(Hismawan &amp;#38; Izaak, 2023)&quot;,&quot;manualOverrideText&quot;:&quot;&quot;},&quot;citationTag&quot;:&quot;MENDELEY_CITATION_v3_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&quot;,&quot;citationItems&quot;:[{&quot;id&quot;:&quot;11846df6-0008-38cd-b3d5-57f64a205852&quot;,&quot;itemData&quot;:{&quot;type&quot;:&quot;article-journal&quot;,&quot;id&quot;:&quot;11846df6-0008-38cd-b3d5-57f64a205852&quot;,&quot;title&quot;:&quot;Optimalisasi website menggunakan landing page sebagai media pemasaran produk parfum fresh fusion di era digital&quot;,&quot;author&quot;:[{&quot;family&quot;:&quot;Hismawan&quot;,&quot;given&quot;:&quot;Fiska Rahma&quot;,&quot;parse-names&quot;:false,&quot;dropping-particle&quot;:&quot;&quot;,&quot;non-dropping-particle&quot;:&quot;&quot;},{&quot;family&quot;:&quot;Izaak&quot;,&quot;given&quot;:&quot;Wilma Cordelia&quot;,&quot;parse-names&quot;:false,&quot;dropping-particle&quot;:&quot;&quot;,&quot;non-dropping-particle&quot;:&quot;&quot;}],&quot;container-title&quot;:&quot;KARYA: Jurnal Pengabdian Kepada Masyarakat&quot;,&quot;ISSN&quot;:&quot;2798-1827&quot;,&quot;issued&quot;:{&quot;date-parts&quot;:[[2023]]},&quot;page&quot;:&quot;364-368&quot;,&quot;issue&quot;:&quot;3&quot;,&quot;volume&quot;:&quot;3&quot;,&quot;container-title-short&quot;:&quot;&quot;},&quot;isTemporary&quot;:false}]}]"/>
+    <we:property name="MENDELEY_CITATIONS" value="[{&quot;citationID&quot;:&quot;MENDELEY_CITATION_283b94aa-947d-4178-a91e-1af80697c9d4&quot;,&quot;properties&quot;:{&quot;noteIndex&quot;:0},&quot;isEdited&quot;:false,&quot;manualOverride&quot;:{&quot;isManuallyOverridden&quot;:true,&quot;citeprocText&quot;:&quot;(Anhari et al., 2025)&quot;,&quot;manualOverrideText&quot;:&quot;Anhari et al., 2025&quot;},&quot;citationTag&quot;:&quot;MENDELEY_CITATION_v3_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&quot;,&quot;citationItems&quot;:[{&quot;id&quot;:&quot;b5c574a7-ea07-381f-95b9-20ca2f9f3321&quot;,&quot;itemData&quot;:{&quot;type&quot;:&quot;report&quot;,&quot;id&quot;:&quot;b5c574a7-ea07-381f-95b9-20ca2f9f3321&quot;,&quot;title&quot;:&quot;Business Intelligence Visualisasi Data Penerimaan Mahasiswa Baru Menggunakan Tableau di Universitas ABC&quot;,&quot;author&quot;:[{&quot;family&quot;:&quot;Anhari&quot;,&quot;given&quot;:&quot;Tirta&quot;,&quot;parse-names&quot;:false,&quot;dropping-particle&quot;:&quot;&quot;,&quot;non-dropping-particle&quot;:&quot;&quot;},{&quot;family&quot;:&quot;Alim&quot;,&quot;given&quot;:&quot;Endy Sjaiful&quot;,&quot;parse-names&quot;:false,&quot;dropping-particle&quot;:&quot;&quot;,&quot;non-dropping-particle&quot;:&quot;&quot;},{&quot;family&quot;:&quot;Rizkiawan&quot;,&quot;given&quot;:&quot;M Asep&quot;,&quot;parse-names&quot;:false,&quot;dropping-particle&quot;:&quot;&quot;,&quot;non-dropping-particle&quot;:&quot;&quot;},{&quot;family&quot;:&quot;Hasan&quot;,&quot;given&quot;:&quot;Firman Noor&quot;,&quot;parse-names&quot;:false,&quot;dropping-particle&quot;:&quot;&quot;,&quot;non-dropping-particle&quot;:&quot;&quot;}],&quot;issued&quot;:{&quot;date-parts&quot;:[[2025]]},&quot;number-of-pages&quot;:&quot;281-291&quot;,&quot;abstract&quot;:&quot;This study aims to analyze the application of Business Intelligence (BI) using Tableau in the new student admission process at ABC University. Tableau is used to visualize admission data for the period 2021 to 2023, including the number of applicants, geographic distribution, and course preferences. The research methodology involves data collection, cleaning, and integration which is then visualized in an interactive dashboard. The results showed a decrease in the number of applicants during the study period, with the lowest applicants in 2024. Geographic distribution analysis shows that DKI Jakarta and West Java provinces still dominate, indicating the need for expansion in conducting promotions and also data-based marketing strategies. In addition, the shift in the interest of applicants from Communication Science study programs to Pharmacist and Management Professions is an important finding, indicating a changing trend in prospective students' preferences for the fields of Communication Science and Business. This study concludes that the implementation of BI using Tableau provides significant benefits in improving the efficiency of decision-making, expanding the range of admissions, and strengthening the competitiveness of ABC University amid changing educational trends. The findings contribute to the literature related to BI implementation in the education sector and recommend further development to optimize university management in the future.&quot;,&quot;issue&quot;:&quot;1&quot;,&quot;volume&quot;:&quot;6&quot;,&quot;container-title-short&quot;:&quot;&quot;},&quot;isTemporary&quot;:false}]},{&quot;citationID&quot;:&quot;MENDELEY_CITATION_b7a18ff0-9375-446e-ac11-b1f5dce9952a&quot;,&quot;properties&quot;:{&quot;noteIndex&quot;:0},&quot;isEdited&quot;:false,&quot;manualOverride&quot;:{&quot;isManuallyOverridden&quot;:true,&quot;citeprocText&quot;:&quot;(MZ et al., 2022)&quot;,&quot;manualOverrideText&quot;:&quot;MZ et al., 2022&quot;},&quot;citationTag&quot;:&quot;MENDELEY_CITATION_v3_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&quot;,&quot;citationItems&quot;:[{&quot;id&quot;:&quot;f1c5e994-53d7-3361-ad3a-23a9d45e6f3b&quot;,&quot;itemData&quot;:{&quot;type&quot;:&quot;article-journal&quot;,&quot;id&quot;:&quot;f1c5e994-53d7-3361-ad3a-23a9d45e6f3b&quot;,&quot;title&quot;:&quot;Aplikasi Dashboard Visualisasi Data Calon Mahasiswa Baru mengunakan Metabase&quot;,&quot;author&quot;:[{&quot;family&quot;:&quot;MZ&quot;,&quot;given&quot;:&quot;Yumarlin&quot;,&quot;parse-names&quot;:false,&quot;dropping-particle&quot;:&quot;&quot;,&quot;non-dropping-particle&quot;:&quot;&quot;},{&quot;family&quot;:&quot;Bororing&quot;,&quot;given&quot;:&quot;Jemmy Edwin&quot;,&quot;parse-names&quot;:false,&quot;dropping-particle&quot;:&quot;&quot;,&quot;non-dropping-particle&quot;:&quot;&quot;},{&quot;family&quot;:&quot;Rahayu&quot;,&quot;given&quot;:&quot;Sri&quot;,&quot;parse-names&quot;:false,&quot;dropping-particle&quot;:&quot;&quot;,&quot;non-dropping-particle&quot;:&quot;&quot;},{&quot;family&quot;:&quot;Ramadhani&quot;,&quot;given&quot;:&quot;Tan Anugrah&quot;,&quot;parse-names&quot;:false,&quot;dropping-particle&quot;:&quot;&quot;,&quot;non-dropping-particle&quot;:&quot;&quot;}],&quot;container-title&quot;:&quot;Edumatic: Jurnal Pendidikan Informatika&quot;,&quot;DOI&quot;:&quot;10.29408/edumatic.v6i1.5483&quot;,&quot;issued&quot;:{&quot;date-parts&quot;:[[2022,6,19]]},&quot;page&quot;:&quot;116-125&quot;,&quot;abstract&quot;:&quot;New student data Information systems can be used as a supporting tool to support decisions. Janabadra University is one of the universities in Yogyakarta, the information system for recording transactional data for students is still done simply in the form of text and numbers. The purpose of this research is to design and build a dashboard application for data visualization of prospective students at Janabadra University for new student admissions (PMB). The method used is a business intelligence roadmap with six stages, the stages are (1) justification, (2) planning, (3) business case, (4) design, (5) construction, and (6) deployment which is a reference in the design and construction of a data warehouse using Metabase. The results of this study can build 7 (seven) visualization dashboards are  (1) Dashboard of information students grouped based on the total number of PMB registrants, (2) Dashboard of the number of registrants based on the academic year, (3) Dashboard of income from PMB registration based on the payment date, (4) Dashboard of the number of students based on the academic year of each study program, (5) Dashboard of the number of registrants by class, (6) Dashboard of the number of PMB registrants by semester and (7) Dashboard of the number of PMB registrants by study program and class.&quot;,&quot;publisher&quot;:&quot;Universitas Hamzanwadi&quot;,&quot;issue&quot;:&quot;1&quot;,&quot;volume&quot;:&quot;6&quot;,&quot;container-title-short&quot;:&quot;&quot;},&quot;isTemporary&quot;:false}]},{&quot;citationID&quot;:&quot;MENDELEY_CITATION_3a12006e-fbea-40f6-b24c-a6b73827dc3c&quot;,&quot;properties&quot;:{&quot;noteIndex&quot;:0},&quot;isEdited&quot;:false,&quot;manualOverride&quot;:{&quot;isManuallyOverridden&quot;:false,&quot;citeprocText&quot;:&quot;(Rosita &amp;#38; Tannar, 2024)&quot;,&quot;manualOverrideText&quot;:&quot;&quot;},&quot;citationTag&quot;:&quot;MENDELEY_CITATION_v3_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&quot;,&quot;citationItems&quot;:[{&quot;id&quot;:&quot;74b4a176-a06b-3dcb-9904-952ea10b110c&quot;,&quot;itemData&quot;:{&quot;type&quot;:&quot;article-journal&quot;,&quot;id&quot;:&quot;74b4a176-a06b-3dcb-9904-952ea10b110c&quot;,&quot;title&quot;:&quot;PERAN DATA ANALIS DALAM MENDORONG KEPUTUSAN DAN STRATEGI BISNIS PERUSAHAAN&quot;,&quot;author&quot;:[{&quot;family&quot;:&quot;Rosita&quot;,&quot;given&quot;:&quot;Amanda Aura&quot;,&quot;parse-names&quot;:false,&quot;dropping-particle&quot;:&quot;&quot;,&quot;non-dropping-particle&quot;:&quot;&quot;},{&quot;family&quot;:&quot;Tannar&quot;,&quot;given&quot;:&quot;Oryza&quot;,&quot;parse-names&quot;:false,&quot;dropping-particle&quot;:&quot;&quot;,&quot;non-dropping-particle&quot;:&quot;&quot;}],&quot;container-title&quot;:&quot;Jurnal Ekonomi Revolusioner&quot;,&quot;issued&quot;:{&quot;date-parts&quot;:[[2024]]},&quot;issue&quot;:&quot;7&quot;,&quot;volume&quot;:&quot;7&quot;,&quot;container-title-short&quot;:&quot;&quot;},&quot;isTemporary&quot;:false}]},{&quot;citationID&quot;:&quot;MENDELEY_CITATION_7d83bb88-96d7-4f02-a289-b3d1de461bdd&quot;,&quot;properties&quot;:{&quot;noteIndex&quot;:0},&quot;isEdited&quot;:false,&quot;manualOverride&quot;:{&quot;isManuallyOverridden&quot;:false,&quot;citeprocText&quot;:&quot;(Widaningsih, 2019)&quot;,&quot;manualOverrideText&quot;:&quot;&quot;},&quot;citationTag&quot;:&quot;MENDELEY_CITATION_v3_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&quot;,&quot;citationItems&quot;:[{&quot;id&quot;:&quot;624bddcc-faad-354e-a37e-9bcacc2441fb&quot;,&quot;itemData&quot;:{&quot;type&quot;:&quot;article-journal&quot;,&quot;id&quot;:&quot;624bddcc-faad-354e-a37e-9bcacc2441fb&quot;,&quot;title&quot;:&quot;Perbandingan Metode Data Mining Untuk Prediksi Nilai Dan Waktu Kelulusan Mahasiswa Prodi Teknik Informatika Dengan Algoritma C4, 5, Naïve Bayes, Knn Dan Svm&quot;,&quot;author&quot;:[{&quot;family&quot;:&quot;Widaningsih&quot;,&quot;given&quot;:&quot;Sri&quot;,&quot;parse-names&quot;:false,&quot;dropping-particle&quot;:&quot;&quot;,&quot;non-dropping-particle&quot;:&quot;&quot;}],&quot;container-title&quot;:&quot;Jurnal Tekno Insentif&quot;,&quot;ISSN&quot;:&quot;2655-089X&quot;,&quot;issued&quot;:{&quot;date-parts&quot;:[[2019]]},&quot;page&quot;:&quot;16-25&quot;,&quot;issue&quot;:&quot;1&quot;,&quot;volume&quot;:&quot;13&quot;,&quot;container-title-short&quot;:&quot;&quot;},&quot;isTemporary&quot;:false}]},{&quot;citationID&quot;:&quot;MENDELEY_CITATION_17f89917-cef1-42eb-9d1e-11357d67e251&quot;,&quot;properties&quot;:{&quot;noteIndex&quot;:0},&quot;isEdited&quot;:false,&quot;manualOverride&quot;:{&quot;isManuallyOverridden&quot;:false,&quot;citeprocText&quot;:&quot;(Seda et al., 2020)&quot;,&quot;manualOverrideText&quot;:&quot;&quot;},&quot;citationTag&quot;:&quot;MENDELEY_CITATION_v3_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&quot;,&quot;citationItems&quot;:[{&quot;id&quot;:&quot;219e0431-c196-3cad-83dd-7ead91a2a396&quot;,&quot;itemData&quot;:{&quot;type&quot;:&quot;article-journal&quot;,&quot;id&quot;:&quot;219e0431-c196-3cad-83dd-7ead91a2a396&quot;,&quot;title&quot;:&quot;Dataset on the cultural dimension of urban society food consumption in Indonesia&quot;,&quot;author&quot;:[{&quot;family&quot;:&quot;Seda&quot;,&quot;given&quot;:&quot;Francisia S S E&quot;,&quot;parse-names&quot;:false,&quot;dropping-particle&quot;:&quot;&quot;,&quot;non-dropping-particle&quot;:&quot;&quot;},{&quot;family&quot;:&quot;Setyawati&quot;,&quot;given&quot;:&quot;Lugina&quot;,&quot;parse-names&quot;:false,&quot;dropping-particle&quot;:&quot;&quot;,&quot;non-dropping-particle&quot;:&quot;&quot;},{&quot;family&quot;:&quot;Tirta&quot;,&quot;given&quot;:&quot;Timoti&quot;,&quot;parse-names&quot;:false,&quot;dropping-particle&quot;:&quot;&quot;,&quot;non-dropping-particle&quot;:&quot;&quot;},{&quot;family&quot;:&quot;Nobel&quot;,&quot;given&quot;:&quot;Kevin&quot;,&quot;parse-names&quot;:false,&quot;dropping-particle&quot;:&quot;&quot;,&quot;non-dropping-particle&quot;:&quot;&quot;}],&quot;container-title&quot;:&quot;Data in Brief&quot;,&quot;container-title-short&quot;:&quot;Data Brief&quot;,&quot;ISSN&quot;:&quot;2352-3409&quot;,&quot;issued&quot;:{&quot;date-parts&quot;:[[2020]]},&quot;page&quot;:&quot;105681&quot;,&quot;publisher&quot;:&quot;Elsevier&quot;,&quot;volume&quot;:&quot;31&quot;},&quot;isTemporary&quot;:false}]},{&quot;citationID&quot;:&quot;MENDELEY_CITATION_f89be22b-269e-4c31-831b-f953af3883fb&quot;,&quot;properties&quot;:{&quot;noteIndex&quot;:0},&quot;isEdited&quot;:false,&quot;manualOverride&quot;:{&quot;isManuallyOverridden&quot;:false,&quot;citeprocText&quot;:&quot;(Hanifah &amp;#38; Nasution, 2025)&quot;,&quot;manualOverrideText&quot;:&quot;&quot;},&quot;citationTag&quot;:&quot;MENDELEY_CITATION_v3_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&quot;,&quot;citationItems&quot;:[{&quot;id&quot;:&quot;a93aaf8b-be5f-34bb-aae0-7da4f3b98c22&quot;,&quot;itemData&quot;:{&quot;type&quot;:&quot;article-journal&quot;,&quot;id&quot;:&quot;a93aaf8b-be5f-34bb-aae0-7da4f3b98c22&quot;,&quot;title&quot;:&quot;Manajemen Data Yang Efektif: Solusi Untuk Mencegah dan Mengatasi Duplikasi Data Dalam Perusahaan&quot;,&quot;author&quot;:[{&quot;family&quot;:&quot;Hanifah&quot;,&quot;given&quot;:&quot;Nazwa&quot;,&quot;parse-names&quot;:false,&quot;dropping-particle&quot;:&quot;&quot;,&quot;non-dropping-particle&quot;:&quot;&quot;},{&quot;family&quot;:&quot;Nasution&quot;,&quot;given&quot;:&quot;Muhammad Irwan Padli&quot;,&quot;parse-names&quot;:false,&quot;dropping-particle&quot;:&quot;&quot;,&quot;non-dropping-particle&quot;:&quot;&quot;}],&quot;container-title&quot;:&quot;Epsilon: Journal of Management (EJoM)&quot;,&quot;ISSN&quot;:&quot;3026-653X&quot;,&quot;issued&quot;:{&quot;date-parts&quot;:[[2025]]},&quot;page&quot;:&quot;27-38&quot;,&quot;issue&quot;:&quot;1&quot;,&quot;volume&quot;:&quot;3&quot;,&quot;container-title-short&quot;:&quot;&quot;},&quot;isTemporary&quot;:false}]},{&quot;citationID&quot;:&quot;MENDELEY_CITATION_41771b54-2cd1-48dc-8259-192f6ab796cb&quot;,&quot;properties&quot;:{&quot;noteIndex&quot;:0},&quot;isEdited&quot;:false,&quot;manualOverride&quot;:{&quot;isManuallyOverridden&quot;:false,&quot;citeprocText&quot;:&quot;(Sudrajat &amp;#38; Cholid, 2023)&quot;,&quot;manualOverrideText&quot;:&quot;&quot;},&quot;citationTag&quot;:&quot;MENDELEY_CITATION_v3_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&quot;,&quot;citationItems&quot;:[{&quot;id&quot;:&quot;5503319d-adb7-3949-b8f3-2192723250e6&quot;,&quot;itemData&quot;:{&quot;type&quot;:&quot;article-journal&quot;,&quot;id&quot;:&quot;5503319d-adb7-3949-b8f3-2192723250e6&quot;,&quot;title&quot;:&quot;K-Nearest Neighbor (K-Nn) Untuk Penanganan Missing Value Pada Data Umkm&quot;,&quot;author&quot;:[{&quot;family&quot;:&quot;Sudrajat&quot;,&quot;given&quot;:&quot;Wahyu&quot;,&quot;parse-names&quot;:false,&quot;dropping-particle&quot;:&quot;&quot;,&quot;non-dropping-particle&quot;:&quot;&quot;},{&quot;family&quot;:&quot;Cholid&quot;,&quot;given&quot;:&quot;Idahm&quot;,&quot;parse-names&quot;:false,&quot;dropping-particle&quot;:&quot;&quot;,&quot;non-dropping-particle&quot;:&quot;&quot;}],&quot;container-title&quot;:&quot;Jurnal Rekayasa Sistem Informasi Dan Teknologi&quot;,&quot;ISSN&quot;:&quot;3025-888X&quot;,&quot;issued&quot;:{&quot;date-parts&quot;:[[2023]]},&quot;page&quot;:&quot;54-63&quot;,&quot;issue&quot;:&quot;2&quot;,&quot;volume&quot;:&quot;1&quot;,&quot;container-title-short&quot;:&quot;&quot;},&quot;isTemporary&quot;:false}]},{&quot;citationID&quot;:&quot;MENDELEY_CITATION_a68d755a-3a98-4a4a-93be-865b7b61246c&quot;,&quot;properties&quot;:{&quot;noteIndex&quot;:0},&quot;isEdited&quot;:false,&quot;manualOverride&quot;:{&quot;isManuallyOverridden&quot;:false,&quot;citeprocText&quot;:&quot;(Turyadi &amp;#38; Kusnandar, n.d.)&quot;,&quot;manualOverrideText&quot;:&quot;&quot;},&quot;citationTag&quot;:&quot;MENDELEY_CITATION_v3_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&quot;,&quot;citationItems&quot;:[{&quot;id&quot;:&quot;2e56aaf9-a5a3-3f81-a5f3-734246019abf&quot;,&quot;itemData&quot;:{&quot;type&quot;:&quot;article-journal&quot;,&quot;id&quot;:&quot;2e56aaf9-a5a3-3f81-a5f3-734246019abf&quot;,&quot;title&quot;:&quot;KAJIAN SIFAT DISTRIBUSI NORMAL BIVARIAT&quot;,&quot;author&quot;:[{&quot;family&quot;:&quot;Turyadi&quot;,&quot;given&quot;:&quot;Muhlasah Novitasari Mara&quot;,&quot;parse-names&quot;:false,&quot;dropping-particle&quot;:&quot;&quot;,&quot;non-dropping-particle&quot;:&quot;&quot;},{&quot;family&quot;:&quot;Kusnandar&quot;,&quot;given&quot;:&quot;Dadan&quot;,&quot;parse-names&quot;:false,&quot;dropping-particle&quot;:&quot;&quot;,&quot;non-dropping-particle&quot;:&quot;&quot;}],&quot;container-title&quot;:&quot;Bimaster: Buletin Ilmiah Matematika, Statistika dan Terapannya&quot;,&quot;ISSN&quot;:&quot;2302-9854&quot;,&quot;issue&quot;:&quot;02&quot;,&quot;volume&quot;:&quot;2&quot;,&quot;container-title-short&quot;:&quot;&quot;},&quot;isTemporary&quot;:false}]},{&quot;citationID&quot;:&quot;MENDELEY_CITATION_dc4f565e-b259-42f3-abd0-d5e58402ca6a&quot;,&quot;properties&quot;:{&quot;noteIndex&quot;:0},&quot;isEdited&quot;:false,&quot;manualOverride&quot;:{&quot;isManuallyOverridden&quot;:false,&quot;citeprocText&quot;:&quot;(Sulasmono, 2012)&quot;,&quot;manualOverrideText&quot;:&quot;&quot;},&quot;citationTag&quot;:&quot;MENDELEY_CITATION_v3_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&quot;,&quot;citationItems&quot;:[{&quot;id&quot;:&quot;8e698846-4f7b-35f4-aa77-9c90920f795f&quot;,&quot;itemData&quot;:{&quot;type&quot;:&quot;article-journal&quot;,&quot;id&quot;:&quot;8e698846-4f7b-35f4-aa77-9c90920f795f&quot;,&quot;title&quot;:&quot;Problem solving: Signifikansi, pengertian, dan ragamnya&quot;,&quot;author&quot;:[{&quot;family&quot;:&quot;Sulasmono&quot;,&quot;given&quot;:&quot;Bambang Suteng&quot;,&quot;parse-names&quot;:false,&quot;dropping-particle&quot;:&quot;&quot;,&quot;non-dropping-particle&quot;:&quot;&quot;}],&quot;container-title&quot;:&quot;Satya Widya&quot;,&quot;ISSN&quot;:&quot;2549-967X&quot;,&quot;issued&quot;:{&quot;date-parts&quot;:[[2012]]},&quot;page&quot;:&quot;155-166&quot;,&quot;issue&quot;:&quot;2&quot;,&quot;volume&quot;:&quot;28&quot;,&quot;container-title-short&quot;:&quot;&quot;},&quot;isTemporary&quot;:false}]},{&quot;citationID&quot;:&quot;MENDELEY_CITATION_0bb2aa4c-3392-4aff-8273-f70e9cc73e68&quot;,&quot;properties&quot;:{&quot;noteIndex&quot;:0},&quot;isEdited&quot;:false,&quot;manualOverride&quot;:{&quot;isManuallyOverridden&quot;:false,&quot;citeprocText&quot;:&quot;(Ramanisa et al., 2020)&quot;,&quot;manualOverrideText&quot;:&quot;&quot;},&quot;citationTag&quot;:&quot;MENDELEY_CITATION_v3_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&quot;,&quot;citationItems&quot;:[{&quot;id&quot;:&quot;1b97f332-ea00-3a32-b851-ac744ffe09c6&quot;,&quot;itemData&quot;:{&quot;type&quot;:&quot;article-journal&quot;,&quot;id&quot;:&quot;1b97f332-ea00-3a32-b851-ac744ffe09c6&quot;,&quot;title&quot;:&quot;Analisis Kemampuan Representasi Matematis Siswa&quot;,&quot;author&quot;:[{&quot;family&quot;:&quot;Ramanisa&quot;,&quot;given&quot;:&quot;Hartiwi&quot;,&quot;parse-names&quot;:false,&quot;dropping-particle&quot;:&quot;&quot;,&quot;non-dropping-particle&quot;:&quot;&quot;},{&quot;family&quot;:&quot;Khairudin&quot;,&quot;given&quot;:&quot;Khairudin&quot;,&quot;parse-names&quot;:false,&quot;dropping-particle&quot;:&quot;&quot;,&quot;non-dropping-particle&quot;:&quot;&quot;},{&quot;family&quot;:&quot;Netti&quot;,&quot;given&quot;:&quot;Syukma&quot;,&quot;parse-names&quot;:false,&quot;dropping-particle&quot;:&quot;&quot;,&quot;non-dropping-particle&quot;:&quot;&quot;}],&quot;container-title&quot;:&quot;Jurnal Magister Pendidikan Matematika (JUMADIKA)&quot;,&quot;ISSN&quot;:&quot;2684-8848&quot;,&quot;issued&quot;:{&quot;date-parts&quot;:[[2020]]},&quot;page&quot;:&quot;34-38&quot;,&quot;issue&quot;:&quot;1&quot;,&quot;volume&quot;:&quot;2&quot;,&quot;container-title-short&quot;:&quot;&quot;},&quot;isTemporary&quot;:false}]},{&quot;citationID&quot;:&quot;MENDELEY_CITATION_b766a1da-7ff7-4b3b-9de1-5325f90eb8b2&quot;,&quot;properties&quot;:{&quot;noteIndex&quot;:0},&quot;isEdited&quot;:false,&quot;manualOverride&quot;:{&quot;isManuallyOverridden&quot;:false,&quot;citeprocText&quot;:&quot;(Matondang et al., 2020)&quot;,&quot;manualOverrideText&quot;:&quot;&quot;},&quot;citationTag&quot;:&quot;MENDELEY_CITATION_v3_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&quot;,&quot;citationItems&quot;:[{&quot;id&quot;:&quot;abac9297-d8b0-3b76-a078-f6adb92f755b&quot;,&quot;itemData&quot;:{&quot;type&quot;:&quot;paper-conference&quot;,&quot;id&quot;:&quot;abac9297-d8b0-3b76-a078-f6adb92f755b&quot;,&quot;title&quot;:&quot;Penerapan Metode Brainstorming Dalam Perancangan Produk Pochade&quot;,&quot;author&quot;:[{&quot;family&quot;:&quot;Matondang&quot;,&quot;given&quot;:&quot;Muharram&quot;,&quot;parse-names&quot;:false,&quot;dropping-particle&quot;:&quot;&quot;,&quot;non-dropping-particle&quot;:&quot;&quot;},{&quot;family&quot;:&quot;Sary&quot;,&quot;given&quot;:&quot;Nadilah&quot;,&quot;parse-names&quot;:false,&quot;dropping-particle&quot;:&quot;&quot;,&quot;non-dropping-particle&quot;:&quot;&quot;},{&quot;family&quot;:&quot;Gultom&quot;,&quot;given&quot;:&quot;Theo Benneditson&quot;,&quot;parse-names&quot;:false,&quot;dropping-particle&quot;:&quot;&quot;,&quot;non-dropping-particle&quot;:&quot;&quot;},{&quot;family&quot;:&quot;Sebayang&quot;,&quot;given&quot;:&quot;Yesticka&quot;,&quot;parse-names&quot;:false,&quot;dropping-particle&quot;:&quot;&quot;,&quot;non-dropping-particle&quot;:&quot;&quot;}],&quot;container-title&quot;:&quot;Talenta Conference Series: Energy and Engineering (EE)&quot;,&quot;ISBN&quot;:&quot;2654-704X&quot;,&quot;issued&quot;:{&quot;date-parts&quot;:[[2020]]},&quot;issue&quot;:&quot;2&quot;,&quot;volume&quot;:&quot;3&quot;,&quot;container-title-short&quot;:&quot;&quot;},&quot;isTemporary&quot;:false}]},{&quot;citationID&quot;:&quot;MENDELEY_CITATION_517e0629-801d-4b12-a8f8-ee2fe9f46ac4&quot;,&quot;properties&quot;:{&quot;noteIndex&quot;:0},&quot;isEdited&quot;:false,&quot;manualOverride&quot;:{&quot;isManuallyOverridden&quot;:false,&quot;citeprocText&quot;:&quot;(Mulyani &amp;#38; Kartini, 2023)&quot;,&quot;manualOverrideText&quot;:&quot;&quot;},&quot;citationTag&quot;:&quot;MENDELEY_CITATION_v3_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&quot;,&quot;citationItems&quot;:[{&quot;id&quot;:&quot;0cb1f664-1d35-3d25-a481-d642dbf50f2d&quot;,&quot;itemData&quot;:{&quot;type&quot;:&quot;article-journal&quot;,&quot;id&quot;:&quot;0cb1f664-1d35-3d25-a481-d642dbf50f2d&quot;,&quot;title&quot;:&quot;Visualisasi Data Ticketing Servicedesk Dengan Dashboard Pada PT Brantas Abipraya (Persero)&quot;,&quot;author&quot;:[{&quot;family&quot;:&quot;Mulyani&quot;,&quot;given&quot;:&quot;Astriana&quot;,&quot;parse-names&quot;:false,&quot;dropping-particle&quot;:&quot;&quot;,&quot;non-dropping-particle&quot;:&quot;&quot;},{&quot;family&quot;:&quot;Kartini&quot;,&quot;given&quot;:&quot;Kartini&quot;,&quot;parse-names&quot;:false,&quot;dropping-particle&quot;:&quot;&quot;,&quot;non-dropping-particle&quot;:&quot;&quot;}],&quot;container-title&quot;:&quot;Journal of Information System, Applied, Management, Accounting and Research&quot;,&quot;ISSN&quot;:&quot;2598-8719&quot;,&quot;issued&quot;:{&quot;date-parts&quot;:[[2023]]},&quot;page&quot;:&quot;289-300&quot;,&quot;issue&quot;:&quot;2&quot;,&quot;volume&quot;:&quot;7&quot;,&quot;container-title-short&quot;:&quot;&quot;},&quot;isTemporary&quot;:false}]},{&quot;citationID&quot;:&quot;MENDELEY_CITATION_b7c5119d-813d-44e2-977d-b57712b9b0e2&quot;,&quot;properties&quot;:{&quot;noteIndex&quot;:0},&quot;isEdited&quot;:false,&quot;manualOverride&quot;:{&quot;isManuallyOverridden&quot;:false,&quot;citeprocText&quot;:&quot;(Hismawan &amp;#38; Izaak, 2023)&quot;,&quot;manualOverrideText&quot;:&quot;&quot;},&quot;citationTag&quot;:&quot;MENDELEY_CITATION_v3_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&quot;,&quot;citationItems&quot;:[{&quot;id&quot;:&quot;11846df6-0008-38cd-b3d5-57f64a205852&quot;,&quot;itemData&quot;:{&quot;type&quot;:&quot;article-journal&quot;,&quot;id&quot;:&quot;11846df6-0008-38cd-b3d5-57f64a205852&quot;,&quot;title&quot;:&quot;Optimalisasi website menggunakan landing page sebagai media pemasaran produk parfum fresh fusion di era digital&quot;,&quot;author&quot;:[{&quot;family&quot;:&quot;Hismawan&quot;,&quot;given&quot;:&quot;Fiska Rahma&quot;,&quot;parse-names&quot;:false,&quot;dropping-particle&quot;:&quot;&quot;,&quot;non-dropping-particle&quot;:&quot;&quot;},{&quot;family&quot;:&quot;Izaak&quot;,&quot;given&quot;:&quot;Wilma Cordelia&quot;,&quot;parse-names&quot;:false,&quot;dropping-particle&quot;:&quot;&quot;,&quot;non-dropping-particle&quot;:&quot;&quot;}],&quot;container-title&quot;:&quot;KARYA: Jurnal Pengabdian Kepada Masyarakat&quot;,&quot;ISSN&quot;:&quot;2798-1827&quot;,&quot;issued&quot;:{&quot;date-parts&quot;:[[2023]]},&quot;page&quot;:&quot;364-368&quot;,&quot;issue&quot;:&quot;3&quot;,&quot;volume&quot;:&quot;3&quot;,&quot;container-title-short&quot;:&quot;&quot;},&quot;isTemporary&quot;:false}]}]"/>
     <we:property name="MENDELEY_CITATIONS_LOCALE_CODE" value="&quot;en-GB&quot;"/>
     <we:property name="MENDELEY_CITATIONS_STYLE" value="{&quot;id&quot;:&quot;https://www.zotero.org/styles/apa&quot;,&quot;title&quot;:&quot;American Psychological Association 7th edition&quot;,&quot;format&quot;:&quot;author-date&quot;,&quot;defaultLocale&quot;:null,&quot;isLocaleCodeValid&quot;:true}"/>
   </we:properties>

</xml_diff>

<commit_message>
abis nyicil bagian laporan biar gada space kosong. next lanjutin + perbarui daftar gambar sama daftar isi karna bisa jadi berubah (font daftar gambar sama daftar isi cek juga harus times new roman semua)
</commit_message>
<xml_diff>
--- a/non-website/Laporan Akhir KP/2203040182 - Dhika Ramadhan Saputra - Laporan KP - Revisi 1.docx
+++ b/non-website/Laporan Akhir KP/2203040182 - Dhika Ramadhan Saputra - Laporan KP - Revisi 1.docx
@@ -185,7 +185,6 @@
           <w:szCs w:val="22"/>
         </w:rPr>
       </w:pPr>
-      <w:proofErr w:type="gramStart"/>
       <w:r>
         <w:rPr>
           <w:rFonts w:ascii="Times New Roman" w:hAnsi="Times New Roman" w:cs="Times New Roman"/>
@@ -208,16 +207,15 @@
           <w:sz w:val="22"/>
           <w:szCs w:val="22"/>
         </w:rPr>
-        <w:t>:</w:t>
-      </w:r>
-      <w:proofErr w:type="gramEnd"/>
+        <w:t>: Dhika Ramadhan Saputra</w:t>
+      </w:r>
       <w:r>
         <w:rPr>
           <w:rFonts w:ascii="Times New Roman" w:hAnsi="Times New Roman" w:cs="Times New Roman"/>
           <w:sz w:val="22"/>
           <w:szCs w:val="22"/>
         </w:rPr>
-        <w:t xml:space="preserve"> Dhika Ramadhan Saputra</w:t>
+        <w:br/>
       </w:r>
       <w:r>
         <w:rPr>
@@ -225,16 +223,15 @@
           <w:sz w:val="22"/>
           <w:szCs w:val="22"/>
         </w:rPr>
-        <w:br/>
-      </w:r>
-      <w:proofErr w:type="gramStart"/>
+        <w:t>NIM.</w:t>
+      </w:r>
       <w:r>
         <w:rPr>
           <w:rFonts w:ascii="Times New Roman" w:hAnsi="Times New Roman" w:cs="Times New Roman"/>
           <w:sz w:val="22"/>
           <w:szCs w:val="22"/>
         </w:rPr>
-        <w:t>NIM.</w:t>
+        <w:t xml:space="preserve">  </w:t>
       </w:r>
       <w:r>
         <w:rPr>
@@ -242,24 +239,7 @@
           <w:sz w:val="22"/>
           <w:szCs w:val="22"/>
         </w:rPr>
-        <w:t xml:space="preserve">  </w:t>
-      </w:r>
-      <w:r>
-        <w:rPr>
-          <w:rFonts w:ascii="Times New Roman" w:hAnsi="Times New Roman" w:cs="Times New Roman"/>
-          <w:sz w:val="22"/>
-          <w:szCs w:val="22"/>
-        </w:rPr>
-        <w:t>:</w:t>
-      </w:r>
-      <w:proofErr w:type="gramEnd"/>
-      <w:r>
-        <w:rPr>
-          <w:rFonts w:ascii="Times New Roman" w:hAnsi="Times New Roman" w:cs="Times New Roman"/>
-          <w:sz w:val="22"/>
-          <w:szCs w:val="22"/>
-        </w:rPr>
-        <w:t xml:space="preserve"> 2203040182</w:t>
+        <w:t>: 2203040182</w:t>
       </w:r>
     </w:p>
     <w:p>
@@ -468,7 +448,6 @@
           <w:szCs w:val="22"/>
         </w:rPr>
       </w:pPr>
-      <w:proofErr w:type="gramStart"/>
       <w:r>
         <w:rPr>
           <w:rFonts w:ascii="Times New Roman" w:hAnsi="Times New Roman" w:cs="Times New Roman"/>
@@ -477,9 +456,8 @@
           <w:sz w:val="22"/>
           <w:szCs w:val="22"/>
         </w:rPr>
-        <w:t>Nama :</w:t>
-      </w:r>
-      <w:proofErr w:type="gramEnd"/>
+        <w:t xml:space="preserve">Nama : </w:t>
+      </w:r>
       <w:r>
         <w:rPr>
           <w:rFonts w:ascii="Times New Roman" w:hAnsi="Times New Roman" w:cs="Times New Roman"/>
@@ -488,9 +466,12 @@
           <w:sz w:val="22"/>
           <w:szCs w:val="22"/>
         </w:rPr>
-        <w:t xml:space="preserve"> </w:t>
-      </w:r>
-      <w:r>
+        <w:t>Dhika Ramadhan Saputra</w:t>
+      </w:r>
+    </w:p>
+    <w:p>
+      <w:pPr>
+        <w:jc w:val="center"/>
         <w:rPr>
           <w:rFonts w:ascii="Times New Roman" w:hAnsi="Times New Roman" w:cs="Times New Roman"/>
           <w:b/>
@@ -498,12 +479,8 @@
           <w:sz w:val="22"/>
           <w:szCs w:val="22"/>
         </w:rPr>
-        <w:t>Dhika Ramadhan Saputra</w:t>
-      </w:r>
-    </w:p>
-    <w:p>
-      <w:pPr>
-        <w:jc w:val="center"/>
+      </w:pPr>
+      <w:r>
         <w:rPr>
           <w:rFonts w:ascii="Times New Roman" w:hAnsi="Times New Roman" w:cs="Times New Roman"/>
           <w:b/>
@@ -511,7 +488,8 @@
           <w:sz w:val="22"/>
           <w:szCs w:val="22"/>
         </w:rPr>
-      </w:pPr>
+        <w:t xml:space="preserve">NIM. : </w:t>
+      </w:r>
       <w:r>
         <w:rPr>
           <w:rFonts w:ascii="Times New Roman" w:hAnsi="Times New Roman" w:cs="Times New Roman"/>
@@ -520,9 +498,8 @@
           <w:sz w:val="22"/>
           <w:szCs w:val="22"/>
         </w:rPr>
-        <w:t>NIM</w:t>
-      </w:r>
-      <w:proofErr w:type="gramStart"/>
+        <w:t>2203040182</w:t>
+      </w:r>
       <w:r>
         <w:rPr>
           <w:rFonts w:ascii="Times New Roman" w:hAnsi="Times New Roman" w:cs="Times New Roman"/>
@@ -531,9 +508,36 @@
           <w:sz w:val="22"/>
           <w:szCs w:val="22"/>
         </w:rPr>
-        <w:t>. :</w:t>
-      </w:r>
-      <w:proofErr w:type="gramEnd"/>
+        <w:t>.</w:t>
+      </w:r>
+    </w:p>
+    <w:p>
+      <w:pPr>
+        <w:jc w:val="center"/>
+        <w:rPr>
+          <w:rFonts w:ascii="Times New Roman" w:hAnsi="Times New Roman" w:cs="Times New Roman"/>
+          <w:sz w:val="22"/>
+          <w:szCs w:val="22"/>
+        </w:rPr>
+      </w:pPr>
+      <w:r>
+        <w:rPr>
+          <w:rFonts w:ascii="Times New Roman" w:hAnsi="Times New Roman" w:cs="Times New Roman"/>
+          <w:sz w:val="22"/>
+          <w:szCs w:val="22"/>
+        </w:rPr>
+        <w:br/>
+      </w:r>
+    </w:p>
+    <w:p>
+      <w:pPr>
+        <w:jc w:val="center"/>
+        <w:rPr>
+          <w:rFonts w:ascii="Times New Roman" w:hAnsi="Times New Roman" w:cs="Times New Roman"/>
+          <w:sz w:val="22"/>
+          <w:szCs w:val="22"/>
+        </w:rPr>
+      </w:pPr>
       <w:r>
         <w:rPr>
           <w:rFonts w:ascii="Times New Roman" w:hAnsi="Times New Roman" w:cs="Times New Roman"/>
@@ -542,8 +546,18 @@
           <w:sz w:val="22"/>
           <w:szCs w:val="22"/>
         </w:rPr>
-        <w:t xml:space="preserve"> </w:t>
-      </w:r>
+        <w:t>Laporan Kerja Praktik Mahasiswa tersebut di Atas</w:t>
+      </w:r>
+    </w:p>
+    <w:p>
+      <w:pPr>
+        <w:jc w:val="center"/>
+        <w:rPr>
+          <w:rFonts w:ascii="Times New Roman" w:hAnsi="Times New Roman" w:cs="Times New Roman"/>
+          <w:sz w:val="22"/>
+          <w:szCs w:val="22"/>
+        </w:rPr>
+      </w:pPr>
       <w:r>
         <w:rPr>
           <w:rFonts w:ascii="Times New Roman" w:hAnsi="Times New Roman" w:cs="Times New Roman"/>
@@ -552,8 +566,36 @@
           <w:sz w:val="22"/>
           <w:szCs w:val="22"/>
         </w:rPr>
-        <w:t>2203040182</w:t>
-      </w:r>
+        <w:t>Dinyatakan Telah Memenuhi Syarat untuk Diseminarkan</w:t>
+      </w:r>
+    </w:p>
+    <w:p>
+      <w:pPr>
+        <w:jc w:val="center"/>
+        <w:rPr>
+          <w:rFonts w:ascii="Times New Roman" w:hAnsi="Times New Roman" w:cs="Times New Roman"/>
+          <w:sz w:val="22"/>
+          <w:szCs w:val="22"/>
+        </w:rPr>
+      </w:pPr>
+      <w:r>
+        <w:rPr>
+          <w:rFonts w:ascii="Times New Roman" w:hAnsi="Times New Roman" w:cs="Times New Roman"/>
+          <w:sz w:val="22"/>
+          <w:szCs w:val="22"/>
+        </w:rPr>
+        <w:br/>
+      </w:r>
+    </w:p>
+    <w:p>
+      <w:pPr>
+        <w:jc w:val="center"/>
+        <w:rPr>
+          <w:rFonts w:ascii="Times New Roman" w:hAnsi="Times New Roman" w:cs="Times New Roman"/>
+          <w:sz w:val="22"/>
+          <w:szCs w:val="22"/>
+        </w:rPr>
+      </w:pPr>
       <w:r>
         <w:rPr>
           <w:rFonts w:ascii="Times New Roman" w:hAnsi="Times New Roman" w:cs="Times New Roman"/>
@@ -562,25 +604,7 @@
           <w:sz w:val="22"/>
           <w:szCs w:val="22"/>
         </w:rPr>
-        <w:t>.</w:t>
-      </w:r>
-    </w:p>
-    <w:p>
-      <w:pPr>
-        <w:jc w:val="center"/>
-        <w:rPr>
-          <w:rFonts w:ascii="Times New Roman" w:hAnsi="Times New Roman" w:cs="Times New Roman"/>
-          <w:sz w:val="22"/>
-          <w:szCs w:val="22"/>
-        </w:rPr>
-      </w:pPr>
-      <w:r>
-        <w:rPr>
-          <w:rFonts w:ascii="Times New Roman" w:hAnsi="Times New Roman" w:cs="Times New Roman"/>
-          <w:sz w:val="22"/>
-          <w:szCs w:val="22"/>
-        </w:rPr>
-        <w:br/>
+        <w:t>Disetujui  : di Purwokerto</w:t>
       </w:r>
     </w:p>
     <w:p>
@@ -600,7 +624,23 @@
           <w:sz w:val="22"/>
           <w:szCs w:val="22"/>
         </w:rPr>
-        <w:t>Laporan Kerja Praktik Mahasiswa tersebut di Atas</w:t>
+        <w:t>Tanggal : …………………..</w:t>
+      </w:r>
+      <w:r>
+        <w:rPr>
+          <w:rFonts w:ascii="Times New Roman" w:hAnsi="Times New Roman" w:cs="Times New Roman"/>
+          <w:sz w:val="22"/>
+          <w:szCs w:val="22"/>
+        </w:rPr>
+        <w:br/>
+      </w:r>
+      <w:r>
+        <w:rPr>
+          <w:rFonts w:ascii="Times New Roman" w:hAnsi="Times New Roman" w:cs="Times New Roman"/>
+          <w:sz w:val="22"/>
+          <w:szCs w:val="22"/>
+        </w:rPr>
+        <w:br/>
       </w:r>
     </w:p>
     <w:p>
@@ -620,140 +660,8 @@
           <w:sz w:val="22"/>
           <w:szCs w:val="22"/>
         </w:rPr>
-        <w:t>Dinyatakan Telah Memenuhi Syarat untuk Diseminarkan</w:t>
-      </w:r>
-    </w:p>
-    <w:p>
-      <w:pPr>
-        <w:jc w:val="center"/>
-        <w:rPr>
-          <w:rFonts w:ascii="Times New Roman" w:hAnsi="Times New Roman" w:cs="Times New Roman"/>
-          <w:sz w:val="22"/>
-          <w:szCs w:val="22"/>
-        </w:rPr>
-      </w:pPr>
-      <w:r>
-        <w:rPr>
-          <w:rFonts w:ascii="Times New Roman" w:hAnsi="Times New Roman" w:cs="Times New Roman"/>
-          <w:sz w:val="22"/>
-          <w:szCs w:val="22"/>
-        </w:rPr>
-        <w:br/>
-      </w:r>
-    </w:p>
-    <w:p>
-      <w:pPr>
-        <w:jc w:val="center"/>
-        <w:rPr>
-          <w:rFonts w:ascii="Times New Roman" w:hAnsi="Times New Roman" w:cs="Times New Roman"/>
-          <w:sz w:val="22"/>
-          <w:szCs w:val="22"/>
-        </w:rPr>
-      </w:pPr>
-      <w:proofErr w:type="gramStart"/>
-      <w:r>
-        <w:rPr>
-          <w:rFonts w:ascii="Times New Roman" w:hAnsi="Times New Roman" w:cs="Times New Roman"/>
-          <w:b/>
-          <w:bCs/>
-          <w:sz w:val="22"/>
-          <w:szCs w:val="22"/>
-        </w:rPr>
-        <w:t>Disetujui  :</w:t>
-      </w:r>
-      <w:proofErr w:type="gramEnd"/>
-      <w:r>
-        <w:rPr>
-          <w:rFonts w:ascii="Times New Roman" w:hAnsi="Times New Roman" w:cs="Times New Roman"/>
-          <w:b/>
-          <w:bCs/>
-          <w:sz w:val="22"/>
-          <w:szCs w:val="22"/>
-        </w:rPr>
-        <w:t xml:space="preserve"> di Purwokerto</w:t>
-      </w:r>
-    </w:p>
-    <w:p>
-      <w:pPr>
-        <w:jc w:val="center"/>
-        <w:rPr>
-          <w:rFonts w:ascii="Times New Roman" w:hAnsi="Times New Roman" w:cs="Times New Roman"/>
-          <w:sz w:val="22"/>
-          <w:szCs w:val="22"/>
-        </w:rPr>
-      </w:pPr>
-      <w:proofErr w:type="gramStart"/>
-      <w:r>
-        <w:rPr>
-          <w:rFonts w:ascii="Times New Roman" w:hAnsi="Times New Roman" w:cs="Times New Roman"/>
-          <w:b/>
-          <w:bCs/>
-          <w:sz w:val="22"/>
-          <w:szCs w:val="22"/>
-        </w:rPr>
-        <w:t>Tanggal :</w:t>
-      </w:r>
-      <w:proofErr w:type="gramEnd"/>
-      <w:r>
-        <w:rPr>
-          <w:rFonts w:ascii="Times New Roman" w:hAnsi="Times New Roman" w:cs="Times New Roman"/>
-          <w:b/>
-          <w:bCs/>
-          <w:sz w:val="22"/>
-          <w:szCs w:val="22"/>
-        </w:rPr>
-        <w:t xml:space="preserve"> ………………</w:t>
-      </w:r>
-      <w:proofErr w:type="gramStart"/>
-      <w:r>
-        <w:rPr>
-          <w:rFonts w:ascii="Times New Roman" w:hAnsi="Times New Roman" w:cs="Times New Roman"/>
-          <w:b/>
-          <w:bCs/>
-          <w:sz w:val="22"/>
-          <w:szCs w:val="22"/>
-        </w:rPr>
-        <w:t>…..</w:t>
-      </w:r>
-      <w:proofErr w:type="gramEnd"/>
-      <w:r>
-        <w:rPr>
-          <w:rFonts w:ascii="Times New Roman" w:hAnsi="Times New Roman" w:cs="Times New Roman"/>
-          <w:sz w:val="22"/>
-          <w:szCs w:val="22"/>
-        </w:rPr>
-        <w:br/>
-      </w:r>
-      <w:r>
-        <w:rPr>
-          <w:rFonts w:ascii="Times New Roman" w:hAnsi="Times New Roman" w:cs="Times New Roman"/>
-          <w:sz w:val="22"/>
-          <w:szCs w:val="22"/>
-        </w:rPr>
-        <w:br/>
-      </w:r>
-    </w:p>
-    <w:p>
-      <w:pPr>
-        <w:jc w:val="center"/>
-        <w:rPr>
-          <w:rFonts w:ascii="Times New Roman" w:hAnsi="Times New Roman" w:cs="Times New Roman"/>
-          <w:sz w:val="22"/>
-          <w:szCs w:val="22"/>
-        </w:rPr>
-      </w:pPr>
-      <w:proofErr w:type="gramStart"/>
-      <w:r>
-        <w:rPr>
-          <w:rFonts w:ascii="Times New Roman" w:hAnsi="Times New Roman" w:cs="Times New Roman"/>
-          <w:b/>
-          <w:bCs/>
-          <w:sz w:val="22"/>
-          <w:szCs w:val="22"/>
-        </w:rPr>
         <w:t>Oleh :</w:t>
       </w:r>
-      <w:proofErr w:type="gramEnd"/>
     </w:p>
     <w:p>
       <w:pPr>
@@ -881,27 +789,7 @@
                 <w:szCs w:val="22"/>
                 <w:u w:val="single"/>
               </w:rPr>
-              <w:t xml:space="preserve">Maulida Ayu Fitriani, </w:t>
-            </w:r>
-            <w:proofErr w:type="gramStart"/>
-            <w:r>
-              <w:rPr>
-                <w:rFonts w:ascii="Times New Roman" w:hAnsi="Times New Roman" w:cs="Times New Roman"/>
-                <w:sz w:val="22"/>
-                <w:szCs w:val="22"/>
-                <w:u w:val="single"/>
-              </w:rPr>
-              <w:t>S.Kom</w:t>
-            </w:r>
-            <w:proofErr w:type="gramEnd"/>
-            <w:r>
-              <w:rPr>
-                <w:rFonts w:ascii="Times New Roman" w:hAnsi="Times New Roman" w:cs="Times New Roman"/>
-                <w:sz w:val="22"/>
-                <w:szCs w:val="22"/>
-                <w:u w:val="single"/>
-              </w:rPr>
-              <w:t>., M.Cs.</w:t>
+              <w:t>Maulida Ayu Fitriani, S.Kom., M.Cs.</w:t>
             </w:r>
           </w:p>
           <w:p>
@@ -1246,7 +1134,6 @@
           <w:szCs w:val="20"/>
         </w:rPr>
       </w:pPr>
-      <w:proofErr w:type="gramStart"/>
       <w:r>
         <w:rPr>
           <w:rFonts w:ascii="Times New Roman" w:eastAsia="Times New Roman" w:hAnsi="Times New Roman" w:cs="Times New Roman"/>
@@ -1256,7 +1143,6 @@
         </w:rPr>
         <w:t>Disetujui :</w:t>
       </w:r>
-      <w:proofErr w:type="gramEnd"/>
     </w:p>
     <w:p>
       <w:pPr>
@@ -1301,19 +1187,8 @@
           <w:sz w:val="22"/>
           <w:szCs w:val="22"/>
         </w:rPr>
-        <w:t>Tanggal: ………………</w:t>
-      </w:r>
-      <w:proofErr w:type="gramStart"/>
-      <w:r>
-        <w:rPr>
-          <w:rFonts w:ascii="Times New Roman" w:eastAsia="Times New Roman" w:hAnsi="Times New Roman" w:cs="Times New Roman"/>
-          <w:color w:val="000000"/>
-          <w:sz w:val="22"/>
-          <w:szCs w:val="22"/>
-        </w:rPr>
-        <w:t>…..</w:t>
-      </w:r>
-      <w:proofErr w:type="gramEnd"/>
+        <w:t>Tanggal: …………………..</w:t>
+      </w:r>
     </w:p>
     <w:p>
       <w:pPr>
@@ -1458,29 +1333,7 @@
                 <w:szCs w:val="22"/>
                 <w:u w:val="single"/>
               </w:rPr>
-              <w:t xml:space="preserve">Maulida Ayu Fitriani, </w:t>
-            </w:r>
-            <w:proofErr w:type="gramStart"/>
-            <w:r>
-              <w:rPr>
-                <w:rFonts w:ascii="Times New Roman" w:eastAsia="Times New Roman" w:hAnsi="Times New Roman" w:cs="Times New Roman"/>
-                <w:color w:val="000000"/>
-                <w:sz w:val="22"/>
-                <w:szCs w:val="22"/>
-                <w:u w:val="single"/>
-              </w:rPr>
-              <w:t>S.Kom</w:t>
-            </w:r>
-            <w:proofErr w:type="gramEnd"/>
-            <w:r>
-              <w:rPr>
-                <w:rFonts w:ascii="Times New Roman" w:eastAsia="Times New Roman" w:hAnsi="Times New Roman" w:cs="Times New Roman"/>
-                <w:color w:val="000000"/>
-                <w:sz w:val="22"/>
-                <w:szCs w:val="22"/>
-                <w:u w:val="single"/>
-              </w:rPr>
-              <w:t>., M.Cs.</w:t>
+              <w:t>Maulida Ayu Fitriani, S.Kom., M.Cs.</w:t>
             </w:r>
           </w:p>
           <w:p>
@@ -1493,7 +1346,6 @@
                 <w:szCs w:val="22"/>
               </w:rPr>
             </w:pPr>
-            <w:proofErr w:type="gramStart"/>
             <w:r>
               <w:rPr>
                 <w:rFonts w:ascii="Times New Roman" w:eastAsia="Times New Roman" w:hAnsi="Times New Roman" w:cs="Times New Roman"/>
@@ -1501,17 +1353,7 @@
                 <w:sz w:val="22"/>
                 <w:szCs w:val="22"/>
               </w:rPr>
-              <w:t>NIK./</w:t>
-            </w:r>
-            <w:proofErr w:type="gramEnd"/>
-            <w:r>
-              <w:rPr>
-                <w:rFonts w:ascii="Times New Roman" w:eastAsia="Times New Roman" w:hAnsi="Times New Roman" w:cs="Times New Roman"/>
-                <w:color w:val="000000"/>
-                <w:sz w:val="22"/>
-                <w:szCs w:val="22"/>
-              </w:rPr>
-              <w:t>NIP.</w:t>
+              <w:t>NIK./NIP.</w:t>
             </w:r>
             <w:r>
               <w:rPr>
@@ -1591,7 +1433,6 @@
                 <w:szCs w:val="22"/>
               </w:rPr>
             </w:pPr>
-            <w:proofErr w:type="gramStart"/>
             <w:r>
               <w:rPr>
                 <w:rFonts w:ascii="Times New Roman" w:eastAsia="Times New Roman" w:hAnsi="Times New Roman" w:cs="Times New Roman"/>
@@ -1601,7 +1442,6 @@
               </w:rPr>
               <w:t>NIK./NIP.*</w:t>
             </w:r>
-            <w:proofErr w:type="gramEnd"/>
             <w:r>
               <w:rPr>
                 <w:rFonts w:ascii="Times New Roman" w:eastAsia="Times New Roman" w:hAnsi="Times New Roman" w:cs="Times New Roman"/>
@@ -1728,60 +1568,27 @@
           <w:szCs w:val="22"/>
           <w:u w:val="single"/>
         </w:rPr>
-        <w:t xml:space="preserve">Agung Purwo Wicaksono, S.T., </w:t>
-      </w:r>
-      <w:proofErr w:type="gramStart"/>
+        <w:t>Agung Purwo Wicaksono, S.T., M.Kom.</w:t>
+      </w:r>
+    </w:p>
+    <w:p>
+      <w:pPr>
+        <w:spacing w:line="276" w:lineRule="auto"/>
+        <w:ind w:left="441"/>
+        <w:jc w:val="center"/>
+        <w:rPr>
+          <w:rFonts w:ascii="Times New Roman" w:eastAsia="Times New Roman" w:hAnsi="Times New Roman" w:cs="Times New Roman"/>
+          <w:color w:val="000000"/>
+        </w:rPr>
+      </w:pPr>
       <w:r>
         <w:rPr>
           <w:rFonts w:ascii="Times New Roman" w:eastAsia="Times New Roman" w:hAnsi="Times New Roman" w:cs="Times New Roman"/>
           <w:color w:val="000000"/>
           <w:sz w:val="22"/>
           <w:szCs w:val="22"/>
-          <w:u w:val="single"/>
-        </w:rPr>
-        <w:t>M.Kom</w:t>
-      </w:r>
-      <w:proofErr w:type="gramEnd"/>
-      <w:r>
-        <w:rPr>
-          <w:rFonts w:ascii="Times New Roman" w:eastAsia="Times New Roman" w:hAnsi="Times New Roman" w:cs="Times New Roman"/>
-          <w:color w:val="000000"/>
-          <w:sz w:val="22"/>
-          <w:szCs w:val="22"/>
-          <w:u w:val="single"/>
-        </w:rPr>
-        <w:t>.</w:t>
-      </w:r>
-    </w:p>
-    <w:p>
-      <w:pPr>
-        <w:spacing w:line="276" w:lineRule="auto"/>
-        <w:ind w:left="441"/>
-        <w:jc w:val="center"/>
-        <w:rPr>
-          <w:rFonts w:ascii="Times New Roman" w:eastAsia="Times New Roman" w:hAnsi="Times New Roman" w:cs="Times New Roman"/>
-          <w:color w:val="000000"/>
-        </w:rPr>
-      </w:pPr>
-      <w:proofErr w:type="gramStart"/>
-      <w:r>
-        <w:rPr>
-          <w:rFonts w:ascii="Times New Roman" w:eastAsia="Times New Roman" w:hAnsi="Times New Roman" w:cs="Times New Roman"/>
-          <w:color w:val="000000"/>
-          <w:sz w:val="22"/>
-          <w:szCs w:val="22"/>
-        </w:rPr>
-        <w:t>NIK./</w:t>
-      </w:r>
-      <w:proofErr w:type="gramEnd"/>
-      <w:r>
-        <w:rPr>
-          <w:rFonts w:ascii="Times New Roman" w:eastAsia="Times New Roman" w:hAnsi="Times New Roman" w:cs="Times New Roman"/>
-          <w:color w:val="000000"/>
-          <w:sz w:val="22"/>
-          <w:szCs w:val="22"/>
-        </w:rPr>
-        <w:t>NIP.</w:t>
+        </w:rPr>
+        <w:t>NIK./NIP.</w:t>
       </w:r>
       <w:r>
         <w:rPr>
@@ -3730,14 +3537,30 @@
         </w:rPr>
         <w:fldChar w:fldCharType="separate"/>
       </w:r>
-      <w:hyperlink w:anchor="_Toc200619004" w:history="1">
+      <w:hyperlink w:anchor="_Toc208147252" w:history="1">
         <w:r>
           <w:rPr>
             <w:rStyle w:val="Hyperlink"/>
             <w:rFonts w:ascii="Times New Roman" w:hAnsi="Times New Roman" w:cs="Times New Roman"/>
             <w:noProof/>
           </w:rPr>
-          <w:t>Gambar 1. 1 tahapan pelaksanaan</w:t>
+          <w:t>Gambar 1. 1 tahapan pela</w:t>
+        </w:r>
+        <w:r>
+          <w:rPr>
+            <w:rStyle w:val="Hyperlink"/>
+            <w:rFonts w:ascii="Times New Roman" w:hAnsi="Times New Roman" w:cs="Times New Roman"/>
+            <w:noProof/>
+          </w:rPr>
+          <w:t>k</w:t>
+        </w:r>
+        <w:r>
+          <w:rPr>
+            <w:rStyle w:val="Hyperlink"/>
+            <w:rFonts w:ascii="Times New Roman" w:hAnsi="Times New Roman" w:cs="Times New Roman"/>
+            <w:noProof/>
+          </w:rPr>
+          <w:t>sanaan</w:t>
         </w:r>
         <w:r>
           <w:rPr>
@@ -3761,7 +3584,7 @@
             <w:noProof/>
             <w:webHidden/>
           </w:rPr>
-          <w:instrText xml:space="preserve"> PAGEREF _Toc200619004 \h </w:instrText>
+          <w:instrText xml:space="preserve"> PAGEREF _Toc208147252 \h </w:instrText>
         </w:r>
         <w:r>
           <w:rPr>
@@ -3784,7 +3607,7 @@
             <w:noProof/>
             <w:webHidden/>
           </w:rPr>
-          <w:t>4</w:t>
+          <w:t>5</w:t>
         </w:r>
         <w:r>
           <w:rPr>
@@ -3795,14 +3618,6 @@
           <w:fldChar w:fldCharType="end"/>
         </w:r>
       </w:hyperlink>
-      <w:r>
-        <w:rPr>
-          <w:rStyle w:val="Hyperlink"/>
-          <w:rFonts w:ascii="Times New Roman" w:hAnsi="Times New Roman" w:cs="Times New Roman"/>
-          <w:noProof/>
-        </w:rPr>
-        <w:t xml:space="preserve"> </w:t>
-      </w:r>
       <w:r>
         <w:rPr>
           <w:rFonts w:ascii="Times New Roman" w:hAnsi="Times New Roman" w:cs="Times New Roman"/>
@@ -3839,14 +3654,30 @@
           <w:noProof/>
         </w:rPr>
       </w:pPr>
-      <w:hyperlink w:anchor="_Toc200619010" w:history="1">
+      <w:hyperlink w:anchor="_Toc208147272" w:history="1">
         <w:r>
           <w:rPr>
             <w:rStyle w:val="Hyperlink"/>
             <w:rFonts w:ascii="Times New Roman" w:hAnsi="Times New Roman" w:cs="Times New Roman"/>
             <w:noProof/>
           </w:rPr>
-          <w:t>Gambar 2. 1 struktur umum organisasi mitra</w:t>
+          <w:t>Gambar 2. 1 struk</w:t>
+        </w:r>
+        <w:r>
+          <w:rPr>
+            <w:rStyle w:val="Hyperlink"/>
+            <w:rFonts w:ascii="Times New Roman" w:hAnsi="Times New Roman" w:cs="Times New Roman"/>
+            <w:noProof/>
+          </w:rPr>
+          <w:t>t</w:t>
+        </w:r>
+        <w:r>
+          <w:rPr>
+            <w:rStyle w:val="Hyperlink"/>
+            <w:rFonts w:ascii="Times New Roman" w:hAnsi="Times New Roman" w:cs="Times New Roman"/>
+            <w:noProof/>
+          </w:rPr>
+          <w:t>ur umum organisasi mitra</w:t>
         </w:r>
         <w:r>
           <w:rPr>
@@ -3870,7 +3701,7 @@
             <w:noProof/>
             <w:webHidden/>
           </w:rPr>
-          <w:instrText xml:space="preserve"> PAGEREF _Toc200619010 \h </w:instrText>
+          <w:instrText xml:space="preserve"> PAGEREF _Toc208147272 \h </w:instrText>
         </w:r>
         <w:r>
           <w:rPr>
@@ -3893,7 +3724,7 @@
             <w:noProof/>
             <w:webHidden/>
           </w:rPr>
-          <w:t>7</w:t>
+          <w:t>11</w:t>
         </w:r>
         <w:r>
           <w:rPr>
@@ -3904,14 +3735,6 @@
           <w:fldChar w:fldCharType="end"/>
         </w:r>
       </w:hyperlink>
-      <w:r>
-        <w:rPr>
-          <w:rStyle w:val="Hyperlink"/>
-          <w:rFonts w:ascii="Times New Roman" w:hAnsi="Times New Roman" w:cs="Times New Roman"/>
-          <w:noProof/>
-        </w:rPr>
-        <w:t xml:space="preserve"> </w:t>
-      </w:r>
       <w:r>
         <w:rPr>
           <w:rFonts w:ascii="Times New Roman" w:hAnsi="Times New Roman" w:cs="Times New Roman"/>
@@ -3948,14 +3771,30 @@
           <w:noProof/>
         </w:rPr>
       </w:pPr>
-      <w:hyperlink w:anchor="_Toc200619018" w:history="1">
+      <w:hyperlink w:anchor="_Toc208147360" w:history="1">
         <w:r>
           <w:rPr>
             <w:rStyle w:val="Hyperlink"/>
             <w:rFonts w:ascii="Times New Roman" w:hAnsi="Times New Roman" w:cs="Times New Roman"/>
             <w:noProof/>
           </w:rPr>
-          <w:t>Gambar 3. 1 dokumentasi penerimaan data via Whatsapp</w:t>
+          <w:t>Gambar 3. 1 dokumentasi penerim</w:t>
+        </w:r>
+        <w:r>
+          <w:rPr>
+            <w:rStyle w:val="Hyperlink"/>
+            <w:rFonts w:ascii="Times New Roman" w:hAnsi="Times New Roman" w:cs="Times New Roman"/>
+            <w:noProof/>
+          </w:rPr>
+          <w:t>a</w:t>
+        </w:r>
+        <w:r>
+          <w:rPr>
+            <w:rStyle w:val="Hyperlink"/>
+            <w:rFonts w:ascii="Times New Roman" w:hAnsi="Times New Roman" w:cs="Times New Roman"/>
+            <w:noProof/>
+          </w:rPr>
+          <w:t>an data via Whatsapp</w:t>
         </w:r>
         <w:r>
           <w:rPr>
@@ -3979,7 +3818,7 @@
             <w:noProof/>
             <w:webHidden/>
           </w:rPr>
-          <w:instrText xml:space="preserve"> PAGEREF _Toc200619018 \h </w:instrText>
+          <w:instrText xml:space="preserve"> PAGEREF _Toc208147360 \h </w:instrText>
         </w:r>
         <w:r>
           <w:rPr>
@@ -4002,7 +3841,7 @@
             <w:noProof/>
             <w:webHidden/>
           </w:rPr>
-          <w:t>9</w:t>
+          <w:t>13</w:t>
         </w:r>
         <w:r>
           <w:rPr>
@@ -4025,7 +3864,7 @@
           <w:noProof/>
         </w:rPr>
       </w:pPr>
-      <w:hyperlink w:anchor="_Toc200619019" w:history="1">
+      <w:hyperlink w:anchor="_Toc208147361" w:history="1">
         <w:r>
           <w:rPr>
             <w:rStyle w:val="Hyperlink"/>
@@ -4056,7 +3895,7 @@
             <w:noProof/>
             <w:webHidden/>
           </w:rPr>
-          <w:instrText xml:space="preserve"> PAGEREF _Toc200619019 \h </w:instrText>
+          <w:instrText xml:space="preserve"> PAGEREF _Toc208147361 \h </w:instrText>
         </w:r>
         <w:r>
           <w:rPr>
@@ -4079,7 +3918,7 @@
             <w:noProof/>
             <w:webHidden/>
           </w:rPr>
-          <w:t>9</w:t>
+          <w:t>13</w:t>
         </w:r>
         <w:r>
           <w:rPr>
@@ -4102,7 +3941,7 @@
           <w:noProof/>
         </w:rPr>
       </w:pPr>
-      <w:hyperlink w:anchor="_Toc200619020" w:history="1">
+      <w:hyperlink w:anchor="_Toc208147362" w:history="1">
         <w:r>
           <w:rPr>
             <w:rStyle w:val="Hyperlink"/>
@@ -4133,7 +3972,7 @@
             <w:noProof/>
             <w:webHidden/>
           </w:rPr>
-          <w:instrText xml:space="preserve"> PAGEREF _Toc200619020 \h </w:instrText>
+          <w:instrText xml:space="preserve"> PAGEREF _Toc208147362 \h </w:instrText>
         </w:r>
         <w:r>
           <w:rPr>
@@ -4156,7 +3995,7 @@
             <w:noProof/>
             <w:webHidden/>
           </w:rPr>
-          <w:t>10</w:t>
+          <w:t>14</w:t>
         </w:r>
         <w:r>
           <w:rPr>
@@ -4179,7 +4018,7 @@
           <w:noProof/>
         </w:rPr>
       </w:pPr>
-      <w:hyperlink w:anchor="_Toc200619021" w:history="1">
+      <w:hyperlink w:anchor="_Toc208147363" w:history="1">
         <w:r>
           <w:rPr>
             <w:rStyle w:val="Hyperlink"/>
@@ -4210,7 +4049,7 @@
             <w:noProof/>
             <w:webHidden/>
           </w:rPr>
-          <w:instrText xml:space="preserve"> PAGEREF _Toc200619021 \h </w:instrText>
+          <w:instrText xml:space="preserve"> PAGEREF _Toc208147363 \h </w:instrText>
         </w:r>
         <w:r>
           <w:rPr>
@@ -4233,7 +4072,7 @@
             <w:noProof/>
             <w:webHidden/>
           </w:rPr>
-          <w:t>11</w:t>
+          <w:t>15</w:t>
         </w:r>
         <w:r>
           <w:rPr>
@@ -4256,7 +4095,7 @@
           <w:noProof/>
         </w:rPr>
       </w:pPr>
-      <w:hyperlink w:anchor="_Toc200619022" w:history="1">
+      <w:hyperlink w:anchor="_Toc208147364" w:history="1">
         <w:r>
           <w:rPr>
             <w:rStyle w:val="Hyperlink"/>
@@ -4287,7 +4126,7 @@
             <w:noProof/>
             <w:webHidden/>
           </w:rPr>
-          <w:instrText xml:space="preserve"> PAGEREF _Toc200619022 \h </w:instrText>
+          <w:instrText xml:space="preserve"> PAGEREF _Toc208147364 \h </w:instrText>
         </w:r>
         <w:r>
           <w:rPr>
@@ -4310,7 +4149,7 @@
             <w:noProof/>
             <w:webHidden/>
           </w:rPr>
-          <w:t>11</w:t>
+          <w:t>15</w:t>
         </w:r>
         <w:r>
           <w:rPr>
@@ -4333,7 +4172,7 @@
           <w:noProof/>
         </w:rPr>
       </w:pPr>
-      <w:hyperlink w:anchor="_Toc200619023" w:history="1">
+      <w:hyperlink w:anchor="_Toc208147365" w:history="1">
         <w:r>
           <w:rPr>
             <w:rStyle w:val="Hyperlink"/>
@@ -4364,7 +4203,7 @@
             <w:noProof/>
             <w:webHidden/>
           </w:rPr>
-          <w:instrText xml:space="preserve"> PAGEREF _Toc200619023 \h </w:instrText>
+          <w:instrText xml:space="preserve"> PAGEREF _Toc208147365 \h </w:instrText>
         </w:r>
         <w:r>
           <w:rPr>
@@ -4387,7 +4226,7 @@
             <w:noProof/>
             <w:webHidden/>
           </w:rPr>
-          <w:t>12</w:t>
+          <w:t>16</w:t>
         </w:r>
         <w:r>
           <w:rPr>
@@ -4410,7 +4249,7 @@
           <w:noProof/>
         </w:rPr>
       </w:pPr>
-      <w:hyperlink w:anchor="_Toc200619024" w:history="1">
+      <w:hyperlink w:anchor="_Toc208147366" w:history="1">
         <w:r>
           <w:rPr>
             <w:rStyle w:val="Hyperlink"/>
@@ -4441,7 +4280,7 @@
             <w:noProof/>
             <w:webHidden/>
           </w:rPr>
-          <w:instrText xml:space="preserve"> PAGEREF _Toc200619024 \h </w:instrText>
+          <w:instrText xml:space="preserve"> PAGEREF _Toc208147366 \h </w:instrText>
         </w:r>
         <w:r>
           <w:rPr>
@@ -4464,7 +4303,7 @@
             <w:noProof/>
             <w:webHidden/>
           </w:rPr>
-          <w:t>12</w:t>
+          <w:t>16</w:t>
         </w:r>
         <w:r>
           <w:rPr>
@@ -4487,7 +4326,7 @@
           <w:noProof/>
         </w:rPr>
       </w:pPr>
-      <w:hyperlink w:anchor="_Toc200619025" w:history="1">
+      <w:hyperlink w:anchor="_Toc208147367" w:history="1">
         <w:r>
           <w:rPr>
             <w:rStyle w:val="Hyperlink"/>
@@ -4518,7 +4357,7 @@
             <w:noProof/>
             <w:webHidden/>
           </w:rPr>
-          <w:instrText xml:space="preserve"> PAGEREF _Toc200619025 \h </w:instrText>
+          <w:instrText xml:space="preserve"> PAGEREF _Toc208147367 \h </w:instrText>
         </w:r>
         <w:r>
           <w:rPr>
@@ -4541,7 +4380,7 @@
             <w:noProof/>
             <w:webHidden/>
           </w:rPr>
-          <w:t>13</w:t>
+          <w:t>18</w:t>
         </w:r>
         <w:r>
           <w:rPr>
@@ -4564,7 +4403,7 @@
           <w:noProof/>
         </w:rPr>
       </w:pPr>
-      <w:hyperlink w:anchor="_Toc200619026" w:history="1">
+      <w:hyperlink w:anchor="_Toc208147368" w:history="1">
         <w:r>
           <w:rPr>
             <w:rStyle w:val="Hyperlink"/>
@@ -4595,7 +4434,7 @@
             <w:noProof/>
             <w:webHidden/>
           </w:rPr>
-          <w:instrText xml:space="preserve"> PAGEREF _Toc200619026 \h </w:instrText>
+          <w:instrText xml:space="preserve"> PAGEREF _Toc208147368 \h </w:instrText>
         </w:r>
         <w:r>
           <w:rPr>
@@ -4618,7 +4457,7 @@
             <w:noProof/>
             <w:webHidden/>
           </w:rPr>
-          <w:t>14</w:t>
+          <w:t>19</w:t>
         </w:r>
         <w:r>
           <w:rPr>
@@ -4641,7 +4480,7 @@
           <w:noProof/>
         </w:rPr>
       </w:pPr>
-      <w:hyperlink w:anchor="_Toc200619027" w:history="1">
+      <w:hyperlink w:anchor="_Toc208147369" w:history="1">
         <w:r>
           <w:rPr>
             <w:rStyle w:val="Hyperlink"/>
@@ -4672,7 +4511,7 @@
             <w:noProof/>
             <w:webHidden/>
           </w:rPr>
-          <w:instrText xml:space="preserve"> PAGEREF _Toc200619027 \h </w:instrText>
+          <w:instrText xml:space="preserve"> PAGEREF _Toc208147369 \h </w:instrText>
         </w:r>
         <w:r>
           <w:rPr>
@@ -4695,7 +4534,7 @@
             <w:noProof/>
             <w:webHidden/>
           </w:rPr>
-          <w:t>14</w:t>
+          <w:t>19</w:t>
         </w:r>
         <w:r>
           <w:rPr>
@@ -4718,7 +4557,7 @@
           <w:noProof/>
         </w:rPr>
       </w:pPr>
-      <w:hyperlink w:anchor="_Toc200619028" w:history="1">
+      <w:hyperlink w:anchor="_Toc208147370" w:history="1">
         <w:r>
           <w:rPr>
             <w:rStyle w:val="Hyperlink"/>
@@ -4749,7 +4588,7 @@
             <w:noProof/>
             <w:webHidden/>
           </w:rPr>
-          <w:instrText xml:space="preserve"> PAGEREF _Toc200619028 \h </w:instrText>
+          <w:instrText xml:space="preserve"> PAGEREF _Toc208147370 \h </w:instrText>
         </w:r>
         <w:r>
           <w:rPr>
@@ -4772,7 +4611,7 @@
             <w:noProof/>
             <w:webHidden/>
           </w:rPr>
-          <w:t>15</w:t>
+          <w:t>20</w:t>
         </w:r>
         <w:r>
           <w:rPr>
@@ -4795,7 +4634,7 @@
           <w:noProof/>
         </w:rPr>
       </w:pPr>
-      <w:hyperlink w:anchor="_Toc200619029" w:history="1">
+      <w:hyperlink w:anchor="_Toc208147371" w:history="1">
         <w:r>
           <w:rPr>
             <w:rStyle w:val="Hyperlink"/>
@@ -4826,7 +4665,7 @@
             <w:noProof/>
             <w:webHidden/>
           </w:rPr>
-          <w:instrText xml:space="preserve"> PAGEREF _Toc200619029 \h </w:instrText>
+          <w:instrText xml:space="preserve"> PAGEREF _Toc208147371 \h </w:instrText>
         </w:r>
         <w:r>
           <w:rPr>
@@ -4849,7 +4688,7 @@
             <w:noProof/>
             <w:webHidden/>
           </w:rPr>
-          <w:t>16</w:t>
+          <w:t>22</w:t>
         </w:r>
         <w:r>
           <w:rPr>
@@ -4872,7 +4711,7 @@
           <w:noProof/>
         </w:rPr>
       </w:pPr>
-      <w:hyperlink w:anchor="_Toc200619030" w:history="1">
+      <w:hyperlink w:anchor="_Toc208147372" w:history="1">
         <w:r>
           <w:rPr>
             <w:rStyle w:val="Hyperlink"/>
@@ -4903,7 +4742,7 @@
             <w:noProof/>
             <w:webHidden/>
           </w:rPr>
-          <w:instrText xml:space="preserve"> PAGEREF _Toc200619030 \h </w:instrText>
+          <w:instrText xml:space="preserve"> PAGEREF _Toc208147372 \h </w:instrText>
         </w:r>
         <w:r>
           <w:rPr>
@@ -4926,7 +4765,7 @@
             <w:noProof/>
             <w:webHidden/>
           </w:rPr>
-          <w:t>17</w:t>
+          <w:t>23</w:t>
         </w:r>
         <w:r>
           <w:rPr>
@@ -4949,7 +4788,7 @@
           <w:noProof/>
         </w:rPr>
       </w:pPr>
-      <w:hyperlink w:anchor="_Toc200619031" w:history="1">
+      <w:hyperlink w:anchor="_Toc208147373" w:history="1">
         <w:r>
           <w:rPr>
             <w:rStyle w:val="Hyperlink"/>
@@ -4980,7 +4819,7 @@
             <w:noProof/>
             <w:webHidden/>
           </w:rPr>
-          <w:instrText xml:space="preserve"> PAGEREF _Toc200619031 \h </w:instrText>
+          <w:instrText xml:space="preserve"> PAGEREF _Toc208147373 \h </w:instrText>
         </w:r>
         <w:r>
           <w:rPr>
@@ -5003,7 +4842,7 @@
             <w:noProof/>
             <w:webHidden/>
           </w:rPr>
-          <w:t>17</w:t>
+          <w:t>24</w:t>
         </w:r>
         <w:r>
           <w:rPr>
@@ -5026,7 +4865,7 @@
           <w:noProof/>
         </w:rPr>
       </w:pPr>
-      <w:hyperlink w:anchor="_Toc200619032" w:history="1">
+      <w:hyperlink w:anchor="_Toc208147374" w:history="1">
         <w:r>
           <w:rPr>
             <w:rStyle w:val="Hyperlink"/>
@@ -5057,7 +4896,7 @@
             <w:noProof/>
             <w:webHidden/>
           </w:rPr>
-          <w:instrText xml:space="preserve"> PAGEREF _Toc200619032 \h </w:instrText>
+          <w:instrText xml:space="preserve"> PAGEREF _Toc208147374 \h </w:instrText>
         </w:r>
         <w:r>
           <w:rPr>
@@ -5080,7 +4919,7 @@
             <w:noProof/>
             <w:webHidden/>
           </w:rPr>
-          <w:t>18</w:t>
+          <w:t>25</w:t>
         </w:r>
         <w:r>
           <w:rPr>
@@ -5103,7 +4942,7 @@
           <w:noProof/>
         </w:rPr>
       </w:pPr>
-      <w:hyperlink w:anchor="_Toc200619033" w:history="1">
+      <w:hyperlink w:anchor="_Toc208147375" w:history="1">
         <w:r>
           <w:rPr>
             <w:rStyle w:val="Hyperlink"/>
@@ -5134,7 +4973,7 @@
             <w:noProof/>
             <w:webHidden/>
           </w:rPr>
-          <w:instrText xml:space="preserve"> PAGEREF _Toc200619033 \h </w:instrText>
+          <w:instrText xml:space="preserve"> PAGEREF _Toc208147375 \h </w:instrText>
         </w:r>
         <w:r>
           <w:rPr>
@@ -5157,7 +4996,7 @@
             <w:noProof/>
             <w:webHidden/>
           </w:rPr>
-          <w:t>18</w:t>
+          <w:t>27</w:t>
         </w:r>
         <w:r>
           <w:rPr>
@@ -5180,7 +5019,7 @@
           <w:noProof/>
         </w:rPr>
       </w:pPr>
-      <w:hyperlink w:anchor="_Toc200619034" w:history="1">
+      <w:hyperlink w:anchor="_Toc208147376" w:history="1">
         <w:r>
           <w:rPr>
             <w:rStyle w:val="Hyperlink"/>
@@ -5211,7 +5050,7 @@
             <w:noProof/>
             <w:webHidden/>
           </w:rPr>
-          <w:instrText xml:space="preserve"> PAGEREF _Toc200619034 \h </w:instrText>
+          <w:instrText xml:space="preserve"> PAGEREF _Toc208147376 \h </w:instrText>
         </w:r>
         <w:r>
           <w:rPr>
@@ -5234,7 +5073,7 @@
             <w:noProof/>
             <w:webHidden/>
           </w:rPr>
-          <w:t>19</w:t>
+          <w:t>28</w:t>
         </w:r>
         <w:r>
           <w:rPr>
@@ -5257,7 +5096,7 @@
           <w:noProof/>
         </w:rPr>
       </w:pPr>
-      <w:hyperlink w:anchor="_Toc200619035" w:history="1">
+      <w:hyperlink w:anchor="_Toc208147377" w:history="1">
         <w:r>
           <w:rPr>
             <w:rStyle w:val="Hyperlink"/>
@@ -5288,7 +5127,7 @@
             <w:noProof/>
             <w:webHidden/>
           </w:rPr>
-          <w:instrText xml:space="preserve"> PAGEREF _Toc200619035 \h </w:instrText>
+          <w:instrText xml:space="preserve"> PAGEREF _Toc208147377 \h </w:instrText>
         </w:r>
         <w:r>
           <w:rPr>
@@ -5311,7 +5150,7 @@
             <w:noProof/>
             <w:webHidden/>
           </w:rPr>
-          <w:t>19</w:t>
+          <w:t>30</w:t>
         </w:r>
         <w:r>
           <w:rPr>
@@ -5334,7 +5173,7 @@
           <w:noProof/>
         </w:rPr>
       </w:pPr>
-      <w:hyperlink w:anchor="_Toc200619036" w:history="1">
+      <w:hyperlink w:anchor="_Toc208147378" w:history="1">
         <w:r>
           <w:rPr>
             <w:rStyle w:val="Hyperlink"/>
@@ -5365,7 +5204,7 @@
             <w:noProof/>
             <w:webHidden/>
           </w:rPr>
-          <w:instrText xml:space="preserve"> PAGEREF _Toc200619036 \h </w:instrText>
+          <w:instrText xml:space="preserve"> PAGEREF _Toc208147378 \h </w:instrText>
         </w:r>
         <w:r>
           <w:rPr>
@@ -5388,7 +5227,7 @@
             <w:noProof/>
             <w:webHidden/>
           </w:rPr>
-          <w:t>20</w:t>
+          <w:t>31</w:t>
         </w:r>
         <w:r>
           <w:rPr>
@@ -5411,14 +5250,14 @@
           <w:noProof/>
         </w:rPr>
       </w:pPr>
-      <w:hyperlink w:anchor="_Toc200619037" w:history="1">
+      <w:hyperlink w:anchor="_Toc208147379" w:history="1">
         <w:r>
           <w:rPr>
             <w:rStyle w:val="Hyperlink"/>
             <w:rFonts w:ascii="Times New Roman" w:hAnsi="Times New Roman" w:cs="Times New Roman"/>
             <w:noProof/>
           </w:rPr>
-          <w:t>Gambar 3. 20 distribusi usia mahasiswa baru</w:t>
+          <w:t>Gambar 3. 20 distribusi usia</w:t>
         </w:r>
         <w:r>
           <w:rPr>
@@ -5442,7 +5281,7 @@
             <w:noProof/>
             <w:webHidden/>
           </w:rPr>
-          <w:instrText xml:space="preserve"> PAGEREF _Toc200619037 \h </w:instrText>
+          <w:instrText xml:space="preserve"> PAGEREF _Toc208147379 \h </w:instrText>
         </w:r>
         <w:r>
           <w:rPr>
@@ -5465,7 +5304,7 @@
             <w:noProof/>
             <w:webHidden/>
           </w:rPr>
-          <w:t>20</w:t>
+          <w:t>32</w:t>
         </w:r>
         <w:r>
           <w:rPr>
@@ -5488,7 +5327,7 @@
           <w:noProof/>
         </w:rPr>
       </w:pPr>
-      <w:hyperlink w:anchor="_Toc200619038" w:history="1">
+      <w:hyperlink w:anchor="_Toc208147380" w:history="1">
         <w:r>
           <w:rPr>
             <w:rStyle w:val="Hyperlink"/>
@@ -5519,7 +5358,7 @@
             <w:noProof/>
             <w:webHidden/>
           </w:rPr>
-          <w:instrText xml:space="preserve"> PAGEREF _Toc200619038 \h </w:instrText>
+          <w:instrText xml:space="preserve"> PAGEREF _Toc208147380 \h </w:instrText>
         </w:r>
         <w:r>
           <w:rPr>
@@ -5542,7 +5381,7 @@
             <w:noProof/>
             <w:webHidden/>
           </w:rPr>
-          <w:t>20</w:t>
+          <w:t>33</w:t>
         </w:r>
         <w:r>
           <w:rPr>
@@ -5565,7 +5404,7 @@
           <w:noProof/>
         </w:rPr>
       </w:pPr>
-      <w:hyperlink w:anchor="_Toc200619039" w:history="1">
+      <w:hyperlink w:anchor="_Toc208147381" w:history="1">
         <w:r>
           <w:rPr>
             <w:rStyle w:val="Hyperlink"/>
@@ -5596,7 +5435,7 @@
             <w:noProof/>
             <w:webHidden/>
           </w:rPr>
-          <w:instrText xml:space="preserve"> PAGEREF _Toc200619039 \h </w:instrText>
+          <w:instrText xml:space="preserve"> PAGEREF _Toc208147381 \h </w:instrText>
         </w:r>
         <w:r>
           <w:rPr>
@@ -5619,7 +5458,7 @@
             <w:noProof/>
             <w:webHidden/>
           </w:rPr>
-          <w:t>21</w:t>
+          <w:t>34</w:t>
         </w:r>
         <w:r>
           <w:rPr>
@@ -5642,7 +5481,7 @@
           <w:noProof/>
         </w:rPr>
       </w:pPr>
-      <w:hyperlink w:anchor="_Toc200619040" w:history="1">
+      <w:hyperlink w:anchor="_Toc208147382" w:history="1">
         <w:r>
           <w:rPr>
             <w:rStyle w:val="Hyperlink"/>
@@ -5673,7 +5512,7 @@
             <w:noProof/>
             <w:webHidden/>
           </w:rPr>
-          <w:instrText xml:space="preserve"> PAGEREF _Toc200619040 \h </w:instrText>
+          <w:instrText xml:space="preserve"> PAGEREF _Toc208147382 \h </w:instrText>
         </w:r>
         <w:r>
           <w:rPr>
@@ -5696,7 +5535,7 @@
             <w:noProof/>
             <w:webHidden/>
           </w:rPr>
-          <w:t>21</w:t>
+          <w:t>35</w:t>
         </w:r>
         <w:r>
           <w:rPr>
@@ -5719,7 +5558,7 @@
           <w:noProof/>
         </w:rPr>
       </w:pPr>
-      <w:hyperlink w:anchor="_Toc200619041" w:history="1">
+      <w:hyperlink w:anchor="_Toc208147383" w:history="1">
         <w:r>
           <w:rPr>
             <w:rStyle w:val="Hyperlink"/>
@@ -5750,7 +5589,7 @@
             <w:noProof/>
             <w:webHidden/>
           </w:rPr>
-          <w:instrText xml:space="preserve"> PAGEREF _Toc200619041 \h </w:instrText>
+          <w:instrText xml:space="preserve"> PAGEREF _Toc208147383 \h </w:instrText>
         </w:r>
         <w:r>
           <w:rPr>
@@ -5773,7 +5612,7 @@
             <w:noProof/>
             <w:webHidden/>
           </w:rPr>
-          <w:t>22</w:t>
+          <w:t>36</w:t>
         </w:r>
         <w:r>
           <w:rPr>
@@ -5796,7 +5635,7 @@
           <w:noProof/>
         </w:rPr>
       </w:pPr>
-      <w:hyperlink w:anchor="_Toc200619042" w:history="1">
+      <w:hyperlink w:anchor="_Toc208147384" w:history="1">
         <w:r>
           <w:rPr>
             <w:rStyle w:val="Hyperlink"/>
@@ -5827,7 +5666,7 @@
             <w:noProof/>
             <w:webHidden/>
           </w:rPr>
-          <w:instrText xml:space="preserve"> PAGEREF _Toc200619042 \h </w:instrText>
+          <w:instrText xml:space="preserve"> PAGEREF _Toc208147384 \h </w:instrText>
         </w:r>
         <w:r>
           <w:rPr>
@@ -5850,7 +5689,7 @@
             <w:noProof/>
             <w:webHidden/>
           </w:rPr>
-          <w:t>23</w:t>
+          <w:t>38</w:t>
         </w:r>
         <w:r>
           <w:rPr>
@@ -5873,7 +5712,7 @@
           <w:noProof/>
         </w:rPr>
       </w:pPr>
-      <w:hyperlink w:anchor="_Toc200619043" w:history="1">
+      <w:hyperlink w:anchor="_Toc208147385" w:history="1">
         <w:r>
           <w:rPr>
             <w:rStyle w:val="Hyperlink"/>
@@ -5904,7 +5743,7 @@
             <w:noProof/>
             <w:webHidden/>
           </w:rPr>
-          <w:instrText xml:space="preserve"> PAGEREF _Toc200619043 \h </w:instrText>
+          <w:instrText xml:space="preserve"> PAGEREF _Toc208147385 \h </w:instrText>
         </w:r>
         <w:r>
           <w:rPr>
@@ -5927,7 +5766,7 @@
             <w:noProof/>
             <w:webHidden/>
           </w:rPr>
-          <w:t>24</w:t>
+          <w:t>39</w:t>
         </w:r>
         <w:r>
           <w:rPr>
@@ -5950,7 +5789,7 @@
           <w:noProof/>
         </w:rPr>
       </w:pPr>
-      <w:hyperlink w:anchor="_Toc200619044" w:history="1">
+      <w:hyperlink w:anchor="_Toc208147386" w:history="1">
         <w:r>
           <w:rPr>
             <w:rStyle w:val="Hyperlink"/>
@@ -5981,7 +5820,7 @@
             <w:noProof/>
             <w:webHidden/>
           </w:rPr>
-          <w:instrText xml:space="preserve"> PAGEREF _Toc200619044 \h </w:instrText>
+          <w:instrText xml:space="preserve"> PAGEREF _Toc208147386 \h </w:instrText>
         </w:r>
         <w:r>
           <w:rPr>
@@ -6004,7 +5843,7 @@
             <w:noProof/>
             <w:webHidden/>
           </w:rPr>
-          <w:t>25</w:t>
+          <w:t>40</w:t>
         </w:r>
         <w:r>
           <w:rPr>
@@ -6027,7 +5866,7 @@
           <w:noProof/>
         </w:rPr>
       </w:pPr>
-      <w:hyperlink w:anchor="_Toc200619045" w:history="1">
+      <w:hyperlink w:anchor="_Toc208147387" w:history="1">
         <w:r>
           <w:rPr>
             <w:rStyle w:val="Hyperlink"/>
@@ -6058,7 +5897,7 @@
             <w:noProof/>
             <w:webHidden/>
           </w:rPr>
-          <w:instrText xml:space="preserve"> PAGEREF _Toc200619045 \h </w:instrText>
+          <w:instrText xml:space="preserve"> PAGEREF _Toc208147387 \h </w:instrText>
         </w:r>
         <w:r>
           <w:rPr>
@@ -6081,7 +5920,7 @@
             <w:noProof/>
             <w:webHidden/>
           </w:rPr>
-          <w:t>25</w:t>
+          <w:t>40</w:t>
         </w:r>
         <w:r>
           <w:rPr>
@@ -6104,14 +5943,14 @@
           <w:noProof/>
         </w:rPr>
       </w:pPr>
-      <w:hyperlink w:anchor="_Toc200619046" w:history="1">
+      <w:hyperlink w:anchor="_Toc208147388" w:history="1">
         <w:r>
           <w:rPr>
             <w:rStyle w:val="Hyperlink"/>
             <w:rFonts w:ascii="Times New Roman" w:hAnsi="Times New Roman" w:cs="Times New Roman"/>
             <w:noProof/>
           </w:rPr>
-          <w:t>Gambar 3. 29 validasi ulang distribusi usia</w:t>
+          <w:t>Gambar 3. 29 validasi ulang prodi pilihan 1</w:t>
         </w:r>
         <w:r>
           <w:rPr>
@@ -6135,7 +5974,7 @@
             <w:noProof/>
             <w:webHidden/>
           </w:rPr>
-          <w:instrText xml:space="preserve"> PAGEREF _Toc200619046 \h </w:instrText>
+          <w:instrText xml:space="preserve"> PAGEREF _Toc208147388 \h </w:instrText>
         </w:r>
         <w:r>
           <w:rPr>
@@ -6158,7 +5997,7 @@
             <w:noProof/>
             <w:webHidden/>
           </w:rPr>
-          <w:t>26</w:t>
+          <w:t>41</w:t>
         </w:r>
         <w:r>
           <w:rPr>
@@ -6181,14 +6020,14 @@
           <w:noProof/>
         </w:rPr>
       </w:pPr>
-      <w:hyperlink w:anchor="_Toc200619047" w:history="1">
+      <w:hyperlink w:anchor="_Toc208147389" w:history="1">
         <w:r>
           <w:rPr>
             <w:rStyle w:val="Hyperlink"/>
             <w:rFonts w:ascii="Times New Roman" w:hAnsi="Times New Roman" w:cs="Times New Roman"/>
             <w:noProof/>
           </w:rPr>
-          <w:t>Gambar 3. 30 validasi ulang fakultas prodi diterima</w:t>
+          <w:t>Gambar 3. 30 validasi ulang fakultas prodi pilihan 1</w:t>
         </w:r>
         <w:r>
           <w:rPr>
@@ -6212,7 +6051,7 @@
             <w:noProof/>
             <w:webHidden/>
           </w:rPr>
-          <w:instrText xml:space="preserve"> PAGEREF _Toc200619047 \h </w:instrText>
+          <w:instrText xml:space="preserve"> PAGEREF _Toc208147389 \h </w:instrText>
         </w:r>
         <w:r>
           <w:rPr>
@@ -6235,7 +6074,7 @@
             <w:noProof/>
             <w:webHidden/>
           </w:rPr>
-          <w:t>26</w:t>
+          <w:t>42</w:t>
         </w:r>
         <w:r>
           <w:rPr>
@@ -6258,14 +6097,14 @@
           <w:noProof/>
         </w:rPr>
       </w:pPr>
-      <w:hyperlink w:anchor="_Toc200619048" w:history="1">
+      <w:hyperlink w:anchor="_Toc208147390" w:history="1">
         <w:r>
           <w:rPr>
             <w:rStyle w:val="Hyperlink"/>
             <w:rFonts w:ascii="Times New Roman" w:hAnsi="Times New Roman" w:cs="Times New Roman"/>
             <w:noProof/>
           </w:rPr>
-          <w:t>Gambar 3. 31 validasi ulang distribusi fakultas prodi 1</w:t>
+          <w:t>Gambar 3. 31 validasi ulang prodi pilihan 2</w:t>
         </w:r>
         <w:r>
           <w:rPr>
@@ -6289,7 +6128,7 @@
             <w:noProof/>
             <w:webHidden/>
           </w:rPr>
-          <w:instrText xml:space="preserve"> PAGEREF _Toc200619048 \h </w:instrText>
+          <w:instrText xml:space="preserve"> PAGEREF _Toc208147390 \h </w:instrText>
         </w:r>
         <w:r>
           <w:rPr>
@@ -6312,7 +6151,7 @@
             <w:noProof/>
             <w:webHidden/>
           </w:rPr>
-          <w:t>26</w:t>
+          <w:t>44</w:t>
         </w:r>
         <w:r>
           <w:rPr>
@@ -6335,14 +6174,14 @@
           <w:noProof/>
         </w:rPr>
       </w:pPr>
-      <w:hyperlink w:anchor="_Toc200619049" w:history="1">
+      <w:hyperlink w:anchor="_Toc208147391" w:history="1">
         <w:r>
           <w:rPr>
             <w:rStyle w:val="Hyperlink"/>
             <w:rFonts w:ascii="Times New Roman" w:hAnsi="Times New Roman" w:cs="Times New Roman"/>
             <w:noProof/>
           </w:rPr>
-          <w:t>Gambar 3. 32 validasi ulang distribusi prodi diterima</w:t>
+          <w:t>Gambar 3. 32 validasi ulang fakultas prodi pilihan 2</w:t>
         </w:r>
         <w:r>
           <w:rPr>
@@ -6366,7 +6205,7 @@
             <w:noProof/>
             <w:webHidden/>
           </w:rPr>
-          <w:instrText xml:space="preserve"> PAGEREF _Toc200619049 \h </w:instrText>
+          <w:instrText xml:space="preserve"> PAGEREF _Toc208147391 \h </w:instrText>
         </w:r>
         <w:r>
           <w:rPr>
@@ -6389,7 +6228,7 @@
             <w:noProof/>
             <w:webHidden/>
           </w:rPr>
-          <w:t>27</w:t>
+          <w:t>45</w:t>
         </w:r>
         <w:r>
           <w:rPr>
@@ -6412,14 +6251,14 @@
           <w:noProof/>
         </w:rPr>
       </w:pPr>
-      <w:hyperlink w:anchor="_Toc200619050" w:history="1">
+      <w:hyperlink w:anchor="_Toc208147392" w:history="1">
         <w:r>
           <w:rPr>
             <w:rStyle w:val="Hyperlink"/>
             <w:rFonts w:ascii="Times New Roman" w:hAnsi="Times New Roman" w:cs="Times New Roman"/>
             <w:noProof/>
           </w:rPr>
-          <w:t>Gambar 3. 33 validasi ulang distribusi prodi pilihan 1</w:t>
+          <w:t>Gambar 3. 33 validasi ulang distribusi prodi diterima</w:t>
         </w:r>
         <w:r>
           <w:rPr>
@@ -6443,7 +6282,7 @@
             <w:noProof/>
             <w:webHidden/>
           </w:rPr>
-          <w:instrText xml:space="preserve"> PAGEREF _Toc200619050 \h </w:instrText>
+          <w:instrText xml:space="preserve"> PAGEREF _Toc208147392 \h </w:instrText>
         </w:r>
         <w:r>
           <w:rPr>
@@ -6466,7 +6305,7 @@
             <w:noProof/>
             <w:webHidden/>
           </w:rPr>
-          <w:t>28</w:t>
+          <w:t>47</w:t>
         </w:r>
         <w:r>
           <w:rPr>
@@ -6489,14 +6328,14 @@
           <w:noProof/>
         </w:rPr>
       </w:pPr>
-      <w:hyperlink w:anchor="_Toc200619051" w:history="1">
+      <w:hyperlink w:anchor="_Toc208147393" w:history="1">
         <w:r>
           <w:rPr>
             <w:rStyle w:val="Hyperlink"/>
             <w:rFonts w:ascii="Times New Roman" w:hAnsi="Times New Roman" w:cs="Times New Roman"/>
             <w:noProof/>
           </w:rPr>
-          <w:t>Gambar 3. 34 validasi ulang prodi pilihan 2</w:t>
+          <w:t>Gambar 3. 34 validasi ulang fakultas prodi diterima</w:t>
         </w:r>
         <w:r>
           <w:rPr>
@@ -6520,7 +6359,7 @@
             <w:noProof/>
             <w:webHidden/>
           </w:rPr>
-          <w:instrText xml:space="preserve"> PAGEREF _Toc200619051 \h </w:instrText>
+          <w:instrText xml:space="preserve"> PAGEREF _Toc208147393 \h </w:instrText>
         </w:r>
         <w:r>
           <w:rPr>
@@ -6543,7 +6382,7 @@
             <w:noProof/>
             <w:webHidden/>
           </w:rPr>
-          <w:t>28</w:t>
+          <w:t>48</w:t>
         </w:r>
         <w:r>
           <w:rPr>
@@ -6566,14 +6405,14 @@
           <w:noProof/>
         </w:rPr>
       </w:pPr>
-      <w:hyperlink w:anchor="_Toc200619052" w:history="1">
+      <w:hyperlink w:anchor="_Toc208147394" w:history="1">
         <w:r>
           <w:rPr>
             <w:rStyle w:val="Hyperlink"/>
             <w:rFonts w:ascii="Times New Roman" w:hAnsi="Times New Roman" w:cs="Times New Roman"/>
             <w:noProof/>
           </w:rPr>
-          <w:t>Gambar 3. 35 sintaks pembuatan kolom Kabupaten/Kota</w:t>
+          <w:t>Gambar 3. 35 validasi ulang usia</w:t>
         </w:r>
         <w:r>
           <w:rPr>
@@ -6597,7 +6436,7 @@
             <w:noProof/>
             <w:webHidden/>
           </w:rPr>
-          <w:instrText xml:space="preserve"> PAGEREF _Toc200619052 \h </w:instrText>
+          <w:instrText xml:space="preserve"> PAGEREF _Toc208147394 \h </w:instrText>
         </w:r>
         <w:r>
           <w:rPr>
@@ -6620,7 +6459,7 @@
             <w:noProof/>
             <w:webHidden/>
           </w:rPr>
-          <w:t>29</w:t>
+          <w:t>50</w:t>
         </w:r>
         <w:r>
           <w:rPr>
@@ -6643,14 +6482,14 @@
           <w:noProof/>
         </w:rPr>
       </w:pPr>
-      <w:hyperlink w:anchor="_Toc200619053" w:history="1">
+      <w:hyperlink w:anchor="_Toc208147395" w:history="1">
         <w:r>
           <w:rPr>
             <w:rStyle w:val="Hyperlink"/>
             <w:rFonts w:ascii="Times New Roman" w:hAnsi="Times New Roman" w:cs="Times New Roman"/>
             <w:noProof/>
           </w:rPr>
-          <w:t>Gambar 3. 36 sintaks pembuatan kolom Provinsi</w:t>
+          <w:t>Gambar 3. 36 sintaks pembuatan kolom Kabupaten/Kota</w:t>
         </w:r>
         <w:r>
           <w:rPr>
@@ -6674,7 +6513,7 @@
             <w:noProof/>
             <w:webHidden/>
           </w:rPr>
-          <w:instrText xml:space="preserve"> PAGEREF _Toc200619053 \h </w:instrText>
+          <w:instrText xml:space="preserve"> PAGEREF _Toc208147395 \h </w:instrText>
         </w:r>
         <w:r>
           <w:rPr>
@@ -6697,7 +6536,7 @@
             <w:noProof/>
             <w:webHidden/>
           </w:rPr>
-          <w:t>29</w:t>
+          <w:t>51</w:t>
         </w:r>
         <w:r>
           <w:rPr>
@@ -6720,14 +6559,14 @@
           <w:noProof/>
         </w:rPr>
       </w:pPr>
-      <w:hyperlink w:anchor="_Toc200619054" w:history="1">
+      <w:hyperlink w:anchor="_Toc208147396" w:history="1">
         <w:r>
           <w:rPr>
             <w:rStyle w:val="Hyperlink"/>
             <w:rFonts w:ascii="Times New Roman" w:hAnsi="Times New Roman" w:cs="Times New Roman"/>
             <w:noProof/>
           </w:rPr>
-          <w:t>Gambar 3. 37 contoh hasil pembuatan kolom baru</w:t>
+          <w:t>Gambar 3. 37 sintaks pembuatan kolom Provinsi</w:t>
         </w:r>
         <w:r>
           <w:rPr>
@@ -6751,7 +6590,7 @@
             <w:noProof/>
             <w:webHidden/>
           </w:rPr>
-          <w:instrText xml:space="preserve"> PAGEREF _Toc200619054 \h </w:instrText>
+          <w:instrText xml:space="preserve"> PAGEREF _Toc208147396 \h </w:instrText>
         </w:r>
         <w:r>
           <w:rPr>
@@ -6774,7 +6613,7 @@
             <w:noProof/>
             <w:webHidden/>
           </w:rPr>
-          <w:t>30</w:t>
+          <w:t>51</w:t>
         </w:r>
         <w:r>
           <w:rPr>
@@ -6797,14 +6636,14 @@
           <w:noProof/>
         </w:rPr>
       </w:pPr>
-      <w:hyperlink w:anchor="_Toc200619055" w:history="1">
+      <w:hyperlink w:anchor="_Toc208147397" w:history="1">
         <w:r>
           <w:rPr>
             <w:rStyle w:val="Hyperlink"/>
             <w:rFonts w:ascii="Times New Roman" w:hAnsi="Times New Roman" w:cs="Times New Roman"/>
             <w:noProof/>
           </w:rPr>
-          <w:t>Gambar 3. 38 dashboard overview</w:t>
+          <w:t>Gambar 3. 38 contoh hasil pembuatan kolom baru</w:t>
         </w:r>
         <w:r>
           <w:rPr>
@@ -6828,7 +6667,7 @@
             <w:noProof/>
             <w:webHidden/>
           </w:rPr>
-          <w:instrText xml:space="preserve"> PAGEREF _Toc200619055 \h </w:instrText>
+          <w:instrText xml:space="preserve"> PAGEREF _Toc208147397 \h </w:instrText>
         </w:r>
         <w:r>
           <w:rPr>
@@ -6851,7 +6690,7 @@
             <w:noProof/>
             <w:webHidden/>
           </w:rPr>
-          <w:t>32</w:t>
+          <w:t>52</w:t>
         </w:r>
         <w:r>
           <w:rPr>
@@ -6874,14 +6713,14 @@
           <w:noProof/>
         </w:rPr>
       </w:pPr>
-      <w:hyperlink w:anchor="_Toc200619056" w:history="1">
+      <w:hyperlink w:anchor="_Toc208147398" w:history="1">
         <w:r>
           <w:rPr>
             <w:rStyle w:val="Hyperlink"/>
             <w:rFonts w:ascii="Times New Roman" w:hAnsi="Times New Roman" w:cs="Times New Roman"/>
             <w:noProof/>
           </w:rPr>
-          <w:t>Gambar 3. 39 dashboard demografi</w:t>
+          <w:t>Gambar 3. 39 dashboard overview</w:t>
         </w:r>
         <w:r>
           <w:rPr>
@@ -6905,7 +6744,7 @@
             <w:noProof/>
             <w:webHidden/>
           </w:rPr>
-          <w:instrText xml:space="preserve"> PAGEREF _Toc200619056 \h </w:instrText>
+          <w:instrText xml:space="preserve"> PAGEREF _Toc208147398 \h </w:instrText>
         </w:r>
         <w:r>
           <w:rPr>
@@ -6928,7 +6767,7 @@
             <w:noProof/>
             <w:webHidden/>
           </w:rPr>
-          <w:t>33</w:t>
+          <w:t>55</w:t>
         </w:r>
         <w:r>
           <w:rPr>
@@ -6951,14 +6790,14 @@
           <w:noProof/>
         </w:rPr>
       </w:pPr>
-      <w:hyperlink w:anchor="_Toc200619057" w:history="1">
+      <w:hyperlink w:anchor="_Toc208147399" w:history="1">
         <w:r>
           <w:rPr>
             <w:rStyle w:val="Hyperlink"/>
             <w:rFonts w:ascii="Times New Roman" w:hAnsi="Times New Roman" w:cs="Times New Roman"/>
             <w:noProof/>
           </w:rPr>
-          <w:t>Gambar 3. 40 bar navigasi halaman utama</w:t>
+          <w:t>Gambar 3. 40 dashboard demografi</w:t>
         </w:r>
         <w:r>
           <w:rPr>
@@ -6982,7 +6821,7 @@
             <w:noProof/>
             <w:webHidden/>
           </w:rPr>
-          <w:instrText xml:space="preserve"> PAGEREF _Toc200619057 \h </w:instrText>
+          <w:instrText xml:space="preserve"> PAGEREF _Toc208147399 \h </w:instrText>
         </w:r>
         <w:r>
           <w:rPr>
@@ -7005,7 +6844,7 @@
             <w:noProof/>
             <w:webHidden/>
           </w:rPr>
-          <w:t>35</w:t>
+          <w:t>57</w:t>
         </w:r>
         <w:r>
           <w:rPr>
@@ -7028,14 +6867,14 @@
           <w:noProof/>
         </w:rPr>
       </w:pPr>
-      <w:hyperlink w:anchor="_Toc200619058" w:history="1">
+      <w:hyperlink w:anchor="_Toc208147400" w:history="1">
         <w:r>
           <w:rPr>
             <w:rStyle w:val="Hyperlink"/>
             <w:rFonts w:ascii="Times New Roman" w:hAnsi="Times New Roman" w:cs="Times New Roman"/>
             <w:noProof/>
           </w:rPr>
-          <w:t>Gambar 3. 41 judul proyek pada halaman utama</w:t>
+          <w:t>Gambar 3. 41 demo penggunaan dashboard overall</w:t>
         </w:r>
         <w:r>
           <w:rPr>
@@ -7059,7 +6898,7 @@
             <w:noProof/>
             <w:webHidden/>
           </w:rPr>
-          <w:instrText xml:space="preserve"> PAGEREF _Toc200619058 \h </w:instrText>
+          <w:instrText xml:space="preserve"> PAGEREF _Toc208147400 \h </w:instrText>
         </w:r>
         <w:r>
           <w:rPr>
@@ -7082,7 +6921,7 @@
             <w:noProof/>
             <w:webHidden/>
           </w:rPr>
-          <w:t>35</w:t>
+          <w:t>61</w:t>
         </w:r>
         <w:r>
           <w:rPr>
@@ -7105,14 +6944,14 @@
           <w:noProof/>
         </w:rPr>
       </w:pPr>
-      <w:hyperlink w:anchor="_Toc200619059" w:history="1">
+      <w:hyperlink w:anchor="_Toc208147401" w:history="1">
         <w:r>
           <w:rPr>
             <w:rStyle w:val="Hyperlink"/>
             <w:rFonts w:ascii="Times New Roman" w:hAnsi="Times New Roman" w:cs="Times New Roman"/>
             <w:noProof/>
           </w:rPr>
-          <w:t>Gambar 3. 42 permasalahan, tujuan, dan manfaat pada halaman utama</w:t>
+          <w:t>Gambar 3. 42 demo penggunaan dashboard demografi</w:t>
         </w:r>
         <w:r>
           <w:rPr>
@@ -7136,7 +6975,7 @@
             <w:noProof/>
             <w:webHidden/>
           </w:rPr>
-          <w:instrText xml:space="preserve"> PAGEREF _Toc200619059 \h </w:instrText>
+          <w:instrText xml:space="preserve"> PAGEREF _Toc208147401 \h </w:instrText>
         </w:r>
         <w:r>
           <w:rPr>
@@ -7159,7 +6998,7 @@
             <w:noProof/>
             <w:webHidden/>
           </w:rPr>
-          <w:t>36</w:t>
+          <w:t>64</w:t>
         </w:r>
         <w:r>
           <w:rPr>
@@ -7182,14 +7021,14 @@
           <w:noProof/>
         </w:rPr>
       </w:pPr>
-      <w:hyperlink w:anchor="_Toc200619060" w:history="1">
+      <w:hyperlink w:anchor="_Toc208147402" w:history="1">
         <w:r>
           <w:rPr>
             <w:rStyle w:val="Hyperlink"/>
             <w:rFonts w:ascii="Times New Roman" w:hAnsi="Times New Roman" w:cs="Times New Roman"/>
             <w:noProof/>
           </w:rPr>
-          <w:t>Gambar 3. 43 data pipeline pada halaman utama</w:t>
+          <w:t>Gambar 3. 43 bar navigasi halaman utama</w:t>
         </w:r>
         <w:r>
           <w:rPr>
@@ -7213,7 +7052,7 @@
             <w:noProof/>
             <w:webHidden/>
           </w:rPr>
-          <w:instrText xml:space="preserve"> PAGEREF _Toc200619060 \h </w:instrText>
+          <w:instrText xml:space="preserve"> PAGEREF _Toc208147402 \h </w:instrText>
         </w:r>
         <w:r>
           <w:rPr>
@@ -7236,7 +7075,7 @@
             <w:noProof/>
             <w:webHidden/>
           </w:rPr>
-          <w:t>36</w:t>
+          <w:t>69</w:t>
         </w:r>
         <w:r>
           <w:rPr>
@@ -7259,14 +7098,14 @@
           <w:noProof/>
         </w:rPr>
       </w:pPr>
-      <w:hyperlink w:anchor="_Toc200619061" w:history="1">
+      <w:hyperlink w:anchor="_Toc208147403" w:history="1">
         <w:r>
           <w:rPr>
             <w:rStyle w:val="Hyperlink"/>
             <w:rFonts w:ascii="Times New Roman" w:hAnsi="Times New Roman" w:cs="Times New Roman"/>
             <w:noProof/>
           </w:rPr>
-          <w:t>Gambar 3. 44 funfact pada halaman utama</w:t>
+          <w:t>Gambar 3. 44 judul proyek pada halaman utama</w:t>
         </w:r>
         <w:r>
           <w:rPr>
@@ -7290,7 +7129,7 @@
             <w:noProof/>
             <w:webHidden/>
           </w:rPr>
-          <w:instrText xml:space="preserve"> PAGEREF _Toc200619061 \h </w:instrText>
+          <w:instrText xml:space="preserve"> PAGEREF _Toc208147403 \h </w:instrText>
         </w:r>
         <w:r>
           <w:rPr>
@@ -7313,7 +7152,7 @@
             <w:noProof/>
             <w:webHidden/>
           </w:rPr>
-          <w:t>37</w:t>
+          <w:t>70</w:t>
         </w:r>
         <w:r>
           <w:rPr>
@@ -7336,14 +7175,14 @@
           <w:noProof/>
         </w:rPr>
       </w:pPr>
-      <w:hyperlink w:anchor="_Toc200619062" w:history="1">
+      <w:hyperlink w:anchor="_Toc208147404" w:history="1">
         <w:r>
           <w:rPr>
             <w:rStyle w:val="Hyperlink"/>
             <w:rFonts w:ascii="Times New Roman" w:hAnsi="Times New Roman" w:cs="Times New Roman"/>
             <w:noProof/>
           </w:rPr>
-          <w:t>Gambar 3. 45 brainstorming dashboard pada halaman utama</w:t>
+          <w:t>Gambar 3. 45 permasalahan, tujuan, dan manfaat pada halaman utama</w:t>
         </w:r>
         <w:r>
           <w:rPr>
@@ -7367,7 +7206,7 @@
             <w:noProof/>
             <w:webHidden/>
           </w:rPr>
-          <w:instrText xml:space="preserve"> PAGEREF _Toc200619062 \h </w:instrText>
+          <w:instrText xml:space="preserve"> PAGEREF _Toc208147404 \h </w:instrText>
         </w:r>
         <w:r>
           <w:rPr>
@@ -7390,7 +7229,7 @@
             <w:noProof/>
             <w:webHidden/>
           </w:rPr>
-          <w:t>37</w:t>
+          <w:t>71</w:t>
         </w:r>
         <w:r>
           <w:rPr>
@@ -7413,14 +7252,14 @@
           <w:noProof/>
         </w:rPr>
       </w:pPr>
-      <w:hyperlink w:anchor="_Toc200619063" w:history="1">
+      <w:hyperlink w:anchor="_Toc208147405" w:history="1">
         <w:r>
           <w:rPr>
             <w:rStyle w:val="Hyperlink"/>
             <w:rFonts w:ascii="Times New Roman" w:hAnsi="Times New Roman" w:cs="Times New Roman"/>
             <w:noProof/>
           </w:rPr>
-          <w:t>Gambar 3. 46 ucapan terimakasih pada halaman utama</w:t>
+          <w:t>Gambar 3. 46 data pipeline pada halaman utama</w:t>
         </w:r>
         <w:r>
           <w:rPr>
@@ -7444,7 +7283,7 @@
             <w:noProof/>
             <w:webHidden/>
           </w:rPr>
-          <w:instrText xml:space="preserve"> PAGEREF _Toc200619063 \h </w:instrText>
+          <w:instrText xml:space="preserve"> PAGEREF _Toc208147405 \h </w:instrText>
         </w:r>
         <w:r>
           <w:rPr>
@@ -7467,7 +7306,7 @@
             <w:noProof/>
             <w:webHidden/>
           </w:rPr>
-          <w:t>38</w:t>
+          <w:t>72</w:t>
         </w:r>
         <w:r>
           <w:rPr>
@@ -7490,14 +7329,14 @@
           <w:noProof/>
         </w:rPr>
       </w:pPr>
-      <w:hyperlink w:anchor="_Toc200619064" w:history="1">
+      <w:hyperlink w:anchor="_Toc208147406" w:history="1">
         <w:r>
           <w:rPr>
             <w:rStyle w:val="Hyperlink"/>
             <w:rFonts w:ascii="Times New Roman" w:hAnsi="Times New Roman" w:cs="Times New Roman"/>
             <w:noProof/>
           </w:rPr>
-          <w:t>Gambar 3. 47 watermark pada halaman utama</w:t>
+          <w:t>Gambar 3. 47 funfact pada halaman utama</w:t>
         </w:r>
         <w:r>
           <w:rPr>
@@ -7521,7 +7360,7 @@
             <w:noProof/>
             <w:webHidden/>
           </w:rPr>
-          <w:instrText xml:space="preserve"> PAGEREF _Toc200619064 \h </w:instrText>
+          <w:instrText xml:space="preserve"> PAGEREF _Toc208147406 \h </w:instrText>
         </w:r>
         <w:r>
           <w:rPr>
@@ -7544,7 +7383,7 @@
             <w:noProof/>
             <w:webHidden/>
           </w:rPr>
-          <w:t>38</w:t>
+          <w:t>73</w:t>
         </w:r>
         <w:r>
           <w:rPr>
@@ -7567,14 +7406,14 @@
           <w:noProof/>
         </w:rPr>
       </w:pPr>
-      <w:hyperlink w:anchor="_Toc200619065" w:history="1">
+      <w:hyperlink w:anchor="_Toc208147407" w:history="1">
         <w:r>
           <w:rPr>
             <w:rStyle w:val="Hyperlink"/>
             <w:rFonts w:ascii="Times New Roman" w:hAnsi="Times New Roman" w:cs="Times New Roman"/>
             <w:noProof/>
           </w:rPr>
-          <w:t>Gambar 3. 48 bar navigasi halaman cara membaca</w:t>
+          <w:t>Gambar 3. 48 brainstorming dashboard pada halaman utama</w:t>
         </w:r>
         <w:r>
           <w:rPr>
@@ -7598,7 +7437,7 @@
             <w:noProof/>
             <w:webHidden/>
           </w:rPr>
-          <w:instrText xml:space="preserve"> PAGEREF _Toc200619065 \h </w:instrText>
+          <w:instrText xml:space="preserve"> PAGEREF _Toc208147407 \h </w:instrText>
         </w:r>
         <w:r>
           <w:rPr>
@@ -7621,7 +7460,7 @@
             <w:noProof/>
             <w:webHidden/>
           </w:rPr>
-          <w:t>39</w:t>
+          <w:t>74</w:t>
         </w:r>
         <w:r>
           <w:rPr>
@@ -7644,14 +7483,14 @@
           <w:noProof/>
         </w:rPr>
       </w:pPr>
-      <w:hyperlink w:anchor="_Toc200619066" w:history="1">
+      <w:hyperlink w:anchor="_Toc208147408" w:history="1">
         <w:r>
           <w:rPr>
             <w:rStyle w:val="Hyperlink"/>
             <w:rFonts w:ascii="Times New Roman" w:hAnsi="Times New Roman" w:cs="Times New Roman"/>
             <w:noProof/>
           </w:rPr>
-          <w:t>Gambar 3. 49 cara membaca pada halaman cara membaca dashboard</w:t>
+          <w:t>Gambar 3. 49 ucapan terimakasih pada halaman utama</w:t>
         </w:r>
         <w:r>
           <w:rPr>
@@ -7675,7 +7514,7 @@
             <w:noProof/>
             <w:webHidden/>
           </w:rPr>
-          <w:instrText xml:space="preserve"> PAGEREF _Toc200619066 \h </w:instrText>
+          <w:instrText xml:space="preserve"> PAGEREF _Toc208147408 \h </w:instrText>
         </w:r>
         <w:r>
           <w:rPr>
@@ -7698,7 +7537,7 @@
             <w:noProof/>
             <w:webHidden/>
           </w:rPr>
-          <w:t>39</w:t>
+          <w:t>75</w:t>
         </w:r>
         <w:r>
           <w:rPr>
@@ -7721,14 +7560,14 @@
           <w:noProof/>
         </w:rPr>
       </w:pPr>
-      <w:hyperlink w:anchor="_Toc200619067" w:history="1">
+      <w:hyperlink w:anchor="_Toc208147409" w:history="1">
         <w:r>
           <w:rPr>
             <w:rStyle w:val="Hyperlink"/>
             <w:rFonts w:ascii="Times New Roman" w:hAnsi="Times New Roman" w:cs="Times New Roman"/>
             <w:noProof/>
           </w:rPr>
-          <w:t>Gambar 3. 50 watermark pada halaman cara membaca</w:t>
+          <w:t>Gambar 3. 50 watermark pada halaman utama</w:t>
         </w:r>
         <w:r>
           <w:rPr>
@@ -7752,7 +7591,7 @@
             <w:noProof/>
             <w:webHidden/>
           </w:rPr>
-          <w:instrText xml:space="preserve"> PAGEREF _Toc200619067 \h </w:instrText>
+          <w:instrText xml:space="preserve"> PAGEREF _Toc208147409 \h </w:instrText>
         </w:r>
         <w:r>
           <w:rPr>
@@ -7775,7 +7614,238 @@
             <w:noProof/>
             <w:webHidden/>
           </w:rPr>
-          <w:t>40</w:t>
+          <w:t>76</w:t>
+        </w:r>
+        <w:r>
+          <w:rPr>
+            <w:rFonts w:ascii="Times New Roman" w:hAnsi="Times New Roman" w:cs="Times New Roman"/>
+            <w:noProof/>
+            <w:webHidden/>
+          </w:rPr>
+          <w:fldChar w:fldCharType="end"/>
+        </w:r>
+      </w:hyperlink>
+    </w:p>
+    <w:p>
+      <w:pPr>
+        <w:pStyle w:val="TableofFigures"/>
+        <w:tabs>
+          <w:tab w:val="right" w:leader="dot" w:pos="7930"/>
+        </w:tabs>
+        <w:rPr>
+          <w:rFonts w:ascii="Times New Roman" w:eastAsiaTheme="minorEastAsia" w:hAnsi="Times New Roman" w:cs="Times New Roman"/>
+          <w:noProof/>
+        </w:rPr>
+      </w:pPr>
+      <w:hyperlink w:anchor="_Toc208147410" w:history="1">
+        <w:r>
+          <w:rPr>
+            <w:rStyle w:val="Hyperlink"/>
+            <w:rFonts w:ascii="Times New Roman" w:hAnsi="Times New Roman" w:cs="Times New Roman"/>
+            <w:noProof/>
+          </w:rPr>
+          <w:t>Gambar 3. 51 bar navigasi halaman cara membaca</w:t>
+        </w:r>
+        <w:r>
+          <w:rPr>
+            <w:rFonts w:ascii="Times New Roman" w:hAnsi="Times New Roman" w:cs="Times New Roman"/>
+            <w:noProof/>
+            <w:webHidden/>
+          </w:rPr>
+          <w:tab/>
+        </w:r>
+        <w:r>
+          <w:rPr>
+            <w:rFonts w:ascii="Times New Roman" w:hAnsi="Times New Roman" w:cs="Times New Roman"/>
+            <w:noProof/>
+            <w:webHidden/>
+          </w:rPr>
+          <w:fldChar w:fldCharType="begin"/>
+        </w:r>
+        <w:r>
+          <w:rPr>
+            <w:rFonts w:ascii="Times New Roman" w:hAnsi="Times New Roman" w:cs="Times New Roman"/>
+            <w:noProof/>
+            <w:webHidden/>
+          </w:rPr>
+          <w:instrText xml:space="preserve"> PAGEREF _Toc208147410 \h </w:instrText>
+        </w:r>
+        <w:r>
+          <w:rPr>
+            <w:rFonts w:ascii="Times New Roman" w:hAnsi="Times New Roman" w:cs="Times New Roman"/>
+            <w:noProof/>
+            <w:webHidden/>
+          </w:rPr>
+        </w:r>
+        <w:r>
+          <w:rPr>
+            <w:rFonts w:ascii="Times New Roman" w:hAnsi="Times New Roman" w:cs="Times New Roman"/>
+            <w:noProof/>
+            <w:webHidden/>
+          </w:rPr>
+          <w:fldChar w:fldCharType="separate"/>
+        </w:r>
+        <w:r>
+          <w:rPr>
+            <w:rFonts w:ascii="Times New Roman" w:hAnsi="Times New Roman" w:cs="Times New Roman"/>
+            <w:noProof/>
+            <w:webHidden/>
+          </w:rPr>
+          <w:t>77</w:t>
+        </w:r>
+        <w:r>
+          <w:rPr>
+            <w:rFonts w:ascii="Times New Roman" w:hAnsi="Times New Roman" w:cs="Times New Roman"/>
+            <w:noProof/>
+            <w:webHidden/>
+          </w:rPr>
+          <w:fldChar w:fldCharType="end"/>
+        </w:r>
+      </w:hyperlink>
+    </w:p>
+    <w:p>
+      <w:pPr>
+        <w:pStyle w:val="TableofFigures"/>
+        <w:tabs>
+          <w:tab w:val="right" w:leader="dot" w:pos="7930"/>
+        </w:tabs>
+        <w:rPr>
+          <w:rFonts w:ascii="Times New Roman" w:eastAsiaTheme="minorEastAsia" w:hAnsi="Times New Roman" w:cs="Times New Roman"/>
+          <w:noProof/>
+        </w:rPr>
+      </w:pPr>
+      <w:hyperlink w:anchor="_Toc208147411" w:history="1">
+        <w:r>
+          <w:rPr>
+            <w:rStyle w:val="Hyperlink"/>
+            <w:rFonts w:ascii="Times New Roman" w:hAnsi="Times New Roman" w:cs="Times New Roman"/>
+            <w:noProof/>
+          </w:rPr>
+          <w:t>Gambar 3. 52 cara membaca pada halaman cara membaca dashboard</w:t>
+        </w:r>
+        <w:r>
+          <w:rPr>
+            <w:rFonts w:ascii="Times New Roman" w:hAnsi="Times New Roman" w:cs="Times New Roman"/>
+            <w:noProof/>
+            <w:webHidden/>
+          </w:rPr>
+          <w:tab/>
+        </w:r>
+        <w:r>
+          <w:rPr>
+            <w:rFonts w:ascii="Times New Roman" w:hAnsi="Times New Roman" w:cs="Times New Roman"/>
+            <w:noProof/>
+            <w:webHidden/>
+          </w:rPr>
+          <w:fldChar w:fldCharType="begin"/>
+        </w:r>
+        <w:r>
+          <w:rPr>
+            <w:rFonts w:ascii="Times New Roman" w:hAnsi="Times New Roman" w:cs="Times New Roman"/>
+            <w:noProof/>
+            <w:webHidden/>
+          </w:rPr>
+          <w:instrText xml:space="preserve"> PAGEREF _Toc208147411 \h </w:instrText>
+        </w:r>
+        <w:r>
+          <w:rPr>
+            <w:rFonts w:ascii="Times New Roman" w:hAnsi="Times New Roman" w:cs="Times New Roman"/>
+            <w:noProof/>
+            <w:webHidden/>
+          </w:rPr>
+        </w:r>
+        <w:r>
+          <w:rPr>
+            <w:rFonts w:ascii="Times New Roman" w:hAnsi="Times New Roman" w:cs="Times New Roman"/>
+            <w:noProof/>
+            <w:webHidden/>
+          </w:rPr>
+          <w:fldChar w:fldCharType="separate"/>
+        </w:r>
+        <w:r>
+          <w:rPr>
+            <w:rFonts w:ascii="Times New Roman" w:hAnsi="Times New Roman" w:cs="Times New Roman"/>
+            <w:noProof/>
+            <w:webHidden/>
+          </w:rPr>
+          <w:t>77</w:t>
+        </w:r>
+        <w:r>
+          <w:rPr>
+            <w:rFonts w:ascii="Times New Roman" w:hAnsi="Times New Roman" w:cs="Times New Roman"/>
+            <w:noProof/>
+            <w:webHidden/>
+          </w:rPr>
+          <w:fldChar w:fldCharType="end"/>
+        </w:r>
+      </w:hyperlink>
+    </w:p>
+    <w:p>
+      <w:pPr>
+        <w:pStyle w:val="TableofFigures"/>
+        <w:tabs>
+          <w:tab w:val="right" w:leader="dot" w:pos="7930"/>
+        </w:tabs>
+        <w:rPr>
+          <w:rFonts w:ascii="Times New Roman" w:eastAsiaTheme="minorEastAsia" w:hAnsi="Times New Roman" w:cs="Times New Roman"/>
+          <w:noProof/>
+        </w:rPr>
+      </w:pPr>
+      <w:hyperlink w:anchor="_Toc208147412" w:history="1">
+        <w:r>
+          <w:rPr>
+            <w:rStyle w:val="Hyperlink"/>
+            <w:rFonts w:ascii="Times New Roman" w:hAnsi="Times New Roman" w:cs="Times New Roman"/>
+            <w:noProof/>
+          </w:rPr>
+          <w:t>Gambar 3. 53 watermark pada halaman cara membaca</w:t>
+        </w:r>
+        <w:r>
+          <w:rPr>
+            <w:rFonts w:ascii="Times New Roman" w:hAnsi="Times New Roman" w:cs="Times New Roman"/>
+            <w:noProof/>
+            <w:webHidden/>
+          </w:rPr>
+          <w:tab/>
+        </w:r>
+        <w:r>
+          <w:rPr>
+            <w:rFonts w:ascii="Times New Roman" w:hAnsi="Times New Roman" w:cs="Times New Roman"/>
+            <w:noProof/>
+            <w:webHidden/>
+          </w:rPr>
+          <w:fldChar w:fldCharType="begin"/>
+        </w:r>
+        <w:r>
+          <w:rPr>
+            <w:rFonts w:ascii="Times New Roman" w:hAnsi="Times New Roman" w:cs="Times New Roman"/>
+            <w:noProof/>
+            <w:webHidden/>
+          </w:rPr>
+          <w:instrText xml:space="preserve"> PAGEREF _Toc208147412 \h </w:instrText>
+        </w:r>
+        <w:r>
+          <w:rPr>
+            <w:rFonts w:ascii="Times New Roman" w:hAnsi="Times New Roman" w:cs="Times New Roman"/>
+            <w:noProof/>
+            <w:webHidden/>
+          </w:rPr>
+        </w:r>
+        <w:r>
+          <w:rPr>
+            <w:rFonts w:ascii="Times New Roman" w:hAnsi="Times New Roman" w:cs="Times New Roman"/>
+            <w:noProof/>
+            <w:webHidden/>
+          </w:rPr>
+          <w:fldChar w:fldCharType="separate"/>
+        </w:r>
+        <w:r>
+          <w:rPr>
+            <w:rFonts w:ascii="Times New Roman" w:hAnsi="Times New Roman" w:cs="Times New Roman"/>
+            <w:noProof/>
+            <w:webHidden/>
+          </w:rPr>
+          <w:t>78</w:t>
         </w:r>
         <w:r>
           <w:rPr>
@@ -8843,11 +8913,10 @@
           <w:rFonts w:ascii="Times New Roman" w:hAnsi="Times New Roman" w:cs="Times New Roman"/>
           <w:noProof/>
         </w:rPr>
-        <w:lastRenderedPageBreak/>
         <w:drawing>
-          <wp:inline distT="0" distB="0" distL="0" distR="0" wp14:anchorId="091CD487" wp14:editId="1AF43376">
-            <wp:extent cx="2683498" cy="6876000"/>
-            <wp:effectExtent l="0" t="0" r="3175" b="1270"/>
+          <wp:inline distT="0" distB="0" distL="0" distR="0" wp14:anchorId="091CD487" wp14:editId="1AE06545">
+            <wp:extent cx="3095625" cy="5831467"/>
+            <wp:effectExtent l="0" t="0" r="0" b="0"/>
             <wp:docPr id="426171956" name="Picture 1"/>
             <wp:cNvGraphicFramePr>
               <a:graphicFrameLocks xmlns:a="http://schemas.openxmlformats.org/drawingml/2006/main" noChangeAspect="1"/>
@@ -8874,7 +8943,7 @@
                   <pic:spPr>
                     <a:xfrm>
                       <a:off x="0" y="0"/>
-                      <a:ext cx="2683498" cy="6876000"/>
+                      <a:ext cx="3098551" cy="5836978"/>
                     </a:xfrm>
                     <a:prstGeom prst="rect">
                       <a:avLst/>
@@ -8895,7 +8964,7 @@
       </w:pPr>
       <w:bookmarkStart w:id="16" w:name="_Toc200446284"/>
       <w:bookmarkStart w:id="17" w:name="_Toc200618642"/>
-      <w:bookmarkStart w:id="18" w:name="_Toc200619004"/>
+      <w:bookmarkStart w:id="18" w:name="_Toc208147252"/>
       <w:r>
         <w:t xml:space="preserve">Gambar 1. </w:t>
       </w:r>
@@ -8927,6 +8996,7 @@
         <w:rPr>
           <w:rFonts w:ascii="Times New Roman" w:hAnsi="Times New Roman" w:cs="Times New Roman"/>
         </w:rPr>
+        <w:lastRenderedPageBreak/>
         <w:t>Adapun tahapan-tahapan pelaksanaan proyek secara umum dapat dijelaskan sebagai berikut:</w:t>
       </w:r>
     </w:p>
@@ -8947,7 +9017,6 @@
         <w:rPr>
           <w:rFonts w:ascii="Times New Roman" w:hAnsi="Times New Roman" w:cs="Times New Roman"/>
         </w:rPr>
-        <w:lastRenderedPageBreak/>
         <w:t>Mulai</w:t>
       </w:r>
     </w:p>
@@ -9243,20 +9312,14 @@
           <w:i/>
           <w:iCs/>
         </w:rPr>
+        <w:lastRenderedPageBreak/>
         <w:t>Problem Solving</w:t>
       </w:r>
       <w:r>
         <w:rPr>
           <w:rFonts w:ascii="Times New Roman" w:hAnsi="Times New Roman" w:cs="Times New Roman"/>
         </w:rPr>
-        <w:t xml:space="preserve">: Menangani masalah yang ditemukan saat validasi, seperti menghapus duplikasi, menangani data kosong menggunakan </w:t>
-      </w:r>
-      <w:r>
-        <w:rPr>
-          <w:rFonts w:ascii="Times New Roman" w:hAnsi="Times New Roman" w:cs="Times New Roman"/>
-        </w:rPr>
-        <w:lastRenderedPageBreak/>
-        <w:t>teknik imputasi, dan memperbaiki data anomali. Pada tahap ini juga ditambahkan kolom baru seperti ‘Kabupaten/Kota’ dan ‘Provinsi’.</w:t>
+        <w:t>: Menangani masalah yang ditemukan saat validasi, seperti menghapus duplikasi, menangani data kosong menggunakan teknik imputasi, dan memperbaiki data anomali. Pada tahap ini juga ditambahkan kolom baru seperti ‘Kabupaten/Kota’ dan ‘Provinsi’.</w:t>
       </w:r>
     </w:p>
     <w:p>
@@ -9677,6 +9740,7 @@
       </w:pPr>
       <w:bookmarkStart w:id="19" w:name="_Toc200619288"/>
       <w:r>
+        <w:lastRenderedPageBreak/>
         <w:t xml:space="preserve">D. </w:t>
       </w:r>
       <w:r>
@@ -9712,7 +9776,6 @@
         <w:jc w:val="center"/>
       </w:pPr>
       <w:r>
-        <w:lastRenderedPageBreak/>
         <w:t xml:space="preserve">Tabel 1. </w:t>
       </w:r>
       <w:fldSimple w:instr=" SEQ Tabel_1. \* ARABIC ">
@@ -10382,7 +10445,6 @@
               <w:bottom w:val="single" w:sz="2" w:space="0" w:color="auto"/>
               <w:right w:val="single" w:sz="2" w:space="0" w:color="auto"/>
             </w:tcBorders>
-            <w:shd w:val="clear" w:color="auto" w:fill="auto"/>
           </w:tcPr>
           <w:p>
             <w:pPr>
@@ -10522,7 +10584,6 @@
         <w:tc>
           <w:tcPr>
             <w:tcW w:w="326" w:type="dxa"/>
-            <w:shd w:val="clear" w:color="auto" w:fill="auto"/>
           </w:tcPr>
           <w:p>
             <w:pPr>
@@ -11423,7 +11484,6 @@
             <w:tcBorders>
               <w:left w:val="single" w:sz="2" w:space="0" w:color="auto"/>
             </w:tcBorders>
-            <w:shd w:val="clear" w:color="auto" w:fill="auto"/>
           </w:tcPr>
           <w:p>
             <w:pPr>
@@ -11440,7 +11500,6 @@
         <w:tc>
           <w:tcPr>
             <w:tcW w:w="326" w:type="dxa"/>
-            <w:shd w:val="clear" w:color="auto" w:fill="auto"/>
           </w:tcPr>
           <w:p>
             <w:pPr>
@@ -11457,7 +11516,6 @@
         <w:tc>
           <w:tcPr>
             <w:tcW w:w="326" w:type="dxa"/>
-            <w:shd w:val="clear" w:color="auto" w:fill="auto"/>
           </w:tcPr>
           <w:p>
             <w:pPr>
@@ -11474,7 +11532,6 @@
         <w:tc>
           <w:tcPr>
             <w:tcW w:w="326" w:type="dxa"/>
-            <w:shd w:val="clear" w:color="auto" w:fill="auto"/>
           </w:tcPr>
           <w:p>
             <w:pPr>
@@ -11741,6 +11798,7 @@
         <w:rPr>
           <w:rFonts w:ascii="Times New Roman" w:hAnsi="Times New Roman" w:cs="Times New Roman"/>
         </w:rPr>
+        <w:lastRenderedPageBreak/>
         <w:t xml:space="preserve">Representasi dilaksanakan pada minggu ke-2 hingga minggu ke-4 bulan Mei. Kegiatan ini melibatkan </w:t>
       </w:r>
       <w:r>
@@ -11769,14 +11827,7 @@
         <w:rPr>
           <w:rFonts w:ascii="Times New Roman" w:hAnsi="Times New Roman" w:cs="Times New Roman"/>
         </w:rPr>
-        <w:t xml:space="preserve"> dan </w:t>
-      </w:r>
-      <w:r>
-        <w:rPr>
-          <w:rFonts w:ascii="Times New Roman" w:hAnsi="Times New Roman" w:cs="Times New Roman"/>
-        </w:rPr>
-        <w:lastRenderedPageBreak/>
-        <w:t>pembuatan visualisasi data menggunakan Tableau Public berdasarkan data yang telah diproses pada tahap sebelumnya.</w:t>
+        <w:t xml:space="preserve"> dan pembuatan visualisasi data menggunakan Tableau Public berdasarkan data yang telah diproses pada tahap sebelumnya.</w:t>
       </w:r>
     </w:p>
     <w:p>
@@ -12042,7 +12093,7 @@
       </w:pPr>
       <w:bookmarkStart w:id="23" w:name="_Toc200446290"/>
       <w:bookmarkStart w:id="24" w:name="_Toc200618648"/>
-      <w:bookmarkStart w:id="25" w:name="_Toc200619010"/>
+      <w:bookmarkStart w:id="25" w:name="_Toc208147272"/>
       <w:r>
         <w:t xml:space="preserve">Gambar 2. </w:t>
       </w:r>
@@ -12268,20 +12319,6 @@
         <w:t>A. Hasil Tahapan Pelaksanaan</w:t>
       </w:r>
       <w:bookmarkEnd w:id="28"/>
-    </w:p>
-    <w:p>
-      <w:pPr>
-        <w:spacing w:line="480" w:lineRule="auto"/>
-        <w:rPr>
-          <w:rFonts w:ascii="Times New Roman" w:hAnsi="Times New Roman" w:cs="Times New Roman"/>
-        </w:rPr>
-      </w:pPr>
-      <w:r>
-        <w:rPr>
-          <w:rFonts w:ascii="Times New Roman" w:hAnsi="Times New Roman" w:cs="Times New Roman"/>
-        </w:rPr>
-        <w:t>Berikut ini adalah hasil dari setiap tahapan pelaksanaan pada proyek ini:</w:t>
-      </w:r>
     </w:p>
     <w:p>
       <w:pPr>
@@ -12437,7 +12474,13 @@
         <w:rPr>
           <w:rFonts w:ascii="Times New Roman" w:hAnsi="Times New Roman" w:cs="Times New Roman"/>
         </w:rPr>
-        <w:t xml:space="preserve"> Berikut ini </w:t>
+        <w:t xml:space="preserve"> </w:t>
+      </w:r>
+      <w:r>
+        <w:rPr>
+          <w:rFonts w:ascii="Times New Roman" w:hAnsi="Times New Roman" w:cs="Times New Roman"/>
+        </w:rPr>
+        <w:t xml:space="preserve">Gambar 3.1 dan 3.2 </w:t>
       </w:r>
       <w:r>
         <w:rPr>
@@ -12464,9 +12507,8 @@
           <w:rFonts w:ascii="Times New Roman" w:hAnsi="Times New Roman" w:cs="Times New Roman"/>
           <w:noProof/>
         </w:rPr>
-        <w:lastRenderedPageBreak/>
         <w:drawing>
-          <wp:inline distT="0" distB="0" distL="0" distR="0" wp14:anchorId="4B3B3EE4" wp14:editId="2AB122FF">
+          <wp:inline distT="0" distB="0" distL="0" distR="0" wp14:anchorId="4B3B3EE4" wp14:editId="05C185CE">
             <wp:extent cx="2802353" cy="3240000"/>
             <wp:effectExtent l="19050" t="19050" r="17145" b="17780"/>
             <wp:docPr id="623233293" name="Picture 2"/>
@@ -12525,7 +12567,7 @@
       </w:pPr>
       <w:bookmarkStart w:id="29" w:name="_Toc200446296"/>
       <w:bookmarkStart w:id="30" w:name="_Toc200618658"/>
-      <w:bookmarkStart w:id="31" w:name="_Toc200619018"/>
+      <w:bookmarkStart w:id="31" w:name="_Toc208147360"/>
       <w:r>
         <w:t xml:space="preserve">Gambar 3. </w:t>
       </w:r>
@@ -12556,8 +12598,9 @@
           <w:rFonts w:ascii="Times New Roman" w:hAnsi="Times New Roman" w:cs="Times New Roman"/>
           <w:noProof/>
         </w:rPr>
+        <w:lastRenderedPageBreak/>
         <w:drawing>
-          <wp:inline distT="0" distB="0" distL="0" distR="0" wp14:anchorId="75188C27" wp14:editId="7B9D337E">
+          <wp:inline distT="0" distB="0" distL="0" distR="0" wp14:anchorId="75188C27" wp14:editId="76FE5F0D">
             <wp:extent cx="5004000" cy="1844909"/>
             <wp:effectExtent l="19050" t="19050" r="25400" b="22225"/>
             <wp:docPr id="783286403" name="Picture 4"/>
@@ -12619,7 +12662,7 @@
       </w:pPr>
       <w:bookmarkStart w:id="32" w:name="_Toc200446297"/>
       <w:bookmarkStart w:id="33" w:name="_Toc200618659"/>
-      <w:bookmarkStart w:id="34" w:name="_Toc200619019"/>
+      <w:bookmarkStart w:id="34" w:name="_Toc208147361"/>
       <w:r>
         <w:t xml:space="preserve">Gambar 3. </w:t>
       </w:r>
@@ -12771,7 +12814,6 @@
         <w:pStyle w:val="Heading5"/>
       </w:pPr>
       <w:r>
-        <w:lastRenderedPageBreak/>
         <w:t xml:space="preserve">Penggabungan </w:t>
       </w:r>
       <w:r>
@@ -12804,7 +12846,19 @@
         <w:rPr>
           <w:rFonts w:ascii="Times New Roman" w:hAnsi="Times New Roman" w:cs="Times New Roman"/>
         </w:rPr>
-        <w:t xml:space="preserve"> adalah sekumpulan data, yang biasanya disajikan dalam bentuk tabel, di mana setiap kolom merepresentasikan variabel tertentu dan setiap baris mewakili anggota tertentu dari dataset yang di</w:t>
+        <w:t xml:space="preserve"> adalah sekumpulan data, yang biasanya disajikan dalam bentuk tabel, di mana setiap kolom</w:t>
+      </w:r>
+      <w:r>
+        <w:rPr>
+          <w:rFonts w:ascii="Times New Roman" w:hAnsi="Times New Roman" w:cs="Times New Roman"/>
+        </w:rPr>
+        <w:t xml:space="preserve"> pada tabel tersebut</w:t>
+      </w:r>
+      <w:r>
+        <w:rPr>
+          <w:rFonts w:ascii="Times New Roman" w:hAnsi="Times New Roman" w:cs="Times New Roman"/>
+        </w:rPr>
+        <w:t xml:space="preserve"> merepresentasikan variabel tertentu dan setiap baris mewakili anggota tertentu dari dataset yang di</w:t>
       </w:r>
       <w:r>
         <w:rPr>
@@ -12904,7 +12958,31 @@
         <w:rPr>
           <w:rFonts w:ascii="Times New Roman" w:hAnsi="Times New Roman" w:cs="Times New Roman"/>
         </w:rPr>
-        <w:t>, penggabungan dataset ini diperlukan. Berikut ini dokumentasinya:</w:t>
+        <w:t xml:space="preserve">, penggabungan dataset ini diperlukan. </w:t>
+      </w:r>
+      <w:r>
+        <w:rPr>
+          <w:rFonts w:ascii="Times New Roman" w:hAnsi="Times New Roman" w:cs="Times New Roman"/>
+        </w:rPr>
+        <w:t xml:space="preserve">Gambar 3.3 dan 3.4 adalah </w:t>
+      </w:r>
+      <w:r>
+        <w:rPr>
+          <w:rFonts w:ascii="Times New Roman" w:hAnsi="Times New Roman" w:cs="Times New Roman"/>
+        </w:rPr>
+        <w:t>dokumentasi</w:t>
+      </w:r>
+      <w:r>
+        <w:rPr>
+          <w:rFonts w:ascii="Times New Roman" w:hAnsi="Times New Roman" w:cs="Times New Roman"/>
+        </w:rPr>
+        <w:t xml:space="preserve"> dari tahap ini</w:t>
+      </w:r>
+      <w:r>
+        <w:rPr>
+          <w:rFonts w:ascii="Times New Roman" w:hAnsi="Times New Roman" w:cs="Times New Roman"/>
+        </w:rPr>
+        <w:t>:</w:t>
       </w:r>
     </w:p>
     <w:p>
@@ -12919,8 +12997,9 @@
           <w:rFonts w:ascii="Times New Roman" w:hAnsi="Times New Roman" w:cs="Times New Roman"/>
           <w:noProof/>
         </w:rPr>
+        <w:lastRenderedPageBreak/>
         <w:drawing>
-          <wp:inline distT="0" distB="0" distL="0" distR="0" wp14:anchorId="02EBA956" wp14:editId="519FD437">
+          <wp:inline distT="0" distB="0" distL="0" distR="0" wp14:anchorId="02EBA956" wp14:editId="67099DFA">
             <wp:extent cx="3888000" cy="2160000"/>
             <wp:effectExtent l="19050" t="19050" r="17780" b="12065"/>
             <wp:docPr id="102117401" name="Picture 5"/>
@@ -12981,7 +13060,7 @@
       </w:pPr>
       <w:bookmarkStart w:id="35" w:name="_Toc200446298"/>
       <w:bookmarkStart w:id="36" w:name="_Toc200618660"/>
-      <w:bookmarkStart w:id="37" w:name="_Toc200619020"/>
+      <w:bookmarkStart w:id="37" w:name="_Toc208147362"/>
       <w:r>
         <w:t xml:space="preserve">Gambar 3. </w:t>
       </w:r>
@@ -13015,7 +13094,6 @@
           <w:rFonts w:ascii="Times New Roman" w:hAnsi="Times New Roman" w:cs="Times New Roman"/>
           <w:noProof/>
         </w:rPr>
-        <w:lastRenderedPageBreak/>
         <w:drawing>
           <wp:inline distT="0" distB="0" distL="0" distR="0" wp14:anchorId="2A1F1CBC" wp14:editId="11C399CC">
             <wp:extent cx="2520000" cy="2411027"/>
@@ -13079,7 +13157,7 @@
       </w:pPr>
       <w:bookmarkStart w:id="38" w:name="_Toc200446299"/>
       <w:bookmarkStart w:id="39" w:name="_Toc200618661"/>
-      <w:bookmarkStart w:id="40" w:name="_Toc200619021"/>
+      <w:bookmarkStart w:id="40" w:name="_Toc208147363"/>
       <w:r>
         <w:t xml:space="preserve">Gambar 3. </w:t>
       </w:r>
@@ -13141,7 +13219,19 @@
         <w:rPr>
           <w:rFonts w:ascii="Times New Roman" w:hAnsi="Times New Roman" w:cs="Times New Roman"/>
         </w:rPr>
-        <w:t xml:space="preserve"> dan menyisakan kolom informasi yang berguna pada tahap visualisasi</w:t>
+        <w:t xml:space="preserve"> dan menyisakan kolom informasi yang</w:t>
+      </w:r>
+      <w:r>
+        <w:rPr>
+          <w:rFonts w:ascii="Times New Roman" w:hAnsi="Times New Roman" w:cs="Times New Roman"/>
+        </w:rPr>
+        <w:t xml:space="preserve"> diperkirakan akan</w:t>
+      </w:r>
+      <w:r>
+        <w:rPr>
+          <w:rFonts w:ascii="Times New Roman" w:hAnsi="Times New Roman" w:cs="Times New Roman"/>
+        </w:rPr>
+        <w:t xml:space="preserve"> berguna pada tahap visualisasi</w:t>
       </w:r>
       <w:r>
         <w:rPr>
@@ -13185,25 +13275,68 @@
         <w:rPr>
           <w:rFonts w:ascii="Times New Roman" w:hAnsi="Times New Roman" w:cs="Times New Roman"/>
         </w:rPr>
-        <w:t xml:space="preserve">Berikut ini adalah </w:t>
-      </w:r>
-      <w:r>
-        <w:rPr>
-          <w:rFonts w:ascii="Times New Roman" w:hAnsi="Times New Roman" w:cs="Times New Roman"/>
-        </w:rPr>
-        <w:t>18 dari 74 kolom pilihan</w:t>
-      </w:r>
-      <w:r>
-        <w:rPr>
-          <w:rFonts w:ascii="Times New Roman" w:hAnsi="Times New Roman" w:cs="Times New Roman"/>
-        </w:rPr>
-        <w:t xml:space="preserve"> serta dokumentasi </w:t>
-      </w:r>
-      <w:r>
-        <w:rPr>
-          <w:rFonts w:ascii="Times New Roman" w:hAnsi="Times New Roman" w:cs="Times New Roman"/>
-        </w:rPr>
-        <w:t>dari tahap ini:</w:t>
+        <w:t>Gambar 3.5</w:t>
+      </w:r>
+      <w:r>
+        <w:rPr>
+          <w:rFonts w:ascii="Times New Roman" w:hAnsi="Times New Roman" w:cs="Times New Roman"/>
+        </w:rPr>
+        <w:t xml:space="preserve"> merupakan dokumentasi </w:t>
+      </w:r>
+      <w:r>
+        <w:rPr>
+          <w:rFonts w:ascii="Times New Roman" w:hAnsi="Times New Roman" w:cs="Times New Roman"/>
+          <w:i/>
+          <w:iCs/>
+        </w:rPr>
+        <w:t>brainstorming</w:t>
+      </w:r>
+      <w:r>
+        <w:rPr>
+          <w:rFonts w:ascii="Times New Roman" w:hAnsi="Times New Roman" w:cs="Times New Roman"/>
+        </w:rPr>
+        <w:t xml:space="preserve"> pemilihan kolom, </w:t>
+      </w:r>
+      <w:r>
+        <w:rPr>
+          <w:rFonts w:ascii="Times New Roman" w:hAnsi="Times New Roman" w:cs="Times New Roman"/>
+        </w:rPr>
+        <w:lastRenderedPageBreak/>
+        <w:t xml:space="preserve">gambar 3.6 merupakan dokumentasi sintaks realisasi </w:t>
+      </w:r>
+      <w:r>
+        <w:rPr>
+          <w:rFonts w:ascii="Times New Roman" w:hAnsi="Times New Roman" w:cs="Times New Roman"/>
+          <w:i/>
+          <w:iCs/>
+        </w:rPr>
+        <w:t>brainstorming</w:t>
+      </w:r>
+      <w:r>
+        <w:rPr>
+          <w:rFonts w:ascii="Times New Roman" w:hAnsi="Times New Roman" w:cs="Times New Roman"/>
+        </w:rPr>
+        <w:t xml:space="preserve">, dan gambar 3.7 adalah hasil dari realisasi </w:t>
+      </w:r>
+      <w:r>
+        <w:rPr>
+          <w:rFonts w:ascii="Times New Roman" w:hAnsi="Times New Roman" w:cs="Times New Roman"/>
+          <w:i/>
+          <w:iCs/>
+        </w:rPr>
+        <w:t>brainstorming</w:t>
+      </w:r>
+      <w:r>
+        <w:rPr>
+          <w:rFonts w:ascii="Times New Roman" w:hAnsi="Times New Roman" w:cs="Times New Roman"/>
+        </w:rPr>
+        <w:t xml:space="preserve"> pemilihan kolom</w:t>
+      </w:r>
+      <w:r>
+        <w:rPr>
+          <w:rFonts w:ascii="Times New Roman" w:hAnsi="Times New Roman" w:cs="Times New Roman"/>
+        </w:rPr>
+        <w:t>:</w:t>
       </w:r>
     </w:p>
     <w:p>
@@ -13281,7 +13414,7 @@
       </w:pPr>
       <w:bookmarkStart w:id="41" w:name="_Toc200446300"/>
       <w:bookmarkStart w:id="42" w:name="_Toc200618662"/>
-      <w:bookmarkStart w:id="43" w:name="_Toc200619022"/>
+      <w:bookmarkStart w:id="43" w:name="_Toc208147364"/>
       <w:r>
         <w:t xml:space="preserve">Gambar 3. </w:t>
       </w:r>
@@ -13315,7 +13448,6 @@
           <w:rFonts w:ascii="Times New Roman" w:hAnsi="Times New Roman" w:cs="Times New Roman"/>
           <w:noProof/>
         </w:rPr>
-        <w:lastRenderedPageBreak/>
         <w:drawing>
           <wp:inline distT="0" distB="0" distL="0" distR="0" wp14:anchorId="3D1861C2" wp14:editId="19977DBD">
             <wp:extent cx="2880000" cy="2858214"/>
@@ -13379,7 +13511,7 @@
       </w:pPr>
       <w:bookmarkStart w:id="44" w:name="_Toc200446301"/>
       <w:bookmarkStart w:id="45" w:name="_Toc200618663"/>
-      <w:bookmarkStart w:id="46" w:name="_Toc200619023"/>
+      <w:bookmarkStart w:id="46" w:name="_Toc208147365"/>
       <w:r>
         <w:t xml:space="preserve">Gambar 3. </w:t>
       </w:r>
@@ -13413,6 +13545,7 @@
           <w:rFonts w:ascii="Times New Roman" w:hAnsi="Times New Roman" w:cs="Times New Roman"/>
           <w:noProof/>
         </w:rPr>
+        <w:lastRenderedPageBreak/>
         <w:drawing>
           <wp:inline distT="0" distB="0" distL="0" distR="0" wp14:anchorId="0A53EE62" wp14:editId="1B298BA8">
             <wp:extent cx="3960000" cy="3846346"/>
@@ -13476,7 +13609,7 @@
       </w:pPr>
       <w:bookmarkStart w:id="47" w:name="_Toc200446302"/>
       <w:bookmarkStart w:id="48" w:name="_Toc200618664"/>
-      <w:bookmarkStart w:id="49" w:name="_Toc200619024"/>
+      <w:bookmarkStart w:id="49" w:name="_Toc208147366"/>
       <w:r>
         <w:t xml:space="preserve">Gambar 3. </w:t>
       </w:r>
@@ -13503,7 +13636,6 @@
         <w:pStyle w:val="Heading5"/>
       </w:pPr>
       <w:r>
-        <w:lastRenderedPageBreak/>
         <w:t>Validasi Data</w:t>
       </w:r>
     </w:p>
@@ -13717,7 +13849,7 @@
       </w:pPr>
       <w:bookmarkStart w:id="50" w:name="_Toc200446303"/>
       <w:bookmarkStart w:id="51" w:name="_Toc200618665"/>
-      <w:bookmarkStart w:id="52" w:name="_Toc200619025"/>
+      <w:bookmarkStart w:id="52" w:name="_Toc208147367"/>
       <w:r>
         <w:t xml:space="preserve">Gambar 3. </w:t>
       </w:r>
@@ -13967,7 +14099,7 @@
       </w:pPr>
       <w:bookmarkStart w:id="53" w:name="_Toc200446304"/>
       <w:bookmarkStart w:id="54" w:name="_Toc200618666"/>
-      <w:bookmarkStart w:id="55" w:name="_Toc200619026"/>
+      <w:bookmarkStart w:id="55" w:name="_Toc208147368"/>
       <w:r>
         <w:t xml:space="preserve">Gambar 3. </w:t>
       </w:r>
@@ -14065,7 +14197,7 @@
       </w:pPr>
       <w:bookmarkStart w:id="56" w:name="_Toc200446305"/>
       <w:bookmarkStart w:id="57" w:name="_Toc200618667"/>
-      <w:bookmarkStart w:id="58" w:name="_Toc200619027"/>
+      <w:bookmarkStart w:id="58" w:name="_Toc208147369"/>
       <w:r>
         <w:t xml:space="preserve">Gambar 3. </w:t>
       </w:r>
@@ -14146,7 +14278,6 @@
           <w:rFonts w:ascii="Times New Roman" w:hAnsi="Times New Roman" w:cs="Times New Roman"/>
         </w:rPr>
       </w:pPr>
-      <w:proofErr w:type="gramStart"/>
       <w:r>
         <w:rPr>
           <w:rFonts w:ascii="Times New Roman" w:hAnsi="Times New Roman" w:cs="Times New Roman"/>
@@ -14161,14 +14292,17 @@
           <w:i/>
           <w:iCs/>
         </w:rPr>
-        <w:t>issing  value</w:t>
-      </w:r>
-      <w:proofErr w:type="gramEnd"/>
-      <w:r>
-        <w:rPr>
-          <w:rFonts w:ascii="Times New Roman" w:hAnsi="Times New Roman" w:cs="Times New Roman"/>
-          <w:i/>
-          <w:iCs/>
+        <w:t xml:space="preserve">issing  value </w:t>
+      </w:r>
+      <w:r>
+        <w:rPr>
+          <w:rFonts w:ascii="Times New Roman" w:hAnsi="Times New Roman" w:cs="Times New Roman"/>
+        </w:rPr>
+        <w:t xml:space="preserve"> adalah  satu  kondisi  dimana  terdapat  nilai  yang  tidak</w:t>
+      </w:r>
+      <w:r>
+        <w:rPr>
+          <w:rFonts w:ascii="Times New Roman" w:hAnsi="Times New Roman" w:cs="Times New Roman"/>
         </w:rPr>
         <w:t xml:space="preserve"> </w:t>
       </w:r>
@@ -14176,114 +14310,8 @@
         <w:rPr>
           <w:rFonts w:ascii="Times New Roman" w:hAnsi="Times New Roman" w:cs="Times New Roman"/>
         </w:rPr>
-        <w:t xml:space="preserve"> </w:t>
-      </w:r>
-      <w:proofErr w:type="gramStart"/>
-      <w:r>
-        <w:rPr>
-          <w:rFonts w:ascii="Times New Roman" w:hAnsi="Times New Roman" w:cs="Times New Roman"/>
-        </w:rPr>
-        <w:t>adalah  satu</w:t>
-      </w:r>
-      <w:proofErr w:type="gramEnd"/>
-      <w:r>
-        <w:rPr>
-          <w:rFonts w:ascii="Times New Roman" w:hAnsi="Times New Roman" w:cs="Times New Roman"/>
-        </w:rPr>
-        <w:t xml:space="preserve">  </w:t>
-      </w:r>
-      <w:proofErr w:type="gramStart"/>
-      <w:r>
-        <w:rPr>
-          <w:rFonts w:ascii="Times New Roman" w:hAnsi="Times New Roman" w:cs="Times New Roman"/>
-        </w:rPr>
-        <w:t>kondisi  dimana</w:t>
-      </w:r>
-      <w:proofErr w:type="gramEnd"/>
-      <w:r>
-        <w:rPr>
-          <w:rFonts w:ascii="Times New Roman" w:hAnsi="Times New Roman" w:cs="Times New Roman"/>
-        </w:rPr>
-        <w:t xml:space="preserve">  </w:t>
-      </w:r>
-      <w:proofErr w:type="gramStart"/>
-      <w:r>
-        <w:rPr>
-          <w:rFonts w:ascii="Times New Roman" w:hAnsi="Times New Roman" w:cs="Times New Roman"/>
-        </w:rPr>
-        <w:t>terdapat  nilai</w:t>
-      </w:r>
-      <w:proofErr w:type="gramEnd"/>
-      <w:r>
-        <w:rPr>
-          <w:rFonts w:ascii="Times New Roman" w:hAnsi="Times New Roman" w:cs="Times New Roman"/>
-        </w:rPr>
-        <w:t xml:space="preserve">  </w:t>
-      </w:r>
-      <w:proofErr w:type="gramStart"/>
-      <w:r>
-        <w:rPr>
-          <w:rFonts w:ascii="Times New Roman" w:hAnsi="Times New Roman" w:cs="Times New Roman"/>
-        </w:rPr>
-        <w:t>yang  tidak</w:t>
-      </w:r>
-      <w:proofErr w:type="gramEnd"/>
-      <w:r>
-        <w:rPr>
-          <w:rFonts w:ascii="Times New Roman" w:hAnsi="Times New Roman" w:cs="Times New Roman"/>
-        </w:rPr>
-        <w:t xml:space="preserve"> </w:t>
-      </w:r>
-      <w:proofErr w:type="gramStart"/>
-      <w:r>
-        <w:rPr>
-          <w:rFonts w:ascii="Times New Roman" w:hAnsi="Times New Roman" w:cs="Times New Roman"/>
-        </w:rPr>
-        <w:t>lengkap  atau</w:t>
-      </w:r>
-      <w:proofErr w:type="gramEnd"/>
-      <w:r>
-        <w:rPr>
-          <w:rFonts w:ascii="Times New Roman" w:hAnsi="Times New Roman" w:cs="Times New Roman"/>
-        </w:rPr>
-        <w:t xml:space="preserve">  </w:t>
-      </w:r>
-      <w:proofErr w:type="gramStart"/>
-      <w:r>
-        <w:rPr>
-          <w:rFonts w:ascii="Times New Roman" w:hAnsi="Times New Roman" w:cs="Times New Roman"/>
-        </w:rPr>
-        <w:t>kosong  pada</w:t>
-      </w:r>
-      <w:proofErr w:type="gramEnd"/>
-      <w:r>
-        <w:rPr>
-          <w:rFonts w:ascii="Times New Roman" w:hAnsi="Times New Roman" w:cs="Times New Roman"/>
-        </w:rPr>
-        <w:t xml:space="preserve">  </w:t>
-      </w:r>
-      <w:proofErr w:type="gramStart"/>
-      <w:r>
-        <w:rPr>
-          <w:rFonts w:ascii="Times New Roman" w:hAnsi="Times New Roman" w:cs="Times New Roman"/>
-        </w:rPr>
-        <w:t>satu  atau</w:t>
-      </w:r>
-      <w:proofErr w:type="gramEnd"/>
-      <w:r>
-        <w:rPr>
-          <w:rFonts w:ascii="Times New Roman" w:hAnsi="Times New Roman" w:cs="Times New Roman"/>
-        </w:rPr>
-        <w:t xml:space="preserve">  </w:t>
-      </w:r>
-      <w:proofErr w:type="gramStart"/>
-      <w:r>
-        <w:rPr>
-          <w:rFonts w:ascii="Times New Roman" w:hAnsi="Times New Roman" w:cs="Times New Roman"/>
-        </w:rPr>
-        <w:t>beberapa  kriteria</w:t>
-      </w:r>
-      <w:proofErr w:type="gramEnd"/>
+        <w:t>lengkap  atau  kosong  pada  satu  atau  beberapa  kriteria</w:t>
+      </w:r>
       <w:r>
         <w:rPr>
           <w:rFonts w:ascii="Times New Roman" w:hAnsi="Times New Roman" w:cs="Times New Roman"/>
@@ -14433,7 +14461,7 @@
       </w:pPr>
       <w:bookmarkStart w:id="59" w:name="_Toc200446306"/>
       <w:bookmarkStart w:id="60" w:name="_Toc200618668"/>
-      <w:bookmarkStart w:id="61" w:name="_Toc200619028"/>
+      <w:bookmarkStart w:id="61" w:name="_Toc208147370"/>
       <w:r>
         <w:t xml:space="preserve">Gambar 3. </w:t>
       </w:r>
@@ -15032,19 +15060,63 @@
         <w:rPr>
           <w:rFonts w:ascii="Times New Roman" w:hAnsi="Times New Roman" w:cs="Times New Roman"/>
         </w:rPr>
-        <w:t>. Tujuan proses ini adalah untuk melihat ada ti</w:t>
-      </w:r>
-      <w:r>
-        <w:rPr>
-          <w:rFonts w:ascii="Times New Roman" w:hAnsi="Times New Roman" w:cs="Times New Roman"/>
-        </w:rPr>
-        <w:t>daknya d</w:t>
-      </w:r>
-      <w:r>
-        <w:rPr>
-          <w:rFonts w:ascii="Times New Roman" w:hAnsi="Times New Roman" w:cs="Times New Roman"/>
-        </w:rPr>
-        <w:t>istribusi data yang tidak wajar</w:t>
+        <w:t xml:space="preserve">. </w:t>
+      </w:r>
+      <w:r>
+        <w:rPr>
+          <w:rFonts w:ascii="Times New Roman" w:hAnsi="Times New Roman" w:cs="Times New Roman"/>
+        </w:rPr>
+        <w:t>Analisis</w:t>
+      </w:r>
+      <w:r>
+        <w:rPr>
+          <w:rFonts w:ascii="Times New Roman" w:hAnsi="Times New Roman" w:cs="Times New Roman"/>
+        </w:rPr>
+        <w:t xml:space="preserve"> sederhana</w:t>
+      </w:r>
+      <w:r>
+        <w:rPr>
+          <w:rFonts w:ascii="Times New Roman" w:hAnsi="Times New Roman" w:cs="Times New Roman"/>
+        </w:rPr>
+        <w:t xml:space="preserve"> distribusi data dilakukan untuk mengidentifikasi pola umum maupun anomali, termasuk mendeteksi adanya data yang tidak wajar atau </w:t>
+      </w:r>
+      <w:r>
+        <w:rPr>
+          <w:rFonts w:ascii="Times New Roman" w:hAnsi="Times New Roman" w:cs="Times New Roman"/>
+          <w:i/>
+          <w:iCs/>
+        </w:rPr>
+        <w:t>outlier</w:t>
+      </w:r>
+      <w:r>
+        <w:rPr>
+          <w:rFonts w:ascii="Times New Roman" w:hAnsi="Times New Roman" w:cs="Times New Roman"/>
+        </w:rPr>
+        <w:t xml:space="preserve"> yang dapat memengaruhi hasil</w:t>
+      </w:r>
+      <w:r>
+        <w:rPr>
+          <w:rFonts w:ascii="Times New Roman" w:hAnsi="Times New Roman" w:cs="Times New Roman"/>
+        </w:rPr>
+        <w:t xml:space="preserve"> </w:t>
+      </w:r>
+      <w:r>
+        <w:rPr>
+          <w:rFonts w:ascii="Times New Roman" w:hAnsi="Times New Roman" w:cs="Times New Roman"/>
+        </w:rPr>
+        <w:t xml:space="preserve">visualisasi </w:t>
+      </w:r>
+      <w:r>
+        <w:rPr>
+          <w:rFonts w:ascii="Times New Roman" w:hAnsi="Times New Roman" w:cs="Times New Roman"/>
+        </w:rPr>
+        <w:t xml:space="preserve">di tahap </w:t>
+      </w:r>
+      <w:r>
+        <w:rPr>
+          <w:rFonts w:ascii="Times New Roman" w:hAnsi="Times New Roman" w:cs="Times New Roman"/>
+        </w:rPr>
+        <w:t>berikutnya. Peninjauan pola distribusi ini sangat penting guna memastikan kualitas data dan kebenaran interpretasi yang dihasilkan dari data tersebut</w:t>
       </w:r>
       <w:r>
         <w:rPr>
@@ -15062,6 +15134,18 @@
         <w:rPr>
           <w:rFonts w:ascii="Times New Roman" w:hAnsi="Times New Roman" w:cs="Times New Roman"/>
         </w:rPr>
+        <w:t>Proses ini melibatkan pengamatan terhadap sebaran, konsistensi, dan kelengkapan data agar menghasilkan informasi yang akurat dan dapat diandalkan</w:t>
+      </w:r>
+      <w:r>
+        <w:rPr>
+          <w:rFonts w:ascii="Times New Roman" w:hAnsi="Times New Roman" w:cs="Times New Roman"/>
+        </w:rPr>
+        <w:t xml:space="preserve"> </w:t>
+      </w:r>
+      <w:r>
+        <w:rPr>
+          <w:rFonts w:ascii="Times New Roman" w:hAnsi="Times New Roman" w:cs="Times New Roman"/>
+        </w:rPr>
         <w:t>Gambar 3.12 sampai gambar 3.24</w:t>
       </w:r>
       <w:r>
@@ -15074,7 +15158,19 @@
         <w:rPr>
           <w:rFonts w:ascii="Times New Roman" w:hAnsi="Times New Roman" w:cs="Times New Roman"/>
         </w:rPr>
-        <w:t>hasil dari</w:t>
+        <w:t xml:space="preserve">hasil </w:t>
+      </w:r>
+      <w:r>
+        <w:rPr>
+          <w:rFonts w:ascii="Times New Roman" w:hAnsi="Times New Roman" w:cs="Times New Roman"/>
+        </w:rPr>
+        <w:t xml:space="preserve">dokumentasi </w:t>
+      </w:r>
+      <w:r>
+        <w:rPr>
+          <w:rFonts w:ascii="Times New Roman" w:hAnsi="Times New Roman" w:cs="Times New Roman"/>
+        </w:rPr>
+        <w:t>dari</w:t>
       </w:r>
       <w:r>
         <w:rPr>
@@ -15115,7 +15211,7 @@
         </w:rPr>
         <w:lastRenderedPageBreak/>
         <w:drawing>
-          <wp:inline distT="0" distB="0" distL="0" distR="0" wp14:anchorId="71F22594" wp14:editId="3AAAEA59">
+          <wp:inline distT="0" distB="0" distL="0" distR="0" wp14:anchorId="71F22594" wp14:editId="357E60EF">
             <wp:extent cx="5400000" cy="3088049"/>
             <wp:effectExtent l="0" t="0" r="0" b="0"/>
             <wp:docPr id="817290869" name="Picture 5"/>
@@ -15172,6 +15268,7 @@
           <w:rFonts w:ascii="Times New Roman" w:hAnsi="Times New Roman" w:cs="Times New Roman"/>
         </w:rPr>
       </w:pPr>
+      <w:bookmarkStart w:id="62" w:name="_Toc208147371"/>
       <w:r>
         <w:t xml:space="preserve">Gambar 3. </w:t>
       </w:r>
@@ -15186,6 +15283,7 @@
       <w:r>
         <w:t xml:space="preserve"> distribusi jalur pendaftaran</w:t>
       </w:r>
+      <w:bookmarkEnd w:id="62"/>
     </w:p>
     <w:p>
       <w:pPr>
@@ -15307,6 +15405,7 @@
           <w:rFonts w:ascii="Times New Roman" w:hAnsi="Times New Roman" w:cs="Times New Roman"/>
         </w:rPr>
       </w:pPr>
+      <w:bookmarkStart w:id="63" w:name="_Toc208147372"/>
       <w:r>
         <w:t xml:space="preserve">Gambar 3. </w:t>
       </w:r>
@@ -15324,6 +15423,7 @@
       <w:r>
         <w:t>tahun</w:t>
       </w:r>
+      <w:bookmarkEnd w:id="63"/>
     </w:p>
     <w:p>
       <w:pPr>
@@ -15455,6 +15555,7 @@
           <w:rFonts w:ascii="Times New Roman" w:hAnsi="Times New Roman" w:cs="Times New Roman"/>
         </w:rPr>
       </w:pPr>
+      <w:bookmarkStart w:id="64" w:name="_Toc208147373"/>
       <w:r>
         <w:t xml:space="preserve">Gambar 3. </w:t>
       </w:r>
@@ -15472,6 +15573,7 @@
       <w:r>
         <w:t>prodi pilihan 1</w:t>
       </w:r>
+      <w:bookmarkEnd w:id="64"/>
     </w:p>
     <w:p>
       <w:pPr>
@@ -15590,6 +15692,7 @@
           <w:rFonts w:ascii="Times New Roman" w:hAnsi="Times New Roman" w:cs="Times New Roman"/>
         </w:rPr>
       </w:pPr>
+      <w:bookmarkStart w:id="65" w:name="_Toc208147374"/>
       <w:r>
         <w:t xml:space="preserve">Gambar 3. </w:t>
       </w:r>
@@ -15607,6 +15710,7 @@
       <w:r>
         <w:t xml:space="preserve"> fakultas prodi pilihan 1</w:t>
       </w:r>
+      <w:bookmarkEnd w:id="65"/>
     </w:p>
     <w:p>
       <w:pPr>
@@ -15726,6 +15830,7 @@
           <w:rFonts w:ascii="Times New Roman" w:hAnsi="Times New Roman" w:cs="Times New Roman"/>
         </w:rPr>
       </w:pPr>
+      <w:bookmarkStart w:id="66" w:name="_Toc208147375"/>
       <w:r>
         <w:t xml:space="preserve">Gambar 3. </w:t>
       </w:r>
@@ -15743,6 +15848,7 @@
       <w:r>
         <w:t>prodi pilihan 2</w:t>
       </w:r>
+      <w:bookmarkEnd w:id="66"/>
     </w:p>
     <w:p>
       <w:pPr>
@@ -15861,6 +15967,7 @@
           <w:rFonts w:ascii="Times New Roman" w:hAnsi="Times New Roman" w:cs="Times New Roman"/>
         </w:rPr>
       </w:pPr>
+      <w:bookmarkStart w:id="67" w:name="_Toc208147376"/>
       <w:r>
         <w:t xml:space="preserve">Gambar 3. </w:t>
       </w:r>
@@ -15878,6 +15985,7 @@
       <w:r>
         <w:t>fakultas prodi pilihan 2</w:t>
       </w:r>
+      <w:bookmarkEnd w:id="67"/>
     </w:p>
     <w:p>
       <w:pPr>
@@ -15997,6 +16105,7 @@
           <w:rFonts w:ascii="Times New Roman" w:hAnsi="Times New Roman" w:cs="Times New Roman"/>
         </w:rPr>
       </w:pPr>
+      <w:bookmarkStart w:id="68" w:name="_Toc208147377"/>
       <w:r>
         <w:t xml:space="preserve">Gambar 3. </w:t>
       </w:r>
@@ -16014,6 +16123,7 @@
       <w:r>
         <w:t>prodi diterima</w:t>
       </w:r>
+      <w:bookmarkEnd w:id="68"/>
     </w:p>
     <w:p>
       <w:pPr>
@@ -16138,6 +16248,7 @@
           <w:rFonts w:ascii="Times New Roman" w:hAnsi="Times New Roman" w:cs="Times New Roman"/>
         </w:rPr>
       </w:pPr>
+      <w:bookmarkStart w:id="69" w:name="_Toc208147378"/>
       <w:r>
         <w:t xml:space="preserve">Gambar 3. </w:t>
       </w:r>
@@ -16155,6 +16266,7 @@
       <w:r>
         <w:t>fakultas prodi diterima</w:t>
       </w:r>
+      <w:bookmarkEnd w:id="69"/>
     </w:p>
     <w:p>
       <w:pPr>
@@ -16303,6 +16415,7 @@
           <w:rFonts w:ascii="Times New Roman" w:hAnsi="Times New Roman" w:cs="Times New Roman"/>
         </w:rPr>
       </w:pPr>
+      <w:bookmarkStart w:id="70" w:name="_Toc208147379"/>
       <w:r>
         <w:t xml:space="preserve">Gambar 3. </w:t>
       </w:r>
@@ -16320,6 +16433,7 @@
       <w:r>
         <w:t>usia</w:t>
       </w:r>
+      <w:bookmarkEnd w:id="70"/>
     </w:p>
     <w:p>
       <w:pPr>
@@ -16450,6 +16564,7 @@
           <w:rFonts w:ascii="Times New Roman" w:hAnsi="Times New Roman" w:cs="Times New Roman"/>
         </w:rPr>
       </w:pPr>
+      <w:bookmarkStart w:id="71" w:name="_Toc208147380"/>
       <w:r>
         <w:t xml:space="preserve">Gambar 3. </w:t>
       </w:r>
@@ -16467,6 +16582,7 @@
       <w:r>
         <w:t>jurusan SLTA</w:t>
       </w:r>
+      <w:bookmarkEnd w:id="71"/>
     </w:p>
     <w:p>
       <w:pPr>
@@ -16580,6 +16696,7 @@
           <w:rFonts w:ascii="Times New Roman" w:hAnsi="Times New Roman" w:cs="Times New Roman"/>
         </w:rPr>
       </w:pPr>
+      <w:bookmarkStart w:id="72" w:name="_Toc208147381"/>
       <w:r>
         <w:t xml:space="preserve">Gambar 3. </w:t>
       </w:r>
@@ -16597,6 +16714,7 @@
       <w:r>
         <w:t>pendidikan ayah</w:t>
       </w:r>
+      <w:bookmarkEnd w:id="72"/>
     </w:p>
     <w:p>
       <w:pPr>
@@ -16716,6 +16834,7 @@
           <w:rFonts w:ascii="Times New Roman" w:hAnsi="Times New Roman" w:cs="Times New Roman"/>
         </w:rPr>
       </w:pPr>
+      <w:bookmarkStart w:id="73" w:name="_Toc208147382"/>
       <w:r>
         <w:t xml:space="preserve">Gambar 3. </w:t>
       </w:r>
@@ -16733,6 +16852,7 @@
       <w:r>
         <w:t>pendidikan ibu</w:t>
       </w:r>
+      <w:bookmarkEnd w:id="73"/>
     </w:p>
     <w:p>
       <w:pPr>
@@ -16858,6 +16978,7 @@
           <w:rFonts w:ascii="Times New Roman" w:hAnsi="Times New Roman" w:cs="Times New Roman"/>
         </w:rPr>
       </w:pPr>
+      <w:bookmarkStart w:id="74" w:name="_Toc208147383"/>
       <w:r>
         <w:t xml:space="preserve">Gambar 3. </w:t>
       </w:r>
@@ -16875,6 +16996,7 @@
       <w:r>
         <w:t>pekerjaan orang tua (ibu)</w:t>
       </w:r>
+      <w:bookmarkEnd w:id="74"/>
     </w:p>
     <w:p>
       <w:pPr>
@@ -17203,9 +17325,9 @@
           <w:rFonts w:ascii="Times New Roman" w:hAnsi="Times New Roman" w:cs="Times New Roman"/>
         </w:rPr>
       </w:pPr>
-      <w:bookmarkStart w:id="62" w:name="_Toc200446320"/>
-      <w:bookmarkStart w:id="63" w:name="_Toc200618682"/>
-      <w:bookmarkStart w:id="64" w:name="_Toc200619042"/>
+      <w:bookmarkStart w:id="75" w:name="_Toc200446320"/>
+      <w:bookmarkStart w:id="76" w:name="_Toc200618682"/>
+      <w:bookmarkStart w:id="77" w:name="_Toc208147384"/>
       <w:r>
         <w:t xml:space="preserve">Gambar 3. </w:t>
       </w:r>
@@ -17223,9 +17345,9 @@
       <w:r>
         <w:t>alidasi ulang struktur data</w:t>
       </w:r>
-      <w:bookmarkEnd w:id="62"/>
-      <w:bookmarkEnd w:id="63"/>
-      <w:bookmarkEnd w:id="64"/>
+      <w:bookmarkEnd w:id="75"/>
+      <w:bookmarkEnd w:id="76"/>
+      <w:bookmarkEnd w:id="77"/>
     </w:p>
     <w:p>
       <w:pPr>
@@ -17363,9 +17485,9 @@
           <w:rFonts w:ascii="Times New Roman" w:hAnsi="Times New Roman" w:cs="Times New Roman"/>
         </w:rPr>
       </w:pPr>
-      <w:bookmarkStart w:id="65" w:name="_Toc200446321"/>
-      <w:bookmarkStart w:id="66" w:name="_Toc200618683"/>
-      <w:bookmarkStart w:id="67" w:name="_Toc200619043"/>
+      <w:bookmarkStart w:id="78" w:name="_Toc200446321"/>
+      <w:bookmarkStart w:id="79" w:name="_Toc200618683"/>
+      <w:bookmarkStart w:id="80" w:name="_Toc208147385"/>
       <w:r>
         <w:t xml:space="preserve">Gambar 3. </w:t>
       </w:r>
@@ -17383,9 +17505,9 @@
       <w:r>
         <w:t>alidasi ulang duplikasi data</w:t>
       </w:r>
-      <w:bookmarkEnd w:id="65"/>
-      <w:bookmarkEnd w:id="66"/>
-      <w:bookmarkEnd w:id="67"/>
+      <w:bookmarkEnd w:id="78"/>
+      <w:bookmarkEnd w:id="79"/>
+      <w:bookmarkEnd w:id="80"/>
     </w:p>
     <w:p>
       <w:pPr>
@@ -17621,9 +17743,9 @@
           <w:rFonts w:ascii="Times New Roman" w:hAnsi="Times New Roman" w:cs="Times New Roman"/>
         </w:rPr>
       </w:pPr>
-      <w:bookmarkStart w:id="68" w:name="_Toc200446322"/>
-      <w:bookmarkStart w:id="69" w:name="_Toc200618684"/>
-      <w:bookmarkStart w:id="70" w:name="_Toc200619044"/>
+      <w:bookmarkStart w:id="81" w:name="_Toc200446322"/>
+      <w:bookmarkStart w:id="82" w:name="_Toc200618684"/>
+      <w:bookmarkStart w:id="83" w:name="_Toc208147386"/>
       <w:r>
         <w:t xml:space="preserve">Gambar 3. </w:t>
       </w:r>
@@ -17641,9 +17763,9 @@
       <w:r>
         <w:t>validasi ulang missing/null values</w:t>
       </w:r>
-      <w:bookmarkEnd w:id="68"/>
-      <w:bookmarkEnd w:id="69"/>
-      <w:bookmarkEnd w:id="70"/>
+      <w:bookmarkEnd w:id="81"/>
+      <w:bookmarkEnd w:id="82"/>
+      <w:bookmarkEnd w:id="83"/>
     </w:p>
     <w:p>
       <w:pPr>
@@ -17720,9 +17842,9 @@
           <w:color w:val="auto"/>
         </w:rPr>
       </w:pPr>
-      <w:bookmarkStart w:id="71" w:name="_Toc200446323"/>
-      <w:bookmarkStart w:id="72" w:name="_Toc200618685"/>
-      <w:bookmarkStart w:id="73" w:name="_Toc200619045"/>
+      <w:bookmarkStart w:id="84" w:name="_Toc200446323"/>
+      <w:bookmarkStart w:id="85" w:name="_Toc200618685"/>
+      <w:bookmarkStart w:id="86" w:name="_Toc208147387"/>
       <w:r>
         <w:t xml:space="preserve">Gambar 3. </w:t>
       </w:r>
@@ -17740,9 +17862,9 @@
       <w:r>
         <w:t>contoh data missing yang di isi dengan teknik imputation</w:t>
       </w:r>
-      <w:bookmarkEnd w:id="71"/>
-      <w:bookmarkEnd w:id="72"/>
-      <w:bookmarkEnd w:id="73"/>
+      <w:bookmarkEnd w:id="84"/>
+      <w:bookmarkEnd w:id="85"/>
+      <w:bookmarkEnd w:id="86"/>
     </w:p>
     <w:p>
       <w:pPr>
@@ -17880,6 +18002,7 @@
         <w:pStyle w:val="Caption"/>
         <w:jc w:val="center"/>
       </w:pPr>
+      <w:bookmarkStart w:id="87" w:name="_Toc208147388"/>
       <w:r>
         <w:t xml:space="preserve">Gambar 3. </w:t>
       </w:r>
@@ -17894,6 +18017,7 @@
       <w:r>
         <w:t xml:space="preserve"> validasi ulang prodi pilihan 1</w:t>
       </w:r>
+      <w:bookmarkEnd w:id="87"/>
     </w:p>
     <w:p>
       <w:pPr>
@@ -18008,6 +18132,7 @@
         <w:pStyle w:val="Caption"/>
         <w:jc w:val="center"/>
       </w:pPr>
+      <w:bookmarkStart w:id="88" w:name="_Toc208147389"/>
       <w:r>
         <w:t xml:space="preserve">Gambar 3. </w:t>
       </w:r>
@@ -18025,6 +18150,7 @@
       <w:r>
         <w:t>fakultas prodi pilihan 1</w:t>
       </w:r>
+      <w:bookmarkEnd w:id="88"/>
     </w:p>
     <w:p>
       <w:pPr>
@@ -18158,6 +18284,7 @@
         <w:pStyle w:val="Caption"/>
         <w:jc w:val="center"/>
       </w:pPr>
+      <w:bookmarkStart w:id="89" w:name="_Toc208147390"/>
       <w:r>
         <w:t xml:space="preserve">Gambar 3. </w:t>
       </w:r>
@@ -18175,6 +18302,7 @@
       <w:r>
         <w:t>prodi pilihan 2</w:t>
       </w:r>
+      <w:bookmarkEnd w:id="89"/>
     </w:p>
     <w:p>
       <w:pPr>
@@ -18295,6 +18423,7 @@
         <w:pStyle w:val="Caption"/>
         <w:jc w:val="center"/>
       </w:pPr>
+      <w:bookmarkStart w:id="90" w:name="_Toc208147391"/>
       <w:r>
         <w:t xml:space="preserve">Gambar 3. </w:t>
       </w:r>
@@ -18312,6 +18441,7 @@
       <w:r>
         <w:t>fakultas prodi pilihan 2</w:t>
       </w:r>
+      <w:bookmarkEnd w:id="90"/>
     </w:p>
     <w:p>
       <w:pPr>
@@ -18457,6 +18587,7 @@
         <w:pStyle w:val="Caption"/>
         <w:jc w:val="center"/>
       </w:pPr>
+      <w:bookmarkStart w:id="91" w:name="_Toc208147392"/>
       <w:r>
         <w:t xml:space="preserve">Gambar 3. </w:t>
       </w:r>
@@ -18474,6 +18605,7 @@
       <w:r>
         <w:t>distribusi prodi diterima</w:t>
       </w:r>
+      <w:bookmarkEnd w:id="91"/>
     </w:p>
     <w:p>
       <w:pPr>
@@ -18594,6 +18726,7 @@
         <w:pStyle w:val="Caption"/>
         <w:jc w:val="center"/>
       </w:pPr>
+      <w:bookmarkStart w:id="92" w:name="_Toc208147393"/>
       <w:r>
         <w:t xml:space="preserve">Gambar 3. </w:t>
       </w:r>
@@ -18611,6 +18744,7 @@
       <w:r>
         <w:t>fakultas prodi diterima</w:t>
       </w:r>
+      <w:bookmarkEnd w:id="92"/>
     </w:p>
     <w:p>
       <w:pPr>
@@ -18756,6 +18890,7 @@
         <w:pStyle w:val="Caption"/>
         <w:jc w:val="center"/>
       </w:pPr>
+      <w:bookmarkStart w:id="93" w:name="_Toc208147394"/>
       <w:r>
         <w:t xml:space="preserve">Gambar 3. </w:t>
       </w:r>
@@ -18773,6 +18908,7 @@
       <w:r>
         <w:t>usia</w:t>
       </w:r>
+      <w:bookmarkEnd w:id="93"/>
     </w:p>
     <w:p>
       <w:pPr>
@@ -19055,9 +19191,9 @@
           <w:rFonts w:ascii="Times New Roman" w:hAnsi="Times New Roman" w:cs="Times New Roman"/>
         </w:rPr>
       </w:pPr>
-      <w:bookmarkStart w:id="74" w:name="_Toc200446330"/>
-      <w:bookmarkStart w:id="75" w:name="_Toc200618692"/>
-      <w:bookmarkStart w:id="76" w:name="_Toc200619052"/>
+      <w:bookmarkStart w:id="94" w:name="_Toc200446330"/>
+      <w:bookmarkStart w:id="95" w:name="_Toc200618692"/>
+      <w:bookmarkStart w:id="96" w:name="_Toc208147395"/>
       <w:r>
         <w:t xml:space="preserve">Gambar 3. </w:t>
       </w:r>
@@ -19075,9 +19211,9 @@
       <w:r>
         <w:t>sintaks pembuatan kolom Kabupaten/Kota</w:t>
       </w:r>
-      <w:bookmarkEnd w:id="74"/>
-      <w:bookmarkEnd w:id="75"/>
-      <w:bookmarkEnd w:id="76"/>
+      <w:bookmarkEnd w:id="94"/>
+      <w:bookmarkEnd w:id="95"/>
+      <w:bookmarkEnd w:id="96"/>
     </w:p>
     <w:p>
       <w:pPr>
@@ -19153,9 +19289,9 @@
           <w:rFonts w:ascii="Times New Roman" w:hAnsi="Times New Roman" w:cs="Times New Roman"/>
         </w:rPr>
       </w:pPr>
-      <w:bookmarkStart w:id="77" w:name="_Toc200446331"/>
-      <w:bookmarkStart w:id="78" w:name="_Toc200618693"/>
-      <w:bookmarkStart w:id="79" w:name="_Toc200619053"/>
+      <w:bookmarkStart w:id="97" w:name="_Toc200446331"/>
+      <w:bookmarkStart w:id="98" w:name="_Toc200618693"/>
+      <w:bookmarkStart w:id="99" w:name="_Toc208147396"/>
       <w:r>
         <w:t xml:space="preserve">Gambar 3. </w:t>
       </w:r>
@@ -19173,9 +19309,9 @@
       <w:r>
         <w:t>sintaks pembuatan kolom Provinsi</w:t>
       </w:r>
-      <w:bookmarkEnd w:id="77"/>
-      <w:bookmarkEnd w:id="78"/>
-      <w:bookmarkEnd w:id="79"/>
+      <w:bookmarkEnd w:id="97"/>
+      <w:bookmarkEnd w:id="98"/>
+      <w:bookmarkEnd w:id="99"/>
     </w:p>
     <w:p>
       <w:pPr>
@@ -19251,9 +19387,9 @@
           <w:color w:val="auto"/>
         </w:rPr>
       </w:pPr>
-      <w:bookmarkStart w:id="80" w:name="_Toc200446332"/>
-      <w:bookmarkStart w:id="81" w:name="_Toc200618694"/>
-      <w:bookmarkStart w:id="82" w:name="_Toc200619054"/>
+      <w:bookmarkStart w:id="100" w:name="_Toc200446332"/>
+      <w:bookmarkStart w:id="101" w:name="_Toc200618694"/>
+      <w:bookmarkStart w:id="102" w:name="_Toc208147397"/>
       <w:r>
         <w:t xml:space="preserve">Gambar 3. </w:t>
       </w:r>
@@ -19271,9 +19407,9 @@
       <w:r>
         <w:t>contoh hasil pembuatan kolom baru</w:t>
       </w:r>
-      <w:bookmarkEnd w:id="80"/>
-      <w:bookmarkEnd w:id="81"/>
-      <w:bookmarkEnd w:id="82"/>
+      <w:bookmarkEnd w:id="100"/>
+      <w:bookmarkEnd w:id="101"/>
+      <w:bookmarkEnd w:id="102"/>
     </w:p>
     <w:p>
       <w:pPr>
@@ -19994,6 +20130,72 @@
       <w:r>
         <w:rPr>
           <w:rFonts w:ascii="Times New Roman" w:hAnsi="Times New Roman" w:cs="Times New Roman"/>
+          <w:i/>
+          <w:iCs/>
+        </w:rPr>
+        <w:t>Dashboard</w:t>
+      </w:r>
+      <w:r>
+        <w:rPr>
+          <w:rFonts w:ascii="Times New Roman" w:hAnsi="Times New Roman" w:cs="Times New Roman"/>
+        </w:rPr>
+        <w:t xml:space="preserve"> </w:t>
+      </w:r>
+      <w:r>
+        <w:rPr>
+          <w:rFonts w:ascii="Times New Roman" w:hAnsi="Times New Roman" w:cs="Times New Roman"/>
+        </w:rPr>
+        <w:t xml:space="preserve">hasil visualisasi ini berperan sebagai alat bantu dalam evaluasi strategi pemasaran UMP. Namun, interpretasi data pada </w:t>
+      </w:r>
+      <w:r>
+        <w:rPr>
+          <w:rFonts w:ascii="Times New Roman" w:hAnsi="Times New Roman" w:cs="Times New Roman"/>
+          <w:i/>
+          <w:iCs/>
+        </w:rPr>
+        <w:t>dashboard</w:t>
+      </w:r>
+      <w:r>
+        <w:rPr>
+          <w:rFonts w:ascii="Times New Roman" w:hAnsi="Times New Roman" w:cs="Times New Roman"/>
+        </w:rPr>
+        <w:t xml:space="preserve"> tersebut perlu dikombinasikan dengan sumber data atau informasi tambahan lainnya agar analisis yang dihasilkan dapat lebih komprehensif dan mendalam. </w:t>
+      </w:r>
+      <w:r>
+        <w:rPr>
+          <w:rFonts w:ascii="Times New Roman" w:hAnsi="Times New Roman" w:cs="Times New Roman"/>
+        </w:rPr>
+        <w:t xml:space="preserve">Sebagai contoh, data mengenai 10 besar SLTA penyumbang mahasiswa baru perlu dipertimbangkan bersamaan dengan data aktivitas promosi di wilayah SLTA tersebut, seperti pelaksanaan </w:t>
+      </w:r>
+      <w:r>
+        <w:rPr>
+          <w:rFonts w:ascii="Times New Roman" w:hAnsi="Times New Roman" w:cs="Times New Roman"/>
+          <w:i/>
+          <w:iCs/>
+        </w:rPr>
+        <w:t>campus expo</w:t>
+      </w:r>
+      <w:r>
+        <w:rPr>
+          <w:rFonts w:ascii="Times New Roman" w:hAnsi="Times New Roman" w:cs="Times New Roman"/>
+        </w:rPr>
+        <w:t xml:space="preserve"> atau pemasangan baliho, guna memperoleh pemahaman yang lebih kontekstual</w:t>
+      </w:r>
+      <w:r>
+        <w:rPr>
+          <w:rFonts w:ascii="Times New Roman" w:hAnsi="Times New Roman" w:cs="Times New Roman"/>
+        </w:rPr>
+        <w:t>.</w:t>
+      </w:r>
+      <w:r>
+        <w:rPr>
+          <w:rFonts w:ascii="Times New Roman" w:hAnsi="Times New Roman" w:cs="Times New Roman"/>
+        </w:rPr>
+        <w:t xml:space="preserve"> </w:t>
+      </w:r>
+      <w:r>
+        <w:rPr>
+          <w:rFonts w:ascii="Times New Roman" w:hAnsi="Times New Roman" w:cs="Times New Roman"/>
         </w:rPr>
         <w:t>Gambar 3.38 dan 3.39</w:t>
       </w:r>
@@ -20039,6 +20241,7 @@
         <w:rPr>
           <w:noProof/>
         </w:rPr>
+        <w:lastRenderedPageBreak/>
         <w:drawing>
           <wp:inline distT="0" distB="0" distL="0" distR="0" wp14:anchorId="505DD079" wp14:editId="3A137FE2">
             <wp:extent cx="5400000" cy="3081818"/>
@@ -20097,9 +20300,9 @@
         <w:spacing w:line="480" w:lineRule="auto"/>
         <w:jc w:val="center"/>
       </w:pPr>
-      <w:bookmarkStart w:id="83" w:name="_Toc200446333"/>
-      <w:bookmarkStart w:id="84" w:name="_Toc200618695"/>
-      <w:bookmarkStart w:id="85" w:name="_Toc200619055"/>
+      <w:bookmarkStart w:id="103" w:name="_Toc200446333"/>
+      <w:bookmarkStart w:id="104" w:name="_Toc200618695"/>
+      <w:bookmarkStart w:id="105" w:name="_Toc208147398"/>
       <w:r>
         <w:t xml:space="preserve">Gambar 3. </w:t>
       </w:r>
@@ -20117,9 +20320,9 @@
       <w:r>
         <w:t>dashboard overview</w:t>
       </w:r>
-      <w:bookmarkEnd w:id="83"/>
-      <w:bookmarkEnd w:id="84"/>
-      <w:bookmarkEnd w:id="85"/>
+      <w:bookmarkEnd w:id="103"/>
+      <w:bookmarkEnd w:id="104"/>
+      <w:bookmarkEnd w:id="105"/>
     </w:p>
     <w:p>
       <w:pPr>
@@ -20137,7 +20340,6 @@
           <w:i/>
           <w:iCs/>
         </w:rPr>
-        <w:lastRenderedPageBreak/>
         <w:t>Dashboard</w:t>
       </w:r>
       <w:r>
@@ -20329,6 +20531,7 @@
         <w:jc w:val="both"/>
       </w:pPr>
       <w:r>
+        <w:lastRenderedPageBreak/>
         <w:t>Visualisasi ini dirancang sebagai informasi grafik tren sekaligus filter pada dashboard ini</w:t>
       </w:r>
       <w:r>
@@ -20402,7 +20605,6 @@
         <w:jc w:val="both"/>
       </w:pPr>
       <w:r>
-        <w:lastRenderedPageBreak/>
         <w:t>Garis horizontal putus-putus merupakan rata-rata dalam 10 tahun</w:t>
       </w:r>
     </w:p>
@@ -20497,6 +20699,7 @@
         <w:jc w:val="both"/>
       </w:pPr>
       <w:r>
+        <w:lastRenderedPageBreak/>
         <w:t>Visualisasi ini dirancang untuk mencari tahu Fakultas maupun Prodi mana yang paling diminati oleh mahasiswa baru</w:t>
       </w:r>
       <w:r>
@@ -20570,7 +20773,6 @@
         <w:rPr>
           <w:noProof/>
         </w:rPr>
-        <w:lastRenderedPageBreak/>
         <w:drawing>
           <wp:inline distT="0" distB="0" distL="0" distR="0" wp14:anchorId="7D6A7027" wp14:editId="079CA3AC">
             <wp:extent cx="5400000" cy="3084545"/>
@@ -20629,9 +20831,9 @@
         <w:spacing w:line="480" w:lineRule="auto"/>
         <w:jc w:val="center"/>
       </w:pPr>
-      <w:bookmarkStart w:id="86" w:name="_Toc200446334"/>
-      <w:bookmarkStart w:id="87" w:name="_Toc200618696"/>
-      <w:bookmarkStart w:id="88" w:name="_Toc200619056"/>
+      <w:bookmarkStart w:id="106" w:name="_Toc200446334"/>
+      <w:bookmarkStart w:id="107" w:name="_Toc200618696"/>
+      <w:bookmarkStart w:id="108" w:name="_Toc208147399"/>
       <w:r>
         <w:t xml:space="preserve">Gambar 3. </w:t>
       </w:r>
@@ -20649,9 +20851,9 @@
       <w:r>
         <w:t>dashboard demografi</w:t>
       </w:r>
-      <w:bookmarkEnd w:id="86"/>
-      <w:bookmarkEnd w:id="87"/>
-      <w:bookmarkEnd w:id="88"/>
+      <w:bookmarkEnd w:id="106"/>
+      <w:bookmarkEnd w:id="107"/>
+      <w:bookmarkEnd w:id="108"/>
     </w:p>
     <w:p>
       <w:pPr>
@@ -20669,6 +20871,7 @@
           <w:i/>
           <w:iCs/>
         </w:rPr>
+        <w:lastRenderedPageBreak/>
         <w:t>Dashboard</w:t>
       </w:r>
       <w:r>
@@ -20884,7 +21087,6 @@
           <w:i/>
           <w:iCs/>
         </w:rPr>
-        <w:lastRenderedPageBreak/>
         <w:t>Dashboard</w:t>
       </w:r>
       <w:r>
@@ -20982,6 +21184,7 @@
           <w:i/>
           <w:iCs/>
         </w:rPr>
+        <w:lastRenderedPageBreak/>
         <w:t>Dashboard</w:t>
       </w:r>
       <w:r>
@@ -21092,7 +21295,6 @@
         <w:jc w:val="both"/>
       </w:pPr>
       <w:r>
-        <w:lastRenderedPageBreak/>
         <w:t>Sebelah kiri tabel merupakan nama SLTA asal mahasiswa</w:t>
       </w:r>
     </w:p>
@@ -21195,6 +21397,7 @@
         <w:jc w:val="both"/>
       </w:pPr>
       <w:r>
+        <w:lastRenderedPageBreak/>
         <w:t>Semakin gelap warna biru suatu Provinsi, semakin mendominasi</w:t>
       </w:r>
     </w:p>
@@ -21316,7 +21519,6 @@
         <w:jc w:val="both"/>
       </w:pPr>
       <w:r>
-        <w:lastRenderedPageBreak/>
         <w:t>Perlu dipahami bahwa filter juga mempengaruhi dashboard lain</w:t>
       </w:r>
     </w:p>
@@ -21385,6 +21587,7 @@
         <w:rPr>
           <w:noProof/>
         </w:rPr>
+        <w:lastRenderedPageBreak/>
         <w:drawing>
           <wp:inline distT="0" distB="0" distL="0" distR="0" wp14:anchorId="1DC5653A" wp14:editId="3506C398">
             <wp:extent cx="5400000" cy="3084257"/>
@@ -21441,6 +21644,7 @@
           <w:rFonts w:ascii="Times New Roman" w:hAnsi="Times New Roman" w:cs="Times New Roman"/>
         </w:rPr>
       </w:pPr>
+      <w:bookmarkStart w:id="109" w:name="_Toc208147400"/>
       <w:r>
         <w:t xml:space="preserve">Gambar 3. </w:t>
       </w:r>
@@ -21455,6 +21659,7 @@
       <w:r>
         <w:t xml:space="preserve"> demo penggunaan dashboard overall</w:t>
       </w:r>
+      <w:bookmarkEnd w:id="109"/>
     </w:p>
     <w:p>
       <w:pPr>
@@ -21537,7 +21742,6 @@
         <w:rPr>
           <w:rFonts w:ascii="Times New Roman" w:hAnsi="Times New Roman" w:cs="Times New Roman"/>
         </w:rPr>
-        <w:lastRenderedPageBreak/>
         <w:t>Indikator Utama (</w:t>
       </w:r>
       <w:r>
@@ -21610,6 +21814,7 @@
         <w:rPr>
           <w:rFonts w:ascii="Times New Roman" w:hAnsi="Times New Roman" w:cs="Times New Roman"/>
         </w:rPr>
+        <w:lastRenderedPageBreak/>
         <w:t>6 Jalur Masuk: jumlah jenis jalur pendaftaran yang digunakan oleh mahasiswa baru di tahun tersebut.</w:t>
       </w:r>
     </w:p>
@@ -21746,7 +21951,6 @@
         <w:rPr>
           <w:rFonts w:ascii="Times New Roman" w:hAnsi="Times New Roman" w:cs="Times New Roman"/>
         </w:rPr>
-        <w:lastRenderedPageBreak/>
         <w:t xml:space="preserve">Distribusi jalur masuk pada gambar </w:t>
       </w:r>
       <w:r>
@@ -21779,6 +21983,7 @@
         <w:rPr>
           <w:rFonts w:ascii="Times New Roman" w:hAnsi="Times New Roman" w:cs="Times New Roman"/>
         </w:rPr>
+        <w:lastRenderedPageBreak/>
         <w:t>Jalur Nilai Rapor: 175 mahasiswa</w:t>
       </w:r>
     </w:p>
@@ -22032,6 +22237,7 @@
           <w:rFonts w:ascii="Times New Roman" w:hAnsi="Times New Roman" w:cs="Times New Roman"/>
         </w:rPr>
       </w:pPr>
+      <w:bookmarkStart w:id="110" w:name="_Toc208147401"/>
       <w:r>
         <w:t xml:space="preserve">Gambar 3. </w:t>
       </w:r>
@@ -22046,6 +22252,7 @@
       <w:r>
         <w:t xml:space="preserve"> demo penggunaan dashboard demografi</w:t>
       </w:r>
+      <w:bookmarkEnd w:id="110"/>
     </w:p>
     <w:p>
       <w:pPr>
@@ -23471,9 +23678,9 @@
           <w:rFonts w:ascii="Times New Roman" w:hAnsi="Times New Roman" w:cs="Times New Roman"/>
         </w:rPr>
       </w:pPr>
-      <w:bookmarkStart w:id="89" w:name="_Toc200446335"/>
-      <w:bookmarkStart w:id="90" w:name="_Toc200618697"/>
-      <w:bookmarkStart w:id="91" w:name="_Toc200619057"/>
+      <w:bookmarkStart w:id="111" w:name="_Toc200446335"/>
+      <w:bookmarkStart w:id="112" w:name="_Toc200618697"/>
+      <w:bookmarkStart w:id="113" w:name="_Toc208147402"/>
       <w:r>
         <w:t xml:space="preserve">Gambar 3. </w:t>
       </w:r>
@@ -23491,9 +23698,9 @@
       <w:r>
         <w:t>bar navigasi halaman utama</w:t>
       </w:r>
-      <w:bookmarkEnd w:id="89"/>
-      <w:bookmarkEnd w:id="90"/>
-      <w:bookmarkEnd w:id="91"/>
+      <w:bookmarkEnd w:id="111"/>
+      <w:bookmarkEnd w:id="112"/>
+      <w:bookmarkEnd w:id="113"/>
     </w:p>
     <w:p>
       <w:pPr>
@@ -23639,9 +23846,9 @@
           <w:rFonts w:ascii="Times New Roman" w:hAnsi="Times New Roman" w:cs="Times New Roman"/>
         </w:rPr>
       </w:pPr>
-      <w:bookmarkStart w:id="92" w:name="_Toc200446336"/>
-      <w:bookmarkStart w:id="93" w:name="_Toc200618698"/>
-      <w:bookmarkStart w:id="94" w:name="_Toc200619058"/>
+      <w:bookmarkStart w:id="114" w:name="_Toc200446336"/>
+      <w:bookmarkStart w:id="115" w:name="_Toc200618698"/>
+      <w:bookmarkStart w:id="116" w:name="_Toc208147403"/>
       <w:r>
         <w:t xml:space="preserve">Gambar 3. </w:t>
       </w:r>
@@ -23659,9 +23866,9 @@
       <w:r>
         <w:t>judul proyek pada halaman utama</w:t>
       </w:r>
-      <w:bookmarkEnd w:id="92"/>
-      <w:bookmarkEnd w:id="93"/>
-      <w:bookmarkEnd w:id="94"/>
+      <w:bookmarkEnd w:id="114"/>
+      <w:bookmarkEnd w:id="115"/>
+      <w:bookmarkEnd w:id="116"/>
     </w:p>
     <w:p>
       <w:pPr>
@@ -23804,9 +24011,9 @@
           <w:rFonts w:ascii="Times New Roman" w:hAnsi="Times New Roman" w:cs="Times New Roman"/>
         </w:rPr>
       </w:pPr>
-      <w:bookmarkStart w:id="95" w:name="_Toc200446337"/>
-      <w:bookmarkStart w:id="96" w:name="_Toc200618699"/>
-      <w:bookmarkStart w:id="97" w:name="_Toc200619059"/>
+      <w:bookmarkStart w:id="117" w:name="_Toc200446337"/>
+      <w:bookmarkStart w:id="118" w:name="_Toc200618699"/>
+      <w:bookmarkStart w:id="119" w:name="_Toc208147404"/>
       <w:r>
         <w:t xml:space="preserve">Gambar 3. </w:t>
       </w:r>
@@ -23824,9 +24031,9 @@
       <w:r>
         <w:t>permasalahan, tujuan, dan manfaat pada halaman utama</w:t>
       </w:r>
-      <w:bookmarkEnd w:id="95"/>
-      <w:bookmarkEnd w:id="96"/>
-      <w:bookmarkEnd w:id="97"/>
+      <w:bookmarkEnd w:id="117"/>
+      <w:bookmarkEnd w:id="118"/>
+      <w:bookmarkEnd w:id="119"/>
     </w:p>
     <w:p>
       <w:pPr>
@@ -23966,9 +24173,9 @@
           <w:rFonts w:ascii="Times New Roman" w:hAnsi="Times New Roman" w:cs="Times New Roman"/>
         </w:rPr>
       </w:pPr>
-      <w:bookmarkStart w:id="98" w:name="_Toc200446338"/>
-      <w:bookmarkStart w:id="99" w:name="_Toc200618700"/>
-      <w:bookmarkStart w:id="100" w:name="_Toc200619060"/>
+      <w:bookmarkStart w:id="120" w:name="_Toc200446338"/>
+      <w:bookmarkStart w:id="121" w:name="_Toc200618700"/>
+      <w:bookmarkStart w:id="122" w:name="_Toc208147405"/>
       <w:r>
         <w:t xml:space="preserve">Gambar 3. </w:t>
       </w:r>
@@ -23986,9 +24193,9 @@
       <w:r>
         <w:t>data pipeline pada halaman utama</w:t>
       </w:r>
-      <w:bookmarkEnd w:id="98"/>
-      <w:bookmarkEnd w:id="99"/>
-      <w:bookmarkEnd w:id="100"/>
+      <w:bookmarkEnd w:id="120"/>
+      <w:bookmarkEnd w:id="121"/>
+      <w:bookmarkEnd w:id="122"/>
     </w:p>
     <w:p>
       <w:pPr>
@@ -24178,9 +24385,9 @@
           <w:rFonts w:ascii="Times New Roman" w:hAnsi="Times New Roman" w:cs="Times New Roman"/>
         </w:rPr>
       </w:pPr>
-      <w:bookmarkStart w:id="101" w:name="_Toc200446339"/>
-      <w:bookmarkStart w:id="102" w:name="_Toc200618701"/>
-      <w:bookmarkStart w:id="103" w:name="_Toc200619061"/>
+      <w:bookmarkStart w:id="123" w:name="_Toc200446339"/>
+      <w:bookmarkStart w:id="124" w:name="_Toc200618701"/>
+      <w:bookmarkStart w:id="125" w:name="_Toc208147406"/>
       <w:r>
         <w:t xml:space="preserve">Gambar 3. </w:t>
       </w:r>
@@ -24198,9 +24405,9 @@
       <w:r>
         <w:t>funfact pada halaman utama</w:t>
       </w:r>
-      <w:bookmarkEnd w:id="101"/>
-      <w:bookmarkEnd w:id="102"/>
-      <w:bookmarkEnd w:id="103"/>
+      <w:bookmarkEnd w:id="123"/>
+      <w:bookmarkEnd w:id="124"/>
+      <w:bookmarkEnd w:id="125"/>
     </w:p>
     <w:p>
       <w:pPr>
@@ -24452,9 +24659,9 @@
           <w:rFonts w:ascii="Times New Roman" w:hAnsi="Times New Roman" w:cs="Times New Roman"/>
         </w:rPr>
       </w:pPr>
-      <w:bookmarkStart w:id="104" w:name="_Toc200446340"/>
-      <w:bookmarkStart w:id="105" w:name="_Toc200618702"/>
-      <w:bookmarkStart w:id="106" w:name="_Toc200619062"/>
+      <w:bookmarkStart w:id="126" w:name="_Toc200446340"/>
+      <w:bookmarkStart w:id="127" w:name="_Toc200618702"/>
+      <w:bookmarkStart w:id="128" w:name="_Toc208147407"/>
       <w:r>
         <w:t xml:space="preserve">Gambar 3. </w:t>
       </w:r>
@@ -24472,9 +24679,9 @@
       <w:r>
         <w:t>brainstorming dashboard pada halaman utama</w:t>
       </w:r>
-      <w:bookmarkEnd w:id="104"/>
-      <w:bookmarkEnd w:id="105"/>
-      <w:bookmarkEnd w:id="106"/>
+      <w:bookmarkEnd w:id="126"/>
+      <w:bookmarkEnd w:id="127"/>
+      <w:bookmarkEnd w:id="128"/>
     </w:p>
     <w:p>
       <w:pPr>
@@ -24606,9 +24813,9 @@
           <w:rFonts w:ascii="Times New Roman" w:hAnsi="Times New Roman" w:cs="Times New Roman"/>
         </w:rPr>
       </w:pPr>
-      <w:bookmarkStart w:id="107" w:name="_Toc200446341"/>
-      <w:bookmarkStart w:id="108" w:name="_Toc200618703"/>
-      <w:bookmarkStart w:id="109" w:name="_Toc200619063"/>
+      <w:bookmarkStart w:id="129" w:name="_Toc200446341"/>
+      <w:bookmarkStart w:id="130" w:name="_Toc200618703"/>
+      <w:bookmarkStart w:id="131" w:name="_Toc208147408"/>
       <w:r>
         <w:t xml:space="preserve">Gambar 3. </w:t>
       </w:r>
@@ -24626,9 +24833,9 @@
       <w:r>
         <w:t>ucapan terimakasih pada halaman utama</w:t>
       </w:r>
-      <w:bookmarkEnd w:id="107"/>
-      <w:bookmarkEnd w:id="108"/>
-      <w:bookmarkEnd w:id="109"/>
+      <w:bookmarkEnd w:id="129"/>
+      <w:bookmarkEnd w:id="130"/>
+      <w:bookmarkEnd w:id="131"/>
     </w:p>
     <w:p>
       <w:pPr>
@@ -24801,9 +25008,9 @@
           <w:rFonts w:ascii="Times New Roman" w:hAnsi="Times New Roman" w:cs="Times New Roman"/>
         </w:rPr>
       </w:pPr>
-      <w:bookmarkStart w:id="110" w:name="_Toc200446342"/>
-      <w:bookmarkStart w:id="111" w:name="_Toc200618704"/>
-      <w:bookmarkStart w:id="112" w:name="_Toc200619064"/>
+      <w:bookmarkStart w:id="132" w:name="_Toc200446342"/>
+      <w:bookmarkStart w:id="133" w:name="_Toc200618704"/>
+      <w:bookmarkStart w:id="134" w:name="_Toc208147409"/>
       <w:r>
         <w:t xml:space="preserve">Gambar 3. </w:t>
       </w:r>
@@ -24821,9 +25028,9 @@
       <w:r>
         <w:t>watermark pada halaman utama</w:t>
       </w:r>
-      <w:bookmarkEnd w:id="110"/>
-      <w:bookmarkEnd w:id="111"/>
-      <w:bookmarkEnd w:id="112"/>
+      <w:bookmarkEnd w:id="132"/>
+      <w:bookmarkEnd w:id="133"/>
+      <w:bookmarkEnd w:id="134"/>
     </w:p>
     <w:p>
       <w:pPr>
@@ -24991,9 +25198,9 @@
           <w:rFonts w:ascii="Times New Roman" w:hAnsi="Times New Roman" w:cs="Times New Roman"/>
         </w:rPr>
       </w:pPr>
-      <w:bookmarkStart w:id="113" w:name="_Toc200446343"/>
-      <w:bookmarkStart w:id="114" w:name="_Toc200618705"/>
-      <w:bookmarkStart w:id="115" w:name="_Toc200619065"/>
+      <w:bookmarkStart w:id="135" w:name="_Toc200446343"/>
+      <w:bookmarkStart w:id="136" w:name="_Toc200618705"/>
+      <w:bookmarkStart w:id="137" w:name="_Toc208147410"/>
       <w:r>
         <w:t xml:space="preserve">Gambar 3. </w:t>
       </w:r>
@@ -25011,9 +25218,9 @@
       <w:r>
         <w:t>bar navigasi halaman cara membaca</w:t>
       </w:r>
-      <w:bookmarkEnd w:id="113"/>
-      <w:bookmarkEnd w:id="114"/>
-      <w:bookmarkEnd w:id="115"/>
+      <w:bookmarkEnd w:id="135"/>
+      <w:bookmarkEnd w:id="136"/>
+      <w:bookmarkEnd w:id="137"/>
     </w:p>
     <w:p>
       <w:pPr>
@@ -25174,9 +25381,9 @@
           <w:rFonts w:ascii="Times New Roman" w:hAnsi="Times New Roman" w:cs="Times New Roman"/>
         </w:rPr>
       </w:pPr>
-      <w:bookmarkStart w:id="116" w:name="_Toc200446344"/>
-      <w:bookmarkStart w:id="117" w:name="_Toc200618706"/>
-      <w:bookmarkStart w:id="118" w:name="_Toc200619066"/>
+      <w:bookmarkStart w:id="138" w:name="_Toc200446344"/>
+      <w:bookmarkStart w:id="139" w:name="_Toc200618706"/>
+      <w:bookmarkStart w:id="140" w:name="_Toc208147411"/>
       <w:r>
         <w:t xml:space="preserve">Gambar 3. </w:t>
       </w:r>
@@ -25194,9 +25401,9 @@
       <w:r>
         <w:t>cara membaca pada halaman cara membaca dashboard</w:t>
       </w:r>
-      <w:bookmarkEnd w:id="116"/>
-      <w:bookmarkEnd w:id="117"/>
-      <w:bookmarkEnd w:id="118"/>
+      <w:bookmarkEnd w:id="138"/>
+      <w:bookmarkEnd w:id="139"/>
+      <w:bookmarkEnd w:id="140"/>
     </w:p>
     <w:p>
       <w:pPr>
@@ -25369,9 +25576,9 @@
           <w:rFonts w:ascii="Times New Roman" w:hAnsi="Times New Roman" w:cs="Times New Roman"/>
         </w:rPr>
       </w:pPr>
-      <w:bookmarkStart w:id="119" w:name="_Toc200446345"/>
-      <w:bookmarkStart w:id="120" w:name="_Toc200618707"/>
-      <w:bookmarkStart w:id="121" w:name="_Toc200619067"/>
+      <w:bookmarkStart w:id="141" w:name="_Toc200446345"/>
+      <w:bookmarkStart w:id="142" w:name="_Toc200618707"/>
+      <w:bookmarkStart w:id="143" w:name="_Toc208147412"/>
       <w:r>
         <w:t xml:space="preserve">Gambar 3. </w:t>
       </w:r>
@@ -25389,22 +25596,22 @@
       <w:r>
         <w:t>watermark pada halaman cara membaca</w:t>
       </w:r>
-      <w:bookmarkEnd w:id="119"/>
-      <w:bookmarkEnd w:id="120"/>
-      <w:bookmarkEnd w:id="121"/>
+      <w:bookmarkEnd w:id="141"/>
+      <w:bookmarkEnd w:id="142"/>
+      <w:bookmarkEnd w:id="143"/>
     </w:p>
     <w:p>
       <w:pPr>
         <w:pStyle w:val="Heading3"/>
       </w:pPr>
-      <w:bookmarkStart w:id="122" w:name="_Toc200619295"/>
+      <w:bookmarkStart w:id="144" w:name="_Toc200619295"/>
       <w:r>
         <w:t>B.</w:t>
       </w:r>
       <w:r>
         <w:t xml:space="preserve"> Kendala Pelaksanaan</w:t>
       </w:r>
-      <w:bookmarkEnd w:id="122"/>
+      <w:bookmarkEnd w:id="144"/>
     </w:p>
     <w:p>
       <w:pPr>
@@ -25845,7 +26052,7 @@
       <w:pPr>
         <w:pStyle w:val="Heading2"/>
       </w:pPr>
-      <w:bookmarkStart w:id="123" w:name="_Toc200619296"/>
+      <w:bookmarkStart w:id="145" w:name="_Toc200619296"/>
       <w:r>
         <w:lastRenderedPageBreak/>
         <w:t>BAB IV</w:t>
@@ -25854,20 +26061,20 @@
         <w:br/>
         <w:t>PENUTUP</w:t>
       </w:r>
-      <w:bookmarkEnd w:id="123"/>
+      <w:bookmarkEnd w:id="145"/>
     </w:p>
     <w:p>
       <w:pPr>
         <w:pStyle w:val="Heading3"/>
       </w:pPr>
-      <w:bookmarkStart w:id="124" w:name="_Toc200619297"/>
+      <w:bookmarkStart w:id="146" w:name="_Toc200619297"/>
       <w:r>
         <w:t xml:space="preserve">A. </w:t>
       </w:r>
       <w:r>
         <w:t>Kesimpulan</w:t>
       </w:r>
-      <w:bookmarkEnd w:id="124"/>
+      <w:bookmarkEnd w:id="146"/>
     </w:p>
     <w:p>
       <w:pPr>
@@ -25983,14 +26190,14 @@
       <w:pPr>
         <w:pStyle w:val="Heading3"/>
       </w:pPr>
-      <w:bookmarkStart w:id="125" w:name="_Toc200619298"/>
+      <w:bookmarkStart w:id="147" w:name="_Toc200619298"/>
       <w:r>
         <w:t xml:space="preserve">B. </w:t>
       </w:r>
       <w:r>
         <w:t>Saran</w:t>
       </w:r>
-      <w:bookmarkEnd w:id="125"/>
+      <w:bookmarkEnd w:id="147"/>
     </w:p>
     <w:p>
       <w:pPr>
@@ -26056,12 +26263,12 @@
       <w:pPr>
         <w:pStyle w:val="Heading2"/>
       </w:pPr>
-      <w:bookmarkStart w:id="126" w:name="_Toc200619299"/>
+      <w:bookmarkStart w:id="148" w:name="_Toc200619299"/>
       <w:r>
         <w:lastRenderedPageBreak/>
         <w:t>DAFTAR PUSTAKA</w:t>
       </w:r>
-      <w:bookmarkEnd w:id="126"/>
+      <w:bookmarkEnd w:id="148"/>
     </w:p>
     <w:sdt>
       <w:sdtPr>
@@ -34335,6 +34542,7 @@
     <w:rsid w:val="000450FD"/>
     <w:rsid w:val="001D4EF9"/>
     <w:rsid w:val="00206D59"/>
+    <w:rsid w:val="002471AA"/>
     <w:rsid w:val="0029117C"/>
     <w:rsid w:val="002A4EB4"/>
     <w:rsid w:val="002E4447"/>
@@ -34349,12 +34557,14 @@
     <w:rsid w:val="0081424B"/>
     <w:rsid w:val="008F2E33"/>
     <w:rsid w:val="00966163"/>
+    <w:rsid w:val="00970281"/>
     <w:rsid w:val="00A00705"/>
     <w:rsid w:val="00AB1197"/>
     <w:rsid w:val="00B634C8"/>
     <w:rsid w:val="00BB0A64"/>
     <w:rsid w:val="00BB2A6A"/>
     <w:rsid w:val="00C53D3B"/>
+    <w:rsid w:val="00CE74A5"/>
     <w:rsid w:val="00D9167C"/>
     <w:rsid w:val="00E03E23"/>
     <w:rsid w:val="00E704EB"/>

</xml_diff>

<commit_message>
abis nyelesein deskripsi proyek yg jurnal sama nyicil beresin space kosong di bagian distribusi. next tinggal lanjutin beresin space kosongnya tok
</commit_message>
<xml_diff>
--- a/non-website/Laporan Akhir KP/2203040182 - Dhika Ramadhan Saputra - Laporan KP - Revisi 1.docx
+++ b/non-website/Laporan Akhir KP/2203040182 - Dhika Ramadhan Saputra - Laporan KP - Revisi 1.docx
@@ -2233,7 +2233,7 @@
               <w:rPr>
                 <w:webHidden/>
               </w:rPr>
-              <w:t>vii</w:t>
+              <w:t>vi</w:t>
             </w:r>
             <w:r>
               <w:rPr>
@@ -2290,7 +2290,7 @@
               <w:rPr>
                 <w:webHidden/>
               </w:rPr>
-              <w:t>ix</w:t>
+              <w:t>viii</w:t>
             </w:r>
             <w:r>
               <w:rPr>
@@ -2501,7 +2501,7 @@
                 <w:noProof/>
                 <w:webHidden/>
               </w:rPr>
-              <w:t>2</w:t>
+              <w:t>3</w:t>
             </w:r>
             <w:r>
               <w:rPr>
@@ -2579,7 +2579,7 @@
                 <w:noProof/>
                 <w:webHidden/>
               </w:rPr>
-              <w:t>4</w:t>
+              <w:t>5</w:t>
             </w:r>
             <w:r>
               <w:rPr>
@@ -2657,7 +2657,7 @@
                 <w:noProof/>
                 <w:webHidden/>
               </w:rPr>
-              <w:t>5</w:t>
+              <w:t>8</w:t>
             </w:r>
             <w:r>
               <w:rPr>
@@ -2716,7 +2716,7 @@
               <w:rPr>
                 <w:webHidden/>
               </w:rPr>
-              <w:t>6</w:t>
+              <w:t>10</w:t>
             </w:r>
             <w:r>
               <w:rPr>
@@ -2792,7 +2792,7 @@
                 <w:noProof/>
                 <w:webHidden/>
               </w:rPr>
-              <w:t>6</w:t>
+              <w:t>10</w:t>
             </w:r>
             <w:r>
               <w:rPr>
@@ -2870,7 +2870,7 @@
                 <w:noProof/>
                 <w:webHidden/>
               </w:rPr>
-              <w:t>6</w:t>
+              <w:t>10</w:t>
             </w:r>
             <w:r>
               <w:rPr>
@@ -2948,7 +2948,7 @@
                 <w:noProof/>
                 <w:webHidden/>
               </w:rPr>
-              <w:t>7</w:t>
+              <w:t>11</w:t>
             </w:r>
             <w:r>
               <w:rPr>
@@ -3007,7 +3007,7 @@
               <w:rPr>
                 <w:webHidden/>
               </w:rPr>
-              <w:t>8</w:t>
+              <w:t>12</w:t>
             </w:r>
             <w:r>
               <w:rPr>
@@ -3083,7 +3083,7 @@
                 <w:noProof/>
                 <w:webHidden/>
               </w:rPr>
-              <w:t>8</w:t>
+              <w:t>12</w:t>
             </w:r>
             <w:r>
               <w:rPr>
@@ -3161,7 +3161,7 @@
                 <w:noProof/>
                 <w:webHidden/>
               </w:rPr>
-              <w:t>40</w:t>
+              <w:t>77</w:t>
             </w:r>
             <w:r>
               <w:rPr>
@@ -3220,7 +3220,7 @@
               <w:rPr>
                 <w:webHidden/>
               </w:rPr>
-              <w:t>42</w:t>
+              <w:t>79</w:t>
             </w:r>
             <w:r>
               <w:rPr>
@@ -3296,7 +3296,7 @@
                 <w:noProof/>
                 <w:webHidden/>
               </w:rPr>
-              <w:t>42</w:t>
+              <w:t>79</w:t>
             </w:r>
             <w:r>
               <w:rPr>
@@ -3374,7 +3374,7 @@
                 <w:noProof/>
                 <w:webHidden/>
               </w:rPr>
-              <w:t>42</w:t>
+              <w:t>79</w:t>
             </w:r>
             <w:r>
               <w:rPr>
@@ -3433,7 +3433,7 @@
               <w:rPr>
                 <w:webHidden/>
               </w:rPr>
-              <w:t>43</w:t>
+              <w:t>80</w:t>
             </w:r>
             <w:r>
               <w:rPr>
@@ -3544,23 +3544,7 @@
             <w:rFonts w:ascii="Times New Roman" w:hAnsi="Times New Roman" w:cs="Times New Roman"/>
             <w:noProof/>
           </w:rPr>
-          <w:t>Gambar 1. 1 tahapan pela</w:t>
-        </w:r>
-        <w:r>
-          <w:rPr>
-            <w:rStyle w:val="Hyperlink"/>
-            <w:rFonts w:ascii="Times New Roman" w:hAnsi="Times New Roman" w:cs="Times New Roman"/>
-            <w:noProof/>
-          </w:rPr>
-          <w:t>k</w:t>
-        </w:r>
-        <w:r>
-          <w:rPr>
-            <w:rStyle w:val="Hyperlink"/>
-            <w:rFonts w:ascii="Times New Roman" w:hAnsi="Times New Roman" w:cs="Times New Roman"/>
-            <w:noProof/>
-          </w:rPr>
-          <w:t>sanaan</w:t>
+          <w:t>Gambar 1. 1 tahapan pelaksanaan</w:t>
         </w:r>
         <w:r>
           <w:rPr>
@@ -3661,23 +3645,7 @@
             <w:rFonts w:ascii="Times New Roman" w:hAnsi="Times New Roman" w:cs="Times New Roman"/>
             <w:noProof/>
           </w:rPr>
-          <w:t>Gambar 2. 1 struk</w:t>
-        </w:r>
-        <w:r>
-          <w:rPr>
-            <w:rStyle w:val="Hyperlink"/>
-            <w:rFonts w:ascii="Times New Roman" w:hAnsi="Times New Roman" w:cs="Times New Roman"/>
-            <w:noProof/>
-          </w:rPr>
-          <w:t>t</w:t>
-        </w:r>
-        <w:r>
-          <w:rPr>
-            <w:rStyle w:val="Hyperlink"/>
-            <w:rFonts w:ascii="Times New Roman" w:hAnsi="Times New Roman" w:cs="Times New Roman"/>
-            <w:noProof/>
-          </w:rPr>
-          <w:t>ur umum organisasi mitra</w:t>
+          <w:t>Gambar 2. 1 struktur umum organisasi mitra</w:t>
         </w:r>
         <w:r>
           <w:rPr>
@@ -3778,7 +3746,7 @@
             <w:rFonts w:ascii="Times New Roman" w:hAnsi="Times New Roman" w:cs="Times New Roman"/>
             <w:noProof/>
           </w:rPr>
-          <w:t>Gambar 3. 1 dokumentasi penerim</w:t>
+          <w:t>Gambar 3. 1 doku</w:t>
         </w:r>
         <w:r>
           <w:rPr>
@@ -3786,7 +3754,7 @@
             <w:rFonts w:ascii="Times New Roman" w:hAnsi="Times New Roman" w:cs="Times New Roman"/>
             <w:noProof/>
           </w:rPr>
-          <w:t>a</w:t>
+          <w:t>m</w:t>
         </w:r>
         <w:r>
           <w:rPr>
@@ -3794,7 +3762,7 @@
             <w:rFonts w:ascii="Times New Roman" w:hAnsi="Times New Roman" w:cs="Times New Roman"/>
             <w:noProof/>
           </w:rPr>
-          <w:t>an data via Whatsapp</w:t>
+          <w:t>entasi penerimaan data via Whatsapp</w:t>
         </w:r>
         <w:r>
           <w:rPr>
@@ -3841,7 +3809,7 @@
             <w:noProof/>
             <w:webHidden/>
           </w:rPr>
-          <w:t>13</w:t>
+          <w:t>12</w:t>
         </w:r>
         <w:r>
           <w:rPr>
@@ -4072,7 +4040,7 @@
             <w:noProof/>
             <w:webHidden/>
           </w:rPr>
-          <w:t>15</w:t>
+          <w:t>14</w:t>
         </w:r>
         <w:r>
           <w:rPr>
@@ -4226,7 +4194,7 @@
             <w:noProof/>
             <w:webHidden/>
           </w:rPr>
-          <w:t>16</w:t>
+          <w:t>15</w:t>
         </w:r>
         <w:r>
           <w:rPr>
@@ -4380,7 +4348,7 @@
             <w:noProof/>
             <w:webHidden/>
           </w:rPr>
-          <w:t>18</w:t>
+          <w:t>17</w:t>
         </w:r>
         <w:r>
           <w:rPr>
@@ -4457,7 +4425,7 @@
             <w:noProof/>
             <w:webHidden/>
           </w:rPr>
-          <w:t>19</w:t>
+          <w:t>18</w:t>
         </w:r>
         <w:r>
           <w:rPr>
@@ -4534,7 +4502,7 @@
             <w:noProof/>
             <w:webHidden/>
           </w:rPr>
-          <w:t>19</w:t>
+          <w:t>18</w:t>
         </w:r>
         <w:r>
           <w:rPr>
@@ -4611,7 +4579,7 @@
             <w:noProof/>
             <w:webHidden/>
           </w:rPr>
-          <w:t>20</w:t>
+          <w:t>19</w:t>
         </w:r>
         <w:r>
           <w:rPr>
@@ -4688,7 +4656,7 @@
             <w:noProof/>
             <w:webHidden/>
           </w:rPr>
-          <w:t>22</w:t>
+          <w:t>21</w:t>
         </w:r>
         <w:r>
           <w:rPr>
@@ -4765,7 +4733,7 @@
             <w:noProof/>
             <w:webHidden/>
           </w:rPr>
-          <w:t>23</w:t>
+          <w:t>22</w:t>
         </w:r>
         <w:r>
           <w:rPr>
@@ -4842,7 +4810,7 @@
             <w:noProof/>
             <w:webHidden/>
           </w:rPr>
-          <w:t>24</w:t>
+          <w:t>23</w:t>
         </w:r>
         <w:r>
           <w:rPr>
@@ -4919,7 +4887,7 @@
             <w:noProof/>
             <w:webHidden/>
           </w:rPr>
-          <w:t>25</w:t>
+          <w:t>24</w:t>
         </w:r>
         <w:r>
           <w:rPr>
@@ -4996,7 +4964,7 @@
             <w:noProof/>
             <w:webHidden/>
           </w:rPr>
-          <w:t>27</w:t>
+          <w:t>26</w:t>
         </w:r>
         <w:r>
           <w:rPr>
@@ -5073,7 +5041,7 @@
             <w:noProof/>
             <w:webHidden/>
           </w:rPr>
-          <w:t>28</w:t>
+          <w:t>27</w:t>
         </w:r>
         <w:r>
           <w:rPr>
@@ -5150,7 +5118,7 @@
             <w:noProof/>
             <w:webHidden/>
           </w:rPr>
-          <w:t>30</w:t>
+          <w:t>29</w:t>
         </w:r>
         <w:r>
           <w:rPr>
@@ -5227,7 +5195,7 @@
             <w:noProof/>
             <w:webHidden/>
           </w:rPr>
-          <w:t>31</w:t>
+          <w:t>30</w:t>
         </w:r>
         <w:r>
           <w:rPr>
@@ -5304,7 +5272,7 @@
             <w:noProof/>
             <w:webHidden/>
           </w:rPr>
-          <w:t>32</w:t>
+          <w:t>31</w:t>
         </w:r>
         <w:r>
           <w:rPr>
@@ -5381,7 +5349,7 @@
             <w:noProof/>
             <w:webHidden/>
           </w:rPr>
-          <w:t>33</w:t>
+          <w:t>32</w:t>
         </w:r>
         <w:r>
           <w:rPr>
@@ -5458,7 +5426,7 @@
             <w:noProof/>
             <w:webHidden/>
           </w:rPr>
-          <w:t>34</w:t>
+          <w:t>33</w:t>
         </w:r>
         <w:r>
           <w:rPr>
@@ -5535,7 +5503,7 @@
             <w:noProof/>
             <w:webHidden/>
           </w:rPr>
-          <w:t>35</w:t>
+          <w:t>34</w:t>
         </w:r>
         <w:r>
           <w:rPr>
@@ -5612,7 +5580,7 @@
             <w:noProof/>
             <w:webHidden/>
           </w:rPr>
-          <w:t>36</w:t>
+          <w:t>35</w:t>
         </w:r>
         <w:r>
           <w:rPr>
@@ -5689,7 +5657,7 @@
             <w:noProof/>
             <w:webHidden/>
           </w:rPr>
-          <w:t>38</w:t>
+          <w:t>37</w:t>
         </w:r>
         <w:r>
           <w:rPr>
@@ -5766,7 +5734,7 @@
             <w:noProof/>
             <w:webHidden/>
           </w:rPr>
-          <w:t>39</w:t>
+          <w:t>38</w:t>
         </w:r>
         <w:r>
           <w:rPr>
@@ -5843,7 +5811,7 @@
             <w:noProof/>
             <w:webHidden/>
           </w:rPr>
-          <w:t>40</w:t>
+          <w:t>39</w:t>
         </w:r>
         <w:r>
           <w:rPr>
@@ -5920,7 +5888,7 @@
             <w:noProof/>
             <w:webHidden/>
           </w:rPr>
-          <w:t>40</w:t>
+          <w:t>39</w:t>
         </w:r>
         <w:r>
           <w:rPr>
@@ -5997,7 +5965,7 @@
             <w:noProof/>
             <w:webHidden/>
           </w:rPr>
-          <w:t>41</w:t>
+          <w:t>40</w:t>
         </w:r>
         <w:r>
           <w:rPr>
@@ -6074,7 +6042,7 @@
             <w:noProof/>
             <w:webHidden/>
           </w:rPr>
-          <w:t>42</w:t>
+          <w:t>41</w:t>
         </w:r>
         <w:r>
           <w:rPr>
@@ -6151,7 +6119,7 @@
             <w:noProof/>
             <w:webHidden/>
           </w:rPr>
-          <w:t>44</w:t>
+          <w:t>43</w:t>
         </w:r>
         <w:r>
           <w:rPr>
@@ -6228,7 +6196,7 @@
             <w:noProof/>
             <w:webHidden/>
           </w:rPr>
-          <w:t>45</w:t>
+          <w:t>44</w:t>
         </w:r>
         <w:r>
           <w:rPr>
@@ -6305,7 +6273,7 @@
             <w:noProof/>
             <w:webHidden/>
           </w:rPr>
-          <w:t>47</w:t>
+          <w:t>46</w:t>
         </w:r>
         <w:r>
           <w:rPr>
@@ -6382,7 +6350,7 @@
             <w:noProof/>
             <w:webHidden/>
           </w:rPr>
-          <w:t>48</w:t>
+          <w:t>47</w:t>
         </w:r>
         <w:r>
           <w:rPr>
@@ -6459,7 +6427,7 @@
             <w:noProof/>
             <w:webHidden/>
           </w:rPr>
-          <w:t>50</w:t>
+          <w:t>49</w:t>
         </w:r>
         <w:r>
           <w:rPr>
@@ -6536,7 +6504,7 @@
             <w:noProof/>
             <w:webHidden/>
           </w:rPr>
-          <w:t>51</w:t>
+          <w:t>50</w:t>
         </w:r>
         <w:r>
           <w:rPr>
@@ -6613,7 +6581,7 @@
             <w:noProof/>
             <w:webHidden/>
           </w:rPr>
-          <w:t>51</w:t>
+          <w:t>50</w:t>
         </w:r>
         <w:r>
           <w:rPr>
@@ -6690,7 +6658,7 @@
             <w:noProof/>
             <w:webHidden/>
           </w:rPr>
-          <w:t>52</w:t>
+          <w:t>51</w:t>
         </w:r>
         <w:r>
           <w:rPr>
@@ -6767,7 +6735,7 @@
             <w:noProof/>
             <w:webHidden/>
           </w:rPr>
-          <w:t>55</w:t>
+          <w:t>54</w:t>
         </w:r>
         <w:r>
           <w:rPr>
@@ -6844,7 +6812,7 @@
             <w:noProof/>
             <w:webHidden/>
           </w:rPr>
-          <w:t>57</w:t>
+          <w:t>56</w:t>
         </w:r>
         <w:r>
           <w:rPr>
@@ -6921,7 +6889,7 @@
             <w:noProof/>
             <w:webHidden/>
           </w:rPr>
-          <w:t>61</w:t>
+          <w:t>60</w:t>
         </w:r>
         <w:r>
           <w:rPr>
@@ -6998,7 +6966,7 @@
             <w:noProof/>
             <w:webHidden/>
           </w:rPr>
-          <w:t>64</w:t>
+          <w:t>63</w:t>
         </w:r>
         <w:r>
           <w:rPr>
@@ -7075,7 +7043,7 @@
             <w:noProof/>
             <w:webHidden/>
           </w:rPr>
-          <w:t>69</w:t>
+          <w:t>68</w:t>
         </w:r>
         <w:r>
           <w:rPr>
@@ -7152,7 +7120,7 @@
             <w:noProof/>
             <w:webHidden/>
           </w:rPr>
-          <w:t>70</w:t>
+          <w:t>69</w:t>
         </w:r>
         <w:r>
           <w:rPr>
@@ -7229,7 +7197,7 @@
             <w:noProof/>
             <w:webHidden/>
           </w:rPr>
-          <w:t>71</w:t>
+          <w:t>70</w:t>
         </w:r>
         <w:r>
           <w:rPr>
@@ -7306,7 +7274,7 @@
             <w:noProof/>
             <w:webHidden/>
           </w:rPr>
-          <w:t>72</w:t>
+          <w:t>71</w:t>
         </w:r>
         <w:r>
           <w:rPr>
@@ -7383,7 +7351,7 @@
             <w:noProof/>
             <w:webHidden/>
           </w:rPr>
-          <w:t>73</w:t>
+          <w:t>72</w:t>
         </w:r>
         <w:r>
           <w:rPr>
@@ -7460,7 +7428,7 @@
             <w:noProof/>
             <w:webHidden/>
           </w:rPr>
-          <w:t>74</w:t>
+          <w:t>73</w:t>
         </w:r>
         <w:r>
           <w:rPr>
@@ -7537,7 +7505,7 @@
             <w:noProof/>
             <w:webHidden/>
           </w:rPr>
-          <w:t>75</w:t>
+          <w:t>74</w:t>
         </w:r>
         <w:r>
           <w:rPr>
@@ -7614,7 +7582,7 @@
             <w:noProof/>
             <w:webHidden/>
           </w:rPr>
-          <w:t>76</w:t>
+          <w:t>75</w:t>
         </w:r>
         <w:r>
           <w:rPr>
@@ -7691,7 +7659,7 @@
             <w:noProof/>
             <w:webHidden/>
           </w:rPr>
-          <w:t>77</w:t>
+          <w:t>76</w:t>
         </w:r>
         <w:r>
           <w:rPr>
@@ -7768,7 +7736,7 @@
             <w:noProof/>
             <w:webHidden/>
           </w:rPr>
-          <w:t>77</w:t>
+          <w:t>76</w:t>
         </w:r>
         <w:r>
           <w:rPr>
@@ -7845,7 +7813,7 @@
             <w:noProof/>
             <w:webHidden/>
           </w:rPr>
-          <w:t>78</w:t>
+          <w:t>77</w:t>
         </w:r>
         <w:r>
           <w:rPr>
@@ -8334,6 +8302,80 @@
         </w:rPr>
         <w:t>.</w:t>
       </w:r>
+      <w:r>
+        <w:rPr>
+          <w:rFonts w:ascii="Times New Roman" w:hAnsi="Times New Roman" w:cs="Times New Roman"/>
+        </w:rPr>
+        <w:t xml:space="preserve"> </w:t>
+      </w:r>
+      <w:r>
+        <w:rPr>
+          <w:rFonts w:ascii="Times New Roman" w:hAnsi="Times New Roman" w:cs="Times New Roman"/>
+        </w:rPr>
+        <w:t>Sejalan dengan hal tersebut, studi oleh</w:t>
+      </w:r>
+      <w:r>
+        <w:rPr>
+          <w:rFonts w:ascii="Times New Roman" w:hAnsi="Times New Roman" w:cs="Times New Roman"/>
+        </w:rPr>
+        <w:t xml:space="preserve"> </w:t>
+      </w:r>
+      <w:sdt>
+        <w:sdtPr>
+          <w:rPr>
+            <w:rFonts w:ascii="Times New Roman" w:hAnsi="Times New Roman" w:cs="Times New Roman"/>
+            <w:color w:val="000000"/>
+          </w:rPr>
+          <w:tag w:val="MENDELEY_CITATION_v3_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"/>
+          <w:id w:val="-928580275"/>
+          <w:placeholder>
+            <w:docPart w:val="DefaultPlaceholder_-1854013440"/>
+          </w:placeholder>
+        </w:sdtPr>
+        <w:sdtContent>
+          <w:r>
+            <w:rPr>
+              <w:rFonts w:ascii="Times New Roman" w:hAnsi="Times New Roman" w:cs="Times New Roman"/>
+              <w:color w:val="000000"/>
+            </w:rPr>
+            <w:t>(Santhi et al., 2023)</w:t>
+          </w:r>
+        </w:sdtContent>
+      </w:sdt>
+      <w:r>
+        <w:rPr>
+          <w:rFonts w:ascii="Times New Roman" w:hAnsi="Times New Roman" w:cs="Times New Roman"/>
+        </w:rPr>
+        <w:t xml:space="preserve"> menegaskan bahwa dashboard berbasis Tableau dapat mempermudah analisis data dan pengambilan keputusan di perguruan tinggi, sementara penelitian lain menunjukkan manfaat serupa dalam visualisasi data penerimaan mahasiswa baru sebagai alat strategi pemasaran </w:t>
+      </w:r>
+      <w:sdt>
+        <w:sdtPr>
+          <w:rPr>
+            <w:rFonts w:ascii="Times New Roman" w:hAnsi="Times New Roman" w:cs="Times New Roman"/>
+            <w:color w:val="000000"/>
+          </w:rPr>
+          <w:tag w:val="MENDELEY_CITATION_v3_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"/>
+          <w:id w:val="704147857"/>
+          <w:placeholder>
+            <w:docPart w:val="DefaultPlaceholder_-1854013440"/>
+          </w:placeholder>
+        </w:sdtPr>
+        <w:sdtContent>
+          <w:r>
+            <w:rPr>
+              <w:rFonts w:ascii="Times New Roman" w:hAnsi="Times New Roman" w:cs="Times New Roman"/>
+              <w:color w:val="000000"/>
+            </w:rPr>
+            <w:t>(Anhari et al., 2025)</w:t>
+          </w:r>
+        </w:sdtContent>
+      </w:sdt>
+      <w:r>
+        <w:rPr>
+          <w:rFonts w:ascii="Times New Roman" w:hAnsi="Times New Roman" w:cs="Times New Roman"/>
+        </w:rPr>
+        <w:t>.</w:t>
+      </w:r>
     </w:p>
     <w:p>
       <w:pPr>
@@ -8456,6 +8498,7 @@
       </w:pPr>
       <w:bookmarkStart w:id="14" w:name="_Toc200619286"/>
       <w:r>
+        <w:lastRenderedPageBreak/>
         <w:t>B. Ruang Lingkup</w:t>
       </w:r>
       <w:bookmarkEnd w:id="14"/>
@@ -8527,7 +8570,6 @@
         <w:rPr>
           <w:rFonts w:ascii="Times New Roman" w:hAnsi="Times New Roman" w:cs="Times New Roman"/>
         </w:rPr>
-        <w:lastRenderedPageBreak/>
         <w:t>Data pendaftar mahasiswa baru</w:t>
       </w:r>
       <w:r>
@@ -8760,6 +8802,7 @@
         <w:rPr>
           <w:rFonts w:ascii="Times New Roman" w:hAnsi="Times New Roman" w:cs="Times New Roman"/>
         </w:rPr>
+        <w:lastRenderedPageBreak/>
         <w:t>Proyek ini berfokus pada eksplorasi data historis</w:t>
       </w:r>
       <w:r>
@@ -8853,23 +8896,10 @@
     </w:p>
     <w:p>
       <w:pPr>
-        <w:rPr>
-          <w:rFonts w:ascii="Times New Roman" w:eastAsiaTheme="majorEastAsia" w:hAnsi="Times New Roman" w:cstheme="majorBidi"/>
-          <w:b/>
-          <w:szCs w:val="28"/>
-        </w:rPr>
-      </w:pPr>
-      <w:r>
-        <w:br w:type="page"/>
-      </w:r>
-    </w:p>
-    <w:p>
-      <w:pPr>
         <w:pStyle w:val="Heading3"/>
       </w:pPr>
       <w:bookmarkStart w:id="15" w:name="_Toc200619287"/>
       <w:r>
-        <w:lastRenderedPageBreak/>
         <w:t>C. Tahapan Pelaksanaan</w:t>
       </w:r>
       <w:bookmarkEnd w:id="15"/>
@@ -8914,9 +8944,9 @@
           <w:noProof/>
         </w:rPr>
         <w:drawing>
-          <wp:inline distT="0" distB="0" distL="0" distR="0" wp14:anchorId="091CD487" wp14:editId="1AE06545">
-            <wp:extent cx="3095625" cy="5831467"/>
-            <wp:effectExtent l="0" t="0" r="0" b="0"/>
+          <wp:inline distT="0" distB="0" distL="0" distR="0" wp14:anchorId="091CD487" wp14:editId="772FE21C">
+            <wp:extent cx="2293261" cy="4320000"/>
+            <wp:effectExtent l="0" t="0" r="0" b="4445"/>
             <wp:docPr id="426171956" name="Picture 1"/>
             <wp:cNvGraphicFramePr>
               <a:graphicFrameLocks xmlns:a="http://schemas.openxmlformats.org/drawingml/2006/main" noChangeAspect="1"/>
@@ -8943,7 +8973,7 @@
                   <pic:spPr>
                     <a:xfrm>
                       <a:off x="0" y="0"/>
-                      <a:ext cx="3098551" cy="5836978"/>
+                      <a:ext cx="2293261" cy="4320000"/>
                     </a:xfrm>
                     <a:prstGeom prst="rect">
                       <a:avLst/>
@@ -8968,14 +8998,27 @@
       <w:r>
         <w:t xml:space="preserve">Gambar 1. </w:t>
       </w:r>
-      <w:fldSimple w:instr=" SEQ Gambar_1. \* ARABIC ">
-        <w:r>
-          <w:rPr>
-            <w:noProof/>
-          </w:rPr>
-          <w:t>1</w:t>
-        </w:r>
-      </w:fldSimple>
+      <w:r>
+        <w:fldChar w:fldCharType="begin"/>
+      </w:r>
+      <w:r>
+        <w:instrText xml:space="preserve"> SEQ Gambar_1. \* ARABIC </w:instrText>
+      </w:r>
+      <w:r>
+        <w:fldChar w:fldCharType="separate"/>
+      </w:r>
+      <w:r>
+        <w:rPr>
+          <w:noProof/>
+        </w:rPr>
+        <w:t>1</w:t>
+      </w:r>
+      <w:r>
+        <w:rPr>
+          <w:noProof/>
+        </w:rPr>
+        <w:fldChar w:fldCharType="end"/>
+      </w:r>
       <w:r>
         <w:t xml:space="preserve"> tahapan pelaksanaan</w:t>
       </w:r>
@@ -9778,14 +9821,27 @@
       <w:r>
         <w:t xml:space="preserve">Tabel 1. </w:t>
       </w:r>
-      <w:fldSimple w:instr=" SEQ Tabel_1. \* ARABIC ">
-        <w:r>
-          <w:rPr>
-            <w:noProof/>
-          </w:rPr>
-          <w:t>1</w:t>
-        </w:r>
-      </w:fldSimple>
+      <w:r>
+        <w:fldChar w:fldCharType="begin"/>
+      </w:r>
+      <w:r>
+        <w:instrText xml:space="preserve"> SEQ Tabel_1. \* ARABIC </w:instrText>
+      </w:r>
+      <w:r>
+        <w:fldChar w:fldCharType="separate"/>
+      </w:r>
+      <w:r>
+        <w:rPr>
+          <w:noProof/>
+        </w:rPr>
+        <w:t>1</w:t>
+      </w:r>
+      <w:r>
+        <w:rPr>
+          <w:noProof/>
+        </w:rPr>
+        <w:fldChar w:fldCharType="end"/>
+      </w:r>
       <w:r>
         <w:t xml:space="preserve"> jadwal pelaksanaan</w:t>
       </w:r>
@@ -12097,14 +12153,27 @@
       <w:r>
         <w:t xml:space="preserve">Gambar 2. </w:t>
       </w:r>
-      <w:fldSimple w:instr=" SEQ Gambar_2. \* ARABIC ">
-        <w:r>
-          <w:rPr>
-            <w:noProof/>
-          </w:rPr>
-          <w:t>1</w:t>
-        </w:r>
-      </w:fldSimple>
+      <w:r>
+        <w:fldChar w:fldCharType="begin"/>
+      </w:r>
+      <w:r>
+        <w:instrText xml:space="preserve"> SEQ Gambar_2. \* ARABIC </w:instrText>
+      </w:r>
+      <w:r>
+        <w:fldChar w:fldCharType="separate"/>
+      </w:r>
+      <w:r>
+        <w:rPr>
+          <w:noProof/>
+        </w:rPr>
+        <w:t>1</w:t>
+      </w:r>
+      <w:r>
+        <w:rPr>
+          <w:noProof/>
+        </w:rPr>
+        <w:fldChar w:fldCharType="end"/>
+      </w:r>
       <w:r>
         <w:t xml:space="preserve"> struktur umum organisasi mitra</w:t>
       </w:r>
@@ -12571,14 +12640,27 @@
       <w:r>
         <w:t xml:space="preserve">Gambar 3. </w:t>
       </w:r>
-      <w:fldSimple w:instr=" SEQ Gambar_3. \* ARABIC ">
-        <w:r>
-          <w:rPr>
-            <w:noProof/>
-          </w:rPr>
-          <w:t>1</w:t>
-        </w:r>
-      </w:fldSimple>
+      <w:r>
+        <w:fldChar w:fldCharType="begin"/>
+      </w:r>
+      <w:r>
+        <w:instrText xml:space="preserve"> SEQ Gambar_3. \* ARABIC </w:instrText>
+      </w:r>
+      <w:r>
+        <w:fldChar w:fldCharType="separate"/>
+      </w:r>
+      <w:r>
+        <w:rPr>
+          <w:noProof/>
+        </w:rPr>
+        <w:t>1</w:t>
+      </w:r>
+      <w:r>
+        <w:rPr>
+          <w:noProof/>
+        </w:rPr>
+        <w:fldChar w:fldCharType="end"/>
+      </w:r>
       <w:r>
         <w:t xml:space="preserve"> dokumentasi penerimaan data via Whatsapp</w:t>
       </w:r>
@@ -12600,7 +12682,7 @@
         </w:rPr>
         <w:lastRenderedPageBreak/>
         <w:drawing>
-          <wp:inline distT="0" distB="0" distL="0" distR="0" wp14:anchorId="75188C27" wp14:editId="76FE5F0D">
+          <wp:inline distT="0" distB="0" distL="0" distR="0" wp14:anchorId="75188C27" wp14:editId="063C2252">
             <wp:extent cx="5004000" cy="1844909"/>
             <wp:effectExtent l="19050" t="19050" r="25400" b="22225"/>
             <wp:docPr id="783286403" name="Picture 4"/>
@@ -12666,14 +12748,27 @@
       <w:r>
         <w:t xml:space="preserve">Gambar 3. </w:t>
       </w:r>
-      <w:fldSimple w:instr=" SEQ Gambar_3. \* ARABIC ">
-        <w:r>
-          <w:rPr>
-            <w:noProof/>
-          </w:rPr>
-          <w:t>2</w:t>
-        </w:r>
-      </w:fldSimple>
+      <w:r>
+        <w:fldChar w:fldCharType="begin"/>
+      </w:r>
+      <w:r>
+        <w:instrText xml:space="preserve"> SEQ Gambar_3. \* ARABIC </w:instrText>
+      </w:r>
+      <w:r>
+        <w:fldChar w:fldCharType="separate"/>
+      </w:r>
+      <w:r>
+        <w:rPr>
+          <w:noProof/>
+        </w:rPr>
+        <w:t>2</w:t>
+      </w:r>
+      <w:r>
+        <w:rPr>
+          <w:noProof/>
+        </w:rPr>
+        <w:fldChar w:fldCharType="end"/>
+      </w:r>
       <w:r>
         <w:t xml:space="preserve"> s</w:t>
       </w:r>
@@ -12999,7 +13094,7 @@
         </w:rPr>
         <w:lastRenderedPageBreak/>
         <w:drawing>
-          <wp:inline distT="0" distB="0" distL="0" distR="0" wp14:anchorId="02EBA956" wp14:editId="67099DFA">
+          <wp:inline distT="0" distB="0" distL="0" distR="0" wp14:anchorId="02EBA956" wp14:editId="4A1E44A4">
             <wp:extent cx="3888000" cy="2160000"/>
             <wp:effectExtent l="19050" t="19050" r="17780" b="12065"/>
             <wp:docPr id="102117401" name="Picture 5"/>
@@ -13064,14 +13159,27 @@
       <w:r>
         <w:t xml:space="preserve">Gambar 3. </w:t>
       </w:r>
-      <w:fldSimple w:instr=" SEQ Gambar_3. \* ARABIC ">
-        <w:r>
-          <w:rPr>
-            <w:noProof/>
-          </w:rPr>
-          <w:t>3</w:t>
-        </w:r>
-      </w:fldSimple>
+      <w:r>
+        <w:fldChar w:fldCharType="begin"/>
+      </w:r>
+      <w:r>
+        <w:instrText xml:space="preserve"> SEQ Gambar_3. \* ARABIC </w:instrText>
+      </w:r>
+      <w:r>
+        <w:fldChar w:fldCharType="separate"/>
+      </w:r>
+      <w:r>
+        <w:rPr>
+          <w:noProof/>
+        </w:rPr>
+        <w:t>3</w:t>
+      </w:r>
+      <w:r>
+        <w:rPr>
+          <w:noProof/>
+        </w:rPr>
+        <w:fldChar w:fldCharType="end"/>
+      </w:r>
       <w:r>
         <w:t xml:space="preserve"> c</w:t>
       </w:r>
@@ -13161,14 +13269,27 @@
       <w:r>
         <w:t xml:space="preserve">Gambar 3. </w:t>
       </w:r>
-      <w:fldSimple w:instr=" SEQ Gambar_3. \* ARABIC ">
-        <w:r>
-          <w:rPr>
-            <w:noProof/>
-          </w:rPr>
-          <w:t>4</w:t>
-        </w:r>
-      </w:fldSimple>
+      <w:r>
+        <w:fldChar w:fldCharType="begin"/>
+      </w:r>
+      <w:r>
+        <w:instrText xml:space="preserve"> SEQ Gambar_3. \* ARABIC </w:instrText>
+      </w:r>
+      <w:r>
+        <w:fldChar w:fldCharType="separate"/>
+      </w:r>
+      <w:r>
+        <w:rPr>
+          <w:noProof/>
+        </w:rPr>
+        <w:t>4</w:t>
+      </w:r>
+      <w:r>
+        <w:rPr>
+          <w:noProof/>
+        </w:rPr>
+        <w:fldChar w:fldCharType="end"/>
+      </w:r>
       <w:r>
         <w:t xml:space="preserve"> b</w:t>
       </w:r>
@@ -13418,14 +13539,27 @@
       <w:r>
         <w:t xml:space="preserve">Gambar 3. </w:t>
       </w:r>
-      <w:fldSimple w:instr=" SEQ Gambar_3. \* ARABIC ">
-        <w:r>
-          <w:rPr>
-            <w:noProof/>
-          </w:rPr>
-          <w:t>5</w:t>
-        </w:r>
-      </w:fldSimple>
+      <w:r>
+        <w:fldChar w:fldCharType="begin"/>
+      </w:r>
+      <w:r>
+        <w:instrText xml:space="preserve"> SEQ Gambar_3. \* ARABIC </w:instrText>
+      </w:r>
+      <w:r>
+        <w:fldChar w:fldCharType="separate"/>
+      </w:r>
+      <w:r>
+        <w:rPr>
+          <w:noProof/>
+        </w:rPr>
+        <w:t>5</w:t>
+      </w:r>
+      <w:r>
+        <w:rPr>
+          <w:noProof/>
+        </w:rPr>
+        <w:fldChar w:fldCharType="end"/>
+      </w:r>
       <w:r>
         <w:t xml:space="preserve"> b</w:t>
       </w:r>
@@ -13515,14 +13649,27 @@
       <w:r>
         <w:t xml:space="preserve">Gambar 3. </w:t>
       </w:r>
-      <w:fldSimple w:instr=" SEQ Gambar_3. \* ARABIC ">
-        <w:r>
-          <w:rPr>
-            <w:noProof/>
-          </w:rPr>
-          <w:t>6</w:t>
-        </w:r>
-      </w:fldSimple>
+      <w:r>
+        <w:fldChar w:fldCharType="begin"/>
+      </w:r>
+      <w:r>
+        <w:instrText xml:space="preserve"> SEQ Gambar_3. \* ARABIC </w:instrText>
+      </w:r>
+      <w:r>
+        <w:fldChar w:fldCharType="separate"/>
+      </w:r>
+      <w:r>
+        <w:rPr>
+          <w:noProof/>
+        </w:rPr>
+        <w:t>6</w:t>
+      </w:r>
+      <w:r>
+        <w:rPr>
+          <w:noProof/>
+        </w:rPr>
+        <w:fldChar w:fldCharType="end"/>
+      </w:r>
       <w:r>
         <w:t xml:space="preserve"> s</w:t>
       </w:r>
@@ -13613,14 +13760,27 @@
       <w:r>
         <w:t xml:space="preserve">Gambar 3. </w:t>
       </w:r>
-      <w:fldSimple w:instr=" SEQ Gambar_3. \* ARABIC ">
-        <w:r>
-          <w:rPr>
-            <w:noProof/>
-          </w:rPr>
-          <w:t>7</w:t>
-        </w:r>
-      </w:fldSimple>
+      <w:r>
+        <w:fldChar w:fldCharType="begin"/>
+      </w:r>
+      <w:r>
+        <w:instrText xml:space="preserve"> SEQ Gambar_3. \* ARABIC </w:instrText>
+      </w:r>
+      <w:r>
+        <w:fldChar w:fldCharType="separate"/>
+      </w:r>
+      <w:r>
+        <w:rPr>
+          <w:noProof/>
+        </w:rPr>
+        <w:t>7</w:t>
+      </w:r>
+      <w:r>
+        <w:rPr>
+          <w:noProof/>
+        </w:rPr>
+        <w:fldChar w:fldCharType="end"/>
+      </w:r>
       <w:r>
         <w:t xml:space="preserve"> h</w:t>
       </w:r>
@@ -13853,14 +14013,27 @@
       <w:r>
         <w:t xml:space="preserve">Gambar 3. </w:t>
       </w:r>
-      <w:fldSimple w:instr=" SEQ Gambar_3. \* ARABIC ">
-        <w:r>
-          <w:rPr>
-            <w:noProof/>
-          </w:rPr>
-          <w:t>8</w:t>
-        </w:r>
-      </w:fldSimple>
+      <w:r>
+        <w:fldChar w:fldCharType="begin"/>
+      </w:r>
+      <w:r>
+        <w:instrText xml:space="preserve"> SEQ Gambar_3. \* ARABIC </w:instrText>
+      </w:r>
+      <w:r>
+        <w:fldChar w:fldCharType="separate"/>
+      </w:r>
+      <w:r>
+        <w:rPr>
+          <w:noProof/>
+        </w:rPr>
+        <w:t>8</w:t>
+      </w:r>
+      <w:r>
+        <w:rPr>
+          <w:noProof/>
+        </w:rPr>
+        <w:fldChar w:fldCharType="end"/>
+      </w:r>
       <w:r>
         <w:t xml:space="preserve"> </w:t>
       </w:r>
@@ -14103,14 +14276,27 @@
       <w:r>
         <w:t xml:space="preserve">Gambar 3. </w:t>
       </w:r>
-      <w:fldSimple w:instr=" SEQ Gambar_3. \* ARABIC ">
-        <w:r>
-          <w:rPr>
-            <w:noProof/>
-          </w:rPr>
-          <w:t>9</w:t>
-        </w:r>
-      </w:fldSimple>
+      <w:r>
+        <w:fldChar w:fldCharType="begin"/>
+      </w:r>
+      <w:r>
+        <w:instrText xml:space="preserve"> SEQ Gambar_3. \* ARABIC </w:instrText>
+      </w:r>
+      <w:r>
+        <w:fldChar w:fldCharType="separate"/>
+      </w:r>
+      <w:r>
+        <w:rPr>
+          <w:noProof/>
+        </w:rPr>
+        <w:t>9</w:t>
+      </w:r>
+      <w:r>
+        <w:rPr>
+          <w:noProof/>
+        </w:rPr>
+        <w:fldChar w:fldCharType="end"/>
+      </w:r>
       <w:r>
         <w:t xml:space="preserve"> m</w:t>
       </w:r>
@@ -14201,14 +14387,27 @@
       <w:r>
         <w:t xml:space="preserve">Gambar 3. </w:t>
       </w:r>
-      <w:fldSimple w:instr=" SEQ Gambar_3. \* ARABIC ">
-        <w:r>
-          <w:rPr>
-            <w:noProof/>
-          </w:rPr>
-          <w:t>10</w:t>
-        </w:r>
-      </w:fldSimple>
+      <w:r>
+        <w:fldChar w:fldCharType="begin"/>
+      </w:r>
+      <w:r>
+        <w:instrText xml:space="preserve"> SEQ Gambar_3. \* ARABIC </w:instrText>
+      </w:r>
+      <w:r>
+        <w:fldChar w:fldCharType="separate"/>
+      </w:r>
+      <w:r>
+        <w:rPr>
+          <w:noProof/>
+        </w:rPr>
+        <w:t>10</w:t>
+      </w:r>
+      <w:r>
+        <w:rPr>
+          <w:noProof/>
+        </w:rPr>
+        <w:fldChar w:fldCharType="end"/>
+      </w:r>
       <w:r>
         <w:t xml:space="preserve"> s</w:t>
       </w:r>
@@ -14465,14 +14664,27 @@
       <w:r>
         <w:t xml:space="preserve">Gambar 3. </w:t>
       </w:r>
-      <w:fldSimple w:instr=" SEQ Gambar_3. \* ARABIC ">
-        <w:r>
-          <w:rPr>
-            <w:noProof/>
-          </w:rPr>
-          <w:t>11</w:t>
-        </w:r>
-      </w:fldSimple>
+      <w:r>
+        <w:fldChar w:fldCharType="begin"/>
+      </w:r>
+      <w:r>
+        <w:instrText xml:space="preserve"> SEQ Gambar_3. \* ARABIC </w:instrText>
+      </w:r>
+      <w:r>
+        <w:fldChar w:fldCharType="separate"/>
+      </w:r>
+      <w:r>
+        <w:rPr>
+          <w:noProof/>
+        </w:rPr>
+        <w:t>11</w:t>
+      </w:r>
+      <w:r>
+        <w:rPr>
+          <w:noProof/>
+        </w:rPr>
+        <w:fldChar w:fldCharType="end"/>
+      </w:r>
       <w:r>
         <w:t xml:space="preserve"> s</w:t>
       </w:r>
@@ -15066,33 +15278,7 @@
         <w:rPr>
           <w:rFonts w:ascii="Times New Roman" w:hAnsi="Times New Roman" w:cs="Times New Roman"/>
         </w:rPr>
-        <w:t>Analisis</w:t>
-      </w:r>
-      <w:r>
-        <w:rPr>
-          <w:rFonts w:ascii="Times New Roman" w:hAnsi="Times New Roman" w:cs="Times New Roman"/>
-        </w:rPr>
-        <w:t xml:space="preserve"> sederhana</w:t>
-      </w:r>
-      <w:r>
-        <w:rPr>
-          <w:rFonts w:ascii="Times New Roman" w:hAnsi="Times New Roman" w:cs="Times New Roman"/>
-        </w:rPr>
-        <w:t xml:space="preserve"> distribusi data dilakukan untuk mengidentifikasi pola umum maupun anomali, termasuk mendeteksi adanya data yang tidak wajar atau </w:t>
-      </w:r>
-      <w:r>
-        <w:rPr>
-          <w:rFonts w:ascii="Times New Roman" w:hAnsi="Times New Roman" w:cs="Times New Roman"/>
-          <w:i/>
-          <w:iCs/>
-        </w:rPr>
-        <w:t>outlier</w:t>
-      </w:r>
-      <w:r>
-        <w:rPr>
-          <w:rFonts w:ascii="Times New Roman" w:hAnsi="Times New Roman" w:cs="Times New Roman"/>
-        </w:rPr>
-        <w:t xml:space="preserve"> yang dapat memengaruhi hasil</w:t>
+        <w:t>Analisis sederhana terhadap distribusi data ini dilakukan dengan tujuan untuk mengidentifikasi pola-pola umum yang muncul sekaligus mendeteksi berbagai anomali yang mungkin ada, termasuk menemukan data yang tidak wajar atau outlier yang berpotensi mempengaruhi akurasi dan keandalan hasil visualisasi pada tahapan selanjutnya. Peninjauan menyeluruh terhadap pola distribusi ini sangat krusial untuk memastikan bahwa kualitas data yang digunakan tetap terjaga, serta interpretasi yang dihasilkan dari data tersebut benar dan dapat dipercaya. Melalui proses ini, dilakukan pengamatan yang cermat terhadap sebaran, konsistensi, dan kelengkapan data, sehingga informasi yang diperoleh mampu mencerminkan kondisi nyata dengan akurasi tinggi dan dapat diandalkan untuk pengambilan keputusan.</w:t>
       </w:r>
       <w:r>
         <w:rPr>
@@ -15104,48 +15290,6 @@
         <w:rPr>
           <w:rFonts w:ascii="Times New Roman" w:hAnsi="Times New Roman" w:cs="Times New Roman"/>
         </w:rPr>
-        <w:t xml:space="preserve">visualisasi </w:t>
-      </w:r>
-      <w:r>
-        <w:rPr>
-          <w:rFonts w:ascii="Times New Roman" w:hAnsi="Times New Roman" w:cs="Times New Roman"/>
-        </w:rPr>
-        <w:t xml:space="preserve">di tahap </w:t>
-      </w:r>
-      <w:r>
-        <w:rPr>
-          <w:rFonts w:ascii="Times New Roman" w:hAnsi="Times New Roman" w:cs="Times New Roman"/>
-        </w:rPr>
-        <w:t>berikutnya. Peninjauan pola distribusi ini sangat penting guna memastikan kualitas data dan kebenaran interpretasi yang dihasilkan dari data tersebut</w:t>
-      </w:r>
-      <w:r>
-        <w:rPr>
-          <w:rFonts w:ascii="Times New Roman" w:hAnsi="Times New Roman" w:cs="Times New Roman"/>
-        </w:rPr>
-        <w:t>.</w:t>
-      </w:r>
-      <w:r>
-        <w:rPr>
-          <w:rFonts w:ascii="Times New Roman" w:hAnsi="Times New Roman" w:cs="Times New Roman"/>
-        </w:rPr>
-        <w:t xml:space="preserve"> </w:t>
-      </w:r>
-      <w:r>
-        <w:rPr>
-          <w:rFonts w:ascii="Times New Roman" w:hAnsi="Times New Roman" w:cs="Times New Roman"/>
-        </w:rPr>
-        <w:t>Proses ini melibatkan pengamatan terhadap sebaran, konsistensi, dan kelengkapan data agar menghasilkan informasi yang akurat dan dapat diandalkan</w:t>
-      </w:r>
-      <w:r>
-        <w:rPr>
-          <w:rFonts w:ascii="Times New Roman" w:hAnsi="Times New Roman" w:cs="Times New Roman"/>
-        </w:rPr>
-        <w:t xml:space="preserve"> </w:t>
-      </w:r>
-      <w:r>
-        <w:rPr>
-          <w:rFonts w:ascii="Times New Roman" w:hAnsi="Times New Roman" w:cs="Times New Roman"/>
-        </w:rPr>
         <w:t>Gambar 3.12 sampai gambar 3.24</w:t>
       </w:r>
       <w:r>
@@ -15190,6 +15334,7 @@
         <w:pStyle w:val="Heading8"/>
       </w:pPr>
       <w:r>
+        <w:lastRenderedPageBreak/>
         <w:t xml:space="preserve">Jalur </w:t>
       </w:r>
       <w:r>
@@ -15209,7 +15354,6 @@
         <w:rPr>
           <w:noProof/>
         </w:rPr>
-        <w:lastRenderedPageBreak/>
         <w:drawing>
           <wp:inline distT="0" distB="0" distL="0" distR="0" wp14:anchorId="71F22594" wp14:editId="357E60EF">
             <wp:extent cx="5400000" cy="3088049"/>
@@ -15272,14 +15416,27 @@
       <w:r>
         <w:t xml:space="preserve">Gambar 3. </w:t>
       </w:r>
-      <w:fldSimple w:instr=" SEQ Gambar_3. \* ARABIC ">
-        <w:r>
-          <w:rPr>
-            <w:noProof/>
-          </w:rPr>
-          <w:t>12</w:t>
-        </w:r>
-      </w:fldSimple>
+      <w:r>
+        <w:fldChar w:fldCharType="begin"/>
+      </w:r>
+      <w:r>
+        <w:instrText xml:space="preserve"> SEQ Gambar_3. \* ARABIC </w:instrText>
+      </w:r>
+      <w:r>
+        <w:fldChar w:fldCharType="separate"/>
+      </w:r>
+      <w:r>
+        <w:rPr>
+          <w:noProof/>
+        </w:rPr>
+        <w:t>12</w:t>
+      </w:r>
+      <w:r>
+        <w:rPr>
+          <w:noProof/>
+        </w:rPr>
+        <w:fldChar w:fldCharType="end"/>
+      </w:r>
       <w:r>
         <w:t xml:space="preserve"> distribusi jalur pendaftaran</w:t>
       </w:r>
@@ -15299,31 +15456,14 @@
         <w:rPr>
           <w:rFonts w:ascii="Times New Roman" w:hAnsi="Times New Roman" w:cs="Times New Roman"/>
         </w:rPr>
-        <w:t>Distribusi data untuk kolom Jalur Pendaftaran menunjukkan sebaran yang normal dan tidak mengandung nilai anomali. Dari hasil visualisasi, terlihat bahwa jalur-jalur dominan seperti CBT, Nilai Rapor, dan Nilai SNBT memiliki jumlah pendaftar yang jauh lebih tinggi dibandingkan jalur lain, yang merupakan hal yang wajar karena ketiga jalur ini memang menjadi jalur utama penerimaan mahasiswa di UMP.</w:t>
-      </w:r>
-    </w:p>
-    <w:p>
-      <w:pPr>
-        <w:pStyle w:val="ListParagraph"/>
-        <w:spacing w:line="480" w:lineRule="auto"/>
-        <w:ind w:left="2160" w:firstLine="720"/>
-        <w:jc w:val="both"/>
-        <w:rPr>
-          <w:rFonts w:ascii="Times New Roman" w:hAnsi="Times New Roman" w:cs="Times New Roman"/>
-        </w:rPr>
-      </w:pPr>
-      <w:r>
-        <w:rPr>
-          <w:rFonts w:ascii="Times New Roman" w:hAnsi="Times New Roman" w:cs="Times New Roman"/>
-        </w:rPr>
-        <w:t xml:space="preserve">Sementara itu, jalur lain seperti PPG, Profesi Apoteker, Pascasarjana, hingga jalur-jalur khusus seperti Alih Jenjang Program TLM dan FAST TRACK MAGISTER memiliki jumlah pendaftar yang jauh lebih sedikit, namun tetap relevan karena diperuntukkan bagi target segmentasi </w:t>
+        <w:t xml:space="preserve">Distribusi data pada kolom Jalur Pendaftaran memperlihatkan pola sebaran yang normal dan stabil tanpa adanya indikasi nilai anomali yang signifikan. Berdasarkan hasil visualisasi yang telah dilakukan, dapat diamati bahwa beberapa jalur pendaftaran utama seperti CBT, Nilai Rapor, dan Nilai SNBT mendominasi dengan jumlah pendaftar yang jauh lebih banyak jika dibandingkan dengan jalur-jalur pendaftaran lainnya. Hal ini sangat masuk akal dan sesuai dengan harapan, mengingat ketiga jalur tersebut memang merupakan jalur utama yang secara resmi digunakan oleh Universitas Muhammadiyah Purwokerto (UMP) dalam proses penerimaan mahasiswa baru. Di sisi lain, terdapat </w:t>
       </w:r>
       <w:r>
         <w:rPr>
           <w:rFonts w:ascii="Times New Roman" w:hAnsi="Times New Roman" w:cs="Times New Roman"/>
         </w:rPr>
         <w:lastRenderedPageBreak/>
-        <w:t>tertentu. Tidak ditemukan adanya nilai yang mencurigakan, kesalahan penulisan, ataupun entri yang tidak lazim dalam kolom ini.</w:t>
+        <w:t>sejumlah jalur lain seperti PPG, Profesi Apoteker, Pascasarjana, serta jalur-jalur khusus seperti Alih Jenjang Program TLM dan FAST TRACK MAGISTER yang meskipun memiliki jumlah pendaftar jauh lebih sedikit, namun tetap memiliki relevansi tersendiri karena ditujukan untuk segmen tertentu yang lebih spesifik dan terbatas. Selama proses pemeriksaan data pada kolom ini, tidak ditemukan adanya nilai yang mencurigakan, kesalahan penulisan, atau entri yang tidak sesuai aturan atau tidak lazim, sehingga dapat dipastikan bahwa data Jalur Pendaftaran ini memiliki kualitas yang baik dan kredibilitas yang tinggi untuk dianalisis lebih lanjut.</w:t>
       </w:r>
     </w:p>
     <w:p>
@@ -15409,14 +15549,27 @@
       <w:r>
         <w:t xml:space="preserve">Gambar 3. </w:t>
       </w:r>
-      <w:fldSimple w:instr=" SEQ Gambar_3. \* ARABIC ">
-        <w:r>
-          <w:rPr>
-            <w:noProof/>
-          </w:rPr>
-          <w:t>13</w:t>
-        </w:r>
-      </w:fldSimple>
+      <w:r>
+        <w:fldChar w:fldCharType="begin"/>
+      </w:r>
+      <w:r>
+        <w:instrText xml:space="preserve"> SEQ Gambar_3. \* ARABIC </w:instrText>
+      </w:r>
+      <w:r>
+        <w:fldChar w:fldCharType="separate"/>
+      </w:r>
+      <w:r>
+        <w:rPr>
+          <w:noProof/>
+        </w:rPr>
+        <w:t>13</w:t>
+      </w:r>
+      <w:r>
+        <w:rPr>
+          <w:noProof/>
+        </w:rPr>
+        <w:fldChar w:fldCharType="end"/>
+      </w:r>
       <w:r>
         <w:t xml:space="preserve"> distribusi </w:t>
       </w:r>
@@ -15439,43 +15592,8 @@
         <w:rPr>
           <w:rFonts w:ascii="Times New Roman" w:hAnsi="Times New Roman" w:cs="Times New Roman"/>
         </w:rPr>
-        <w:t xml:space="preserve">Dari segi validasi, </w:t>
-      </w:r>
-      <w:r>
-        <w:rPr>
-          <w:rFonts w:ascii="Times New Roman" w:hAnsi="Times New Roman" w:cs="Times New Roman"/>
-        </w:rPr>
-        <w:t xml:space="preserve">distribusi pada kolom </w:t>
-      </w:r>
-      <w:r>
-        <w:rPr>
-          <w:rFonts w:ascii="Times New Roman" w:hAnsi="Times New Roman" w:cs="Times New Roman"/>
-        </w:rPr>
-        <w:t>TAHUN</w:t>
-      </w:r>
-      <w:r>
-        <w:rPr>
-          <w:rFonts w:ascii="Times New Roman" w:hAnsi="Times New Roman" w:cs="Times New Roman"/>
-        </w:rPr>
-        <w:t xml:space="preserve"> </w:t>
-      </w:r>
-      <w:r>
-        <w:rPr>
-          <w:rFonts w:ascii="Times New Roman" w:hAnsi="Times New Roman" w:cs="Times New Roman"/>
-        </w:rPr>
-        <w:t xml:space="preserve">tidak ditemukan nilai tahun yang di luar rentang logis (misalnya tahun sebelum 2014 atau setelah 2024), serta tidak ada duplikasi penamaan atau format yang tidak konsisten. Dengan demikian, distribusi data pada kolom TAHUN dapat dinyatakan valid dan layak digunakan untuk proses </w:t>
-      </w:r>
-      <w:r>
-        <w:rPr>
-          <w:rFonts w:ascii="Times New Roman" w:hAnsi="Times New Roman" w:cs="Times New Roman"/>
-        </w:rPr>
-        <w:t xml:space="preserve">visualisasi </w:t>
-      </w:r>
-      <w:r>
-        <w:rPr>
-          <w:rFonts w:ascii="Times New Roman" w:hAnsi="Times New Roman" w:cs="Times New Roman"/>
-        </w:rPr>
-        <w:t>tren lebih lanjut.</w:t>
+        <w:lastRenderedPageBreak/>
+        <w:t>Dari segi proses validasi yang dilakukan, distribusi data pada kolom TAHUN menunjukkan hasil yang sangat baik dan konsisten, di mana tidak ditemukan adanya nilai-nilai tahun yang berada di luar rentang logis yang telah ditetapkan, seperti misalnya nilai tahun sebelum tahun 2014 atau setelah tahun 2024. Selain itu, pemeriksaan juga menegaskan bahwa tidak ada duplikasi dalam penamaan tahun maupun format yang tidak konsisten yang bisa mengganggu kualitas data. Dengan kondisi seperti ini, dapat disimpulkan bahwa distribusi data pada kolom TAHUN tersebut memiliki validitas yang tinggi dan memenuhi standar kualitas data yang diperlukan, sehingga data tersebut sangat layak dan dapat diandalkan untuk digunakan dalam proses visualisasi tren penerimaan mahasiswa baru secara lebih mendalam dan komprehensif di tahap selanjutnya.</w:t>
       </w:r>
     </w:p>
     <w:p>
@@ -15484,6 +15602,47 @@
       </w:pPr>
       <w:r>
         <w:t>Prodi pilihan 1</w:t>
+      </w:r>
+    </w:p>
+    <w:p>
+      <w:pPr>
+        <w:pStyle w:val="ListParagraph"/>
+        <w:spacing w:line="480" w:lineRule="auto"/>
+        <w:ind w:left="2160" w:firstLine="720"/>
+        <w:jc w:val="both"/>
+        <w:rPr>
+          <w:rFonts w:ascii="Times New Roman" w:hAnsi="Times New Roman" w:cs="Times New Roman"/>
+        </w:rPr>
+      </w:pPr>
+      <w:r>
+        <w:rPr>
+          <w:rFonts w:ascii="Times New Roman" w:hAnsi="Times New Roman" w:cs="Times New Roman"/>
+        </w:rPr>
+        <w:t xml:space="preserve">Distribusi data pada kolom Prodi Pilihan 1 menunjukkan keberagaman pilihan program studi dari para pendaftar mahasiswa baru, mencerminkan variasi minat yang cukup luas. Program studi seperti Farmasi, Manajemen S1, dan Pendidikan Dokter menempati posisi teratas dalam jumlah pendaftar, menunjukkan daya tarik yang tinggi pada bidang tersebut. Pilihan ini kemungkinan didorong oleh </w:t>
+      </w:r>
+      <w:r>
+        <w:rPr>
+          <w:rFonts w:ascii="Times New Roman" w:hAnsi="Times New Roman" w:cs="Times New Roman"/>
+        </w:rPr>
+        <w:lastRenderedPageBreak/>
+        <w:t>kebutuhan pasar kerja, reputasi program, dan prospek karir yang menarik. Di sisi lain, beberapa program studi seperti PPG Pendidikan Biologi, PPG Pekerjaan Sosial, dan Program Pertukaran Mahasiswa memiliki jumlah peminat yang lebih rendah, mencerminkan preferensi yang beragam di kalangan pendaftar.</w:t>
+      </w:r>
+    </w:p>
+    <w:p>
+      <w:pPr>
+        <w:pStyle w:val="ListParagraph"/>
+        <w:spacing w:line="480" w:lineRule="auto"/>
+        <w:ind w:left="2160" w:firstLine="720"/>
+        <w:jc w:val="both"/>
+        <w:rPr>
+          <w:rFonts w:ascii="Times New Roman" w:hAnsi="Times New Roman" w:cs="Times New Roman"/>
+        </w:rPr>
+      </w:pPr>
+      <w:r>
+        <w:rPr>
+          <w:rFonts w:ascii="Times New Roman" w:hAnsi="Times New Roman" w:cs="Times New Roman"/>
+        </w:rPr>
+        <w:t>Namun, dalam pengecekan data ditemukan adanya nilai anomali berupa karakter "-", yang tidak mewakili nama program studi mana pun dalam data resmi. Nilai ini kemungkinan berasal dari data kosong yang belum terisi dengan benar atau kesalahan input saat pendataan. Kondisi ini penting untuk segera diperbaiki dalam tahap problem solving agar tidak mengganggu akurasi dan kualitas visualisasi pada dashboard akhir. Penanganan nilai anomali tersebut sangat diperlukan untuk menjaga integritas data sehingga informasi yang disajikan dalam visualisasi dapat tetap valid, kredibel, dan dapat diandalkan. Dengan data yang bersih dan terverifikasi, dashboard akan mampu memberikan gambaran yang lebih akurat mengenai tren pemilihan program studi mahasiswa baru, mendukung pengambilan keputusan yang lebih efektif oleh pihak universitas dan pemangku kepentingan terkait.</w:t>
       </w:r>
     </w:p>
     <w:p>
@@ -15498,7 +15657,7 @@
         </w:rPr>
         <w:lastRenderedPageBreak/>
         <w:drawing>
-          <wp:inline distT="0" distB="0" distL="0" distR="0" wp14:anchorId="7A5235CA" wp14:editId="01700E05">
+          <wp:inline distT="0" distB="0" distL="0" distR="0" wp14:anchorId="5639EE3A" wp14:editId="07750017">
             <wp:extent cx="5400000" cy="5622955"/>
             <wp:effectExtent l="0" t="0" r="0" b="0"/>
             <wp:docPr id="1576637060" name="Picture 7"/>
@@ -15550,6 +15709,7 @@
     <w:p>
       <w:pPr>
         <w:pStyle w:val="Caption"/>
+        <w:spacing w:line="480" w:lineRule="auto"/>
         <w:jc w:val="center"/>
         <w:rPr>
           <w:rFonts w:ascii="Times New Roman" w:hAnsi="Times New Roman" w:cs="Times New Roman"/>
@@ -15559,14 +15719,27 @@
       <w:r>
         <w:t xml:space="preserve">Gambar 3. </w:t>
       </w:r>
-      <w:fldSimple w:instr=" SEQ Gambar_3. \* ARABIC ">
-        <w:r>
-          <w:rPr>
-            <w:noProof/>
-          </w:rPr>
-          <w:t>14</w:t>
-        </w:r>
-      </w:fldSimple>
+      <w:r>
+        <w:fldChar w:fldCharType="begin"/>
+      </w:r>
+      <w:r>
+        <w:instrText xml:space="preserve"> SEQ Gambar_3. \* ARABIC </w:instrText>
+      </w:r>
+      <w:r>
+        <w:fldChar w:fldCharType="separate"/>
+      </w:r>
+      <w:r>
+        <w:rPr>
+          <w:noProof/>
+        </w:rPr>
+        <w:t>14</w:t>
+      </w:r>
+      <w:r>
+        <w:rPr>
+          <w:noProof/>
+        </w:rPr>
+        <w:fldChar w:fldCharType="end"/>
+      </w:r>
       <w:r>
         <w:t xml:space="preserve"> distribusi </w:t>
       </w:r>
@@ -15574,6 +15747,14 @@
         <w:t>prodi pilihan 1</w:t>
       </w:r>
       <w:bookmarkEnd w:id="64"/>
+    </w:p>
+    <w:p>
+      <w:pPr>
+        <w:pStyle w:val="Heading8"/>
+      </w:pPr>
+      <w:r>
+        <w:t>Fakultas prodi pilihan 1</w:t>
+      </w:r>
     </w:p>
     <w:p>
       <w:pPr>
@@ -15589,14 +15770,14 @@
         <w:rPr>
           <w:rFonts w:ascii="Times New Roman" w:hAnsi="Times New Roman" w:cs="Times New Roman"/>
         </w:rPr>
-        <w:t xml:space="preserve">Distribusi data pada kolom Prodi Pilihan 1 menunjukkan keberagaman pilihan program studi dari para pendaftar mahasiswa baru. Terlihat bahwa program studi seperti Farmasi, Manajemen S1, dan Pendidikan Dokter menjadi pilihan terbanyak. Sementara itu, terdapat pula beberapa program studi dengan jumlah peminat yang relatif </w:t>
+        <w:t xml:space="preserve">Distribusi pada kolom Fakultas Prodi Pilihan 1 menunjukkan bahwa sebagian besar pendaftar memilih program studi yang berada di bawah naungan Fakultas Farmasi, Fakultas Keguruan dan Ilmu Pendidikan, serta </w:t>
       </w:r>
       <w:r>
         <w:rPr>
           <w:rFonts w:ascii="Times New Roman" w:hAnsi="Times New Roman" w:cs="Times New Roman"/>
         </w:rPr>
         <w:lastRenderedPageBreak/>
-        <w:t>rendah, seperti PPG Pendidikan Biologi, PPG Pekerjaan Sosial, hingga Program Pertukaran Mahasiswa.</w:t>
+        <w:t>Fakultas Ekonomi dan Bisnis. Hal ini selaras dengan temuan pada kolom Prodi Pilihan 1, di mana Farmasi dan Manajemen merupakan dua dari program studi dengan jumlah pendaftar tertinggi.</w:t>
       </w:r>
     </w:p>
     <w:p>
@@ -15613,15 +15794,7 @@
         <w:rPr>
           <w:rFonts w:ascii="Times New Roman" w:hAnsi="Times New Roman" w:cs="Times New Roman"/>
         </w:rPr>
-        <w:t>Namun, pada pengecekan ini ditemukan satu nilai anomali berupa karakter "-" yang tidak merepresentasikan nama program studi manapun. Nilai tersebut bisa berasal dari data kosong yang belum terisi dengan benar atau kesalahan input saat pendataan. Nilai anomali ini perlu ditindaklanjuti pada tahap problem solving untuk diperbaiki agar tidak mengganggu hasil visualisasi pada dashboard akhir.</w:t>
-      </w:r>
-    </w:p>
-    <w:p>
-      <w:pPr>
-        <w:pStyle w:val="Heading8"/>
-      </w:pPr>
-      <w:r>
-        <w:t>Fakultas prodi pilihan 1</w:t>
+        <w:t>Namun demikian, pada distribusi kolom Fakultas Prodi Pilihan 1 ditemukan adanya satu nilai anomali berupa karakter “-”. Nilai ini tidak mewakili nama fakultas apapun yang ada di Universitas Muhammadiyah Purwokerto. Kemunculan karakter ini mengindikasikan adanya data yang tidak terisi dengan benar atau kesalahan input pada tahap pencatatan awal. Oleh karena itu, nilai ini perlu ditindaklanjuti pada tahap problem solving agar tidak memengaruhi hasil visualisasi secara keseluruhan.</w:t>
       </w:r>
     </w:p>
     <w:p>
@@ -15635,7 +15808,7 @@
           <w:noProof/>
         </w:rPr>
         <w:drawing>
-          <wp:inline distT="0" distB="0" distL="0" distR="0" wp14:anchorId="6CE6529E" wp14:editId="59612FF9">
+          <wp:inline distT="0" distB="0" distL="0" distR="0" wp14:anchorId="6FACB620" wp14:editId="4FD3ED80">
             <wp:extent cx="5400000" cy="1906523"/>
             <wp:effectExtent l="0" t="0" r="0" b="0"/>
             <wp:docPr id="3550065" name="Picture 8"/>
@@ -15687,6 +15860,7 @@
     <w:p>
       <w:pPr>
         <w:pStyle w:val="Caption"/>
+        <w:spacing w:line="480" w:lineRule="auto"/>
         <w:jc w:val="center"/>
         <w:rPr>
           <w:rFonts w:ascii="Times New Roman" w:hAnsi="Times New Roman" w:cs="Times New Roman"/>
@@ -15696,14 +15870,27 @@
       <w:r>
         <w:t xml:space="preserve">Gambar 3. </w:t>
       </w:r>
-      <w:fldSimple w:instr=" SEQ Gambar_3. \* ARABIC ">
-        <w:r>
-          <w:rPr>
-            <w:noProof/>
-          </w:rPr>
-          <w:t>15</w:t>
-        </w:r>
-      </w:fldSimple>
+      <w:r>
+        <w:fldChar w:fldCharType="begin"/>
+      </w:r>
+      <w:r>
+        <w:instrText xml:space="preserve"> SEQ Gambar_3. \* ARABIC </w:instrText>
+      </w:r>
+      <w:r>
+        <w:fldChar w:fldCharType="separate"/>
+      </w:r>
+      <w:r>
+        <w:rPr>
+          <w:noProof/>
+        </w:rPr>
+        <w:t>15</w:t>
+      </w:r>
+      <w:r>
+        <w:rPr>
+          <w:noProof/>
+        </w:rPr>
+        <w:fldChar w:fldCharType="end"/>
+      </w:r>
       <w:r>
         <w:t xml:space="preserve"> distribusi</w:t>
       </w:r>
@@ -15711,47 +15898,6 @@
         <w:t xml:space="preserve"> fakultas prodi pilihan 1</w:t>
       </w:r>
       <w:bookmarkEnd w:id="65"/>
-    </w:p>
-    <w:p>
-      <w:pPr>
-        <w:pStyle w:val="ListParagraph"/>
-        <w:spacing w:line="480" w:lineRule="auto"/>
-        <w:ind w:left="2160" w:firstLine="720"/>
-        <w:jc w:val="both"/>
-        <w:rPr>
-          <w:rFonts w:ascii="Times New Roman" w:hAnsi="Times New Roman" w:cs="Times New Roman"/>
-        </w:rPr>
-      </w:pPr>
-      <w:r>
-        <w:rPr>
-          <w:rFonts w:ascii="Times New Roman" w:hAnsi="Times New Roman" w:cs="Times New Roman"/>
-        </w:rPr>
-        <w:t xml:space="preserve">Distribusi pada kolom Fakultas Prodi Pilihan 1 menunjukkan bahwa sebagian besar pendaftar memilih program studi yang berada di bawah naungan Fakultas Farmasi, Fakultas Keguruan dan Ilmu Pendidikan, serta Fakultas Ekonomi dan Bisnis. Hal ini selaras dengan temuan pada kolom Prodi Pilihan 1, di mana Farmasi dan </w:t>
-      </w:r>
-      <w:r>
-        <w:rPr>
-          <w:rFonts w:ascii="Times New Roman" w:hAnsi="Times New Roman" w:cs="Times New Roman"/>
-        </w:rPr>
-        <w:lastRenderedPageBreak/>
-        <w:t>Manajemen merupakan dua dari program studi dengan jumlah pendaftar tertinggi.</w:t>
-      </w:r>
-    </w:p>
-    <w:p>
-      <w:pPr>
-        <w:pStyle w:val="ListParagraph"/>
-        <w:spacing w:line="480" w:lineRule="auto"/>
-        <w:ind w:left="2160" w:firstLine="720"/>
-        <w:jc w:val="both"/>
-        <w:rPr>
-          <w:rFonts w:ascii="Times New Roman" w:hAnsi="Times New Roman" w:cs="Times New Roman"/>
-        </w:rPr>
-      </w:pPr>
-      <w:r>
-        <w:rPr>
-          <w:rFonts w:ascii="Times New Roman" w:hAnsi="Times New Roman" w:cs="Times New Roman"/>
-        </w:rPr>
-        <w:t>Namun demikian, pada distribusi kolom Fakultas Prodi Pilihan 1 ditemukan adanya satu nilai anomali berupa karakter “-”. Nilai ini tidak mewakili nama fakultas apapun yang ada di Universitas Muhammadiyah Purwokerto. Kemunculan karakter ini mengindikasikan adanya data yang tidak terisi dengan benar atau kesalahan input pada tahap pencatatan awal. Oleh karena itu, nilai ini perlu ditindaklanjuti pada tahap problem solving agar tidak memengaruhi hasil visualisasi secara keseluruhan.</w:t>
-      </w:r>
     </w:p>
     <w:p>
       <w:pPr>
@@ -15834,14 +15980,27 @@
       <w:r>
         <w:t xml:space="preserve">Gambar 3. </w:t>
       </w:r>
-      <w:fldSimple w:instr=" SEQ Gambar_3. \* ARABIC ">
-        <w:r>
-          <w:rPr>
-            <w:noProof/>
-          </w:rPr>
-          <w:t>16</w:t>
-        </w:r>
-      </w:fldSimple>
+      <w:r>
+        <w:fldChar w:fldCharType="begin"/>
+      </w:r>
+      <w:r>
+        <w:instrText xml:space="preserve"> SEQ Gambar_3. \* ARABIC </w:instrText>
+      </w:r>
+      <w:r>
+        <w:fldChar w:fldCharType="separate"/>
+      </w:r>
+      <w:r>
+        <w:rPr>
+          <w:noProof/>
+        </w:rPr>
+        <w:t>16</w:t>
+      </w:r>
+      <w:r>
+        <w:rPr>
+          <w:noProof/>
+        </w:rPr>
+        <w:fldChar w:fldCharType="end"/>
+      </w:r>
       <w:r>
         <w:t xml:space="preserve"> distribusi </w:t>
       </w:r>
@@ -15971,14 +16130,27 @@
       <w:r>
         <w:t xml:space="preserve">Gambar 3. </w:t>
       </w:r>
-      <w:fldSimple w:instr=" SEQ Gambar_3. \* ARABIC ">
-        <w:r>
-          <w:rPr>
-            <w:noProof/>
-          </w:rPr>
-          <w:t>17</w:t>
-        </w:r>
-      </w:fldSimple>
+      <w:r>
+        <w:fldChar w:fldCharType="begin"/>
+      </w:r>
+      <w:r>
+        <w:instrText xml:space="preserve"> SEQ Gambar_3. \* ARABIC </w:instrText>
+      </w:r>
+      <w:r>
+        <w:fldChar w:fldCharType="separate"/>
+      </w:r>
+      <w:r>
+        <w:rPr>
+          <w:noProof/>
+        </w:rPr>
+        <w:t>17</w:t>
+      </w:r>
+      <w:r>
+        <w:rPr>
+          <w:noProof/>
+        </w:rPr>
+        <w:fldChar w:fldCharType="end"/>
+      </w:r>
       <w:r>
         <w:t xml:space="preserve"> distribusi </w:t>
       </w:r>
@@ -16038,6 +16210,59 @@
     </w:p>
     <w:p>
       <w:pPr>
+        <w:pStyle w:val="ListParagraph"/>
+        <w:spacing w:line="480" w:lineRule="auto"/>
+        <w:ind w:left="2160" w:firstLine="720"/>
+        <w:jc w:val="both"/>
+        <w:rPr>
+          <w:rFonts w:ascii="Times New Roman" w:hAnsi="Times New Roman" w:cs="Times New Roman"/>
+        </w:rPr>
+      </w:pPr>
+      <w:r>
+        <w:rPr>
+          <w:rFonts w:ascii="Times New Roman" w:hAnsi="Times New Roman" w:cs="Times New Roman"/>
+        </w:rPr>
+        <w:t xml:space="preserve">Distribusi pada kolom Prodi Diterima memperlihatkan program studi yang paling banyak menerima mahasiswa baru di UMP. </w:t>
+      </w:r>
+      <w:r>
+        <w:rPr>
+          <w:rFonts w:ascii="Times New Roman" w:hAnsi="Times New Roman" w:cs="Times New Roman"/>
+        </w:rPr>
+        <w:t>Dari visualisasi, terlihat bahwa Keperawatan, Manajemen S1, dan Psikologi menjadi tiga program studi dengan jumlah penerimaan tertinggi. Hal ini menggambarkan minat dan daya tampung yang tinggi pada program-program tersebut, sehingga mereka menjadi fokus utama dalam penerimaan mahasiswa baru.</w:t>
+      </w:r>
+      <w:r>
+        <w:rPr>
+          <w:rFonts w:ascii="Times New Roman" w:hAnsi="Times New Roman" w:cs="Times New Roman"/>
+        </w:rPr>
+        <w:t xml:space="preserve"> </w:t>
+      </w:r>
+    </w:p>
+    <w:p>
+      <w:pPr>
+        <w:pStyle w:val="ListParagraph"/>
+        <w:spacing w:line="480" w:lineRule="auto"/>
+        <w:ind w:left="2160" w:firstLine="720"/>
+        <w:jc w:val="both"/>
+        <w:rPr>
+          <w:rFonts w:ascii="Times New Roman" w:hAnsi="Times New Roman" w:cs="Times New Roman"/>
+        </w:rPr>
+      </w:pPr>
+      <w:r>
+        <w:rPr>
+          <w:rFonts w:ascii="Times New Roman" w:hAnsi="Times New Roman" w:cs="Times New Roman"/>
+        </w:rPr>
+        <w:t xml:space="preserve">Namun, terdapat nilai anomali berupa karakter “-” yang muncul dalam kolom ini. Nilai tersebut tidak </w:t>
+      </w:r>
+      <w:r>
+        <w:rPr>
+          <w:rFonts w:ascii="Times New Roman" w:hAnsi="Times New Roman" w:cs="Times New Roman"/>
+        </w:rPr>
+        <w:lastRenderedPageBreak/>
+        <w:t>merepresentasikan nama program studi manapun dan kemungkinan besar merupakan hasil dari entri yang kosong atau tidak valid. Keberadaan nilai ini perlu ditindaklanjuti pada tahap problem solving untuk menjaga keakuratan visualisasi dan mencegah penyajian data yang menyesatkan.</w:t>
+      </w:r>
+    </w:p>
+    <w:p>
+      <w:pPr>
         <w:keepNext/>
         <w:spacing w:line="480" w:lineRule="auto"/>
         <w:jc w:val="center"/>
@@ -16046,9 +16271,8 @@
         <w:rPr>
           <w:noProof/>
         </w:rPr>
-        <w:lastRenderedPageBreak/>
         <w:drawing>
-          <wp:inline distT="0" distB="0" distL="0" distR="0" wp14:anchorId="25F37CE7" wp14:editId="248E4D63">
+          <wp:inline distT="0" distB="0" distL="0" distR="0" wp14:anchorId="6190236E" wp14:editId="71AC2599">
             <wp:extent cx="5400000" cy="5622955"/>
             <wp:effectExtent l="0" t="0" r="0" b="0"/>
             <wp:docPr id="29152661" name="Picture 11"/>
@@ -16100,23 +16324,34 @@
     <w:p>
       <w:pPr>
         <w:pStyle w:val="Caption"/>
+        <w:spacing w:line="480" w:lineRule="auto"/>
         <w:jc w:val="center"/>
-        <w:rPr>
-          <w:rFonts w:ascii="Times New Roman" w:hAnsi="Times New Roman" w:cs="Times New Roman"/>
-        </w:rPr>
       </w:pPr>
       <w:bookmarkStart w:id="68" w:name="_Toc208147377"/>
       <w:r>
         <w:t xml:space="preserve">Gambar 3. </w:t>
       </w:r>
-      <w:fldSimple w:instr=" SEQ Gambar_3. \* ARABIC ">
-        <w:r>
-          <w:rPr>
-            <w:noProof/>
-          </w:rPr>
-          <w:t>18</w:t>
-        </w:r>
-      </w:fldSimple>
+      <w:r>
+        <w:fldChar w:fldCharType="begin"/>
+      </w:r>
+      <w:r>
+        <w:instrText xml:space="preserve"> SEQ Gambar_3. \* ARABIC </w:instrText>
+      </w:r>
+      <w:r>
+        <w:fldChar w:fldCharType="separate"/>
+      </w:r>
+      <w:r>
+        <w:rPr>
+          <w:noProof/>
+        </w:rPr>
+        <w:t>18</w:t>
+      </w:r>
+      <w:r>
+        <w:rPr>
+          <w:noProof/>
+        </w:rPr>
+        <w:fldChar w:fldCharType="end"/>
+      </w:r>
       <w:r>
         <w:t xml:space="preserve"> distribusi </w:t>
       </w:r>
@@ -16127,56 +16362,10 @@
     </w:p>
     <w:p>
       <w:pPr>
-        <w:pStyle w:val="ListParagraph"/>
-        <w:spacing w:line="480" w:lineRule="auto"/>
-        <w:ind w:left="2160" w:firstLine="720"/>
-        <w:jc w:val="both"/>
-        <w:rPr>
-          <w:rFonts w:ascii="Times New Roman" w:hAnsi="Times New Roman" w:cs="Times New Roman"/>
-        </w:rPr>
-      </w:pPr>
-      <w:r>
-        <w:rPr>
-          <w:rFonts w:ascii="Times New Roman" w:hAnsi="Times New Roman" w:cs="Times New Roman"/>
-        </w:rPr>
-        <w:t xml:space="preserve">Distribusi pada kolom Prodi Diterima memperlihatkan program studi yang paling banyak menerima mahasiswa baru di UMP. Dari visualisasi, terlihat bahwa </w:t>
-      </w:r>
-      <w:r>
-        <w:rPr>
-          <w:rFonts w:ascii="Times New Roman" w:hAnsi="Times New Roman" w:cs="Times New Roman"/>
-        </w:rPr>
-        <w:t>Keperawatan</w:t>
-      </w:r>
-      <w:r>
-        <w:rPr>
-          <w:rFonts w:ascii="Times New Roman" w:hAnsi="Times New Roman" w:cs="Times New Roman"/>
-        </w:rPr>
-        <w:t xml:space="preserve">, Manajemen S1, dan Psikologi menjadi tiga program studi dengan jumlah penerimaan tertinggi. </w:t>
-      </w:r>
-    </w:p>
-    <w:p>
-      <w:pPr>
-        <w:pStyle w:val="ListParagraph"/>
-        <w:spacing w:line="480" w:lineRule="auto"/>
-        <w:ind w:left="2160" w:firstLine="720"/>
-        <w:jc w:val="both"/>
-        <w:rPr>
-          <w:rFonts w:ascii="Times New Roman" w:hAnsi="Times New Roman" w:cs="Times New Roman"/>
-        </w:rPr>
-      </w:pPr>
-      <w:r>
-        <w:rPr>
-          <w:rFonts w:ascii="Times New Roman" w:hAnsi="Times New Roman" w:cs="Times New Roman"/>
-        </w:rPr>
+        <w:pStyle w:val="Heading8"/>
+      </w:pPr>
+      <w:r>
         <w:lastRenderedPageBreak/>
-        <w:t>Namun, terdapat nilai anomali berupa karakter “-” yang muncul dalam kolom ini. Nilai tersebut tidak merepresentasikan nama program studi manapun dan kemungkinan besar merupakan hasil dari entri yang kosong atau tidak valid. Keberadaan nilai ini perlu ditindaklanjuti pada tahap problem solving untuk menjaga keakuratan visualisasi dan mencegah penyajian data yang menyesatkan.</w:t>
-      </w:r>
-    </w:p>
-    <w:p>
-      <w:pPr>
-        <w:pStyle w:val="Heading8"/>
-      </w:pPr>
-      <w:r>
         <w:t>Fakultas prodi diterima</w:t>
       </w:r>
     </w:p>
@@ -16252,14 +16441,27 @@
       <w:r>
         <w:t xml:space="preserve">Gambar 3. </w:t>
       </w:r>
-      <w:fldSimple w:instr=" SEQ Gambar_3. \* ARABIC ">
-        <w:r>
-          <w:rPr>
-            <w:noProof/>
-          </w:rPr>
-          <w:t>19</w:t>
-        </w:r>
-      </w:fldSimple>
+      <w:r>
+        <w:fldChar w:fldCharType="begin"/>
+      </w:r>
+      <w:r>
+        <w:instrText xml:space="preserve"> SEQ Gambar_3. \* ARABIC </w:instrText>
+      </w:r>
+      <w:r>
+        <w:fldChar w:fldCharType="separate"/>
+      </w:r>
+      <w:r>
+        <w:rPr>
+          <w:noProof/>
+        </w:rPr>
+        <w:t>19</w:t>
+      </w:r>
+      <w:r>
+        <w:rPr>
+          <w:noProof/>
+        </w:rPr>
+        <w:fldChar w:fldCharType="end"/>
+      </w:r>
       <w:r>
         <w:t xml:space="preserve"> distribusi </w:t>
       </w:r>
@@ -16335,15 +16537,26 @@
         <w:rPr>
           <w:rFonts w:ascii="Times New Roman" w:hAnsi="Times New Roman" w:cs="Times New Roman"/>
         </w:rPr>
+        <w:t>Meskipun sebagian besar nilai terlihat valid, terdapat satu nilai anomali berupa karakter “-” yang tidak sesuai dengan nama fakultas resmi di UMP. Nilai tersebut perlu diperhatikan karena dapat memengaruhi integritas visualisasi. Penanganan terhadap entri ini akan dilakukan pada tahap problem solving untuk memastikan bahwa semua data yang divisualisasikan mewakili kondisi sebenarnya.</w:t>
+      </w:r>
+    </w:p>
+    <w:p>
+      <w:pPr>
+        <w:pStyle w:val="ListParagraph"/>
+        <w:spacing w:line="480" w:lineRule="auto"/>
+        <w:ind w:left="2160" w:firstLine="720"/>
+        <w:jc w:val="both"/>
+        <w:rPr>
+          <w:rFonts w:ascii="Times New Roman" w:hAnsi="Times New Roman" w:cs="Times New Roman"/>
+        </w:rPr>
+      </w:pPr>
+    </w:p>
+    <w:p>
+      <w:pPr>
+        <w:pStyle w:val="Heading8"/>
+      </w:pPr>
+      <w:r>
         <w:lastRenderedPageBreak/>
-        <w:t>Meskipun sebagian besar nilai terlihat valid, terdapat satu nilai anomali berupa karakter “-” yang tidak sesuai dengan nama fakultas resmi di UMP. Nilai tersebut perlu diperhatikan karena dapat memengaruhi integritas visualisasi. Penanganan terhadap entri ini akan dilakukan pada tahap problem solving untuk memastikan bahwa semua data yang divisualisasikan mewakili kondisi sebenarnya.</w:t>
-      </w:r>
-    </w:p>
-    <w:p>
-      <w:pPr>
-        <w:pStyle w:val="Heading8"/>
-      </w:pPr>
-      <w:r>
         <w:t>Usia</w:t>
       </w:r>
     </w:p>
@@ -16419,14 +16632,27 @@
       <w:r>
         <w:t xml:space="preserve">Gambar 3. </w:t>
       </w:r>
-      <w:fldSimple w:instr=" SEQ Gambar_3. \* ARABIC ">
-        <w:r>
-          <w:rPr>
-            <w:noProof/>
-          </w:rPr>
-          <w:t>20</w:t>
-        </w:r>
-      </w:fldSimple>
+      <w:r>
+        <w:fldChar w:fldCharType="begin"/>
+      </w:r>
+      <w:r>
+        <w:instrText xml:space="preserve"> SEQ Gambar_3. \* ARABIC </w:instrText>
+      </w:r>
+      <w:r>
+        <w:fldChar w:fldCharType="separate"/>
+      </w:r>
+      <w:r>
+        <w:rPr>
+          <w:noProof/>
+        </w:rPr>
+        <w:t>20</w:t>
+      </w:r>
+      <w:r>
+        <w:rPr>
+          <w:noProof/>
+        </w:rPr>
+        <w:fldChar w:fldCharType="end"/>
+      </w:r>
       <w:r>
         <w:t xml:space="preserve"> distribusi </w:t>
       </w:r>
@@ -16449,14 +16675,7 @@
         <w:rPr>
           <w:rFonts w:ascii="Times New Roman" w:hAnsi="Times New Roman" w:cs="Times New Roman"/>
         </w:rPr>
-        <w:t xml:space="preserve">Distribusi pada kolom Usia memperlihatkan rentang usia mahasiswa baru yang cukup beragam. Sebagian besar nilai berada dalam rentang yang wajar untuk kategori </w:t>
-      </w:r>
-      <w:r>
-        <w:rPr>
-          <w:rFonts w:ascii="Times New Roman" w:hAnsi="Times New Roman" w:cs="Times New Roman"/>
-        </w:rPr>
-        <w:lastRenderedPageBreak/>
-        <w:t xml:space="preserve">pendaftar pendidikan tinggi. Namun, dari hasil visualisasi ditemukan beberapa nilai usia yang tidak wajar, seperti usia yang mendekati 120 tahun serta usia </w:t>
+        <w:t xml:space="preserve">Distribusi pada kolom Usia memperlihatkan rentang usia mahasiswa baru yang cukup beragam. Sebagian besar nilai berada dalam rentang yang wajar untuk kategori pendaftar pendidikan tinggi. Namun, dari hasil visualisasi ditemukan beberapa nilai usia yang tidak wajar, seperti usia yang mendekati 120 tahun serta usia </w:t>
       </w:r>
       <w:r>
         <w:rPr>
@@ -16485,7 +16704,14 @@
         <w:rPr>
           <w:rFonts w:ascii="Times New Roman" w:hAnsi="Times New Roman" w:cs="Times New Roman"/>
         </w:rPr>
-        <w:t>Nilai-nilai tersebut menunjukkan adanya entri data yang keliru atau tidak terisi dengan benar, sehingga dikategorikan sebagai anomali. Kasus ini perlu ditangani pada tahap problem solving agar tidak memengaruhi interpretasi visualisasi dan tidak menimbulkan kesalahan pemahaman terhadap kondisi demografis mahasiswa baru.</w:t>
+        <w:t xml:space="preserve">Nilai-nilai tersebut menunjukkan adanya entri data yang keliru atau tidak terisi dengan benar, sehingga dikategorikan sebagai anomali. Kasus ini perlu ditangani </w:t>
+      </w:r>
+      <w:r>
+        <w:rPr>
+          <w:rFonts w:ascii="Times New Roman" w:hAnsi="Times New Roman" w:cs="Times New Roman"/>
+        </w:rPr>
+        <w:lastRenderedPageBreak/>
+        <w:t>pada tahap problem solving agar tidak memengaruhi interpretasi visualisasi dan tidak menimbulkan kesalahan pemahaman terhadap kondisi demografis mahasiswa baru.</w:t>
       </w:r>
     </w:p>
     <w:p>
@@ -16568,14 +16794,27 @@
       <w:r>
         <w:t xml:space="preserve">Gambar 3. </w:t>
       </w:r>
-      <w:fldSimple w:instr=" SEQ Gambar_3. \* ARABIC ">
-        <w:r>
-          <w:rPr>
-            <w:noProof/>
-          </w:rPr>
-          <w:t>21</w:t>
-        </w:r>
-      </w:fldSimple>
+      <w:r>
+        <w:fldChar w:fldCharType="begin"/>
+      </w:r>
+      <w:r>
+        <w:instrText xml:space="preserve"> SEQ Gambar_3. \* ARABIC </w:instrText>
+      </w:r>
+      <w:r>
+        <w:fldChar w:fldCharType="separate"/>
+      </w:r>
+      <w:r>
+        <w:rPr>
+          <w:noProof/>
+        </w:rPr>
+        <w:t>21</w:t>
+      </w:r>
+      <w:r>
+        <w:rPr>
+          <w:noProof/>
+        </w:rPr>
+        <w:fldChar w:fldCharType="end"/>
+      </w:r>
       <w:r>
         <w:t xml:space="preserve"> distribusi </w:t>
       </w:r>
@@ -16610,22 +16849,57 @@
         <w:rPr>
           <w:rFonts w:ascii="Times New Roman" w:hAnsi="Times New Roman" w:cs="Times New Roman"/>
         </w:rPr>
-        <w:t xml:space="preserve">. Berdasarkan visualisasi, sebaran data pada kolom ini dapat dikatakan normal dan valid. Tidak </w:t>
+        <w:t>. Berdasarkan visualisasi, sebaran data pada kolom ini dapat dikatakan normal dan valid. Tidak ditemukan nilai yang janggal, tidak lazim, atau tidak sesuai dengan klasifikasi umum jurusan SLTA di Indonesia. Data pada kolom ini dapat langsung digunakan dalam proses visualisasi tanpa perlu dilakukan penanganan lebih lanjut.</w:t>
+      </w:r>
+    </w:p>
+    <w:p>
+      <w:pPr>
+        <w:pStyle w:val="Heading8"/>
+      </w:pPr>
+      <w:r>
+        <w:t>Pendidikan ayah</w:t>
+      </w:r>
+    </w:p>
+    <w:p>
+      <w:pPr>
+        <w:pStyle w:val="ListParagraph"/>
+        <w:spacing w:line="480" w:lineRule="auto"/>
+        <w:ind w:left="2160" w:firstLine="720"/>
+        <w:jc w:val="both"/>
+        <w:rPr>
+          <w:rFonts w:ascii="Times New Roman" w:hAnsi="Times New Roman" w:cs="Times New Roman"/>
+        </w:rPr>
+      </w:pPr>
+      <w:r>
+        <w:rPr>
+          <w:rFonts w:ascii="Times New Roman" w:hAnsi="Times New Roman" w:cs="Times New Roman"/>
+        </w:rPr>
+        <w:t xml:space="preserve">Distribusi pada kolom Pendidikan Ayah menunjukkan tingkat pendidikan terakhir yang ditempuh </w:t>
       </w:r>
       <w:r>
         <w:rPr>
           <w:rFonts w:ascii="Times New Roman" w:hAnsi="Times New Roman" w:cs="Times New Roman"/>
         </w:rPr>
         <w:lastRenderedPageBreak/>
-        <w:t>ditemukan nilai yang janggal, tidak lazim, atau tidak sesuai dengan klasifikasi umum jurusan SLTA di Indonesia. Data pada kolom ini dapat langsung digunakan dalam proses visualisasi tanpa perlu dilakukan penanganan lebih lanjut.</w:t>
-      </w:r>
-    </w:p>
-    <w:p>
-      <w:pPr>
-        <w:pStyle w:val="Heading8"/>
-      </w:pPr>
-      <w:r>
-        <w:t>Pendidikan ayah</w:t>
+        <w:t>oleh orang tua pendaftar (ayah). Berdasarkan visualisasi, seluruh nilai yang muncul tergolong umum dan sesuai dengan jenjang pendidikan formal yang berlaku di Indonesia, seperti SD, SMP, SMA, D3, S1, S2</w:t>
+      </w:r>
+      <w:r>
+        <w:rPr>
+          <w:rFonts w:ascii="Times New Roman" w:hAnsi="Times New Roman" w:cs="Times New Roman"/>
+        </w:rPr>
+        <w:t>,</w:t>
+      </w:r>
+      <w:r>
+        <w:rPr>
+          <w:rFonts w:ascii="Times New Roman" w:hAnsi="Times New Roman" w:cs="Times New Roman"/>
+        </w:rPr>
+        <w:t xml:space="preserve"> dan lainnya</w:t>
+      </w:r>
+      <w:r>
+        <w:rPr>
+          <w:rFonts w:ascii="Times New Roman" w:hAnsi="Times New Roman" w:cs="Times New Roman"/>
+        </w:rPr>
+        <w:t>. Oleh karena itu, distribusi data pada kolom ini dapat dikatakan normal dan valid, serta tidak memerlukan tindakan koreksi tambahan sebelum divisualisasikan.</w:t>
       </w:r>
     </w:p>
     <w:p>
@@ -16639,7 +16913,7 @@
           <w:noProof/>
         </w:rPr>
         <w:drawing>
-          <wp:inline distT="0" distB="0" distL="0" distR="0" wp14:anchorId="213EFD9D" wp14:editId="232A0D24">
+          <wp:inline distT="0" distB="0" distL="0" distR="0" wp14:anchorId="1D5F75F7" wp14:editId="723D4757">
             <wp:extent cx="5400000" cy="3038054"/>
             <wp:effectExtent l="0" t="0" r="0" b="0"/>
             <wp:docPr id="1741589111" name="Picture 15"/>
@@ -16691,6 +16965,7 @@
     <w:p>
       <w:pPr>
         <w:pStyle w:val="Caption"/>
+        <w:spacing w:line="480" w:lineRule="auto"/>
         <w:jc w:val="center"/>
         <w:rPr>
           <w:rFonts w:ascii="Times New Roman" w:hAnsi="Times New Roman" w:cs="Times New Roman"/>
@@ -16700,14 +16975,27 @@
       <w:r>
         <w:t xml:space="preserve">Gambar 3. </w:t>
       </w:r>
-      <w:fldSimple w:instr=" SEQ Gambar_3. \* ARABIC ">
-        <w:r>
-          <w:rPr>
-            <w:noProof/>
-          </w:rPr>
-          <w:t>22</w:t>
-        </w:r>
-      </w:fldSimple>
+      <w:r>
+        <w:fldChar w:fldCharType="begin"/>
+      </w:r>
+      <w:r>
+        <w:instrText xml:space="preserve"> SEQ Gambar_3. \* ARABIC </w:instrText>
+      </w:r>
+      <w:r>
+        <w:fldChar w:fldCharType="separate"/>
+      </w:r>
+      <w:r>
+        <w:rPr>
+          <w:noProof/>
+        </w:rPr>
+        <w:t>22</w:t>
+      </w:r>
+      <w:r>
+        <w:rPr>
+          <w:noProof/>
+        </w:rPr>
+        <w:fldChar w:fldCharType="end"/>
+      </w:r>
       <w:r>
         <w:t xml:space="preserve"> distribusi </w:t>
       </w:r>
@@ -16715,6 +17003,14 @@
         <w:t>pendidikan ayah</w:t>
       </w:r>
       <w:bookmarkEnd w:id="72"/>
+    </w:p>
+    <w:p>
+      <w:pPr>
+        <w:pStyle w:val="Heading8"/>
+      </w:pPr>
+      <w:r>
+        <w:t>Pendidikan ibu</w:t>
+      </w:r>
     </w:p>
     <w:p>
       <w:pPr>
@@ -16730,40 +17026,38 @@
         <w:rPr>
           <w:rFonts w:ascii="Times New Roman" w:hAnsi="Times New Roman" w:cs="Times New Roman"/>
         </w:rPr>
-        <w:t>Distribusi pada kolom Pendidikan Ayah menunjukkan tingkat pendidikan terakhir yang ditempuh oleh orang tua pendaftar (ayah). Berdasarkan visualisasi, seluruh nilai yang muncul tergolong umum dan sesuai dengan jenjang pendidikan formal yang berlaku di Indonesia, seperti SD, SMP, SMA, D3, S1, S2</w:t>
-      </w:r>
-      <w:r>
-        <w:rPr>
-          <w:rFonts w:ascii="Times New Roman" w:hAnsi="Times New Roman" w:cs="Times New Roman"/>
-        </w:rPr>
-        <w:t>,</w:t>
-      </w:r>
-      <w:r>
-        <w:rPr>
-          <w:rFonts w:ascii="Times New Roman" w:hAnsi="Times New Roman" w:cs="Times New Roman"/>
-        </w:rPr>
-        <w:t xml:space="preserve"> dan lainnya</w:t>
-      </w:r>
-      <w:r>
-        <w:rPr>
-          <w:rFonts w:ascii="Times New Roman" w:hAnsi="Times New Roman" w:cs="Times New Roman"/>
-        </w:rPr>
-        <w:t xml:space="preserve">. Oleh karena itu, distribusi data pada kolom ini dapat </w:t>
+        <w:t xml:space="preserve">Distribusi pada kolom Pendidikan Ibu merepresentasikan jenjang pendidikan terakhir yang ditempuh oleh ibu dari masing-masing pendaftar. Hasil visualisasi menunjukkan bahwa seluruh nilai yang muncul </w:t>
       </w:r>
       <w:r>
         <w:rPr>
           <w:rFonts w:ascii="Times New Roman" w:hAnsi="Times New Roman" w:cs="Times New Roman"/>
         </w:rPr>
         <w:lastRenderedPageBreak/>
-        <w:t>dikatakan normal dan valid, serta tidak memerlukan tindakan koreksi tambahan sebelum divisualisasikan.</w:t>
-      </w:r>
-    </w:p>
-    <w:p>
-      <w:pPr>
-        <w:pStyle w:val="Heading8"/>
-      </w:pPr>
-      <w:r>
-        <w:t>Pendidikan ibu</w:t>
+        <w:t>sesuai dengan jenjang pendidikan formal yang umum di Indonesia, seperti SD, SMP, SMA, D3, S1,</w:t>
+      </w:r>
+      <w:r>
+        <w:rPr>
+          <w:rFonts w:ascii="Times New Roman" w:hAnsi="Times New Roman" w:cs="Times New Roman"/>
+        </w:rPr>
+        <w:t xml:space="preserve"> </w:t>
+      </w:r>
+      <w:r>
+        <w:rPr>
+          <w:rFonts w:ascii="Times New Roman" w:hAnsi="Times New Roman" w:cs="Times New Roman"/>
+        </w:rPr>
+        <w:t>S2</w:t>
+      </w:r>
+      <w:r>
+        <w:rPr>
+          <w:rFonts w:ascii="Times New Roman" w:hAnsi="Times New Roman" w:cs="Times New Roman"/>
+        </w:rPr>
+        <w:t>, dan lainnya</w:t>
+      </w:r>
+      <w:r>
+        <w:rPr>
+          <w:rFonts w:ascii="Times New Roman" w:hAnsi="Times New Roman" w:cs="Times New Roman"/>
+        </w:rPr>
+        <w:t>. Tidak ditemukan nilai yang tidak lazim atau mencurigakan. Dengan demikian, data pada kolom ini dinyatakan aman dan valid, serta dapat digunakan langsung dalam proses visualisasi.</w:t>
       </w:r>
     </w:p>
     <w:p>
@@ -16777,7 +17071,7 @@
           <w:noProof/>
         </w:rPr>
         <w:drawing>
-          <wp:inline distT="0" distB="0" distL="0" distR="0" wp14:anchorId="236AD427" wp14:editId="1A1C5FA2">
+          <wp:inline distT="0" distB="0" distL="0" distR="0" wp14:anchorId="07281B34" wp14:editId="28A850E4">
             <wp:extent cx="5400000" cy="3038054"/>
             <wp:effectExtent l="0" t="0" r="0" b="0"/>
             <wp:docPr id="2021986289" name="Picture 16"/>
@@ -16829,6 +17123,7 @@
     <w:p>
       <w:pPr>
         <w:pStyle w:val="Caption"/>
+        <w:spacing w:line="480" w:lineRule="auto"/>
         <w:jc w:val="center"/>
         <w:rPr>
           <w:rFonts w:ascii="Times New Roman" w:hAnsi="Times New Roman" w:cs="Times New Roman"/>
@@ -16838,14 +17133,27 @@
       <w:r>
         <w:t xml:space="preserve">Gambar 3. </w:t>
       </w:r>
-      <w:fldSimple w:instr=" SEQ Gambar_3. \* ARABIC ">
-        <w:r>
-          <w:rPr>
-            <w:noProof/>
-          </w:rPr>
-          <w:t>23</w:t>
-        </w:r>
-      </w:fldSimple>
+      <w:r>
+        <w:fldChar w:fldCharType="begin"/>
+      </w:r>
+      <w:r>
+        <w:instrText xml:space="preserve"> SEQ Gambar_3. \* ARABIC </w:instrText>
+      </w:r>
+      <w:r>
+        <w:fldChar w:fldCharType="separate"/>
+      </w:r>
+      <w:r>
+        <w:rPr>
+          <w:noProof/>
+        </w:rPr>
+        <w:t>23</w:t>
+      </w:r>
+      <w:r>
+        <w:rPr>
+          <w:noProof/>
+        </w:rPr>
+        <w:fldChar w:fldCharType="end"/>
+      </w:r>
       <w:r>
         <w:t xml:space="preserve"> distribusi </w:t>
       </w:r>
@@ -16853,6 +17161,14 @@
         <w:t>pendidikan ibu</w:t>
       </w:r>
       <w:bookmarkEnd w:id="73"/>
+    </w:p>
+    <w:p>
+      <w:pPr>
+        <w:pStyle w:val="Heading8"/>
+      </w:pPr>
+      <w:r>
+        <w:t>Pekerjaan orang tua (ibu)</w:t>
+      </w:r>
     </w:p>
     <w:p>
       <w:pPr>
@@ -16868,46 +17184,44 @@
         <w:rPr>
           <w:rFonts w:ascii="Times New Roman" w:hAnsi="Times New Roman" w:cs="Times New Roman"/>
         </w:rPr>
-        <w:t>Distribusi pada kolom Pendidikan Ibu merepresentasikan jenjang pendidikan terakhir yang ditempuh oleh ibu dari masing-masing pendaftar. Hasil visualisasi menunjukkan bahwa seluruh nilai yang muncul sesuai dengan jenjang pendidikan formal yang umum di Indonesia, seperti SD, SMP, SMA, D3, S1,</w:t>
-      </w:r>
-      <w:r>
-        <w:rPr>
-          <w:rFonts w:ascii="Times New Roman" w:hAnsi="Times New Roman" w:cs="Times New Roman"/>
-        </w:rPr>
-        <w:t xml:space="preserve"> </w:t>
-      </w:r>
-      <w:r>
-        <w:rPr>
-          <w:rFonts w:ascii="Times New Roman" w:hAnsi="Times New Roman" w:cs="Times New Roman"/>
-        </w:rPr>
-        <w:t>S2</w:t>
-      </w:r>
-      <w:r>
-        <w:rPr>
-          <w:rFonts w:ascii="Times New Roman" w:hAnsi="Times New Roman" w:cs="Times New Roman"/>
-        </w:rPr>
-        <w:t>, dan lainnya</w:t>
-      </w:r>
-      <w:r>
-        <w:rPr>
-          <w:rFonts w:ascii="Times New Roman" w:hAnsi="Times New Roman" w:cs="Times New Roman"/>
-        </w:rPr>
-        <w:t xml:space="preserve">. Tidak ditemukan nilai yang tidak lazim atau mencurigakan. Dengan demikian, data pada kolom ini dinyatakan aman dan </w:t>
+        <w:t xml:space="preserve">Distribusi pada kolom Pekerjaan Orang Tua (Ibu) menunjukkan variasi pekerjaan yang dijalani oleh ibu dari para pendaftar. Berdasarkan hasil visualisasi, seluruh nilai yang muncul merupakan jenis pekerjaan yang wajar dan umum ditemukan di masyarakat, seperti </w:t>
+      </w:r>
+      <w:r>
+        <w:rPr>
+          <w:rFonts w:ascii="Times New Roman" w:hAnsi="Times New Roman" w:cs="Times New Roman"/>
+        </w:rPr>
+        <w:t xml:space="preserve">tidak bekerja, </w:t>
       </w:r>
       <w:r>
         <w:rPr>
           <w:rFonts w:ascii="Times New Roman" w:hAnsi="Times New Roman" w:cs="Times New Roman"/>
         </w:rPr>
         <w:lastRenderedPageBreak/>
-        <w:t>valid, serta dapat digunakan langsung dalam proses visualisasi.</w:t>
-      </w:r>
-    </w:p>
-    <w:p>
-      <w:pPr>
-        <w:pStyle w:val="Heading8"/>
-      </w:pPr>
-      <w:r>
-        <w:t>Pekerjaan orang tua (ibu)</w:t>
+        <w:t>PNS/TNI/</w:t>
+      </w:r>
+      <w:r>
+        <w:rPr>
+          <w:rFonts w:ascii="Times New Roman" w:hAnsi="Times New Roman" w:cs="Times New Roman"/>
+        </w:rPr>
+        <w:t>Polri</w:t>
+      </w:r>
+      <w:r>
+        <w:rPr>
+          <w:rFonts w:ascii="Times New Roman" w:hAnsi="Times New Roman" w:cs="Times New Roman"/>
+        </w:rPr>
+        <w:t xml:space="preserve">, </w:t>
+      </w:r>
+      <w:r>
+        <w:rPr>
+          <w:rFonts w:ascii="Times New Roman" w:hAnsi="Times New Roman" w:cs="Times New Roman"/>
+        </w:rPr>
+        <w:t>karyawan swasta</w:t>
+      </w:r>
+      <w:r>
+        <w:rPr>
+          <w:rFonts w:ascii="Times New Roman" w:hAnsi="Times New Roman" w:cs="Times New Roman"/>
+        </w:rPr>
+        <w:t>, dan profesi lainnya. Tidak terdapat nilai yang janggal, kosong, atau tidak relevan. Oleh karena itu, data pada kolom ini dapat dinyatakan aman dan valid untuk digunakan dalam proses visualisasi lebih lanjut.</w:t>
       </w:r>
     </w:p>
     <w:p>
@@ -16921,7 +17235,7 @@
           <w:noProof/>
         </w:rPr>
         <w:drawing>
-          <wp:inline distT="0" distB="0" distL="0" distR="0" wp14:anchorId="78308A1F" wp14:editId="5E6331EE">
+          <wp:inline distT="0" distB="0" distL="0" distR="0" wp14:anchorId="24B0B33F" wp14:editId="29D944C3">
             <wp:extent cx="5400000" cy="2929816"/>
             <wp:effectExtent l="0" t="0" r="0" b="4445"/>
             <wp:docPr id="526921830" name="Picture 17"/>
@@ -16973,6 +17287,7 @@
     <w:p>
       <w:pPr>
         <w:pStyle w:val="Caption"/>
+        <w:spacing w:line="480" w:lineRule="auto"/>
         <w:jc w:val="center"/>
         <w:rPr>
           <w:rFonts w:ascii="Times New Roman" w:hAnsi="Times New Roman" w:cs="Times New Roman"/>
@@ -16982,14 +17297,27 @@
       <w:r>
         <w:t xml:space="preserve">Gambar 3. </w:t>
       </w:r>
-      <w:fldSimple w:instr=" SEQ Gambar_3. \* ARABIC ">
-        <w:r>
-          <w:rPr>
-            <w:noProof/>
-          </w:rPr>
-          <w:t>24</w:t>
-        </w:r>
-      </w:fldSimple>
+      <w:r>
+        <w:fldChar w:fldCharType="begin"/>
+      </w:r>
+      <w:r>
+        <w:instrText xml:space="preserve"> SEQ Gambar_3. \* ARABIC </w:instrText>
+      </w:r>
+      <w:r>
+        <w:fldChar w:fldCharType="separate"/>
+      </w:r>
+      <w:r>
+        <w:rPr>
+          <w:noProof/>
+        </w:rPr>
+        <w:t>24</w:t>
+      </w:r>
+      <w:r>
+        <w:rPr>
+          <w:noProof/>
+        </w:rPr>
+        <w:fldChar w:fldCharType="end"/>
+      </w:r>
       <w:r>
         <w:t xml:space="preserve"> distribusi </w:t>
       </w:r>
@@ -16997,59 +17325,6 @@
         <w:t>pekerjaan orang tua (ibu)</w:t>
       </w:r>
       <w:bookmarkEnd w:id="74"/>
-    </w:p>
-    <w:p>
-      <w:pPr>
-        <w:pStyle w:val="ListParagraph"/>
-        <w:spacing w:line="480" w:lineRule="auto"/>
-        <w:ind w:left="2160" w:firstLine="720"/>
-        <w:jc w:val="both"/>
-        <w:rPr>
-          <w:rFonts w:ascii="Times New Roman" w:hAnsi="Times New Roman" w:cs="Times New Roman"/>
-        </w:rPr>
-      </w:pPr>
-      <w:r>
-        <w:rPr>
-          <w:rFonts w:ascii="Times New Roman" w:hAnsi="Times New Roman" w:cs="Times New Roman"/>
-        </w:rPr>
-        <w:t xml:space="preserve">Distribusi pada kolom Pekerjaan Orang Tua (Ibu) menunjukkan variasi pekerjaan yang dijalani oleh ibu dari para pendaftar. Berdasarkan hasil visualisasi, seluruh nilai yang muncul merupakan jenis pekerjaan yang wajar dan umum ditemukan di masyarakat, seperti </w:t>
-      </w:r>
-      <w:r>
-        <w:rPr>
-          <w:rFonts w:ascii="Times New Roman" w:hAnsi="Times New Roman" w:cs="Times New Roman"/>
-        </w:rPr>
-        <w:t xml:space="preserve">tidak bekerja, </w:t>
-      </w:r>
-      <w:r>
-        <w:rPr>
-          <w:rFonts w:ascii="Times New Roman" w:hAnsi="Times New Roman" w:cs="Times New Roman"/>
-        </w:rPr>
-        <w:t>PNS/TNI/</w:t>
-      </w:r>
-      <w:r>
-        <w:rPr>
-          <w:rFonts w:ascii="Times New Roman" w:hAnsi="Times New Roman" w:cs="Times New Roman"/>
-        </w:rPr>
-        <w:t>Polri</w:t>
-      </w:r>
-      <w:r>
-        <w:rPr>
-          <w:rFonts w:ascii="Times New Roman" w:hAnsi="Times New Roman" w:cs="Times New Roman"/>
-        </w:rPr>
-        <w:t xml:space="preserve">, </w:t>
-      </w:r>
-      <w:r>
-        <w:rPr>
-          <w:rFonts w:ascii="Times New Roman" w:hAnsi="Times New Roman" w:cs="Times New Roman"/>
-        </w:rPr>
-        <w:t>karyawan swasta</w:t>
-      </w:r>
-      <w:r>
-        <w:rPr>
-          <w:rFonts w:ascii="Times New Roman" w:hAnsi="Times New Roman" w:cs="Times New Roman"/>
-        </w:rPr>
-        <w:t>, dan profesi lainnya. Tidak terdapat nilai yang janggal, kosong, atau tidak relevan. Oleh karena itu, data pada kolom ini dapat dinyatakan aman dan valid untuk digunakan dalam proses visualisasi lebih lanjut.</w:t>
-      </w:r>
     </w:p>
     <w:p>
       <w:pPr>
@@ -17064,7 +17339,6 @@
           <w:i/>
           <w:iCs/>
         </w:rPr>
-        <w:lastRenderedPageBreak/>
         <w:t>Problem Solving</w:t>
       </w:r>
     </w:p>
@@ -17229,6 +17503,7 @@
         <w:rPr>
           <w:rFonts w:ascii="Times New Roman" w:hAnsi="Times New Roman" w:cs="Times New Roman"/>
         </w:rPr>
+        <w:lastRenderedPageBreak/>
         <w:t>Pada bagian struktur data, masalah yang diatasi adalah pada kolom</w:t>
       </w:r>
       <w:r>
@@ -17263,7 +17538,6 @@
           <w:rFonts w:ascii="Times New Roman" w:hAnsi="Times New Roman" w:cs="Times New Roman"/>
           <w:noProof/>
         </w:rPr>
-        <w:lastRenderedPageBreak/>
         <w:drawing>
           <wp:inline distT="0" distB="0" distL="0" distR="0" wp14:anchorId="243B031C" wp14:editId="6749E333">
             <wp:extent cx="3600000" cy="4090166"/>
@@ -17331,14 +17605,27 @@
       <w:r>
         <w:t xml:space="preserve">Gambar 3. </w:t>
       </w:r>
-      <w:fldSimple w:instr=" SEQ Gambar_3. \* ARABIC ">
-        <w:r>
-          <w:rPr>
-            <w:noProof/>
-          </w:rPr>
-          <w:t>25</w:t>
-        </w:r>
-      </w:fldSimple>
+      <w:r>
+        <w:fldChar w:fldCharType="begin"/>
+      </w:r>
+      <w:r>
+        <w:instrText xml:space="preserve"> SEQ Gambar_3. \* ARABIC </w:instrText>
+      </w:r>
+      <w:r>
+        <w:fldChar w:fldCharType="separate"/>
+      </w:r>
+      <w:r>
+        <w:rPr>
+          <w:noProof/>
+        </w:rPr>
+        <w:t>25</w:t>
+      </w:r>
+      <w:r>
+        <w:rPr>
+          <w:noProof/>
+        </w:rPr>
+        <w:fldChar w:fldCharType="end"/>
+      </w:r>
       <w:r>
         <w:t xml:space="preserve"> v</w:t>
       </w:r>
@@ -17491,14 +17778,27 @@
       <w:r>
         <w:t xml:space="preserve">Gambar 3. </w:t>
       </w:r>
-      <w:fldSimple w:instr=" SEQ Gambar_3. \* ARABIC ">
-        <w:r>
-          <w:rPr>
-            <w:noProof/>
-          </w:rPr>
-          <w:t>26</w:t>
-        </w:r>
-      </w:fldSimple>
+      <w:r>
+        <w:fldChar w:fldCharType="begin"/>
+      </w:r>
+      <w:r>
+        <w:instrText xml:space="preserve"> SEQ Gambar_3. \* ARABIC </w:instrText>
+      </w:r>
+      <w:r>
+        <w:fldChar w:fldCharType="separate"/>
+      </w:r>
+      <w:r>
+        <w:rPr>
+          <w:noProof/>
+        </w:rPr>
+        <w:t>26</w:t>
+      </w:r>
+      <w:r>
+        <w:rPr>
+          <w:noProof/>
+        </w:rPr>
+        <w:fldChar w:fldCharType="end"/>
+      </w:r>
       <w:r>
         <w:t xml:space="preserve"> v</w:t>
       </w:r>
@@ -17749,14 +18049,27 @@
       <w:r>
         <w:t xml:space="preserve">Gambar 3. </w:t>
       </w:r>
-      <w:fldSimple w:instr=" SEQ Gambar_3. \* ARABIC ">
-        <w:r>
-          <w:rPr>
-            <w:noProof/>
-          </w:rPr>
-          <w:t>27</w:t>
-        </w:r>
-      </w:fldSimple>
+      <w:r>
+        <w:fldChar w:fldCharType="begin"/>
+      </w:r>
+      <w:r>
+        <w:instrText xml:space="preserve"> SEQ Gambar_3. \* ARABIC </w:instrText>
+      </w:r>
+      <w:r>
+        <w:fldChar w:fldCharType="separate"/>
+      </w:r>
+      <w:r>
+        <w:rPr>
+          <w:noProof/>
+        </w:rPr>
+        <w:t>27</w:t>
+      </w:r>
+      <w:r>
+        <w:rPr>
+          <w:noProof/>
+        </w:rPr>
+        <w:fldChar w:fldCharType="end"/>
+      </w:r>
       <w:r>
         <w:t xml:space="preserve"> </w:t>
       </w:r>
@@ -17848,14 +18161,27 @@
       <w:r>
         <w:t xml:space="preserve">Gambar 3. </w:t>
       </w:r>
-      <w:fldSimple w:instr=" SEQ Gambar_3. \* ARABIC ">
-        <w:r>
-          <w:rPr>
-            <w:noProof/>
-          </w:rPr>
-          <w:t>28</w:t>
-        </w:r>
-      </w:fldSimple>
+      <w:r>
+        <w:fldChar w:fldCharType="begin"/>
+      </w:r>
+      <w:r>
+        <w:instrText xml:space="preserve"> SEQ Gambar_3. \* ARABIC </w:instrText>
+      </w:r>
+      <w:r>
+        <w:fldChar w:fldCharType="separate"/>
+      </w:r>
+      <w:r>
+        <w:rPr>
+          <w:noProof/>
+        </w:rPr>
+        <w:t>28</w:t>
+      </w:r>
+      <w:r>
+        <w:rPr>
+          <w:noProof/>
+        </w:rPr>
+        <w:fldChar w:fldCharType="end"/>
+      </w:r>
       <w:r>
         <w:t xml:space="preserve"> </w:t>
       </w:r>
@@ -18006,14 +18332,27 @@
       <w:r>
         <w:t xml:space="preserve">Gambar 3. </w:t>
       </w:r>
-      <w:fldSimple w:instr=" SEQ Gambar_3. \* ARABIC ">
-        <w:r>
-          <w:rPr>
-            <w:noProof/>
-          </w:rPr>
-          <w:t>29</w:t>
-        </w:r>
-      </w:fldSimple>
+      <w:r>
+        <w:fldChar w:fldCharType="begin"/>
+      </w:r>
+      <w:r>
+        <w:instrText xml:space="preserve"> SEQ Gambar_3. \* ARABIC </w:instrText>
+      </w:r>
+      <w:r>
+        <w:fldChar w:fldCharType="separate"/>
+      </w:r>
+      <w:r>
+        <w:rPr>
+          <w:noProof/>
+        </w:rPr>
+        <w:t>29</w:t>
+      </w:r>
+      <w:r>
+        <w:rPr>
+          <w:noProof/>
+        </w:rPr>
+        <w:fldChar w:fldCharType="end"/>
+      </w:r>
       <w:r>
         <w:t xml:space="preserve"> validasi ulang prodi pilihan 1</w:t>
       </w:r>
@@ -18136,14 +18475,27 @@
       <w:r>
         <w:t xml:space="preserve">Gambar 3. </w:t>
       </w:r>
-      <w:fldSimple w:instr=" SEQ Gambar_3. \* ARABIC ">
-        <w:r>
-          <w:rPr>
-            <w:noProof/>
-          </w:rPr>
-          <w:t>30</w:t>
-        </w:r>
-      </w:fldSimple>
+      <w:r>
+        <w:fldChar w:fldCharType="begin"/>
+      </w:r>
+      <w:r>
+        <w:instrText xml:space="preserve"> SEQ Gambar_3. \* ARABIC </w:instrText>
+      </w:r>
+      <w:r>
+        <w:fldChar w:fldCharType="separate"/>
+      </w:r>
+      <w:r>
+        <w:rPr>
+          <w:noProof/>
+        </w:rPr>
+        <w:t>30</w:t>
+      </w:r>
+      <w:r>
+        <w:rPr>
+          <w:noProof/>
+        </w:rPr>
+        <w:fldChar w:fldCharType="end"/>
+      </w:r>
       <w:r>
         <w:t xml:space="preserve"> validasi ulang </w:t>
       </w:r>
@@ -18288,14 +18640,27 @@
       <w:r>
         <w:t xml:space="preserve">Gambar 3. </w:t>
       </w:r>
-      <w:fldSimple w:instr=" SEQ Gambar_3. \* ARABIC ">
-        <w:r>
-          <w:rPr>
-            <w:noProof/>
-          </w:rPr>
-          <w:t>31</w:t>
-        </w:r>
-      </w:fldSimple>
+      <w:r>
+        <w:fldChar w:fldCharType="begin"/>
+      </w:r>
+      <w:r>
+        <w:instrText xml:space="preserve"> SEQ Gambar_3. \* ARABIC </w:instrText>
+      </w:r>
+      <w:r>
+        <w:fldChar w:fldCharType="separate"/>
+      </w:r>
+      <w:r>
+        <w:rPr>
+          <w:noProof/>
+        </w:rPr>
+        <w:t>31</w:t>
+      </w:r>
+      <w:r>
+        <w:rPr>
+          <w:noProof/>
+        </w:rPr>
+        <w:fldChar w:fldCharType="end"/>
+      </w:r>
       <w:r>
         <w:t xml:space="preserve"> validasi ulang </w:t>
       </w:r>
@@ -18427,14 +18792,27 @@
       <w:r>
         <w:t xml:space="preserve">Gambar 3. </w:t>
       </w:r>
-      <w:fldSimple w:instr=" SEQ Gambar_3. \* ARABIC ">
-        <w:r>
-          <w:rPr>
-            <w:noProof/>
-          </w:rPr>
-          <w:t>32</w:t>
-        </w:r>
-      </w:fldSimple>
+      <w:r>
+        <w:fldChar w:fldCharType="begin"/>
+      </w:r>
+      <w:r>
+        <w:instrText xml:space="preserve"> SEQ Gambar_3. \* ARABIC </w:instrText>
+      </w:r>
+      <w:r>
+        <w:fldChar w:fldCharType="separate"/>
+      </w:r>
+      <w:r>
+        <w:rPr>
+          <w:noProof/>
+        </w:rPr>
+        <w:t>32</w:t>
+      </w:r>
+      <w:r>
+        <w:rPr>
+          <w:noProof/>
+        </w:rPr>
+        <w:fldChar w:fldCharType="end"/>
+      </w:r>
       <w:r>
         <w:t xml:space="preserve"> validasi ulang </w:t>
       </w:r>
@@ -18591,14 +18969,27 @@
       <w:r>
         <w:t xml:space="preserve">Gambar 3. </w:t>
       </w:r>
-      <w:fldSimple w:instr=" SEQ Gambar_3. \* ARABIC ">
-        <w:r>
-          <w:rPr>
-            <w:noProof/>
-          </w:rPr>
-          <w:t>33</w:t>
-        </w:r>
-      </w:fldSimple>
+      <w:r>
+        <w:fldChar w:fldCharType="begin"/>
+      </w:r>
+      <w:r>
+        <w:instrText xml:space="preserve"> SEQ Gambar_3. \* ARABIC </w:instrText>
+      </w:r>
+      <w:r>
+        <w:fldChar w:fldCharType="separate"/>
+      </w:r>
+      <w:r>
+        <w:rPr>
+          <w:noProof/>
+        </w:rPr>
+        <w:t>33</w:t>
+      </w:r>
+      <w:r>
+        <w:rPr>
+          <w:noProof/>
+        </w:rPr>
+        <w:fldChar w:fldCharType="end"/>
+      </w:r>
       <w:r>
         <w:t xml:space="preserve"> validasi ulang </w:t>
       </w:r>
@@ -18730,14 +19121,27 @@
       <w:r>
         <w:t xml:space="preserve">Gambar 3. </w:t>
       </w:r>
-      <w:fldSimple w:instr=" SEQ Gambar_3. \* ARABIC ">
-        <w:r>
-          <w:rPr>
-            <w:noProof/>
-          </w:rPr>
-          <w:t>34</w:t>
-        </w:r>
-      </w:fldSimple>
+      <w:r>
+        <w:fldChar w:fldCharType="begin"/>
+      </w:r>
+      <w:r>
+        <w:instrText xml:space="preserve"> SEQ Gambar_3. \* ARABIC </w:instrText>
+      </w:r>
+      <w:r>
+        <w:fldChar w:fldCharType="separate"/>
+      </w:r>
+      <w:r>
+        <w:rPr>
+          <w:noProof/>
+        </w:rPr>
+        <w:t>34</w:t>
+      </w:r>
+      <w:r>
+        <w:rPr>
+          <w:noProof/>
+        </w:rPr>
+        <w:fldChar w:fldCharType="end"/>
+      </w:r>
       <w:r>
         <w:t xml:space="preserve"> validasi ulang </w:t>
       </w:r>
@@ -18894,14 +19298,27 @@
       <w:r>
         <w:t xml:space="preserve">Gambar 3. </w:t>
       </w:r>
-      <w:fldSimple w:instr=" SEQ Gambar_3. \* ARABIC ">
-        <w:r>
-          <w:rPr>
-            <w:noProof/>
-          </w:rPr>
-          <w:t>35</w:t>
-        </w:r>
-      </w:fldSimple>
+      <w:r>
+        <w:fldChar w:fldCharType="begin"/>
+      </w:r>
+      <w:r>
+        <w:instrText xml:space="preserve"> SEQ Gambar_3. \* ARABIC </w:instrText>
+      </w:r>
+      <w:r>
+        <w:fldChar w:fldCharType="separate"/>
+      </w:r>
+      <w:r>
+        <w:rPr>
+          <w:noProof/>
+        </w:rPr>
+        <w:t>35</w:t>
+      </w:r>
+      <w:r>
+        <w:rPr>
+          <w:noProof/>
+        </w:rPr>
+        <w:fldChar w:fldCharType="end"/>
+      </w:r>
       <w:r>
         <w:t xml:space="preserve"> validasi ulang </w:t>
       </w:r>
@@ -19197,14 +19614,27 @@
       <w:r>
         <w:t xml:space="preserve">Gambar 3. </w:t>
       </w:r>
-      <w:fldSimple w:instr=" SEQ Gambar_3. \* ARABIC ">
-        <w:r>
-          <w:rPr>
-            <w:noProof/>
-          </w:rPr>
-          <w:t>36</w:t>
-        </w:r>
-      </w:fldSimple>
+      <w:r>
+        <w:fldChar w:fldCharType="begin"/>
+      </w:r>
+      <w:r>
+        <w:instrText xml:space="preserve"> SEQ Gambar_3. \* ARABIC </w:instrText>
+      </w:r>
+      <w:r>
+        <w:fldChar w:fldCharType="separate"/>
+      </w:r>
+      <w:r>
+        <w:rPr>
+          <w:noProof/>
+        </w:rPr>
+        <w:t>36</w:t>
+      </w:r>
+      <w:r>
+        <w:rPr>
+          <w:noProof/>
+        </w:rPr>
+        <w:fldChar w:fldCharType="end"/>
+      </w:r>
       <w:r>
         <w:t xml:space="preserve"> </w:t>
       </w:r>
@@ -19295,14 +19725,27 @@
       <w:r>
         <w:t xml:space="preserve">Gambar 3. </w:t>
       </w:r>
-      <w:fldSimple w:instr=" SEQ Gambar_3. \* ARABIC ">
-        <w:r>
-          <w:rPr>
-            <w:noProof/>
-          </w:rPr>
-          <w:t>37</w:t>
-        </w:r>
-      </w:fldSimple>
+      <w:r>
+        <w:fldChar w:fldCharType="begin"/>
+      </w:r>
+      <w:r>
+        <w:instrText xml:space="preserve"> SEQ Gambar_3. \* ARABIC </w:instrText>
+      </w:r>
+      <w:r>
+        <w:fldChar w:fldCharType="separate"/>
+      </w:r>
+      <w:r>
+        <w:rPr>
+          <w:noProof/>
+        </w:rPr>
+        <w:t>37</w:t>
+      </w:r>
+      <w:r>
+        <w:rPr>
+          <w:noProof/>
+        </w:rPr>
+        <w:fldChar w:fldCharType="end"/>
+      </w:r>
       <w:r>
         <w:t xml:space="preserve"> </w:t>
       </w:r>
@@ -19393,14 +19836,27 @@
       <w:r>
         <w:t xml:space="preserve">Gambar 3. </w:t>
       </w:r>
-      <w:fldSimple w:instr=" SEQ Gambar_3. \* ARABIC ">
-        <w:r>
-          <w:rPr>
-            <w:noProof/>
-          </w:rPr>
-          <w:t>38</w:t>
-        </w:r>
-      </w:fldSimple>
+      <w:r>
+        <w:fldChar w:fldCharType="begin"/>
+      </w:r>
+      <w:r>
+        <w:instrText xml:space="preserve"> SEQ Gambar_3. \* ARABIC </w:instrText>
+      </w:r>
+      <w:r>
+        <w:fldChar w:fldCharType="separate"/>
+      </w:r>
+      <w:r>
+        <w:rPr>
+          <w:noProof/>
+        </w:rPr>
+        <w:t>38</w:t>
+      </w:r>
+      <w:r>
+        <w:rPr>
+          <w:noProof/>
+        </w:rPr>
+        <w:fldChar w:fldCharType="end"/>
+      </w:r>
       <w:r>
         <w:t xml:space="preserve"> </w:t>
       </w:r>
@@ -20306,14 +20762,27 @@
       <w:r>
         <w:t xml:space="preserve">Gambar 3. </w:t>
       </w:r>
-      <w:fldSimple w:instr=" SEQ Gambar_3. \* ARABIC ">
-        <w:r>
-          <w:rPr>
-            <w:noProof/>
-          </w:rPr>
-          <w:t>39</w:t>
-        </w:r>
-      </w:fldSimple>
+      <w:r>
+        <w:fldChar w:fldCharType="begin"/>
+      </w:r>
+      <w:r>
+        <w:instrText xml:space="preserve"> SEQ Gambar_3. \* ARABIC </w:instrText>
+      </w:r>
+      <w:r>
+        <w:fldChar w:fldCharType="separate"/>
+      </w:r>
+      <w:r>
+        <w:rPr>
+          <w:noProof/>
+        </w:rPr>
+        <w:t>39</w:t>
+      </w:r>
+      <w:r>
+        <w:rPr>
+          <w:noProof/>
+        </w:rPr>
+        <w:fldChar w:fldCharType="end"/>
+      </w:r>
       <w:r>
         <w:t xml:space="preserve"> </w:t>
       </w:r>
@@ -20837,14 +21306,27 @@
       <w:r>
         <w:t xml:space="preserve">Gambar 3. </w:t>
       </w:r>
-      <w:fldSimple w:instr=" SEQ Gambar_3. \* ARABIC ">
-        <w:r>
-          <w:rPr>
-            <w:noProof/>
-          </w:rPr>
-          <w:t>40</w:t>
-        </w:r>
-      </w:fldSimple>
+      <w:r>
+        <w:fldChar w:fldCharType="begin"/>
+      </w:r>
+      <w:r>
+        <w:instrText xml:space="preserve"> SEQ Gambar_3. \* ARABIC </w:instrText>
+      </w:r>
+      <w:r>
+        <w:fldChar w:fldCharType="separate"/>
+      </w:r>
+      <w:r>
+        <w:rPr>
+          <w:noProof/>
+        </w:rPr>
+        <w:t>40</w:t>
+      </w:r>
+      <w:r>
+        <w:rPr>
+          <w:noProof/>
+        </w:rPr>
+        <w:fldChar w:fldCharType="end"/>
+      </w:r>
       <w:r>
         <w:t xml:space="preserve"> </w:t>
       </w:r>
@@ -21648,14 +22130,27 @@
       <w:r>
         <w:t xml:space="preserve">Gambar 3. </w:t>
       </w:r>
-      <w:fldSimple w:instr=" SEQ Gambar_3. \* ARABIC ">
-        <w:r>
-          <w:rPr>
-            <w:noProof/>
-          </w:rPr>
-          <w:t>41</w:t>
-        </w:r>
-      </w:fldSimple>
+      <w:r>
+        <w:fldChar w:fldCharType="begin"/>
+      </w:r>
+      <w:r>
+        <w:instrText xml:space="preserve"> SEQ Gambar_3. \* ARABIC </w:instrText>
+      </w:r>
+      <w:r>
+        <w:fldChar w:fldCharType="separate"/>
+      </w:r>
+      <w:r>
+        <w:rPr>
+          <w:noProof/>
+        </w:rPr>
+        <w:t>41</w:t>
+      </w:r>
+      <w:r>
+        <w:rPr>
+          <w:noProof/>
+        </w:rPr>
+        <w:fldChar w:fldCharType="end"/>
+      </w:r>
       <w:r>
         <w:t xml:space="preserve"> demo penggunaan dashboard overall</w:t>
       </w:r>
@@ -22241,14 +22736,27 @@
       <w:r>
         <w:t xml:space="preserve">Gambar 3. </w:t>
       </w:r>
-      <w:fldSimple w:instr=" SEQ Gambar_3. \* ARABIC ">
-        <w:r>
-          <w:rPr>
-            <w:noProof/>
-          </w:rPr>
-          <w:t>42</w:t>
-        </w:r>
-      </w:fldSimple>
+      <w:r>
+        <w:fldChar w:fldCharType="begin"/>
+      </w:r>
+      <w:r>
+        <w:instrText xml:space="preserve"> SEQ Gambar_3. \* ARABIC </w:instrText>
+      </w:r>
+      <w:r>
+        <w:fldChar w:fldCharType="separate"/>
+      </w:r>
+      <w:r>
+        <w:rPr>
+          <w:noProof/>
+        </w:rPr>
+        <w:t>42</w:t>
+      </w:r>
+      <w:r>
+        <w:rPr>
+          <w:noProof/>
+        </w:rPr>
+        <w:fldChar w:fldCharType="end"/>
+      </w:r>
       <w:r>
         <w:t xml:space="preserve"> demo penggunaan dashboard demografi</w:t>
       </w:r>
@@ -23684,14 +24192,27 @@
       <w:r>
         <w:t xml:space="preserve">Gambar 3. </w:t>
       </w:r>
-      <w:fldSimple w:instr=" SEQ Gambar_3. \* ARABIC ">
-        <w:r>
-          <w:rPr>
-            <w:noProof/>
-          </w:rPr>
-          <w:t>43</w:t>
-        </w:r>
-      </w:fldSimple>
+      <w:r>
+        <w:fldChar w:fldCharType="begin"/>
+      </w:r>
+      <w:r>
+        <w:instrText xml:space="preserve"> SEQ Gambar_3. \* ARABIC </w:instrText>
+      </w:r>
+      <w:r>
+        <w:fldChar w:fldCharType="separate"/>
+      </w:r>
+      <w:r>
+        <w:rPr>
+          <w:noProof/>
+        </w:rPr>
+        <w:t>43</w:t>
+      </w:r>
+      <w:r>
+        <w:rPr>
+          <w:noProof/>
+        </w:rPr>
+        <w:fldChar w:fldCharType="end"/>
+      </w:r>
       <w:r>
         <w:t xml:space="preserve"> </w:t>
       </w:r>
@@ -23852,14 +24373,27 @@
       <w:r>
         <w:t xml:space="preserve">Gambar 3. </w:t>
       </w:r>
-      <w:fldSimple w:instr=" SEQ Gambar_3. \* ARABIC ">
-        <w:r>
-          <w:rPr>
-            <w:noProof/>
-          </w:rPr>
-          <w:t>44</w:t>
-        </w:r>
-      </w:fldSimple>
+      <w:r>
+        <w:fldChar w:fldCharType="begin"/>
+      </w:r>
+      <w:r>
+        <w:instrText xml:space="preserve"> SEQ Gambar_3. \* ARABIC </w:instrText>
+      </w:r>
+      <w:r>
+        <w:fldChar w:fldCharType="separate"/>
+      </w:r>
+      <w:r>
+        <w:rPr>
+          <w:noProof/>
+        </w:rPr>
+        <w:t>44</w:t>
+      </w:r>
+      <w:r>
+        <w:rPr>
+          <w:noProof/>
+        </w:rPr>
+        <w:fldChar w:fldCharType="end"/>
+      </w:r>
       <w:r>
         <w:t xml:space="preserve"> </w:t>
       </w:r>
@@ -24017,14 +24551,27 @@
       <w:r>
         <w:t xml:space="preserve">Gambar 3. </w:t>
       </w:r>
-      <w:fldSimple w:instr=" SEQ Gambar_3. \* ARABIC ">
-        <w:r>
-          <w:rPr>
-            <w:noProof/>
-          </w:rPr>
-          <w:t>45</w:t>
-        </w:r>
-      </w:fldSimple>
+      <w:r>
+        <w:fldChar w:fldCharType="begin"/>
+      </w:r>
+      <w:r>
+        <w:instrText xml:space="preserve"> SEQ Gambar_3. \* ARABIC </w:instrText>
+      </w:r>
+      <w:r>
+        <w:fldChar w:fldCharType="separate"/>
+      </w:r>
+      <w:r>
+        <w:rPr>
+          <w:noProof/>
+        </w:rPr>
+        <w:t>45</w:t>
+      </w:r>
+      <w:r>
+        <w:rPr>
+          <w:noProof/>
+        </w:rPr>
+        <w:fldChar w:fldCharType="end"/>
+      </w:r>
       <w:r>
         <w:t xml:space="preserve"> </w:t>
       </w:r>
@@ -24179,14 +24726,27 @@
       <w:r>
         <w:t xml:space="preserve">Gambar 3. </w:t>
       </w:r>
-      <w:fldSimple w:instr=" SEQ Gambar_3. \* ARABIC ">
-        <w:r>
-          <w:rPr>
-            <w:noProof/>
-          </w:rPr>
-          <w:t>46</w:t>
-        </w:r>
-      </w:fldSimple>
+      <w:r>
+        <w:fldChar w:fldCharType="begin"/>
+      </w:r>
+      <w:r>
+        <w:instrText xml:space="preserve"> SEQ Gambar_3. \* ARABIC </w:instrText>
+      </w:r>
+      <w:r>
+        <w:fldChar w:fldCharType="separate"/>
+      </w:r>
+      <w:r>
+        <w:rPr>
+          <w:noProof/>
+        </w:rPr>
+        <w:t>46</w:t>
+      </w:r>
+      <w:r>
+        <w:rPr>
+          <w:noProof/>
+        </w:rPr>
+        <w:fldChar w:fldCharType="end"/>
+      </w:r>
       <w:r>
         <w:t xml:space="preserve"> </w:t>
       </w:r>
@@ -24391,14 +24951,27 @@
       <w:r>
         <w:t xml:space="preserve">Gambar 3. </w:t>
       </w:r>
-      <w:fldSimple w:instr=" SEQ Gambar_3. \* ARABIC ">
-        <w:r>
-          <w:rPr>
-            <w:noProof/>
-          </w:rPr>
-          <w:t>47</w:t>
-        </w:r>
-      </w:fldSimple>
+      <w:r>
+        <w:fldChar w:fldCharType="begin"/>
+      </w:r>
+      <w:r>
+        <w:instrText xml:space="preserve"> SEQ Gambar_3. \* ARABIC </w:instrText>
+      </w:r>
+      <w:r>
+        <w:fldChar w:fldCharType="separate"/>
+      </w:r>
+      <w:r>
+        <w:rPr>
+          <w:noProof/>
+        </w:rPr>
+        <w:t>47</w:t>
+      </w:r>
+      <w:r>
+        <w:rPr>
+          <w:noProof/>
+        </w:rPr>
+        <w:fldChar w:fldCharType="end"/>
+      </w:r>
       <w:r>
         <w:t xml:space="preserve"> </w:t>
       </w:r>
@@ -24665,14 +25238,27 @@
       <w:r>
         <w:t xml:space="preserve">Gambar 3. </w:t>
       </w:r>
-      <w:fldSimple w:instr=" SEQ Gambar_3. \* ARABIC ">
-        <w:r>
-          <w:rPr>
-            <w:noProof/>
-          </w:rPr>
-          <w:t>48</w:t>
-        </w:r>
-      </w:fldSimple>
+      <w:r>
+        <w:fldChar w:fldCharType="begin"/>
+      </w:r>
+      <w:r>
+        <w:instrText xml:space="preserve"> SEQ Gambar_3. \* ARABIC </w:instrText>
+      </w:r>
+      <w:r>
+        <w:fldChar w:fldCharType="separate"/>
+      </w:r>
+      <w:r>
+        <w:rPr>
+          <w:noProof/>
+        </w:rPr>
+        <w:t>48</w:t>
+      </w:r>
+      <w:r>
+        <w:rPr>
+          <w:noProof/>
+        </w:rPr>
+        <w:fldChar w:fldCharType="end"/>
+      </w:r>
       <w:r>
         <w:t xml:space="preserve"> </w:t>
       </w:r>
@@ -24819,14 +25405,27 @@
       <w:r>
         <w:t xml:space="preserve">Gambar 3. </w:t>
       </w:r>
-      <w:fldSimple w:instr=" SEQ Gambar_3. \* ARABIC ">
-        <w:r>
-          <w:rPr>
-            <w:noProof/>
-          </w:rPr>
-          <w:t>49</w:t>
-        </w:r>
-      </w:fldSimple>
+      <w:r>
+        <w:fldChar w:fldCharType="begin"/>
+      </w:r>
+      <w:r>
+        <w:instrText xml:space="preserve"> SEQ Gambar_3. \* ARABIC </w:instrText>
+      </w:r>
+      <w:r>
+        <w:fldChar w:fldCharType="separate"/>
+      </w:r>
+      <w:r>
+        <w:rPr>
+          <w:noProof/>
+        </w:rPr>
+        <w:t>49</w:t>
+      </w:r>
+      <w:r>
+        <w:rPr>
+          <w:noProof/>
+        </w:rPr>
+        <w:fldChar w:fldCharType="end"/>
+      </w:r>
       <w:r>
         <w:t xml:space="preserve"> </w:t>
       </w:r>
@@ -25014,14 +25613,27 @@
       <w:r>
         <w:t xml:space="preserve">Gambar 3. </w:t>
       </w:r>
-      <w:fldSimple w:instr=" SEQ Gambar_3. \* ARABIC ">
-        <w:r>
-          <w:rPr>
-            <w:noProof/>
-          </w:rPr>
-          <w:t>50</w:t>
-        </w:r>
-      </w:fldSimple>
+      <w:r>
+        <w:fldChar w:fldCharType="begin"/>
+      </w:r>
+      <w:r>
+        <w:instrText xml:space="preserve"> SEQ Gambar_3. \* ARABIC </w:instrText>
+      </w:r>
+      <w:r>
+        <w:fldChar w:fldCharType="separate"/>
+      </w:r>
+      <w:r>
+        <w:rPr>
+          <w:noProof/>
+        </w:rPr>
+        <w:t>50</w:t>
+      </w:r>
+      <w:r>
+        <w:rPr>
+          <w:noProof/>
+        </w:rPr>
+        <w:fldChar w:fldCharType="end"/>
+      </w:r>
       <w:r>
         <w:t xml:space="preserve"> </w:t>
       </w:r>
@@ -25204,14 +25816,27 @@
       <w:r>
         <w:t xml:space="preserve">Gambar 3. </w:t>
       </w:r>
-      <w:fldSimple w:instr=" SEQ Gambar_3. \* ARABIC ">
-        <w:r>
-          <w:rPr>
-            <w:noProof/>
-          </w:rPr>
-          <w:t>51</w:t>
-        </w:r>
-      </w:fldSimple>
+      <w:r>
+        <w:fldChar w:fldCharType="begin"/>
+      </w:r>
+      <w:r>
+        <w:instrText xml:space="preserve"> SEQ Gambar_3. \* ARABIC </w:instrText>
+      </w:r>
+      <w:r>
+        <w:fldChar w:fldCharType="separate"/>
+      </w:r>
+      <w:r>
+        <w:rPr>
+          <w:noProof/>
+        </w:rPr>
+        <w:t>51</w:t>
+      </w:r>
+      <w:r>
+        <w:rPr>
+          <w:noProof/>
+        </w:rPr>
+        <w:fldChar w:fldCharType="end"/>
+      </w:r>
       <w:r>
         <w:t xml:space="preserve"> </w:t>
       </w:r>
@@ -25387,14 +26012,27 @@
       <w:r>
         <w:t xml:space="preserve">Gambar 3. </w:t>
       </w:r>
-      <w:fldSimple w:instr=" SEQ Gambar_3. \* ARABIC ">
-        <w:r>
-          <w:rPr>
-            <w:noProof/>
-          </w:rPr>
-          <w:t>52</w:t>
-        </w:r>
-      </w:fldSimple>
+      <w:r>
+        <w:fldChar w:fldCharType="begin"/>
+      </w:r>
+      <w:r>
+        <w:instrText xml:space="preserve"> SEQ Gambar_3. \* ARABIC </w:instrText>
+      </w:r>
+      <w:r>
+        <w:fldChar w:fldCharType="separate"/>
+      </w:r>
+      <w:r>
+        <w:rPr>
+          <w:noProof/>
+        </w:rPr>
+        <w:t>52</w:t>
+      </w:r>
+      <w:r>
+        <w:rPr>
+          <w:noProof/>
+        </w:rPr>
+        <w:fldChar w:fldCharType="end"/>
+      </w:r>
       <w:r>
         <w:t xml:space="preserve"> </w:t>
       </w:r>
@@ -25582,14 +26220,27 @@
       <w:r>
         <w:t xml:space="preserve">Gambar 3. </w:t>
       </w:r>
-      <w:fldSimple w:instr=" SEQ Gambar_3. \* ARABIC ">
-        <w:r>
-          <w:rPr>
-            <w:noProof/>
-          </w:rPr>
-          <w:t>53</w:t>
-        </w:r>
-      </w:fldSimple>
+      <w:r>
+        <w:fldChar w:fldCharType="begin"/>
+      </w:r>
+      <w:r>
+        <w:instrText xml:space="preserve"> SEQ Gambar_3. \* ARABIC </w:instrText>
+      </w:r>
+      <w:r>
+        <w:fldChar w:fldCharType="separate"/>
+      </w:r>
+      <w:r>
+        <w:rPr>
+          <w:noProof/>
+        </w:rPr>
+        <w:t>53</w:t>
+      </w:r>
+      <w:r>
+        <w:rPr>
+          <w:noProof/>
+        </w:rPr>
+        <w:fldChar w:fldCharType="end"/>
+      </w:r>
       <w:r>
         <w:t xml:space="preserve"> </w:t>
       </w:r>
@@ -26277,23 +26928,18 @@
           <w:color w:val="000000"/>
         </w:rPr>
         <w:tag w:val="MENDELEY_BIBLIOGRAPHY"/>
-        <w:id w:val="1090589119"/>
+        <w:id w:val="1041937106"/>
         <w:placeholder>
           <w:docPart w:val="DefaultPlaceholder_-1854013440"/>
         </w:placeholder>
       </w:sdtPr>
-      <w:sdtEndPr>
-        <w:rPr>
-          <w:rFonts w:asciiTheme="minorHAnsi" w:hAnsiTheme="minorHAnsi" w:cstheme="minorBidi"/>
-        </w:rPr>
-      </w:sdtEndPr>
       <w:sdtContent>
         <w:p>
           <w:pPr>
             <w:autoSpaceDE w:val="0"/>
             <w:autoSpaceDN w:val="0"/>
             <w:ind w:hanging="480"/>
-            <w:divId w:val="2103910461"/>
+            <w:divId w:val="1633515779"/>
             <w:rPr>
               <w:rFonts w:eastAsia="Times New Roman"/>
               <w:kern w:val="0"/>
@@ -26326,7 +26972,7 @@
             <w:autoSpaceDE w:val="0"/>
             <w:autoSpaceDN w:val="0"/>
             <w:ind w:hanging="480"/>
-            <w:divId w:val="1464956673"/>
+            <w:divId w:val="997272611"/>
             <w:rPr>
               <w:rFonts w:eastAsia="Times New Roman"/>
             </w:rPr>
@@ -26371,7 +27017,7 @@
             <w:autoSpaceDE w:val="0"/>
             <w:autoSpaceDN w:val="0"/>
             <w:ind w:hanging="480"/>
-            <w:divId w:val="1836023368"/>
+            <w:divId w:val="1646084826"/>
             <w:rPr>
               <w:rFonts w:eastAsia="Times New Roman"/>
             </w:rPr>
@@ -26416,7 +27062,7 @@
             <w:autoSpaceDE w:val="0"/>
             <w:autoSpaceDN w:val="0"/>
             <w:ind w:hanging="480"/>
-            <w:divId w:val="1510633787"/>
+            <w:divId w:val="2074505911"/>
             <w:rPr>
               <w:rFonts w:eastAsia="Times New Roman"/>
             </w:rPr>
@@ -26461,7 +27107,7 @@
             <w:autoSpaceDE w:val="0"/>
             <w:autoSpaceDN w:val="0"/>
             <w:ind w:hanging="480"/>
-            <w:divId w:val="571741452"/>
+            <w:divId w:val="1226836641"/>
             <w:rPr>
               <w:rFonts w:eastAsia="Times New Roman"/>
             </w:rPr>
@@ -26506,7 +27152,7 @@
             <w:autoSpaceDE w:val="0"/>
             <w:autoSpaceDN w:val="0"/>
             <w:ind w:hanging="480"/>
-            <w:divId w:val="658390018"/>
+            <w:divId w:val="1149860337"/>
             <w:rPr>
               <w:rFonts w:eastAsia="Times New Roman"/>
             </w:rPr>
@@ -26551,7 +27197,7 @@
             <w:autoSpaceDE w:val="0"/>
             <w:autoSpaceDN w:val="0"/>
             <w:ind w:hanging="480"/>
-            <w:divId w:val="198666868"/>
+            <w:divId w:val="339357656"/>
             <w:rPr>
               <w:rFonts w:eastAsia="Times New Roman"/>
             </w:rPr>
@@ -26596,7 +27242,7 @@
             <w:autoSpaceDE w:val="0"/>
             <w:autoSpaceDN w:val="0"/>
             <w:ind w:hanging="480"/>
-            <w:divId w:val="664474916"/>
+            <w:divId w:val="1509254206"/>
             <w:rPr>
               <w:rFonts w:eastAsia="Times New Roman"/>
             </w:rPr>
@@ -26641,7 +27287,7 @@
             <w:autoSpaceDE w:val="0"/>
             <w:autoSpaceDN w:val="0"/>
             <w:ind w:hanging="480"/>
-            <w:divId w:val="1498105940"/>
+            <w:divId w:val="686099900"/>
             <w:rPr>
               <w:rFonts w:eastAsia="Times New Roman"/>
             </w:rPr>
@@ -26650,6 +27296,38 @@
             <w:rPr>
               <w:rFonts w:eastAsia="Times New Roman"/>
             </w:rPr>
+            <w:t xml:space="preserve">Santhi, T., Monica Sari, A., Ketut Alit Maha Putra, D., Surya Mahendra, G., Putri Ariasih, M., Studi Sistem Informasi, P., &amp; Teknik dan Kejuruan, F. (2023). </w:t>
+          </w:r>
+          <w:r>
+            <w:rPr>
+              <w:rFonts w:eastAsia="Times New Roman"/>
+              <w:i/>
+              <w:iCs/>
+            </w:rPr>
+            <w:t>IMPLEMENTASI BUSINESS INTELLIGENCE MENGGUNAKAN TABLEAU UNTUK VISUALISASI PREDIKSI KELULUSAN MAHASISWA</w:t>
+          </w:r>
+          <w:r>
+            <w:rPr>
+              <w:rFonts w:eastAsia="Times New Roman"/>
+            </w:rPr>
+            <w:t xml:space="preserve"> (Vol. 3, Issue 2). https://ejurnal.umri.ac.id/index.php/SEIS/index</w:t>
+          </w:r>
+        </w:p>
+        <w:p>
+          <w:pPr>
+            <w:autoSpaceDE w:val="0"/>
+            <w:autoSpaceDN w:val="0"/>
+            <w:ind w:hanging="480"/>
+            <w:divId w:val="852456309"/>
+            <w:rPr>
+              <w:rFonts w:eastAsia="Times New Roman"/>
+            </w:rPr>
+          </w:pPr>
+          <w:r>
+            <w:rPr>
+              <w:rFonts w:eastAsia="Times New Roman"/>
+            </w:rPr>
+            <w:lastRenderedPageBreak/>
             <w:t xml:space="preserve">Seda, F. S. S. E., Setyawati, L., Tirta, T., &amp; Nobel, K. (2020). Dataset on the cultural dimension of urban society food consumption in Indonesia. </w:t>
           </w:r>
           <w:r>
@@ -26686,7 +27364,7 @@
             <w:autoSpaceDE w:val="0"/>
             <w:autoSpaceDN w:val="0"/>
             <w:ind w:hanging="480"/>
-            <w:divId w:val="1843472528"/>
+            <w:divId w:val="543294892"/>
             <w:rPr>
               <w:rFonts w:eastAsia="Times New Roman"/>
             </w:rPr>
@@ -26731,7 +27409,7 @@
             <w:autoSpaceDE w:val="0"/>
             <w:autoSpaceDN w:val="0"/>
             <w:ind w:hanging="480"/>
-            <w:divId w:val="2035492796"/>
+            <w:divId w:val="269512306"/>
             <w:rPr>
               <w:rFonts w:eastAsia="Times New Roman"/>
             </w:rPr>
@@ -26740,7 +27418,6 @@
             <w:rPr>
               <w:rFonts w:eastAsia="Times New Roman"/>
             </w:rPr>
-            <w:lastRenderedPageBreak/>
             <w:t xml:space="preserve">Sulasmono, B. S. (2012). Problem solving: Signifikansi, pengertian, dan ragamnya. </w:t>
           </w:r>
           <w:r>
@@ -26777,7 +27454,7 @@
             <w:autoSpaceDE w:val="0"/>
             <w:autoSpaceDN w:val="0"/>
             <w:ind w:hanging="480"/>
-            <w:divId w:val="828641545"/>
+            <w:divId w:val="984092091"/>
             <w:rPr>
               <w:rFonts w:eastAsia="Times New Roman"/>
             </w:rPr>
@@ -26822,7 +27499,7 @@
             <w:autoSpaceDE w:val="0"/>
             <w:autoSpaceDN w:val="0"/>
             <w:ind w:hanging="480"/>
-            <w:divId w:val="1791780733"/>
+            <w:divId w:val="705721047"/>
             <w:rPr>
               <w:rFonts w:eastAsia="Times New Roman"/>
             </w:rPr>
@@ -34552,6 +35229,7 @@
     <w:rsid w:val="005E1BF2"/>
     <w:rsid w:val="006901B0"/>
     <w:rsid w:val="006E1BAB"/>
+    <w:rsid w:val="00724939"/>
     <w:rsid w:val="00751EDB"/>
     <w:rsid w:val="00763159"/>
     <w:rsid w:val="0081424B"/>
@@ -34563,6 +35241,7 @@
     <w:rsid w:val="00B634C8"/>
     <w:rsid w:val="00BB0A64"/>
     <w:rsid w:val="00BB2A6A"/>
+    <w:rsid w:val="00C312A8"/>
     <w:rsid w:val="00C53D3B"/>
     <w:rsid w:val="00CE74A5"/>
     <w:rsid w:val="00D9167C"/>
@@ -35352,7 +36031,7 @@
     <we:reference id="WA104382081" version="1.55.1.0" store="" storeType="OMEX"/>
   </we:alternateReferences>
   <we:properties>
-    <we:property name="MENDELEY_CITATIONS" value="[{&quot;citationID&quot;:&quot;MENDELEY_CITATION_283b94aa-947d-4178-a91e-1af80697c9d4&quot;,&quot;properties&quot;:{&quot;noteIndex&quot;:0},&quot;isEdited&quot;:false,&quot;manualOverride&quot;:{&quot;isManuallyOverridden&quot;:true,&quot;citeprocText&quot;:&quot;(Anhari et al., 2025)&quot;,&quot;manualOverrideText&quot;:&quot;Anhari et al., 2025&quot;},&quot;citationTag&quot;:&quot;MENDELEY_CITATION_v3_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&quot;,&quot;citationItems&quot;:[{&quot;id&quot;:&quot;b5c574a7-ea07-381f-95b9-20ca2f9f3321&quot;,&quot;itemData&quot;:{&quot;type&quot;:&quot;report&quot;,&quot;id&quot;:&quot;b5c574a7-ea07-381f-95b9-20ca2f9f3321&quot;,&quot;title&quot;:&quot;Business Intelligence Visualisasi Data Penerimaan Mahasiswa Baru Menggunakan Tableau di Universitas ABC&quot;,&quot;author&quot;:[{&quot;family&quot;:&quot;Anhari&quot;,&quot;given&quot;:&quot;Tirta&quot;,&quot;parse-names&quot;:false,&quot;dropping-particle&quot;:&quot;&quot;,&quot;non-dropping-particle&quot;:&quot;&quot;},{&quot;family&quot;:&quot;Alim&quot;,&quot;given&quot;:&quot;Endy Sjaiful&quot;,&quot;parse-names&quot;:false,&quot;dropping-particle&quot;:&quot;&quot;,&quot;non-dropping-particle&quot;:&quot;&quot;},{&quot;family&quot;:&quot;Rizkiawan&quot;,&quot;given&quot;:&quot;M Asep&quot;,&quot;parse-names&quot;:false,&quot;dropping-particle&quot;:&quot;&quot;,&quot;non-dropping-particle&quot;:&quot;&quot;},{&quot;family&quot;:&quot;Hasan&quot;,&quot;given&quot;:&quot;Firman Noor&quot;,&quot;parse-names&quot;:false,&quot;dropping-particle&quot;:&quot;&quot;,&quot;non-dropping-particle&quot;:&quot;&quot;}],&quot;issued&quot;:{&quot;date-parts&quot;:[[2025]]},&quot;number-of-pages&quot;:&quot;281-291&quot;,&quot;abstract&quot;:&quot;This study aims to analyze the application of Business Intelligence (BI) using Tableau in the new student admission process at ABC University. Tableau is used to visualize admission data for the period 2021 to 2023, including the number of applicants, geographic distribution, and course preferences. The research methodology involves data collection, cleaning, and integration which is then visualized in an interactive dashboard. The results showed a decrease in the number of applicants during the study period, with the lowest applicants in 2024. Geographic distribution analysis shows that DKI Jakarta and West Java provinces still dominate, indicating the need for expansion in conducting promotions and also data-based marketing strategies. In addition, the shift in the interest of applicants from Communication Science study programs to Pharmacist and Management Professions is an important finding, indicating a changing trend in prospective students' preferences for the fields of Communication Science and Business. This study concludes that the implementation of BI using Tableau provides significant benefits in improving the efficiency of decision-making, expanding the range of admissions, and strengthening the competitiveness of ABC University amid changing educational trends. The findings contribute to the literature related to BI implementation in the education sector and recommend further development to optimize university management in the future.&quot;,&quot;issue&quot;:&quot;1&quot;,&quot;volume&quot;:&quot;6&quot;,&quot;container-title-short&quot;:&quot;&quot;},&quot;isTemporary&quot;:false}]},{&quot;citationID&quot;:&quot;MENDELEY_CITATION_b7a18ff0-9375-446e-ac11-b1f5dce9952a&quot;,&quot;properties&quot;:{&quot;noteIndex&quot;:0},&quot;isEdited&quot;:false,&quot;manualOverride&quot;:{&quot;isManuallyOverridden&quot;:true,&quot;citeprocText&quot;:&quot;(MZ et al., 2022)&quot;,&quot;manualOverrideText&quot;:&quot;MZ et al., 2022&quot;},&quot;citationTag&quot;:&quot;MENDELEY_CITATION_v3_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&quot;,&quot;citationItems&quot;:[{&quot;id&quot;:&quot;f1c5e994-53d7-3361-ad3a-23a9d45e6f3b&quot;,&quot;itemData&quot;:{&quot;type&quot;:&quot;article-journal&quot;,&quot;id&quot;:&quot;f1c5e994-53d7-3361-ad3a-23a9d45e6f3b&quot;,&quot;title&quot;:&quot;Aplikasi Dashboard Visualisasi Data Calon Mahasiswa Baru mengunakan Metabase&quot;,&quot;author&quot;:[{&quot;family&quot;:&quot;MZ&quot;,&quot;given&quot;:&quot;Yumarlin&quot;,&quot;parse-names&quot;:false,&quot;dropping-particle&quot;:&quot;&quot;,&quot;non-dropping-particle&quot;:&quot;&quot;},{&quot;family&quot;:&quot;Bororing&quot;,&quot;given&quot;:&quot;Jemmy Edwin&quot;,&quot;parse-names&quot;:false,&quot;dropping-particle&quot;:&quot;&quot;,&quot;non-dropping-particle&quot;:&quot;&quot;},{&quot;family&quot;:&quot;Rahayu&quot;,&quot;given&quot;:&quot;Sri&quot;,&quot;parse-names&quot;:false,&quot;dropping-particle&quot;:&quot;&quot;,&quot;non-dropping-particle&quot;:&quot;&quot;},{&quot;family&quot;:&quot;Ramadhani&quot;,&quot;given&quot;:&quot;Tan Anugrah&quot;,&quot;parse-names&quot;:false,&quot;dropping-particle&quot;:&quot;&quot;,&quot;non-dropping-particle&quot;:&quot;&quot;}],&quot;container-title&quot;:&quot;Edumatic: Jurnal Pendidikan Informatika&quot;,&quot;DOI&quot;:&quot;10.29408/edumatic.v6i1.5483&quot;,&quot;issued&quot;:{&quot;date-parts&quot;:[[2022,6,19]]},&quot;page&quot;:&quot;116-125&quot;,&quot;abstract&quot;:&quot;New student data Information systems can be used as a supporting tool to support decisions. Janabadra University is one of the universities in Yogyakarta, the information system for recording transactional data for students is still done simply in the form of text and numbers. The purpose of this research is to design and build a dashboard application for data visualization of prospective students at Janabadra University for new student admissions (PMB). The method used is a business intelligence roadmap with six stages, the stages are (1) justification, (2) planning, (3) business case, (4) design, (5) construction, and (6) deployment which is a reference in the design and construction of a data warehouse using Metabase. The results of this study can build 7 (seven) visualization dashboards are  (1) Dashboard of information students grouped based on the total number of PMB registrants, (2) Dashboard of the number of registrants based on the academic year, (3) Dashboard of income from PMB registration based on the payment date, (4) Dashboard of the number of students based on the academic year of each study program, (5) Dashboard of the number of registrants by class, (6) Dashboard of the number of PMB registrants by semester and (7) Dashboard of the number of PMB registrants by study program and class.&quot;,&quot;publisher&quot;:&quot;Universitas Hamzanwadi&quot;,&quot;issue&quot;:&quot;1&quot;,&quot;volume&quot;:&quot;6&quot;,&quot;container-title-short&quot;:&quot;&quot;},&quot;isTemporary&quot;:false}]},{&quot;citationID&quot;:&quot;MENDELEY_CITATION_3a12006e-fbea-40f6-b24c-a6b73827dc3c&quot;,&quot;properties&quot;:{&quot;noteIndex&quot;:0},&quot;isEdited&quot;:false,&quot;manualOverride&quot;:{&quot;isManuallyOverridden&quot;:false,&quot;citeprocText&quot;:&quot;(Rosita &amp;#38; Tannar, 2024)&quot;,&quot;manualOverrideText&quot;:&quot;&quot;},&quot;citationTag&quot;:&quot;MENDELEY_CITATION_v3_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&quot;,&quot;citationItems&quot;:[{&quot;id&quot;:&quot;74b4a176-a06b-3dcb-9904-952ea10b110c&quot;,&quot;itemData&quot;:{&quot;type&quot;:&quot;article-journal&quot;,&quot;id&quot;:&quot;74b4a176-a06b-3dcb-9904-952ea10b110c&quot;,&quot;title&quot;:&quot;PERAN DATA ANALIS DALAM MENDORONG KEPUTUSAN DAN STRATEGI BISNIS PERUSAHAAN&quot;,&quot;author&quot;:[{&quot;family&quot;:&quot;Rosita&quot;,&quot;given&quot;:&quot;Amanda Aura&quot;,&quot;parse-names&quot;:false,&quot;dropping-particle&quot;:&quot;&quot;,&quot;non-dropping-particle&quot;:&quot;&quot;},{&quot;family&quot;:&quot;Tannar&quot;,&quot;given&quot;:&quot;Oryza&quot;,&quot;parse-names&quot;:false,&quot;dropping-particle&quot;:&quot;&quot;,&quot;non-dropping-particle&quot;:&quot;&quot;}],&quot;container-title&quot;:&quot;Jurnal Ekonomi Revolusioner&quot;,&quot;issued&quot;:{&quot;date-parts&quot;:[[2024]]},&quot;issue&quot;:&quot;7&quot;,&quot;volume&quot;:&quot;7&quot;,&quot;container-title-short&quot;:&quot;&quot;},&quot;isTemporary&quot;:false}]},{&quot;citationID&quot;:&quot;MENDELEY_CITATION_7d83bb88-96d7-4f02-a289-b3d1de461bdd&quot;,&quot;properties&quot;:{&quot;noteIndex&quot;:0},&quot;isEdited&quot;:false,&quot;manualOverride&quot;:{&quot;isManuallyOverridden&quot;:false,&quot;citeprocText&quot;:&quot;(Widaningsih, 2019)&quot;,&quot;manualOverrideText&quot;:&quot;&quot;},&quot;citationTag&quot;:&quot;MENDELEY_CITATION_v3_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&quot;,&quot;citationItems&quot;:[{&quot;id&quot;:&quot;624bddcc-faad-354e-a37e-9bcacc2441fb&quot;,&quot;itemData&quot;:{&quot;type&quot;:&quot;article-journal&quot;,&quot;id&quot;:&quot;624bddcc-faad-354e-a37e-9bcacc2441fb&quot;,&quot;title&quot;:&quot;Perbandingan Metode Data Mining Untuk Prediksi Nilai Dan Waktu Kelulusan Mahasiswa Prodi Teknik Informatika Dengan Algoritma C4, 5, Naïve Bayes, Knn Dan Svm&quot;,&quot;author&quot;:[{&quot;family&quot;:&quot;Widaningsih&quot;,&quot;given&quot;:&quot;Sri&quot;,&quot;parse-names&quot;:false,&quot;dropping-particle&quot;:&quot;&quot;,&quot;non-dropping-particle&quot;:&quot;&quot;}],&quot;container-title&quot;:&quot;Jurnal Tekno Insentif&quot;,&quot;ISSN&quot;:&quot;2655-089X&quot;,&quot;issued&quot;:{&quot;date-parts&quot;:[[2019]]},&quot;page&quot;:&quot;16-25&quot;,&quot;issue&quot;:&quot;1&quot;,&quot;volume&quot;:&quot;13&quot;,&quot;container-title-short&quot;:&quot;&quot;},&quot;isTemporary&quot;:false}]},{&quot;citationID&quot;:&quot;MENDELEY_CITATION_17f89917-cef1-42eb-9d1e-11357d67e251&quot;,&quot;properties&quot;:{&quot;noteIndex&quot;:0},&quot;isEdited&quot;:false,&quot;manualOverride&quot;:{&quot;isManuallyOverridden&quot;:false,&quot;citeprocText&quot;:&quot;(Seda et al., 2020)&quot;,&quot;manualOverrideText&quot;:&quot;&quot;},&quot;citationTag&quot;:&quot;MENDELEY_CITATION_v3_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&quot;,&quot;citationItems&quot;:[{&quot;id&quot;:&quot;219e0431-c196-3cad-83dd-7ead91a2a396&quot;,&quot;itemData&quot;:{&quot;type&quot;:&quot;article-journal&quot;,&quot;id&quot;:&quot;219e0431-c196-3cad-83dd-7ead91a2a396&quot;,&quot;title&quot;:&quot;Dataset on the cultural dimension of urban society food consumption in Indonesia&quot;,&quot;author&quot;:[{&quot;family&quot;:&quot;Seda&quot;,&quot;given&quot;:&quot;Francisia S S E&quot;,&quot;parse-names&quot;:false,&quot;dropping-particle&quot;:&quot;&quot;,&quot;non-dropping-particle&quot;:&quot;&quot;},{&quot;family&quot;:&quot;Setyawati&quot;,&quot;given&quot;:&quot;Lugina&quot;,&quot;parse-names&quot;:false,&quot;dropping-particle&quot;:&quot;&quot;,&quot;non-dropping-particle&quot;:&quot;&quot;},{&quot;family&quot;:&quot;Tirta&quot;,&quot;given&quot;:&quot;Timoti&quot;,&quot;parse-names&quot;:false,&quot;dropping-particle&quot;:&quot;&quot;,&quot;non-dropping-particle&quot;:&quot;&quot;},{&quot;family&quot;:&quot;Nobel&quot;,&quot;given&quot;:&quot;Kevin&quot;,&quot;parse-names&quot;:false,&quot;dropping-particle&quot;:&quot;&quot;,&quot;non-dropping-particle&quot;:&quot;&quot;}],&quot;container-title&quot;:&quot;Data in Brief&quot;,&quot;container-title-short&quot;:&quot;Data Brief&quot;,&quot;ISSN&quot;:&quot;2352-3409&quot;,&quot;issued&quot;:{&quot;date-parts&quot;:[[2020]]},&quot;page&quot;:&quot;105681&quot;,&quot;publisher&quot;:&quot;Elsevier&quot;,&quot;volume&quot;:&quot;31&quot;},&quot;isTemporary&quot;:false}]},{&quot;citationID&quot;:&quot;MENDELEY_CITATION_f89be22b-269e-4c31-831b-f953af3883fb&quot;,&quot;properties&quot;:{&quot;noteIndex&quot;:0},&quot;isEdited&quot;:false,&quot;manualOverride&quot;:{&quot;isManuallyOverridden&quot;:false,&quot;citeprocText&quot;:&quot;(Hanifah &amp;#38; Nasution, 2025)&quot;,&quot;manualOverrideText&quot;:&quot;&quot;},&quot;citationTag&quot;:&quot;MENDELEY_CITATION_v3_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&quot;,&quot;citationItems&quot;:[{&quot;id&quot;:&quot;a93aaf8b-be5f-34bb-aae0-7da4f3b98c22&quot;,&quot;itemData&quot;:{&quot;type&quot;:&quot;article-journal&quot;,&quot;id&quot;:&quot;a93aaf8b-be5f-34bb-aae0-7da4f3b98c22&quot;,&quot;title&quot;:&quot;Manajemen Data Yang Efektif: Solusi Untuk Mencegah dan Mengatasi Duplikasi Data Dalam Perusahaan&quot;,&quot;author&quot;:[{&quot;family&quot;:&quot;Hanifah&quot;,&quot;given&quot;:&quot;Nazwa&quot;,&quot;parse-names&quot;:false,&quot;dropping-particle&quot;:&quot;&quot;,&quot;non-dropping-particle&quot;:&quot;&quot;},{&quot;family&quot;:&quot;Nasution&quot;,&quot;given&quot;:&quot;Muhammad Irwan Padli&quot;,&quot;parse-names&quot;:false,&quot;dropping-particle&quot;:&quot;&quot;,&quot;non-dropping-particle&quot;:&quot;&quot;}],&quot;container-title&quot;:&quot;Epsilon: Journal of Management (EJoM)&quot;,&quot;ISSN&quot;:&quot;3026-653X&quot;,&quot;issued&quot;:{&quot;date-parts&quot;:[[2025]]},&quot;page&quot;:&quot;27-38&quot;,&quot;issue&quot;:&quot;1&quot;,&quot;volume&quot;:&quot;3&quot;,&quot;container-title-short&quot;:&quot;&quot;},&quot;isTemporary&quot;:false}]},{&quot;citationID&quot;:&quot;MENDELEY_CITATION_41771b54-2cd1-48dc-8259-192f6ab796cb&quot;,&quot;properties&quot;:{&quot;noteIndex&quot;:0},&quot;isEdited&quot;:false,&quot;manualOverride&quot;:{&quot;isManuallyOverridden&quot;:false,&quot;citeprocText&quot;:&quot;(Sudrajat &amp;#38; Cholid, 2023)&quot;,&quot;manualOverrideText&quot;:&quot;&quot;},&quot;citationTag&quot;:&quot;MENDELEY_CITATION_v3_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&quot;,&quot;citationItems&quot;:[{&quot;id&quot;:&quot;5503319d-adb7-3949-b8f3-2192723250e6&quot;,&quot;itemData&quot;:{&quot;type&quot;:&quot;article-journal&quot;,&quot;id&quot;:&quot;5503319d-adb7-3949-b8f3-2192723250e6&quot;,&quot;title&quot;:&quot;K-Nearest Neighbor (K-Nn) Untuk Penanganan Missing Value Pada Data Umkm&quot;,&quot;author&quot;:[{&quot;family&quot;:&quot;Sudrajat&quot;,&quot;given&quot;:&quot;Wahyu&quot;,&quot;parse-names&quot;:false,&quot;dropping-particle&quot;:&quot;&quot;,&quot;non-dropping-particle&quot;:&quot;&quot;},{&quot;family&quot;:&quot;Cholid&quot;,&quot;given&quot;:&quot;Idahm&quot;,&quot;parse-names&quot;:false,&quot;dropping-particle&quot;:&quot;&quot;,&quot;non-dropping-particle&quot;:&quot;&quot;}],&quot;container-title&quot;:&quot;Jurnal Rekayasa Sistem Informasi Dan Teknologi&quot;,&quot;ISSN&quot;:&quot;3025-888X&quot;,&quot;issued&quot;:{&quot;date-parts&quot;:[[2023]]},&quot;page&quot;:&quot;54-63&quot;,&quot;issue&quot;:&quot;2&quot;,&quot;volume&quot;:&quot;1&quot;,&quot;container-title-short&quot;:&quot;&quot;},&quot;isTemporary&quot;:false}]},{&quot;citationID&quot;:&quot;MENDELEY_CITATION_a68d755a-3a98-4a4a-93be-865b7b61246c&quot;,&quot;properties&quot;:{&quot;noteIndex&quot;:0},&quot;isEdited&quot;:false,&quot;manualOverride&quot;:{&quot;isManuallyOverridden&quot;:false,&quot;citeprocText&quot;:&quot;(Turyadi &amp;#38; Kusnandar, n.d.)&quot;,&quot;manualOverrideText&quot;:&quot;&quot;},&quot;citationTag&quot;:&quot;MENDELEY_CITATION_v3_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&quot;,&quot;citationItems&quot;:[{&quot;id&quot;:&quot;2e56aaf9-a5a3-3f81-a5f3-734246019abf&quot;,&quot;itemData&quot;:{&quot;type&quot;:&quot;article-journal&quot;,&quot;id&quot;:&quot;2e56aaf9-a5a3-3f81-a5f3-734246019abf&quot;,&quot;title&quot;:&quot;KAJIAN SIFAT DISTRIBUSI NORMAL BIVARIAT&quot;,&quot;author&quot;:[{&quot;family&quot;:&quot;Turyadi&quot;,&quot;given&quot;:&quot;Muhlasah Novitasari Mara&quot;,&quot;parse-names&quot;:false,&quot;dropping-particle&quot;:&quot;&quot;,&quot;non-dropping-particle&quot;:&quot;&quot;},{&quot;family&quot;:&quot;Kusnandar&quot;,&quot;given&quot;:&quot;Dadan&quot;,&quot;parse-names&quot;:false,&quot;dropping-particle&quot;:&quot;&quot;,&quot;non-dropping-particle&quot;:&quot;&quot;}],&quot;container-title&quot;:&quot;Bimaster: Buletin Ilmiah Matematika, Statistika dan Terapannya&quot;,&quot;ISSN&quot;:&quot;2302-9854&quot;,&quot;issue&quot;:&quot;02&quot;,&quot;volume&quot;:&quot;2&quot;,&quot;container-title-short&quot;:&quot;&quot;},&quot;isTemporary&quot;:false}]},{&quot;citationID&quot;:&quot;MENDELEY_CITATION_dc4f565e-b259-42f3-abd0-d5e58402ca6a&quot;,&quot;properties&quot;:{&quot;noteIndex&quot;:0},&quot;isEdited&quot;:false,&quot;manualOverride&quot;:{&quot;isManuallyOverridden&quot;:false,&quot;citeprocText&quot;:&quot;(Sulasmono, 2012)&quot;,&quot;manualOverrideText&quot;:&quot;&quot;},&quot;citationTag&quot;:&quot;MENDELEY_CITATION_v3_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&quot;,&quot;citationItems&quot;:[{&quot;id&quot;:&quot;8e698846-4f7b-35f4-aa77-9c90920f795f&quot;,&quot;itemData&quot;:{&quot;type&quot;:&quot;article-journal&quot;,&quot;id&quot;:&quot;8e698846-4f7b-35f4-aa77-9c90920f795f&quot;,&quot;title&quot;:&quot;Problem solving: Signifikansi, pengertian, dan ragamnya&quot;,&quot;author&quot;:[{&quot;family&quot;:&quot;Sulasmono&quot;,&quot;given&quot;:&quot;Bambang Suteng&quot;,&quot;parse-names&quot;:false,&quot;dropping-particle&quot;:&quot;&quot;,&quot;non-dropping-particle&quot;:&quot;&quot;}],&quot;container-title&quot;:&quot;Satya Widya&quot;,&quot;ISSN&quot;:&quot;2549-967X&quot;,&quot;issued&quot;:{&quot;date-parts&quot;:[[2012]]},&quot;page&quot;:&quot;155-166&quot;,&quot;issue&quot;:&quot;2&quot;,&quot;volume&quot;:&quot;28&quot;,&quot;container-title-short&quot;:&quot;&quot;},&quot;isTemporary&quot;:false}]},{&quot;citationID&quot;:&quot;MENDELEY_CITATION_0bb2aa4c-3392-4aff-8273-f70e9cc73e68&quot;,&quot;properties&quot;:{&quot;noteIndex&quot;:0},&quot;isEdited&quot;:false,&quot;manualOverride&quot;:{&quot;isManuallyOverridden&quot;:false,&quot;citeprocText&quot;:&quot;(Ramanisa et al., 2020)&quot;,&quot;manualOverrideText&quot;:&quot;&quot;},&quot;citationTag&quot;:&quot;MENDELEY_CITATION_v3_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&quot;,&quot;citationItems&quot;:[{&quot;id&quot;:&quot;1b97f332-ea00-3a32-b851-ac744ffe09c6&quot;,&quot;itemData&quot;:{&quot;type&quot;:&quot;article-journal&quot;,&quot;id&quot;:&quot;1b97f332-ea00-3a32-b851-ac744ffe09c6&quot;,&quot;title&quot;:&quot;Analisis Kemampuan Representasi Matematis Siswa&quot;,&quot;author&quot;:[{&quot;family&quot;:&quot;Ramanisa&quot;,&quot;given&quot;:&quot;Hartiwi&quot;,&quot;parse-names&quot;:false,&quot;dropping-particle&quot;:&quot;&quot;,&quot;non-dropping-particle&quot;:&quot;&quot;},{&quot;family&quot;:&quot;Khairudin&quot;,&quot;given&quot;:&quot;Khairudin&quot;,&quot;parse-names&quot;:false,&quot;dropping-particle&quot;:&quot;&quot;,&quot;non-dropping-particle&quot;:&quot;&quot;},{&quot;family&quot;:&quot;Netti&quot;,&quot;given&quot;:&quot;Syukma&quot;,&quot;parse-names&quot;:false,&quot;dropping-particle&quot;:&quot;&quot;,&quot;non-dropping-particle&quot;:&quot;&quot;}],&quot;container-title&quot;:&quot;Jurnal Magister Pendidikan Matematika (JUMADIKA)&quot;,&quot;ISSN&quot;:&quot;2684-8848&quot;,&quot;issued&quot;:{&quot;date-parts&quot;:[[2020]]},&quot;page&quot;:&quot;34-38&quot;,&quot;issue&quot;:&quot;1&quot;,&quot;volume&quot;:&quot;2&quot;,&quot;container-title-short&quot;:&quot;&quot;},&quot;isTemporary&quot;:false}]},{&quot;citationID&quot;:&quot;MENDELEY_CITATION_b766a1da-7ff7-4b3b-9de1-5325f90eb8b2&quot;,&quot;properties&quot;:{&quot;noteIndex&quot;:0},&quot;isEdited&quot;:false,&quot;manualOverride&quot;:{&quot;isManuallyOverridden&quot;:false,&quot;citeprocText&quot;:&quot;(Matondang et al., 2020)&quot;,&quot;manualOverrideText&quot;:&quot;&quot;},&quot;citationTag&quot;:&quot;MENDELEY_CITATION_v3_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&quot;,&quot;citationItems&quot;:[{&quot;id&quot;:&quot;abac9297-d8b0-3b76-a078-f6adb92f755b&quot;,&quot;itemData&quot;:{&quot;type&quot;:&quot;paper-conference&quot;,&quot;id&quot;:&quot;abac9297-d8b0-3b76-a078-f6adb92f755b&quot;,&quot;title&quot;:&quot;Penerapan Metode Brainstorming Dalam Perancangan Produk Pochade&quot;,&quot;author&quot;:[{&quot;family&quot;:&quot;Matondang&quot;,&quot;given&quot;:&quot;Muharram&quot;,&quot;parse-names&quot;:false,&quot;dropping-particle&quot;:&quot;&quot;,&quot;non-dropping-particle&quot;:&quot;&quot;},{&quot;family&quot;:&quot;Sary&quot;,&quot;given&quot;:&quot;Nadilah&quot;,&quot;parse-names&quot;:false,&quot;dropping-particle&quot;:&quot;&quot;,&quot;non-dropping-particle&quot;:&quot;&quot;},{&quot;family&quot;:&quot;Gultom&quot;,&quot;given&quot;:&quot;Theo Benneditson&quot;,&quot;parse-names&quot;:false,&quot;dropping-particle&quot;:&quot;&quot;,&quot;non-dropping-particle&quot;:&quot;&quot;},{&quot;family&quot;:&quot;Sebayang&quot;,&quot;given&quot;:&quot;Yesticka&quot;,&quot;parse-names&quot;:false,&quot;dropping-particle&quot;:&quot;&quot;,&quot;non-dropping-particle&quot;:&quot;&quot;}],&quot;container-title&quot;:&quot;Talenta Conference Series: Energy and Engineering (EE)&quot;,&quot;ISBN&quot;:&quot;2654-704X&quot;,&quot;issued&quot;:{&quot;date-parts&quot;:[[2020]]},&quot;issue&quot;:&quot;2&quot;,&quot;volume&quot;:&quot;3&quot;,&quot;container-title-short&quot;:&quot;&quot;},&quot;isTemporary&quot;:false}]},{&quot;citationID&quot;:&quot;MENDELEY_CITATION_517e0629-801d-4b12-a8f8-ee2fe9f46ac4&quot;,&quot;properties&quot;:{&quot;noteIndex&quot;:0},&quot;isEdited&quot;:false,&quot;manualOverride&quot;:{&quot;isManuallyOverridden&quot;:false,&quot;citeprocText&quot;:&quot;(Mulyani &amp;#38; Kartini, 2023)&quot;,&quot;manualOverrideText&quot;:&quot;&quot;},&quot;citationTag&quot;:&quot;MENDELEY_CITATION_v3_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&quot;,&quot;citationItems&quot;:[{&quot;id&quot;:&quot;0cb1f664-1d35-3d25-a481-d642dbf50f2d&quot;,&quot;itemData&quot;:{&quot;type&quot;:&quot;article-journal&quot;,&quot;id&quot;:&quot;0cb1f664-1d35-3d25-a481-d642dbf50f2d&quot;,&quot;title&quot;:&quot;Visualisasi Data Ticketing Servicedesk Dengan Dashboard Pada PT Brantas Abipraya (Persero)&quot;,&quot;author&quot;:[{&quot;family&quot;:&quot;Mulyani&quot;,&quot;given&quot;:&quot;Astriana&quot;,&quot;parse-names&quot;:false,&quot;dropping-particle&quot;:&quot;&quot;,&quot;non-dropping-particle&quot;:&quot;&quot;},{&quot;family&quot;:&quot;Kartini&quot;,&quot;given&quot;:&quot;Kartini&quot;,&quot;parse-names&quot;:false,&quot;dropping-particle&quot;:&quot;&quot;,&quot;non-dropping-particle&quot;:&quot;&quot;}],&quot;container-title&quot;:&quot;Journal of Information System, Applied, Management, Accounting and Research&quot;,&quot;ISSN&quot;:&quot;2598-8719&quot;,&quot;issued&quot;:{&quot;date-parts&quot;:[[2023]]},&quot;page&quot;:&quot;289-300&quot;,&quot;issue&quot;:&quot;2&quot;,&quot;volume&quot;:&quot;7&quot;,&quot;container-title-short&quot;:&quot;&quot;},&quot;isTemporary&quot;:false}]},{&quot;citationID&quot;:&quot;MENDELEY_CITATION_b7c5119d-813d-44e2-977d-b57712b9b0e2&quot;,&quot;properties&quot;:{&quot;noteIndex&quot;:0},&quot;isEdited&quot;:false,&quot;manualOverride&quot;:{&quot;isManuallyOverridden&quot;:false,&quot;citeprocText&quot;:&quot;(Hismawan &amp;#38; Izaak, 2023)&quot;,&quot;manualOverrideText&quot;:&quot;&quot;},&quot;citationTag&quot;:&quot;MENDELEY_CITATION_v3_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&quot;,&quot;citationItems&quot;:[{&quot;id&quot;:&quot;11846df6-0008-38cd-b3d5-57f64a205852&quot;,&quot;itemData&quot;:{&quot;type&quot;:&quot;article-journal&quot;,&quot;id&quot;:&quot;11846df6-0008-38cd-b3d5-57f64a205852&quot;,&quot;title&quot;:&quot;Optimalisasi website menggunakan landing page sebagai media pemasaran produk parfum fresh fusion di era digital&quot;,&quot;author&quot;:[{&quot;family&quot;:&quot;Hismawan&quot;,&quot;given&quot;:&quot;Fiska Rahma&quot;,&quot;parse-names&quot;:false,&quot;dropping-particle&quot;:&quot;&quot;,&quot;non-dropping-particle&quot;:&quot;&quot;},{&quot;family&quot;:&quot;Izaak&quot;,&quot;given&quot;:&quot;Wilma Cordelia&quot;,&quot;parse-names&quot;:false,&quot;dropping-particle&quot;:&quot;&quot;,&quot;non-dropping-particle&quot;:&quot;&quot;}],&quot;container-title&quot;:&quot;KARYA: Jurnal Pengabdian Kepada Masyarakat&quot;,&quot;ISSN&quot;:&quot;2798-1827&quot;,&quot;issued&quot;:{&quot;date-parts&quot;:[[2023]]},&quot;page&quot;:&quot;364-368&quot;,&quot;issue&quot;:&quot;3&quot;,&quot;volume&quot;:&quot;3&quot;,&quot;container-title-short&quot;:&quot;&quot;},&quot;isTemporary&quot;:false}]}]"/>
+    <we:property name="MENDELEY_CITATIONS" value="[{&quot;citationID&quot;:&quot;MENDELEY_CITATION_283b94aa-947d-4178-a91e-1af80697c9d4&quot;,&quot;properties&quot;:{&quot;noteIndex&quot;:0},&quot;isEdited&quot;:false,&quot;manualOverride&quot;:{&quot;isManuallyOverridden&quot;:true,&quot;citeprocText&quot;:&quot;(Anhari et al., 2025)&quot;,&quot;manualOverrideText&quot;:&quot;Anhari et al., 2025&quot;},&quot;citationTag&quot;:&quot;MENDELEY_CITATION_v3_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&quot;,&quot;citationItems&quot;:[{&quot;id&quot;:&quot;b5c574a7-ea07-381f-95b9-20ca2f9f3321&quot;,&quot;itemData&quot;:{&quot;type&quot;:&quot;report&quot;,&quot;id&quot;:&quot;b5c574a7-ea07-381f-95b9-20ca2f9f3321&quot;,&quot;title&quot;:&quot;Business Intelligence Visualisasi Data Penerimaan Mahasiswa Baru Menggunakan Tableau di Universitas ABC&quot;,&quot;author&quot;:[{&quot;family&quot;:&quot;Anhari&quot;,&quot;given&quot;:&quot;Tirta&quot;,&quot;parse-names&quot;:false,&quot;dropping-particle&quot;:&quot;&quot;,&quot;non-dropping-particle&quot;:&quot;&quot;},{&quot;family&quot;:&quot;Alim&quot;,&quot;given&quot;:&quot;Endy Sjaiful&quot;,&quot;parse-names&quot;:false,&quot;dropping-particle&quot;:&quot;&quot;,&quot;non-dropping-particle&quot;:&quot;&quot;},{&quot;family&quot;:&quot;Rizkiawan&quot;,&quot;given&quot;:&quot;M Asep&quot;,&quot;parse-names&quot;:false,&quot;dropping-particle&quot;:&quot;&quot;,&quot;non-dropping-particle&quot;:&quot;&quot;},{&quot;family&quot;:&quot;Hasan&quot;,&quot;given&quot;:&quot;Firman Noor&quot;,&quot;parse-names&quot;:false,&quot;dropping-particle&quot;:&quot;&quot;,&quot;non-dropping-particle&quot;:&quot;&quot;}],&quot;issued&quot;:{&quot;date-parts&quot;:[[2025]]},&quot;number-of-pages&quot;:&quot;281-291&quot;,&quot;abstract&quot;:&quot;This study aims to analyze the application of Business Intelligence (BI) using Tableau in the new student admission process at ABC University. Tableau is used to visualize admission data for the period 2021 to 2023, including the number of applicants, geographic distribution, and course preferences. The research methodology involves data collection, cleaning, and integration which is then visualized in an interactive dashboard. The results showed a decrease in the number of applicants during the study period, with the lowest applicants in 2024. Geographic distribution analysis shows that DKI Jakarta and West Java provinces still dominate, indicating the need for expansion in conducting promotions and also data-based marketing strategies. In addition, the shift in the interest of applicants from Communication Science study programs to Pharmacist and Management Professions is an important finding, indicating a changing trend in prospective students' preferences for the fields of Communication Science and Business. This study concludes that the implementation of BI using Tableau provides significant benefits in improving the efficiency of decision-making, expanding the range of admissions, and strengthening the competitiveness of ABC University amid changing educational trends. The findings contribute to the literature related to BI implementation in the education sector and recommend further development to optimize university management in the future.&quot;,&quot;issue&quot;:&quot;1&quot;,&quot;volume&quot;:&quot;6&quot;,&quot;container-title-short&quot;:&quot;&quot;},&quot;isTemporary&quot;:false}]},{&quot;citationID&quot;:&quot;MENDELEY_CITATION_b7a18ff0-9375-446e-ac11-b1f5dce9952a&quot;,&quot;properties&quot;:{&quot;noteIndex&quot;:0},&quot;isEdited&quot;:false,&quot;manualOverride&quot;:{&quot;isManuallyOverridden&quot;:true,&quot;citeprocText&quot;:&quot;(MZ et al., 2022)&quot;,&quot;manualOverrideText&quot;:&quot;MZ et al., 2022&quot;},&quot;citationTag&quot;:&quot;MENDELEY_CITATION_v3_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&quot;,&quot;citationItems&quot;:[{&quot;id&quot;:&quot;f1c5e994-53d7-3361-ad3a-23a9d45e6f3b&quot;,&quot;itemData&quot;:{&quot;type&quot;:&quot;article-journal&quot;,&quot;id&quot;:&quot;f1c5e994-53d7-3361-ad3a-23a9d45e6f3b&quot;,&quot;title&quot;:&quot;Aplikasi Dashboard Visualisasi Data Calon Mahasiswa Baru mengunakan Metabase&quot;,&quot;author&quot;:[{&quot;family&quot;:&quot;MZ&quot;,&quot;given&quot;:&quot;Yumarlin&quot;,&quot;parse-names&quot;:false,&quot;dropping-particle&quot;:&quot;&quot;,&quot;non-dropping-particle&quot;:&quot;&quot;},{&quot;family&quot;:&quot;Bororing&quot;,&quot;given&quot;:&quot;Jemmy Edwin&quot;,&quot;parse-names&quot;:false,&quot;dropping-particle&quot;:&quot;&quot;,&quot;non-dropping-particle&quot;:&quot;&quot;},{&quot;family&quot;:&quot;Rahayu&quot;,&quot;given&quot;:&quot;Sri&quot;,&quot;parse-names&quot;:false,&quot;dropping-particle&quot;:&quot;&quot;,&quot;non-dropping-particle&quot;:&quot;&quot;},{&quot;family&quot;:&quot;Ramadhani&quot;,&quot;given&quot;:&quot;Tan Anugrah&quot;,&quot;parse-names&quot;:false,&quot;dropping-particle&quot;:&quot;&quot;,&quot;non-dropping-particle&quot;:&quot;&quot;}],&quot;container-title&quot;:&quot;Edumatic: Jurnal Pendidikan Informatika&quot;,&quot;DOI&quot;:&quot;10.29408/edumatic.v6i1.5483&quot;,&quot;issued&quot;:{&quot;date-parts&quot;:[[2022,6,19]]},&quot;page&quot;:&quot;116-125&quot;,&quot;abstract&quot;:&quot;New student data Information systems can be used as a supporting tool to support decisions. Janabadra University is one of the universities in Yogyakarta, the information system for recording transactional data for students is still done simply in the form of text and numbers. The purpose of this research is to design and build a dashboard application for data visualization of prospective students at Janabadra University for new student admissions (PMB). The method used is a business intelligence roadmap with six stages, the stages are (1) justification, (2) planning, (3) business case, (4) design, (5) construction, and (6) deployment which is a reference in the design and construction of a data warehouse using Metabase. The results of this study can build 7 (seven) visualization dashboards are  (1) Dashboard of information students grouped based on the total number of PMB registrants, (2) Dashboard of the number of registrants based on the academic year, (3) Dashboard of income from PMB registration based on the payment date, (4) Dashboard of the number of students based on the academic year of each study program, (5) Dashboard of the number of registrants by class, (6) Dashboard of the number of PMB registrants by semester and (7) Dashboard of the number of PMB registrants by study program and class.&quot;,&quot;publisher&quot;:&quot;Universitas Hamzanwadi&quot;,&quot;issue&quot;:&quot;1&quot;,&quot;volume&quot;:&quot;6&quot;,&quot;container-title-short&quot;:&quot;&quot;},&quot;isTemporary&quot;:false}]},{&quot;citationID&quot;:&quot;MENDELEY_CITATION_d038d7fd-4d62-4474-9148-82bc78cd093b&quot;,&quot;properties&quot;:{&quot;noteIndex&quot;:0},&quot;isEdited&quot;:false,&quot;manualOverride&quot;:{&quot;isManuallyOverridden&quot;:false,&quot;citeprocText&quot;:&quot;(Santhi et al., 2023)&quot;,&quot;manualOverrideText&quot;:&quot;&quot;},&quot;citationTag&quot;:&quot;MENDELEY_CITATION_v3_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&quot;,&quot;citationItems&quot;:[{&quot;id&quot;:&quot;e141a05e-71b1-3e77-be5d-bfe5ac71ee66&quot;,&quot;itemData&quot;:{&quot;type&quot;:&quot;report&quot;,&quot;id&quot;:&quot;e141a05e-71b1-3e77-be5d-bfe5ac71ee66&quot;,&quot;title&quot;:&quot;IMPLEMENTASI BUSINESS INTELLIGENCE MENGGUNAKAN TABLEAU UNTUK VISUALISASI PREDIKSI KELULUSAN MAHASISWA&quot;,&quot;author&quot;:[{&quot;family&quot;:&quot;Santhi&quot;,&quot;given&quot;:&quot;Trihana&quot;,&quot;parse-names&quot;:false,&quot;dropping-particle&quot;:&quot;&quot;,&quot;non-dropping-particle&quot;:&quot;&quot;},{&quot;family&quot;:&quot;Monica Sari&quot;,&quot;given&quot;:&quot;Aprilia&quot;,&quot;parse-names&quot;:false,&quot;dropping-particle&quot;:&quot;&quot;,&quot;non-dropping-particle&quot;:&quot;&quot;},{&quot;family&quot;:&quot;Ketut Alit Maha Putra&quot;,&quot;given&quot;:&quot;Dewa&quot;,&quot;parse-names&quot;:false,&quot;dropping-particle&quot;:&quot;&quot;,&quot;non-dropping-particle&quot;:&quot;&quot;},{&quot;family&quot;:&quot;Surya Mahendra&quot;,&quot;given&quot;:&quot;Gede&quot;,&quot;parse-names&quot;:false,&quot;dropping-particle&quot;:&quot;&quot;,&quot;non-dropping-particle&quot;:&quot;&quot;},{&quot;family&quot;:&quot;Putri Ariasih&quot;,&quot;given&quot;:&quot;Made&quot;,&quot;parse-names&quot;:false,&quot;dropping-particle&quot;:&quot;&quot;,&quot;non-dropping-particle&quot;:&quot;&quot;},{&quot;family&quot;:&quot;Studi Sistem Informasi&quot;,&quot;given&quot;:&quot;Program&quot;,&quot;parse-names&quot;:false,&quot;dropping-particle&quot;:&quot;&quot;,&quot;non-dropping-particle&quot;:&quot;&quot;},{&quot;family&quot;:&quot;Teknik dan Kejuruan&quot;,&quot;given&quot;:&quot;Fakultas&quot;,&quot;parse-names&quot;:false,&quot;dropping-particle&quot;:&quot;&quot;,&quot;non-dropping-particle&quot;:&quot;&quot;}],&quot;URL&quot;:&quot;https://ejurnal.umri.ac.id/index.php/SEIS/index&quot;,&quot;issued&quot;:{&quot;date-parts&quot;:[[2023]]},&quot;number-of-pages&quot;:&quot;51-58&quot;,&quot;abstract&quot;:&quot;Prediction of student graduation plays an important role in college programs to help students stay high-achieving and graduate on time, as well as produce the best graduates. Information about the number of students graduating in college plays a significant role in decision-making through visual representation of data. This article aims to describe data on student graduation predictions in college through visual representation using Business Intelligence and Tableau tools with data from www.kaggle.com. The results of this research are presented in the form of a dashboard that includes GPA, academic achievement, organizational involvement, and gender in college, which can be used to support decision-making. Visualizing data through analysis using an interactive Tableau dashboard is expected to make information more engaging and easily understandable. Predicted students who graduate on time have adequate GPA, participate in campus activities, and are mostly male.&quot;,&quot;issue&quot;:&quot;2&quot;,&quot;volume&quot;:&quot;3&quot;,&quot;container-title-short&quot;:&quot;&quot;},&quot;isTemporary&quot;:false}]},{&quot;citationID&quot;:&quot;MENDELEY_CITATION_0f1b994b-42c2-4de3-843d-7ac6b98f9ec9&quot;,&quot;properties&quot;:{&quot;noteIndex&quot;:0},&quot;isEdited&quot;:false,&quot;manualOverride&quot;:{&quot;isManuallyOverridden&quot;:false,&quot;citeprocText&quot;:&quot;(Anhari et al., 2025)&quot;,&quot;manualOverrideText&quot;:&quot;&quot;},&quot;citationTag&quot;:&quot;MENDELEY_CITATION_v3_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&quot;,&quot;citationItems&quot;:[{&quot;id&quot;:&quot;b5c574a7-ea07-381f-95b9-20ca2f9f3321&quot;,&quot;itemData&quot;:{&quot;type&quot;:&quot;report&quot;,&quot;id&quot;:&quot;b5c574a7-ea07-381f-95b9-20ca2f9f3321&quot;,&quot;title&quot;:&quot;Business Intelligence Visualisasi Data Penerimaan Mahasiswa Baru Menggunakan Tableau di Universitas ABC&quot;,&quot;author&quot;:[{&quot;family&quot;:&quot;Anhari&quot;,&quot;given&quot;:&quot;Tirta&quot;,&quot;parse-names&quot;:false,&quot;dropping-particle&quot;:&quot;&quot;,&quot;non-dropping-particle&quot;:&quot;&quot;},{&quot;family&quot;:&quot;Alim&quot;,&quot;given&quot;:&quot;Endy Sjaiful&quot;,&quot;parse-names&quot;:false,&quot;dropping-particle&quot;:&quot;&quot;,&quot;non-dropping-particle&quot;:&quot;&quot;},{&quot;family&quot;:&quot;Rizkiawan&quot;,&quot;given&quot;:&quot;M Asep&quot;,&quot;parse-names&quot;:false,&quot;dropping-particle&quot;:&quot;&quot;,&quot;non-dropping-particle&quot;:&quot;&quot;},{&quot;family&quot;:&quot;Hasan&quot;,&quot;given&quot;:&quot;Firman Noor&quot;,&quot;parse-names&quot;:false,&quot;dropping-particle&quot;:&quot;&quot;,&quot;non-dropping-particle&quot;:&quot;&quot;}],&quot;issued&quot;:{&quot;date-parts&quot;:[[2025]]},&quot;number-of-pages&quot;:&quot;281-291&quot;,&quot;abstract&quot;:&quot;This study aims to analyze the application of Business Intelligence (BI) using Tableau in the new student admission process at ABC University. Tableau is used to visualize admission data for the period 2021 to 2023, including the number of applicants, geographic distribution, and course preferences. The research methodology involves data collection, cleaning, and integration which is then visualized in an interactive dashboard. The results showed a decrease in the number of applicants during the study period, with the lowest applicants in 2024. Geographic distribution analysis shows that DKI Jakarta and West Java provinces still dominate, indicating the need for expansion in conducting promotions and also data-based marketing strategies. In addition, the shift in the interest of applicants from Communication Science study programs to Pharmacist and Management Professions is an important finding, indicating a changing trend in prospective students' preferences for the fields of Communication Science and Business. This study concludes that the implementation of BI using Tableau provides significant benefits in improving the efficiency of decision-making, expanding the range of admissions, and strengthening the competitiveness of ABC University amid changing educational trends. The findings contribute to the literature related to BI implementation in the education sector and recommend further development to optimize university management in the future.&quot;,&quot;issue&quot;:&quot;1&quot;,&quot;volume&quot;:&quot;6&quot;,&quot;container-title-short&quot;:&quot;&quot;},&quot;isTemporary&quot;:false}]},{&quot;citationID&quot;:&quot;MENDELEY_CITATION_3a12006e-fbea-40f6-b24c-a6b73827dc3c&quot;,&quot;properties&quot;:{&quot;noteIndex&quot;:0},&quot;isEdited&quot;:false,&quot;manualOverride&quot;:{&quot;isManuallyOverridden&quot;:false,&quot;citeprocText&quot;:&quot;(Rosita &amp;#38; Tannar, 2024)&quot;,&quot;manualOverrideText&quot;:&quot;&quot;},&quot;citationTag&quot;:&quot;MENDELEY_CITATION_v3_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&quot;,&quot;citationItems&quot;:[{&quot;id&quot;:&quot;74b4a176-a06b-3dcb-9904-952ea10b110c&quot;,&quot;itemData&quot;:{&quot;type&quot;:&quot;article-journal&quot;,&quot;id&quot;:&quot;74b4a176-a06b-3dcb-9904-952ea10b110c&quot;,&quot;title&quot;:&quot;PERAN DATA ANALIS DALAM MENDORONG KEPUTUSAN DAN STRATEGI BISNIS PERUSAHAAN&quot;,&quot;author&quot;:[{&quot;family&quot;:&quot;Rosita&quot;,&quot;given&quot;:&quot;Amanda Aura&quot;,&quot;parse-names&quot;:false,&quot;dropping-particle&quot;:&quot;&quot;,&quot;non-dropping-particle&quot;:&quot;&quot;},{&quot;family&quot;:&quot;Tannar&quot;,&quot;given&quot;:&quot;Oryza&quot;,&quot;parse-names&quot;:false,&quot;dropping-particle&quot;:&quot;&quot;,&quot;non-dropping-particle&quot;:&quot;&quot;}],&quot;container-title&quot;:&quot;Jurnal Ekonomi Revolusioner&quot;,&quot;issued&quot;:{&quot;date-parts&quot;:[[2024]]},&quot;issue&quot;:&quot;7&quot;,&quot;volume&quot;:&quot;7&quot;,&quot;container-title-short&quot;:&quot;&quot;},&quot;isTemporary&quot;:false}]},{&quot;citationID&quot;:&quot;MENDELEY_CITATION_7d83bb88-96d7-4f02-a289-b3d1de461bdd&quot;,&quot;properties&quot;:{&quot;noteIndex&quot;:0},&quot;isEdited&quot;:false,&quot;manualOverride&quot;:{&quot;isManuallyOverridden&quot;:false,&quot;citeprocText&quot;:&quot;(Widaningsih, 2019)&quot;,&quot;manualOverrideText&quot;:&quot;&quot;},&quot;citationTag&quot;:&quot;MENDELEY_CITATION_v3_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&quot;,&quot;citationItems&quot;:[{&quot;id&quot;:&quot;624bddcc-faad-354e-a37e-9bcacc2441fb&quot;,&quot;itemData&quot;:{&quot;type&quot;:&quot;article-journal&quot;,&quot;id&quot;:&quot;624bddcc-faad-354e-a37e-9bcacc2441fb&quot;,&quot;title&quot;:&quot;Perbandingan Metode Data Mining Untuk Prediksi Nilai Dan Waktu Kelulusan Mahasiswa Prodi Teknik Informatika Dengan Algoritma C4, 5, Naïve Bayes, Knn Dan Svm&quot;,&quot;author&quot;:[{&quot;family&quot;:&quot;Widaningsih&quot;,&quot;given&quot;:&quot;Sri&quot;,&quot;parse-names&quot;:false,&quot;dropping-particle&quot;:&quot;&quot;,&quot;non-dropping-particle&quot;:&quot;&quot;}],&quot;container-title&quot;:&quot;Jurnal Tekno Insentif&quot;,&quot;ISSN&quot;:&quot;2655-089X&quot;,&quot;issued&quot;:{&quot;date-parts&quot;:[[2019]]},&quot;page&quot;:&quot;16-25&quot;,&quot;issue&quot;:&quot;1&quot;,&quot;volume&quot;:&quot;13&quot;,&quot;container-title-short&quot;:&quot;&quot;},&quot;isTemporary&quot;:false}]},{&quot;citationID&quot;:&quot;MENDELEY_CITATION_17f89917-cef1-42eb-9d1e-11357d67e251&quot;,&quot;properties&quot;:{&quot;noteIndex&quot;:0},&quot;isEdited&quot;:false,&quot;manualOverride&quot;:{&quot;isManuallyOverridden&quot;:false,&quot;citeprocText&quot;:&quot;(Seda et al., 2020)&quot;,&quot;manualOverrideText&quot;:&quot;&quot;},&quot;citationTag&quot;:&quot;MENDELEY_CITATION_v3_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&quot;,&quot;citationItems&quot;:[{&quot;id&quot;:&quot;219e0431-c196-3cad-83dd-7ead91a2a396&quot;,&quot;itemData&quot;:{&quot;type&quot;:&quot;article-journal&quot;,&quot;id&quot;:&quot;219e0431-c196-3cad-83dd-7ead91a2a396&quot;,&quot;title&quot;:&quot;Dataset on the cultural dimension of urban society food consumption in Indonesia&quot;,&quot;author&quot;:[{&quot;family&quot;:&quot;Seda&quot;,&quot;given&quot;:&quot;Francisia S S E&quot;,&quot;parse-names&quot;:false,&quot;dropping-particle&quot;:&quot;&quot;,&quot;non-dropping-particle&quot;:&quot;&quot;},{&quot;family&quot;:&quot;Setyawati&quot;,&quot;given&quot;:&quot;Lugina&quot;,&quot;parse-names&quot;:false,&quot;dropping-particle&quot;:&quot;&quot;,&quot;non-dropping-particle&quot;:&quot;&quot;},{&quot;family&quot;:&quot;Tirta&quot;,&quot;given&quot;:&quot;Timoti&quot;,&quot;parse-names&quot;:false,&quot;dropping-particle&quot;:&quot;&quot;,&quot;non-dropping-particle&quot;:&quot;&quot;},{&quot;family&quot;:&quot;Nobel&quot;,&quot;given&quot;:&quot;Kevin&quot;,&quot;parse-names&quot;:false,&quot;dropping-particle&quot;:&quot;&quot;,&quot;non-dropping-particle&quot;:&quot;&quot;}],&quot;container-title&quot;:&quot;Data in Brief&quot;,&quot;container-title-short&quot;:&quot;Data Brief&quot;,&quot;ISSN&quot;:&quot;2352-3409&quot;,&quot;issued&quot;:{&quot;date-parts&quot;:[[2020]]},&quot;page&quot;:&quot;105681&quot;,&quot;publisher&quot;:&quot;Elsevier&quot;,&quot;volume&quot;:&quot;31&quot;},&quot;isTemporary&quot;:false}]},{&quot;citationID&quot;:&quot;MENDELEY_CITATION_f89be22b-269e-4c31-831b-f953af3883fb&quot;,&quot;properties&quot;:{&quot;noteIndex&quot;:0},&quot;isEdited&quot;:false,&quot;manualOverride&quot;:{&quot;isManuallyOverridden&quot;:false,&quot;citeprocText&quot;:&quot;(Hanifah &amp;#38; Nasution, 2025)&quot;,&quot;manualOverrideText&quot;:&quot;&quot;},&quot;citationTag&quot;:&quot;MENDELEY_CITATION_v3_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&quot;,&quot;citationItems&quot;:[{&quot;id&quot;:&quot;a93aaf8b-be5f-34bb-aae0-7da4f3b98c22&quot;,&quot;itemData&quot;:{&quot;type&quot;:&quot;article-journal&quot;,&quot;id&quot;:&quot;a93aaf8b-be5f-34bb-aae0-7da4f3b98c22&quot;,&quot;title&quot;:&quot;Manajemen Data Yang Efektif: Solusi Untuk Mencegah dan Mengatasi Duplikasi Data Dalam Perusahaan&quot;,&quot;author&quot;:[{&quot;family&quot;:&quot;Hanifah&quot;,&quot;given&quot;:&quot;Nazwa&quot;,&quot;parse-names&quot;:false,&quot;dropping-particle&quot;:&quot;&quot;,&quot;non-dropping-particle&quot;:&quot;&quot;},{&quot;family&quot;:&quot;Nasution&quot;,&quot;given&quot;:&quot;Muhammad Irwan Padli&quot;,&quot;parse-names&quot;:false,&quot;dropping-particle&quot;:&quot;&quot;,&quot;non-dropping-particle&quot;:&quot;&quot;}],&quot;container-title&quot;:&quot;Epsilon: Journal of Management (EJoM)&quot;,&quot;ISSN&quot;:&quot;3026-653X&quot;,&quot;issued&quot;:{&quot;date-parts&quot;:[[2025]]},&quot;page&quot;:&quot;27-38&quot;,&quot;issue&quot;:&quot;1&quot;,&quot;volume&quot;:&quot;3&quot;,&quot;container-title-short&quot;:&quot;&quot;},&quot;isTemporary&quot;:false}]},{&quot;citationID&quot;:&quot;MENDELEY_CITATION_41771b54-2cd1-48dc-8259-192f6ab796cb&quot;,&quot;properties&quot;:{&quot;noteIndex&quot;:0},&quot;isEdited&quot;:false,&quot;manualOverride&quot;:{&quot;isManuallyOverridden&quot;:false,&quot;citeprocText&quot;:&quot;(Sudrajat &amp;#38; Cholid, 2023)&quot;,&quot;manualOverrideText&quot;:&quot;&quot;},&quot;citationTag&quot;:&quot;MENDELEY_CITATION_v3_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&quot;,&quot;citationItems&quot;:[{&quot;id&quot;:&quot;5503319d-adb7-3949-b8f3-2192723250e6&quot;,&quot;itemData&quot;:{&quot;type&quot;:&quot;article-journal&quot;,&quot;id&quot;:&quot;5503319d-adb7-3949-b8f3-2192723250e6&quot;,&quot;title&quot;:&quot;K-Nearest Neighbor (K-Nn) Untuk Penanganan Missing Value Pada Data Umkm&quot;,&quot;author&quot;:[{&quot;family&quot;:&quot;Sudrajat&quot;,&quot;given&quot;:&quot;Wahyu&quot;,&quot;parse-names&quot;:false,&quot;dropping-particle&quot;:&quot;&quot;,&quot;non-dropping-particle&quot;:&quot;&quot;},{&quot;family&quot;:&quot;Cholid&quot;,&quot;given&quot;:&quot;Idahm&quot;,&quot;parse-names&quot;:false,&quot;dropping-particle&quot;:&quot;&quot;,&quot;non-dropping-particle&quot;:&quot;&quot;}],&quot;container-title&quot;:&quot;Jurnal Rekayasa Sistem Informasi Dan Teknologi&quot;,&quot;ISSN&quot;:&quot;3025-888X&quot;,&quot;issued&quot;:{&quot;date-parts&quot;:[[2023]]},&quot;page&quot;:&quot;54-63&quot;,&quot;issue&quot;:&quot;2&quot;,&quot;volume&quot;:&quot;1&quot;,&quot;container-title-short&quot;:&quot;&quot;},&quot;isTemporary&quot;:false}]},{&quot;citationID&quot;:&quot;MENDELEY_CITATION_a68d755a-3a98-4a4a-93be-865b7b61246c&quot;,&quot;properties&quot;:{&quot;noteIndex&quot;:0},&quot;isEdited&quot;:false,&quot;manualOverride&quot;:{&quot;isManuallyOverridden&quot;:false,&quot;citeprocText&quot;:&quot;(Turyadi &amp;#38; Kusnandar, n.d.)&quot;,&quot;manualOverrideText&quot;:&quot;&quot;},&quot;citationTag&quot;:&quot;MENDELEY_CITATION_v3_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&quot;,&quot;citationItems&quot;:[{&quot;id&quot;:&quot;2e56aaf9-a5a3-3f81-a5f3-734246019abf&quot;,&quot;itemData&quot;:{&quot;type&quot;:&quot;article-journal&quot;,&quot;id&quot;:&quot;2e56aaf9-a5a3-3f81-a5f3-734246019abf&quot;,&quot;title&quot;:&quot;KAJIAN SIFAT DISTRIBUSI NORMAL BIVARIAT&quot;,&quot;author&quot;:[{&quot;family&quot;:&quot;Turyadi&quot;,&quot;given&quot;:&quot;Muhlasah Novitasari Mara&quot;,&quot;parse-names&quot;:false,&quot;dropping-particle&quot;:&quot;&quot;,&quot;non-dropping-particle&quot;:&quot;&quot;},{&quot;family&quot;:&quot;Kusnandar&quot;,&quot;given&quot;:&quot;Dadan&quot;,&quot;parse-names&quot;:false,&quot;dropping-particle&quot;:&quot;&quot;,&quot;non-dropping-particle&quot;:&quot;&quot;}],&quot;container-title&quot;:&quot;Bimaster: Buletin Ilmiah Matematika, Statistika dan Terapannya&quot;,&quot;ISSN&quot;:&quot;2302-9854&quot;,&quot;issue&quot;:&quot;02&quot;,&quot;volume&quot;:&quot;2&quot;,&quot;container-title-short&quot;:&quot;&quot;},&quot;isTemporary&quot;:false}]},{&quot;citationID&quot;:&quot;MENDELEY_CITATION_dc4f565e-b259-42f3-abd0-d5e58402ca6a&quot;,&quot;properties&quot;:{&quot;noteIndex&quot;:0},&quot;isEdited&quot;:false,&quot;manualOverride&quot;:{&quot;isManuallyOverridden&quot;:false,&quot;citeprocText&quot;:&quot;(Sulasmono, 2012)&quot;,&quot;manualOverrideText&quot;:&quot;&quot;},&quot;citationTag&quot;:&quot;MENDELEY_CITATION_v3_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&quot;,&quot;citationItems&quot;:[{&quot;id&quot;:&quot;8e698846-4f7b-35f4-aa77-9c90920f795f&quot;,&quot;itemData&quot;:{&quot;type&quot;:&quot;article-journal&quot;,&quot;id&quot;:&quot;8e698846-4f7b-35f4-aa77-9c90920f795f&quot;,&quot;title&quot;:&quot;Problem solving: Signifikansi, pengertian, dan ragamnya&quot;,&quot;author&quot;:[{&quot;family&quot;:&quot;Sulasmono&quot;,&quot;given&quot;:&quot;Bambang Suteng&quot;,&quot;parse-names&quot;:false,&quot;dropping-particle&quot;:&quot;&quot;,&quot;non-dropping-particle&quot;:&quot;&quot;}],&quot;container-title&quot;:&quot;Satya Widya&quot;,&quot;ISSN&quot;:&quot;2549-967X&quot;,&quot;issued&quot;:{&quot;date-parts&quot;:[[2012]]},&quot;page&quot;:&quot;155-166&quot;,&quot;issue&quot;:&quot;2&quot;,&quot;volume&quot;:&quot;28&quot;,&quot;container-title-short&quot;:&quot;&quot;},&quot;isTemporary&quot;:false}]},{&quot;citationID&quot;:&quot;MENDELEY_CITATION_0bb2aa4c-3392-4aff-8273-f70e9cc73e68&quot;,&quot;properties&quot;:{&quot;noteIndex&quot;:0},&quot;isEdited&quot;:false,&quot;manualOverride&quot;:{&quot;isManuallyOverridden&quot;:false,&quot;citeprocText&quot;:&quot;(Ramanisa et al., 2020)&quot;,&quot;manualOverrideText&quot;:&quot;&quot;},&quot;citationTag&quot;:&quot;MENDELEY_CITATION_v3_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&quot;,&quot;citationItems&quot;:[{&quot;id&quot;:&quot;1b97f332-ea00-3a32-b851-ac744ffe09c6&quot;,&quot;itemData&quot;:{&quot;type&quot;:&quot;article-journal&quot;,&quot;id&quot;:&quot;1b97f332-ea00-3a32-b851-ac744ffe09c6&quot;,&quot;title&quot;:&quot;Analisis Kemampuan Representasi Matematis Siswa&quot;,&quot;author&quot;:[{&quot;family&quot;:&quot;Ramanisa&quot;,&quot;given&quot;:&quot;Hartiwi&quot;,&quot;parse-names&quot;:false,&quot;dropping-particle&quot;:&quot;&quot;,&quot;non-dropping-particle&quot;:&quot;&quot;},{&quot;family&quot;:&quot;Khairudin&quot;,&quot;given&quot;:&quot;Khairudin&quot;,&quot;parse-names&quot;:false,&quot;dropping-particle&quot;:&quot;&quot;,&quot;non-dropping-particle&quot;:&quot;&quot;},{&quot;family&quot;:&quot;Netti&quot;,&quot;given&quot;:&quot;Syukma&quot;,&quot;parse-names&quot;:false,&quot;dropping-particle&quot;:&quot;&quot;,&quot;non-dropping-particle&quot;:&quot;&quot;}],&quot;container-title&quot;:&quot;Jurnal Magister Pendidikan Matematika (JUMADIKA)&quot;,&quot;ISSN&quot;:&quot;2684-8848&quot;,&quot;issued&quot;:{&quot;date-parts&quot;:[[2020]]},&quot;page&quot;:&quot;34-38&quot;,&quot;issue&quot;:&quot;1&quot;,&quot;volume&quot;:&quot;2&quot;,&quot;container-title-short&quot;:&quot;&quot;},&quot;isTemporary&quot;:false}]},{&quot;citationID&quot;:&quot;MENDELEY_CITATION_b766a1da-7ff7-4b3b-9de1-5325f90eb8b2&quot;,&quot;properties&quot;:{&quot;noteIndex&quot;:0},&quot;isEdited&quot;:false,&quot;manualOverride&quot;:{&quot;isManuallyOverridden&quot;:false,&quot;citeprocText&quot;:&quot;(Matondang et al., 2020)&quot;,&quot;manualOverrideText&quot;:&quot;&quot;},&quot;citationTag&quot;:&quot;MENDELEY_CITATION_v3_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&quot;,&quot;citationItems&quot;:[{&quot;id&quot;:&quot;abac9297-d8b0-3b76-a078-f6adb92f755b&quot;,&quot;itemData&quot;:{&quot;type&quot;:&quot;paper-conference&quot;,&quot;id&quot;:&quot;abac9297-d8b0-3b76-a078-f6adb92f755b&quot;,&quot;title&quot;:&quot;Penerapan Metode Brainstorming Dalam Perancangan Produk Pochade&quot;,&quot;author&quot;:[{&quot;family&quot;:&quot;Matondang&quot;,&quot;given&quot;:&quot;Muharram&quot;,&quot;parse-names&quot;:false,&quot;dropping-particle&quot;:&quot;&quot;,&quot;non-dropping-particle&quot;:&quot;&quot;},{&quot;family&quot;:&quot;Sary&quot;,&quot;given&quot;:&quot;Nadilah&quot;,&quot;parse-names&quot;:false,&quot;dropping-particle&quot;:&quot;&quot;,&quot;non-dropping-particle&quot;:&quot;&quot;},{&quot;family&quot;:&quot;Gultom&quot;,&quot;given&quot;:&quot;Theo Benneditson&quot;,&quot;parse-names&quot;:false,&quot;dropping-particle&quot;:&quot;&quot;,&quot;non-dropping-particle&quot;:&quot;&quot;},{&quot;family&quot;:&quot;Sebayang&quot;,&quot;given&quot;:&quot;Yesticka&quot;,&quot;parse-names&quot;:false,&quot;dropping-particle&quot;:&quot;&quot;,&quot;non-dropping-particle&quot;:&quot;&quot;}],&quot;container-title&quot;:&quot;Talenta Conference Series: Energy and Engineering (EE)&quot;,&quot;ISBN&quot;:&quot;2654-704X&quot;,&quot;issued&quot;:{&quot;date-parts&quot;:[[2020]]},&quot;issue&quot;:&quot;2&quot;,&quot;volume&quot;:&quot;3&quot;,&quot;container-title-short&quot;:&quot;&quot;},&quot;isTemporary&quot;:false}]},{&quot;citationID&quot;:&quot;MENDELEY_CITATION_517e0629-801d-4b12-a8f8-ee2fe9f46ac4&quot;,&quot;properties&quot;:{&quot;noteIndex&quot;:0},&quot;isEdited&quot;:false,&quot;manualOverride&quot;:{&quot;isManuallyOverridden&quot;:false,&quot;citeprocText&quot;:&quot;(Mulyani &amp;#38; Kartini, 2023)&quot;,&quot;manualOverrideText&quot;:&quot;&quot;},&quot;citationTag&quot;:&quot;MENDELEY_CITATION_v3_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&quot;,&quot;citationItems&quot;:[{&quot;id&quot;:&quot;0cb1f664-1d35-3d25-a481-d642dbf50f2d&quot;,&quot;itemData&quot;:{&quot;type&quot;:&quot;article-journal&quot;,&quot;id&quot;:&quot;0cb1f664-1d35-3d25-a481-d642dbf50f2d&quot;,&quot;title&quot;:&quot;Visualisasi Data Ticketing Servicedesk Dengan Dashboard Pada PT Brantas Abipraya (Persero)&quot;,&quot;author&quot;:[{&quot;family&quot;:&quot;Mulyani&quot;,&quot;given&quot;:&quot;Astriana&quot;,&quot;parse-names&quot;:false,&quot;dropping-particle&quot;:&quot;&quot;,&quot;non-dropping-particle&quot;:&quot;&quot;},{&quot;family&quot;:&quot;Kartini&quot;,&quot;given&quot;:&quot;Kartini&quot;,&quot;parse-names&quot;:false,&quot;dropping-particle&quot;:&quot;&quot;,&quot;non-dropping-particle&quot;:&quot;&quot;}],&quot;container-title&quot;:&quot;Journal of Information System, Applied, Management, Accounting and Research&quot;,&quot;ISSN&quot;:&quot;2598-8719&quot;,&quot;issued&quot;:{&quot;date-parts&quot;:[[2023]]},&quot;page&quot;:&quot;289-300&quot;,&quot;issue&quot;:&quot;2&quot;,&quot;volume&quot;:&quot;7&quot;,&quot;container-title-short&quot;:&quot;&quot;},&quot;isTemporary&quot;:false}]},{&quot;citationID&quot;:&quot;MENDELEY_CITATION_b7c5119d-813d-44e2-977d-b57712b9b0e2&quot;,&quot;properties&quot;:{&quot;noteIndex&quot;:0},&quot;isEdited&quot;:false,&quot;manualOverride&quot;:{&quot;isManuallyOverridden&quot;:false,&quot;citeprocText&quot;:&quot;(Hismawan &amp;#38; Izaak, 2023)&quot;,&quot;manualOverrideText&quot;:&quot;&quot;},&quot;citationTag&quot;:&quot;MENDELEY_CITATION_v3_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&quot;,&quot;citationItems&quot;:[{&quot;id&quot;:&quot;11846df6-0008-38cd-b3d5-57f64a205852&quot;,&quot;itemData&quot;:{&quot;type&quot;:&quot;article-journal&quot;,&quot;id&quot;:&quot;11846df6-0008-38cd-b3d5-57f64a205852&quot;,&quot;title&quot;:&quot;Optimalisasi website menggunakan landing page sebagai media pemasaran produk parfum fresh fusion di era digital&quot;,&quot;author&quot;:[{&quot;family&quot;:&quot;Hismawan&quot;,&quot;given&quot;:&quot;Fiska Rahma&quot;,&quot;parse-names&quot;:false,&quot;dropping-particle&quot;:&quot;&quot;,&quot;non-dropping-particle&quot;:&quot;&quot;},{&quot;family&quot;:&quot;Izaak&quot;,&quot;given&quot;:&quot;Wilma Cordelia&quot;,&quot;parse-names&quot;:false,&quot;dropping-particle&quot;:&quot;&quot;,&quot;non-dropping-particle&quot;:&quot;&quot;}],&quot;container-title&quot;:&quot;KARYA: Jurnal Pengabdian Kepada Masyarakat&quot;,&quot;ISSN&quot;:&quot;2798-1827&quot;,&quot;issued&quot;:{&quot;date-parts&quot;:[[2023]]},&quot;page&quot;:&quot;364-368&quot;,&quot;issue&quot;:&quot;3&quot;,&quot;volume&quot;:&quot;3&quot;,&quot;container-title-short&quot;:&quot;&quot;},&quot;isTemporary&quot;:false}]}]"/>
     <we:property name="MENDELEY_CITATIONS_LOCALE_CODE" value="&quot;en-GB&quot;"/>
     <we:property name="MENDELEY_CITATIONS_STYLE" value="{&quot;id&quot;:&quot;https://www.zotero.org/styles/apa&quot;,&quot;title&quot;:&quot;American Psychological Association 7th edition&quot;,&quot;format&quot;:&quot;author-date&quot;,&quot;defaultLocale&quot;:null,&quot;isLocaleCodeValid&quot;:true}"/>
   </we:properties>

</xml_diff>